<commit_message>
Deploying to gh-pages from @ Morrison-Lab/pds@6bd539afcf5e0480f180bfca7c5189c5cebb4dcd 🚀
</commit_message>
<xml_diff>
--- a/limit-theorems.docx
+++ b/limit-theorems.docx
@@ -15,10 +15,10 @@
         <w:pStyle w:val="Date"/>
       </w:pPr>
       <w:r>
-        <w:t xml:space="preserve">Last modified: 2026-09-28 15:22:34 (PDT)</w:t>
+        <w:t xml:space="preserve">Last modified: 2026-09-28 22:56:18 (PDT)</w:t>
       </w:r>
     </w:p>
-    <w:bookmarkStart w:id="24" w:name="sec-clt"/>
+    <w:bookmarkStart w:id="27" w:name="sec-clt"/>
     <w:p>
       <w:pPr>
         <w:pStyle w:val="Heading2"/>
@@ -31,6 +31,16 @@
       <w:pPr>
         <w:pStyle w:val="FirstParagraph"/>
       </w:pPr>
+      <w:r>
+        <w:rPr>
+          <w:i/>
+          <w:iCs/>
+        </w:rPr>
+        <w:t xml:space="preserve">Remark</w:t>
+      </w:r>
+      <w:r>
+        <w:t xml:space="preserve">. </w:t>
+      </w:r>
       <w:r>
         <w:t xml:space="preserve">The sum of many independent random variables,</w:t>
       </w:r>
@@ -677,6 +687,16 @@
         <w:pStyle w:val="BodyText"/>
       </w:pPr>
       <w:r>
+        <w:rPr>
+          <w:i/>
+          <w:iCs/>
+        </w:rPr>
+        <w:t xml:space="preserve">Remark</w:t>
+      </w:r>
+      <w:r>
+        <w:t xml:space="preserve">. </w:t>
+      </w:r>
+      <w:r>
         <w:t xml:space="preserve">This version is the Lindeberg–Lévy CLT;</w:t>
       </w:r>
       <w:r>
@@ -705,88 +725,382 @@
       </w:r>
       <w:r>
         <w:t xml:space="preserve">which is why the informal statement asks only that no summand dominate.</w:t>
+      </w:r>
+    </w:p>
+    <w:bookmarkStart w:id="12" w:name="cor-sum-iid-moments"/>
+    <w:p>
+      <w:pPr>
+        <w:pStyle w:val="BodyText"/>
+      </w:pPr>
+      <w:r>
+        <w:rPr>
+          <w:b/>
+          <w:bCs/>
+        </w:rPr>
+        <w:t xml:space="preserve">Corollary 1 (Mean and variance of a sum of IID random variables)</w:t>
+      </w:r>
+      <w:r>
+        <w:t xml:space="preserve"> </w:t>
+      </w:r>
+      <w:r>
+        <w:t xml:space="preserve">Let</w:t>
+      </w:r>
+      <w:r>
+        <w:t xml:space="preserve"> </w:t>
+      </w:r>
+      <m:oMath>
+        <m:sSub>
+          <m:e>
+            <m:r>
+              <m:t>X</m:t>
+            </m:r>
+          </m:e>
+          <m:sub>
+            <m:r>
+              <m:t>1</m:t>
+            </m:r>
+          </m:sub>
+        </m:sSub>
+        <m:r>
+          <m:rPr>
+            <m:sty m:val="p"/>
+          </m:rPr>
+          <m:t>,</m:t>
+        </m:r>
+        <m:r>
+          <m:rPr>
+            <m:sty m:val="p"/>
+          </m:rPr>
+          <m:t>…</m:t>
+        </m:r>
+        <m:r>
+          <m:rPr>
+            <m:sty m:val="p"/>
+          </m:rPr>
+          <m:t>,</m:t>
+        </m:r>
+        <m:sSub>
+          <m:e>
+            <m:r>
+              <m:t>X</m:t>
+            </m:r>
+          </m:e>
+          <m:sub>
+            <m:r>
+              <m:t>n</m:t>
+            </m:r>
+          </m:sub>
+        </m:sSub>
+      </m:oMath>
+      <w:r>
+        <w:t xml:space="preserve"> </w:t>
+      </w:r>
+      <w:r>
+        <w:t xml:space="preserve">be</w:t>
+      </w:r>
+      <w:r>
+        <w:t xml:space="preserve"> </w:t>
+      </w:r>
+      <w:hyperlink r:id="rId9">
+        <w:r>
+          <w:rPr>
+            <w:rStyle w:val="Hyperlink"/>
+          </w:rPr>
+          <w:t xml:space="preserve">IID</w:t>
+        </w:r>
+      </w:hyperlink>
+      <w:r>
+        <w:t xml:space="preserve"> </w:t>
+      </w:r>
+      <w:r>
+        <w:t xml:space="preserve">random variables,</w:t>
+      </w:r>
+      <w:r>
+        <w:t xml:space="preserve"> </w:t>
+      </w:r>
+      <w:r>
+        <w:t xml:space="preserve">each discrete or continuous,</w:t>
+      </w:r>
+      <w:r>
+        <w:t xml:space="preserve"> </w:t>
+      </w:r>
+      <w:r>
+        <w:t xml:space="preserve">with mean</w:t>
+      </w:r>
+      <w:r>
+        <w:t xml:space="preserve"> </w:t>
+      </w:r>
+      <m:oMath>
+        <m:r>
+          <m:t>μ</m:t>
+        </m:r>
+      </m:oMath>
+      <w:r>
+        <w:t xml:space="preserve"> </w:t>
+      </w:r>
+      <w:r>
+        <w:t xml:space="preserve">and finite variance</w:t>
+      </w:r>
+      <w:r>
+        <w:t xml:space="preserve"> </w:t>
+      </w:r>
+      <m:oMath>
+        <m:sSup>
+          <m:e>
+            <m:r>
+              <m:t>σ</m:t>
+            </m:r>
+          </m:e>
+          <m:sup>
+            <m:r>
+              <m:t>2</m:t>
+            </m:r>
+          </m:sup>
+        </m:sSup>
+      </m:oMath>
+      <w:r>
+        <w:t xml:space="preserve">,</w:t>
+      </w:r>
+      <w:r>
+        <w:t xml:space="preserve"> </w:t>
+      </w:r>
+      <w:r>
+        <w:t xml:space="preserve">and let</w:t>
+      </w:r>
+      <w:r>
+        <w:t xml:space="preserve"> </w:t>
+      </w:r>
+      <m:oMath>
+        <m:sSub>
+          <m:e>
+            <m:r>
+              <m:t>S</m:t>
+            </m:r>
+          </m:e>
+          <m:sub>
+            <m:r>
+              <m:t>n</m:t>
+            </m:r>
+          </m:sub>
+        </m:sSub>
+        <m:limUpp>
+          <m:e>
+            <m:r>
+              <m:rPr>
+                <m:sty m:val="p"/>
+              </m:rPr>
+              <m:t>=</m:t>
+            </m:r>
+          </m:e>
+          <m:lim>
+            <m:r>
+              <m:rPr>
+                <m:nor/>
+                <m:sty m:val="p"/>
+              </m:rPr>
+              <m:t>def</m:t>
+            </m:r>
+          </m:lim>
+        </m:limUpp>
+        <m:nary>
+          <m:naryPr>
+            <m:chr m:val="∑"/>
+            <m:limLoc m:val="undOvr"/>
+            <m:subHide m:val="off"/>
+            <m:supHide m:val="off"/>
+          </m:naryPr>
+          <m:sub>
+            <m:r>
+              <m:t>i</m:t>
+            </m:r>
+            <m:r>
+              <m:rPr>
+                <m:sty m:val="p"/>
+              </m:rPr>
+              <m:t>=</m:t>
+            </m:r>
+            <m:r>
+              <m:t>1</m:t>
+            </m:r>
+          </m:sub>
+          <m:sup>
+            <m:r>
+              <m:t>n</m:t>
+            </m:r>
+          </m:sup>
+          <m:e>
+            <m:sSub>
+              <m:e>
+                <m:r>
+                  <m:t>X</m:t>
+                </m:r>
+              </m:e>
+              <m:sub>
+                <m:r>
+                  <m:t>i</m:t>
+                </m:r>
+              </m:sub>
+            </m:sSub>
+          </m:e>
+        </m:nary>
+      </m:oMath>
+      <w:r>
+        <w:t xml:space="preserve">.</w:t>
+      </w:r>
+      <w:r>
+        <w:t xml:space="preserve"> </w:t>
+      </w:r>
+      <w:r>
+        <w:t xml:space="preserve">Then:</w:t>
       </w:r>
     </w:p>
     <w:p>
       <w:pPr>
         <w:pStyle w:val="BodyText"/>
       </w:pPr>
-      <w:r>
-        <w:t xml:space="preserve">In practice, the theorem justifies approximating</w:t>
-      </w:r>
-      <w:r>
-        <w:t xml:space="preserve"> </w:t>
-      </w:r>
-      <m:oMath>
-        <m:sSub>
-          <m:e>
-            <m:r>
-              <m:t>S</m:t>
-            </m:r>
-          </m:e>
-          <m:sub>
-            <m:r>
-              <m:t>n</m:t>
-            </m:r>
-          </m:sub>
-        </m:sSub>
-      </m:oMath>
-      <w:r>
-        <w:t xml:space="preserve"> </w:t>
-      </w:r>
-      <w:r>
-        <w:t xml:space="preserve">by a normal distribution with mean</w:t>
-      </w:r>
-      <w:r>
-        <w:t xml:space="preserve"> </w:t>
-      </w:r>
-      <m:oMath>
-        <m:r>
-          <m:t>n</m:t>
-        </m:r>
-        <m:r>
-          <m:t>μ</m:t>
-        </m:r>
-      </m:oMath>
-      <w:r>
-        <w:t xml:space="preserve"> </w:t>
-      </w:r>
-      <w:r>
-        <w:t xml:space="preserve">and variance</w:t>
-      </w:r>
-      <w:r>
-        <w:t xml:space="preserve"> </w:t>
-      </w:r>
-      <m:oMath>
-        <m:r>
-          <m:t>n</m:t>
-        </m:r>
-        <m:sSup>
-          <m:e>
-            <m:r>
-              <m:t>σ</m:t>
-            </m:r>
-          </m:e>
-          <m:sup>
-            <m:r>
-              <m:t>2</m:t>
-            </m:r>
-          </m:sup>
-        </m:sSup>
-      </m:oMath>
-      <w:r>
-        <w:t xml:space="preserve">,</w:t>
-      </w:r>
-      <w:r>
-        <w:t xml:space="preserve"> </w:t>
-      </w:r>
-      <w:r>
-        <w:t xml:space="preserve">which by</w:t>
-      </w:r>
-      <w:r>
-        <w:t xml:space="preserve"> </w:t>
-      </w:r>
-      <w:hyperlink r:id="rId12">
+      <m:oMathPara>
+        <m:oMathParaPr>
+          <m:jc m:val="center"/>
+        </m:oMathParaPr>
+        <m:oMath>
+          <m:eqArr>
+            <m:e>
+              <m:r>
+                <m:rPr>
+                  <m:sty m:val="p"/>
+                </m:rPr>
+                <m:t>E</m:t>
+              </m:r>
+              <m:r>
+                <m:t>​</m:t>
+              </m:r>
+              <m:d>
+                <m:dPr>
+                  <m:begChr m:val="["/>
+                  <m:sepChr m:val=""/>
+                  <m:endChr m:val="]"/>
+                  <m:grow/>
+                </m:dPr>
+                <m:e>
+                  <m:sSub>
+                    <m:e>
+                      <m:r>
+                        <m:t>S</m:t>
+                      </m:r>
+                    </m:e>
+                    <m:sub>
+                      <m:r>
+                        <m:t>n</m:t>
+                      </m:r>
+                    </m:sub>
+                  </m:sSub>
+                </m:e>
+              </m:d>
+              <m:r>
+                <m:t>​</m:t>
+              </m:r>
+              <m:r>
+                <m:t>&amp;</m:t>
+              </m:r>
+              <m:r>
+                <m:rPr>
+                  <m:sty m:val="p"/>
+                </m:rPr>
+                <m:t>=</m:t>
+              </m:r>
+              <m:r>
+                <m:t>n</m:t>
+              </m:r>
+              <m:r>
+                <m:t>μ</m:t>
+              </m:r>
+            </m:e>
+            <m:e>
+              <m:r>
+                <m:rPr>
+                  <m:sty m:val="p"/>
+                </m:rPr>
+                <m:t>Var</m:t>
+              </m:r>
+              <m:r>
+                <m:t>​</m:t>
+              </m:r>
+              <m:d>
+                <m:dPr>
+                  <m:begChr m:val="("/>
+                  <m:sepChr m:val=""/>
+                  <m:endChr m:val=")"/>
+                  <m:grow/>
+                </m:dPr>
+                <m:e>
+                  <m:sSub>
+                    <m:e>
+                      <m:r>
+                        <m:t>S</m:t>
+                      </m:r>
+                    </m:e>
+                    <m:sub>
+                      <m:r>
+                        <m:t>n</m:t>
+                      </m:r>
+                    </m:sub>
+                  </m:sSub>
+                </m:e>
+              </m:d>
+              <m:r>
+                <m:t>​</m:t>
+              </m:r>
+              <m:r>
+                <m:t>&amp;</m:t>
+              </m:r>
+              <m:r>
+                <m:rPr>
+                  <m:sty m:val="p"/>
+                </m:rPr>
+                <m:t>=</m:t>
+              </m:r>
+              <m:r>
+                <m:t>n</m:t>
+              </m:r>
+              <m:sSup>
+                <m:e>
+                  <m:r>
+                    <m:t>σ</m:t>
+                  </m:r>
+                </m:e>
+                <m:sup>
+                  <m:r>
+                    <m:t>2</m:t>
+                  </m:r>
+                </m:sup>
+              </m:sSup>
+            </m:e>
+          </m:eqArr>
+        </m:oMath>
+      </m:oMathPara>
+    </w:p>
+    <w:bookmarkEnd w:id="12"/>
+    <w:p>
+      <w:pPr>
+        <w:pStyle w:val="FirstParagraph"/>
+      </w:pPr>
+      <w:r>
+        <w:rPr>
+          <w:i/>
+          <w:iCs/>
+        </w:rPr>
+        <w:t xml:space="preserve">Proof</w:t>
+      </w:r>
+      <w:r>
+        <w:t xml:space="preserve">. </w:t>
+      </w:r>
+      <w:r>
+        <w:t xml:space="preserve">For the mean, apply</w:t>
+      </w:r>
+      <w:r>
+        <w:t xml:space="preserve"> </w:t>
+      </w:r>
+      <w:hyperlink r:id="rId13">
         <w:r>
           <w:rPr>
             <w:rStyle w:val="Hyperlink"/>
@@ -798,12 +1112,233 @@
         <w:t xml:space="preserve"> </w:t>
       </w:r>
       <w:r>
-        <w:t xml:space="preserve">and the</w:t>
-      </w:r>
-      <w:r>
-        <w:t xml:space="preserve"> </w:t>
-      </w:r>
-      <w:hyperlink r:id="rId13">
+        <w:t xml:space="preserve">once per added summand:</w:t>
+      </w:r>
+    </w:p>
+    <w:p>
+      <w:pPr>
+        <w:pStyle w:val="BodyText"/>
+      </w:pPr>
+      <m:oMathPara>
+        <m:oMathParaPr>
+          <m:jc m:val="center"/>
+        </m:oMathParaPr>
+        <m:oMath>
+          <m:eqArr>
+            <m:e>
+              <m:r>
+                <m:rPr>
+                  <m:sty m:val="p"/>
+                </m:rPr>
+                <m:t>E</m:t>
+              </m:r>
+              <m:r>
+                <m:t>​</m:t>
+              </m:r>
+              <m:d>
+                <m:dPr>
+                  <m:begChr m:val="["/>
+                  <m:sepChr m:val=""/>
+                  <m:endChr m:val="]"/>
+                  <m:grow/>
+                </m:dPr>
+                <m:e>
+                  <m:sSub>
+                    <m:e>
+                      <m:r>
+                        <m:t>S</m:t>
+                      </m:r>
+                    </m:e>
+                    <m:sub>
+                      <m:r>
+                        <m:t>n</m:t>
+                      </m:r>
+                    </m:sub>
+                  </m:sSub>
+                </m:e>
+              </m:d>
+              <m:r>
+                <m:t>​</m:t>
+              </m:r>
+              <m:r>
+                <m:t>&amp;</m:t>
+              </m:r>
+              <m:r>
+                <m:rPr>
+                  <m:sty m:val="p"/>
+                </m:rPr>
+                <m:t>=</m:t>
+              </m:r>
+              <m:nary>
+                <m:naryPr>
+                  <m:chr m:val="∑"/>
+                  <m:limLoc m:val="undOvr"/>
+                  <m:subHide m:val="off"/>
+                  <m:supHide m:val="off"/>
+                </m:naryPr>
+                <m:sub>
+                  <m:r>
+                    <m:t>i</m:t>
+                  </m:r>
+                  <m:r>
+                    <m:rPr>
+                      <m:sty m:val="p"/>
+                    </m:rPr>
+                    <m:t>=</m:t>
+                  </m:r>
+                  <m:r>
+                    <m:t>1</m:t>
+                  </m:r>
+                </m:sub>
+                <m:sup>
+                  <m:r>
+                    <m:t>n</m:t>
+                  </m:r>
+                </m:sup>
+                <m:e>
+                  <m:r>
+                    <m:rPr>
+                      <m:sty m:val="p"/>
+                    </m:rPr>
+                    <m:t>E</m:t>
+                  </m:r>
+                </m:e>
+              </m:nary>
+              <m:r>
+                <m:t>​</m:t>
+              </m:r>
+              <m:d>
+                <m:dPr>
+                  <m:begChr m:val="["/>
+                  <m:sepChr m:val=""/>
+                  <m:endChr m:val="]"/>
+                  <m:grow/>
+                </m:dPr>
+                <m:e>
+                  <m:sSub>
+                    <m:e>
+                      <m:r>
+                        <m:t>X</m:t>
+                      </m:r>
+                    </m:e>
+                    <m:sub>
+                      <m:r>
+                        <m:t>i</m:t>
+                      </m:r>
+                    </m:sub>
+                  </m:sSub>
+                </m:e>
+              </m:d>
+              <m:r>
+                <m:t>​</m:t>
+              </m:r>
+              <m:r>
+                <m:t>&amp;</m:t>
+              </m:r>
+              <m:r>
+                <m:t>&amp;</m:t>
+              </m:r>
+              <m:r>
+                <m:rPr>
+                  <m:nor/>
+                  <m:sty m:val="p"/>
+                </m:rPr>
+                <m:t>(linearity of expectation, applied </m:t>
+              </m:r>
+              <m:r>
+                <m:t>n</m:t>
+              </m:r>
+              <m:r>
+                <m:rPr>
+                  <m:sty m:val="p"/>
+                </m:rPr>
+                <m:t>−</m:t>
+              </m:r>
+              <m:r>
+                <m:t>1</m:t>
+              </m:r>
+              <m:r>
+                <m:rPr>
+                  <m:nor/>
+                  <m:sty m:val="p"/>
+                </m:rPr>
+                <m:t> times)</m:t>
+              </m:r>
+            </m:e>
+            <m:e>
+              <m:r>
+                <m:t>&amp;</m:t>
+              </m:r>
+              <m:r>
+                <m:rPr>
+                  <m:sty m:val="p"/>
+                </m:rPr>
+                <m:t>=</m:t>
+              </m:r>
+              <m:r>
+                <m:t>n</m:t>
+              </m:r>
+              <m:r>
+                <m:t>μ</m:t>
+              </m:r>
+              <m:r>
+                <m:t>&amp;</m:t>
+              </m:r>
+              <m:r>
+                <m:t>&amp;</m:t>
+              </m:r>
+              <m:r>
+                <m:rPr>
+                  <m:nor/>
+                  <m:sty m:val="p"/>
+                </m:rPr>
+                <m:t>(each </m:t>
+              </m:r>
+              <m:sSub>
+                <m:e>
+                  <m:r>
+                    <m:t>X</m:t>
+                  </m:r>
+                </m:e>
+                <m:sub>
+                  <m:r>
+                    <m:t>i</m:t>
+                  </m:r>
+                </m:sub>
+              </m:sSub>
+              <m:r>
+                <m:rPr>
+                  <m:nor/>
+                  <m:sty m:val="p"/>
+                </m:rPr>
+                <m:t> has mean </m:t>
+              </m:r>
+              <m:r>
+                <m:t>μ</m:t>
+              </m:r>
+              <m:r>
+                <m:rPr>
+                  <m:nor/>
+                  <m:sty m:val="p"/>
+                </m:rPr>
+                <m:t>)</m:t>
+              </m:r>
+            </m:e>
+          </m:eqArr>
+        </m:oMath>
+      </m:oMathPara>
+    </w:p>
+    <w:p>
+      <w:pPr>
+        <w:pStyle w:val="FirstParagraph"/>
+      </w:pPr>
+      <w:r>
+        <w:t xml:space="preserve">For the variance, apply the</w:t>
+      </w:r>
+      <w:r>
+        <w:t xml:space="preserve"> </w:t>
+      </w:r>
+      <w:hyperlink r:id="rId14">
         <w:r>
           <w:rPr>
             <w:rStyle w:val="Hyperlink"/>
@@ -815,12 +1350,261 @@
         <w:t xml:space="preserve"> </w:t>
       </w:r>
       <w:r>
-        <w:t xml:space="preserve">(whose covariance terms are 0 for</w:t>
-      </w:r>
-      <w:r>
-        <w:t xml:space="preserve"> </w:t>
-      </w:r>
-      <w:hyperlink r:id="rId14">
+        <w:t xml:space="preserve">with every</w:t>
+      </w:r>
+      <w:r>
+        <w:t xml:space="preserve"> </w:t>
+      </w:r>
+      <m:oMath>
+        <m:sSub>
+          <m:e>
+            <m:r>
+              <m:t>a</m:t>
+            </m:r>
+          </m:e>
+          <m:sub>
+            <m:r>
+              <m:t>i</m:t>
+            </m:r>
+          </m:sub>
+        </m:sSub>
+        <m:r>
+          <m:rPr>
+            <m:sty m:val="p"/>
+          </m:rPr>
+          <m:t>=</m:t>
+        </m:r>
+        <m:r>
+          <m:t>1</m:t>
+        </m:r>
+      </m:oMath>
+      <w:r>
+        <w:t xml:space="preserve">.</w:t>
+      </w:r>
+      <w:r>
+        <w:t xml:space="preserve"> </w:t>
+      </w:r>
+      <w:r>
+        <w:t xml:space="preserve">For</w:t>
+      </w:r>
+      <w:r>
+        <w:t xml:space="preserve"> </w:t>
+      </w:r>
+      <m:oMath>
+        <m:r>
+          <m:t>i</m:t>
+        </m:r>
+        <m:r>
+          <m:rPr>
+            <m:sty m:val="p"/>
+          </m:rPr>
+          <m:t>≠</m:t>
+        </m:r>
+        <m:r>
+          <m:t>j</m:t>
+        </m:r>
+      </m:oMath>
+      <w:r>
+        <w:t xml:space="preserve">,</w:t>
+      </w:r>
+      <w:r>
+        <w:t xml:space="preserve"> </w:t>
+      </w:r>
+      <m:oMath>
+        <m:sSub>
+          <m:e>
+            <m:r>
+              <m:t>X</m:t>
+            </m:r>
+          </m:e>
+          <m:sub>
+            <m:r>
+              <m:t>i</m:t>
+            </m:r>
+          </m:sub>
+        </m:sSub>
+      </m:oMath>
+      <w:r>
+        <w:t xml:space="preserve"> </w:t>
+      </w:r>
+      <w:r>
+        <w:t xml:space="preserve">and</w:t>
+      </w:r>
+      <w:r>
+        <w:t xml:space="preserve"> </w:t>
+      </w:r>
+      <m:oMath>
+        <m:sSub>
+          <m:e>
+            <m:r>
+              <m:t>X</m:t>
+            </m:r>
+          </m:e>
+          <m:sub>
+            <m:r>
+              <m:t>j</m:t>
+            </m:r>
+          </m:sub>
+        </m:sSub>
+      </m:oMath>
+      <w:r>
+        <w:t xml:space="preserve"> </w:t>
+      </w:r>
+      <w:r>
+        <w:t xml:space="preserve">are independent</w:t>
+      </w:r>
+      <w:r>
+        <w:t xml:space="preserve"> </w:t>
+      </w:r>
+      <w:r>
+        <w:t xml:space="preserve">(take</w:t>
+      </w:r>
+      <w:r>
+        <w:t xml:space="preserve"> </w:t>
+      </w:r>
+      <m:oMath>
+        <m:sSub>
+          <m:e>
+            <m:r>
+              <m:t>A</m:t>
+            </m:r>
+          </m:e>
+          <m:sub>
+            <m:r>
+              <m:t>k</m:t>
+            </m:r>
+          </m:sub>
+        </m:sSub>
+        <m:r>
+          <m:rPr>
+            <m:sty m:val="p"/>
+          </m:rPr>
+          <m:t>=</m:t>
+        </m:r>
+        <m:r>
+          <m:rPr>
+            <m:scr m:val="double-struck"/>
+            <m:sty m:val="p"/>
+          </m:rPr>
+          <m:t>R</m:t>
+        </m:r>
+      </m:oMath>
+      <w:r>
+        <w:t xml:space="preserve"> </w:t>
+      </w:r>
+      <w:r>
+        <w:t xml:space="preserve">for every other</w:t>
+      </w:r>
+      <w:r>
+        <w:t xml:space="preserve"> </w:t>
+      </w:r>
+      <m:oMath>
+        <m:r>
+          <m:t>k</m:t>
+        </m:r>
+      </m:oMath>
+      <w:r>
+        <w:t xml:space="preserve"> </w:t>
+      </w:r>
+      <w:r>
+        <w:t xml:space="preserve">in the</w:t>
+      </w:r>
+      <w:r>
+        <w:t xml:space="preserve"> </w:t>
+      </w:r>
+      <w:hyperlink r:id="rId15">
+        <w:r>
+          <w:rPr>
+            <w:rStyle w:val="Hyperlink"/>
+          </w:rPr>
+          <w:t xml:space="preserve">definition of independence</w:t>
+        </w:r>
+      </w:hyperlink>
+      <w:r>
+        <w:t xml:space="preserve">),</w:t>
+      </w:r>
+      <w:r>
+        <w:t xml:space="preserve"> </w:t>
+      </w:r>
+      <w:r>
+        <w:t xml:space="preserve">so</w:t>
+      </w:r>
+      <w:r>
+        <w:t xml:space="preserve"> </w:t>
+      </w:r>
+      <m:oMath>
+        <m:r>
+          <m:rPr>
+            <m:sty m:val="p"/>
+          </m:rPr>
+          <m:t>Cov</m:t>
+        </m:r>
+        <m:r>
+          <m:t>​</m:t>
+        </m:r>
+        <m:d>
+          <m:dPr>
+            <m:begChr m:val="("/>
+            <m:sepChr m:val=""/>
+            <m:endChr m:val=")"/>
+            <m:grow/>
+          </m:dPr>
+          <m:e>
+            <m:sSub>
+              <m:e>
+                <m:r>
+                  <m:t>X</m:t>
+                </m:r>
+              </m:e>
+              <m:sub>
+                <m:r>
+                  <m:t>i</m:t>
+                </m:r>
+              </m:sub>
+            </m:sSub>
+            <m:r>
+              <m:rPr>
+                <m:sty m:val="p"/>
+              </m:rPr>
+              <m:t>,</m:t>
+            </m:r>
+            <m:sSub>
+              <m:e>
+                <m:r>
+                  <m:t>X</m:t>
+                </m:r>
+              </m:e>
+              <m:sub>
+                <m:r>
+                  <m:t>j</m:t>
+                </m:r>
+              </m:sub>
+            </m:sSub>
+          </m:e>
+        </m:d>
+        <m:r>
+          <m:t>​</m:t>
+        </m:r>
+        <m:r>
+          <m:rPr>
+            <m:sty m:val="p"/>
+          </m:rPr>
+          <m:t>=</m:t>
+        </m:r>
+        <m:r>
+          <m:t>0</m:t>
+        </m:r>
+      </m:oMath>
+      <w:r>
+        <w:t xml:space="preserve"> </w:t>
+      </w:r>
+      <w:r>
+        <w:t xml:space="preserve">for</w:t>
+      </w:r>
+      <w:r>
+        <w:t xml:space="preserve"> </w:t>
+      </w:r>
+      <w:hyperlink r:id="rId16">
         <w:r>
           <w:rPr>
             <w:rStyle w:val="Hyperlink"/>
@@ -829,13 +1613,756 @@
         </w:r>
       </w:hyperlink>
       <w:r>
-        <w:t xml:space="preserve">)</w:t>
-      </w:r>
-      <w:r>
-        <w:t xml:space="preserve"> </w:t>
-      </w:r>
-      <w:r>
-        <w:t xml:space="preserve">are exactly the mean and variance of</w:t>
+        <w:t xml:space="preserve">;</w:t>
+      </w:r>
+      <w:r>
+        <w:t xml:space="preserve"> </w:t>
+      </w:r>
+      <w:r>
+        <w:t xml:space="preserve">and</w:t>
+      </w:r>
+      <w:r>
+        <w:t xml:space="preserve"> </w:t>
+      </w:r>
+      <m:oMath>
+        <m:r>
+          <m:rPr>
+            <m:sty m:val="p"/>
+          </m:rPr>
+          <m:t>Cov</m:t>
+        </m:r>
+        <m:r>
+          <m:t>​</m:t>
+        </m:r>
+        <m:d>
+          <m:dPr>
+            <m:begChr m:val="("/>
+            <m:sepChr m:val=""/>
+            <m:endChr m:val=")"/>
+            <m:grow/>
+          </m:dPr>
+          <m:e>
+            <m:sSub>
+              <m:e>
+                <m:r>
+                  <m:t>X</m:t>
+                </m:r>
+              </m:e>
+              <m:sub>
+                <m:r>
+                  <m:t>i</m:t>
+                </m:r>
+              </m:sub>
+            </m:sSub>
+            <m:r>
+              <m:rPr>
+                <m:sty m:val="p"/>
+              </m:rPr>
+              <m:t>,</m:t>
+            </m:r>
+            <m:sSub>
+              <m:e>
+                <m:r>
+                  <m:t>X</m:t>
+                </m:r>
+              </m:e>
+              <m:sub>
+                <m:r>
+                  <m:t>i</m:t>
+                </m:r>
+              </m:sub>
+            </m:sSub>
+          </m:e>
+        </m:d>
+        <m:r>
+          <m:t>​</m:t>
+        </m:r>
+        <m:r>
+          <m:rPr>
+            <m:sty m:val="p"/>
+          </m:rPr>
+          <m:t>=</m:t>
+        </m:r>
+        <m:r>
+          <m:rPr>
+            <m:sty m:val="p"/>
+          </m:rPr>
+          <m:t>Var</m:t>
+        </m:r>
+        <m:r>
+          <m:t>​</m:t>
+        </m:r>
+        <m:d>
+          <m:dPr>
+            <m:begChr m:val="("/>
+            <m:sepChr m:val=""/>
+            <m:endChr m:val=")"/>
+            <m:grow/>
+          </m:dPr>
+          <m:e>
+            <m:sSub>
+              <m:e>
+                <m:r>
+                  <m:t>X</m:t>
+                </m:r>
+              </m:e>
+              <m:sub>
+                <m:r>
+                  <m:t>i</m:t>
+                </m:r>
+              </m:sub>
+            </m:sSub>
+          </m:e>
+        </m:d>
+        <m:r>
+          <m:t>​</m:t>
+        </m:r>
+      </m:oMath>
+      <w:r>
+        <w:t xml:space="preserve"> </w:t>
+      </w:r>
+      <w:r>
+        <w:t xml:space="preserve">(</w:t>
+      </w:r>
+      <w:hyperlink r:id="rId17">
+        <w:r>
+          <w:rPr>
+            <w:rStyle w:val="Hyperlink"/>
+          </w:rPr>
+          <w:t xml:space="preserve">covariance of a variable with itself</w:t>
+        </w:r>
+      </w:hyperlink>
+      <w:r>
+        <w:t xml:space="preserve">):</w:t>
+      </w:r>
+    </w:p>
+    <w:p>
+      <w:pPr>
+        <w:pStyle w:val="BodyText"/>
+      </w:pPr>
+      <m:oMathPara>
+        <m:oMathParaPr>
+          <m:jc m:val="center"/>
+        </m:oMathParaPr>
+        <m:oMath>
+          <m:eqArr>
+            <m:e>
+              <m:r>
+                <m:rPr>
+                  <m:sty m:val="p"/>
+                </m:rPr>
+                <m:t>Var</m:t>
+              </m:r>
+              <m:r>
+                <m:t>​</m:t>
+              </m:r>
+              <m:d>
+                <m:dPr>
+                  <m:begChr m:val="("/>
+                  <m:sepChr m:val=""/>
+                  <m:endChr m:val=")"/>
+                  <m:grow/>
+                </m:dPr>
+                <m:e>
+                  <m:sSub>
+                    <m:e>
+                      <m:r>
+                        <m:t>S</m:t>
+                      </m:r>
+                    </m:e>
+                    <m:sub>
+                      <m:r>
+                        <m:t>n</m:t>
+                      </m:r>
+                    </m:sub>
+                  </m:sSub>
+                </m:e>
+              </m:d>
+              <m:r>
+                <m:t>​</m:t>
+              </m:r>
+              <m:r>
+                <m:t>&amp;</m:t>
+              </m:r>
+              <m:r>
+                <m:rPr>
+                  <m:sty m:val="p"/>
+                </m:rPr>
+                <m:t>=</m:t>
+              </m:r>
+              <m:nary>
+                <m:naryPr>
+                  <m:chr m:val="∑"/>
+                  <m:limLoc m:val="undOvr"/>
+                  <m:subHide m:val="off"/>
+                  <m:supHide m:val="off"/>
+                </m:naryPr>
+                <m:sub>
+                  <m:r>
+                    <m:t>i</m:t>
+                  </m:r>
+                  <m:r>
+                    <m:rPr>
+                      <m:sty m:val="p"/>
+                    </m:rPr>
+                    <m:t>=</m:t>
+                  </m:r>
+                  <m:r>
+                    <m:t>1</m:t>
+                  </m:r>
+                </m:sub>
+                <m:sup>
+                  <m:r>
+                    <m:t>n</m:t>
+                  </m:r>
+                </m:sup>
+                <m:e>
+                  <m:nary>
+                    <m:naryPr>
+                      <m:chr m:val="∑"/>
+                      <m:limLoc m:val="undOvr"/>
+                      <m:subHide m:val="off"/>
+                      <m:supHide m:val="off"/>
+                    </m:naryPr>
+                    <m:sub>
+                      <m:r>
+                        <m:t>j</m:t>
+                      </m:r>
+                      <m:r>
+                        <m:rPr>
+                          <m:sty m:val="p"/>
+                        </m:rPr>
+                        <m:t>=</m:t>
+                      </m:r>
+                      <m:r>
+                        <m:t>1</m:t>
+                      </m:r>
+                    </m:sub>
+                    <m:sup>
+                      <m:r>
+                        <m:t>n</m:t>
+                      </m:r>
+                    </m:sup>
+                    <m:e>
+                      <m:r>
+                        <m:rPr>
+                          <m:sty m:val="p"/>
+                        </m:rPr>
+                        <m:t>Cov</m:t>
+                      </m:r>
+                    </m:e>
+                  </m:nary>
+                </m:e>
+              </m:nary>
+              <m:r>
+                <m:t>​</m:t>
+              </m:r>
+              <m:d>
+                <m:dPr>
+                  <m:begChr m:val="("/>
+                  <m:sepChr m:val=""/>
+                  <m:endChr m:val=")"/>
+                  <m:grow/>
+                </m:dPr>
+                <m:e>
+                  <m:sSub>
+                    <m:e>
+                      <m:r>
+                        <m:t>X</m:t>
+                      </m:r>
+                    </m:e>
+                    <m:sub>
+                      <m:r>
+                        <m:t>i</m:t>
+                      </m:r>
+                    </m:sub>
+                  </m:sSub>
+                  <m:r>
+                    <m:rPr>
+                      <m:sty m:val="p"/>
+                    </m:rPr>
+                    <m:t>,</m:t>
+                  </m:r>
+                  <m:sSub>
+                    <m:e>
+                      <m:r>
+                        <m:t>X</m:t>
+                      </m:r>
+                    </m:e>
+                    <m:sub>
+                      <m:r>
+                        <m:t>j</m:t>
+                      </m:r>
+                    </m:sub>
+                  </m:sSub>
+                </m:e>
+              </m:d>
+              <m:r>
+                <m:t>​</m:t>
+              </m:r>
+              <m:r>
+                <m:t>&amp;</m:t>
+              </m:r>
+              <m:r>
+                <m:t>&amp;</m:t>
+              </m:r>
+              <m:r>
+                <m:rPr>
+                  <m:nor/>
+                  <m:sty m:val="p"/>
+                </m:rPr>
+                <m:t>(variance of a linear combination, all </m:t>
+              </m:r>
+              <m:sSub>
+                <m:e>
+                  <m:r>
+                    <m:t>a</m:t>
+                  </m:r>
+                </m:e>
+                <m:sub>
+                  <m:r>
+                    <m:t>i</m:t>
+                  </m:r>
+                </m:sub>
+              </m:sSub>
+              <m:r>
+                <m:rPr>
+                  <m:sty m:val="p"/>
+                </m:rPr>
+                <m:t>=</m:t>
+              </m:r>
+              <m:r>
+                <m:t>1</m:t>
+              </m:r>
+              <m:r>
+                <m:rPr>
+                  <m:nor/>
+                  <m:sty m:val="p"/>
+                </m:rPr>
+                <m:t>)</m:t>
+              </m:r>
+            </m:e>
+            <m:e>
+              <m:r>
+                <m:t>&amp;</m:t>
+              </m:r>
+              <m:r>
+                <m:rPr>
+                  <m:sty m:val="p"/>
+                </m:rPr>
+                <m:t>=</m:t>
+              </m:r>
+              <m:nary>
+                <m:naryPr>
+                  <m:chr m:val="∑"/>
+                  <m:limLoc m:val="undOvr"/>
+                  <m:subHide m:val="off"/>
+                  <m:supHide m:val="off"/>
+                </m:naryPr>
+                <m:sub>
+                  <m:r>
+                    <m:t>i</m:t>
+                  </m:r>
+                  <m:r>
+                    <m:rPr>
+                      <m:sty m:val="p"/>
+                    </m:rPr>
+                    <m:t>=</m:t>
+                  </m:r>
+                  <m:r>
+                    <m:t>1</m:t>
+                  </m:r>
+                </m:sub>
+                <m:sup>
+                  <m:r>
+                    <m:t>n</m:t>
+                  </m:r>
+                </m:sup>
+                <m:e>
+                  <m:r>
+                    <m:rPr>
+                      <m:sty m:val="p"/>
+                    </m:rPr>
+                    <m:t>Cov</m:t>
+                  </m:r>
+                </m:e>
+              </m:nary>
+              <m:r>
+                <m:t>​</m:t>
+              </m:r>
+              <m:d>
+                <m:dPr>
+                  <m:begChr m:val="("/>
+                  <m:sepChr m:val=""/>
+                  <m:endChr m:val=")"/>
+                  <m:grow/>
+                </m:dPr>
+                <m:e>
+                  <m:sSub>
+                    <m:e>
+                      <m:r>
+                        <m:t>X</m:t>
+                      </m:r>
+                    </m:e>
+                    <m:sub>
+                      <m:r>
+                        <m:t>i</m:t>
+                      </m:r>
+                    </m:sub>
+                  </m:sSub>
+                  <m:r>
+                    <m:rPr>
+                      <m:sty m:val="p"/>
+                    </m:rPr>
+                    <m:t>,</m:t>
+                  </m:r>
+                  <m:sSub>
+                    <m:e>
+                      <m:r>
+                        <m:t>X</m:t>
+                      </m:r>
+                    </m:e>
+                    <m:sub>
+                      <m:r>
+                        <m:t>i</m:t>
+                      </m:r>
+                    </m:sub>
+                  </m:sSub>
+                </m:e>
+              </m:d>
+              <m:r>
+                <m:t>​</m:t>
+              </m:r>
+              <m:r>
+                <m:rPr>
+                  <m:sty m:val="p"/>
+                </m:rPr>
+                <m:t>+</m:t>
+              </m:r>
+              <m:nary>
+                <m:naryPr>
+                  <m:chr m:val="∑"/>
+                  <m:limLoc m:val="undOvr"/>
+                  <m:subHide m:val="off"/>
+                  <m:supHide m:val="on"/>
+                </m:naryPr>
+                <m:sub>
+                  <m:r>
+                    <m:t>i</m:t>
+                  </m:r>
+                  <m:r>
+                    <m:rPr>
+                      <m:sty m:val="p"/>
+                    </m:rPr>
+                    <m:t>≠</m:t>
+                  </m:r>
+                  <m:r>
+                    <m:t>j</m:t>
+                  </m:r>
+                </m:sub>
+                <m:sup>
+                  <m:r>
+                    <m:t>​</m:t>
+                  </m:r>
+                </m:sup>
+                <m:e>
+                  <m:r>
+                    <m:rPr>
+                      <m:sty m:val="p"/>
+                    </m:rPr>
+                    <m:t>Cov</m:t>
+                  </m:r>
+                </m:e>
+              </m:nary>
+              <m:r>
+                <m:t>​</m:t>
+              </m:r>
+              <m:d>
+                <m:dPr>
+                  <m:begChr m:val="("/>
+                  <m:sepChr m:val=""/>
+                  <m:endChr m:val=")"/>
+                  <m:grow/>
+                </m:dPr>
+                <m:e>
+                  <m:sSub>
+                    <m:e>
+                      <m:r>
+                        <m:t>X</m:t>
+                      </m:r>
+                    </m:e>
+                    <m:sub>
+                      <m:r>
+                        <m:t>i</m:t>
+                      </m:r>
+                    </m:sub>
+                  </m:sSub>
+                  <m:r>
+                    <m:rPr>
+                      <m:sty m:val="p"/>
+                    </m:rPr>
+                    <m:t>,</m:t>
+                  </m:r>
+                  <m:sSub>
+                    <m:e>
+                      <m:r>
+                        <m:t>X</m:t>
+                      </m:r>
+                    </m:e>
+                    <m:sub>
+                      <m:r>
+                        <m:t>j</m:t>
+                      </m:r>
+                    </m:sub>
+                  </m:sSub>
+                </m:e>
+              </m:d>
+              <m:r>
+                <m:t>​</m:t>
+              </m:r>
+              <m:r>
+                <m:t>&amp;</m:t>
+              </m:r>
+              <m:r>
+                <m:t>&amp;</m:t>
+              </m:r>
+              <m:r>
+                <m:rPr>
+                  <m:nor/>
+                  <m:sty m:val="p"/>
+                </m:rPr>
+                <m:t>(split off the terms with </m:t>
+              </m:r>
+              <m:r>
+                <m:t>i</m:t>
+              </m:r>
+              <m:r>
+                <m:rPr>
+                  <m:sty m:val="p"/>
+                </m:rPr>
+                <m:t>=</m:t>
+              </m:r>
+              <m:r>
+                <m:t>j</m:t>
+              </m:r>
+              <m:r>
+                <m:rPr>
+                  <m:nor/>
+                  <m:sty m:val="p"/>
+                </m:rPr>
+                <m:t>)</m:t>
+              </m:r>
+            </m:e>
+            <m:e>
+              <m:r>
+                <m:t>&amp;</m:t>
+              </m:r>
+              <m:r>
+                <m:rPr>
+                  <m:sty m:val="p"/>
+                </m:rPr>
+                <m:t>=</m:t>
+              </m:r>
+              <m:nary>
+                <m:naryPr>
+                  <m:chr m:val="∑"/>
+                  <m:limLoc m:val="undOvr"/>
+                  <m:subHide m:val="off"/>
+                  <m:supHide m:val="off"/>
+                </m:naryPr>
+                <m:sub>
+                  <m:r>
+                    <m:t>i</m:t>
+                  </m:r>
+                  <m:r>
+                    <m:rPr>
+                      <m:sty m:val="p"/>
+                    </m:rPr>
+                    <m:t>=</m:t>
+                  </m:r>
+                  <m:r>
+                    <m:t>1</m:t>
+                  </m:r>
+                </m:sub>
+                <m:sup>
+                  <m:r>
+                    <m:t>n</m:t>
+                  </m:r>
+                </m:sup>
+                <m:e>
+                  <m:r>
+                    <m:rPr>
+                      <m:sty m:val="p"/>
+                    </m:rPr>
+                    <m:t>Var</m:t>
+                  </m:r>
+                </m:e>
+              </m:nary>
+              <m:r>
+                <m:t>​</m:t>
+              </m:r>
+              <m:d>
+                <m:dPr>
+                  <m:begChr m:val="("/>
+                  <m:sepChr m:val=""/>
+                  <m:endChr m:val=")"/>
+                  <m:grow/>
+                </m:dPr>
+                <m:e>
+                  <m:sSub>
+                    <m:e>
+                      <m:r>
+                        <m:t>X</m:t>
+                      </m:r>
+                    </m:e>
+                    <m:sub>
+                      <m:r>
+                        <m:t>i</m:t>
+                      </m:r>
+                    </m:sub>
+                  </m:sSub>
+                </m:e>
+              </m:d>
+              <m:r>
+                <m:t>​</m:t>
+              </m:r>
+              <m:r>
+                <m:rPr>
+                  <m:sty m:val="p"/>
+                </m:rPr>
+                <m:t>+</m:t>
+              </m:r>
+              <m:r>
+                <m:t>0</m:t>
+              </m:r>
+              <m:r>
+                <m:t>&amp;</m:t>
+              </m:r>
+              <m:r>
+                <m:t>&amp;</m:t>
+              </m:r>
+              <m:r>
+                <m:rPr>
+                  <m:nor/>
+                  <m:sty m:val="p"/>
+                </m:rPr>
+                <m:t>(covariance with itself; independent summands)</m:t>
+              </m:r>
+            </m:e>
+            <m:e>
+              <m:r>
+                <m:t>&amp;</m:t>
+              </m:r>
+              <m:r>
+                <m:rPr>
+                  <m:sty m:val="p"/>
+                </m:rPr>
+                <m:t>=</m:t>
+              </m:r>
+              <m:r>
+                <m:t>n</m:t>
+              </m:r>
+              <m:sSup>
+                <m:e>
+                  <m:r>
+                    <m:t>σ</m:t>
+                  </m:r>
+                </m:e>
+                <m:sup>
+                  <m:r>
+                    <m:t>2</m:t>
+                  </m:r>
+                </m:sup>
+              </m:sSup>
+              <m:r>
+                <m:t>&amp;</m:t>
+              </m:r>
+              <m:r>
+                <m:t>&amp;</m:t>
+              </m:r>
+              <m:r>
+                <m:rPr>
+                  <m:nor/>
+                  <m:sty m:val="p"/>
+                </m:rPr>
+                <m:t>(each </m:t>
+              </m:r>
+              <m:sSub>
+                <m:e>
+                  <m:r>
+                    <m:t>X</m:t>
+                  </m:r>
+                </m:e>
+                <m:sub>
+                  <m:r>
+                    <m:t>i</m:t>
+                  </m:r>
+                </m:sub>
+              </m:sSub>
+              <m:r>
+                <m:rPr>
+                  <m:nor/>
+                  <m:sty m:val="p"/>
+                </m:rPr>
+                <m:t> has variance </m:t>
+              </m:r>
+              <m:sSup>
+                <m:e>
+                  <m:r>
+                    <m:t>σ</m:t>
+                  </m:r>
+                </m:e>
+                <m:sup>
+                  <m:r>
+                    <m:t>2</m:t>
+                  </m:r>
+                </m:sup>
+              </m:sSup>
+              <m:r>
+                <m:rPr>
+                  <m:nor/>
+                  <m:sty m:val="p"/>
+                </m:rPr>
+                <m:t>)</m:t>
+              </m:r>
+            </m:e>
+          </m:eqArr>
+        </m:oMath>
+      </m:oMathPara>
+    </w:p>
+    <w:p>
+      <w:pPr>
+        <w:pStyle w:val="FirstParagraph"/>
+      </w:pPr>
+      <w:r>
+        <w:rPr>
+          <w:i/>
+          <w:iCs/>
+        </w:rPr>
+        <w:t xml:space="preserve">Remark</w:t>
+      </w:r>
+      <w:r>
+        <w:t xml:space="preserve">. </w:t>
+      </w:r>
+      <w:r>
+        <w:t xml:space="preserve">In practice,</w:t>
+      </w:r>
+      <w:r>
+        <w:t xml:space="preserve"> </w:t>
+      </w:r>
+      <w:hyperlink w:anchor="thm-clt">
+        <w:r>
+          <w:rPr>
+            <w:rStyle w:val="Hyperlink"/>
+          </w:rPr>
+          <w:t xml:space="preserve">Theorem 1</w:t>
+        </w:r>
+      </w:hyperlink>
+      <w:r>
+        <w:t xml:space="preserve"> </w:t>
+      </w:r>
+      <w:r>
+        <w:t xml:space="preserve">justifies approximating</w:t>
       </w:r>
       <w:r>
         <w:t xml:space="preserve"> </w:t>
@@ -855,10 +2382,96 @@
         </m:sSub>
       </m:oMath>
       <w:r>
+        <w:t xml:space="preserve"> </w:t>
+      </w:r>
+      <w:r>
+        <w:t xml:space="preserve">by a normal distribution with mean</w:t>
+      </w:r>
+      <w:r>
+        <w:t xml:space="preserve"> </w:t>
+      </w:r>
+      <m:oMath>
+        <m:r>
+          <m:t>n</m:t>
+        </m:r>
+        <m:r>
+          <m:t>μ</m:t>
+        </m:r>
+      </m:oMath>
+      <w:r>
+        <w:t xml:space="preserve"> </w:t>
+      </w:r>
+      <w:r>
+        <w:t xml:space="preserve">and variance</w:t>
+      </w:r>
+      <w:r>
+        <w:t xml:space="preserve"> </w:t>
+      </w:r>
+      <m:oMath>
+        <m:r>
+          <m:t>n</m:t>
+        </m:r>
+        <m:sSup>
+          <m:e>
+            <m:r>
+              <m:t>σ</m:t>
+            </m:r>
+          </m:e>
+          <m:sup>
+            <m:r>
+              <m:t>2</m:t>
+            </m:r>
+          </m:sup>
+        </m:sSup>
+      </m:oMath>
+      <w:r>
+        <w:t xml:space="preserve">,</w:t>
+      </w:r>
+      <w:r>
+        <w:t xml:space="preserve"> </w:t>
+      </w:r>
+      <w:r>
+        <w:t xml:space="preserve">which by</w:t>
+      </w:r>
+      <w:r>
+        <w:t xml:space="preserve"> </w:t>
+      </w:r>
+      <w:hyperlink w:anchor="cor-sum-iid-moments">
+        <w:r>
+          <w:rPr>
+            <w:rStyle w:val="Hyperlink"/>
+          </w:rPr>
+          <w:t xml:space="preserve">Corollary 1</w:t>
+        </w:r>
+      </w:hyperlink>
+      <w:r>
+        <w:t xml:space="preserve"> </w:t>
+      </w:r>
+      <w:r>
+        <w:t xml:space="preserve">are exactly the mean and variance of</w:t>
+      </w:r>
+      <w:r>
+        <w:t xml:space="preserve"> </w:t>
+      </w:r>
+      <m:oMath>
+        <m:sSub>
+          <m:e>
+            <m:r>
+              <m:t>S</m:t>
+            </m:r>
+          </m:e>
+          <m:sub>
+            <m:r>
+              <m:t>n</m:t>
+            </m:r>
+          </m:sub>
+        </m:sSub>
+      </m:oMath>
+      <w:r>
         <w:t xml:space="preserve">.</w:t>
       </w:r>
     </w:p>
-    <w:bookmarkStart w:id="23" w:name="exm-clt-5d6"/>
+    <w:bookmarkStart w:id="26" w:name="exm-clt-5d6"/>
     <w:p>
       <w:pPr>
         <w:pStyle w:val="BodyText"/>
@@ -1689,7 +3302,7 @@
       <w:tr>
         <w:tc>
           <w:tcPr/>
-          <w:bookmarkStart w:id="18" w:name="fig-clt-1d6"/>
+          <w:bookmarkStart w:id="21" w:name="fig-clt-1d6"/>
           <w:p>
             <w:pPr>
               <w:pStyle w:val="Compact"/>
@@ -1700,18 +3313,18 @@
                 <wp:inline>
                   <wp:extent cx="4620126" cy="3696101"/>
                   <wp:effectExtent b="0" l="0" r="0" t="0"/>
-                  <wp:docPr descr="" title="" id="16" name="Picture"/>
+                  <wp:docPr descr="" title="" id="19" name="Picture"/>
                   <a:graphic>
                     <a:graphicData uri="http://schemas.openxmlformats.org/drawingml/2006/picture">
                       <pic:pic>
                         <pic:nvPicPr>
-                          <pic:cNvPr descr="limit-theorems_files/figure-docx/fig-clt-1d6-1.png" id="17" name="Picture"/>
+                          <pic:cNvPr descr="limit-theorems_files/figure-docx/fig-clt-1d6-1.png" id="20" name="Picture"/>
                           <pic:cNvPicPr>
                             <a:picLocks noChangeArrowheads="1" noChangeAspect="1"/>
                           </pic:cNvPicPr>
                         </pic:nvPicPr>
                         <pic:blipFill>
-                          <a:blip r:embed="rId15"/>
+                          <a:blip r:embed="rId18"/>
                           <a:stretch>
                             <a:fillRect/>
                           </a:stretch>
@@ -1751,7 +3364,7 @@
               <w:t xml:space="preserve">Figure 1: Distribution of the outcome of one die</w:t>
             </w:r>
           </w:p>
-          <w:bookmarkEnd w:id="18"/>
+          <w:bookmarkEnd w:id="21"/>
         </w:tc>
       </w:tr>
     </w:tbl>
@@ -1911,7 +3524,7 @@
       <w:tr>
         <w:tc>
           <w:tcPr/>
-          <w:bookmarkStart w:id="22" w:name="fig-clt-5d6"/>
+          <w:bookmarkStart w:id="25" w:name="fig-clt-5d6"/>
           <w:p>
             <w:pPr>
               <w:pStyle w:val="Compact"/>
@@ -1922,18 +3535,18 @@
                 <wp:inline>
                   <wp:extent cx="4620126" cy="3696101"/>
                   <wp:effectExtent b="0" l="0" r="0" t="0"/>
-                  <wp:docPr descr="" title="" id="20" name="Picture"/>
+                  <wp:docPr descr="" title="" id="23" name="Picture"/>
                   <a:graphic>
                     <a:graphicData uri="http://schemas.openxmlformats.org/drawingml/2006/picture">
                       <pic:pic>
                         <pic:nvPicPr>
-                          <pic:cNvPr descr="limit-theorems_files/figure-docx/fig-clt-5d6-1.png" id="21" name="Picture"/>
+                          <pic:cNvPr descr="limit-theorems_files/figure-docx/fig-clt-5d6-1.png" id="24" name="Picture"/>
                           <pic:cNvPicPr>
                             <a:picLocks noChangeArrowheads="1" noChangeAspect="1"/>
                           </pic:cNvPicPr>
                         </pic:nvPicPr>
                         <pic:blipFill>
-                          <a:blip r:embed="rId19"/>
+                          <a:blip r:embed="rId22"/>
                           <a:stretch>
                             <a:fillRect/>
                           </a:stretch>
@@ -1973,7 +3586,7 @@
               <w:t xml:space="preserve">Figure 2: Distribution of the sum of five dice</w:t>
             </w:r>
           </w:p>
-          <w:bookmarkEnd w:id="22"/>
+          <w:bookmarkEnd w:id="25"/>
         </w:tc>
       </w:tr>
     </w:tbl>
@@ -2269,9 +3882,9 @@
         <w:t xml:space="preserve">.</w:t>
       </w:r>
     </w:p>
-    <w:bookmarkEnd w:id="23"/>
-    <w:bookmarkEnd w:id="24"/>
-    <w:bookmarkStart w:id="27" w:name="references"/>
+    <w:bookmarkEnd w:id="26"/>
+    <w:bookmarkEnd w:id="27"/>
+    <w:bookmarkStart w:id="30" w:name="references"/>
     <w:p>
       <w:pPr>
         <w:pStyle w:val="Heading2"/>
@@ -2280,8 +3893,8 @@
         <w:t xml:space="preserve">References</w:t>
       </w:r>
     </w:p>
-    <w:bookmarkStart w:id="26" w:name="refs"/>
-    <w:bookmarkStart w:id="25" w:name="ref-billingsley1995probability"/>
+    <w:bookmarkStart w:id="29" w:name="refs"/>
+    <w:bookmarkStart w:id="28" w:name="ref-billingsley1995probability"/>
     <w:p>
       <w:pPr>
         <w:pStyle w:val="Bibliography"/>
@@ -2303,9 +3916,9 @@
         <w:t xml:space="preserve">. 3rd ed. Wiley Series in Probability and Mathematical Statistics. Wiley.</w:t>
       </w:r>
     </w:p>
-    <w:bookmarkEnd w:id="25"/>
-    <w:bookmarkEnd w:id="26"/>
-    <w:bookmarkEnd w:id="27"/>
+    <w:bookmarkEnd w:id="28"/>
+    <w:bookmarkEnd w:id="29"/>
+    <w:bookmarkEnd w:id="30"/>
     <w:sectPr>
       <w:footnotePr>
         <w:numRestart w:val="eachSect"/>

</xml_diff>

<commit_message>
Deploying to gh-pages from @ Morrison-Lab/pds@5de227cbcef7fff8128afe01bf34ed174ba9a94c 🚀
</commit_message>
<xml_diff>
--- a/limit-theorems.docx
+++ b/limit-theorems.docx
@@ -15,10 +15,10 @@
         <w:pStyle w:val="Date"/>
       </w:pPr>
       <w:r>
-        <w:t xml:space="preserve">Last modified: 2026-10-08 09:21:46 (PDT)</w:t>
+        <w:t xml:space="preserve">Last modified: 2026-10-08 09:59:08 (PDT)</w:t>
       </w:r>
     </w:p>
-    <w:bookmarkStart w:id="27" w:name="sec-clt"/>
+    <w:bookmarkStart w:id="34" w:name="sec-clt"/>
     <w:p>
       <w:pPr>
         <w:pStyle w:val="Heading2"/>
@@ -3926,8 +3926,2834 @@
       </w:r>
     </w:p>
     <w:bookmarkEnd w:id="26"/>
-    <w:bookmarkEnd w:id="27"/>
-    <w:bookmarkStart w:id="30" w:name="references"/>
+    <w:bookmarkStart w:id="33" w:name="exm-clt-auto"/>
+    <w:p>
+      <w:pPr>
+        <w:pStyle w:val="BodyText"/>
+      </w:pPr>
+      <w:r>
+        <w:rPr>
+          <w:b/>
+          <w:bCs/>
+        </w:rPr>
+        <w:t xml:space="preserve">Example 2 (Sample means of car horsepower)</w:t>
+      </w:r>
+      <w:r>
+        <w:t xml:space="preserve"> </w:t>
+      </w:r>
+      <w:r>
+        <w:t xml:space="preserve">The Auto data record the horsepower and fuel economy of</w:t>
+      </w:r>
+      <w:r>
+        <w:t xml:space="preserve"> </w:t>
+      </w:r>
+      <w:r>
+        <w:t xml:space="preserve">392 car models</w:t>
+      </w:r>
+      <w:r>
+        <w:t xml:space="preserve"> </w:t>
+      </w:r>
+      <w:r>
+        <w:t xml:space="preserve">sold between 1970 and 1982.</w:t>
+      </w:r>
+      <w:r>
+        <w:t xml:space="preserve"> </w:t>
+      </w:r>
+      <w:r>
+        <w:t xml:space="preserve">They come from the StatLib library at Carnegie Mellon University</w:t>
+      </w:r>
+      <w:r>
+        <w:t xml:space="preserve"> </w:t>
+      </w:r>
+      <w:r>
+        <w:t xml:space="preserve">and ship with the book</w:t>
+      </w:r>
+      <w:r>
+        <w:t xml:space="preserve"> </w:t>
+      </w:r>
+      <w:r>
+        <w:rPr>
+          <w:i/>
+          <w:iCs/>
+        </w:rPr>
+        <w:t xml:space="preserve">An Introduction to Statistical Learning</w:t>
+      </w:r>
+      <w:r>
+        <w:t xml:space="preserve">,</w:t>
+      </w:r>
+      <w:r>
+        <w:t xml:space="preserve"> </w:t>
+      </w:r>
+      <w:r>
+        <w:t xml:space="preserve">in the Python package</w:t>
+      </w:r>
+      <w:r>
+        <w:t xml:space="preserve"> </w:t>
+      </w:r>
+      <w:hyperlink r:id="rId27">
+        <w:r>
+          <w:rPr>
+            <w:rStyle w:val="VerbatimChar"/>
+          </w:rPr>
+          <w:t xml:space="preserve">ISLP</w:t>
+        </w:r>
+      </w:hyperlink>
+      <w:r>
+        <w:t xml:space="preserve"> </w:t>
+      </w:r>
+      <w:r>
+        <w:t xml:space="preserve">(</w:t>
+      </w:r>
+      <w:r>
+        <w:rPr>
+          <w:rStyle w:val="VerbatimChar"/>
+        </w:rPr>
+        <w:t xml:space="preserve">ISLP.load_data("Auto")</w:t>
+      </w:r>
+      <w:r>
+        <w:t xml:space="preserve">)</w:t>
+      </w:r>
+      <w:r>
+        <w:t xml:space="preserve"> </w:t>
+      </w:r>
+      <w:r>
+        <w:t xml:space="preserve">and the R package</w:t>
+      </w:r>
+      <w:r>
+        <w:t xml:space="preserve"> </w:t>
+      </w:r>
+      <w:hyperlink r:id="rId28">
+        <w:r>
+          <w:rPr>
+            <w:rStyle w:val="VerbatimChar"/>
+          </w:rPr>
+          <w:t xml:space="preserve">ISLR2</w:t>
+        </w:r>
+      </w:hyperlink>
+      <w:r>
+        <w:t xml:space="preserve"> </w:t>
+      </w:r>
+      <w:r>
+        <w:t xml:space="preserve">(</w:t>
+      </w:r>
+      <w:r>
+        <w:rPr>
+          <w:rStyle w:val="VerbatimChar"/>
+        </w:rPr>
+        <w:t xml:space="preserve">ISLR2::Auto</w:t>
+      </w:r>
+      <w:r>
+        <w:t xml:space="preserve">).</w:t>
+      </w:r>
+      <w:r>
+        <w:t xml:space="preserve"> </w:t>
+      </w:r>
+      <w:r>
+        <w:t xml:space="preserve">This repository holds a copy at</w:t>
+      </w:r>
+      <w:r>
+        <w:t xml:space="preserve"> </w:t>
+      </w:r>
+      <w:r>
+        <w:rPr>
+          <w:rStyle w:val="VerbatimChar"/>
+        </w:rPr>
+        <w:t xml:space="preserve">data/auto.csv</w:t>
+      </w:r>
+      <w:r>
+        <w:t xml:space="preserve">,</w:t>
+      </w:r>
+      <w:r>
+        <w:t xml:space="preserve"> </w:t>
+      </w:r>
+      <w:r>
+        <w:t xml:space="preserve">and both code tabs below read that file.</w:t>
+      </w:r>
+    </w:p>
+    <w:p>
+      <w:pPr>
+        <w:pStyle w:val="BodyText"/>
+      </w:pPr>
+      <w:r>
+        <w:t xml:space="preserve">Horsepower is not bell-shaped:</w:t>
+      </w:r>
+      <w:r>
+        <w:t xml:space="preserve"> </w:t>
+      </w:r>
+      <w:r>
+        <w:t xml:space="preserve">a few powerful cars give it a long right tail.</w:t>
+      </w:r>
+      <w:r>
+        <w:t xml:space="preserve"> </w:t>
+      </w:r>
+      <w:r>
+        <w:t xml:space="preserve">To apply</w:t>
+      </w:r>
+      <w:r>
+        <w:t xml:space="preserve"> </w:t>
+      </w:r>
+      <w:hyperlink w:anchor="thm-clt">
+        <w:r>
+          <w:rPr>
+            <w:rStyle w:val="Hyperlink"/>
+          </w:rPr>
+          <w:t xml:space="preserve">Theorem 1</w:t>
+        </w:r>
+      </w:hyperlink>
+      <w:r>
+        <w:t xml:space="preserve">, treat each draw of one car at random as one IID observation</w:t>
+      </w:r>
+      <w:r>
+        <w:t xml:space="preserve"> </w:t>
+      </w:r>
+      <m:oMath>
+        <m:sSub>
+          <m:e>
+            <m:r>
+              <m:t>X</m:t>
+            </m:r>
+          </m:e>
+          <m:sub>
+            <m:r>
+              <m:t>i</m:t>
+            </m:r>
+          </m:sub>
+        </m:sSub>
+      </m:oMath>
+      <w:r>
+        <w:t xml:space="preserve">,</w:t>
+      </w:r>
+      <w:r>
+        <w:t xml:space="preserve"> </w:t>
+      </w:r>
+      <w:r>
+        <w:t xml:space="preserve">so that</w:t>
+      </w:r>
+      <w:r>
+        <w:t xml:space="preserve"> </w:t>
+      </w:r>
+      <m:oMath>
+        <m:r>
+          <m:t>μ</m:t>
+        </m:r>
+      </m:oMath>
+      <w:r>
+        <w:t xml:space="preserve"> </w:t>
+      </w:r>
+      <w:r>
+        <w:t xml:space="preserve">and</w:t>
+      </w:r>
+      <w:r>
+        <w:t xml:space="preserve"> </w:t>
+      </w:r>
+      <m:oMath>
+        <m:sSup>
+          <m:e>
+            <m:r>
+              <m:t>σ</m:t>
+            </m:r>
+          </m:e>
+          <m:sup>
+            <m:r>
+              <m:t>2</m:t>
+            </m:r>
+          </m:sup>
+        </m:sSup>
+      </m:oMath>
+      <w:r>
+        <w:t xml:space="preserve"> </w:t>
+      </w:r>
+      <w:r>
+        <w:t xml:space="preserve">are the mean and variance of the 392 horsepower values.</w:t>
+      </w:r>
+      <w:r>
+        <w:t xml:space="preserve"> </w:t>
+      </w:r>
+      <w:r>
+        <w:t xml:space="preserve">The sum</w:t>
+      </w:r>
+      <w:r>
+        <w:t xml:space="preserve"> </w:t>
+      </w:r>
+      <m:oMath>
+        <m:sSub>
+          <m:e>
+            <m:r>
+              <m:t>S</m:t>
+            </m:r>
+          </m:e>
+          <m:sub>
+            <m:r>
+              <m:t>n</m:t>
+            </m:r>
+          </m:sub>
+        </m:sSub>
+      </m:oMath>
+      <w:r>
+        <w:t xml:space="preserve"> </w:t>
+      </w:r>
+      <w:r>
+        <w:t xml:space="preserve">has mean</w:t>
+      </w:r>
+      <w:r>
+        <w:t xml:space="preserve"> </w:t>
+      </w:r>
+      <m:oMath>
+        <m:r>
+          <m:t>n</m:t>
+        </m:r>
+        <m:r>
+          <m:t>μ</m:t>
+        </m:r>
+      </m:oMath>
+      <w:r>
+        <w:t xml:space="preserve"> </w:t>
+      </w:r>
+      <w:r>
+        <w:t xml:space="preserve">and variance</w:t>
+      </w:r>
+      <w:r>
+        <w:t xml:space="preserve"> </w:t>
+      </w:r>
+      <m:oMath>
+        <m:r>
+          <m:t>n</m:t>
+        </m:r>
+        <m:sSup>
+          <m:e>
+            <m:r>
+              <m:t>σ</m:t>
+            </m:r>
+          </m:e>
+          <m:sup>
+            <m:r>
+              <m:t>2</m:t>
+            </m:r>
+          </m:sup>
+        </m:sSup>
+      </m:oMath>
+      <w:r>
+        <w:t xml:space="preserve"> </w:t>
+      </w:r>
+      <w:r>
+        <w:t xml:space="preserve">by</w:t>
+      </w:r>
+      <w:r>
+        <w:t xml:space="preserve"> </w:t>
+      </w:r>
+      <w:hyperlink w:anchor="cor-sum-iid-moments">
+        <w:r>
+          <w:rPr>
+            <w:rStyle w:val="Hyperlink"/>
+          </w:rPr>
+          <w:t xml:space="preserve">Corollary 1</w:t>
+        </w:r>
+      </w:hyperlink>
+      <w:r>
+        <w:t xml:space="preserve">,</w:t>
+      </w:r>
+      <w:r>
+        <w:t xml:space="preserve"> </w:t>
+      </w:r>
+      <w:r>
+        <w:t xml:space="preserve">so the sample mean</w:t>
+      </w:r>
+      <w:r>
+        <w:t xml:space="preserve"> </w:t>
+      </w:r>
+      <m:oMath>
+        <m:sSub>
+          <m:e>
+            <m:r>
+              <m:t>S</m:t>
+            </m:r>
+          </m:e>
+          <m:sub>
+            <m:r>
+              <m:t>n</m:t>
+            </m:r>
+          </m:sub>
+        </m:sSub>
+        <m:r>
+          <m:rPr>
+            <m:sty m:val="p"/>
+          </m:rPr>
+          <m:t>/</m:t>
+        </m:r>
+        <m:r>
+          <m:t>n</m:t>
+        </m:r>
+      </m:oMath>
+      <w:r>
+        <w:t xml:space="preserve"> </w:t>
+      </w:r>
+      <w:r>
+        <w:t xml:space="preserve">has mean</w:t>
+      </w:r>
+      <w:r>
+        <w:t xml:space="preserve"> </w:t>
+      </w:r>
+      <m:oMath>
+        <m:r>
+          <m:t>μ</m:t>
+        </m:r>
+      </m:oMath>
+      <w:r>
+        <w:t xml:space="preserve"> </w:t>
+      </w:r>
+      <w:r>
+        <w:t xml:space="preserve">and standard deviation</w:t>
+      </w:r>
+      <w:r>
+        <w:t xml:space="preserve"> </w:t>
+      </w:r>
+      <m:oMath>
+        <m:r>
+          <m:t>σ</m:t>
+        </m:r>
+        <m:r>
+          <m:rPr>
+            <m:sty m:val="p"/>
+          </m:rPr>
+          <m:t>/</m:t>
+        </m:r>
+        <m:rad>
+          <m:radPr>
+            <m:degHide m:val="on"/>
+          </m:radPr>
+          <m:deg/>
+          <m:e>
+            <m:r>
+              <m:t>n</m:t>
+            </m:r>
+          </m:e>
+        </m:rad>
+      </m:oMath>
+      <w:r>
+        <w:t xml:space="preserve">.</w:t>
+      </w:r>
+      <w:r>
+        <w:t xml:space="preserve"> </w:t>
+      </w:r>
+      <w:r>
+        <w:t xml:space="preserve">The code below draws 10,000 random samples of each size</w:t>
+      </w:r>
+      <w:r>
+        <w:t xml:space="preserve"> </w:t>
+      </w:r>
+      <m:oMath>
+        <m:r>
+          <m:t>n</m:t>
+        </m:r>
+        <m:r>
+          <m:rPr>
+            <m:sty m:val="p"/>
+          </m:rPr>
+          <m:t>∈</m:t>
+        </m:r>
+        <m:r>
+          <m:t>​</m:t>
+        </m:r>
+        <m:d>
+          <m:dPr>
+            <m:begChr m:val="{"/>
+            <m:sepChr m:val=""/>
+            <m:endChr m:val="}"/>
+            <m:grow/>
+          </m:dPr>
+          <m:e>
+            <m:r>
+              <m:t>1</m:t>
+            </m:r>
+            <m:r>
+              <m:rPr>
+                <m:sty m:val="p"/>
+              </m:rPr>
+              <m:t>,</m:t>
+            </m:r>
+            <m:r>
+              <m:t>5</m:t>
+            </m:r>
+            <m:r>
+              <m:rPr>
+                <m:sty m:val="p"/>
+              </m:rPr>
+              <m:t>,</m:t>
+            </m:r>
+            <m:r>
+              <m:t>30</m:t>
+            </m:r>
+          </m:e>
+        </m:d>
+        <m:r>
+          <m:t>​</m:t>
+        </m:r>
+      </m:oMath>
+      <w:r>
+        <w:t xml:space="preserve">,</w:t>
+      </w:r>
+      <w:r>
+        <w:t xml:space="preserve"> </w:t>
+      </w:r>
+      <w:r>
+        <w:t xml:space="preserve">with replacement, and computes each sample’s mean.</w:t>
+      </w:r>
+    </w:p>
+    <w:p>
+      <w:pPr>
+        <w:pStyle w:val="Heading4"/>
+      </w:pPr>
+      <w:r>
+        <w:t xml:space="preserve">Python</w:t>
+      </w:r>
+    </w:p>
+    <w:p>
+      <w:pPr>
+        <w:pStyle w:val="SourceCode"/>
+      </w:pPr>
+      <w:r>
+        <w:rPr>
+          <w:rStyle w:val="ImportTok"/>
+        </w:rPr>
+        <w:t xml:space="preserve">import</w:t>
+      </w:r>
+      <w:r>
+        <w:rPr>
+          <w:rStyle w:val="NormalTok"/>
+        </w:rPr>
+        <w:t xml:space="preserve"> numpy </w:t>
+      </w:r>
+      <w:r>
+        <w:rPr>
+          <w:rStyle w:val="ImportTok"/>
+        </w:rPr>
+        <w:t xml:space="preserve">as</w:t>
+      </w:r>
+      <w:r>
+        <w:rPr>
+          <w:rStyle w:val="NormalTok"/>
+        </w:rPr>
+        <w:t xml:space="preserve"> np</w:t>
+      </w:r>
+      <w:r>
+        <w:br/>
+      </w:r>
+      <w:r>
+        <w:rPr>
+          <w:rStyle w:val="ImportTok"/>
+        </w:rPr>
+        <w:t xml:space="preserve">import</w:t>
+      </w:r>
+      <w:r>
+        <w:rPr>
+          <w:rStyle w:val="NormalTok"/>
+        </w:rPr>
+        <w:t xml:space="preserve"> pandas </w:t>
+      </w:r>
+      <w:r>
+        <w:rPr>
+          <w:rStyle w:val="ImportTok"/>
+        </w:rPr>
+        <w:t xml:space="preserve">as</w:t>
+      </w:r>
+      <w:r>
+        <w:rPr>
+          <w:rStyle w:val="NormalTok"/>
+        </w:rPr>
+        <w:t xml:space="preserve"> pd</w:t>
+      </w:r>
+      <w:r>
+        <w:br/>
+      </w:r>
+      <w:r>
+        <w:br/>
+      </w:r>
+      <w:r>
+        <w:rPr>
+          <w:rStyle w:val="NormalTok"/>
+        </w:rPr>
+        <w:t xml:space="preserve">hp </w:t>
+      </w:r>
+      <w:r>
+        <w:rPr>
+          <w:rStyle w:val="OperatorTok"/>
+        </w:rPr>
+        <w:t xml:space="preserve">=</w:t>
+      </w:r>
+      <w:r>
+        <w:rPr>
+          <w:rStyle w:val="NormalTok"/>
+        </w:rPr>
+        <w:t xml:space="preserve"> pd.read_csv(</w:t>
+      </w:r>
+      <w:r>
+        <w:rPr>
+          <w:rStyle w:val="StringTok"/>
+        </w:rPr>
+        <w:t xml:space="preserve">"data/auto.csv"</w:t>
+      </w:r>
+      <w:r>
+        <w:rPr>
+          <w:rStyle w:val="NormalTok"/>
+        </w:rPr>
+        <w:t xml:space="preserve">)[</w:t>
+      </w:r>
+      <w:r>
+        <w:rPr>
+          <w:rStyle w:val="StringTok"/>
+        </w:rPr>
+        <w:t xml:space="preserve">"horsepower"</w:t>
+      </w:r>
+      <w:r>
+        <w:rPr>
+          <w:rStyle w:val="NormalTok"/>
+        </w:rPr>
+        <w:t xml:space="preserve">].to_numpy(dtype</w:t>
+      </w:r>
+      <w:r>
+        <w:rPr>
+          <w:rStyle w:val="OperatorTok"/>
+        </w:rPr>
+        <w:t xml:space="preserve">=</w:t>
+      </w:r>
+      <w:r>
+        <w:rPr>
+          <w:rStyle w:val="BuiltInTok"/>
+        </w:rPr>
+        <w:t xml:space="preserve">float</w:t>
+      </w:r>
+      <w:r>
+        <w:rPr>
+          <w:rStyle w:val="NormalTok"/>
+        </w:rPr>
+        <w:t xml:space="preserve">)</w:t>
+      </w:r>
+      <w:r>
+        <w:br/>
+      </w:r>
+      <w:r>
+        <w:rPr>
+          <w:rStyle w:val="NormalTok"/>
+        </w:rPr>
+        <w:t xml:space="preserve">mu, sigma </w:t>
+      </w:r>
+      <w:r>
+        <w:rPr>
+          <w:rStyle w:val="OperatorTok"/>
+        </w:rPr>
+        <w:t xml:space="preserve">=</w:t>
+      </w:r>
+      <w:r>
+        <w:rPr>
+          <w:rStyle w:val="NormalTok"/>
+        </w:rPr>
+        <w:t xml:space="preserve"> hp.mean(), hp.std(ddof</w:t>
+      </w:r>
+      <w:r>
+        <w:rPr>
+          <w:rStyle w:val="OperatorTok"/>
+        </w:rPr>
+        <w:t xml:space="preserve">=</w:t>
+      </w:r>
+      <w:r>
+        <w:rPr>
+          <w:rStyle w:val="DecValTok"/>
+        </w:rPr>
+        <w:t xml:space="preserve">0</w:t>
+      </w:r>
+      <w:r>
+        <w:rPr>
+          <w:rStyle w:val="NormalTok"/>
+        </w:rPr>
+        <w:t xml:space="preserve">)</w:t>
+      </w:r>
+      <w:r>
+        <w:br/>
+      </w:r>
+      <w:r>
+        <w:br/>
+      </w:r>
+      <w:r>
+        <w:rPr>
+          <w:rStyle w:val="NormalTok"/>
+        </w:rPr>
+        <w:t xml:space="preserve">rng </w:t>
+      </w:r>
+      <w:r>
+        <w:rPr>
+          <w:rStyle w:val="OperatorTok"/>
+        </w:rPr>
+        <w:t xml:space="preserve">=</w:t>
+      </w:r>
+      <w:r>
+        <w:rPr>
+          <w:rStyle w:val="NormalTok"/>
+        </w:rPr>
+        <w:t xml:space="preserve"> np.random.default_rng(</w:t>
+      </w:r>
+      <w:r>
+        <w:rPr>
+          <w:rStyle w:val="DecValTok"/>
+        </w:rPr>
+        <w:t xml:space="preserve">571</w:t>
+      </w:r>
+      <w:r>
+        <w:rPr>
+          <w:rStyle w:val="NormalTok"/>
+        </w:rPr>
+        <w:t xml:space="preserve">)</w:t>
+      </w:r>
+      <w:r>
+        <w:br/>
+      </w:r>
+      <w:r>
+        <w:rPr>
+          <w:rStyle w:val="NormalTok"/>
+        </w:rPr>
+        <w:t xml:space="preserve">sizes </w:t>
+      </w:r>
+      <w:r>
+        <w:rPr>
+          <w:rStyle w:val="OperatorTok"/>
+        </w:rPr>
+        <w:t xml:space="preserve">=</w:t>
+      </w:r>
+      <w:r>
+        <w:rPr>
+          <w:rStyle w:val="NormalTok"/>
+        </w:rPr>
+        <w:t xml:space="preserve"> [</w:t>
+      </w:r>
+      <w:r>
+        <w:rPr>
+          <w:rStyle w:val="DecValTok"/>
+        </w:rPr>
+        <w:t xml:space="preserve">1</w:t>
+      </w:r>
+      <w:r>
+        <w:rPr>
+          <w:rStyle w:val="NormalTok"/>
+        </w:rPr>
+        <w:t xml:space="preserve">, </w:t>
+      </w:r>
+      <w:r>
+        <w:rPr>
+          <w:rStyle w:val="DecValTok"/>
+        </w:rPr>
+        <w:t xml:space="preserve">5</w:t>
+      </w:r>
+      <w:r>
+        <w:rPr>
+          <w:rStyle w:val="NormalTok"/>
+        </w:rPr>
+        <w:t xml:space="preserve">, </w:t>
+      </w:r>
+      <w:r>
+        <w:rPr>
+          <w:rStyle w:val="DecValTok"/>
+        </w:rPr>
+        <w:t xml:space="preserve">30</w:t>
+      </w:r>
+      <w:r>
+        <w:rPr>
+          <w:rStyle w:val="NormalTok"/>
+        </w:rPr>
+        <w:t xml:space="preserve">]</w:t>
+      </w:r>
+      <w:r>
+        <w:br/>
+      </w:r>
+      <w:r>
+        <w:rPr>
+          <w:rStyle w:val="NormalTok"/>
+        </w:rPr>
+        <w:t xml:space="preserve">sample_means </w:t>
+      </w:r>
+      <w:r>
+        <w:rPr>
+          <w:rStyle w:val="OperatorTok"/>
+        </w:rPr>
+        <w:t xml:space="preserve">=</w:t>
+      </w:r>
+      <w:r>
+        <w:rPr>
+          <w:rStyle w:val="NormalTok"/>
+        </w:rPr>
+        <w:t xml:space="preserve"> {n: rng.choice(hp, size</w:t>
+      </w:r>
+      <w:r>
+        <w:rPr>
+          <w:rStyle w:val="OperatorTok"/>
+        </w:rPr>
+        <w:t xml:space="preserve">=</w:t>
+      </w:r>
+      <w:r>
+        <w:rPr>
+          <w:rStyle w:val="NormalTok"/>
+        </w:rPr>
+        <w:t xml:space="preserve">(</w:t>
+      </w:r>
+      <w:r>
+        <w:rPr>
+          <w:rStyle w:val="DecValTok"/>
+        </w:rPr>
+        <w:t xml:space="preserve">10_000</w:t>
+      </w:r>
+      <w:r>
+        <w:rPr>
+          <w:rStyle w:val="NormalTok"/>
+        </w:rPr>
+        <w:t xml:space="preserve">, n)).mean(axis</w:t>
+      </w:r>
+      <w:r>
+        <w:rPr>
+          <w:rStyle w:val="OperatorTok"/>
+        </w:rPr>
+        <w:t xml:space="preserve">=</w:t>
+      </w:r>
+      <w:r>
+        <w:rPr>
+          <w:rStyle w:val="DecValTok"/>
+        </w:rPr>
+        <w:t xml:space="preserve">1</w:t>
+      </w:r>
+      <w:r>
+        <w:rPr>
+          <w:rStyle w:val="NormalTok"/>
+        </w:rPr>
+        <w:t xml:space="preserve">) </w:t>
+      </w:r>
+      <w:r>
+        <w:rPr>
+          <w:rStyle w:val="ControlFlowTok"/>
+        </w:rPr>
+        <w:t xml:space="preserve">for</w:t>
+      </w:r>
+      <w:r>
+        <w:rPr>
+          <w:rStyle w:val="NormalTok"/>
+        </w:rPr>
+        <w:t xml:space="preserve"> n </w:t>
+      </w:r>
+      <w:r>
+        <w:rPr>
+          <w:rStyle w:val="KeywordTok"/>
+        </w:rPr>
+        <w:t xml:space="preserve">in</w:t>
+      </w:r>
+      <w:r>
+        <w:rPr>
+          <w:rStyle w:val="NormalTok"/>
+        </w:rPr>
+        <w:t xml:space="preserve"> sizes}</w:t>
+      </w:r>
+      <w:r>
+        <w:br/>
+      </w:r>
+      <w:r>
+        <w:br/>
+      </w:r>
+      <w:r>
+        <w:rPr>
+          <w:rStyle w:val="KeywordTok"/>
+        </w:rPr>
+        <w:t xml:space="preserve">def</w:t>
+      </w:r>
+      <w:r>
+        <w:rPr>
+          <w:rStyle w:val="NormalTok"/>
+        </w:rPr>
+        <w:t xml:space="preserve"> skewness(x):</w:t>
+      </w:r>
+      <w:r>
+        <w:br/>
+      </w:r>
+      <w:r>
+        <w:rPr>
+          <w:rStyle w:val="NormalTok"/>
+        </w:rPr>
+        <w:t xml:space="preserve">    </w:t>
+      </w:r>
+      <w:r>
+        <w:rPr>
+          <w:rStyle w:val="ControlFlowTok"/>
+        </w:rPr>
+        <w:t xml:space="preserve">return</w:t>
+      </w:r>
+      <w:r>
+        <w:rPr>
+          <w:rStyle w:val="NormalTok"/>
+        </w:rPr>
+        <w:t xml:space="preserve"> np.mean(((x </w:t>
+      </w:r>
+      <w:r>
+        <w:rPr>
+          <w:rStyle w:val="OperatorTok"/>
+        </w:rPr>
+        <w:t xml:space="preserve">-</w:t>
+      </w:r>
+      <w:r>
+        <w:rPr>
+          <w:rStyle w:val="NormalTok"/>
+        </w:rPr>
+        <w:t xml:space="preserve"> x.mean()) </w:t>
+      </w:r>
+      <w:r>
+        <w:rPr>
+          <w:rStyle w:val="OperatorTok"/>
+        </w:rPr>
+        <w:t xml:space="preserve">/</w:t>
+      </w:r>
+      <w:r>
+        <w:rPr>
+          <w:rStyle w:val="NormalTok"/>
+        </w:rPr>
+        <w:t xml:space="preserve"> x.std()) </w:t>
+      </w:r>
+      <w:r>
+        <w:rPr>
+          <w:rStyle w:val="OperatorTok"/>
+        </w:rPr>
+        <w:t xml:space="preserve">**</w:t>
+      </w:r>
+      <w:r>
+        <w:rPr>
+          <w:rStyle w:val="NormalTok"/>
+        </w:rPr>
+        <w:t xml:space="preserve"> </w:t>
+      </w:r>
+      <w:r>
+        <w:rPr>
+          <w:rStyle w:val="DecValTok"/>
+        </w:rPr>
+        <w:t xml:space="preserve">3</w:t>
+      </w:r>
+      <w:r>
+        <w:rPr>
+          <w:rStyle w:val="NormalTok"/>
+        </w:rPr>
+        <w:t xml:space="preserve">)</w:t>
+      </w:r>
+      <w:r>
+        <w:br/>
+      </w:r>
+      <w:r>
+        <w:br/>
+      </w:r>
+      <w:r>
+        <w:rPr>
+          <w:rStyle w:val="NormalTok"/>
+        </w:rPr>
+        <w:t xml:space="preserve">pd.DataFrame({</w:t>
+      </w:r>
+      <w:r>
+        <w:br/>
+      </w:r>
+      <w:r>
+        <w:rPr>
+          <w:rStyle w:val="NormalTok"/>
+        </w:rPr>
+        <w:t xml:space="preserve">    </w:t>
+      </w:r>
+      <w:r>
+        <w:rPr>
+          <w:rStyle w:val="StringTok"/>
+        </w:rPr>
+        <w:t xml:space="preserve">"n"</w:t>
+      </w:r>
+      <w:r>
+        <w:rPr>
+          <w:rStyle w:val="NormalTok"/>
+        </w:rPr>
+        <w:t xml:space="preserve">: sizes,</w:t>
+      </w:r>
+      <w:r>
+        <w:br/>
+      </w:r>
+      <w:r>
+        <w:rPr>
+          <w:rStyle w:val="NormalTok"/>
+        </w:rPr>
+        <w:t xml:space="preserve">    </w:t>
+      </w:r>
+      <w:r>
+        <w:rPr>
+          <w:rStyle w:val="StringTok"/>
+        </w:rPr>
+        <w:t xml:space="preserve">"sd of sample means"</w:t>
+      </w:r>
+      <w:r>
+        <w:rPr>
+          <w:rStyle w:val="NormalTok"/>
+        </w:rPr>
+        <w:t xml:space="preserve">: [sample_means[n].std(ddof</w:t>
+      </w:r>
+      <w:r>
+        <w:rPr>
+          <w:rStyle w:val="OperatorTok"/>
+        </w:rPr>
+        <w:t xml:space="preserve">=</w:t>
+      </w:r>
+      <w:r>
+        <w:rPr>
+          <w:rStyle w:val="DecValTok"/>
+        </w:rPr>
+        <w:t xml:space="preserve">1</w:t>
+      </w:r>
+      <w:r>
+        <w:rPr>
+          <w:rStyle w:val="NormalTok"/>
+        </w:rPr>
+        <w:t xml:space="preserve">) </w:t>
+      </w:r>
+      <w:r>
+        <w:rPr>
+          <w:rStyle w:val="ControlFlowTok"/>
+        </w:rPr>
+        <w:t xml:space="preserve">for</w:t>
+      </w:r>
+      <w:r>
+        <w:rPr>
+          <w:rStyle w:val="NormalTok"/>
+        </w:rPr>
+        <w:t xml:space="preserve"> n </w:t>
+      </w:r>
+      <w:r>
+        <w:rPr>
+          <w:rStyle w:val="KeywordTok"/>
+        </w:rPr>
+        <w:t xml:space="preserve">in</w:t>
+      </w:r>
+      <w:r>
+        <w:rPr>
+          <w:rStyle w:val="NormalTok"/>
+        </w:rPr>
+        <w:t xml:space="preserve"> sizes],</w:t>
+      </w:r>
+      <w:r>
+        <w:br/>
+      </w:r>
+      <w:r>
+        <w:rPr>
+          <w:rStyle w:val="NormalTok"/>
+        </w:rPr>
+        <w:t xml:space="preserve">    </w:t>
+      </w:r>
+      <w:r>
+        <w:rPr>
+          <w:rStyle w:val="StringTok"/>
+        </w:rPr>
+        <w:t xml:space="preserve">"sigma / sqrt(n)"</w:t>
+      </w:r>
+      <w:r>
+        <w:rPr>
+          <w:rStyle w:val="NormalTok"/>
+        </w:rPr>
+        <w:t xml:space="preserve">: [sigma </w:t>
+      </w:r>
+      <w:r>
+        <w:rPr>
+          <w:rStyle w:val="OperatorTok"/>
+        </w:rPr>
+        <w:t xml:space="preserve">/</w:t>
+      </w:r>
+      <w:r>
+        <w:rPr>
+          <w:rStyle w:val="NormalTok"/>
+        </w:rPr>
+        <w:t xml:space="preserve"> np.sqrt(n) </w:t>
+      </w:r>
+      <w:r>
+        <w:rPr>
+          <w:rStyle w:val="ControlFlowTok"/>
+        </w:rPr>
+        <w:t xml:space="preserve">for</w:t>
+      </w:r>
+      <w:r>
+        <w:rPr>
+          <w:rStyle w:val="NormalTok"/>
+        </w:rPr>
+        <w:t xml:space="preserve"> n </w:t>
+      </w:r>
+      <w:r>
+        <w:rPr>
+          <w:rStyle w:val="KeywordTok"/>
+        </w:rPr>
+        <w:t xml:space="preserve">in</w:t>
+      </w:r>
+      <w:r>
+        <w:rPr>
+          <w:rStyle w:val="NormalTok"/>
+        </w:rPr>
+        <w:t xml:space="preserve"> sizes],</w:t>
+      </w:r>
+      <w:r>
+        <w:br/>
+      </w:r>
+      <w:r>
+        <w:rPr>
+          <w:rStyle w:val="NormalTok"/>
+        </w:rPr>
+        <w:t xml:space="preserve">    </w:t>
+      </w:r>
+      <w:r>
+        <w:rPr>
+          <w:rStyle w:val="StringTok"/>
+        </w:rPr>
+        <w:t xml:space="preserve">"skewness of sample means"</w:t>
+      </w:r>
+      <w:r>
+        <w:rPr>
+          <w:rStyle w:val="NormalTok"/>
+        </w:rPr>
+        <w:t xml:space="preserve">: [skewness(sample_means[n]) </w:t>
+      </w:r>
+      <w:r>
+        <w:rPr>
+          <w:rStyle w:val="ControlFlowTok"/>
+        </w:rPr>
+        <w:t xml:space="preserve">for</w:t>
+      </w:r>
+      <w:r>
+        <w:rPr>
+          <w:rStyle w:val="NormalTok"/>
+        </w:rPr>
+        <w:t xml:space="preserve"> n </w:t>
+      </w:r>
+      <w:r>
+        <w:rPr>
+          <w:rStyle w:val="KeywordTok"/>
+        </w:rPr>
+        <w:t xml:space="preserve">in</w:t>
+      </w:r>
+      <w:r>
+        <w:rPr>
+          <w:rStyle w:val="NormalTok"/>
+        </w:rPr>
+        <w:t xml:space="preserve"> sizes],</w:t>
+      </w:r>
+      <w:r>
+        <w:br/>
+      </w:r>
+      <w:r>
+        <w:rPr>
+          <w:rStyle w:val="NormalTok"/>
+        </w:rPr>
+        <w:t xml:space="preserve">})</w:t>
+      </w:r>
+      <w:r>
+        <w:br/>
+      </w:r>
+      <w:r>
+        <w:rPr>
+          <w:rStyle w:val="CommentTok"/>
+        </w:rPr>
+        <w:t xml:space="preserve">#&gt;     n  sd of sample means  sigma / sqrt(n)  skewness of sample means</w:t>
+      </w:r>
+      <w:r>
+        <w:br/>
+      </w:r>
+      <w:r>
+        <w:rPr>
+          <w:rStyle w:val="CommentTok"/>
+        </w:rPr>
+        <w:t xml:space="preserve">#&gt; 0   1           38.691521        38.442033                  1.080767</w:t>
+      </w:r>
+      <w:r>
+        <w:br/>
+      </w:r>
+      <w:r>
+        <w:rPr>
+          <w:rStyle w:val="CommentTok"/>
+        </w:rPr>
+        <w:t xml:space="preserve">#&gt; 1   5           17.265666        17.191800                  0.522243</w:t>
+      </w:r>
+      <w:r>
+        <w:br/>
+      </w:r>
+      <w:r>
+        <w:rPr>
+          <w:rStyle w:val="CommentTok"/>
+        </w:rPr>
+        <w:t xml:space="preserve">#&gt; 2  30            6.971269         7.018523                  0.164940</w:t>
+      </w:r>
+    </w:p>
+    <w:p>
+      <w:pPr>
+        <w:pStyle w:val="Heading4"/>
+      </w:pPr>
+      <w:r>
+        <w:t xml:space="preserve">R</w:t>
+      </w:r>
+    </w:p>
+    <w:p>
+      <w:pPr>
+        <w:pStyle w:val="SourceCode"/>
+      </w:pPr>
+      <w:r>
+        <w:rPr>
+          <w:rStyle w:val="NormalTok"/>
+        </w:rPr>
+        <w:t xml:space="preserve">hp </w:t>
+      </w:r>
+      <w:r>
+        <w:rPr>
+          <w:rStyle w:val="OtherTok"/>
+        </w:rPr>
+        <w:t xml:space="preserve">&lt;-</w:t>
+      </w:r>
+      <w:r>
+        <w:rPr>
+          <w:rStyle w:val="NormalTok"/>
+        </w:rPr>
+        <w:t xml:space="preserve"> </w:t>
+      </w:r>
+      <w:r>
+        <w:rPr>
+          <w:rStyle w:val="FunctionTok"/>
+        </w:rPr>
+        <w:t xml:space="preserve">read.csv</w:t>
+      </w:r>
+      <w:r>
+        <w:rPr>
+          <w:rStyle w:val="NormalTok"/>
+        </w:rPr>
+        <w:t xml:space="preserve">(</w:t>
+      </w:r>
+      <w:r>
+        <w:rPr>
+          <w:rStyle w:val="StringTok"/>
+        </w:rPr>
+        <w:t xml:space="preserve">"data/auto.csv"</w:t>
+      </w:r>
+      <w:r>
+        <w:rPr>
+          <w:rStyle w:val="NormalTok"/>
+        </w:rPr>
+        <w:t xml:space="preserve">)</w:t>
+      </w:r>
+      <w:r>
+        <w:rPr>
+          <w:rStyle w:val="SpecialCharTok"/>
+        </w:rPr>
+        <w:t xml:space="preserve">$</w:t>
+      </w:r>
+      <w:r>
+        <w:rPr>
+          <w:rStyle w:val="NormalTok"/>
+        </w:rPr>
+        <w:t xml:space="preserve">horsepower</w:t>
+      </w:r>
+      <w:r>
+        <w:br/>
+      </w:r>
+      <w:r>
+        <w:rPr>
+          <w:rStyle w:val="NormalTok"/>
+        </w:rPr>
+        <w:t xml:space="preserve">mu </w:t>
+      </w:r>
+      <w:r>
+        <w:rPr>
+          <w:rStyle w:val="OtherTok"/>
+        </w:rPr>
+        <w:t xml:space="preserve">&lt;-</w:t>
+      </w:r>
+      <w:r>
+        <w:rPr>
+          <w:rStyle w:val="NormalTok"/>
+        </w:rPr>
+        <w:t xml:space="preserve"> </w:t>
+      </w:r>
+      <w:r>
+        <w:rPr>
+          <w:rStyle w:val="FunctionTok"/>
+        </w:rPr>
+        <w:t xml:space="preserve">mean</w:t>
+      </w:r>
+      <w:r>
+        <w:rPr>
+          <w:rStyle w:val="NormalTok"/>
+        </w:rPr>
+        <w:t xml:space="preserve">(hp)</w:t>
+      </w:r>
+      <w:r>
+        <w:br/>
+      </w:r>
+      <w:r>
+        <w:rPr>
+          <w:rStyle w:val="NormalTok"/>
+        </w:rPr>
+        <w:t xml:space="preserve">sigma </w:t>
+      </w:r>
+      <w:r>
+        <w:rPr>
+          <w:rStyle w:val="OtherTok"/>
+        </w:rPr>
+        <w:t xml:space="preserve">&lt;-</w:t>
+      </w:r>
+      <w:r>
+        <w:rPr>
+          <w:rStyle w:val="NormalTok"/>
+        </w:rPr>
+        <w:t xml:space="preserve"> </w:t>
+      </w:r>
+      <w:r>
+        <w:rPr>
+          <w:rStyle w:val="FunctionTok"/>
+        </w:rPr>
+        <w:t xml:space="preserve">sqrt</w:t>
+      </w:r>
+      <w:r>
+        <w:rPr>
+          <w:rStyle w:val="NormalTok"/>
+        </w:rPr>
+        <w:t xml:space="preserve">(</w:t>
+      </w:r>
+      <w:r>
+        <w:rPr>
+          <w:rStyle w:val="FunctionTok"/>
+        </w:rPr>
+        <w:t xml:space="preserve">mean</w:t>
+      </w:r>
+      <w:r>
+        <w:rPr>
+          <w:rStyle w:val="NormalTok"/>
+        </w:rPr>
+        <w:t xml:space="preserve">((hp </w:t>
+      </w:r>
+      <w:r>
+        <w:rPr>
+          <w:rStyle w:val="SpecialCharTok"/>
+        </w:rPr>
+        <w:t xml:space="preserve">-</w:t>
+      </w:r>
+      <w:r>
+        <w:rPr>
+          <w:rStyle w:val="NormalTok"/>
+        </w:rPr>
+        <w:t xml:space="preserve"> mu)</w:t>
+      </w:r>
+      <w:r>
+        <w:rPr>
+          <w:rStyle w:val="SpecialCharTok"/>
+        </w:rPr>
+        <w:t xml:space="preserve">^</w:t>
+      </w:r>
+      <w:r>
+        <w:rPr>
+          <w:rStyle w:val="DecValTok"/>
+        </w:rPr>
+        <w:t xml:space="preserve">2</w:t>
+      </w:r>
+      <w:r>
+        <w:rPr>
+          <w:rStyle w:val="NormalTok"/>
+        </w:rPr>
+        <w:t xml:space="preserve">))</w:t>
+      </w:r>
+      <w:r>
+        <w:br/>
+      </w:r>
+      <w:r>
+        <w:br/>
+      </w:r>
+      <w:r>
+        <w:rPr>
+          <w:rStyle w:val="FunctionTok"/>
+        </w:rPr>
+        <w:t xml:space="preserve">set.seed</w:t>
+      </w:r>
+      <w:r>
+        <w:rPr>
+          <w:rStyle w:val="NormalTok"/>
+        </w:rPr>
+        <w:t xml:space="preserve">(</w:t>
+      </w:r>
+      <w:r>
+        <w:rPr>
+          <w:rStyle w:val="DecValTok"/>
+        </w:rPr>
+        <w:t xml:space="preserve">571</w:t>
+      </w:r>
+      <w:r>
+        <w:rPr>
+          <w:rStyle w:val="NormalTok"/>
+        </w:rPr>
+        <w:t xml:space="preserve">)</w:t>
+      </w:r>
+      <w:r>
+        <w:br/>
+      </w:r>
+      <w:r>
+        <w:rPr>
+          <w:rStyle w:val="NormalTok"/>
+        </w:rPr>
+        <w:t xml:space="preserve">sizes </w:t>
+      </w:r>
+      <w:r>
+        <w:rPr>
+          <w:rStyle w:val="OtherTok"/>
+        </w:rPr>
+        <w:t xml:space="preserve">&lt;-</w:t>
+      </w:r>
+      <w:r>
+        <w:rPr>
+          <w:rStyle w:val="NormalTok"/>
+        </w:rPr>
+        <w:t xml:space="preserve"> </w:t>
+      </w:r>
+      <w:r>
+        <w:rPr>
+          <w:rStyle w:val="FunctionTok"/>
+        </w:rPr>
+        <w:t xml:space="preserve">c</w:t>
+      </w:r>
+      <w:r>
+        <w:rPr>
+          <w:rStyle w:val="NormalTok"/>
+        </w:rPr>
+        <w:t xml:space="preserve">(</w:t>
+      </w:r>
+      <w:r>
+        <w:rPr>
+          <w:rStyle w:val="DecValTok"/>
+        </w:rPr>
+        <w:t xml:space="preserve">1</w:t>
+      </w:r>
+      <w:r>
+        <w:rPr>
+          <w:rStyle w:val="NormalTok"/>
+        </w:rPr>
+        <w:t xml:space="preserve">, </w:t>
+      </w:r>
+      <w:r>
+        <w:rPr>
+          <w:rStyle w:val="DecValTok"/>
+        </w:rPr>
+        <w:t xml:space="preserve">5</w:t>
+      </w:r>
+      <w:r>
+        <w:rPr>
+          <w:rStyle w:val="NormalTok"/>
+        </w:rPr>
+        <w:t xml:space="preserve">, </w:t>
+      </w:r>
+      <w:r>
+        <w:rPr>
+          <w:rStyle w:val="DecValTok"/>
+        </w:rPr>
+        <w:t xml:space="preserve">30</w:t>
+      </w:r>
+      <w:r>
+        <w:rPr>
+          <w:rStyle w:val="NormalTok"/>
+        </w:rPr>
+        <w:t xml:space="preserve">)</w:t>
+      </w:r>
+      <w:r>
+        <w:br/>
+      </w:r>
+      <w:r>
+        <w:rPr>
+          <w:rStyle w:val="NormalTok"/>
+        </w:rPr>
+        <w:t xml:space="preserve">sample_means </w:t>
+      </w:r>
+      <w:r>
+        <w:rPr>
+          <w:rStyle w:val="OtherTok"/>
+        </w:rPr>
+        <w:t xml:space="preserve">&lt;-</w:t>
+      </w:r>
+      <w:r>
+        <w:rPr>
+          <w:rStyle w:val="NormalTok"/>
+        </w:rPr>
+        <w:t xml:space="preserve"> </w:t>
+      </w:r>
+      <w:r>
+        <w:rPr>
+          <w:rStyle w:val="FunctionTok"/>
+        </w:rPr>
+        <w:t xml:space="preserve">lapply</w:t>
+      </w:r>
+      <w:r>
+        <w:rPr>
+          <w:rStyle w:val="NormalTok"/>
+        </w:rPr>
+        <w:t xml:space="preserve">(sizes, </w:t>
+      </w:r>
+      <w:r>
+        <w:rPr>
+          <w:rStyle w:val="ControlFlowTok"/>
+        </w:rPr>
+        <w:t xml:space="preserve">function</w:t>
+      </w:r>
+      <w:r>
+        <w:rPr>
+          <w:rStyle w:val="NormalTok"/>
+        </w:rPr>
+        <w:t xml:space="preserve">(n) {</w:t>
+      </w:r>
+      <w:r>
+        <w:br/>
+      </w:r>
+      <w:r>
+        <w:rPr>
+          <w:rStyle w:val="NormalTok"/>
+        </w:rPr>
+        <w:t xml:space="preserve">  </w:t>
+      </w:r>
+      <w:r>
+        <w:rPr>
+          <w:rStyle w:val="FunctionTok"/>
+        </w:rPr>
+        <w:t xml:space="preserve">replicate</w:t>
+      </w:r>
+      <w:r>
+        <w:rPr>
+          <w:rStyle w:val="NormalTok"/>
+        </w:rPr>
+        <w:t xml:space="preserve">(</w:t>
+      </w:r>
+      <w:r>
+        <w:rPr>
+          <w:rStyle w:val="DecValTok"/>
+        </w:rPr>
+        <w:t xml:space="preserve">10000</w:t>
+      </w:r>
+      <w:r>
+        <w:rPr>
+          <w:rStyle w:val="NormalTok"/>
+        </w:rPr>
+        <w:t xml:space="preserve">, </w:t>
+      </w:r>
+      <w:r>
+        <w:rPr>
+          <w:rStyle w:val="FunctionTok"/>
+        </w:rPr>
+        <w:t xml:space="preserve">mean</w:t>
+      </w:r>
+      <w:r>
+        <w:rPr>
+          <w:rStyle w:val="NormalTok"/>
+        </w:rPr>
+        <w:t xml:space="preserve">(</w:t>
+      </w:r>
+      <w:r>
+        <w:rPr>
+          <w:rStyle w:val="FunctionTok"/>
+        </w:rPr>
+        <w:t xml:space="preserve">sample</w:t>
+      </w:r>
+      <w:r>
+        <w:rPr>
+          <w:rStyle w:val="NormalTok"/>
+        </w:rPr>
+        <w:t xml:space="preserve">(hp, n, </w:t>
+      </w:r>
+      <w:r>
+        <w:rPr>
+          <w:rStyle w:val="AttributeTok"/>
+        </w:rPr>
+        <w:t xml:space="preserve">replace =</w:t>
+      </w:r>
+      <w:r>
+        <w:rPr>
+          <w:rStyle w:val="NormalTok"/>
+        </w:rPr>
+        <w:t xml:space="preserve"> </w:t>
+      </w:r>
+      <w:r>
+        <w:rPr>
+          <w:rStyle w:val="ConstantTok"/>
+        </w:rPr>
+        <w:t xml:space="preserve">TRUE</w:t>
+      </w:r>
+      <w:r>
+        <w:rPr>
+          <w:rStyle w:val="NormalTok"/>
+        </w:rPr>
+        <w:t xml:space="preserve">)))</w:t>
+      </w:r>
+      <w:r>
+        <w:br/>
+      </w:r>
+      <w:r>
+        <w:rPr>
+          <w:rStyle w:val="NormalTok"/>
+        </w:rPr>
+        <w:t xml:space="preserve">})</w:t>
+      </w:r>
+      <w:r>
+        <w:br/>
+      </w:r>
+      <w:r>
+        <w:br/>
+      </w:r>
+      <w:r>
+        <w:rPr>
+          <w:rStyle w:val="NormalTok"/>
+        </w:rPr>
+        <w:t xml:space="preserve">skewness </w:t>
+      </w:r>
+      <w:r>
+        <w:rPr>
+          <w:rStyle w:val="OtherTok"/>
+        </w:rPr>
+        <w:t xml:space="preserve">&lt;-</w:t>
+      </w:r>
+      <w:r>
+        <w:rPr>
+          <w:rStyle w:val="NormalTok"/>
+        </w:rPr>
+        <w:t xml:space="preserve"> </w:t>
+      </w:r>
+      <w:r>
+        <w:rPr>
+          <w:rStyle w:val="ControlFlowTok"/>
+        </w:rPr>
+        <w:t xml:space="preserve">function</w:t>
+      </w:r>
+      <w:r>
+        <w:rPr>
+          <w:rStyle w:val="NormalTok"/>
+        </w:rPr>
+        <w:t xml:space="preserve">(x) </w:t>
+      </w:r>
+      <w:r>
+        <w:rPr>
+          <w:rStyle w:val="FunctionTok"/>
+        </w:rPr>
+        <w:t xml:space="preserve">mean</w:t>
+      </w:r>
+      <w:r>
+        <w:rPr>
+          <w:rStyle w:val="NormalTok"/>
+        </w:rPr>
+        <w:t xml:space="preserve">(((x </w:t>
+      </w:r>
+      <w:r>
+        <w:rPr>
+          <w:rStyle w:val="SpecialCharTok"/>
+        </w:rPr>
+        <w:t xml:space="preserve">-</w:t>
+      </w:r>
+      <w:r>
+        <w:rPr>
+          <w:rStyle w:val="NormalTok"/>
+        </w:rPr>
+        <w:t xml:space="preserve"> </w:t>
+      </w:r>
+      <w:r>
+        <w:rPr>
+          <w:rStyle w:val="FunctionTok"/>
+        </w:rPr>
+        <w:t xml:space="preserve">mean</w:t>
+      </w:r>
+      <w:r>
+        <w:rPr>
+          <w:rStyle w:val="NormalTok"/>
+        </w:rPr>
+        <w:t xml:space="preserve">(x)) </w:t>
+      </w:r>
+      <w:r>
+        <w:rPr>
+          <w:rStyle w:val="SpecialCharTok"/>
+        </w:rPr>
+        <w:t xml:space="preserve">/</w:t>
+      </w:r>
+      <w:r>
+        <w:rPr>
+          <w:rStyle w:val="NormalTok"/>
+        </w:rPr>
+        <w:t xml:space="preserve"> </w:t>
+      </w:r>
+      <w:r>
+        <w:rPr>
+          <w:rStyle w:val="FunctionTok"/>
+        </w:rPr>
+        <w:t xml:space="preserve">sqrt</w:t>
+      </w:r>
+      <w:r>
+        <w:rPr>
+          <w:rStyle w:val="NormalTok"/>
+        </w:rPr>
+        <w:t xml:space="preserve">(</w:t>
+      </w:r>
+      <w:r>
+        <w:rPr>
+          <w:rStyle w:val="FunctionTok"/>
+        </w:rPr>
+        <w:t xml:space="preserve">mean</w:t>
+      </w:r>
+      <w:r>
+        <w:rPr>
+          <w:rStyle w:val="NormalTok"/>
+        </w:rPr>
+        <w:t xml:space="preserve">((x </w:t>
+      </w:r>
+      <w:r>
+        <w:rPr>
+          <w:rStyle w:val="SpecialCharTok"/>
+        </w:rPr>
+        <w:t xml:space="preserve">-</w:t>
+      </w:r>
+      <w:r>
+        <w:rPr>
+          <w:rStyle w:val="NormalTok"/>
+        </w:rPr>
+        <w:t xml:space="preserve"> </w:t>
+      </w:r>
+      <w:r>
+        <w:rPr>
+          <w:rStyle w:val="FunctionTok"/>
+        </w:rPr>
+        <w:t xml:space="preserve">mean</w:t>
+      </w:r>
+      <w:r>
+        <w:rPr>
+          <w:rStyle w:val="NormalTok"/>
+        </w:rPr>
+        <w:t xml:space="preserve">(x))</w:t>
+      </w:r>
+      <w:r>
+        <w:rPr>
+          <w:rStyle w:val="SpecialCharTok"/>
+        </w:rPr>
+        <w:t xml:space="preserve">^</w:t>
+      </w:r>
+      <w:r>
+        <w:rPr>
+          <w:rStyle w:val="DecValTok"/>
+        </w:rPr>
+        <w:t xml:space="preserve">2</w:t>
+      </w:r>
+      <w:r>
+        <w:rPr>
+          <w:rStyle w:val="NormalTok"/>
+        </w:rPr>
+        <w:t xml:space="preserve">)))</w:t>
+      </w:r>
+      <w:r>
+        <w:rPr>
+          <w:rStyle w:val="SpecialCharTok"/>
+        </w:rPr>
+        <w:t xml:space="preserve">^</w:t>
+      </w:r>
+      <w:r>
+        <w:rPr>
+          <w:rStyle w:val="DecValTok"/>
+        </w:rPr>
+        <w:t xml:space="preserve">3</w:t>
+      </w:r>
+      <w:r>
+        <w:rPr>
+          <w:rStyle w:val="NormalTok"/>
+        </w:rPr>
+        <w:t xml:space="preserve">)</w:t>
+      </w:r>
+      <w:r>
+        <w:br/>
+      </w:r>
+      <w:r>
+        <w:br/>
+      </w:r>
+      <w:r>
+        <w:rPr>
+          <w:rStyle w:val="FunctionTok"/>
+        </w:rPr>
+        <w:t xml:space="preserve">data.frame</w:t>
+      </w:r>
+      <w:r>
+        <w:rPr>
+          <w:rStyle w:val="NormalTok"/>
+        </w:rPr>
+        <w:t xml:space="preserve">(</w:t>
+      </w:r>
+      <w:r>
+        <w:br/>
+      </w:r>
+      <w:r>
+        <w:rPr>
+          <w:rStyle w:val="NormalTok"/>
+        </w:rPr>
+        <w:t xml:space="preserve">  </w:t>
+      </w:r>
+      <w:r>
+        <w:rPr>
+          <w:rStyle w:val="AttributeTok"/>
+        </w:rPr>
+        <w:t xml:space="preserve">n =</w:t>
+      </w:r>
+      <w:r>
+        <w:rPr>
+          <w:rStyle w:val="NormalTok"/>
+        </w:rPr>
+        <w:t xml:space="preserve"> sizes,</w:t>
+      </w:r>
+      <w:r>
+        <w:br/>
+      </w:r>
+      <w:r>
+        <w:rPr>
+          <w:rStyle w:val="NormalTok"/>
+        </w:rPr>
+        <w:t xml:space="preserve">  </w:t>
+      </w:r>
+      <w:r>
+        <w:rPr>
+          <w:rStyle w:val="AttributeTok"/>
+        </w:rPr>
+        <w:t xml:space="preserve">sd_of_sample_means =</w:t>
+      </w:r>
+      <w:r>
+        <w:rPr>
+          <w:rStyle w:val="NormalTok"/>
+        </w:rPr>
+        <w:t xml:space="preserve"> </w:t>
+      </w:r>
+      <w:r>
+        <w:rPr>
+          <w:rStyle w:val="FunctionTok"/>
+        </w:rPr>
+        <w:t xml:space="preserve">sapply</w:t>
+      </w:r>
+      <w:r>
+        <w:rPr>
+          <w:rStyle w:val="NormalTok"/>
+        </w:rPr>
+        <w:t xml:space="preserve">(sample_means, sd),</w:t>
+      </w:r>
+      <w:r>
+        <w:br/>
+      </w:r>
+      <w:r>
+        <w:rPr>
+          <w:rStyle w:val="NormalTok"/>
+        </w:rPr>
+        <w:t xml:space="preserve">  </w:t>
+      </w:r>
+      <w:r>
+        <w:rPr>
+          <w:rStyle w:val="AttributeTok"/>
+        </w:rPr>
+        <w:t xml:space="preserve">sigma_over_root_n =</w:t>
+      </w:r>
+      <w:r>
+        <w:rPr>
+          <w:rStyle w:val="NormalTok"/>
+        </w:rPr>
+        <w:t xml:space="preserve"> sigma </w:t>
+      </w:r>
+      <w:r>
+        <w:rPr>
+          <w:rStyle w:val="SpecialCharTok"/>
+        </w:rPr>
+        <w:t xml:space="preserve">/</w:t>
+      </w:r>
+      <w:r>
+        <w:rPr>
+          <w:rStyle w:val="NormalTok"/>
+        </w:rPr>
+        <w:t xml:space="preserve"> </w:t>
+      </w:r>
+      <w:r>
+        <w:rPr>
+          <w:rStyle w:val="FunctionTok"/>
+        </w:rPr>
+        <w:t xml:space="preserve">sqrt</w:t>
+      </w:r>
+      <w:r>
+        <w:rPr>
+          <w:rStyle w:val="NormalTok"/>
+        </w:rPr>
+        <w:t xml:space="preserve">(sizes),</w:t>
+      </w:r>
+      <w:r>
+        <w:br/>
+      </w:r>
+      <w:r>
+        <w:rPr>
+          <w:rStyle w:val="NormalTok"/>
+        </w:rPr>
+        <w:t xml:space="preserve">  </w:t>
+      </w:r>
+      <w:r>
+        <w:rPr>
+          <w:rStyle w:val="AttributeTok"/>
+        </w:rPr>
+        <w:t xml:space="preserve">skewness_of_sample_means =</w:t>
+      </w:r>
+      <w:r>
+        <w:rPr>
+          <w:rStyle w:val="NormalTok"/>
+        </w:rPr>
+        <w:t xml:space="preserve"> </w:t>
+      </w:r>
+      <w:r>
+        <w:rPr>
+          <w:rStyle w:val="FunctionTok"/>
+        </w:rPr>
+        <w:t xml:space="preserve">sapply</w:t>
+      </w:r>
+      <w:r>
+        <w:rPr>
+          <w:rStyle w:val="NormalTok"/>
+        </w:rPr>
+        <w:t xml:space="preserve">(sample_means, skewness)</w:t>
+      </w:r>
+      <w:r>
+        <w:br/>
+      </w:r>
+      <w:r>
+        <w:rPr>
+          <w:rStyle w:val="NormalTok"/>
+        </w:rPr>
+        <w:t xml:space="preserve">)</w:t>
+      </w:r>
+      <w:r>
+        <w:br/>
+      </w:r>
+      <w:r>
+        <w:rPr>
+          <w:rStyle w:val="CommentTok"/>
+        </w:rPr>
+        <w:t xml:space="preserve">#&gt; # A tibble: 3 × 4</w:t>
+      </w:r>
+      <w:r>
+        <w:br/>
+      </w:r>
+      <w:r>
+        <w:rPr>
+          <w:rStyle w:val="CommentTok"/>
+        </w:rPr>
+        <w:t xml:space="preserve">#&gt;       n sd_of_sample_means sigma_over_root_n skewness_of_sample_means</w:t>
+      </w:r>
+      <w:r>
+        <w:br/>
+      </w:r>
+      <w:r>
+        <w:rPr>
+          <w:rStyle w:val="CommentTok"/>
+        </w:rPr>
+        <w:t xml:space="preserve">#&gt;   &lt;dbl&gt;              &lt;dbl&gt;             &lt;dbl&gt;                    &lt;dbl&gt;</w:t>
+      </w:r>
+      <w:r>
+        <w:br/>
+      </w:r>
+      <w:r>
+        <w:rPr>
+          <w:rStyle w:val="CommentTok"/>
+        </w:rPr>
+        <w:t xml:space="preserve">#&gt; 1     1              38.6              38.4                     1.07 </w:t>
+      </w:r>
+      <w:r>
+        <w:br/>
+      </w:r>
+      <w:r>
+        <w:rPr>
+          <w:rStyle w:val="CommentTok"/>
+        </w:rPr>
+        <w:t xml:space="preserve">#&gt; 2     5              17.0              17.2                     0.480</w:t>
+      </w:r>
+      <w:r>
+        <w:br/>
+      </w:r>
+      <w:r>
+        <w:rPr>
+          <w:rStyle w:val="CommentTok"/>
+        </w:rPr>
+        <w:t xml:space="preserve">#&gt; 3    30               7.06              7.02                    0.199</w:t>
+      </w:r>
+    </w:p>
+    <w:p>
+      <w:pPr>
+        <w:pStyle w:val="FirstParagraph"/>
+      </w:pPr>
+      <w:hyperlink w:anchor="fig-clt-auto">
+        <w:r>
+          <w:rPr>
+            <w:rStyle w:val="Hyperlink"/>
+          </w:rPr>
+          <w:t xml:space="preserve">Figure 3</w:t>
+        </w:r>
+      </w:hyperlink>
+      <w:r>
+        <w:t xml:space="preserve"> </w:t>
+      </w:r>
+      <w:r>
+        <w:t xml:space="preserve">shows a histogram of the 10,000 sample means for each</w:t>
+      </w:r>
+      <w:r>
+        <w:t xml:space="preserve"> </w:t>
+      </w:r>
+      <m:oMath>
+        <m:r>
+          <m:t>n</m:t>
+        </m:r>
+      </m:oMath>
+      <w:r>
+        <w:t xml:space="preserve">,</w:t>
+      </w:r>
+      <w:r>
+        <w:t xml:space="preserve"> </w:t>
+      </w:r>
+      <w:r>
+        <w:t xml:space="preserve">with the normal density</w:t>
+      </w:r>
+      <w:r>
+        <w:t xml:space="preserve"> </w:t>
+      </w:r>
+      <m:oMath>
+        <m:r>
+          <m:rPr>
+            <m:sty m:val="p"/>
+          </m:rPr>
+          <m:t>N</m:t>
+        </m:r>
+        <m:r>
+          <m:t>​</m:t>
+        </m:r>
+        <m:d>
+          <m:dPr>
+            <m:begChr m:val="("/>
+            <m:sepChr m:val=""/>
+            <m:endChr m:val=")"/>
+            <m:grow/>
+          </m:dPr>
+          <m:e>
+            <m:r>
+              <m:t>μ</m:t>
+            </m:r>
+            <m:r>
+              <m:rPr>
+                <m:sty m:val="p"/>
+              </m:rPr>
+              <m:t>,</m:t>
+            </m:r>
+            <m:sSup>
+              <m:e>
+                <m:r>
+                  <m:t>σ</m:t>
+                </m:r>
+              </m:e>
+              <m:sup>
+                <m:r>
+                  <m:t>2</m:t>
+                </m:r>
+              </m:sup>
+            </m:sSup>
+            <m:r>
+              <m:rPr>
+                <m:sty m:val="p"/>
+              </m:rPr>
+              <m:t>/</m:t>
+            </m:r>
+            <m:r>
+              <m:t>n</m:t>
+            </m:r>
+          </m:e>
+        </m:d>
+        <m:r>
+          <m:t>​</m:t>
+        </m:r>
+      </m:oMath>
+      <w:r>
+        <w:t xml:space="preserve"> </w:t>
+      </w:r>
+      <w:r>
+        <w:t xml:space="preserve">from</w:t>
+      </w:r>
+      <w:r>
+        <w:t xml:space="preserve"> </w:t>
+      </w:r>
+      <w:hyperlink w:anchor="thm-clt">
+        <w:r>
+          <w:rPr>
+            <w:rStyle w:val="Hyperlink"/>
+          </w:rPr>
+          <w:t xml:space="preserve">Theorem 1</w:t>
+        </w:r>
+      </w:hyperlink>
+      <w:r>
+        <w:t xml:space="preserve"> </w:t>
+      </w:r>
+      <w:r>
+        <w:t xml:space="preserve">drawn over it.</w:t>
+      </w:r>
+    </w:p>
+    <w:p>
+      <w:pPr>
+        <w:pStyle w:val="SourceCode"/>
+      </w:pPr>
+      <w:r>
+        <w:rPr>
+          <w:rStyle w:val="NormalTok"/>
+        </w:rPr>
+        <w:t xml:space="preserve">op </w:t>
+      </w:r>
+      <w:r>
+        <w:rPr>
+          <w:rStyle w:val="OtherTok"/>
+        </w:rPr>
+        <w:t xml:space="preserve">&lt;-</w:t>
+      </w:r>
+      <w:r>
+        <w:rPr>
+          <w:rStyle w:val="NormalTok"/>
+        </w:rPr>
+        <w:t xml:space="preserve"> </w:t>
+      </w:r>
+      <w:r>
+        <w:rPr>
+          <w:rStyle w:val="FunctionTok"/>
+        </w:rPr>
+        <w:t xml:space="preserve">par</w:t>
+      </w:r>
+      <w:r>
+        <w:rPr>
+          <w:rStyle w:val="NormalTok"/>
+        </w:rPr>
+        <w:t xml:space="preserve">(</w:t>
+      </w:r>
+      <w:r>
+        <w:rPr>
+          <w:rStyle w:val="AttributeTok"/>
+        </w:rPr>
+        <w:t xml:space="preserve">mfrow =</w:t>
+      </w:r>
+      <w:r>
+        <w:rPr>
+          <w:rStyle w:val="NormalTok"/>
+        </w:rPr>
+        <w:t xml:space="preserve"> </w:t>
+      </w:r>
+      <w:r>
+        <w:rPr>
+          <w:rStyle w:val="FunctionTok"/>
+        </w:rPr>
+        <w:t xml:space="preserve">c</w:t>
+      </w:r>
+      <w:r>
+        <w:rPr>
+          <w:rStyle w:val="NormalTok"/>
+        </w:rPr>
+        <w:t xml:space="preserve">(</w:t>
+      </w:r>
+      <w:r>
+        <w:rPr>
+          <w:rStyle w:val="DecValTok"/>
+        </w:rPr>
+        <w:t xml:space="preserve">1</w:t>
+      </w:r>
+      <w:r>
+        <w:rPr>
+          <w:rStyle w:val="NormalTok"/>
+        </w:rPr>
+        <w:t xml:space="preserve">, </w:t>
+      </w:r>
+      <w:r>
+        <w:rPr>
+          <w:rStyle w:val="DecValTok"/>
+        </w:rPr>
+        <w:t xml:space="preserve">3</w:t>
+      </w:r>
+      <w:r>
+        <w:rPr>
+          <w:rStyle w:val="NormalTok"/>
+        </w:rPr>
+        <w:t xml:space="preserve">), </w:t>
+      </w:r>
+      <w:r>
+        <w:rPr>
+          <w:rStyle w:val="AttributeTok"/>
+        </w:rPr>
+        <w:t xml:space="preserve">mar =</w:t>
+      </w:r>
+      <w:r>
+        <w:rPr>
+          <w:rStyle w:val="NormalTok"/>
+        </w:rPr>
+        <w:t xml:space="preserve"> </w:t>
+      </w:r>
+      <w:r>
+        <w:rPr>
+          <w:rStyle w:val="FunctionTok"/>
+        </w:rPr>
+        <w:t xml:space="preserve">c</w:t>
+      </w:r>
+      <w:r>
+        <w:rPr>
+          <w:rStyle w:val="NormalTok"/>
+        </w:rPr>
+        <w:t xml:space="preserve">(</w:t>
+      </w:r>
+      <w:r>
+        <w:rPr>
+          <w:rStyle w:val="DecValTok"/>
+        </w:rPr>
+        <w:t xml:space="preserve">4</w:t>
+      </w:r>
+      <w:r>
+        <w:rPr>
+          <w:rStyle w:val="NormalTok"/>
+        </w:rPr>
+        <w:t xml:space="preserve">, </w:t>
+      </w:r>
+      <w:r>
+        <w:rPr>
+          <w:rStyle w:val="DecValTok"/>
+        </w:rPr>
+        <w:t xml:space="preserve">4</w:t>
+      </w:r>
+      <w:r>
+        <w:rPr>
+          <w:rStyle w:val="NormalTok"/>
+        </w:rPr>
+        <w:t xml:space="preserve">, </w:t>
+      </w:r>
+      <w:r>
+        <w:rPr>
+          <w:rStyle w:val="DecValTok"/>
+        </w:rPr>
+        <w:t xml:space="preserve">2</w:t>
+      </w:r>
+      <w:r>
+        <w:rPr>
+          <w:rStyle w:val="NormalTok"/>
+        </w:rPr>
+        <w:t xml:space="preserve">, </w:t>
+      </w:r>
+      <w:r>
+        <w:rPr>
+          <w:rStyle w:val="DecValTok"/>
+        </w:rPr>
+        <w:t xml:space="preserve">1</w:t>
+      </w:r>
+      <w:r>
+        <w:rPr>
+          <w:rStyle w:val="NormalTok"/>
+        </w:rPr>
+        <w:t xml:space="preserve">))</w:t>
+      </w:r>
+      <w:r>
+        <w:br/>
+      </w:r>
+      <w:r>
+        <w:rPr>
+          <w:rStyle w:val="ControlFlowTok"/>
+        </w:rPr>
+        <w:t xml:space="preserve">for</w:t>
+      </w:r>
+      <w:r>
+        <w:rPr>
+          <w:rStyle w:val="NormalTok"/>
+        </w:rPr>
+        <w:t xml:space="preserve"> (k </w:t>
+      </w:r>
+      <w:r>
+        <w:rPr>
+          <w:rStyle w:val="ControlFlowTok"/>
+        </w:rPr>
+        <w:t xml:space="preserve">in</w:t>
+      </w:r>
+      <w:r>
+        <w:rPr>
+          <w:rStyle w:val="NormalTok"/>
+        </w:rPr>
+        <w:t xml:space="preserve"> </w:t>
+      </w:r>
+      <w:r>
+        <w:rPr>
+          <w:rStyle w:val="FunctionTok"/>
+        </w:rPr>
+        <w:t xml:space="preserve">seq_along</w:t>
+      </w:r>
+      <w:r>
+        <w:rPr>
+          <w:rStyle w:val="NormalTok"/>
+        </w:rPr>
+        <w:t xml:space="preserve">(sizes)) {</w:t>
+      </w:r>
+      <w:r>
+        <w:br/>
+      </w:r>
+      <w:r>
+        <w:rPr>
+          <w:rStyle w:val="NormalTok"/>
+        </w:rPr>
+        <w:t xml:space="preserve">  </w:t>
+      </w:r>
+      <w:r>
+        <w:rPr>
+          <w:rStyle w:val="FunctionTok"/>
+        </w:rPr>
+        <w:t xml:space="preserve">hist</w:t>
+      </w:r>
+      <w:r>
+        <w:rPr>
+          <w:rStyle w:val="NormalTok"/>
+        </w:rPr>
+        <w:t xml:space="preserve">(sample_means[[k]], </w:t>
+      </w:r>
+      <w:r>
+        <w:rPr>
+          <w:rStyle w:val="AttributeTok"/>
+        </w:rPr>
+        <w:t xml:space="preserve">breaks =</w:t>
+      </w:r>
+      <w:r>
+        <w:rPr>
+          <w:rStyle w:val="NormalTok"/>
+        </w:rPr>
+        <w:t xml:space="preserve"> </w:t>
+      </w:r>
+      <w:r>
+        <w:rPr>
+          <w:rStyle w:val="DecValTok"/>
+        </w:rPr>
+        <w:t xml:space="preserve">40</w:t>
+      </w:r>
+      <w:r>
+        <w:rPr>
+          <w:rStyle w:val="NormalTok"/>
+        </w:rPr>
+        <w:t xml:space="preserve">, </w:t>
+      </w:r>
+      <w:r>
+        <w:rPr>
+          <w:rStyle w:val="AttributeTok"/>
+        </w:rPr>
+        <w:t xml:space="preserve">freq =</w:t>
+      </w:r>
+      <w:r>
+        <w:rPr>
+          <w:rStyle w:val="NormalTok"/>
+        </w:rPr>
+        <w:t xml:space="preserve"> </w:t>
+      </w:r>
+      <w:r>
+        <w:rPr>
+          <w:rStyle w:val="ConstantTok"/>
+        </w:rPr>
+        <w:t xml:space="preserve">FALSE</w:t>
+      </w:r>
+      <w:r>
+        <w:rPr>
+          <w:rStyle w:val="NormalTok"/>
+        </w:rPr>
+        <w:t xml:space="preserve">,</w:t>
+      </w:r>
+      <w:r>
+        <w:br/>
+      </w:r>
+      <w:r>
+        <w:rPr>
+          <w:rStyle w:val="NormalTok"/>
+        </w:rPr>
+        <w:t xml:space="preserve">       </w:t>
+      </w:r>
+      <w:r>
+        <w:rPr>
+          <w:rStyle w:val="AttributeTok"/>
+        </w:rPr>
+        <w:t xml:space="preserve">main =</w:t>
+      </w:r>
+      <w:r>
+        <w:rPr>
+          <w:rStyle w:val="NormalTok"/>
+        </w:rPr>
+        <w:t xml:space="preserve"> </w:t>
+      </w:r>
+      <w:r>
+        <w:rPr>
+          <w:rStyle w:val="FunctionTok"/>
+        </w:rPr>
+        <w:t xml:space="preserve">paste</w:t>
+      </w:r>
+      <w:r>
+        <w:rPr>
+          <w:rStyle w:val="NormalTok"/>
+        </w:rPr>
+        <w:t xml:space="preserve">(</w:t>
+      </w:r>
+      <w:r>
+        <w:rPr>
+          <w:rStyle w:val="StringTok"/>
+        </w:rPr>
+        <w:t xml:space="preserve">"n ="</w:t>
+      </w:r>
+      <w:r>
+        <w:rPr>
+          <w:rStyle w:val="NormalTok"/>
+        </w:rPr>
+        <w:t xml:space="preserve">, sizes[k]), </w:t>
+      </w:r>
+      <w:r>
+        <w:rPr>
+          <w:rStyle w:val="AttributeTok"/>
+        </w:rPr>
+        <w:t xml:space="preserve">xlab =</w:t>
+      </w:r>
+      <w:r>
+        <w:rPr>
+          <w:rStyle w:val="NormalTok"/>
+        </w:rPr>
+        <w:t xml:space="preserve"> </w:t>
+      </w:r>
+      <w:r>
+        <w:rPr>
+          <w:rStyle w:val="StringTok"/>
+        </w:rPr>
+        <w:t xml:space="preserve">"sample mean of horsepower"</w:t>
+      </w:r>
+      <w:r>
+        <w:rPr>
+          <w:rStyle w:val="NormalTok"/>
+        </w:rPr>
+        <w:t xml:space="preserve">)</w:t>
+      </w:r>
+      <w:r>
+        <w:br/>
+      </w:r>
+      <w:r>
+        <w:rPr>
+          <w:rStyle w:val="NormalTok"/>
+        </w:rPr>
+        <w:t xml:space="preserve">  </w:t>
+      </w:r>
+      <w:r>
+        <w:rPr>
+          <w:rStyle w:val="FunctionTok"/>
+        </w:rPr>
+        <w:t xml:space="preserve">curve</w:t>
+      </w:r>
+      <w:r>
+        <w:rPr>
+          <w:rStyle w:val="NormalTok"/>
+        </w:rPr>
+        <w:t xml:space="preserve">(</w:t>
+      </w:r>
+      <w:r>
+        <w:rPr>
+          <w:rStyle w:val="FunctionTok"/>
+        </w:rPr>
+        <w:t xml:space="preserve">dnorm</w:t>
+      </w:r>
+      <w:r>
+        <w:rPr>
+          <w:rStyle w:val="NormalTok"/>
+        </w:rPr>
+        <w:t xml:space="preserve">(x, mu, sigma </w:t>
+      </w:r>
+      <w:r>
+        <w:rPr>
+          <w:rStyle w:val="SpecialCharTok"/>
+        </w:rPr>
+        <w:t xml:space="preserve">/</w:t>
+      </w:r>
+      <w:r>
+        <w:rPr>
+          <w:rStyle w:val="NormalTok"/>
+        </w:rPr>
+        <w:t xml:space="preserve"> </w:t>
+      </w:r>
+      <w:r>
+        <w:rPr>
+          <w:rStyle w:val="FunctionTok"/>
+        </w:rPr>
+        <w:t xml:space="preserve">sqrt</w:t>
+      </w:r>
+      <w:r>
+        <w:rPr>
+          <w:rStyle w:val="NormalTok"/>
+        </w:rPr>
+        <w:t xml:space="preserve">(sizes[k])), </w:t>
+      </w:r>
+      <w:r>
+        <w:rPr>
+          <w:rStyle w:val="AttributeTok"/>
+        </w:rPr>
+        <w:t xml:space="preserve">add =</w:t>
+      </w:r>
+      <w:r>
+        <w:rPr>
+          <w:rStyle w:val="NormalTok"/>
+        </w:rPr>
+        <w:t xml:space="preserve"> </w:t>
+      </w:r>
+      <w:r>
+        <w:rPr>
+          <w:rStyle w:val="ConstantTok"/>
+        </w:rPr>
+        <w:t xml:space="preserve">TRUE</w:t>
+      </w:r>
+      <w:r>
+        <w:rPr>
+          <w:rStyle w:val="NormalTok"/>
+        </w:rPr>
+        <w:t xml:space="preserve">, </w:t>
+      </w:r>
+      <w:r>
+        <w:rPr>
+          <w:rStyle w:val="AttributeTok"/>
+        </w:rPr>
+        <w:t xml:space="preserve">lwd =</w:t>
+      </w:r>
+      <w:r>
+        <w:rPr>
+          <w:rStyle w:val="NormalTok"/>
+        </w:rPr>
+        <w:t xml:space="preserve"> </w:t>
+      </w:r>
+      <w:r>
+        <w:rPr>
+          <w:rStyle w:val="DecValTok"/>
+        </w:rPr>
+        <w:t xml:space="preserve">2</w:t>
+      </w:r>
+      <w:r>
+        <w:rPr>
+          <w:rStyle w:val="NormalTok"/>
+        </w:rPr>
+        <w:t xml:space="preserve">)</w:t>
+      </w:r>
+      <w:r>
+        <w:br/>
+      </w:r>
+      <w:r>
+        <w:rPr>
+          <w:rStyle w:val="NormalTok"/>
+        </w:rPr>
+        <w:t xml:space="preserve">}</w:t>
+      </w:r>
+      <w:r>
+        <w:br/>
+      </w:r>
+      <w:r>
+        <w:rPr>
+          <w:rStyle w:val="FunctionTok"/>
+        </w:rPr>
+        <w:t xml:space="preserve">par</w:t>
+      </w:r>
+      <w:r>
+        <w:rPr>
+          <w:rStyle w:val="NormalTok"/>
+        </w:rPr>
+        <w:t xml:space="preserve">(op)</w:t>
+      </w:r>
+    </w:p>
+    <w:tbl>
+      <w:tblPr>
+        <w:tblStyle w:val="Table"/>
+        <w:tblW w:type="pct" w:w="5000"/>
+        <w:tblLayout w:type="fixed"/>
+        <w:tblLook w:firstRow="0" w:lastRow="0" w:firstColumn="0" w:lastColumn="0" w:noHBand="0" w:noVBand="0" w:val="0000"/>
+      </w:tblPr>
+      <w:tblGrid>
+        <w:gridCol w:w="7920"/>
+      </w:tblGrid>
+      <w:tr>
+        <w:tc>
+          <w:tcPr/>
+          <w:bookmarkStart w:id="32" w:name="fig-clt-auto"/>
+          <w:p>
+            <w:pPr>
+              <w:pStyle w:val="Compact"/>
+              <w:jc w:val="center"/>
+            </w:pPr>
+            <w:r>
+              <w:drawing>
+                <wp:inline>
+                  <wp:extent cx="5334000" cy="2000250"/>
+                  <wp:effectExtent b="0" l="0" r="0" t="0"/>
+                  <wp:docPr descr="" title="" id="30" name="Picture"/>
+                  <a:graphic>
+                    <a:graphicData uri="http://schemas.openxmlformats.org/drawingml/2006/picture">
+                      <pic:pic>
+                        <pic:nvPicPr>
+                          <pic:cNvPr descr="limit-theorems_files/figure-docx/fig-clt-auto-1.png" id="31" name="Picture"/>
+                          <pic:cNvPicPr>
+                            <a:picLocks noChangeArrowheads="1" noChangeAspect="1"/>
+                          </pic:cNvPicPr>
+                        </pic:nvPicPr>
+                        <pic:blipFill>
+                          <a:blip r:embed="rId29"/>
+                          <a:stretch>
+                            <a:fillRect/>
+                          </a:stretch>
+                        </pic:blipFill>
+                        <pic:spPr bwMode="auto">
+                          <a:xfrm>
+                            <a:off x="0" y="0"/>
+                            <a:ext cx="5334000" cy="2000250"/>
+                          </a:xfrm>
+                          <a:prstGeom prst="rect">
+                            <a:avLst/>
+                          </a:prstGeom>
+                          <a:noFill/>
+                          <a:ln w="9525">
+                            <a:noFill/>
+                            <a:headEnd/>
+                            <a:tailEnd/>
+                          </a:ln>
+                        </pic:spPr>
+                      </pic:pic>
+                    </a:graphicData>
+                  </a:graphic>
+                </wp:inline>
+              </w:drawing>
+            </w:r>
+          </w:p>
+          <w:p>
+            <w:pPr>
+              <w:jc w:val="center"/>
+            </w:pPr>
+            <w:pPr>
+              <w:jc w:val="left"/>
+              <w:spacing w:before="200"/>
+              <w:pStyle w:val="ImageCaption"/>
+            </w:pPr>
+            <w:r>
+              <w:t xml:space="preserve">Figure 3: Histograms of 10,000 sample means of horsepower, for samples of n = 1, 5 and 30 cars drawn with replacement from the Auto data. The curve is the normal density with mean mu and standard deviation sigma over the square root of n.</w:t>
+            </w:r>
+          </w:p>
+          <w:bookmarkEnd w:id="32"/>
+        </w:tc>
+      </w:tr>
+    </w:tbl>
+    <w:p>
+      <w:pPr>
+        <w:pStyle w:val="BodyText"/>
+      </w:pPr>
+      <w:r>
+        <w:t xml:space="preserve">The sample means for</w:t>
+      </w:r>
+      <w:r>
+        <w:t xml:space="preserve"> </w:t>
+      </w:r>
+      <m:oMath>
+        <m:r>
+          <m:t>n</m:t>
+        </m:r>
+        <m:r>
+          <m:rPr>
+            <m:sty m:val="p"/>
+          </m:rPr>
+          <m:t>=</m:t>
+        </m:r>
+        <m:r>
+          <m:t>1</m:t>
+        </m:r>
+      </m:oMath>
+      <w:r>
+        <w:t xml:space="preserve"> </w:t>
+      </w:r>
+      <w:r>
+        <w:t xml:space="preserve">are just single cars, so they are skewed.</w:t>
+      </w:r>
+      <w:r>
+        <w:t xml:space="preserve"> </w:t>
+      </w:r>
+      <w:r>
+        <w:t xml:space="preserve">By</w:t>
+      </w:r>
+      <w:r>
+        <w:t xml:space="preserve"> </w:t>
+      </w:r>
+      <m:oMath>
+        <m:r>
+          <m:t>n</m:t>
+        </m:r>
+        <m:r>
+          <m:rPr>
+            <m:sty m:val="p"/>
+          </m:rPr>
+          <m:t>=</m:t>
+        </m:r>
+        <m:r>
+          <m:t>30</m:t>
+        </m:r>
+      </m:oMath>
+      <w:r>
+        <w:t xml:space="preserve"> </w:t>
+      </w:r>
+      <w:r>
+        <w:t xml:space="preserve">the histogram is close to the normal curve.</w:t>
+      </w:r>
+      <w:r>
+        <w:t xml:space="preserve"> </w:t>
+      </w:r>
+      <w:r>
+        <w:t xml:space="preserve">The standard deviation of the sample means is within</w:t>
+      </w:r>
+      <w:r>
+        <w:t xml:space="preserve"> </w:t>
+      </w:r>
+      <w:r>
+        <w:t xml:space="preserve">1.2%</w:t>
+      </w:r>
+      <w:r>
+        <w:t xml:space="preserve"> </w:t>
+      </w:r>
+      <w:r>
+        <w:t xml:space="preserve">of</w:t>
+      </w:r>
+      <w:r>
+        <w:t xml:space="preserve"> </w:t>
+      </w:r>
+      <m:oMath>
+        <m:r>
+          <m:t>σ</m:t>
+        </m:r>
+        <m:r>
+          <m:rPr>
+            <m:sty m:val="p"/>
+          </m:rPr>
+          <m:t>/</m:t>
+        </m:r>
+        <m:rad>
+          <m:radPr>
+            <m:degHide m:val="on"/>
+          </m:radPr>
+          <m:deg/>
+          <m:e>
+            <m:r>
+              <m:t>n</m:t>
+            </m:r>
+          </m:e>
+        </m:rad>
+      </m:oMath>
+      <w:r>
+        <w:t xml:space="preserve"> </w:t>
+      </w:r>
+      <w:r>
+        <w:t xml:space="preserve">at every</w:t>
+      </w:r>
+      <w:r>
+        <w:t xml:space="preserve"> </w:t>
+      </w:r>
+      <m:oMath>
+        <m:r>
+          <m:t>n</m:t>
+        </m:r>
+      </m:oMath>
+      <w:r>
+        <w:t xml:space="preserve">,</w:t>
+      </w:r>
+      <w:r>
+        <w:t xml:space="preserve"> </w:t>
+      </w:r>
+      <w:r>
+        <w:t xml:space="preserve">as</w:t>
+      </w:r>
+      <w:r>
+        <w:t xml:space="preserve"> </w:t>
+      </w:r>
+      <w:hyperlink w:anchor="cor-sum-iid-moments">
+        <w:r>
+          <w:rPr>
+            <w:rStyle w:val="Hyperlink"/>
+          </w:rPr>
+          <w:t xml:space="preserve">Corollary 1</w:t>
+        </w:r>
+      </w:hyperlink>
+      <w:r>
+        <w:t xml:space="preserve"> </w:t>
+      </w:r>
+      <w:r>
+        <w:t xml:space="preserve">predicts.</w:t>
+      </w:r>
+      <w:r>
+        <w:t xml:space="preserve"> </w:t>
+      </w:r>
+      <w:r>
+        <w:t xml:space="preserve">The skewness of the sample means,</w:t>
+      </w:r>
+      <w:r>
+        <w:t xml:space="preserve"> </w:t>
+      </w:r>
+      <w:r>
+        <w:t xml:space="preserve">which is zero for a normal distribution,</w:t>
+      </w:r>
+      <w:r>
+        <w:t xml:space="preserve"> </w:t>
+      </w:r>
+      <w:r>
+        <w:t xml:space="preserve">falls from 1.07 at</w:t>
+      </w:r>
+      <w:r>
+        <w:t xml:space="preserve"> </w:t>
+      </w:r>
+      <m:oMath>
+        <m:r>
+          <m:t>n</m:t>
+        </m:r>
+        <m:r>
+          <m:rPr>
+            <m:sty m:val="p"/>
+          </m:rPr>
+          <m:t>=</m:t>
+        </m:r>
+        <m:r>
+          <m:t>1</m:t>
+        </m:r>
+      </m:oMath>
+      <w:r>
+        <w:t xml:space="preserve"> </w:t>
+      </w:r>
+      <w:r>
+        <w:t xml:space="preserve">to 0.48 at</w:t>
+      </w:r>
+      <w:r>
+        <w:t xml:space="preserve"> </w:t>
+      </w:r>
+      <m:oMath>
+        <m:r>
+          <m:t>n</m:t>
+        </m:r>
+        <m:r>
+          <m:rPr>
+            <m:sty m:val="p"/>
+          </m:rPr>
+          <m:t>=</m:t>
+        </m:r>
+        <m:r>
+          <m:t>5</m:t>
+        </m:r>
+      </m:oMath>
+      <w:r>
+        <w:t xml:space="preserve"> </w:t>
+      </w:r>
+      <w:r>
+        <w:t xml:space="preserve">and 0.2 at</w:t>
+      </w:r>
+      <w:r>
+        <w:t xml:space="preserve"> </w:t>
+      </w:r>
+      <m:oMath>
+        <m:r>
+          <m:t>n</m:t>
+        </m:r>
+        <m:r>
+          <m:rPr>
+            <m:sty m:val="p"/>
+          </m:rPr>
+          <m:t>=</m:t>
+        </m:r>
+        <m:r>
+          <m:t>30</m:t>
+        </m:r>
+      </m:oMath>
+      <w:r>
+        <w:t xml:space="preserve">.</w:t>
+      </w:r>
+    </w:p>
+    <w:bookmarkEnd w:id="33"/>
+    <w:bookmarkEnd w:id="34"/>
+    <w:bookmarkStart w:id="37" w:name="references"/>
     <w:p>
       <w:pPr>
         <w:pStyle w:val="Heading2"/>
@@ -3936,8 +6762,8 @@
         <w:t xml:space="preserve">References</w:t>
       </w:r>
     </w:p>
-    <w:bookmarkStart w:id="29" w:name="refs"/>
-    <w:bookmarkStart w:id="28" w:name="ref-billingsley1995probability"/>
+    <w:bookmarkStart w:id="36" w:name="refs"/>
+    <w:bookmarkStart w:id="35" w:name="ref-billingsley1995probability"/>
     <w:p>
       <w:pPr>
         <w:pStyle w:val="Bibliography"/>
@@ -3959,9 +6785,9 @@
         <w:t xml:space="preserve">. 3rd ed. Wiley Series in Probability and Mathematical Statistics. Wiley.</w:t>
       </w:r>
     </w:p>
-    <w:bookmarkEnd w:id="28"/>
-    <w:bookmarkEnd w:id="29"/>
-    <w:bookmarkEnd w:id="30"/>
+    <w:bookmarkEnd w:id="35"/>
+    <w:bookmarkEnd w:id="36"/>
+    <w:bookmarkEnd w:id="37"/>
     <w:sectPr>
       <w:footnotePr>
         <w:numRestart w:val="eachSect"/>

</xml_diff>

<commit_message>
Deploying to gh-pages from @ Morrison-Lab/pds@faadc8d1cdd37518226216c37ee296e2236e144a 🚀
</commit_message>
<xml_diff>
--- a/limit-theorems.docx
+++ b/limit-theorems.docx
@@ -15,10 +15,10 @@
         <w:pStyle w:val="Date"/>
       </w:pPr>
       <w:r>
-        <w:t xml:space="preserve">Last modified: 2026-10-09 09:57:02 (PDT)</w:t>
+        <w:t xml:space="preserve">Last modified: 2026-10-09 10:05:51 (PDT)</w:t>
       </w:r>
     </w:p>
-    <w:bookmarkStart w:id="34" w:name="sec-clt"/>
+    <w:bookmarkStart w:id="35" w:name="sec-clt"/>
     <w:p>
       <w:pPr>
         <w:pStyle w:val="Heading2"/>
@@ -3926,7 +3926,7 @@
       </w:r>
     </w:p>
     <w:bookmarkEnd w:id="26"/>
-    <w:bookmarkStart w:id="33" w:name="exm-clt-auto"/>
+    <w:bookmarkStart w:id="34" w:name="exm-clt-auto"/>
     <w:p>
       <w:pPr>
         <w:pStyle w:val="BodyText"/>
@@ -4049,17 +4049,19 @@
         <w:t xml:space="preserve"> </w:t>
       </w:r>
       <w:r>
-        <w:t xml:space="preserve">This repository holds a copy at</w:t>
-      </w:r>
-      <w:r>
-        <w:t xml:space="preserve"> </w:t>
-      </w:r>
-      <w:r>
-        <w:rPr>
-          <w:rStyle w:val="VerbatimChar"/>
-        </w:rPr>
-        <w:t xml:space="preserve">data/auto.csv</w:t>
-      </w:r>
+        <w:t xml:space="preserve">This site has a copy at</w:t>
+      </w:r>
+      <w:r>
+        <w:t xml:space="preserve"> </w:t>
+      </w:r>
+      <w:hyperlink r:id="rId29">
+        <w:r>
+          <w:rPr>
+            <w:rStyle w:val="VerbatimChar"/>
+          </w:rPr>
+          <w:t xml:space="preserve">data/auto.csv</w:t>
+        </w:r>
+      </w:hyperlink>
       <w:r>
         <w:t xml:space="preserve">,</w:t>
       </w:r>
@@ -6458,7 +6460,7 @@
       <w:tr>
         <w:tc>
           <w:tcPr/>
-          <w:bookmarkStart w:id="32" w:name="fig-clt-auto"/>
+          <w:bookmarkStart w:id="33" w:name="fig-clt-auto"/>
           <w:p>
             <w:pPr>
               <w:pStyle w:val="Compact"/>
@@ -6469,18 +6471,18 @@
                 <wp:inline>
                   <wp:extent cx="5334000" cy="2000250"/>
                   <wp:effectExtent b="0" l="0" r="0" t="0"/>
-                  <wp:docPr descr="" title="" id="30" name="Picture"/>
+                  <wp:docPr descr="" title="" id="31" name="Picture"/>
                   <a:graphic>
                     <a:graphicData uri="http://schemas.openxmlformats.org/drawingml/2006/picture">
                       <pic:pic>
                         <pic:nvPicPr>
-                          <pic:cNvPr descr="limit-theorems_files/figure-docx/fig-clt-auto-1.png" id="31" name="Picture"/>
+                          <pic:cNvPr descr="limit-theorems_files/figure-docx/fig-clt-auto-1.png" id="32" name="Picture"/>
                           <pic:cNvPicPr>
                             <a:picLocks noChangeArrowheads="1" noChangeAspect="1"/>
                           </pic:cNvPicPr>
                         </pic:nvPicPr>
                         <pic:blipFill>
-                          <a:blip r:embed="rId29"/>
+                          <a:blip r:embed="rId30"/>
                           <a:stretch>
                             <a:fillRect/>
                           </a:stretch>
@@ -6520,7 +6522,7 @@
               <w:t xml:space="preserve">Figure 3: Histograms of 10,000 sample means of horsepower, for samples of n = 1, 5 and 30 cars drawn with replacement from the Auto data. The curve is the normal density with mean mu and standard deviation sigma over the square root of n.</w:t>
             </w:r>
           </w:p>
-          <w:bookmarkEnd w:id="32"/>
+          <w:bookmarkEnd w:id="33"/>
         </w:tc>
       </w:tr>
     </w:tbl>
@@ -6751,9 +6753,9 @@
         <w:t xml:space="preserve">.</w:t>
       </w:r>
     </w:p>
-    <w:bookmarkEnd w:id="33"/>
     <w:bookmarkEnd w:id="34"/>
-    <w:bookmarkStart w:id="37" w:name="references"/>
+    <w:bookmarkEnd w:id="35"/>
+    <w:bookmarkStart w:id="38" w:name="references"/>
     <w:p>
       <w:pPr>
         <w:pStyle w:val="Heading2"/>
@@ -6762,8 +6764,8 @@
         <w:t xml:space="preserve">References</w:t>
       </w:r>
     </w:p>
-    <w:bookmarkStart w:id="36" w:name="refs"/>
-    <w:bookmarkStart w:id="35" w:name="ref-billingsley1995probability"/>
+    <w:bookmarkStart w:id="37" w:name="refs"/>
+    <w:bookmarkStart w:id="36" w:name="ref-billingsley1995probability"/>
     <w:p>
       <w:pPr>
         <w:pStyle w:val="Bibliography"/>
@@ -6785,9 +6787,9 @@
         <w:t xml:space="preserve">. 3rd ed. Wiley Series in Probability and Mathematical Statistics. Wiley.</w:t>
       </w:r>
     </w:p>
-    <w:bookmarkEnd w:id="35"/>
     <w:bookmarkEnd w:id="36"/>
     <w:bookmarkEnd w:id="37"/>
+    <w:bookmarkEnd w:id="38"/>
     <w:sectPr>
       <w:footnotePr>
         <w:numRestart w:val="eachSect"/>

</xml_diff>

<commit_message>
Deploying to gh-pages from @ Morrison-Lab/pds@e987ca6b3b55d7e543019a6289fa8ff67bf52d2b 🚀
</commit_message>
<xml_diff>
--- a/limit-theorems.docx
+++ b/limit-theorems.docx
@@ -15,7 +15,7 @@
         <w:pStyle w:val="Date"/>
       </w:pPr>
       <w:r>
-        <w:t xml:space="preserve">Last modified: 2026-10-09 10:05:51 (PDT)</w:t>
+        <w:t xml:space="preserve">Last modified: 2026-10-09 10:13:34 (PDT)</w:t>
       </w:r>
     </w:p>
     <w:bookmarkStart w:id="35" w:name="sec-clt"/>
@@ -5994,7 +5994,7 @@
         <w:rPr>
           <w:rStyle w:val="NormalTok"/>
         </w:rPr>
-        <w:t xml:space="preserve">op </w:t>
+        <w:t xml:space="preserve">n_labels </w:t>
       </w:r>
       <w:r>
         <w:rPr>
@@ -6012,7 +6012,7 @@
         <w:rPr>
           <w:rStyle w:val="FunctionTok"/>
         </w:rPr>
-        <w:t xml:space="preserve">par</w:t>
+        <w:t xml:space="preserve">paste</w:t>
       </w:r>
       <w:r>
         <w:rPr>
@@ -6022,9 +6022,63 @@
       </w:r>
       <w:r>
         <w:rPr>
+          <w:rStyle w:val="StringTok"/>
+        </w:rPr>
+        <w:t xml:space="preserve">"n ="</w:t>
+      </w:r>
+      <w:r>
+        <w:rPr>
+          <w:rStyle w:val="NormalTok"/>
+        </w:rPr>
+        <w:t xml:space="preserve">, sizes)</w:t>
+      </w:r>
+      <w:r>
+        <w:br/>
+      </w:r>
+      <w:r>
+        <w:rPr>
+          <w:rStyle w:val="NormalTok"/>
+        </w:rPr>
+        <w:t xml:space="preserve">means_long </w:t>
+      </w:r>
+      <w:r>
+        <w:rPr>
+          <w:rStyle w:val="OtherTok"/>
+        </w:rPr>
+        <w:t xml:space="preserve">&lt;-</w:t>
+      </w:r>
+      <w:r>
+        <w:rPr>
+          <w:rStyle w:val="NormalTok"/>
+        </w:rPr>
+        <w:t xml:space="preserve"> </w:t>
+      </w:r>
+      <w:r>
+        <w:rPr>
+          <w:rStyle w:val="FunctionTok"/>
+        </w:rPr>
+        <w:t xml:space="preserve">data.frame</w:t>
+      </w:r>
+      <w:r>
+        <w:rPr>
+          <w:rStyle w:val="NormalTok"/>
+        </w:rPr>
+        <w:t xml:space="preserve">(</w:t>
+      </w:r>
+      <w:r>
+        <w:br/>
+      </w:r>
+      <w:r>
+        <w:rPr>
+          <w:rStyle w:val="NormalTok"/>
+        </w:rPr>
+        <w:t xml:space="preserve">  </w:t>
+      </w:r>
+      <w:r>
+        <w:rPr>
           <w:rStyle w:val="AttributeTok"/>
         </w:rPr>
-        <w:t xml:space="preserve">mfrow =</w:t>
+        <w:t xml:space="preserve">n =</w:t>
       </w:r>
       <w:r>
         <w:rPr>
@@ -6036,7 +6090,7 @@
         <w:rPr>
           <w:rStyle w:val="FunctionTok"/>
         </w:rPr>
-        <w:t xml:space="preserve">c</w:t>
+        <w:t xml:space="preserve">factor</w:t>
       </w:r>
       <w:r>
         <w:rPr>
@@ -6045,6 +6099,51 @@
         <w:t xml:space="preserve">(</w:t>
       </w:r>
       <w:r>
+        <w:br/>
+      </w:r>
+      <w:r>
+        <w:rPr>
+          <w:rStyle w:val="NormalTok"/>
+        </w:rPr>
+        <w:t xml:space="preserve">    </w:t>
+      </w:r>
+      <w:r>
+        <w:rPr>
+          <w:rStyle w:val="FunctionTok"/>
+        </w:rPr>
+        <w:t xml:space="preserve">rep</w:t>
+      </w:r>
+      <w:r>
+        <w:rPr>
+          <w:rStyle w:val="NormalTok"/>
+        </w:rPr>
+        <w:t xml:space="preserve">(n_labels, </w:t>
+      </w:r>
+      <w:r>
+        <w:rPr>
+          <w:rStyle w:val="AttributeTok"/>
+        </w:rPr>
+        <w:t xml:space="preserve">each =</w:t>
+      </w:r>
+      <w:r>
+        <w:rPr>
+          <w:rStyle w:val="NormalTok"/>
+        </w:rPr>
+        <w:t xml:space="preserve"> </w:t>
+      </w:r>
+      <w:r>
+        <w:rPr>
+          <w:rStyle w:val="FunctionTok"/>
+        </w:rPr>
+        <w:t xml:space="preserve">length</w:t>
+      </w:r>
+      <w:r>
+        <w:rPr>
+          <w:rStyle w:val="NormalTok"/>
+        </w:rPr>
+        <w:t xml:space="preserve">(sample_means[[</w:t>
+      </w:r>
+      <w:r>
         <w:rPr>
           <w:rStyle w:val="DecValTok"/>
         </w:rPr>
@@ -6054,397 +6153,1030 @@
         <w:rPr>
           <w:rStyle w:val="NormalTok"/>
         </w:rPr>
+        <w:t xml:space="preserve">]])),</w:t>
+      </w:r>
+      <w:r>
+        <w:br/>
+      </w:r>
+      <w:r>
+        <w:rPr>
+          <w:rStyle w:val="NormalTok"/>
+        </w:rPr>
+        <w:t xml:space="preserve">    </w:t>
+      </w:r>
+      <w:r>
+        <w:rPr>
+          <w:rStyle w:val="AttributeTok"/>
+        </w:rPr>
+        <w:t xml:space="preserve">levels =</w:t>
+      </w:r>
+      <w:r>
+        <w:rPr>
+          <w:rStyle w:val="NormalTok"/>
+        </w:rPr>
+        <w:t xml:space="preserve"> n_labels</w:t>
+      </w:r>
+      <w:r>
+        <w:br/>
+      </w:r>
+      <w:r>
+        <w:rPr>
+          <w:rStyle w:val="NormalTok"/>
+        </w:rPr>
+        <w:t xml:space="preserve">  ),</w:t>
+      </w:r>
+      <w:r>
+        <w:br/>
+      </w:r>
+      <w:r>
+        <w:rPr>
+          <w:rStyle w:val="NormalTok"/>
+        </w:rPr>
+        <w:t xml:space="preserve">  </w:t>
+      </w:r>
+      <w:r>
+        <w:rPr>
+          <w:rStyle w:val="AttributeTok"/>
+        </w:rPr>
+        <w:t xml:space="preserve">sample_mean =</w:t>
+      </w:r>
+      <w:r>
+        <w:rPr>
+          <w:rStyle w:val="NormalTok"/>
+        </w:rPr>
+        <w:t xml:space="preserve"> </w:t>
+      </w:r>
+      <w:r>
+        <w:rPr>
+          <w:rStyle w:val="FunctionTok"/>
+        </w:rPr>
+        <w:t xml:space="preserve">unlist</w:t>
+      </w:r>
+      <w:r>
+        <w:rPr>
+          <w:rStyle w:val="NormalTok"/>
+        </w:rPr>
+        <w:t xml:space="preserve">(sample_means)</w:t>
+      </w:r>
+      <w:r>
+        <w:br/>
+      </w:r>
+      <w:r>
+        <w:rPr>
+          <w:rStyle w:val="NormalTok"/>
+        </w:rPr>
+        <w:t xml:space="preserve">)</w:t>
+      </w:r>
+      <w:r>
+        <w:br/>
+      </w:r>
+      <w:r>
+        <w:rPr>
+          <w:rStyle w:val="NormalTok"/>
+        </w:rPr>
+        <w:t xml:space="preserve">normal_curves </w:t>
+      </w:r>
+      <w:r>
+        <w:rPr>
+          <w:rStyle w:val="OtherTok"/>
+        </w:rPr>
+        <w:t xml:space="preserve">&lt;-</w:t>
+      </w:r>
+      <w:r>
+        <w:rPr>
+          <w:rStyle w:val="NormalTok"/>
+        </w:rPr>
+        <w:t xml:space="preserve"> </w:t>
+      </w:r>
+      <w:r>
+        <w:rPr>
+          <w:rStyle w:val="FunctionTok"/>
+        </w:rPr>
+        <w:t xml:space="preserve">do.call</w:t>
+      </w:r>
+      <w:r>
+        <w:rPr>
+          <w:rStyle w:val="NormalTok"/>
+        </w:rPr>
+        <w:t xml:space="preserve">(rbind, </w:t>
+      </w:r>
+      <w:r>
+        <w:rPr>
+          <w:rStyle w:val="FunctionTok"/>
+        </w:rPr>
+        <w:t xml:space="preserve">lapply</w:t>
+      </w:r>
+      <w:r>
+        <w:rPr>
+          <w:rStyle w:val="NormalTok"/>
+        </w:rPr>
+        <w:t xml:space="preserve">(</w:t>
+      </w:r>
+      <w:r>
+        <w:rPr>
+          <w:rStyle w:val="FunctionTok"/>
+        </w:rPr>
+        <w:t xml:space="preserve">seq_along</w:t>
+      </w:r>
+      <w:r>
+        <w:rPr>
+          <w:rStyle w:val="NormalTok"/>
+        </w:rPr>
+        <w:t xml:space="preserve">(sizes), </w:t>
+      </w:r>
+      <w:r>
+        <w:rPr>
+          <w:rStyle w:val="ControlFlowTok"/>
+        </w:rPr>
+        <w:t xml:space="preserve">function</w:t>
+      </w:r>
+      <w:r>
+        <w:rPr>
+          <w:rStyle w:val="NormalTok"/>
+        </w:rPr>
+        <w:t xml:space="preserve">(k) {</w:t>
+      </w:r>
+      <w:r>
+        <w:br/>
+      </w:r>
+      <w:r>
+        <w:rPr>
+          <w:rStyle w:val="NormalTok"/>
+        </w:rPr>
+        <w:t xml:space="preserve">  se </w:t>
+      </w:r>
+      <w:r>
+        <w:rPr>
+          <w:rStyle w:val="OtherTok"/>
+        </w:rPr>
+        <w:t xml:space="preserve">&lt;-</w:t>
+      </w:r>
+      <w:r>
+        <w:rPr>
+          <w:rStyle w:val="NormalTok"/>
+        </w:rPr>
+        <w:t xml:space="preserve"> sigma </w:t>
+      </w:r>
+      <w:r>
+        <w:rPr>
+          <w:rStyle w:val="SpecialCharTok"/>
+        </w:rPr>
+        <w:t xml:space="preserve">/</w:t>
+      </w:r>
+      <w:r>
+        <w:rPr>
+          <w:rStyle w:val="NormalTok"/>
+        </w:rPr>
+        <w:t xml:space="preserve"> </w:t>
+      </w:r>
+      <w:r>
+        <w:rPr>
+          <w:rStyle w:val="FunctionTok"/>
+        </w:rPr>
+        <w:t xml:space="preserve">sqrt</w:t>
+      </w:r>
+      <w:r>
+        <w:rPr>
+          <w:rStyle w:val="NormalTok"/>
+        </w:rPr>
+        <w:t xml:space="preserve">(sizes[k])</w:t>
+      </w:r>
+      <w:r>
+        <w:br/>
+      </w:r>
+      <w:r>
+        <w:rPr>
+          <w:rStyle w:val="NormalTok"/>
+        </w:rPr>
+        <w:t xml:space="preserve">  grid </w:t>
+      </w:r>
+      <w:r>
+        <w:rPr>
+          <w:rStyle w:val="OtherTok"/>
+        </w:rPr>
+        <w:t xml:space="preserve">&lt;-</w:t>
+      </w:r>
+      <w:r>
+        <w:rPr>
+          <w:rStyle w:val="NormalTok"/>
+        </w:rPr>
+        <w:t xml:space="preserve"> </w:t>
+      </w:r>
+      <w:r>
+        <w:rPr>
+          <w:rStyle w:val="FunctionTok"/>
+        </w:rPr>
+        <w:t xml:space="preserve">seq</w:t>
+      </w:r>
+      <w:r>
+        <w:rPr>
+          <w:rStyle w:val="NormalTok"/>
+        </w:rPr>
+        <w:t xml:space="preserve">(mu </w:t>
+      </w:r>
+      <w:r>
+        <w:rPr>
+          <w:rStyle w:val="SpecialCharTok"/>
+        </w:rPr>
+        <w:t xml:space="preserve">-</w:t>
+      </w:r>
+      <w:r>
+        <w:rPr>
+          <w:rStyle w:val="NormalTok"/>
+        </w:rPr>
+        <w:t xml:space="preserve"> </w:t>
+      </w:r>
+      <w:r>
+        <w:rPr>
+          <w:rStyle w:val="DecValTok"/>
+        </w:rPr>
+        <w:t xml:space="preserve">4</w:t>
+      </w:r>
+      <w:r>
+        <w:rPr>
+          <w:rStyle w:val="NormalTok"/>
+        </w:rPr>
+        <w:t xml:space="preserve"> </w:t>
+      </w:r>
+      <w:r>
+        <w:rPr>
+          <w:rStyle w:val="SpecialCharTok"/>
+        </w:rPr>
+        <w:t xml:space="preserve">*</w:t>
+      </w:r>
+      <w:r>
+        <w:rPr>
+          <w:rStyle w:val="NormalTok"/>
+        </w:rPr>
+        <w:t xml:space="preserve"> se, mu </w:t>
+      </w:r>
+      <w:r>
+        <w:rPr>
+          <w:rStyle w:val="SpecialCharTok"/>
+        </w:rPr>
+        <w:t xml:space="preserve">+</w:t>
+      </w:r>
+      <w:r>
+        <w:rPr>
+          <w:rStyle w:val="NormalTok"/>
+        </w:rPr>
+        <w:t xml:space="preserve"> </w:t>
+      </w:r>
+      <w:r>
+        <w:rPr>
+          <w:rStyle w:val="DecValTok"/>
+        </w:rPr>
+        <w:t xml:space="preserve">4</w:t>
+      </w:r>
+      <w:r>
+        <w:rPr>
+          <w:rStyle w:val="NormalTok"/>
+        </w:rPr>
+        <w:t xml:space="preserve"> </w:t>
+      </w:r>
+      <w:r>
+        <w:rPr>
+          <w:rStyle w:val="SpecialCharTok"/>
+        </w:rPr>
+        <w:t xml:space="preserve">*</w:t>
+      </w:r>
+      <w:r>
+        <w:rPr>
+          <w:rStyle w:val="NormalTok"/>
+        </w:rPr>
+        <w:t xml:space="preserve"> se, </w:t>
+      </w:r>
+      <w:r>
+        <w:rPr>
+          <w:rStyle w:val="AttributeTok"/>
+        </w:rPr>
+        <w:t xml:space="preserve">length.out =</w:t>
+      </w:r>
+      <w:r>
+        <w:rPr>
+          <w:rStyle w:val="NormalTok"/>
+        </w:rPr>
+        <w:t xml:space="preserve"> </w:t>
+      </w:r>
+      <w:r>
+        <w:rPr>
+          <w:rStyle w:val="DecValTok"/>
+        </w:rPr>
+        <w:t xml:space="preserve">200</w:t>
+      </w:r>
+      <w:r>
+        <w:rPr>
+          <w:rStyle w:val="NormalTok"/>
+        </w:rPr>
+        <w:t xml:space="preserve">)</w:t>
+      </w:r>
+      <w:r>
+        <w:br/>
+      </w:r>
+      <w:r>
+        <w:rPr>
+          <w:rStyle w:val="NormalTok"/>
+        </w:rPr>
+        <w:t xml:space="preserve">  </w:t>
+      </w:r>
+      <w:r>
+        <w:rPr>
+          <w:rStyle w:val="FunctionTok"/>
+        </w:rPr>
+        <w:t xml:space="preserve">data.frame</w:t>
+      </w:r>
+      <w:r>
+        <w:rPr>
+          <w:rStyle w:val="NormalTok"/>
+        </w:rPr>
+        <w:t xml:space="preserve">(</w:t>
+      </w:r>
+      <w:r>
+        <w:br/>
+      </w:r>
+      <w:r>
+        <w:rPr>
+          <w:rStyle w:val="NormalTok"/>
+        </w:rPr>
+        <w:t xml:space="preserve">    </w:t>
+      </w:r>
+      <w:r>
+        <w:rPr>
+          <w:rStyle w:val="AttributeTok"/>
+        </w:rPr>
+        <w:t xml:space="preserve">n =</w:t>
+      </w:r>
+      <w:r>
+        <w:rPr>
+          <w:rStyle w:val="NormalTok"/>
+        </w:rPr>
+        <w:t xml:space="preserve"> </w:t>
+      </w:r>
+      <w:r>
+        <w:rPr>
+          <w:rStyle w:val="FunctionTok"/>
+        </w:rPr>
+        <w:t xml:space="preserve">factor</w:t>
+      </w:r>
+      <w:r>
+        <w:rPr>
+          <w:rStyle w:val="NormalTok"/>
+        </w:rPr>
+        <w:t xml:space="preserve">(n_labels[k], </w:t>
+      </w:r>
+      <w:r>
+        <w:rPr>
+          <w:rStyle w:val="AttributeTok"/>
+        </w:rPr>
+        <w:t xml:space="preserve">levels =</w:t>
+      </w:r>
+      <w:r>
+        <w:rPr>
+          <w:rStyle w:val="NormalTok"/>
+        </w:rPr>
+        <w:t xml:space="preserve"> n_labels),</w:t>
+      </w:r>
+      <w:r>
+        <w:br/>
+      </w:r>
+      <w:r>
+        <w:rPr>
+          <w:rStyle w:val="NormalTok"/>
+        </w:rPr>
+        <w:t xml:space="preserve">    </w:t>
+      </w:r>
+      <w:r>
+        <w:rPr>
+          <w:rStyle w:val="AttributeTok"/>
+        </w:rPr>
+        <w:t xml:space="preserve">sample_mean =</w:t>
+      </w:r>
+      <w:r>
+        <w:rPr>
+          <w:rStyle w:val="NormalTok"/>
+        </w:rPr>
+        <w:t xml:space="preserve"> grid,</w:t>
+      </w:r>
+      <w:r>
+        <w:br/>
+      </w:r>
+      <w:r>
+        <w:rPr>
+          <w:rStyle w:val="NormalTok"/>
+        </w:rPr>
+        <w:t xml:space="preserve">    </w:t>
+      </w:r>
+      <w:r>
+        <w:rPr>
+          <w:rStyle w:val="AttributeTok"/>
+        </w:rPr>
+        <w:t xml:space="preserve">density =</w:t>
+      </w:r>
+      <w:r>
+        <w:rPr>
+          <w:rStyle w:val="NormalTok"/>
+        </w:rPr>
+        <w:t xml:space="preserve"> </w:t>
+      </w:r>
+      <w:r>
+        <w:rPr>
+          <w:rStyle w:val="FunctionTok"/>
+        </w:rPr>
+        <w:t xml:space="preserve">dnorm</w:t>
+      </w:r>
+      <w:r>
+        <w:rPr>
+          <w:rStyle w:val="NormalTok"/>
+        </w:rPr>
+        <w:t xml:space="preserve">(grid, mu, se)</w:t>
+      </w:r>
+      <w:r>
+        <w:br/>
+      </w:r>
+      <w:r>
+        <w:rPr>
+          <w:rStyle w:val="NormalTok"/>
+        </w:rPr>
+        <w:t xml:space="preserve">  )</w:t>
+      </w:r>
+      <w:r>
+        <w:br/>
+      </w:r>
+      <w:r>
+        <w:rPr>
+          <w:rStyle w:val="NormalTok"/>
+        </w:rPr>
+        <w:t xml:space="preserve">}))</w:t>
+      </w:r>
+      <w:r>
+        <w:br/>
+      </w:r>
+      <w:r>
+        <w:br/>
+      </w:r>
+      <w:r>
+        <w:rPr>
+          <w:rStyle w:val="NormalTok"/>
+        </w:rPr>
+        <w:t xml:space="preserve">ggplot2</w:t>
+      </w:r>
+      <w:r>
+        <w:rPr>
+          <w:rStyle w:val="SpecialCharTok"/>
+        </w:rPr>
+        <w:t xml:space="preserve">::</w:t>
+      </w:r>
+      <w:r>
+        <w:rPr>
+          <w:rStyle w:val="FunctionTok"/>
+        </w:rPr>
+        <w:t xml:space="preserve">ggplot</w:t>
+      </w:r>
+      <w:r>
+        <w:rPr>
+          <w:rStyle w:val="NormalTok"/>
+        </w:rPr>
+        <w:t xml:space="preserve">(means_long, ggplot2</w:t>
+      </w:r>
+      <w:r>
+        <w:rPr>
+          <w:rStyle w:val="SpecialCharTok"/>
+        </w:rPr>
+        <w:t xml:space="preserve">::</w:t>
+      </w:r>
+      <w:r>
+        <w:rPr>
+          <w:rStyle w:val="FunctionTok"/>
+        </w:rPr>
+        <w:t xml:space="preserve">aes</w:t>
+      </w:r>
+      <w:r>
+        <w:rPr>
+          <w:rStyle w:val="NormalTok"/>
+        </w:rPr>
+        <w:t xml:space="preserve">(</w:t>
+      </w:r>
+      <w:r>
+        <w:rPr>
+          <w:rStyle w:val="AttributeTok"/>
+        </w:rPr>
+        <w:t xml:space="preserve">x =</w:t>
+      </w:r>
+      <w:r>
+        <w:rPr>
+          <w:rStyle w:val="NormalTok"/>
+        </w:rPr>
+        <w:t xml:space="preserve"> sample_mean)) </w:t>
+      </w:r>
+      <w:r>
+        <w:rPr>
+          <w:rStyle w:val="SpecialCharTok"/>
+        </w:rPr>
+        <w:t xml:space="preserve">+</w:t>
+      </w:r>
+      <w:r>
+        <w:br/>
+      </w:r>
+      <w:r>
+        <w:rPr>
+          <w:rStyle w:val="NormalTok"/>
+        </w:rPr>
+        <w:t xml:space="preserve">  ggplot2</w:t>
+      </w:r>
+      <w:r>
+        <w:rPr>
+          <w:rStyle w:val="SpecialCharTok"/>
+        </w:rPr>
+        <w:t xml:space="preserve">::</w:t>
+      </w:r>
+      <w:r>
+        <w:rPr>
+          <w:rStyle w:val="FunctionTok"/>
+        </w:rPr>
+        <w:t xml:space="preserve">geom_histogram</w:t>
+      </w:r>
+      <w:r>
+        <w:rPr>
+          <w:rStyle w:val="NormalTok"/>
+        </w:rPr>
+        <w:t xml:space="preserve">(</w:t>
+      </w:r>
+      <w:r>
+        <w:br/>
+      </w:r>
+      <w:r>
+        <w:rPr>
+          <w:rStyle w:val="NormalTok"/>
+        </w:rPr>
+        <w:t xml:space="preserve">    ggplot2</w:t>
+      </w:r>
+      <w:r>
+        <w:rPr>
+          <w:rStyle w:val="SpecialCharTok"/>
+        </w:rPr>
+        <w:t xml:space="preserve">::</w:t>
+      </w:r>
+      <w:r>
+        <w:rPr>
+          <w:rStyle w:val="FunctionTok"/>
+        </w:rPr>
+        <w:t xml:space="preserve">aes</w:t>
+      </w:r>
+      <w:r>
+        <w:rPr>
+          <w:rStyle w:val="NormalTok"/>
+        </w:rPr>
+        <w:t xml:space="preserve">(</w:t>
+      </w:r>
+      <w:r>
+        <w:rPr>
+          <w:rStyle w:val="AttributeTok"/>
+        </w:rPr>
+        <w:t xml:space="preserve">y =</w:t>
+      </w:r>
+      <w:r>
+        <w:rPr>
+          <w:rStyle w:val="NormalTok"/>
+        </w:rPr>
+        <w:t xml:space="preserve"> ggplot2</w:t>
+      </w:r>
+      <w:r>
+        <w:rPr>
+          <w:rStyle w:val="SpecialCharTok"/>
+        </w:rPr>
+        <w:t xml:space="preserve">::</w:t>
+      </w:r>
+      <w:r>
+        <w:rPr>
+          <w:rStyle w:val="FunctionTok"/>
+        </w:rPr>
+        <w:t xml:space="preserve">after_stat</w:t>
+      </w:r>
+      <w:r>
+        <w:rPr>
+          <w:rStyle w:val="NormalTok"/>
+        </w:rPr>
+        <w:t xml:space="preserve">(density)),</w:t>
+      </w:r>
+      <w:r>
+        <w:br/>
+      </w:r>
+      <w:r>
+        <w:rPr>
+          <w:rStyle w:val="NormalTok"/>
+        </w:rPr>
+        <w:t xml:space="preserve">    </w:t>
+      </w:r>
+      <w:r>
+        <w:rPr>
+          <w:rStyle w:val="AttributeTok"/>
+        </w:rPr>
+        <w:t xml:space="preserve">bins =</w:t>
+      </w:r>
+      <w:r>
+        <w:rPr>
+          <w:rStyle w:val="NormalTok"/>
+        </w:rPr>
+        <w:t xml:space="preserve"> </w:t>
+      </w:r>
+      <w:r>
+        <w:rPr>
+          <w:rStyle w:val="DecValTok"/>
+        </w:rPr>
+        <w:t xml:space="preserve">40</w:t>
+      </w:r>
+      <w:r>
+        <w:rPr>
+          <w:rStyle w:val="NormalTok"/>
+        </w:rPr>
+        <w:t xml:space="preserve">,</w:t>
+      </w:r>
+      <w:r>
+        <w:br/>
+      </w:r>
+      <w:r>
+        <w:rPr>
+          <w:rStyle w:val="NormalTok"/>
+        </w:rPr>
+        <w:t xml:space="preserve">    </w:t>
+      </w:r>
+      <w:r>
+        <w:rPr>
+          <w:rStyle w:val="AttributeTok"/>
+        </w:rPr>
+        <w:t xml:space="preserve">fill =</w:t>
+      </w:r>
+      <w:r>
+        <w:rPr>
+          <w:rStyle w:val="NormalTok"/>
+        </w:rPr>
+        <w:t xml:space="preserve"> </w:t>
+      </w:r>
+      <w:r>
+        <w:rPr>
+          <w:rStyle w:val="StringTok"/>
+        </w:rPr>
+        <w:t xml:space="preserve">"grey70"</w:t>
+      </w:r>
+      <w:r>
+        <w:rPr>
+          <w:rStyle w:val="NormalTok"/>
+        </w:rPr>
+        <w:t xml:space="preserve">,</w:t>
+      </w:r>
+      <w:r>
+        <w:br/>
+      </w:r>
+      <w:r>
+        <w:rPr>
+          <w:rStyle w:val="NormalTok"/>
+        </w:rPr>
+        <w:t xml:space="preserve">    </w:t>
+      </w:r>
+      <w:r>
+        <w:rPr>
+          <w:rStyle w:val="AttributeTok"/>
+        </w:rPr>
+        <w:t xml:space="preserve">color =</w:t>
+      </w:r>
+      <w:r>
+        <w:rPr>
+          <w:rStyle w:val="NormalTok"/>
+        </w:rPr>
+        <w:t xml:space="preserve"> </w:t>
+      </w:r>
+      <w:r>
+        <w:rPr>
+          <w:rStyle w:val="StringTok"/>
+        </w:rPr>
+        <w:t xml:space="preserve">"white"</w:t>
+      </w:r>
+      <w:r>
+        <w:br/>
+      </w:r>
+      <w:r>
+        <w:rPr>
+          <w:rStyle w:val="NormalTok"/>
+        </w:rPr>
+        <w:t xml:space="preserve">  ) </w:t>
+      </w:r>
+      <w:r>
+        <w:rPr>
+          <w:rStyle w:val="SpecialCharTok"/>
+        </w:rPr>
+        <w:t xml:space="preserve">+</w:t>
+      </w:r>
+      <w:r>
+        <w:br/>
+      </w:r>
+      <w:r>
+        <w:rPr>
+          <w:rStyle w:val="NormalTok"/>
+        </w:rPr>
+        <w:t xml:space="preserve">  ggplot2</w:t>
+      </w:r>
+      <w:r>
+        <w:rPr>
+          <w:rStyle w:val="SpecialCharTok"/>
+        </w:rPr>
+        <w:t xml:space="preserve">::</w:t>
+      </w:r>
+      <w:r>
+        <w:rPr>
+          <w:rStyle w:val="FunctionTok"/>
+        </w:rPr>
+        <w:t xml:space="preserve">geom_line</w:t>
+      </w:r>
+      <w:r>
+        <w:rPr>
+          <w:rStyle w:val="NormalTok"/>
+        </w:rPr>
+        <w:t xml:space="preserve">(</w:t>
+      </w:r>
+      <w:r>
+        <w:br/>
+      </w:r>
+      <w:r>
+        <w:rPr>
+          <w:rStyle w:val="NormalTok"/>
+        </w:rPr>
+        <w:t xml:space="preserve">    ggplot2</w:t>
+      </w:r>
+      <w:r>
+        <w:rPr>
+          <w:rStyle w:val="SpecialCharTok"/>
+        </w:rPr>
+        <w:t xml:space="preserve">::</w:t>
+      </w:r>
+      <w:r>
+        <w:rPr>
+          <w:rStyle w:val="FunctionTok"/>
+        </w:rPr>
+        <w:t xml:space="preserve">aes</w:t>
+      </w:r>
+      <w:r>
+        <w:rPr>
+          <w:rStyle w:val="NormalTok"/>
+        </w:rPr>
+        <w:t xml:space="preserve">(</w:t>
+      </w:r>
+      <w:r>
+        <w:rPr>
+          <w:rStyle w:val="AttributeTok"/>
+        </w:rPr>
+        <w:t xml:space="preserve">y =</w:t>
+      </w:r>
+      <w:r>
+        <w:rPr>
+          <w:rStyle w:val="NormalTok"/>
+        </w:rPr>
+        <w:t xml:space="preserve"> density),</w:t>
+      </w:r>
+      <w:r>
+        <w:br/>
+      </w:r>
+      <w:r>
+        <w:rPr>
+          <w:rStyle w:val="NormalTok"/>
+        </w:rPr>
+        <w:t xml:space="preserve">    </w:t>
+      </w:r>
+      <w:r>
+        <w:rPr>
+          <w:rStyle w:val="AttributeTok"/>
+        </w:rPr>
+        <w:t xml:space="preserve">data =</w:t>
+      </w:r>
+      <w:r>
+        <w:rPr>
+          <w:rStyle w:val="NormalTok"/>
+        </w:rPr>
+        <w:t xml:space="preserve"> normal_curves,</w:t>
+      </w:r>
+      <w:r>
+        <w:br/>
+      </w:r>
+      <w:r>
+        <w:rPr>
+          <w:rStyle w:val="NormalTok"/>
+        </w:rPr>
+        <w:t xml:space="preserve">    </w:t>
+      </w:r>
+      <w:r>
+        <w:rPr>
+          <w:rStyle w:val="AttributeTok"/>
+        </w:rPr>
+        <w:t xml:space="preserve">linewidth =</w:t>
+      </w:r>
+      <w:r>
+        <w:rPr>
+          <w:rStyle w:val="NormalTok"/>
+        </w:rPr>
+        <w:t xml:space="preserve"> </w:t>
+      </w:r>
+      <w:r>
+        <w:rPr>
+          <w:rStyle w:val="DecValTok"/>
+        </w:rPr>
+        <w:t xml:space="preserve">1</w:t>
+      </w:r>
+      <w:r>
+        <w:br/>
+      </w:r>
+      <w:r>
+        <w:rPr>
+          <w:rStyle w:val="NormalTok"/>
+        </w:rPr>
+        <w:t xml:space="preserve">  ) </w:t>
+      </w:r>
+      <w:r>
+        <w:rPr>
+          <w:rStyle w:val="SpecialCharTok"/>
+        </w:rPr>
+        <w:t xml:space="preserve">+</w:t>
+      </w:r>
+      <w:r>
+        <w:br/>
+      </w:r>
+      <w:r>
+        <w:rPr>
+          <w:rStyle w:val="NormalTok"/>
+        </w:rPr>
+        <w:t xml:space="preserve">  ggplot2</w:t>
+      </w:r>
+      <w:r>
+        <w:rPr>
+          <w:rStyle w:val="SpecialCharTok"/>
+        </w:rPr>
+        <w:t xml:space="preserve">::</w:t>
+      </w:r>
+      <w:r>
+        <w:rPr>
+          <w:rStyle w:val="FunctionTok"/>
+        </w:rPr>
+        <w:t xml:space="preserve">facet_wrap</w:t>
+      </w:r>
+      <w:r>
+        <w:rPr>
+          <w:rStyle w:val="NormalTok"/>
+        </w:rPr>
+        <w:t xml:space="preserve">(ggplot2</w:t>
+      </w:r>
+      <w:r>
+        <w:rPr>
+          <w:rStyle w:val="SpecialCharTok"/>
+        </w:rPr>
+        <w:t xml:space="preserve">::</w:t>
+      </w:r>
+      <w:r>
+        <w:rPr>
+          <w:rStyle w:val="FunctionTok"/>
+        </w:rPr>
+        <w:t xml:space="preserve">vars</w:t>
+      </w:r>
+      <w:r>
+        <w:rPr>
+          <w:rStyle w:val="NormalTok"/>
+        </w:rPr>
+        <w:t xml:space="preserve">(n), </w:t>
+      </w:r>
+      <w:r>
+        <w:rPr>
+          <w:rStyle w:val="AttributeTok"/>
+        </w:rPr>
+        <w:t xml:space="preserve">scales =</w:t>
+      </w:r>
+      <w:r>
+        <w:rPr>
+          <w:rStyle w:val="NormalTok"/>
+        </w:rPr>
+        <w:t xml:space="preserve"> </w:t>
+      </w:r>
+      <w:r>
+        <w:rPr>
+          <w:rStyle w:val="StringTok"/>
+        </w:rPr>
+        <w:t xml:space="preserve">"free"</w:t>
+      </w:r>
+      <w:r>
+        <w:rPr>
+          <w:rStyle w:val="NormalTok"/>
+        </w:rPr>
+        <w:t xml:space="preserve">) </w:t>
+      </w:r>
+      <w:r>
+        <w:rPr>
+          <w:rStyle w:val="SpecialCharTok"/>
+        </w:rPr>
+        <w:t xml:space="preserve">+</w:t>
+      </w:r>
+      <w:r>
+        <w:br/>
+      </w:r>
+      <w:r>
+        <w:rPr>
+          <w:rStyle w:val="NormalTok"/>
+        </w:rPr>
+        <w:t xml:space="preserve">  ggplot2</w:t>
+      </w:r>
+      <w:r>
+        <w:rPr>
+          <w:rStyle w:val="SpecialCharTok"/>
+        </w:rPr>
+        <w:t xml:space="preserve">::</w:t>
+      </w:r>
+      <w:r>
+        <w:rPr>
+          <w:rStyle w:val="FunctionTok"/>
+        </w:rPr>
+        <w:t xml:space="preserve">labs</w:t>
+      </w:r>
+      <w:r>
+        <w:rPr>
+          <w:rStyle w:val="NormalTok"/>
+        </w:rPr>
+        <w:t xml:space="preserve">(</w:t>
+      </w:r>
+      <w:r>
+        <w:rPr>
+          <w:rStyle w:val="AttributeTok"/>
+        </w:rPr>
+        <w:t xml:space="preserve">x =</w:t>
+      </w:r>
+      <w:r>
+        <w:rPr>
+          <w:rStyle w:val="NormalTok"/>
+        </w:rPr>
+        <w:t xml:space="preserve"> </w:t>
+      </w:r>
+      <w:r>
+        <w:rPr>
+          <w:rStyle w:val="StringTok"/>
+        </w:rPr>
+        <w:t xml:space="preserve">"sample mean of horsepower"</w:t>
+      </w:r>
+      <w:r>
+        <w:rPr>
+          <w:rStyle w:val="NormalTok"/>
+        </w:rPr>
         <w:t xml:space="preserve">, </w:t>
       </w:r>
       <w:r>
         <w:rPr>
-          <w:rStyle w:val="DecValTok"/>
-        </w:rPr>
-        <w:t xml:space="preserve">3</w:t>
-      </w:r>
-      <w:r>
-        <w:rPr>
-          <w:rStyle w:val="NormalTok"/>
-        </w:rPr>
-        <w:t xml:space="preserve">), </w:t>
-      </w:r>
-      <w:r>
-        <w:rPr>
           <w:rStyle w:val="AttributeTok"/>
         </w:rPr>
-        <w:t xml:space="preserve">mar =</w:t>
-      </w:r>
-      <w:r>
-        <w:rPr>
-          <w:rStyle w:val="NormalTok"/>
-        </w:rPr>
-        <w:t xml:space="preserve"> </w:t>
+        <w:t xml:space="preserve">y =</w:t>
+      </w:r>
+      <w:r>
+        <w:rPr>
+          <w:rStyle w:val="NormalTok"/>
+        </w:rPr>
+        <w:t xml:space="preserve"> </w:t>
+      </w:r>
+      <w:r>
+        <w:rPr>
+          <w:rStyle w:val="StringTok"/>
+        </w:rPr>
+        <w:t xml:space="preserve">"density"</w:t>
+      </w:r>
+      <w:r>
+        <w:rPr>
+          <w:rStyle w:val="NormalTok"/>
+        </w:rPr>
+        <w:t xml:space="preserve">) </w:t>
+      </w:r>
+      <w:r>
+        <w:rPr>
+          <w:rStyle w:val="SpecialCharTok"/>
+        </w:rPr>
+        <w:t xml:space="preserve">+</w:t>
+      </w:r>
+      <w:r>
+        <w:br/>
+      </w:r>
+      <w:r>
+        <w:rPr>
+          <w:rStyle w:val="NormalTok"/>
+        </w:rPr>
+        <w:t xml:space="preserve">  ggplot2</w:t>
+      </w:r>
+      <w:r>
+        <w:rPr>
+          <w:rStyle w:val="SpecialCharTok"/>
+        </w:rPr>
+        <w:t xml:space="preserve">::</w:t>
       </w:r>
       <w:r>
         <w:rPr>
           <w:rStyle w:val="FunctionTok"/>
         </w:rPr>
-        <w:t xml:space="preserve">c</w:t>
-      </w:r>
-      <w:r>
-        <w:rPr>
-          <w:rStyle w:val="NormalTok"/>
-        </w:rPr>
-        <w:t xml:space="preserve">(</w:t>
-      </w:r>
-      <w:r>
-        <w:rPr>
-          <w:rStyle w:val="DecValTok"/>
-        </w:rPr>
-        <w:t xml:space="preserve">4</w:t>
-      </w:r>
-      <w:r>
-        <w:rPr>
-          <w:rStyle w:val="NormalTok"/>
-        </w:rPr>
-        <w:t xml:space="preserve">, </w:t>
-      </w:r>
-      <w:r>
-        <w:rPr>
-          <w:rStyle w:val="DecValTok"/>
-        </w:rPr>
-        <w:t xml:space="preserve">4</w:t>
-      </w:r>
-      <w:r>
-        <w:rPr>
-          <w:rStyle w:val="NormalTok"/>
-        </w:rPr>
-        <w:t xml:space="preserve">, </w:t>
-      </w:r>
-      <w:r>
-        <w:rPr>
-          <w:rStyle w:val="DecValTok"/>
-        </w:rPr>
-        <w:t xml:space="preserve">2</w:t>
-      </w:r>
-      <w:r>
-        <w:rPr>
-          <w:rStyle w:val="NormalTok"/>
-        </w:rPr>
-        <w:t xml:space="preserve">, </w:t>
-      </w:r>
-      <w:r>
-        <w:rPr>
-          <w:rStyle w:val="DecValTok"/>
-        </w:rPr>
-        <w:t xml:space="preserve">1</w:t>
-      </w:r>
-      <w:r>
-        <w:rPr>
-          <w:rStyle w:val="NormalTok"/>
-        </w:rPr>
-        <w:t xml:space="preserve">))</w:t>
-      </w:r>
-      <w:r>
-        <w:br/>
-      </w:r>
-      <w:r>
-        <w:rPr>
-          <w:rStyle w:val="ControlFlowTok"/>
-        </w:rPr>
-        <w:t xml:space="preserve">for</w:t>
-      </w:r>
-      <w:r>
-        <w:rPr>
-          <w:rStyle w:val="NormalTok"/>
-        </w:rPr>
-        <w:t xml:space="preserve"> (k </w:t>
-      </w:r>
-      <w:r>
-        <w:rPr>
-          <w:rStyle w:val="ControlFlowTok"/>
-        </w:rPr>
-        <w:t xml:space="preserve">in</w:t>
-      </w:r>
-      <w:r>
-        <w:rPr>
-          <w:rStyle w:val="NormalTok"/>
-        </w:rPr>
-        <w:t xml:space="preserve"> </w:t>
-      </w:r>
-      <w:r>
-        <w:rPr>
-          <w:rStyle w:val="FunctionTok"/>
-        </w:rPr>
-        <w:t xml:space="preserve">seq_along</w:t>
-      </w:r>
-      <w:r>
-        <w:rPr>
-          <w:rStyle w:val="NormalTok"/>
-        </w:rPr>
-        <w:t xml:space="preserve">(sizes)) {</w:t>
-      </w:r>
-      <w:r>
-        <w:br/>
-      </w:r>
-      <w:r>
-        <w:rPr>
-          <w:rStyle w:val="NormalTok"/>
-        </w:rPr>
-        <w:t xml:space="preserve">  </w:t>
-      </w:r>
-      <w:r>
-        <w:rPr>
-          <w:rStyle w:val="FunctionTok"/>
-        </w:rPr>
-        <w:t xml:space="preserve">hist</w:t>
-      </w:r>
-      <w:r>
-        <w:rPr>
-          <w:rStyle w:val="NormalTok"/>
-        </w:rPr>
-        <w:t xml:space="preserve">(sample_means[[k]], </w:t>
-      </w:r>
-      <w:r>
-        <w:rPr>
-          <w:rStyle w:val="AttributeTok"/>
-        </w:rPr>
-        <w:t xml:space="preserve">breaks =</w:t>
-      </w:r>
-      <w:r>
-        <w:rPr>
-          <w:rStyle w:val="NormalTok"/>
-        </w:rPr>
-        <w:t xml:space="preserve"> </w:t>
-      </w:r>
-      <w:r>
-        <w:rPr>
-          <w:rStyle w:val="DecValTok"/>
-        </w:rPr>
-        <w:t xml:space="preserve">40</w:t>
-      </w:r>
-      <w:r>
-        <w:rPr>
-          <w:rStyle w:val="NormalTok"/>
-        </w:rPr>
-        <w:t xml:space="preserve">, </w:t>
-      </w:r>
-      <w:r>
-        <w:rPr>
-          <w:rStyle w:val="AttributeTok"/>
-        </w:rPr>
-        <w:t xml:space="preserve">freq =</w:t>
-      </w:r>
-      <w:r>
-        <w:rPr>
-          <w:rStyle w:val="NormalTok"/>
-        </w:rPr>
-        <w:t xml:space="preserve"> </w:t>
-      </w:r>
-      <w:r>
-        <w:rPr>
-          <w:rStyle w:val="ConstantTok"/>
-        </w:rPr>
-        <w:t xml:space="preserve">FALSE</w:t>
-      </w:r>
-      <w:r>
-        <w:rPr>
-          <w:rStyle w:val="NormalTok"/>
-        </w:rPr>
-        <w:t xml:space="preserve">,</w:t>
-      </w:r>
-      <w:r>
-        <w:br/>
-      </w:r>
-      <w:r>
-        <w:rPr>
-          <w:rStyle w:val="NormalTok"/>
-        </w:rPr>
-        <w:t xml:space="preserve">       </w:t>
-      </w:r>
-      <w:r>
-        <w:rPr>
-          <w:rStyle w:val="AttributeTok"/>
-        </w:rPr>
-        <w:t xml:space="preserve">main =</w:t>
-      </w:r>
-      <w:r>
-        <w:rPr>
-          <w:rStyle w:val="NormalTok"/>
-        </w:rPr>
-        <w:t xml:space="preserve"> </w:t>
-      </w:r>
-      <w:r>
-        <w:rPr>
-          <w:rStyle w:val="FunctionTok"/>
-        </w:rPr>
-        <w:t xml:space="preserve">paste</w:t>
-      </w:r>
-      <w:r>
-        <w:rPr>
-          <w:rStyle w:val="NormalTok"/>
-        </w:rPr>
-        <w:t xml:space="preserve">(</w:t>
-      </w:r>
-      <w:r>
-        <w:rPr>
-          <w:rStyle w:val="StringTok"/>
-        </w:rPr>
-        <w:t xml:space="preserve">"n ="</w:t>
-      </w:r>
-      <w:r>
-        <w:rPr>
-          <w:rStyle w:val="NormalTok"/>
-        </w:rPr>
-        <w:t xml:space="preserve">, sizes[k]), </w:t>
-      </w:r>
-      <w:r>
-        <w:rPr>
-          <w:rStyle w:val="AttributeTok"/>
-        </w:rPr>
-        <w:t xml:space="preserve">xlab =</w:t>
-      </w:r>
-      <w:r>
-        <w:rPr>
-          <w:rStyle w:val="NormalTok"/>
-        </w:rPr>
-        <w:t xml:space="preserve"> </w:t>
-      </w:r>
-      <w:r>
-        <w:rPr>
-          <w:rStyle w:val="StringTok"/>
-        </w:rPr>
-        <w:t xml:space="preserve">"sample mean of horsepower"</w:t>
-      </w:r>
-      <w:r>
-        <w:rPr>
-          <w:rStyle w:val="NormalTok"/>
-        </w:rPr>
-        <w:t xml:space="preserve">)</w:t>
-      </w:r>
-      <w:r>
-        <w:br/>
-      </w:r>
-      <w:r>
-        <w:rPr>
-          <w:rStyle w:val="NormalTok"/>
-        </w:rPr>
-        <w:t xml:space="preserve">  </w:t>
-      </w:r>
-      <w:r>
-        <w:rPr>
-          <w:rStyle w:val="FunctionTok"/>
-        </w:rPr>
-        <w:t xml:space="preserve">curve</w:t>
-      </w:r>
-      <w:r>
-        <w:rPr>
-          <w:rStyle w:val="NormalTok"/>
-        </w:rPr>
-        <w:t xml:space="preserve">(</w:t>
-      </w:r>
-      <w:r>
-        <w:rPr>
-          <w:rStyle w:val="FunctionTok"/>
-        </w:rPr>
-        <w:t xml:space="preserve">dnorm</w:t>
-      </w:r>
-      <w:r>
-        <w:rPr>
-          <w:rStyle w:val="NormalTok"/>
-        </w:rPr>
-        <w:t xml:space="preserve">(x, mu, sigma </w:t>
-      </w:r>
-      <w:r>
-        <w:rPr>
-          <w:rStyle w:val="SpecialCharTok"/>
-        </w:rPr>
-        <w:t xml:space="preserve">/</w:t>
-      </w:r>
-      <w:r>
-        <w:rPr>
-          <w:rStyle w:val="NormalTok"/>
-        </w:rPr>
-        <w:t xml:space="preserve"> </w:t>
-      </w:r>
-      <w:r>
-        <w:rPr>
-          <w:rStyle w:val="FunctionTok"/>
-        </w:rPr>
-        <w:t xml:space="preserve">sqrt</w:t>
-      </w:r>
-      <w:r>
-        <w:rPr>
-          <w:rStyle w:val="NormalTok"/>
-        </w:rPr>
-        <w:t xml:space="preserve">(sizes[k])), </w:t>
-      </w:r>
-      <w:r>
-        <w:rPr>
-          <w:rStyle w:val="AttributeTok"/>
-        </w:rPr>
-        <w:t xml:space="preserve">add =</w:t>
-      </w:r>
-      <w:r>
-        <w:rPr>
-          <w:rStyle w:val="NormalTok"/>
-        </w:rPr>
-        <w:t xml:space="preserve"> </w:t>
-      </w:r>
-      <w:r>
-        <w:rPr>
-          <w:rStyle w:val="ConstantTok"/>
-        </w:rPr>
-        <w:t xml:space="preserve">TRUE</w:t>
-      </w:r>
-      <w:r>
-        <w:rPr>
-          <w:rStyle w:val="NormalTok"/>
-        </w:rPr>
-        <w:t xml:space="preserve">, </w:t>
-      </w:r>
-      <w:r>
-        <w:rPr>
-          <w:rStyle w:val="AttributeTok"/>
-        </w:rPr>
-        <w:t xml:space="preserve">lwd =</w:t>
-      </w:r>
-      <w:r>
-        <w:rPr>
-          <w:rStyle w:val="NormalTok"/>
-        </w:rPr>
-        <w:t xml:space="preserve"> </w:t>
-      </w:r>
-      <w:r>
-        <w:rPr>
-          <w:rStyle w:val="DecValTok"/>
-        </w:rPr>
-        <w:t xml:space="preserve">2</w:t>
-      </w:r>
-      <w:r>
-        <w:rPr>
-          <w:rStyle w:val="NormalTok"/>
-        </w:rPr>
-        <w:t xml:space="preserve">)</w:t>
-      </w:r>
-      <w:r>
-        <w:br/>
-      </w:r>
-      <w:r>
-        <w:rPr>
-          <w:rStyle w:val="NormalTok"/>
-        </w:rPr>
-        <w:t xml:space="preserve">}</w:t>
-      </w:r>
-      <w:r>
-        <w:br/>
-      </w:r>
-      <w:r>
-        <w:rPr>
-          <w:rStyle w:val="FunctionTok"/>
-        </w:rPr>
-        <w:t xml:space="preserve">par</w:t>
-      </w:r>
-      <w:r>
-        <w:rPr>
-          <w:rStyle w:val="NormalTok"/>
-        </w:rPr>
-        <w:t xml:space="preserve">(op)</w:t>
+        <w:t xml:space="preserve">theme_minimal</w:t>
+      </w:r>
+      <w:r>
+        <w:rPr>
+          <w:rStyle w:val="NormalTok"/>
+        </w:rPr>
+        <w:t xml:space="preserve">()</w:t>
       </w:r>
     </w:p>
     <w:tbl>

</xml_diff>

<commit_message>
Deploying to gh-pages from @ Morrison-Lab/pds@29ddc46467de08913169f756ff830aa74ffa2896 🚀
</commit_message>
<xml_diff>
--- a/limit-theorems.docx
+++ b/limit-theorems.docx
@@ -15,7 +15,7 @@
         <w:pStyle w:val="Date"/>
       </w:pPr>
       <w:r>
-        <w:t xml:space="preserve">Last modified: 2026-10-09 10:20:25 (PDT)</w:t>
+        <w:t xml:space="preserve">Last modified: 2026-10-09 11:53:46 (PDT)</w:t>
       </w:r>
     </w:p>
     <w:bookmarkStart w:id="35" w:name="sec-clt"/>
@@ -2946,13 +2946,19 @@
         <w:rPr>
           <w:rStyle w:val="NormalTok"/>
         </w:rPr>
-        <w:t xml:space="preserve">  </w:t>
+        <w:t xml:space="preserve">  tibble</w:t>
+      </w:r>
+      <w:r>
+        <w:rPr>
+          <w:rStyle w:val="SpecialCharTok"/>
+        </w:rPr>
+        <w:t xml:space="preserve">::</w:t>
       </w:r>
       <w:r>
         <w:rPr>
           <w:rStyle w:val="FunctionTok"/>
         </w:rPr>
-        <w:t xml:space="preserve">data.frame</w:t>
+        <w:t xml:space="preserve">tibble</w:t>
       </w:r>
       <w:r>
         <w:rPr>
@@ -6073,13 +6079,19 @@
         <w:rPr>
           <w:rStyle w:val="NormalTok"/>
         </w:rPr>
-        <w:t xml:space="preserve"> </w:t>
+        <w:t xml:space="preserve"> tibble</w:t>
+      </w:r>
+      <w:r>
+        <w:rPr>
+          <w:rStyle w:val="SpecialCharTok"/>
+        </w:rPr>
+        <w:t xml:space="preserve">::</w:t>
       </w:r>
       <w:r>
         <w:rPr>
           <w:rStyle w:val="FunctionTok"/>
         </w:rPr>
-        <w:t xml:space="preserve">data.frame</w:t>
+        <w:t xml:space="preserve">tibble</w:t>
       </w:r>
       <w:r>
         <w:rPr>
@@ -6274,13 +6286,28 @@
         <w:rPr>
           <w:rStyle w:val="FunctionTok"/>
         </w:rPr>
-        <w:t xml:space="preserve">do.call</w:t>
-      </w:r>
-      <w:r>
-        <w:rPr>
-          <w:rStyle w:val="NormalTok"/>
-        </w:rPr>
-        <w:t xml:space="preserve">(rbind, </w:t>
+        <w:t xml:space="preserve">seq_along</w:t>
+      </w:r>
+      <w:r>
+        <w:rPr>
+          <w:rStyle w:val="NormalTok"/>
+        </w:rPr>
+        <w:t xml:space="preserve">(sizes) </w:t>
+      </w:r>
+      <w:r>
+        <w:rPr>
+          <w:rStyle w:val="SpecialCharTok"/>
+        </w:rPr>
+        <w:t xml:space="preserve">|&gt;</w:t>
+      </w:r>
+      <w:r>
+        <w:br/>
+      </w:r>
+      <w:r>
+        <w:rPr>
+          <w:rStyle w:val="NormalTok"/>
+        </w:rPr>
+        <w:t xml:space="preserve">  </w:t>
       </w:r>
       <w:r>
         <w:rPr>
@@ -6296,36 +6323,69 @@
       </w:r>
       <w:r>
         <w:rPr>
+          <w:rStyle w:val="ControlFlowTok"/>
+        </w:rPr>
+        <w:t xml:space="preserve">function</w:t>
+      </w:r>
+      <w:r>
+        <w:rPr>
+          <w:rStyle w:val="NormalTok"/>
+        </w:rPr>
+        <w:t xml:space="preserve">(k) {</w:t>
+      </w:r>
+      <w:r>
+        <w:br/>
+      </w:r>
+      <w:r>
+        <w:rPr>
+          <w:rStyle w:val="NormalTok"/>
+        </w:rPr>
+        <w:t xml:space="preserve">    se </w:t>
+      </w:r>
+      <w:r>
+        <w:rPr>
+          <w:rStyle w:val="OtherTok"/>
+        </w:rPr>
+        <w:t xml:space="preserve">&lt;-</w:t>
+      </w:r>
+      <w:r>
+        <w:rPr>
+          <w:rStyle w:val="NormalTok"/>
+        </w:rPr>
+        <w:t xml:space="preserve"> sigma </w:t>
+      </w:r>
+      <w:r>
+        <w:rPr>
+          <w:rStyle w:val="SpecialCharTok"/>
+        </w:rPr>
+        <w:t xml:space="preserve">/</w:t>
+      </w:r>
+      <w:r>
+        <w:rPr>
+          <w:rStyle w:val="NormalTok"/>
+        </w:rPr>
+        <w:t xml:space="preserve"> </w:t>
+      </w:r>
+      <w:r>
+        <w:rPr>
           <w:rStyle w:val="FunctionTok"/>
         </w:rPr>
-        <w:t xml:space="preserve">seq_along</w:t>
-      </w:r>
-      <w:r>
-        <w:rPr>
-          <w:rStyle w:val="NormalTok"/>
-        </w:rPr>
-        <w:t xml:space="preserve">(sizes), </w:t>
-      </w:r>
-      <w:r>
-        <w:rPr>
-          <w:rStyle w:val="ControlFlowTok"/>
-        </w:rPr>
-        <w:t xml:space="preserve">function</w:t>
-      </w:r>
-      <w:r>
-        <w:rPr>
-          <w:rStyle w:val="NormalTok"/>
-        </w:rPr>
-        <w:t xml:space="preserve">(k) {</w:t>
-      </w:r>
-      <w:r>
-        <w:br/>
-      </w:r>
-      <w:r>
-        <w:rPr>
-          <w:rStyle w:val="NormalTok"/>
-        </w:rPr>
-        <w:t xml:space="preserve">  se </w:t>
+        <w:t xml:space="preserve">sqrt</w:t>
+      </w:r>
+      <w:r>
+        <w:rPr>
+          <w:rStyle w:val="NormalTok"/>
+        </w:rPr>
+        <w:t xml:space="preserve">(sizes[k])</w:t>
+      </w:r>
+      <w:r>
+        <w:br/>
+      </w:r>
+      <w:r>
+        <w:rPr>
+          <w:rStyle w:val="NormalTok"/>
+        </w:rPr>
+        <w:t xml:space="preserve">    grid </w:t>
       </w:r>
       <w:r>
         <w:rPr>
@@ -6337,46 +6397,157 @@
         <w:rPr>
           <w:rStyle w:val="NormalTok"/>
         </w:rPr>
-        <w:t xml:space="preserve"> sigma </w:t>
+        <w:t xml:space="preserve"> </w:t>
+      </w:r>
+      <w:r>
+        <w:rPr>
+          <w:rStyle w:val="FunctionTok"/>
+        </w:rPr>
+        <w:t xml:space="preserve">seq</w:t>
+      </w:r>
+      <w:r>
+        <w:rPr>
+          <w:rStyle w:val="NormalTok"/>
+        </w:rPr>
+        <w:t xml:space="preserve">(mu </w:t>
       </w:r>
       <w:r>
         <w:rPr>
           <w:rStyle w:val="SpecialCharTok"/>
         </w:rPr>
-        <w:t xml:space="preserve">/</w:t>
-      </w:r>
-      <w:r>
-        <w:rPr>
-          <w:rStyle w:val="NormalTok"/>
-        </w:rPr>
-        <w:t xml:space="preserve"> </w:t>
+        <w:t xml:space="preserve">-</w:t>
+      </w:r>
+      <w:r>
+        <w:rPr>
+          <w:rStyle w:val="NormalTok"/>
+        </w:rPr>
+        <w:t xml:space="preserve"> </w:t>
+      </w:r>
+      <w:r>
+        <w:rPr>
+          <w:rStyle w:val="DecValTok"/>
+        </w:rPr>
+        <w:t xml:space="preserve">4</w:t>
+      </w:r>
+      <w:r>
+        <w:rPr>
+          <w:rStyle w:val="NormalTok"/>
+        </w:rPr>
+        <w:t xml:space="preserve"> </w:t>
+      </w:r>
+      <w:r>
+        <w:rPr>
+          <w:rStyle w:val="SpecialCharTok"/>
+        </w:rPr>
+        <w:t xml:space="preserve">*</w:t>
+      </w:r>
+      <w:r>
+        <w:rPr>
+          <w:rStyle w:val="NormalTok"/>
+        </w:rPr>
+        <w:t xml:space="preserve"> se, mu </w:t>
+      </w:r>
+      <w:r>
+        <w:rPr>
+          <w:rStyle w:val="SpecialCharTok"/>
+        </w:rPr>
+        <w:t xml:space="preserve">+</w:t>
+      </w:r>
+      <w:r>
+        <w:rPr>
+          <w:rStyle w:val="NormalTok"/>
+        </w:rPr>
+        <w:t xml:space="preserve"> </w:t>
+      </w:r>
+      <w:r>
+        <w:rPr>
+          <w:rStyle w:val="DecValTok"/>
+        </w:rPr>
+        <w:t xml:space="preserve">4</w:t>
+      </w:r>
+      <w:r>
+        <w:rPr>
+          <w:rStyle w:val="NormalTok"/>
+        </w:rPr>
+        <w:t xml:space="preserve"> </w:t>
+      </w:r>
+      <w:r>
+        <w:rPr>
+          <w:rStyle w:val="SpecialCharTok"/>
+        </w:rPr>
+        <w:t xml:space="preserve">*</w:t>
+      </w:r>
+      <w:r>
+        <w:rPr>
+          <w:rStyle w:val="NormalTok"/>
+        </w:rPr>
+        <w:t xml:space="preserve"> se, </w:t>
+      </w:r>
+      <w:r>
+        <w:rPr>
+          <w:rStyle w:val="AttributeTok"/>
+        </w:rPr>
+        <w:t xml:space="preserve">length.out =</w:t>
+      </w:r>
+      <w:r>
+        <w:rPr>
+          <w:rStyle w:val="NormalTok"/>
+        </w:rPr>
+        <w:t xml:space="preserve"> </w:t>
+      </w:r>
+      <w:r>
+        <w:rPr>
+          <w:rStyle w:val="DecValTok"/>
+        </w:rPr>
+        <w:t xml:space="preserve">200</w:t>
+      </w:r>
+      <w:r>
+        <w:rPr>
+          <w:rStyle w:val="NormalTok"/>
+        </w:rPr>
+        <w:t xml:space="preserve">)</w:t>
+      </w:r>
+      <w:r>
+        <w:br/>
+      </w:r>
+      <w:r>
+        <w:rPr>
+          <w:rStyle w:val="NormalTok"/>
+        </w:rPr>
+        <w:t xml:space="preserve">    tibble</w:t>
+      </w:r>
+      <w:r>
+        <w:rPr>
+          <w:rStyle w:val="SpecialCharTok"/>
+        </w:rPr>
+        <w:t xml:space="preserve">::</w:t>
       </w:r>
       <w:r>
         <w:rPr>
           <w:rStyle w:val="FunctionTok"/>
         </w:rPr>
-        <w:t xml:space="preserve">sqrt</w:t>
-      </w:r>
-      <w:r>
-        <w:rPr>
-          <w:rStyle w:val="NormalTok"/>
-        </w:rPr>
-        <w:t xml:space="preserve">(sizes[k])</w:t>
-      </w:r>
-      <w:r>
-        <w:br/>
-      </w:r>
-      <w:r>
-        <w:rPr>
-          <w:rStyle w:val="NormalTok"/>
-        </w:rPr>
-        <w:t xml:space="preserve">  grid </w:t>
-      </w:r>
-      <w:r>
-        <w:rPr>
-          <w:rStyle w:val="OtherTok"/>
-        </w:rPr>
-        <w:t xml:space="preserve">&lt;-</w:t>
+        <w:t xml:space="preserve">tibble</w:t>
+      </w:r>
+      <w:r>
+        <w:rPr>
+          <w:rStyle w:val="NormalTok"/>
+        </w:rPr>
+        <w:t xml:space="preserve">(</w:t>
+      </w:r>
+      <w:r>
+        <w:br/>
+      </w:r>
+      <w:r>
+        <w:rPr>
+          <w:rStyle w:val="NormalTok"/>
+        </w:rPr>
+        <w:t xml:space="preserve">      </w:t>
+      </w:r>
+      <w:r>
+        <w:rPr>
+          <w:rStyle w:val="AttributeTok"/>
+        </w:rPr>
+        <w:t xml:space="preserve">n =</w:t>
       </w:r>
       <w:r>
         <w:rPr>
@@ -6388,247 +6559,130 @@
         <w:rPr>
           <w:rStyle w:val="FunctionTok"/>
         </w:rPr>
-        <w:t xml:space="preserve">seq</w:t>
-      </w:r>
-      <w:r>
-        <w:rPr>
-          <w:rStyle w:val="NormalTok"/>
-        </w:rPr>
-        <w:t xml:space="preserve">(mu </w:t>
+        <w:t xml:space="preserve">factor</w:t>
+      </w:r>
+      <w:r>
+        <w:rPr>
+          <w:rStyle w:val="NormalTok"/>
+        </w:rPr>
+        <w:t xml:space="preserve">(n_labels[k], </w:t>
+      </w:r>
+      <w:r>
+        <w:rPr>
+          <w:rStyle w:val="AttributeTok"/>
+        </w:rPr>
+        <w:t xml:space="preserve">levels =</w:t>
+      </w:r>
+      <w:r>
+        <w:rPr>
+          <w:rStyle w:val="NormalTok"/>
+        </w:rPr>
+        <w:t xml:space="preserve"> n_labels),</w:t>
+      </w:r>
+      <w:r>
+        <w:br/>
+      </w:r>
+      <w:r>
+        <w:rPr>
+          <w:rStyle w:val="NormalTok"/>
+        </w:rPr>
+        <w:t xml:space="preserve">      </w:t>
+      </w:r>
+      <w:r>
+        <w:rPr>
+          <w:rStyle w:val="AttributeTok"/>
+        </w:rPr>
+        <w:t xml:space="preserve">sample_mean =</w:t>
+      </w:r>
+      <w:r>
+        <w:rPr>
+          <w:rStyle w:val="NormalTok"/>
+        </w:rPr>
+        <w:t xml:space="preserve"> grid,</w:t>
+      </w:r>
+      <w:r>
+        <w:br/>
+      </w:r>
+      <w:r>
+        <w:rPr>
+          <w:rStyle w:val="NormalTok"/>
+        </w:rPr>
+        <w:t xml:space="preserve">      </w:t>
+      </w:r>
+      <w:r>
+        <w:rPr>
+          <w:rStyle w:val="AttributeTok"/>
+        </w:rPr>
+        <w:t xml:space="preserve">density =</w:t>
+      </w:r>
+      <w:r>
+        <w:rPr>
+          <w:rStyle w:val="NormalTok"/>
+        </w:rPr>
+        <w:t xml:space="preserve"> </w:t>
+      </w:r>
+      <w:r>
+        <w:rPr>
+          <w:rStyle w:val="FunctionTok"/>
+        </w:rPr>
+        <w:t xml:space="preserve">dnorm</w:t>
+      </w:r>
+      <w:r>
+        <w:rPr>
+          <w:rStyle w:val="NormalTok"/>
+        </w:rPr>
+        <w:t xml:space="preserve">(grid, mu, se)</w:t>
+      </w:r>
+      <w:r>
+        <w:br/>
+      </w:r>
+      <w:r>
+        <w:rPr>
+          <w:rStyle w:val="NormalTok"/>
+        </w:rPr>
+        <w:t xml:space="preserve">    )</w:t>
+      </w:r>
+      <w:r>
+        <w:br/>
+      </w:r>
+      <w:r>
+        <w:rPr>
+          <w:rStyle w:val="NormalTok"/>
+        </w:rPr>
+        <w:t xml:space="preserve">  }) </w:t>
       </w:r>
       <w:r>
         <w:rPr>
           <w:rStyle w:val="SpecialCharTok"/>
         </w:rPr>
-        <w:t xml:space="preserve">-</w:t>
-      </w:r>
-      <w:r>
-        <w:rPr>
-          <w:rStyle w:val="NormalTok"/>
-        </w:rPr>
-        <w:t xml:space="preserve"> </w:t>
-      </w:r>
-      <w:r>
-        <w:rPr>
-          <w:rStyle w:val="DecValTok"/>
-        </w:rPr>
-        <w:t xml:space="preserve">4</w:t>
-      </w:r>
-      <w:r>
-        <w:rPr>
-          <w:rStyle w:val="NormalTok"/>
-        </w:rPr>
-        <w:t xml:space="preserve"> </w:t>
+        <w:t xml:space="preserve">|&gt;</w:t>
+      </w:r>
+      <w:r>
+        <w:br/>
+      </w:r>
+      <w:r>
+        <w:rPr>
+          <w:rStyle w:val="NormalTok"/>
+        </w:rPr>
+        <w:t xml:space="preserve">  dplyr</w:t>
       </w:r>
       <w:r>
         <w:rPr>
           <w:rStyle w:val="SpecialCharTok"/>
         </w:rPr>
-        <w:t xml:space="preserve">*</w:t>
-      </w:r>
-      <w:r>
-        <w:rPr>
-          <w:rStyle w:val="NormalTok"/>
-        </w:rPr>
-        <w:t xml:space="preserve"> se, mu </w:t>
-      </w:r>
-      <w:r>
-        <w:rPr>
-          <w:rStyle w:val="SpecialCharTok"/>
-        </w:rPr>
-        <w:t xml:space="preserve">+</w:t>
-      </w:r>
-      <w:r>
-        <w:rPr>
-          <w:rStyle w:val="NormalTok"/>
-        </w:rPr>
-        <w:t xml:space="preserve"> </w:t>
-      </w:r>
-      <w:r>
-        <w:rPr>
-          <w:rStyle w:val="DecValTok"/>
-        </w:rPr>
-        <w:t xml:space="preserve">4</w:t>
-      </w:r>
-      <w:r>
-        <w:rPr>
-          <w:rStyle w:val="NormalTok"/>
-        </w:rPr>
-        <w:t xml:space="preserve"> </w:t>
-      </w:r>
-      <w:r>
-        <w:rPr>
-          <w:rStyle w:val="SpecialCharTok"/>
-        </w:rPr>
-        <w:t xml:space="preserve">*</w:t>
-      </w:r>
-      <w:r>
-        <w:rPr>
-          <w:rStyle w:val="NormalTok"/>
-        </w:rPr>
-        <w:t xml:space="preserve"> se, </w:t>
-      </w:r>
-      <w:r>
-        <w:rPr>
-          <w:rStyle w:val="AttributeTok"/>
-        </w:rPr>
-        <w:t xml:space="preserve">length.out =</w:t>
-      </w:r>
-      <w:r>
-        <w:rPr>
-          <w:rStyle w:val="NormalTok"/>
-        </w:rPr>
-        <w:t xml:space="preserve"> </w:t>
-      </w:r>
-      <w:r>
-        <w:rPr>
-          <w:rStyle w:val="DecValTok"/>
-        </w:rPr>
-        <w:t xml:space="preserve">200</w:t>
-      </w:r>
-      <w:r>
-        <w:rPr>
-          <w:rStyle w:val="NormalTok"/>
-        </w:rPr>
-        <w:t xml:space="preserve">)</w:t>
-      </w:r>
-      <w:r>
-        <w:br/>
-      </w:r>
-      <w:r>
-        <w:rPr>
-          <w:rStyle w:val="NormalTok"/>
-        </w:rPr>
-        <w:t xml:space="preserve">  </w:t>
+        <w:t xml:space="preserve">::</w:t>
       </w:r>
       <w:r>
         <w:rPr>
           <w:rStyle w:val="FunctionTok"/>
         </w:rPr>
-        <w:t xml:space="preserve">data.frame</w:t>
-      </w:r>
-      <w:r>
-        <w:rPr>
-          <w:rStyle w:val="NormalTok"/>
-        </w:rPr>
-        <w:t xml:space="preserve">(</w:t>
-      </w:r>
-      <w:r>
-        <w:br/>
-      </w:r>
-      <w:r>
-        <w:rPr>
-          <w:rStyle w:val="NormalTok"/>
-        </w:rPr>
-        <w:t xml:space="preserve">    </w:t>
-      </w:r>
-      <w:r>
-        <w:rPr>
-          <w:rStyle w:val="AttributeTok"/>
-        </w:rPr>
-        <w:t xml:space="preserve">n =</w:t>
-      </w:r>
-      <w:r>
-        <w:rPr>
-          <w:rStyle w:val="NormalTok"/>
-        </w:rPr>
-        <w:t xml:space="preserve"> </w:t>
-      </w:r>
-      <w:r>
-        <w:rPr>
-          <w:rStyle w:val="FunctionTok"/>
-        </w:rPr>
-        <w:t xml:space="preserve">factor</w:t>
-      </w:r>
-      <w:r>
-        <w:rPr>
-          <w:rStyle w:val="NormalTok"/>
-        </w:rPr>
-        <w:t xml:space="preserve">(n_labels[k], </w:t>
-      </w:r>
-      <w:r>
-        <w:rPr>
-          <w:rStyle w:val="AttributeTok"/>
-        </w:rPr>
-        <w:t xml:space="preserve">levels =</w:t>
-      </w:r>
-      <w:r>
-        <w:rPr>
-          <w:rStyle w:val="NormalTok"/>
-        </w:rPr>
-        <w:t xml:space="preserve"> n_labels),</w:t>
-      </w:r>
-      <w:r>
-        <w:br/>
-      </w:r>
-      <w:r>
-        <w:rPr>
-          <w:rStyle w:val="NormalTok"/>
-        </w:rPr>
-        <w:t xml:space="preserve">    </w:t>
-      </w:r>
-      <w:r>
-        <w:rPr>
-          <w:rStyle w:val="AttributeTok"/>
-        </w:rPr>
-        <w:t xml:space="preserve">sample_mean =</w:t>
-      </w:r>
-      <w:r>
-        <w:rPr>
-          <w:rStyle w:val="NormalTok"/>
-        </w:rPr>
-        <w:t xml:space="preserve"> grid,</w:t>
-      </w:r>
-      <w:r>
-        <w:br/>
-      </w:r>
-      <w:r>
-        <w:rPr>
-          <w:rStyle w:val="NormalTok"/>
-        </w:rPr>
-        <w:t xml:space="preserve">    </w:t>
-      </w:r>
-      <w:r>
-        <w:rPr>
-          <w:rStyle w:val="AttributeTok"/>
-        </w:rPr>
-        <w:t xml:space="preserve">density =</w:t>
-      </w:r>
-      <w:r>
-        <w:rPr>
-          <w:rStyle w:val="NormalTok"/>
-        </w:rPr>
-        <w:t xml:space="preserve"> </w:t>
-      </w:r>
-      <w:r>
-        <w:rPr>
-          <w:rStyle w:val="FunctionTok"/>
-        </w:rPr>
-        <w:t xml:space="preserve">dnorm</w:t>
-      </w:r>
-      <w:r>
-        <w:rPr>
-          <w:rStyle w:val="NormalTok"/>
-        </w:rPr>
-        <w:t xml:space="preserve">(grid, mu, se)</w:t>
-      </w:r>
-      <w:r>
-        <w:br/>
-      </w:r>
-      <w:r>
-        <w:rPr>
-          <w:rStyle w:val="NormalTok"/>
-        </w:rPr>
-        <w:t xml:space="preserve">  )</w:t>
-      </w:r>
-      <w:r>
-        <w:br/>
-      </w:r>
-      <w:r>
-        <w:rPr>
-          <w:rStyle w:val="NormalTok"/>
-        </w:rPr>
-        <w:t xml:space="preserve">}))</w:t>
+        <w:t xml:space="preserve">bind_rows</w:t>
+      </w:r>
+      <w:r>
+        <w:rPr>
+          <w:rStyle w:val="NormalTok"/>
+        </w:rPr>
+        <w:t xml:space="preserve">()</w:t>
       </w:r>
       <w:r>
         <w:br/>

</xml_diff>

<commit_message>
Deploying to gh-pages from @ Morrison-Lab/pds@3d89e26612e891c9642949ccf52b226a9763da0a 🚀
</commit_message>
<xml_diff>
--- a/limit-theorems.docx
+++ b/limit-theorems.docx
@@ -15,7 +15,7 @@
         <w:pStyle w:val="Date"/>
       </w:pPr>
       <w:r>
-        <w:t xml:space="preserve">Last modified: 2026-10-13 14:27:07 (PDT)</w:t>
+        <w:t xml:space="preserve">Last modified: 2026-10-13 14:34:30 (PDT)</w:t>
       </w:r>
     </w:p>
     <w:bookmarkStart w:id="37" w:name="sec-clt"/>
@@ -7617,17 +7617,4250 @@
       </w:r>
     </w:p>
     <w:bookmarkEnd w:id="37"/>
-    <w:bookmarkStart w:id="42" w:name="references"/>
+    <w:bookmarkStart w:id="43" w:name="sec-tail-bounds"/>
     <w:p>
       <w:pPr>
         <w:pStyle w:val="Heading2"/>
       </w:pPr>
       <w:r>
+        <w:t xml:space="preserve">2 Tail bounds</w:t>
+      </w:r>
+    </w:p>
+    <w:bookmarkStart w:id="38" w:name="thm-markov"/>
+    <w:p>
+      <w:pPr>
+        <w:pStyle w:val="FirstParagraph"/>
+      </w:pPr>
+      <w:r>
+        <w:rPr>
+          <w:b/>
+          <w:bCs/>
+        </w:rPr>
+        <w:t xml:space="preserve">Theorem 2 (Markov’s inequality)</w:t>
+      </w:r>
+      <w:r>
+        <w:t xml:space="preserve"> </w:t>
+      </w:r>
+      <w:r>
+        <w:t xml:space="preserve">Let</w:t>
+      </w:r>
+      <w:r>
+        <w:t xml:space="preserve"> </w:t>
+      </w:r>
+      <m:oMath>
+        <m:r>
+          <m:t>X</m:t>
+        </m:r>
+      </m:oMath>
+      <w:r>
+        <w:t xml:space="preserve"> </w:t>
+      </w:r>
+      <w:r>
+        <w:t xml:space="preserve">be a random variable with</w:t>
+      </w:r>
+      <w:r>
+        <w:t xml:space="preserve"> </w:t>
+      </w:r>
+      <m:oMath>
+        <m:r>
+          <m:t>X</m:t>
+        </m:r>
+        <m:r>
+          <m:rPr>
+            <m:sty m:val="p"/>
+          </m:rPr>
+          <m:t>≥</m:t>
+        </m:r>
+        <m:r>
+          <m:t>0</m:t>
+        </m:r>
+      </m:oMath>
+      <w:r>
+        <w:t xml:space="preserve"> </w:t>
+      </w:r>
+      <w:r>
+        <w:t xml:space="preserve">and</w:t>
+      </w:r>
+      <w:r>
+        <w:t xml:space="preserve"> </w:t>
+      </w:r>
+      <m:oMath>
+        <m:r>
+          <m:rPr>
+            <m:sty m:val="p"/>
+          </m:rPr>
+          <m:t>E</m:t>
+        </m:r>
+        <m:r>
+          <m:t>​</m:t>
+        </m:r>
+        <m:d>
+          <m:dPr>
+            <m:begChr m:val="["/>
+            <m:sepChr m:val=""/>
+            <m:endChr m:val="]"/>
+            <m:grow/>
+          </m:dPr>
+          <m:e>
+            <m:r>
+              <m:t>X</m:t>
+            </m:r>
+          </m:e>
+        </m:d>
+        <m:r>
+          <m:t>​</m:t>
+        </m:r>
+        <m:r>
+          <m:rPr>
+            <m:sty m:val="p"/>
+          </m:rPr>
+          <m:t>&lt;</m:t>
+        </m:r>
+        <m:r>
+          <m:rPr>
+            <m:sty m:val="p"/>
+          </m:rPr>
+          <m:t>∞</m:t>
+        </m:r>
+      </m:oMath>
+      <w:r>
+        <w:t xml:space="preserve">.</w:t>
+      </w:r>
+      <w:r>
+        <w:t xml:space="preserve"> </w:t>
+      </w:r>
+      <w:r>
+        <w:t xml:space="preserve">Then for every</w:t>
+      </w:r>
+      <w:r>
+        <w:t xml:space="preserve"> </w:t>
+      </w:r>
+      <m:oMath>
+        <m:r>
+          <m:t>a</m:t>
+        </m:r>
+        <m:r>
+          <m:rPr>
+            <m:sty m:val="p"/>
+          </m:rPr>
+          <m:t>&gt;</m:t>
+        </m:r>
+        <m:r>
+          <m:t>0</m:t>
+        </m:r>
+      </m:oMath>
+      <w:r>
+        <w:t xml:space="preserve">:</w:t>
+      </w:r>
+    </w:p>
+    <w:p>
+      <w:pPr>
+        <w:pStyle w:val="BodyText"/>
+      </w:pPr>
+      <m:oMathPara>
+        <m:oMathParaPr>
+          <m:jc m:val="center"/>
+        </m:oMathParaPr>
+        <m:oMath>
+          <m:r>
+            <m:rPr>
+              <m:sty m:val="p"/>
+            </m:rPr>
+            <m:t>Pr</m:t>
+          </m:r>
+          <m:r>
+            <m:t>​</m:t>
+          </m:r>
+          <m:d>
+            <m:dPr>
+              <m:begChr m:val="("/>
+              <m:sepChr m:val=""/>
+              <m:endChr m:val=")"/>
+              <m:grow/>
+            </m:dPr>
+            <m:e>
+              <m:r>
+                <m:t>X</m:t>
+              </m:r>
+              <m:r>
+                <m:rPr>
+                  <m:sty m:val="p"/>
+                </m:rPr>
+                <m:t>≥</m:t>
+              </m:r>
+              <m:r>
+                <m:t>a</m:t>
+              </m:r>
+            </m:e>
+          </m:d>
+          <m:r>
+            <m:t>​</m:t>
+          </m:r>
+          <m:r>
+            <m:rPr>
+              <m:sty m:val="p"/>
+            </m:rPr>
+            <m:t>≤</m:t>
+          </m:r>
+          <m:f>
+            <m:fPr>
+              <m:type m:val="bar"/>
+            </m:fPr>
+            <m:num>
+              <m:r>
+                <m:rPr>
+                  <m:sty m:val="p"/>
+                </m:rPr>
+                <m:t>E</m:t>
+              </m:r>
+              <m:r>
+                <m:t>​</m:t>
+              </m:r>
+              <m:d>
+                <m:dPr>
+                  <m:begChr m:val="["/>
+                  <m:sepChr m:val=""/>
+                  <m:endChr m:val="]"/>
+                  <m:grow/>
+                </m:dPr>
+                <m:e>
+                  <m:r>
+                    <m:t>X</m:t>
+                  </m:r>
+                </m:e>
+              </m:d>
+              <m:r>
+                <m:t>​</m:t>
+              </m:r>
+            </m:num>
+            <m:den>
+              <m:r>
+                <m:t>a</m:t>
+              </m:r>
+            </m:den>
+          </m:f>
+        </m:oMath>
+      </m:oMathPara>
+    </w:p>
+    <w:bookmarkEnd w:id="38"/>
+    <w:p>
+      <w:pPr>
+        <w:pStyle w:val="FirstParagraph"/>
+      </w:pPr>
+      <w:r>
+        <w:rPr>
+          <w:i/>
+          <w:iCs/>
+        </w:rPr>
+        <w:t xml:space="preserve">Proof</w:t>
+      </w:r>
+      <w:r>
+        <w:t xml:space="preserve">. </w:t>
+      </w:r>
+      <w:r>
+        <w:t xml:space="preserve">Because</w:t>
+      </w:r>
+      <w:r>
+        <w:t xml:space="preserve"> </w:t>
+      </w:r>
+      <m:oMath>
+        <m:r>
+          <m:t>X</m:t>
+        </m:r>
+        <m:r>
+          <m:rPr>
+            <m:sty m:val="p"/>
+          </m:rPr>
+          <m:t>≥</m:t>
+        </m:r>
+        <m:r>
+          <m:t>0</m:t>
+        </m:r>
+      </m:oMath>
+      <w:r>
+        <w:t xml:space="preserve">, every outcome satisfies</w:t>
+      </w:r>
+      <w:r>
+        <w:t xml:space="preserve"> </w:t>
+      </w:r>
+      <m:oMath>
+        <m:r>
+          <m:t>X</m:t>
+        </m:r>
+        <m:r>
+          <m:rPr>
+            <m:sty m:val="p"/>
+          </m:rPr>
+          <m:t>≥</m:t>
+        </m:r>
+        <m:r>
+          <m:t>a</m:t>
+        </m:r>
+        <m:r>
+          <m:rPr>
+            <m:sty m:val="p"/>
+          </m:rPr>
+          <m:t>⋅</m:t>
+        </m:r>
+        <m:sSub>
+          <m:e>
+            <m:r>
+              <m:rPr>
+                <m:scr m:val="double-struck"/>
+                <m:sty m:val="p"/>
+              </m:rPr>
+              <m:t>1</m:t>
+            </m:r>
+          </m:e>
+          <m:sub>
+            <m:r>
+              <m:t>​</m:t>
+            </m:r>
+            <m:d>
+              <m:dPr>
+                <m:begChr m:val="{"/>
+                <m:sepChr m:val=""/>
+                <m:endChr m:val="}"/>
+                <m:grow/>
+              </m:dPr>
+              <m:e>
+                <m:r>
+                  <m:t>X</m:t>
+                </m:r>
+                <m:r>
+                  <m:rPr>
+                    <m:sty m:val="p"/>
+                  </m:rPr>
+                  <m:t>≥</m:t>
+                </m:r>
+                <m:r>
+                  <m:t>a</m:t>
+                </m:r>
+              </m:e>
+            </m:d>
+            <m:r>
+              <m:t>​</m:t>
+            </m:r>
+          </m:sub>
+        </m:sSub>
+      </m:oMath>
+      <w:r>
+        <w:t xml:space="preserve">:</w:t>
+      </w:r>
+      <w:r>
+        <w:t xml:space="preserve"> </w:t>
+      </w:r>
+      <w:r>
+        <w:t xml:space="preserve">when</w:t>
+      </w:r>
+      <w:r>
+        <w:t xml:space="preserve"> </w:t>
+      </w:r>
+      <m:oMath>
+        <m:r>
+          <m:t>X</m:t>
+        </m:r>
+        <m:r>
+          <m:rPr>
+            <m:sty m:val="p"/>
+          </m:rPr>
+          <m:t>≥</m:t>
+        </m:r>
+        <m:r>
+          <m:t>a</m:t>
+        </m:r>
+      </m:oMath>
+      <w:r>
+        <w:t xml:space="preserve"> </w:t>
+      </w:r>
+      <w:r>
+        <w:t xml:space="preserve">the right side is</w:t>
+      </w:r>
+      <w:r>
+        <w:t xml:space="preserve"> </w:t>
+      </w:r>
+      <m:oMath>
+        <m:r>
+          <m:t>a</m:t>
+        </m:r>
+        <m:r>
+          <m:rPr>
+            <m:sty m:val="p"/>
+          </m:rPr>
+          <m:t>≤</m:t>
+        </m:r>
+        <m:r>
+          <m:t>X</m:t>
+        </m:r>
+      </m:oMath>
+      <w:r>
+        <w:t xml:space="preserve">, and otherwise it is</w:t>
+      </w:r>
+      <w:r>
+        <w:t xml:space="preserve"> </w:t>
+      </w:r>
+      <m:oMath>
+        <m:r>
+          <m:t>0</m:t>
+        </m:r>
+        <m:r>
+          <m:rPr>
+            <m:sty m:val="p"/>
+          </m:rPr>
+          <m:t>≤</m:t>
+        </m:r>
+        <m:r>
+          <m:t>X</m:t>
+        </m:r>
+      </m:oMath>
+      <w:r>
+        <w:t xml:space="preserve">.</w:t>
+      </w:r>
+      <w:r>
+        <w:t xml:space="preserve"> </w:t>
+      </w:r>
+      <w:r>
+        <w:t xml:space="preserve">The expectation of a nonnegative random variable is nonnegative,</w:t>
+      </w:r>
+      <w:r>
+        <w:t xml:space="preserve"> </w:t>
+      </w:r>
+      <w:r>
+        <w:t xml:space="preserve">so by</w:t>
+      </w:r>
+      <w:r>
+        <w:t xml:space="preserve"> </w:t>
+      </w:r>
+      <w:hyperlink r:id="rId13">
+        <w:r>
+          <w:rPr>
+            <w:rStyle w:val="Hyperlink"/>
+          </w:rPr>
+          <w:t xml:space="preserve">linearity of expectation</w:t>
+        </w:r>
+      </w:hyperlink>
+      <w:r>
+        <w:t xml:space="preserve">,</w:t>
+      </w:r>
+      <w:r>
+        <w:t xml:space="preserve"> </w:t>
+      </w:r>
+      <w:r>
+        <w:t xml:space="preserve">and because the expectation of an indicator is the probability of its event,</w:t>
+      </w:r>
+    </w:p>
+    <w:p>
+      <w:pPr>
+        <w:pStyle w:val="BodyText"/>
+      </w:pPr>
+      <m:oMathPara>
+        <m:oMathParaPr>
+          <m:jc m:val="center"/>
+        </m:oMathParaPr>
+        <m:oMath>
+          <m:r>
+            <m:rPr>
+              <m:sty m:val="p"/>
+            </m:rPr>
+            <m:t>E</m:t>
+          </m:r>
+          <m:r>
+            <m:t>​</m:t>
+          </m:r>
+          <m:d>
+            <m:dPr>
+              <m:begChr m:val="["/>
+              <m:sepChr m:val=""/>
+              <m:endChr m:val="]"/>
+              <m:grow/>
+            </m:dPr>
+            <m:e>
+              <m:r>
+                <m:t>X</m:t>
+              </m:r>
+            </m:e>
+          </m:d>
+          <m:r>
+            <m:t>​</m:t>
+          </m:r>
+          <m:r>
+            <m:rPr>
+              <m:sty m:val="p"/>
+            </m:rPr>
+            <m:t>−</m:t>
+          </m:r>
+          <m:r>
+            <m:t>a</m:t>
+          </m:r>
+          <m:r>
+            <m:rPr>
+              <m:sty m:val="p"/>
+            </m:rPr>
+            <m:t>⋅</m:t>
+          </m:r>
+          <m:r>
+            <m:rPr>
+              <m:sty m:val="p"/>
+            </m:rPr>
+            <m:t>Pr</m:t>
+          </m:r>
+          <m:r>
+            <m:t>​</m:t>
+          </m:r>
+          <m:d>
+            <m:dPr>
+              <m:begChr m:val="("/>
+              <m:sepChr m:val=""/>
+              <m:endChr m:val=")"/>
+              <m:grow/>
+            </m:dPr>
+            <m:e>
+              <m:r>
+                <m:t>X</m:t>
+              </m:r>
+              <m:r>
+                <m:rPr>
+                  <m:sty m:val="p"/>
+                </m:rPr>
+                <m:t>≥</m:t>
+              </m:r>
+              <m:r>
+                <m:t>a</m:t>
+              </m:r>
+            </m:e>
+          </m:d>
+          <m:r>
+            <m:t>​</m:t>
+          </m:r>
+          <m:r>
+            <m:rPr>
+              <m:sty m:val="p"/>
+            </m:rPr>
+            <m:t>=</m:t>
+          </m:r>
+          <m:r>
+            <m:rPr>
+              <m:sty m:val="p"/>
+            </m:rPr>
+            <m:t>E</m:t>
+          </m:r>
+          <m:r>
+            <m:t>​</m:t>
+          </m:r>
+          <m:d>
+            <m:dPr>
+              <m:begChr m:val="["/>
+              <m:sepChr m:val=""/>
+              <m:endChr m:val="]"/>
+              <m:grow/>
+            </m:dPr>
+            <m:e>
+              <m:r>
+                <m:t>X</m:t>
+              </m:r>
+              <m:r>
+                <m:rPr>
+                  <m:sty m:val="p"/>
+                </m:rPr>
+                <m:t>−</m:t>
+              </m:r>
+              <m:r>
+                <m:t>a</m:t>
+              </m:r>
+              <m:r>
+                <m:rPr>
+                  <m:sty m:val="p"/>
+                </m:rPr>
+                <m:t>⋅</m:t>
+              </m:r>
+              <m:sSub>
+                <m:e>
+                  <m:r>
+                    <m:rPr>
+                      <m:scr m:val="double-struck"/>
+                      <m:sty m:val="p"/>
+                    </m:rPr>
+                    <m:t>1</m:t>
+                  </m:r>
+                </m:e>
+                <m:sub>
+                  <m:r>
+                    <m:t>​</m:t>
+                  </m:r>
+                  <m:d>
+                    <m:dPr>
+                      <m:begChr m:val="{"/>
+                      <m:sepChr m:val=""/>
+                      <m:endChr m:val="}"/>
+                      <m:grow/>
+                    </m:dPr>
+                    <m:e>
+                      <m:r>
+                        <m:t>X</m:t>
+                      </m:r>
+                      <m:r>
+                        <m:rPr>
+                          <m:sty m:val="p"/>
+                        </m:rPr>
+                        <m:t>≥</m:t>
+                      </m:r>
+                      <m:r>
+                        <m:t>a</m:t>
+                      </m:r>
+                    </m:e>
+                  </m:d>
+                  <m:r>
+                    <m:t>​</m:t>
+                  </m:r>
+                </m:sub>
+              </m:sSub>
+            </m:e>
+          </m:d>
+          <m:r>
+            <m:t>​</m:t>
+          </m:r>
+          <m:r>
+            <m:rPr>
+              <m:sty m:val="p"/>
+            </m:rPr>
+            <m:t>≥</m:t>
+          </m:r>
+          <m:r>
+            <m:t>0</m:t>
+          </m:r>
+        </m:oMath>
+      </m:oMathPara>
+    </w:p>
+    <w:p>
+      <w:pPr>
+        <w:pStyle w:val="FirstParagraph"/>
+      </w:pPr>
+      <w:r>
+        <w:t xml:space="preserve">and dividing by</w:t>
+      </w:r>
+      <w:r>
+        <w:t xml:space="preserve"> </w:t>
+      </w:r>
+      <m:oMath>
+        <m:r>
+          <m:t>a</m:t>
+        </m:r>
+        <m:r>
+          <m:rPr>
+            <m:sty m:val="p"/>
+          </m:rPr>
+          <m:t>&gt;</m:t>
+        </m:r>
+        <m:r>
+          <m:t>0</m:t>
+        </m:r>
+      </m:oMath>
+      <w:r>
+        <w:t xml:space="preserve"> </w:t>
+      </w:r>
+      <w:r>
+        <w:t xml:space="preserve">gives the claim.</w:t>
+      </w:r>
+    </w:p>
+    <w:bookmarkStart w:id="39" w:name="thm-chebyshev"/>
+    <w:p>
+      <w:pPr>
+        <w:pStyle w:val="BodyText"/>
+      </w:pPr>
+      <w:r>
+        <w:rPr>
+          <w:b/>
+          <w:bCs/>
+        </w:rPr>
+        <w:t xml:space="preserve">Theorem 3 (Chebyshev’s inequality)</w:t>
+      </w:r>
+      <w:r>
+        <w:t xml:space="preserve"> </w:t>
+      </w:r>
+      <w:r>
+        <w:t xml:space="preserve">Let</w:t>
+      </w:r>
+      <w:r>
+        <w:t xml:space="preserve"> </w:t>
+      </w:r>
+      <m:oMath>
+        <m:r>
+          <m:t>X</m:t>
+        </m:r>
+      </m:oMath>
+      <w:r>
+        <w:t xml:space="preserve"> </w:t>
+      </w:r>
+      <w:r>
+        <w:t xml:space="preserve">be a random variable with mean</w:t>
+      </w:r>
+      <w:r>
+        <w:t xml:space="preserve"> </w:t>
+      </w:r>
+      <m:oMath>
+        <m:r>
+          <m:t>μ</m:t>
+        </m:r>
+      </m:oMath>
+      <w:r>
+        <w:t xml:space="preserve"> </w:t>
+      </w:r>
+      <w:r>
+        <w:t xml:space="preserve">and finite variance</w:t>
+      </w:r>
+      <w:r>
+        <w:t xml:space="preserve"> </w:t>
+      </w:r>
+      <m:oMath>
+        <m:sSup>
+          <m:e>
+            <m:r>
+              <m:t>σ</m:t>
+            </m:r>
+          </m:e>
+          <m:sup>
+            <m:r>
+              <m:t>2</m:t>
+            </m:r>
+          </m:sup>
+        </m:sSup>
+        <m:r>
+          <m:rPr>
+            <m:sty m:val="p"/>
+          </m:rPr>
+          <m:t>&gt;</m:t>
+        </m:r>
+        <m:r>
+          <m:t>0</m:t>
+        </m:r>
+      </m:oMath>
+      <w:r>
+        <w:t xml:space="preserve">.</w:t>
+      </w:r>
+      <w:r>
+        <w:t xml:space="preserve"> </w:t>
+      </w:r>
+      <w:r>
+        <w:t xml:space="preserve">Then for every</w:t>
+      </w:r>
+      <w:r>
+        <w:t xml:space="preserve"> </w:t>
+      </w:r>
+      <m:oMath>
+        <m:r>
+          <m:t>k</m:t>
+        </m:r>
+        <m:r>
+          <m:rPr>
+            <m:sty m:val="p"/>
+          </m:rPr>
+          <m:t>&gt;</m:t>
+        </m:r>
+        <m:r>
+          <m:t>0</m:t>
+        </m:r>
+      </m:oMath>
+      <w:r>
+        <w:t xml:space="preserve">:</w:t>
+      </w:r>
+    </w:p>
+    <w:p>
+      <w:pPr>
+        <w:pStyle w:val="BodyText"/>
+      </w:pPr>
+      <m:oMathPara>
+        <m:oMathParaPr>
+          <m:jc m:val="center"/>
+        </m:oMathParaPr>
+        <m:oMath>
+          <m:r>
+            <m:rPr>
+              <m:sty m:val="p"/>
+            </m:rPr>
+            <m:t>Pr</m:t>
+          </m:r>
+          <m:r>
+            <m:t>​</m:t>
+          </m:r>
+          <m:d>
+            <m:dPr>
+              <m:begChr m:val="("/>
+              <m:sepChr m:val=""/>
+              <m:endChr m:val=")"/>
+              <m:grow/>
+            </m:dPr>
+            <m:e>
+              <m:r>
+                <m:t>​</m:t>
+              </m:r>
+              <m:d>
+                <m:dPr>
+                  <m:begChr m:val="|"/>
+                  <m:sepChr m:val=""/>
+                  <m:endChr m:val="|"/>
+                  <m:grow/>
+                </m:dPr>
+                <m:e>
+                  <m:r>
+                    <m:t>X</m:t>
+                  </m:r>
+                  <m:r>
+                    <m:rPr>
+                      <m:sty m:val="p"/>
+                    </m:rPr>
+                    <m:t>−</m:t>
+                  </m:r>
+                  <m:r>
+                    <m:t>μ</m:t>
+                  </m:r>
+                </m:e>
+              </m:d>
+              <m:r>
+                <m:t>​</m:t>
+              </m:r>
+              <m:r>
+                <m:rPr>
+                  <m:sty m:val="p"/>
+                </m:rPr>
+                <m:t>≥</m:t>
+              </m:r>
+              <m:r>
+                <m:t>k</m:t>
+              </m:r>
+              <m:r>
+                <m:t>σ</m:t>
+              </m:r>
+            </m:e>
+          </m:d>
+          <m:r>
+            <m:t>​</m:t>
+          </m:r>
+          <m:r>
+            <m:rPr>
+              <m:sty m:val="p"/>
+            </m:rPr>
+            <m:t>≤</m:t>
+          </m:r>
+          <m:f>
+            <m:fPr>
+              <m:type m:val="bar"/>
+            </m:fPr>
+            <m:num>
+              <m:r>
+                <m:t>1</m:t>
+              </m:r>
+            </m:num>
+            <m:den>
+              <m:sSup>
+                <m:e>
+                  <m:r>
+                    <m:t>k</m:t>
+                  </m:r>
+                </m:e>
+                <m:sup>
+                  <m:r>
+                    <m:t>2</m:t>
+                  </m:r>
+                </m:sup>
+              </m:sSup>
+            </m:den>
+          </m:f>
+        </m:oMath>
+      </m:oMathPara>
+    </w:p>
+    <w:bookmarkEnd w:id="39"/>
+    <w:p>
+      <w:pPr>
+        <w:pStyle w:val="FirstParagraph"/>
+      </w:pPr>
+      <w:r>
+        <w:rPr>
+          <w:i/>
+          <w:iCs/>
+        </w:rPr>
+        <w:t xml:space="preserve">Proof</w:t>
+      </w:r>
+      <w:r>
+        <w:t xml:space="preserve">. </w:t>
+      </w:r>
+      <w:r>
+        <w:t xml:space="preserve">The random variable</w:t>
+      </w:r>
+      <w:r>
+        <w:t xml:space="preserve"> </w:t>
+      </w:r>
+      <m:oMath>
+        <m:r>
+          <m:rPr>
+            <m:sty m:val="p"/>
+          </m:rPr>
+          <m:t>(</m:t>
+        </m:r>
+        <m:r>
+          <m:t>X</m:t>
+        </m:r>
+        <m:r>
+          <m:rPr>
+            <m:sty m:val="p"/>
+          </m:rPr>
+          <m:t>−</m:t>
+        </m:r>
+        <m:r>
+          <m:t>μ</m:t>
+        </m:r>
+        <m:sSup>
+          <m:e>
+            <m:r>
+              <m:rPr>
+                <m:sty m:val="p"/>
+              </m:rPr>
+              <m:t>)</m:t>
+            </m:r>
+          </m:e>
+          <m:sup>
+            <m:r>
+              <m:t>2</m:t>
+            </m:r>
+          </m:sup>
+        </m:sSup>
+      </m:oMath>
+      <w:r>
+        <w:t xml:space="preserve"> </w:t>
+      </w:r>
+      <w:r>
+        <w:t xml:space="preserve">is nonnegative,</w:t>
+      </w:r>
+      <w:r>
+        <w:t xml:space="preserve"> </w:t>
+      </w:r>
+      <w:r>
+        <w:t xml:space="preserve">and its expectation is</w:t>
+      </w:r>
+      <w:r>
+        <w:t xml:space="preserve"> </w:t>
+      </w:r>
+      <m:oMath>
+        <m:sSup>
+          <m:e>
+            <m:r>
+              <m:t>σ</m:t>
+            </m:r>
+          </m:e>
+          <m:sup>
+            <m:r>
+              <m:t>2</m:t>
+            </m:r>
+          </m:sup>
+        </m:sSup>
+      </m:oMath>
+      <w:r>
+        <w:t xml:space="preserve">.</w:t>
+      </w:r>
+      <w:r>
+        <w:t xml:space="preserve"> </w:t>
+      </w:r>
+      <w:r>
+        <w:t xml:space="preserve">Because</w:t>
+      </w:r>
+      <w:r>
+        <w:t xml:space="preserve"> </w:t>
+      </w:r>
+      <m:oMath>
+        <m:r>
+          <m:t>​</m:t>
+        </m:r>
+        <m:d>
+          <m:dPr>
+            <m:begChr m:val="|"/>
+            <m:sepChr m:val=""/>
+            <m:endChr m:val="|"/>
+            <m:grow/>
+          </m:dPr>
+          <m:e>
+            <m:r>
+              <m:t>X</m:t>
+            </m:r>
+            <m:r>
+              <m:rPr>
+                <m:sty m:val="p"/>
+              </m:rPr>
+              <m:t>−</m:t>
+            </m:r>
+            <m:r>
+              <m:t>μ</m:t>
+            </m:r>
+          </m:e>
+        </m:d>
+        <m:r>
+          <m:t>​</m:t>
+        </m:r>
+        <m:r>
+          <m:rPr>
+            <m:sty m:val="p"/>
+          </m:rPr>
+          <m:t>≥</m:t>
+        </m:r>
+        <m:r>
+          <m:t>k</m:t>
+        </m:r>
+        <m:r>
+          <m:t>σ</m:t>
+        </m:r>
+      </m:oMath>
+      <w:r>
+        <w:t xml:space="preserve"> </w:t>
+      </w:r>
+      <w:r>
+        <w:t xml:space="preserve">exactly when</w:t>
+      </w:r>
+      <w:r>
+        <w:t xml:space="preserve"> </w:t>
+      </w:r>
+      <m:oMath>
+        <m:r>
+          <m:rPr>
+            <m:sty m:val="p"/>
+          </m:rPr>
+          <m:t>(</m:t>
+        </m:r>
+        <m:r>
+          <m:t>X</m:t>
+        </m:r>
+        <m:r>
+          <m:rPr>
+            <m:sty m:val="p"/>
+          </m:rPr>
+          <m:t>−</m:t>
+        </m:r>
+        <m:r>
+          <m:t>μ</m:t>
+        </m:r>
+        <m:sSup>
+          <m:e>
+            <m:r>
+              <m:rPr>
+                <m:sty m:val="p"/>
+              </m:rPr>
+              <m:t>)</m:t>
+            </m:r>
+          </m:e>
+          <m:sup>
+            <m:r>
+              <m:t>2</m:t>
+            </m:r>
+          </m:sup>
+        </m:sSup>
+        <m:r>
+          <m:rPr>
+            <m:sty m:val="p"/>
+          </m:rPr>
+          <m:t>≥</m:t>
+        </m:r>
+        <m:sSup>
+          <m:e>
+            <m:r>
+              <m:t>k</m:t>
+            </m:r>
+          </m:e>
+          <m:sup>
+            <m:r>
+              <m:t>2</m:t>
+            </m:r>
+          </m:sup>
+        </m:sSup>
+        <m:sSup>
+          <m:e>
+            <m:r>
+              <m:t>σ</m:t>
+            </m:r>
+          </m:e>
+          <m:sup>
+            <m:r>
+              <m:t>2</m:t>
+            </m:r>
+          </m:sup>
+        </m:sSup>
+      </m:oMath>
+      <w:r>
+        <w:t xml:space="preserve">,</w:t>
+      </w:r>
+      <w:r>
+        <w:t xml:space="preserve"> </w:t>
+      </w:r>
+      <w:hyperlink w:anchor="thm-markov">
+        <w:r>
+          <w:rPr>
+            <w:rStyle w:val="Hyperlink"/>
+          </w:rPr>
+          <w:t xml:space="preserve">Theorem 2</w:t>
+        </w:r>
+      </w:hyperlink>
+      <w:r>
+        <w:t xml:space="preserve"> </w:t>
+      </w:r>
+      <w:r>
+        <w:t xml:space="preserve">gives</w:t>
+      </w:r>
+    </w:p>
+    <w:p>
+      <w:pPr>
+        <w:pStyle w:val="BodyText"/>
+      </w:pPr>
+      <m:oMathPara>
+        <m:oMathParaPr>
+          <m:jc m:val="center"/>
+        </m:oMathParaPr>
+        <m:oMath>
+          <m:r>
+            <m:rPr>
+              <m:sty m:val="p"/>
+            </m:rPr>
+            <m:t>Pr</m:t>
+          </m:r>
+          <m:r>
+            <m:t>​</m:t>
+          </m:r>
+          <m:d>
+            <m:dPr>
+              <m:begChr m:val="("/>
+              <m:sepChr m:val=""/>
+              <m:endChr m:val=")"/>
+              <m:grow/>
+            </m:dPr>
+            <m:e>
+              <m:r>
+                <m:t>​</m:t>
+              </m:r>
+              <m:d>
+                <m:dPr>
+                  <m:begChr m:val="|"/>
+                  <m:sepChr m:val=""/>
+                  <m:endChr m:val="|"/>
+                  <m:grow/>
+                </m:dPr>
+                <m:e>
+                  <m:r>
+                    <m:t>X</m:t>
+                  </m:r>
+                  <m:r>
+                    <m:rPr>
+                      <m:sty m:val="p"/>
+                    </m:rPr>
+                    <m:t>−</m:t>
+                  </m:r>
+                  <m:r>
+                    <m:t>μ</m:t>
+                  </m:r>
+                </m:e>
+              </m:d>
+              <m:r>
+                <m:t>​</m:t>
+              </m:r>
+              <m:r>
+                <m:rPr>
+                  <m:sty m:val="p"/>
+                </m:rPr>
+                <m:t>≥</m:t>
+              </m:r>
+              <m:r>
+                <m:t>k</m:t>
+              </m:r>
+              <m:r>
+                <m:t>σ</m:t>
+              </m:r>
+            </m:e>
+          </m:d>
+          <m:r>
+            <m:t>​</m:t>
+          </m:r>
+          <m:r>
+            <m:rPr>
+              <m:sty m:val="p"/>
+            </m:rPr>
+            <m:t>=</m:t>
+          </m:r>
+          <m:r>
+            <m:rPr>
+              <m:sty m:val="p"/>
+            </m:rPr>
+            <m:t>Pr</m:t>
+          </m:r>
+          <m:r>
+            <m:t>​</m:t>
+          </m:r>
+          <m:d>
+            <m:dPr>
+              <m:begChr m:val="("/>
+              <m:sepChr m:val=""/>
+              <m:endChr m:val=")"/>
+              <m:grow/>
+            </m:dPr>
+            <m:e>
+              <m:r>
+                <m:rPr>
+                  <m:sty m:val="p"/>
+                </m:rPr>
+                <m:t>(</m:t>
+              </m:r>
+              <m:r>
+                <m:t>X</m:t>
+              </m:r>
+              <m:r>
+                <m:rPr>
+                  <m:sty m:val="p"/>
+                </m:rPr>
+                <m:t>−</m:t>
+              </m:r>
+              <m:r>
+                <m:t>μ</m:t>
+              </m:r>
+              <m:sSup>
+                <m:e>
+                  <m:r>
+                    <m:rPr>
+                      <m:sty m:val="p"/>
+                    </m:rPr>
+                    <m:t>)</m:t>
+                  </m:r>
+                </m:e>
+                <m:sup>
+                  <m:r>
+                    <m:t>2</m:t>
+                  </m:r>
+                </m:sup>
+              </m:sSup>
+              <m:r>
+                <m:rPr>
+                  <m:sty m:val="p"/>
+                </m:rPr>
+                <m:t>≥</m:t>
+              </m:r>
+              <m:sSup>
+                <m:e>
+                  <m:r>
+                    <m:t>k</m:t>
+                  </m:r>
+                </m:e>
+                <m:sup>
+                  <m:r>
+                    <m:t>2</m:t>
+                  </m:r>
+                </m:sup>
+              </m:sSup>
+              <m:sSup>
+                <m:e>
+                  <m:r>
+                    <m:t>σ</m:t>
+                  </m:r>
+                </m:e>
+                <m:sup>
+                  <m:r>
+                    <m:t>2</m:t>
+                  </m:r>
+                </m:sup>
+              </m:sSup>
+            </m:e>
+          </m:d>
+          <m:r>
+            <m:t>​</m:t>
+          </m:r>
+          <m:r>
+            <m:rPr>
+              <m:sty m:val="p"/>
+            </m:rPr>
+            <m:t>≤</m:t>
+          </m:r>
+          <m:f>
+            <m:fPr>
+              <m:type m:val="bar"/>
+            </m:fPr>
+            <m:num>
+              <m:sSup>
+                <m:e>
+                  <m:r>
+                    <m:t>σ</m:t>
+                  </m:r>
+                </m:e>
+                <m:sup>
+                  <m:r>
+                    <m:t>2</m:t>
+                  </m:r>
+                </m:sup>
+              </m:sSup>
+            </m:num>
+            <m:den>
+              <m:sSup>
+                <m:e>
+                  <m:r>
+                    <m:t>k</m:t>
+                  </m:r>
+                </m:e>
+                <m:sup>
+                  <m:r>
+                    <m:t>2</m:t>
+                  </m:r>
+                </m:sup>
+              </m:sSup>
+              <m:sSup>
+                <m:e>
+                  <m:r>
+                    <m:t>σ</m:t>
+                  </m:r>
+                </m:e>
+                <m:sup>
+                  <m:r>
+                    <m:t>2</m:t>
+                  </m:r>
+                </m:sup>
+              </m:sSup>
+            </m:den>
+          </m:f>
+          <m:r>
+            <m:rPr>
+              <m:sty m:val="p"/>
+            </m:rPr>
+            <m:t>=</m:t>
+          </m:r>
+          <m:f>
+            <m:fPr>
+              <m:type m:val="bar"/>
+            </m:fPr>
+            <m:num>
+              <m:r>
+                <m:t>1</m:t>
+              </m:r>
+            </m:num>
+            <m:den>
+              <m:sSup>
+                <m:e>
+                  <m:r>
+                    <m:t>k</m:t>
+                  </m:r>
+                </m:e>
+                <m:sup>
+                  <m:r>
+                    <m:t>2</m:t>
+                  </m:r>
+                </m:sup>
+              </m:sSup>
+            </m:den>
+          </m:f>
+        </m:oMath>
+      </m:oMathPara>
+    </w:p>
+    <w:p>
+      <w:pPr>
+        <w:pStyle w:val="FirstParagraph"/>
+      </w:pPr>
+      <w:r>
+        <w:rPr>
+          <w:i/>
+          <w:iCs/>
+        </w:rPr>
+        <w:t xml:space="preserve">Remark</w:t>
+      </w:r>
+      <w:r>
+        <w:t xml:space="preserve">. </w:t>
+      </w:r>
+      <w:hyperlink w:anchor="thm-chebyshev">
+        <w:r>
+          <w:rPr>
+            <w:rStyle w:val="Hyperlink"/>
+          </w:rPr>
+          <w:t xml:space="preserve">Theorem 3</w:t>
+        </w:r>
+      </w:hyperlink>
+      <w:r>
+        <w:t xml:space="preserve"> </w:t>
+      </w:r>
+      <w:r>
+        <w:t xml:space="preserve">needs only a mean and a variance, not a distribution,</w:t>
+      </w:r>
+      <w:r>
+        <w:t xml:space="preserve"> </w:t>
+      </w:r>
+      <w:r>
+        <w:t xml:space="preserve">so it holds for every distribution that has them.</w:t>
+      </w:r>
+      <w:r>
+        <w:t xml:space="preserve"> </w:t>
+      </w:r>
+      <w:r>
+        <w:t xml:space="preserve">That generality makes it loose:</w:t>
+      </w:r>
+      <w:r>
+        <w:t xml:space="preserve"> </w:t>
+      </w:r>
+      <w:r>
+        <w:t xml:space="preserve">for a normal distribution, the chance of landing more than two standard deviations from the mean is about 5%, but the bound at</w:t>
+      </w:r>
+      <w:r>
+        <w:t xml:space="preserve"> </w:t>
+      </w:r>
+      <m:oMath>
+        <m:r>
+          <m:t>k</m:t>
+        </m:r>
+        <m:r>
+          <m:rPr>
+            <m:sty m:val="p"/>
+          </m:rPr>
+          <m:t>=</m:t>
+        </m:r>
+        <m:r>
+          <m:t>2</m:t>
+        </m:r>
+      </m:oMath>
+      <w:r>
+        <w:t xml:space="preserve"> </w:t>
+      </w:r>
+      <w:r>
+        <w:t xml:space="preserve">is 25%.</w:t>
+      </w:r>
+    </w:p>
+    <w:bookmarkStart w:id="40" w:name="exm-chebyshev-auto"/>
+    <w:p>
+      <w:pPr>
+        <w:pStyle w:val="BodyText"/>
+      </w:pPr>
+      <w:r>
+        <w:rPr>
+          <w:b/>
+          <w:bCs/>
+        </w:rPr>
+        <w:t xml:space="preserve">Example 3 (How loose is Chebyshev’s bound for car horsepower?)</w:t>
+      </w:r>
+      <w:r>
+        <w:t xml:space="preserve"> </w:t>
+      </w:r>
+      <w:r>
+        <w:t xml:space="preserve">Take the 392 horsepower values in the Auto data</w:t>
+      </w:r>
+      <w:r>
+        <w:t xml:space="preserve"> </w:t>
+      </w:r>
+      <w:r>
+        <w:t xml:space="preserve">described in</w:t>
+      </w:r>
+      <w:r>
+        <w:t xml:space="preserve"> </w:t>
+      </w:r>
+      <w:hyperlink w:anchor="exm-clt-auto">
+        <w:r>
+          <w:rPr>
+            <w:rStyle w:val="Hyperlink"/>
+          </w:rPr>
+          <w:t xml:space="preserve">Example 2</w:t>
+        </w:r>
+      </w:hyperlink>
+      <w:r>
+        <w:t xml:space="preserve"> </w:t>
+      </w:r>
+      <w:r>
+        <w:t xml:space="preserve">as the whole population,</w:t>
+      </w:r>
+      <w:r>
+        <w:t xml:space="preserve"> </w:t>
+      </w:r>
+      <w:r>
+        <w:t xml:space="preserve">and draw one car at random.</w:t>
+      </w:r>
+      <w:r>
+        <w:t xml:space="preserve"> </w:t>
+      </w:r>
+      <w:r>
+        <w:t xml:space="preserve">For each</w:t>
+      </w:r>
+      <w:r>
+        <w:t xml:space="preserve"> </w:t>
+      </w:r>
+      <m:oMath>
+        <m:r>
+          <m:t>k</m:t>
+        </m:r>
+      </m:oMath>
+      <w:r>
+        <w:t xml:space="preserve">, the code below counts the share of cars whose horsepower</w:t>
+      </w:r>
+      <w:r>
+        <w:t xml:space="preserve"> </w:t>
+      </w:r>
+      <w:r>
+        <w:t xml:space="preserve">is at least</w:t>
+      </w:r>
+      <w:r>
+        <w:t xml:space="preserve"> </w:t>
+      </w:r>
+      <m:oMath>
+        <m:r>
+          <m:t>k</m:t>
+        </m:r>
+      </m:oMath>
+      <w:r>
+        <w:t xml:space="preserve"> </w:t>
+      </w:r>
+      <w:r>
+        <w:t xml:space="preserve">standard deviations from the mean,</w:t>
+      </w:r>
+      <w:r>
+        <w:t xml:space="preserve"> </w:t>
+      </w:r>
+      <w:r>
+        <w:t xml:space="preserve">and sets it beside the bound</w:t>
+      </w:r>
+      <w:r>
+        <w:t xml:space="preserve"> </w:t>
+      </w:r>
+      <m:oMath>
+        <m:r>
+          <m:t>1</m:t>
+        </m:r>
+        <m:r>
+          <m:rPr>
+            <m:sty m:val="p"/>
+          </m:rPr>
+          <m:t>/</m:t>
+        </m:r>
+        <m:sSup>
+          <m:e>
+            <m:r>
+              <m:t>k</m:t>
+            </m:r>
+          </m:e>
+          <m:sup>
+            <m:r>
+              <m:t>2</m:t>
+            </m:r>
+          </m:sup>
+        </m:sSup>
+      </m:oMath>
+      <w:r>
+        <w:t xml:space="preserve"> </w:t>
+      </w:r>
+      <w:r>
+        <w:t xml:space="preserve">from</w:t>
+      </w:r>
+      <w:r>
+        <w:t xml:space="preserve"> </w:t>
+      </w:r>
+      <w:hyperlink w:anchor="thm-chebyshev">
+        <w:r>
+          <w:rPr>
+            <w:rStyle w:val="Hyperlink"/>
+          </w:rPr>
+          <w:t xml:space="preserve">Theorem 3</w:t>
+        </w:r>
+      </w:hyperlink>
+      <w:r>
+        <w:t xml:space="preserve">.</w:t>
+      </w:r>
+    </w:p>
+    <w:p>
+      <w:pPr>
+        <w:pStyle w:val="SourceCode"/>
+      </w:pPr>
+      <w:r>
+        <w:rPr>
+          <w:rStyle w:val="NormalTok"/>
+        </w:rPr>
+        <w:t xml:space="preserve">hp </w:t>
+      </w:r>
+      <w:r>
+        <w:rPr>
+          <w:rStyle w:val="OtherTok"/>
+        </w:rPr>
+        <w:t xml:space="preserve">&lt;-</w:t>
+      </w:r>
+      <w:r>
+        <w:rPr>
+          <w:rStyle w:val="NormalTok"/>
+        </w:rPr>
+        <w:t xml:space="preserve"> </w:t>
+      </w:r>
+      <w:r>
+        <w:rPr>
+          <w:rStyle w:val="FunctionTok"/>
+        </w:rPr>
+        <w:t xml:space="preserve">read.csv</w:t>
+      </w:r>
+      <w:r>
+        <w:rPr>
+          <w:rStyle w:val="NormalTok"/>
+        </w:rPr>
+        <w:t xml:space="preserve">(</w:t>
+      </w:r>
+      <w:r>
+        <w:rPr>
+          <w:rStyle w:val="StringTok"/>
+        </w:rPr>
+        <w:t xml:space="preserve">"data/auto.csv"</w:t>
+      </w:r>
+      <w:r>
+        <w:rPr>
+          <w:rStyle w:val="NormalTok"/>
+        </w:rPr>
+        <w:t xml:space="preserve">)</w:t>
+      </w:r>
+      <w:r>
+        <w:rPr>
+          <w:rStyle w:val="SpecialCharTok"/>
+        </w:rPr>
+        <w:t xml:space="preserve">$</w:t>
+      </w:r>
+      <w:r>
+        <w:rPr>
+          <w:rStyle w:val="NormalTok"/>
+        </w:rPr>
+        <w:t xml:space="preserve">horsepower</w:t>
+      </w:r>
+      <w:r>
+        <w:br/>
+      </w:r>
+      <w:r>
+        <w:rPr>
+          <w:rStyle w:val="NormalTok"/>
+        </w:rPr>
+        <w:t xml:space="preserve">mu </w:t>
+      </w:r>
+      <w:r>
+        <w:rPr>
+          <w:rStyle w:val="OtherTok"/>
+        </w:rPr>
+        <w:t xml:space="preserve">&lt;-</w:t>
+      </w:r>
+      <w:r>
+        <w:rPr>
+          <w:rStyle w:val="NormalTok"/>
+        </w:rPr>
+        <w:t xml:space="preserve"> </w:t>
+      </w:r>
+      <w:r>
+        <w:rPr>
+          <w:rStyle w:val="FunctionTok"/>
+        </w:rPr>
+        <w:t xml:space="preserve">mean</w:t>
+      </w:r>
+      <w:r>
+        <w:rPr>
+          <w:rStyle w:val="NormalTok"/>
+        </w:rPr>
+        <w:t xml:space="preserve">(hp)</w:t>
+      </w:r>
+      <w:r>
+        <w:br/>
+      </w:r>
+      <w:r>
+        <w:rPr>
+          <w:rStyle w:val="NormalTok"/>
+        </w:rPr>
+        <w:t xml:space="preserve">sigma </w:t>
+      </w:r>
+      <w:r>
+        <w:rPr>
+          <w:rStyle w:val="OtherTok"/>
+        </w:rPr>
+        <w:t xml:space="preserve">&lt;-</w:t>
+      </w:r>
+      <w:r>
+        <w:rPr>
+          <w:rStyle w:val="NormalTok"/>
+        </w:rPr>
+        <w:t xml:space="preserve"> </w:t>
+      </w:r>
+      <w:r>
+        <w:rPr>
+          <w:rStyle w:val="FunctionTok"/>
+        </w:rPr>
+        <w:t xml:space="preserve">sqrt</w:t>
+      </w:r>
+      <w:r>
+        <w:rPr>
+          <w:rStyle w:val="NormalTok"/>
+        </w:rPr>
+        <w:t xml:space="preserve">(</w:t>
+      </w:r>
+      <w:r>
+        <w:rPr>
+          <w:rStyle w:val="FunctionTok"/>
+        </w:rPr>
+        <w:t xml:space="preserve">mean</w:t>
+      </w:r>
+      <w:r>
+        <w:rPr>
+          <w:rStyle w:val="NormalTok"/>
+        </w:rPr>
+        <w:t xml:space="preserve">((hp </w:t>
+      </w:r>
+      <w:r>
+        <w:rPr>
+          <w:rStyle w:val="SpecialCharTok"/>
+        </w:rPr>
+        <w:t xml:space="preserve">-</w:t>
+      </w:r>
+      <w:r>
+        <w:rPr>
+          <w:rStyle w:val="NormalTok"/>
+        </w:rPr>
+        <w:t xml:space="preserve"> mu)</w:t>
+      </w:r>
+      <w:r>
+        <w:rPr>
+          <w:rStyle w:val="SpecialCharTok"/>
+        </w:rPr>
+        <w:t xml:space="preserve">^</w:t>
+      </w:r>
+      <w:r>
+        <w:rPr>
+          <w:rStyle w:val="DecValTok"/>
+        </w:rPr>
+        <w:t xml:space="preserve">2</w:t>
+      </w:r>
+      <w:r>
+        <w:rPr>
+          <w:rStyle w:val="NormalTok"/>
+        </w:rPr>
+        <w:t xml:space="preserve">))</w:t>
+      </w:r>
+      <w:r>
+        <w:br/>
+      </w:r>
+      <w:r>
+        <w:br/>
+      </w:r>
+      <w:r>
+        <w:rPr>
+          <w:rStyle w:val="NormalTok"/>
+        </w:rPr>
+        <w:t xml:space="preserve">k </w:t>
+      </w:r>
+      <w:r>
+        <w:rPr>
+          <w:rStyle w:val="OtherTok"/>
+        </w:rPr>
+        <w:t xml:space="preserve">&lt;-</w:t>
+      </w:r>
+      <w:r>
+        <w:rPr>
+          <w:rStyle w:val="NormalTok"/>
+        </w:rPr>
+        <w:t xml:space="preserve"> </w:t>
+      </w:r>
+      <w:r>
+        <w:rPr>
+          <w:rStyle w:val="FunctionTok"/>
+        </w:rPr>
+        <w:t xml:space="preserve">c</w:t>
+      </w:r>
+      <w:r>
+        <w:rPr>
+          <w:rStyle w:val="NormalTok"/>
+        </w:rPr>
+        <w:t xml:space="preserve">(</w:t>
+      </w:r>
+      <w:r>
+        <w:rPr>
+          <w:rStyle w:val="FloatTok"/>
+        </w:rPr>
+        <w:t xml:space="preserve">1.5</w:t>
+      </w:r>
+      <w:r>
+        <w:rPr>
+          <w:rStyle w:val="NormalTok"/>
+        </w:rPr>
+        <w:t xml:space="preserve">, </w:t>
+      </w:r>
+      <w:r>
+        <w:rPr>
+          <w:rStyle w:val="DecValTok"/>
+        </w:rPr>
+        <w:t xml:space="preserve">2</w:t>
+      </w:r>
+      <w:r>
+        <w:rPr>
+          <w:rStyle w:val="NormalTok"/>
+        </w:rPr>
+        <w:t xml:space="preserve">, </w:t>
+      </w:r>
+      <w:r>
+        <w:rPr>
+          <w:rStyle w:val="DecValTok"/>
+        </w:rPr>
+        <w:t xml:space="preserve">3</w:t>
+      </w:r>
+      <w:r>
+        <w:rPr>
+          <w:rStyle w:val="NormalTok"/>
+        </w:rPr>
+        <w:t xml:space="preserve">)</w:t>
+      </w:r>
+      <w:r>
+        <w:br/>
+      </w:r>
+      <w:r>
+        <w:rPr>
+          <w:rStyle w:val="NormalTok"/>
+        </w:rPr>
+        <w:t xml:space="preserve">share_beyond </w:t>
+      </w:r>
+      <w:r>
+        <w:rPr>
+          <w:rStyle w:val="OtherTok"/>
+        </w:rPr>
+        <w:t xml:space="preserve">&lt;-</w:t>
+      </w:r>
+      <w:r>
+        <w:rPr>
+          <w:rStyle w:val="NormalTok"/>
+        </w:rPr>
+        <w:t xml:space="preserve"> </w:t>
+      </w:r>
+      <w:r>
+        <w:rPr>
+          <w:rStyle w:val="FunctionTok"/>
+        </w:rPr>
+        <w:t xml:space="preserve">sapply</w:t>
+      </w:r>
+      <w:r>
+        <w:rPr>
+          <w:rStyle w:val="NormalTok"/>
+        </w:rPr>
+        <w:t xml:space="preserve">(k, </w:t>
+      </w:r>
+      <w:r>
+        <w:rPr>
+          <w:rStyle w:val="ControlFlowTok"/>
+        </w:rPr>
+        <w:t xml:space="preserve">function</w:t>
+      </w:r>
+      <w:r>
+        <w:rPr>
+          <w:rStyle w:val="NormalTok"/>
+        </w:rPr>
+        <w:t xml:space="preserve">(kk) </w:t>
+      </w:r>
+      <w:r>
+        <w:rPr>
+          <w:rStyle w:val="FunctionTok"/>
+        </w:rPr>
+        <w:t xml:space="preserve">mean</w:t>
+      </w:r>
+      <w:r>
+        <w:rPr>
+          <w:rStyle w:val="NormalTok"/>
+        </w:rPr>
+        <w:t xml:space="preserve">(</w:t>
+      </w:r>
+      <w:r>
+        <w:rPr>
+          <w:rStyle w:val="FunctionTok"/>
+        </w:rPr>
+        <w:t xml:space="preserve">abs</w:t>
+      </w:r>
+      <w:r>
+        <w:rPr>
+          <w:rStyle w:val="NormalTok"/>
+        </w:rPr>
+        <w:t xml:space="preserve">(hp </w:t>
+      </w:r>
+      <w:r>
+        <w:rPr>
+          <w:rStyle w:val="SpecialCharTok"/>
+        </w:rPr>
+        <w:t xml:space="preserve">-</w:t>
+      </w:r>
+      <w:r>
+        <w:rPr>
+          <w:rStyle w:val="NormalTok"/>
+        </w:rPr>
+        <w:t xml:space="preserve"> mu) </w:t>
+      </w:r>
+      <w:r>
+        <w:rPr>
+          <w:rStyle w:val="SpecialCharTok"/>
+        </w:rPr>
+        <w:t xml:space="preserve">&gt;=</w:t>
+      </w:r>
+      <w:r>
+        <w:rPr>
+          <w:rStyle w:val="NormalTok"/>
+        </w:rPr>
+        <w:t xml:space="preserve"> kk </w:t>
+      </w:r>
+      <w:r>
+        <w:rPr>
+          <w:rStyle w:val="SpecialCharTok"/>
+        </w:rPr>
+        <w:t xml:space="preserve">*</w:t>
+      </w:r>
+      <w:r>
+        <w:rPr>
+          <w:rStyle w:val="NormalTok"/>
+        </w:rPr>
+        <w:t xml:space="preserve"> sigma))</w:t>
+      </w:r>
+      <w:r>
+        <w:br/>
+      </w:r>
+      <w:r>
+        <w:rPr>
+          <w:rStyle w:val="FunctionTok"/>
+        </w:rPr>
+        <w:t xml:space="preserve">data.frame</w:t>
+      </w:r>
+      <w:r>
+        <w:rPr>
+          <w:rStyle w:val="NormalTok"/>
+        </w:rPr>
+        <w:t xml:space="preserve">(</w:t>
+      </w:r>
+      <w:r>
+        <w:rPr>
+          <w:rStyle w:val="AttributeTok"/>
+        </w:rPr>
+        <w:t xml:space="preserve">k =</w:t>
+      </w:r>
+      <w:r>
+        <w:rPr>
+          <w:rStyle w:val="NormalTok"/>
+        </w:rPr>
+        <w:t xml:space="preserve"> k, </w:t>
+      </w:r>
+      <w:r>
+        <w:rPr>
+          <w:rStyle w:val="AttributeTok"/>
+        </w:rPr>
+        <w:t xml:space="preserve">share_of_cars =</w:t>
+      </w:r>
+      <w:r>
+        <w:rPr>
+          <w:rStyle w:val="NormalTok"/>
+        </w:rPr>
+        <w:t xml:space="preserve"> share_beyond, </w:t>
+      </w:r>
+      <w:r>
+        <w:rPr>
+          <w:rStyle w:val="AttributeTok"/>
+        </w:rPr>
+        <w:t xml:space="preserve">chebyshev_bound =</w:t>
+      </w:r>
+      <w:r>
+        <w:rPr>
+          <w:rStyle w:val="NormalTok"/>
+        </w:rPr>
+        <w:t xml:space="preserve"> </w:t>
+      </w:r>
+      <w:r>
+        <w:rPr>
+          <w:rStyle w:val="DecValTok"/>
+        </w:rPr>
+        <w:t xml:space="preserve">1</w:t>
+      </w:r>
+      <w:r>
+        <w:rPr>
+          <w:rStyle w:val="NormalTok"/>
+        </w:rPr>
+        <w:t xml:space="preserve"> </w:t>
+      </w:r>
+      <w:r>
+        <w:rPr>
+          <w:rStyle w:val="SpecialCharTok"/>
+        </w:rPr>
+        <w:t xml:space="preserve">/</w:t>
+      </w:r>
+      <w:r>
+        <w:rPr>
+          <w:rStyle w:val="NormalTok"/>
+        </w:rPr>
+        <w:t xml:space="preserve"> k</w:t>
+      </w:r>
+      <w:r>
+        <w:rPr>
+          <w:rStyle w:val="SpecialCharTok"/>
+        </w:rPr>
+        <w:t xml:space="preserve">^</w:t>
+      </w:r>
+      <w:r>
+        <w:rPr>
+          <w:rStyle w:val="DecValTok"/>
+        </w:rPr>
+        <w:t xml:space="preserve">2</w:t>
+      </w:r>
+      <w:r>
+        <w:rPr>
+          <w:rStyle w:val="NormalTok"/>
+        </w:rPr>
+        <w:t xml:space="preserve">)</w:t>
+      </w:r>
+      <w:r>
+        <w:br/>
+      </w:r>
+      <w:r>
+        <w:rPr>
+          <w:rStyle w:val="CommentTok"/>
+        </w:rPr>
+        <w:t xml:space="preserve">#&gt; # A tibble: 3 × 3</w:t>
+      </w:r>
+      <w:r>
+        <w:br/>
+      </w:r>
+      <w:r>
+        <w:rPr>
+          <w:rStyle w:val="CommentTok"/>
+        </w:rPr>
+        <w:t xml:space="preserve">#&gt;       k share_of_cars chebyshev_bound</w:t>
+      </w:r>
+      <w:r>
+        <w:br/>
+      </w:r>
+      <w:r>
+        <w:rPr>
+          <w:rStyle w:val="CommentTok"/>
+        </w:rPr>
+        <w:t xml:space="preserve">#&gt;   &lt;dbl&gt;         &lt;dbl&gt;           &lt;dbl&gt;</w:t>
+      </w:r>
+      <w:r>
+        <w:br/>
+      </w:r>
+      <w:r>
+        <w:rPr>
+          <w:rStyle w:val="CommentTok"/>
+        </w:rPr>
+        <w:t xml:space="preserve">#&gt; 1   1.5        0.0995           0.444</w:t>
+      </w:r>
+      <w:r>
+        <w:br/>
+      </w:r>
+      <w:r>
+        <w:rPr>
+          <w:rStyle w:val="CommentTok"/>
+        </w:rPr>
+        <w:t xml:space="preserve">#&gt; 2   2          0.0434           0.25 </w:t>
+      </w:r>
+      <w:r>
+        <w:br/>
+      </w:r>
+      <w:r>
+        <w:rPr>
+          <w:rStyle w:val="CommentTok"/>
+        </w:rPr>
+        <w:t xml:space="preserve">#&gt; 3   3          0.0128           0.111</w:t>
+      </w:r>
+    </w:p>
+    <w:p>
+      <w:pPr>
+        <w:pStyle w:val="FirstParagraph"/>
+      </w:pPr>
+      <w:r>
+        <w:t xml:space="preserve">The bound holds at every</w:t>
+      </w:r>
+      <w:r>
+        <w:t xml:space="preserve"> </w:t>
+      </w:r>
+      <m:oMath>
+        <m:r>
+          <m:t>k</m:t>
+        </m:r>
+      </m:oMath>
+      <w:r>
+        <w:t xml:space="preserve">, as</w:t>
+      </w:r>
+      <w:r>
+        <w:t xml:space="preserve"> </w:t>
+      </w:r>
+      <w:hyperlink w:anchor="thm-chebyshev">
+        <w:r>
+          <w:rPr>
+            <w:rStyle w:val="Hyperlink"/>
+          </w:rPr>
+          <w:t xml:space="preserve">Theorem 3</w:t>
+        </w:r>
+      </w:hyperlink>
+      <w:r>
+        <w:t xml:space="preserve"> </w:t>
+      </w:r>
+      <w:r>
+        <w:t xml:space="preserve">guarantees.</w:t>
+      </w:r>
+      <w:r>
+        <w:t xml:space="preserve"> </w:t>
+      </w:r>
+      <w:r>
+        <w:t xml:space="preserve">At</w:t>
+      </w:r>
+      <w:r>
+        <w:t xml:space="preserve"> </w:t>
+      </w:r>
+      <m:oMath>
+        <m:r>
+          <m:t>k</m:t>
+        </m:r>
+        <m:r>
+          <m:rPr>
+            <m:sty m:val="p"/>
+          </m:rPr>
+          <m:t>=</m:t>
+        </m:r>
+        <m:r>
+          <m:t>2</m:t>
+        </m:r>
+      </m:oMath>
+      <w:r>
+        <w:t xml:space="preserve"> </w:t>
+      </w:r>
+      <w:r>
+        <w:t xml:space="preserve">the share of cars is</w:t>
+      </w:r>
+      <w:r>
+        <w:t xml:space="preserve"> </w:t>
+      </w:r>
+      <w:r>
+        <w:t xml:space="preserve">4.3%,</w:t>
+      </w:r>
+      <w:r>
+        <w:t xml:space="preserve"> </w:t>
+      </w:r>
+      <w:r>
+        <w:t xml:space="preserve">against a bound of 25%,</w:t>
+      </w:r>
+      <w:r>
+        <w:t xml:space="preserve"> </w:t>
+      </w:r>
+      <w:r>
+        <w:t xml:space="preserve">and at</w:t>
+      </w:r>
+      <w:r>
+        <w:t xml:space="preserve"> </w:t>
+      </w:r>
+      <m:oMath>
+        <m:r>
+          <m:t>k</m:t>
+        </m:r>
+        <m:r>
+          <m:rPr>
+            <m:sty m:val="p"/>
+          </m:rPr>
+          <m:t>=</m:t>
+        </m:r>
+        <m:r>
+          <m:t>3</m:t>
+        </m:r>
+      </m:oMath>
+      <w:r>
+        <w:t xml:space="preserve"> </w:t>
+      </w:r>
+      <w:r>
+        <w:t xml:space="preserve">it is 1.3%</w:t>
+      </w:r>
+      <w:r>
+        <w:t xml:space="preserve"> </w:t>
+      </w:r>
+      <w:r>
+        <w:t xml:space="preserve">against 11.1%.</w:t>
+      </w:r>
+      <w:r>
+        <w:t xml:space="preserve"> </w:t>
+      </w:r>
+      <w:r>
+        <w:t xml:space="preserve">The bound is loose because it must hold for every distribution with this mean and variance.</w:t>
+      </w:r>
+    </w:p>
+    <w:bookmarkEnd w:id="40"/>
+    <w:bookmarkStart w:id="41" w:name="exr-chebyshev-sample-size"/>
+    <w:p>
+      <w:pPr>
+        <w:pStyle w:val="BodyText"/>
+      </w:pPr>
+      <w:r>
+        <w:rPr>
+          <w:b/>
+          <w:bCs/>
+        </w:rPr>
+        <w:t xml:space="preserve">Exercise 1 (How many cars to estimate average fuel economy)</w:t>
+      </w:r>
+      <w:r>
+        <w:t xml:space="preserve"> </w:t>
+      </w:r>
+      <w:r>
+        <w:t xml:space="preserve">Let</w:t>
+      </w:r>
+      <w:r>
+        <w:t xml:space="preserve"> </w:t>
+      </w:r>
+      <m:oMath>
+        <m:sSub>
+          <m:e>
+            <m:r>
+              <m:t>X</m:t>
+            </m:r>
+          </m:e>
+          <m:sub>
+            <m:r>
+              <m:t>1</m:t>
+            </m:r>
+          </m:sub>
+        </m:sSub>
+        <m:r>
+          <m:rPr>
+            <m:sty m:val="p"/>
+          </m:rPr>
+          <m:t>,</m:t>
+        </m:r>
+        <m:r>
+          <m:rPr>
+            <m:sty m:val="p"/>
+          </m:rPr>
+          <m:t>…</m:t>
+        </m:r>
+        <m:r>
+          <m:rPr>
+            <m:sty m:val="p"/>
+          </m:rPr>
+          <m:t>,</m:t>
+        </m:r>
+        <m:sSub>
+          <m:e>
+            <m:r>
+              <m:t>X</m:t>
+            </m:r>
+          </m:e>
+          <m:sub>
+            <m:r>
+              <m:t>n</m:t>
+            </m:r>
+          </m:sub>
+        </m:sSub>
+      </m:oMath>
+      <w:r>
+        <w:t xml:space="preserve"> </w:t>
+      </w:r>
+      <w:r>
+        <w:t xml:space="preserve">be</w:t>
+      </w:r>
+      <w:r>
+        <w:t xml:space="preserve"> </w:t>
+      </w:r>
+      <w:hyperlink r:id="rId9">
+        <w:r>
+          <w:rPr>
+            <w:rStyle w:val="Hyperlink"/>
+          </w:rPr>
+          <w:t xml:space="preserve">IID</w:t>
+        </w:r>
+      </w:hyperlink>
+      <w:r>
+        <w:t xml:space="preserve"> </w:t>
+      </w:r>
+      <w:r>
+        <w:t xml:space="preserve">draws of the fuel economy (</w:t>
+      </w:r>
+      <w:r>
+        <w:rPr>
+          <w:rStyle w:val="VerbatimChar"/>
+        </w:rPr>
+        <w:t xml:space="preserve">mpg</w:t>
+      </w:r>
+      <w:r>
+        <w:t xml:space="preserve">) of</w:t>
+      </w:r>
+      <w:r>
+        <w:t xml:space="preserve"> </w:t>
+      </w:r>
+      <w:r>
+        <w:t xml:space="preserve">a car chosen at random from the Auto data,</w:t>
+      </w:r>
+      <w:r>
+        <w:t xml:space="preserve"> </w:t>
+      </w:r>
+      <w:r>
+        <w:t xml:space="preserve">with mean</w:t>
+      </w:r>
+      <w:r>
+        <w:t xml:space="preserve"> </w:t>
+      </w:r>
+      <m:oMath>
+        <m:r>
+          <m:t>μ</m:t>
+        </m:r>
+      </m:oMath>
+      <w:r>
+        <w:t xml:space="preserve"> </w:t>
+      </w:r>
+      <w:r>
+        <w:t xml:space="preserve">and variance</w:t>
+      </w:r>
+      <w:r>
+        <w:t xml:space="preserve"> </w:t>
+      </w:r>
+      <m:oMath>
+        <m:sSup>
+          <m:e>
+            <m:r>
+              <m:t>σ</m:t>
+            </m:r>
+          </m:e>
+          <m:sup>
+            <m:r>
+              <m:t>2</m:t>
+            </m:r>
+          </m:sup>
+        </m:sSup>
+      </m:oMath>
+      <w:r>
+        <w:t xml:space="preserve">,</w:t>
+      </w:r>
+      <w:r>
+        <w:t xml:space="preserve"> </w:t>
+      </w:r>
+      <w:r>
+        <w:t xml:space="preserve">and let</w:t>
+      </w:r>
+      <w:r>
+        <w:t xml:space="preserve"> </w:t>
+      </w:r>
+      <m:oMath>
+        <m:sSub>
+          <m:e>
+            <m:acc>
+              <m:accPr>
+                <m:chr m:val="‾"/>
+              </m:accPr>
+              <m:e>
+                <m:r>
+                  <m:t>X</m:t>
+                </m:r>
+              </m:e>
+            </m:acc>
+          </m:e>
+          <m:sub>
+            <m:r>
+              <m:t>n</m:t>
+            </m:r>
+          </m:sub>
+        </m:sSub>
+        <m:limUpp>
+          <m:e>
+            <m:r>
+              <m:rPr>
+                <m:sty m:val="p"/>
+              </m:rPr>
+              <m:t>=</m:t>
+            </m:r>
+          </m:e>
+          <m:lim>
+            <m:r>
+              <m:rPr>
+                <m:nor/>
+                <m:sty m:val="p"/>
+              </m:rPr>
+              <m:t>def</m:t>
+            </m:r>
+          </m:lim>
+        </m:limUpp>
+        <m:f>
+          <m:fPr>
+            <m:type m:val="bar"/>
+          </m:fPr>
+          <m:num>
+            <m:r>
+              <m:t>1</m:t>
+            </m:r>
+          </m:num>
+          <m:den>
+            <m:r>
+              <m:t>n</m:t>
+            </m:r>
+          </m:den>
+        </m:f>
+        <m:nary>
+          <m:naryPr>
+            <m:chr m:val="∑"/>
+            <m:limLoc m:val="undOvr"/>
+            <m:subHide m:val="off"/>
+            <m:supHide m:val="off"/>
+          </m:naryPr>
+          <m:sub>
+            <m:r>
+              <m:t>i</m:t>
+            </m:r>
+            <m:r>
+              <m:rPr>
+                <m:sty m:val="p"/>
+              </m:rPr>
+              <m:t>=</m:t>
+            </m:r>
+            <m:r>
+              <m:t>1</m:t>
+            </m:r>
+          </m:sub>
+          <m:sup>
+            <m:r>
+              <m:t>n</m:t>
+            </m:r>
+          </m:sup>
+          <m:e>
+            <m:sSub>
+              <m:e>
+                <m:r>
+                  <m:t>X</m:t>
+                </m:r>
+              </m:e>
+              <m:sub>
+                <m:r>
+                  <m:t>i</m:t>
+                </m:r>
+              </m:sub>
+            </m:sSub>
+          </m:e>
+        </m:nary>
+      </m:oMath>
+      <w:r>
+        <w:t xml:space="preserve">.</w:t>
+      </w:r>
+    </w:p>
+    <w:p>
+      <w:pPr>
+        <w:numPr>
+          <w:ilvl w:val="0"/>
+          <w:numId w:val="1001"/>
+        </w:numPr>
+      </w:pPr>
+      <w:r>
+        <w:t xml:space="preserve">Use</w:t>
+      </w:r>
+      <w:r>
+        <w:t xml:space="preserve"> </w:t>
+      </w:r>
+      <w:hyperlink w:anchor="cor-sum-iid-moments">
+        <w:r>
+          <w:rPr>
+            <w:rStyle w:val="Hyperlink"/>
+          </w:rPr>
+          <w:t xml:space="preserve">Corollary 1</w:t>
+        </w:r>
+      </w:hyperlink>
+      <w:r>
+        <w:t xml:space="preserve"> </w:t>
+      </w:r>
+      <w:r>
+        <w:t xml:space="preserve">and</w:t>
+      </w:r>
+      <w:r>
+        <w:t xml:space="preserve"> </w:t>
+      </w:r>
+      <w:hyperlink w:anchor="thm-chebyshev">
+        <w:r>
+          <w:rPr>
+            <w:rStyle w:val="Hyperlink"/>
+          </w:rPr>
+          <w:t xml:space="preserve">Theorem 3</w:t>
+        </w:r>
+      </w:hyperlink>
+      <w:r>
+        <w:t xml:space="preserve"> </w:t>
+      </w:r>
+      <w:r>
+        <w:t xml:space="preserve">to show that for every</w:t>
+      </w:r>
+      <w:r>
+        <w:t xml:space="preserve"> </w:t>
+      </w:r>
+      <m:oMath>
+        <m:r>
+          <m:t>ϵ</m:t>
+        </m:r>
+        <m:r>
+          <m:rPr>
+            <m:sty m:val="p"/>
+          </m:rPr>
+          <m:t>&gt;</m:t>
+        </m:r>
+        <m:r>
+          <m:t>0</m:t>
+        </m:r>
+      </m:oMath>
+      <w:r>
+        <w:t xml:space="preserve">,</w:t>
+      </w:r>
+    </w:p>
+    <w:p>
+      <w:pPr>
+        <w:pStyle w:val="BodyText"/>
+      </w:pPr>
+      <m:oMathPara>
+        <m:oMathParaPr>
+          <m:jc m:val="center"/>
+        </m:oMathParaPr>
+        <m:oMath>
+          <m:r>
+            <m:rPr>
+              <m:sty m:val="p"/>
+            </m:rPr>
+            <m:t>Pr</m:t>
+          </m:r>
+          <m:r>
+            <m:t>​</m:t>
+          </m:r>
+          <m:d>
+            <m:dPr>
+              <m:begChr m:val="("/>
+              <m:sepChr m:val=""/>
+              <m:endChr m:val=")"/>
+              <m:grow/>
+            </m:dPr>
+            <m:e>
+              <m:r>
+                <m:t>​</m:t>
+              </m:r>
+              <m:d>
+                <m:dPr>
+                  <m:begChr m:val="|"/>
+                  <m:sepChr m:val=""/>
+                  <m:endChr m:val="|"/>
+                  <m:grow/>
+                </m:dPr>
+                <m:e>
+                  <m:sSub>
+                    <m:e>
+                      <m:acc>
+                        <m:accPr>
+                          <m:chr m:val="‾"/>
+                        </m:accPr>
+                        <m:e>
+                          <m:r>
+                            <m:t>X</m:t>
+                          </m:r>
+                        </m:e>
+                      </m:acc>
+                    </m:e>
+                    <m:sub>
+                      <m:r>
+                        <m:t>n</m:t>
+                      </m:r>
+                    </m:sub>
+                  </m:sSub>
+                  <m:r>
+                    <m:rPr>
+                      <m:sty m:val="p"/>
+                    </m:rPr>
+                    <m:t>−</m:t>
+                  </m:r>
+                  <m:r>
+                    <m:t>μ</m:t>
+                  </m:r>
+                </m:e>
+              </m:d>
+              <m:r>
+                <m:t>​</m:t>
+              </m:r>
+              <m:r>
+                <m:rPr>
+                  <m:sty m:val="p"/>
+                </m:rPr>
+                <m:t>≥</m:t>
+              </m:r>
+              <m:r>
+                <m:t>ϵ</m:t>
+              </m:r>
+            </m:e>
+          </m:d>
+          <m:r>
+            <m:t>​</m:t>
+          </m:r>
+          <m:r>
+            <m:rPr>
+              <m:sty m:val="p"/>
+            </m:rPr>
+            <m:t>≤</m:t>
+          </m:r>
+          <m:f>
+            <m:fPr>
+              <m:type m:val="bar"/>
+            </m:fPr>
+            <m:num>
+              <m:sSup>
+                <m:e>
+                  <m:r>
+                    <m:t>σ</m:t>
+                  </m:r>
+                </m:e>
+                <m:sup>
+                  <m:r>
+                    <m:t>2</m:t>
+                  </m:r>
+                </m:sup>
+              </m:sSup>
+            </m:num>
+            <m:den>
+              <m:r>
+                <m:t>n</m:t>
+              </m:r>
+              <m:sSup>
+                <m:e>
+                  <m:r>
+                    <m:t>ϵ</m:t>
+                  </m:r>
+                </m:e>
+                <m:sup>
+                  <m:r>
+                    <m:t>2</m:t>
+                  </m:r>
+                </m:sup>
+              </m:sSup>
+            </m:den>
+          </m:f>
+        </m:oMath>
+      </m:oMathPara>
+    </w:p>
+    <w:p>
+      <w:pPr>
+        <w:numPr>
+          <w:ilvl w:val="0"/>
+          <w:numId w:val="1001"/>
+        </w:numPr>
+      </w:pPr>
+      <w:r>
+        <w:t xml:space="preserve">Compute</w:t>
+      </w:r>
+      <w:r>
+        <w:t xml:space="preserve"> </w:t>
+      </w:r>
+      <m:oMath>
+        <m:sSup>
+          <m:e>
+            <m:r>
+              <m:t>σ</m:t>
+            </m:r>
+          </m:e>
+          <m:sup>
+            <m:r>
+              <m:t>2</m:t>
+            </m:r>
+          </m:sup>
+        </m:sSup>
+      </m:oMath>
+      <w:r>
+        <w:t xml:space="preserve"> </w:t>
+      </w:r>
+      <w:r>
+        <w:t xml:space="preserve">for the</w:t>
+      </w:r>
+      <w:r>
+        <w:t xml:space="preserve"> </w:t>
+      </w:r>
+      <w:r>
+        <w:rPr>
+          <w:rStyle w:val="VerbatimChar"/>
+        </w:rPr>
+        <w:t xml:space="preserve">mpg</w:t>
+      </w:r>
+      <w:r>
+        <w:t xml:space="preserve"> </w:t>
+      </w:r>
+      <w:r>
+        <w:t xml:space="preserve">column of</w:t>
+      </w:r>
+      <w:r>
+        <w:t xml:space="preserve"> </w:t>
+      </w:r>
+      <w:hyperlink r:id="rId29">
+        <w:r>
+          <w:rPr>
+            <w:rStyle w:val="VerbatimChar"/>
+          </w:rPr>
+          <w:t xml:space="preserve">data/auto.csv</w:t>
+        </w:r>
+      </w:hyperlink>
+      <w:r>
+        <w:t xml:space="preserve">,</w:t>
+      </w:r>
+      <w:r>
+        <w:t xml:space="preserve"> </w:t>
+      </w:r>
+      <w:r>
+        <w:t xml:space="preserve">treating the 392 cars as the whole population.</w:t>
+      </w:r>
+      <w:r>
+        <w:t xml:space="preserve"> </w:t>
+      </w:r>
+      <w:r>
+        <w:t xml:space="preserve">Find the smallest</w:t>
+      </w:r>
+      <w:r>
+        <w:t xml:space="preserve"> </w:t>
+      </w:r>
+      <m:oMath>
+        <m:r>
+          <m:t>n</m:t>
+        </m:r>
+      </m:oMath>
+      <w:r>
+        <w:t xml:space="preserve"> </w:t>
+      </w:r>
+      <w:r>
+        <w:t xml:space="preserve">for which the bound in (a) guarantees</w:t>
+      </w:r>
+      <w:r>
+        <w:t xml:space="preserve"> </w:t>
+      </w:r>
+      <m:oMath>
+        <m:r>
+          <m:rPr>
+            <m:sty m:val="p"/>
+          </m:rPr>
+          <m:t>Pr</m:t>
+        </m:r>
+        <m:r>
+          <m:t>​</m:t>
+        </m:r>
+        <m:d>
+          <m:dPr>
+            <m:begChr m:val="("/>
+            <m:sepChr m:val=""/>
+            <m:endChr m:val=")"/>
+            <m:grow/>
+          </m:dPr>
+          <m:e>
+            <m:r>
+              <m:t>​</m:t>
+            </m:r>
+            <m:d>
+              <m:dPr>
+                <m:begChr m:val="|"/>
+                <m:sepChr m:val=""/>
+                <m:endChr m:val="|"/>
+                <m:grow/>
+              </m:dPr>
+              <m:e>
+                <m:sSub>
+                  <m:e>
+                    <m:acc>
+                      <m:accPr>
+                        <m:chr m:val="‾"/>
+                      </m:accPr>
+                      <m:e>
+                        <m:r>
+                          <m:t>X</m:t>
+                        </m:r>
+                      </m:e>
+                    </m:acc>
+                  </m:e>
+                  <m:sub>
+                    <m:r>
+                      <m:t>n</m:t>
+                    </m:r>
+                  </m:sub>
+                </m:sSub>
+                <m:r>
+                  <m:rPr>
+                    <m:sty m:val="p"/>
+                  </m:rPr>
+                  <m:t>−</m:t>
+                </m:r>
+                <m:r>
+                  <m:t>μ</m:t>
+                </m:r>
+              </m:e>
+            </m:d>
+            <m:r>
+              <m:t>​</m:t>
+            </m:r>
+            <m:r>
+              <m:rPr>
+                <m:sty m:val="p"/>
+              </m:rPr>
+              <m:t>≥</m:t>
+            </m:r>
+            <m:r>
+              <m:t>1</m:t>
+            </m:r>
+          </m:e>
+        </m:d>
+        <m:r>
+          <m:t>​</m:t>
+        </m:r>
+        <m:r>
+          <m:rPr>
+            <m:sty m:val="p"/>
+          </m:rPr>
+          <m:t>≤</m:t>
+        </m:r>
+        <m:r>
+          <m:t>0.05</m:t>
+        </m:r>
+      </m:oMath>
+      <w:r>
+        <w:t xml:space="preserve">.</w:t>
+      </w:r>
+    </w:p>
+    <w:p>
+      <w:pPr>
+        <w:numPr>
+          <w:ilvl w:val="0"/>
+          <w:numId w:val="1001"/>
+        </w:numPr>
+      </w:pPr>
+      <w:r>
+        <w:t xml:space="preserve">Simulate 10,000 samples of that size drawn with replacement,</w:t>
+      </w:r>
+      <w:r>
+        <w:t xml:space="preserve"> </w:t>
+      </w:r>
+      <w:r>
+        <w:t xml:space="preserve">and count how many sample means miss</w:t>
+      </w:r>
+      <w:r>
+        <w:t xml:space="preserve"> </w:t>
+      </w:r>
+      <m:oMath>
+        <m:r>
+          <m:t>μ</m:t>
+        </m:r>
+      </m:oMath>
+      <w:r>
+        <w:t xml:space="preserve"> </w:t>
+      </w:r>
+      <w:r>
+        <w:t xml:space="preserve">by 1 or more.</w:t>
+      </w:r>
+      <w:r>
+        <w:t xml:space="preserve"> </w:t>
+      </w:r>
+      <w:r>
+        <w:t xml:space="preserve">Why is the count so far below the 5% the bound allows?</w:t>
+      </w:r>
+    </w:p>
+    <w:bookmarkEnd w:id="41"/>
+    <w:bookmarkStart w:id="42" w:name="sol-chebyshev-sample-size"/>
+    <w:p>
+      <w:pPr>
+        <w:pStyle w:val="FirstParagraph"/>
+      </w:pPr>
+      <w:r>
+        <w:rPr>
+          <w:i/>
+          <w:iCs/>
+        </w:rPr>
+        <w:t xml:space="preserve">Solution 1</w:t>
+      </w:r>
+      <w:r>
+        <w:t xml:space="preserve">. </w:t>
+      </w:r>
+    </w:p>
+    <w:p>
+      <w:pPr>
+        <w:numPr>
+          <w:ilvl w:val="0"/>
+          <w:numId w:val="1002"/>
+        </w:numPr>
+      </w:pPr>
+      <w:r>
+        <w:t xml:space="preserve">By</w:t>
+      </w:r>
+      <w:r>
+        <w:t xml:space="preserve"> </w:t>
+      </w:r>
+      <w:hyperlink w:anchor="cor-sum-iid-moments">
+        <w:r>
+          <w:rPr>
+            <w:rStyle w:val="Hyperlink"/>
+          </w:rPr>
+          <w:t xml:space="preserve">Corollary 1</w:t>
+        </w:r>
+      </w:hyperlink>
+      <w:r>
+        <w:t xml:space="preserve">,</w:t>
+      </w:r>
+      <w:r>
+        <w:t xml:space="preserve"> </w:t>
+      </w:r>
+      <m:oMath>
+        <m:r>
+          <m:rPr>
+            <m:sty m:val="p"/>
+          </m:rPr>
+          <m:t>Var</m:t>
+        </m:r>
+        <m:r>
+          <m:t>​</m:t>
+        </m:r>
+        <m:d>
+          <m:dPr>
+            <m:begChr m:val="("/>
+            <m:sepChr m:val=""/>
+            <m:endChr m:val=")"/>
+            <m:grow/>
+          </m:dPr>
+          <m:e>
+            <m:sSub>
+              <m:e>
+                <m:r>
+                  <m:t>S</m:t>
+                </m:r>
+              </m:e>
+              <m:sub>
+                <m:r>
+                  <m:t>n</m:t>
+                </m:r>
+              </m:sub>
+            </m:sSub>
+          </m:e>
+        </m:d>
+        <m:r>
+          <m:t>​</m:t>
+        </m:r>
+        <m:r>
+          <m:rPr>
+            <m:sty m:val="p"/>
+          </m:rPr>
+          <m:t>=</m:t>
+        </m:r>
+        <m:r>
+          <m:t>n</m:t>
+        </m:r>
+        <m:sSup>
+          <m:e>
+            <m:r>
+              <m:t>σ</m:t>
+            </m:r>
+          </m:e>
+          <m:sup>
+            <m:r>
+              <m:t>2</m:t>
+            </m:r>
+          </m:sup>
+        </m:sSup>
+      </m:oMath>
+      <w:r>
+        <w:t xml:space="preserve"> </w:t>
+      </w:r>
+      <w:r>
+        <w:t xml:space="preserve">for</w:t>
+      </w:r>
+      <w:r>
+        <w:t xml:space="preserve"> </w:t>
+      </w:r>
+      <m:oMath>
+        <m:sSub>
+          <m:e>
+            <m:r>
+              <m:t>S</m:t>
+            </m:r>
+          </m:e>
+          <m:sub>
+            <m:r>
+              <m:t>n</m:t>
+            </m:r>
+          </m:sub>
+        </m:sSub>
+        <m:limUpp>
+          <m:e>
+            <m:r>
+              <m:rPr>
+                <m:sty m:val="p"/>
+              </m:rPr>
+              <m:t>=</m:t>
+            </m:r>
+          </m:e>
+          <m:lim>
+            <m:r>
+              <m:rPr>
+                <m:nor/>
+                <m:sty m:val="p"/>
+              </m:rPr>
+              <m:t>def</m:t>
+            </m:r>
+          </m:lim>
+        </m:limUpp>
+        <m:nary>
+          <m:naryPr>
+            <m:chr m:val="∑"/>
+            <m:limLoc m:val="undOvr"/>
+            <m:subHide m:val="off"/>
+            <m:supHide m:val="off"/>
+          </m:naryPr>
+          <m:sub>
+            <m:r>
+              <m:t>i</m:t>
+            </m:r>
+            <m:r>
+              <m:rPr>
+                <m:sty m:val="p"/>
+              </m:rPr>
+              <m:t>=</m:t>
+            </m:r>
+            <m:r>
+              <m:t>1</m:t>
+            </m:r>
+          </m:sub>
+          <m:sup>
+            <m:r>
+              <m:t>n</m:t>
+            </m:r>
+          </m:sup>
+          <m:e>
+            <m:sSub>
+              <m:e>
+                <m:r>
+                  <m:t>X</m:t>
+                </m:r>
+              </m:e>
+              <m:sub>
+                <m:r>
+                  <m:t>i</m:t>
+                </m:r>
+              </m:sub>
+            </m:sSub>
+          </m:e>
+        </m:nary>
+      </m:oMath>
+      <w:r>
+        <w:t xml:space="preserve">,</w:t>
+      </w:r>
+      <w:r>
+        <w:t xml:space="preserve"> </w:t>
+      </w:r>
+      <w:r>
+        <w:t xml:space="preserve">so</w:t>
+      </w:r>
+      <w:r>
+        <w:t xml:space="preserve"> </w:t>
+      </w:r>
+      <m:oMath>
+        <m:sSub>
+          <m:e>
+            <m:acc>
+              <m:accPr>
+                <m:chr m:val="‾"/>
+              </m:accPr>
+              <m:e>
+                <m:r>
+                  <m:t>X</m:t>
+                </m:r>
+              </m:e>
+            </m:acc>
+          </m:e>
+          <m:sub>
+            <m:r>
+              <m:t>n</m:t>
+            </m:r>
+          </m:sub>
+        </m:sSub>
+        <m:r>
+          <m:rPr>
+            <m:sty m:val="p"/>
+          </m:rPr>
+          <m:t>=</m:t>
+        </m:r>
+        <m:sSub>
+          <m:e>
+            <m:r>
+              <m:t>S</m:t>
+            </m:r>
+          </m:e>
+          <m:sub>
+            <m:r>
+              <m:t>n</m:t>
+            </m:r>
+          </m:sub>
+        </m:sSub>
+        <m:r>
+          <m:rPr>
+            <m:sty m:val="p"/>
+          </m:rPr>
+          <m:t>/</m:t>
+        </m:r>
+        <m:r>
+          <m:t>n</m:t>
+        </m:r>
+      </m:oMath>
+      <w:r>
+        <w:t xml:space="preserve"> </w:t>
+      </w:r>
+      <w:r>
+        <w:t xml:space="preserve">has mean</w:t>
+      </w:r>
+      <w:r>
+        <w:t xml:space="preserve"> </w:t>
+      </w:r>
+      <m:oMath>
+        <m:r>
+          <m:t>μ</m:t>
+        </m:r>
+      </m:oMath>
+      <w:r>
+        <w:t xml:space="preserve"> </w:t>
+      </w:r>
+      <w:r>
+        <w:t xml:space="preserve">and variance</w:t>
+      </w:r>
+      <w:r>
+        <w:t xml:space="preserve"> </w:t>
+      </w:r>
+      <m:oMath>
+        <m:sSup>
+          <m:e>
+            <m:r>
+              <m:t>σ</m:t>
+            </m:r>
+          </m:e>
+          <m:sup>
+            <m:r>
+              <m:t>2</m:t>
+            </m:r>
+          </m:sup>
+        </m:sSup>
+        <m:r>
+          <m:rPr>
+            <m:sty m:val="p"/>
+          </m:rPr>
+          <m:t>/</m:t>
+        </m:r>
+        <m:r>
+          <m:t>n</m:t>
+        </m:r>
+      </m:oMath>
+      <w:r>
+        <w:t xml:space="preserve"> </w:t>
+      </w:r>
+      <w:r>
+        <w:t xml:space="preserve">(a constant factor</w:t>
+      </w:r>
+      <w:r>
+        <w:t xml:space="preserve"> </w:t>
+      </w:r>
+      <m:oMath>
+        <m:r>
+          <m:t>c</m:t>
+        </m:r>
+      </m:oMath>
+      <w:r>
+        <w:t xml:space="preserve"> </w:t>
+      </w:r>
+      <w:r>
+        <w:t xml:space="preserve">scales a variance by</w:t>
+      </w:r>
+      <w:r>
+        <w:t xml:space="preserve"> </w:t>
+      </w:r>
+      <m:oMath>
+        <m:sSup>
+          <m:e>
+            <m:r>
+              <m:t>c</m:t>
+            </m:r>
+          </m:e>
+          <m:sup>
+            <m:r>
+              <m:t>2</m:t>
+            </m:r>
+          </m:sup>
+        </m:sSup>
+      </m:oMath>
+      <w:r>
+        <w:t xml:space="preserve">).</w:t>
+      </w:r>
+      <w:r>
+        <w:t xml:space="preserve"> </w:t>
+      </w:r>
+      <w:r>
+        <w:t xml:space="preserve">Apply</w:t>
+      </w:r>
+      <w:r>
+        <w:t xml:space="preserve"> </w:t>
+      </w:r>
+      <w:hyperlink w:anchor="thm-chebyshev">
+        <w:r>
+          <w:rPr>
+            <w:rStyle w:val="Hyperlink"/>
+          </w:rPr>
+          <w:t xml:space="preserve">Theorem 3</w:t>
+        </w:r>
+      </w:hyperlink>
+      <w:r>
+        <w:t xml:space="preserve"> </w:t>
+      </w:r>
+      <w:r>
+        <w:t xml:space="preserve">to</w:t>
+      </w:r>
+      <w:r>
+        <w:t xml:space="preserve"> </w:t>
+      </w:r>
+      <m:oMath>
+        <m:sSub>
+          <m:e>
+            <m:acc>
+              <m:accPr>
+                <m:chr m:val="‾"/>
+              </m:accPr>
+              <m:e>
+                <m:r>
+                  <m:t>X</m:t>
+                </m:r>
+              </m:e>
+            </m:acc>
+          </m:e>
+          <m:sub>
+            <m:r>
+              <m:t>n</m:t>
+            </m:r>
+          </m:sub>
+        </m:sSub>
+      </m:oMath>
+      <w:r>
+        <w:t xml:space="preserve"> </w:t>
+      </w:r>
+      <w:r>
+        <w:t xml:space="preserve">with</w:t>
+      </w:r>
+      <w:r>
+        <w:t xml:space="preserve"> </w:t>
+      </w:r>
+      <m:oMath>
+        <m:r>
+          <m:t>k</m:t>
+        </m:r>
+        <m:r>
+          <m:t>σ</m:t>
+        </m:r>
+        <m:r>
+          <m:rPr>
+            <m:sty m:val="p"/>
+          </m:rPr>
+          <m:t>/</m:t>
+        </m:r>
+        <m:rad>
+          <m:radPr>
+            <m:degHide m:val="on"/>
+          </m:radPr>
+          <m:deg/>
+          <m:e>
+            <m:r>
+              <m:t>n</m:t>
+            </m:r>
+          </m:e>
+        </m:rad>
+        <m:r>
+          <m:rPr>
+            <m:sty m:val="p"/>
+          </m:rPr>
+          <m:t>=</m:t>
+        </m:r>
+        <m:r>
+          <m:t>ϵ</m:t>
+        </m:r>
+      </m:oMath>
+      <w:r>
+        <w:t xml:space="preserve">,</w:t>
+      </w:r>
+      <w:r>
+        <w:t xml:space="preserve"> </w:t>
+      </w:r>
+      <w:r>
+        <w:t xml:space="preserve">that is,</w:t>
+      </w:r>
+      <w:r>
+        <w:t xml:space="preserve"> </w:t>
+      </w:r>
+      <m:oMath>
+        <m:r>
+          <m:t>k</m:t>
+        </m:r>
+        <m:r>
+          <m:rPr>
+            <m:sty m:val="p"/>
+          </m:rPr>
+          <m:t>=</m:t>
+        </m:r>
+        <m:r>
+          <m:t>ϵ</m:t>
+        </m:r>
+        <m:rad>
+          <m:radPr>
+            <m:degHide m:val="on"/>
+          </m:radPr>
+          <m:deg/>
+          <m:e>
+            <m:r>
+              <m:t>n</m:t>
+            </m:r>
+          </m:e>
+        </m:rad>
+        <m:r>
+          <m:rPr>
+            <m:sty m:val="p"/>
+          </m:rPr>
+          <m:t>/</m:t>
+        </m:r>
+        <m:r>
+          <m:t>σ</m:t>
+        </m:r>
+      </m:oMath>
+      <w:r>
+        <w:t xml:space="preserve">, so</w:t>
+      </w:r>
+      <w:r>
+        <w:t xml:space="preserve"> </w:t>
+      </w:r>
+      <m:oMath>
+        <m:r>
+          <m:t>1</m:t>
+        </m:r>
+        <m:r>
+          <m:rPr>
+            <m:sty m:val="p"/>
+          </m:rPr>
+          <m:t>/</m:t>
+        </m:r>
+        <m:sSup>
+          <m:e>
+            <m:r>
+              <m:t>k</m:t>
+            </m:r>
+          </m:e>
+          <m:sup>
+            <m:r>
+              <m:t>2</m:t>
+            </m:r>
+          </m:sup>
+        </m:sSup>
+        <m:r>
+          <m:rPr>
+            <m:sty m:val="p"/>
+          </m:rPr>
+          <m:t>=</m:t>
+        </m:r>
+        <m:sSup>
+          <m:e>
+            <m:r>
+              <m:t>σ</m:t>
+            </m:r>
+          </m:e>
+          <m:sup>
+            <m:r>
+              <m:t>2</m:t>
+            </m:r>
+          </m:sup>
+        </m:sSup>
+        <m:r>
+          <m:rPr>
+            <m:sty m:val="p"/>
+          </m:rPr>
+          <m:t>/</m:t>
+        </m:r>
+        <m:r>
+          <m:rPr>
+            <m:sty m:val="p"/>
+          </m:rPr>
+          <m:t>(</m:t>
+        </m:r>
+        <m:r>
+          <m:t>n</m:t>
+        </m:r>
+        <m:sSup>
+          <m:e>
+            <m:r>
+              <m:t>ϵ</m:t>
+            </m:r>
+          </m:e>
+          <m:sup>
+            <m:r>
+              <m:t>2</m:t>
+            </m:r>
+          </m:sup>
+        </m:sSup>
+        <m:r>
+          <m:rPr>
+            <m:sty m:val="p"/>
+          </m:rPr>
+          <m:t>)</m:t>
+        </m:r>
+      </m:oMath>
+      <w:r>
+        <w:t xml:space="preserve">.</w:t>
+      </w:r>
+    </w:p>
+    <w:p>
+      <w:pPr>
+        <w:numPr>
+          <w:ilvl w:val="0"/>
+          <w:numId w:val="1002"/>
+        </w:numPr>
+      </w:pPr>
+      <w:r>
+        <w:t xml:space="preserve">Setting</w:t>
+      </w:r>
+      <w:r>
+        <w:t xml:space="preserve"> </w:t>
+      </w:r>
+      <m:oMath>
+        <m:sSup>
+          <m:e>
+            <m:r>
+              <m:t>σ</m:t>
+            </m:r>
+          </m:e>
+          <m:sup>
+            <m:r>
+              <m:t>2</m:t>
+            </m:r>
+          </m:sup>
+        </m:sSup>
+        <m:r>
+          <m:rPr>
+            <m:sty m:val="p"/>
+          </m:rPr>
+          <m:t>/</m:t>
+        </m:r>
+        <m:r>
+          <m:rPr>
+            <m:sty m:val="p"/>
+          </m:rPr>
+          <m:t>(</m:t>
+        </m:r>
+        <m:r>
+          <m:t>n</m:t>
+        </m:r>
+        <m:r>
+          <m:rPr>
+            <m:sty m:val="p"/>
+          </m:rPr>
+          <m:t>⋅</m:t>
+        </m:r>
+        <m:sSup>
+          <m:e>
+            <m:r>
+              <m:t>1</m:t>
+            </m:r>
+          </m:e>
+          <m:sup>
+            <m:r>
+              <m:t>2</m:t>
+            </m:r>
+          </m:sup>
+        </m:sSup>
+        <m:r>
+          <m:rPr>
+            <m:sty m:val="p"/>
+          </m:rPr>
+          <m:t>)</m:t>
+        </m:r>
+        <m:r>
+          <m:rPr>
+            <m:sty m:val="p"/>
+          </m:rPr>
+          <m:t>≤</m:t>
+        </m:r>
+        <m:r>
+          <m:t>0.05</m:t>
+        </m:r>
+      </m:oMath>
+      <w:r>
+        <w:t xml:space="preserve"> </w:t>
+      </w:r>
+      <w:r>
+        <w:t xml:space="preserve">gives</w:t>
+      </w:r>
+      <w:r>
+        <w:t xml:space="preserve"> </w:t>
+      </w:r>
+      <m:oMath>
+        <m:r>
+          <m:t>n</m:t>
+        </m:r>
+        <m:r>
+          <m:rPr>
+            <m:sty m:val="p"/>
+          </m:rPr>
+          <m:t>≥</m:t>
+        </m:r>
+        <m:r>
+          <m:t>20</m:t>
+        </m:r>
+        <m:sSup>
+          <m:e>
+            <m:r>
+              <m:t>σ</m:t>
+            </m:r>
+          </m:e>
+          <m:sup>
+            <m:r>
+              <m:t>2</m:t>
+            </m:r>
+          </m:sup>
+        </m:sSup>
+      </m:oMath>
+      <w:r>
+        <w:t xml:space="preserve">.</w:t>
+      </w:r>
+    </w:p>
+    <w:p>
+      <w:pPr>
+        <w:numPr>
+          <w:ilvl w:val="0"/>
+          <w:numId w:val="1002"/>
+        </w:numPr>
+      </w:pPr>
+      <w:r>
+        <w:t xml:space="preserve">See the code below.</w:t>
+      </w:r>
+    </w:p>
+    <w:p>
+      <w:pPr>
+        <w:pStyle w:val="SourceCode"/>
+      </w:pPr>
+      <w:r>
+        <w:rPr>
+          <w:rStyle w:val="NormalTok"/>
+        </w:rPr>
+        <w:t xml:space="preserve">mpg </w:t>
+      </w:r>
+      <w:r>
+        <w:rPr>
+          <w:rStyle w:val="OtherTok"/>
+        </w:rPr>
+        <w:t xml:space="preserve">&lt;-</w:t>
+      </w:r>
+      <w:r>
+        <w:rPr>
+          <w:rStyle w:val="NormalTok"/>
+        </w:rPr>
+        <w:t xml:space="preserve"> </w:t>
+      </w:r>
+      <w:r>
+        <w:rPr>
+          <w:rStyle w:val="FunctionTok"/>
+        </w:rPr>
+        <w:t xml:space="preserve">read.csv</w:t>
+      </w:r>
+      <w:r>
+        <w:rPr>
+          <w:rStyle w:val="NormalTok"/>
+        </w:rPr>
+        <w:t xml:space="preserve">(</w:t>
+      </w:r>
+      <w:r>
+        <w:rPr>
+          <w:rStyle w:val="StringTok"/>
+        </w:rPr>
+        <w:t xml:space="preserve">"data/auto.csv"</w:t>
+      </w:r>
+      <w:r>
+        <w:rPr>
+          <w:rStyle w:val="NormalTok"/>
+        </w:rPr>
+        <w:t xml:space="preserve">)</w:t>
+      </w:r>
+      <w:r>
+        <w:rPr>
+          <w:rStyle w:val="SpecialCharTok"/>
+        </w:rPr>
+        <w:t xml:space="preserve">$</w:t>
+      </w:r>
+      <w:r>
+        <w:rPr>
+          <w:rStyle w:val="NormalTok"/>
+        </w:rPr>
+        <w:t xml:space="preserve">mpg</w:t>
+      </w:r>
+      <w:r>
+        <w:br/>
+      </w:r>
+      <w:r>
+        <w:rPr>
+          <w:rStyle w:val="NormalTok"/>
+        </w:rPr>
+        <w:t xml:space="preserve">mu </w:t>
+      </w:r>
+      <w:r>
+        <w:rPr>
+          <w:rStyle w:val="OtherTok"/>
+        </w:rPr>
+        <w:t xml:space="preserve">&lt;-</w:t>
+      </w:r>
+      <w:r>
+        <w:rPr>
+          <w:rStyle w:val="NormalTok"/>
+        </w:rPr>
+        <w:t xml:space="preserve"> </w:t>
+      </w:r>
+      <w:r>
+        <w:rPr>
+          <w:rStyle w:val="FunctionTok"/>
+        </w:rPr>
+        <w:t xml:space="preserve">mean</w:t>
+      </w:r>
+      <w:r>
+        <w:rPr>
+          <w:rStyle w:val="NormalTok"/>
+        </w:rPr>
+        <w:t xml:space="preserve">(mpg)</w:t>
+      </w:r>
+      <w:r>
+        <w:br/>
+      </w:r>
+      <w:r>
+        <w:rPr>
+          <w:rStyle w:val="NormalTok"/>
+        </w:rPr>
+        <w:t xml:space="preserve">sigma2 </w:t>
+      </w:r>
+      <w:r>
+        <w:rPr>
+          <w:rStyle w:val="OtherTok"/>
+        </w:rPr>
+        <w:t xml:space="preserve">&lt;-</w:t>
+      </w:r>
+      <w:r>
+        <w:rPr>
+          <w:rStyle w:val="NormalTok"/>
+        </w:rPr>
+        <w:t xml:space="preserve"> </w:t>
+      </w:r>
+      <w:r>
+        <w:rPr>
+          <w:rStyle w:val="FunctionTok"/>
+        </w:rPr>
+        <w:t xml:space="preserve">mean</w:t>
+      </w:r>
+      <w:r>
+        <w:rPr>
+          <w:rStyle w:val="NormalTok"/>
+        </w:rPr>
+        <w:t xml:space="preserve">((mpg </w:t>
+      </w:r>
+      <w:r>
+        <w:rPr>
+          <w:rStyle w:val="SpecialCharTok"/>
+        </w:rPr>
+        <w:t xml:space="preserve">-</w:t>
+      </w:r>
+      <w:r>
+        <w:rPr>
+          <w:rStyle w:val="NormalTok"/>
+        </w:rPr>
+        <w:t xml:space="preserve"> mu)</w:t>
+      </w:r>
+      <w:r>
+        <w:rPr>
+          <w:rStyle w:val="SpecialCharTok"/>
+        </w:rPr>
+        <w:t xml:space="preserve">^</w:t>
+      </w:r>
+      <w:r>
+        <w:rPr>
+          <w:rStyle w:val="DecValTok"/>
+        </w:rPr>
+        <w:t xml:space="preserve">2</w:t>
+      </w:r>
+      <w:r>
+        <w:rPr>
+          <w:rStyle w:val="NormalTok"/>
+        </w:rPr>
+        <w:t xml:space="preserve">)</w:t>
+      </w:r>
+      <w:r>
+        <w:br/>
+      </w:r>
+      <w:r>
+        <w:rPr>
+          <w:rStyle w:val="NormalTok"/>
+        </w:rPr>
+        <w:t xml:space="preserve">n_min </w:t>
+      </w:r>
+      <w:r>
+        <w:rPr>
+          <w:rStyle w:val="OtherTok"/>
+        </w:rPr>
+        <w:t xml:space="preserve">&lt;-</w:t>
+      </w:r>
+      <w:r>
+        <w:rPr>
+          <w:rStyle w:val="NormalTok"/>
+        </w:rPr>
+        <w:t xml:space="preserve"> </w:t>
+      </w:r>
+      <w:r>
+        <w:rPr>
+          <w:rStyle w:val="FunctionTok"/>
+        </w:rPr>
+        <w:t xml:space="preserve">ceiling</w:t>
+      </w:r>
+      <w:r>
+        <w:rPr>
+          <w:rStyle w:val="NormalTok"/>
+        </w:rPr>
+        <w:t xml:space="preserve">(</w:t>
+      </w:r>
+      <w:r>
+        <w:rPr>
+          <w:rStyle w:val="DecValTok"/>
+        </w:rPr>
+        <w:t xml:space="preserve">20</w:t>
+      </w:r>
+      <w:r>
+        <w:rPr>
+          <w:rStyle w:val="NormalTok"/>
+        </w:rPr>
+        <w:t xml:space="preserve"> </w:t>
+      </w:r>
+      <w:r>
+        <w:rPr>
+          <w:rStyle w:val="SpecialCharTok"/>
+        </w:rPr>
+        <w:t xml:space="preserve">*</w:t>
+      </w:r>
+      <w:r>
+        <w:rPr>
+          <w:rStyle w:val="NormalTok"/>
+        </w:rPr>
+        <w:t xml:space="preserve"> sigma2)</w:t>
+      </w:r>
+      <w:r>
+        <w:br/>
+      </w:r>
+      <w:r>
+        <w:br/>
+      </w:r>
+      <w:r>
+        <w:rPr>
+          <w:rStyle w:val="FunctionTok"/>
+        </w:rPr>
+        <w:t xml:space="preserve">set.seed</w:t>
+      </w:r>
+      <w:r>
+        <w:rPr>
+          <w:rStyle w:val="NormalTok"/>
+        </w:rPr>
+        <w:t xml:space="preserve">(</w:t>
+      </w:r>
+      <w:r>
+        <w:rPr>
+          <w:rStyle w:val="DecValTok"/>
+        </w:rPr>
+        <w:t xml:space="preserve">571</w:t>
+      </w:r>
+      <w:r>
+        <w:rPr>
+          <w:rStyle w:val="NormalTok"/>
+        </w:rPr>
+        <w:t xml:space="preserve">)</w:t>
+      </w:r>
+      <w:r>
+        <w:br/>
+      </w:r>
+      <w:r>
+        <w:rPr>
+          <w:rStyle w:val="NormalTok"/>
+        </w:rPr>
+        <w:t xml:space="preserve">xbar </w:t>
+      </w:r>
+      <w:r>
+        <w:rPr>
+          <w:rStyle w:val="OtherTok"/>
+        </w:rPr>
+        <w:t xml:space="preserve">&lt;-</w:t>
+      </w:r>
+      <w:r>
+        <w:rPr>
+          <w:rStyle w:val="NormalTok"/>
+        </w:rPr>
+        <w:t xml:space="preserve"> </w:t>
+      </w:r>
+      <w:r>
+        <w:rPr>
+          <w:rStyle w:val="FunctionTok"/>
+        </w:rPr>
+        <w:t xml:space="preserve">replicate</w:t>
+      </w:r>
+      <w:r>
+        <w:rPr>
+          <w:rStyle w:val="NormalTok"/>
+        </w:rPr>
+        <w:t xml:space="preserve">(</w:t>
+      </w:r>
+      <w:r>
+        <w:rPr>
+          <w:rStyle w:val="DecValTok"/>
+        </w:rPr>
+        <w:t xml:space="preserve">10000</w:t>
+      </w:r>
+      <w:r>
+        <w:rPr>
+          <w:rStyle w:val="NormalTok"/>
+        </w:rPr>
+        <w:t xml:space="preserve">, </w:t>
+      </w:r>
+      <w:r>
+        <w:rPr>
+          <w:rStyle w:val="FunctionTok"/>
+        </w:rPr>
+        <w:t xml:space="preserve">mean</w:t>
+      </w:r>
+      <w:r>
+        <w:rPr>
+          <w:rStyle w:val="NormalTok"/>
+        </w:rPr>
+        <w:t xml:space="preserve">(</w:t>
+      </w:r>
+      <w:r>
+        <w:rPr>
+          <w:rStyle w:val="FunctionTok"/>
+        </w:rPr>
+        <w:t xml:space="preserve">sample</w:t>
+      </w:r>
+      <w:r>
+        <w:rPr>
+          <w:rStyle w:val="NormalTok"/>
+        </w:rPr>
+        <w:t xml:space="preserve">(mpg, n_min, </w:t>
+      </w:r>
+      <w:r>
+        <w:rPr>
+          <w:rStyle w:val="AttributeTok"/>
+        </w:rPr>
+        <w:t xml:space="preserve">replace =</w:t>
+      </w:r>
+      <w:r>
+        <w:rPr>
+          <w:rStyle w:val="NormalTok"/>
+        </w:rPr>
+        <w:t xml:space="preserve"> </w:t>
+      </w:r>
+      <w:r>
+        <w:rPr>
+          <w:rStyle w:val="ConstantTok"/>
+        </w:rPr>
+        <w:t xml:space="preserve">TRUE</w:t>
+      </w:r>
+      <w:r>
+        <w:rPr>
+          <w:rStyle w:val="NormalTok"/>
+        </w:rPr>
+        <w:t xml:space="preserve">)))</w:t>
+      </w:r>
+      <w:r>
+        <w:br/>
+      </w:r>
+      <w:r>
+        <w:rPr>
+          <w:rStyle w:val="NormalTok"/>
+        </w:rPr>
+        <w:t xml:space="preserve">misses </w:t>
+      </w:r>
+      <w:r>
+        <w:rPr>
+          <w:rStyle w:val="OtherTok"/>
+        </w:rPr>
+        <w:t xml:space="preserve">&lt;-</w:t>
+      </w:r>
+      <w:r>
+        <w:rPr>
+          <w:rStyle w:val="NormalTok"/>
+        </w:rPr>
+        <w:t xml:space="preserve"> </w:t>
+      </w:r>
+      <w:r>
+        <w:rPr>
+          <w:rStyle w:val="FunctionTok"/>
+        </w:rPr>
+        <w:t xml:space="preserve">sum</w:t>
+      </w:r>
+      <w:r>
+        <w:rPr>
+          <w:rStyle w:val="NormalTok"/>
+        </w:rPr>
+        <w:t xml:space="preserve">(</w:t>
+      </w:r>
+      <w:r>
+        <w:rPr>
+          <w:rStyle w:val="FunctionTok"/>
+        </w:rPr>
+        <w:t xml:space="preserve">abs</w:t>
+      </w:r>
+      <w:r>
+        <w:rPr>
+          <w:rStyle w:val="NormalTok"/>
+        </w:rPr>
+        <w:t xml:space="preserve">(xbar </w:t>
+      </w:r>
+      <w:r>
+        <w:rPr>
+          <w:rStyle w:val="SpecialCharTok"/>
+        </w:rPr>
+        <w:t xml:space="preserve">-</w:t>
+      </w:r>
+      <w:r>
+        <w:rPr>
+          <w:rStyle w:val="NormalTok"/>
+        </w:rPr>
+        <w:t xml:space="preserve"> mu) </w:t>
+      </w:r>
+      <w:r>
+        <w:rPr>
+          <w:rStyle w:val="SpecialCharTok"/>
+        </w:rPr>
+        <w:t xml:space="preserve">&gt;=</w:t>
+      </w:r>
+      <w:r>
+        <w:rPr>
+          <w:rStyle w:val="NormalTok"/>
+        </w:rPr>
+        <w:t xml:space="preserve"> </w:t>
+      </w:r>
+      <w:r>
+        <w:rPr>
+          <w:rStyle w:val="DecValTok"/>
+        </w:rPr>
+        <w:t xml:space="preserve">1</w:t>
+      </w:r>
+      <w:r>
+        <w:rPr>
+          <w:rStyle w:val="NormalTok"/>
+        </w:rPr>
+        <w:t xml:space="preserve">)</w:t>
+      </w:r>
+      <w:r>
+        <w:br/>
+      </w:r>
+      <w:r>
+        <w:rPr>
+          <w:rStyle w:val="NormalTok"/>
+        </w:rPr>
+        <w:t xml:space="preserve">normal_approx </w:t>
+      </w:r>
+      <w:r>
+        <w:rPr>
+          <w:rStyle w:val="OtherTok"/>
+        </w:rPr>
+        <w:t xml:space="preserve">&lt;-</w:t>
+      </w:r>
+      <w:r>
+        <w:rPr>
+          <w:rStyle w:val="NormalTok"/>
+        </w:rPr>
+        <w:t xml:space="preserve"> </w:t>
+      </w:r>
+      <w:r>
+        <w:rPr>
+          <w:rStyle w:val="DecValTok"/>
+        </w:rPr>
+        <w:t xml:space="preserve">2</w:t>
+      </w:r>
+      <w:r>
+        <w:rPr>
+          <w:rStyle w:val="NormalTok"/>
+        </w:rPr>
+        <w:t xml:space="preserve"> </w:t>
+      </w:r>
+      <w:r>
+        <w:rPr>
+          <w:rStyle w:val="SpecialCharTok"/>
+        </w:rPr>
+        <w:t xml:space="preserve">*</w:t>
+      </w:r>
+      <w:r>
+        <w:rPr>
+          <w:rStyle w:val="NormalTok"/>
+        </w:rPr>
+        <w:t xml:space="preserve"> </w:t>
+      </w:r>
+      <w:r>
+        <w:rPr>
+          <w:rStyle w:val="FunctionTok"/>
+        </w:rPr>
+        <w:t xml:space="preserve">pnorm</w:t>
+      </w:r>
+      <w:r>
+        <w:rPr>
+          <w:rStyle w:val="NormalTok"/>
+        </w:rPr>
+        <w:t xml:space="preserve">(</w:t>
+      </w:r>
+      <w:r>
+        <w:rPr>
+          <w:rStyle w:val="SpecialCharTok"/>
+        </w:rPr>
+        <w:t xml:space="preserve">-</w:t>
+      </w:r>
+      <w:r>
+        <w:rPr>
+          <w:rStyle w:val="DecValTok"/>
+        </w:rPr>
+        <w:t xml:space="preserve">1</w:t>
+      </w:r>
+      <w:r>
+        <w:rPr>
+          <w:rStyle w:val="NormalTok"/>
+        </w:rPr>
+        <w:t xml:space="preserve"> </w:t>
+      </w:r>
+      <w:r>
+        <w:rPr>
+          <w:rStyle w:val="SpecialCharTok"/>
+        </w:rPr>
+        <w:t xml:space="preserve">/</w:t>
+      </w:r>
+      <w:r>
+        <w:rPr>
+          <w:rStyle w:val="NormalTok"/>
+        </w:rPr>
+        <w:t xml:space="preserve"> </w:t>
+      </w:r>
+      <w:r>
+        <w:rPr>
+          <w:rStyle w:val="FunctionTok"/>
+        </w:rPr>
+        <w:t xml:space="preserve">sqrt</w:t>
+      </w:r>
+      <w:r>
+        <w:rPr>
+          <w:rStyle w:val="NormalTok"/>
+        </w:rPr>
+        <w:t xml:space="preserve">(sigma2 </w:t>
+      </w:r>
+      <w:r>
+        <w:rPr>
+          <w:rStyle w:val="SpecialCharTok"/>
+        </w:rPr>
+        <w:t xml:space="preserve">/</w:t>
+      </w:r>
+      <w:r>
+        <w:rPr>
+          <w:rStyle w:val="NormalTok"/>
+        </w:rPr>
+        <w:t xml:space="preserve"> n_min))</w:t>
+      </w:r>
+      <w:r>
+        <w:br/>
+      </w:r>
+      <w:r>
+        <w:rPr>
+          <w:rStyle w:val="FunctionTok"/>
+        </w:rPr>
+        <w:t xml:space="preserve">c</w:t>
+      </w:r>
+      <w:r>
+        <w:rPr>
+          <w:rStyle w:val="NormalTok"/>
+        </w:rPr>
+        <w:t xml:space="preserve">(</w:t>
+      </w:r>
+      <w:r>
+        <w:rPr>
+          <w:rStyle w:val="AttributeTok"/>
+        </w:rPr>
+        <w:t xml:space="preserve">variance =</w:t>
+      </w:r>
+      <w:r>
+        <w:rPr>
+          <w:rStyle w:val="NormalTok"/>
+        </w:rPr>
+        <w:t xml:space="preserve"> sigma2, </w:t>
+      </w:r>
+      <w:r>
+        <w:rPr>
+          <w:rStyle w:val="AttributeTok"/>
+        </w:rPr>
+        <w:t xml:space="preserve">n =</w:t>
+      </w:r>
+      <w:r>
+        <w:rPr>
+          <w:rStyle w:val="NormalTok"/>
+        </w:rPr>
+        <w:t xml:space="preserve"> n_min, </w:t>
+      </w:r>
+      <w:r>
+        <w:rPr>
+          <w:rStyle w:val="AttributeTok"/>
+        </w:rPr>
+        <w:t xml:space="preserve">misses =</w:t>
+      </w:r>
+      <w:r>
+        <w:rPr>
+          <w:rStyle w:val="NormalTok"/>
+        </w:rPr>
+        <w:t xml:space="preserve"> misses, </w:t>
+      </w:r>
+      <w:r>
+        <w:rPr>
+          <w:rStyle w:val="AttributeTok"/>
+        </w:rPr>
+        <w:t xml:space="preserve">normal_approx =</w:t>
+      </w:r>
+      <w:r>
+        <w:rPr>
+          <w:rStyle w:val="NormalTok"/>
+        </w:rPr>
+        <w:t xml:space="preserve"> normal_approx)</w:t>
+      </w:r>
+      <w:r>
+        <w:br/>
+      </w:r>
+      <w:r>
+        <w:rPr>
+          <w:rStyle w:val="CommentTok"/>
+        </w:rPr>
+        <w:t xml:space="preserve">#&gt;      variance             n        misses normal_approx </w:t>
+      </w:r>
+      <w:r>
+        <w:br/>
+      </w:r>
+      <w:r>
+        <w:rPr>
+          <w:rStyle w:val="CommentTok"/>
+        </w:rPr>
+        <w:t xml:space="preserve">#&gt;  6.076274e+01  1.216000e+03  0.000000e+00  7.694705e-06</w:t>
+      </w:r>
+    </w:p>
+    <w:p>
+      <w:pPr>
+        <w:pStyle w:val="FirstParagraph"/>
+      </w:pPr>
+      <w:r>
+        <w:t xml:space="preserve">The population variance of</w:t>
+      </w:r>
+      <w:r>
+        <w:t xml:space="preserve"> </w:t>
+      </w:r>
+      <w:r>
+        <w:rPr>
+          <w:rStyle w:val="VerbatimChar"/>
+        </w:rPr>
+        <w:t xml:space="preserve">mpg</w:t>
+      </w:r>
+      <w:r>
+        <w:t xml:space="preserve"> </w:t>
+      </w:r>
+      <w:r>
+        <w:t xml:space="preserve">is 60.8,</w:t>
+      </w:r>
+      <w:r>
+        <w:t xml:space="preserve"> </w:t>
+      </w:r>
+      <w:r>
+        <w:t xml:space="preserve">so</w:t>
+      </w:r>
+      <w:r>
+        <w:t xml:space="preserve"> </w:t>
+      </w:r>
+      <m:oMath>
+        <m:r>
+          <m:t>n</m:t>
+        </m:r>
+        <m:r>
+          <m:rPr>
+            <m:sty m:val="p"/>
+          </m:rPr>
+          <m:t>=</m:t>
+        </m:r>
+        <m:r>
+          <m:t>1216</m:t>
+        </m:r>
+      </m:oMath>
+      <w:r>
+        <w:t xml:space="preserve"> </w:t>
+      </w:r>
+      <w:r>
+        <w:t xml:space="preserve">cars suffice.</w:t>
+      </w:r>
+      <w:r>
+        <w:t xml:space="preserve"> </w:t>
+      </w:r>
+      <w:r>
+        <w:t xml:space="preserve">Out of 10,000 samples of that size, 0 sample means missed</w:t>
+      </w:r>
+      <w:r>
+        <w:t xml:space="preserve"> </w:t>
+      </w:r>
+      <m:oMath>
+        <m:r>
+          <m:t>μ</m:t>
+        </m:r>
+      </m:oMath>
+      <w:r>
+        <w:t xml:space="preserve"> </w:t>
+      </w:r>
+      <w:r>
+        <w:t xml:space="preserve">by 1 or more,</w:t>
+      </w:r>
+      <w:r>
+        <w:t xml:space="preserve"> </w:t>
+      </w:r>
+      <w:r>
+        <w:t xml:space="preserve">against the 5% (500 samples) the bound allows.</w:t>
+      </w:r>
+      <w:r>
+        <w:t xml:space="preserve"> </w:t>
+      </w:r>
+      <w:r>
+        <w:t xml:space="preserve">The bound is loose because the sample mean of this many cars is nearly normal</w:t>
+      </w:r>
+      <w:r>
+        <w:t xml:space="preserve"> </w:t>
+      </w:r>
+      <w:r>
+        <w:t xml:space="preserve">(</w:t>
+      </w:r>
+      <w:hyperlink w:anchor="thm-clt">
+        <w:r>
+          <w:rPr>
+            <w:rStyle w:val="Hyperlink"/>
+          </w:rPr>
+          <w:t xml:space="preserve">Theorem 1</w:t>
+        </w:r>
+      </w:hyperlink>
+      <w:r>
+        <w:t xml:space="preserve">),</w:t>
+      </w:r>
+      <w:r>
+        <w:t xml:space="preserve"> </w:t>
+      </w:r>
+      <w:r>
+        <w:t xml:space="preserve">and the normal approximation puts the chance of a miss at about</w:t>
+      </w:r>
+      <w:r>
+        <w:t xml:space="preserve"> </w:t>
+      </w:r>
+      <w:r>
+        <w:t xml:space="preserve">7.7</w:t>
+      </w:r>
+      <w:r>
+        <w:t xml:space="preserve">^{-6};</w:t>
+      </w:r>
+      <w:r>
+        <w:t xml:space="preserve"> </w:t>
+      </w:r>
+      <w:r>
+        <w:t xml:space="preserve">Chebyshev’s inequality must hold for every distribution, as in</w:t>
+      </w:r>
+      <w:r>
+        <w:t xml:space="preserve"> </w:t>
+      </w:r>
+      <w:hyperlink w:anchor="exm-chebyshev-auto">
+        <w:r>
+          <w:rPr>
+            <w:rStyle w:val="Hyperlink"/>
+          </w:rPr>
+          <w:t xml:space="preserve">Example 3</w:t>
+        </w:r>
+      </w:hyperlink>
+      <w:r>
+        <w:t xml:space="preserve">.</w:t>
+      </w:r>
+    </w:p>
+    <w:bookmarkEnd w:id="42"/>
+    <w:bookmarkEnd w:id="43"/>
+    <w:bookmarkStart w:id="48" w:name="references"/>
+    <w:p>
+      <w:pPr>
+        <w:pStyle w:val="Heading2"/>
+      </w:pPr>
+      <w:r>
         <w:t xml:space="preserve">References</w:t>
       </w:r>
     </w:p>
-    <w:bookmarkStart w:id="41" w:name="refs"/>
-    <w:bookmarkStart w:id="39" w:name="ref-fiveminuteai_probstat"/>
+    <w:bookmarkStart w:id="47" w:name="refs"/>
+    <w:bookmarkStart w:id="45" w:name="ref-fiveminuteai_probstat"/>
     <w:p>
       <w:pPr>
         <w:pStyle w:val="Bibliography"/>
@@ -7651,7 +11884,7 @@
       <w:r>
         <w:t xml:space="preserve"> </w:t>
       </w:r>
-      <w:hyperlink r:id="rId38">
+      <w:hyperlink r:id="rId44">
         <w:r>
           <w:rPr>
             <w:rStyle w:val="Hyperlink"/>
@@ -7663,8 +11896,8 @@
         <w:t xml:space="preserve">.</w:t>
       </w:r>
     </w:p>
-    <w:bookmarkEnd w:id="39"/>
-    <w:bookmarkStart w:id="40" w:name="ref-billingsley1995probability"/>
+    <w:bookmarkEnd w:id="45"/>
+    <w:bookmarkStart w:id="46" w:name="ref-billingsley1995probability"/>
     <w:p>
       <w:pPr>
         <w:pStyle w:val="Bibliography"/>
@@ -7686,9 +11919,9 @@
         <w:t xml:space="preserve">. 3rd ed. Wiley Series in Probability and Mathematical Statistics. Wiley.</w:t>
       </w:r>
     </w:p>
-    <w:bookmarkEnd w:id="40"/>
-    <w:bookmarkEnd w:id="41"/>
-    <w:bookmarkEnd w:id="42"/>
+    <w:bookmarkEnd w:id="46"/>
+    <w:bookmarkEnd w:id="47"/>
+    <w:bookmarkEnd w:id="48"/>
     <w:sectPr>
       <w:footnotePr>
         <w:numRestart w:val="eachSect"/>
@@ -7799,8 +12032,153 @@
       </w:pPr>
     </w:lvl>
   </w:abstractNum>
+  <w:abstractNum w:abstractNumId="99711">
+    <w:nsid w:val="00A99711"/>
+    <w:multiLevelType w:val="multilevel"/>
+    <w:lvl w:ilvl="0">
+      <w:start w:val="1"/>
+      <w:numFmt w:val="lowerLetter"/>
+      <w:lvlText w:val="%1."/>
+      <w:lvlJc w:val="left"/>
+      <w:pPr>
+        <w:ind w:left="720" w:hanging="360"/>
+      </w:pPr>
+    </w:lvl>
+    <w:lvl w:ilvl="1">
+      <w:start w:val="1"/>
+      <w:numFmt w:val="lowerLetter"/>
+      <w:lvlText w:val="%2."/>
+      <w:lvlJc w:val="left"/>
+      <w:pPr>
+        <w:ind w:left="1440" w:hanging="360"/>
+      </w:pPr>
+    </w:lvl>
+    <w:lvl w:ilvl="2">
+      <w:start w:val="1"/>
+      <w:numFmt w:val="lowerLetter"/>
+      <w:lvlText w:val="%3."/>
+      <w:lvlJc w:val="left"/>
+      <w:pPr>
+        <w:ind w:left="2160" w:hanging="360"/>
+      </w:pPr>
+    </w:lvl>
+    <w:lvl w:ilvl="3">
+      <w:start w:val="1"/>
+      <w:numFmt w:val="lowerLetter"/>
+      <w:lvlText w:val="%4."/>
+      <w:lvlJc w:val="left"/>
+      <w:pPr>
+        <w:ind w:left="2880" w:hanging="360"/>
+      </w:pPr>
+    </w:lvl>
+    <w:lvl w:ilvl="4">
+      <w:start w:val="1"/>
+      <w:numFmt w:val="lowerLetter"/>
+      <w:lvlText w:val="%5."/>
+      <w:lvlJc w:val="left"/>
+      <w:pPr>
+        <w:ind w:left="3600" w:hanging="360"/>
+      </w:pPr>
+    </w:lvl>
+    <w:lvl w:ilvl="5">
+      <w:start w:val="1"/>
+      <w:numFmt w:val="lowerLetter"/>
+      <w:lvlText w:val="%6."/>
+      <w:lvlJc w:val="left"/>
+      <w:pPr>
+        <w:ind w:left="4320" w:hanging="360"/>
+      </w:pPr>
+    </w:lvl>
+    <w:lvl w:ilvl="6">
+      <w:start w:val="1"/>
+      <w:numFmt w:val="lowerLetter"/>
+      <w:lvlText w:val="%7."/>
+      <w:lvlJc w:val="left"/>
+      <w:pPr>
+        <w:ind w:left="5040" w:hanging="360"/>
+      </w:pPr>
+    </w:lvl>
+    <w:lvl w:ilvl="7">
+      <w:start w:val="1"/>
+      <w:numFmt w:val="lowerLetter"/>
+      <w:lvlText w:val="%8."/>
+      <w:lvlJc w:val="left"/>
+      <w:pPr>
+        <w:ind w:left="5760" w:hanging="360"/>
+      </w:pPr>
+    </w:lvl>
+    <w:lvl w:ilvl="8">
+      <w:start w:val="1"/>
+      <w:numFmt w:val="lowerLetter"/>
+      <w:lvlText w:val="%9."/>
+      <w:lvlJc w:val="left"/>
+      <w:pPr>
+        <w:ind w:left="6480" w:hanging="360"/>
+      </w:pPr>
+    </w:lvl>
+  </w:abstractNum>
   <w:num w:numId="1000">
     <w:abstractNumId w:val="990"/>
+  </w:num>
+  <w:num w:numId="1001">
+    <w:abstractNumId w:val="99711"/>
+    <w:lvlOverride w:ilvl="0">
+      <w:startOverride w:val="1"/>
+    </w:lvlOverride>
+    <w:lvlOverride w:ilvl="1">
+      <w:startOverride w:val="1"/>
+    </w:lvlOverride>
+    <w:lvlOverride w:ilvl="2">
+      <w:startOverride w:val="1"/>
+    </w:lvlOverride>
+    <w:lvlOverride w:ilvl="3">
+      <w:startOverride w:val="1"/>
+    </w:lvlOverride>
+    <w:lvlOverride w:ilvl="4">
+      <w:startOverride w:val="1"/>
+    </w:lvlOverride>
+    <w:lvlOverride w:ilvl="5">
+      <w:startOverride w:val="1"/>
+    </w:lvlOverride>
+    <w:lvlOverride w:ilvl="6">
+      <w:startOverride w:val="1"/>
+    </w:lvlOverride>
+    <w:lvlOverride w:ilvl="7">
+      <w:startOverride w:val="1"/>
+    </w:lvlOverride>
+    <w:lvlOverride w:ilvl="8">
+      <w:startOverride w:val="1"/>
+    </w:lvlOverride>
+  </w:num>
+  <w:num w:numId="1002">
+    <w:abstractNumId w:val="99711"/>
+    <w:lvlOverride w:ilvl="0">
+      <w:startOverride w:val="1"/>
+    </w:lvlOverride>
+    <w:lvlOverride w:ilvl="1">
+      <w:startOverride w:val="1"/>
+    </w:lvlOverride>
+    <w:lvlOverride w:ilvl="2">
+      <w:startOverride w:val="1"/>
+    </w:lvlOverride>
+    <w:lvlOverride w:ilvl="3">
+      <w:startOverride w:val="1"/>
+    </w:lvlOverride>
+    <w:lvlOverride w:ilvl="4">
+      <w:startOverride w:val="1"/>
+    </w:lvlOverride>
+    <w:lvlOverride w:ilvl="5">
+      <w:startOverride w:val="1"/>
+    </w:lvlOverride>
+    <w:lvlOverride w:ilvl="6">
+      <w:startOverride w:val="1"/>
+    </w:lvlOverride>
+    <w:lvlOverride w:ilvl="7">
+      <w:startOverride w:val="1"/>
+    </w:lvlOverride>
+    <w:lvlOverride w:ilvl="8">
+      <w:startOverride w:val="1"/>
+    </w:lvlOverride>
   </w:num>
 </w:numbering>
 </file>

</xml_diff>

<commit_message>
Deploying to gh-pages from @ Morrison-Lab/pds@e2f36eb999aa56859055f6e36371d523091c4924 🚀
</commit_message>
<xml_diff>
--- a/limit-theorems.docx
+++ b/limit-theorems.docx
@@ -15,7 +15,7 @@
         <w:pStyle w:val="Date"/>
       </w:pPr>
       <w:r>
-        <w:t xml:space="preserve">Last modified: 2026-10-13 14:34:30 (PDT)</w:t>
+        <w:t xml:space="preserve">Last modified: 2026-10-13 15:27:43 (PDT)</w:t>
       </w:r>
     </w:p>
     <w:bookmarkStart w:id="37" w:name="sec-clt"/>
@@ -8262,6 +8262,78 @@
         <w:t xml:space="preserve">gives the claim.</w:t>
       </w:r>
     </w:p>
+    <w:p>
+      <w:pPr>
+        <w:pStyle w:val="BodyText"/>
+      </w:pPr>
+      <w:r>
+        <w:rPr>
+          <w:i/>
+          <w:iCs/>
+        </w:rPr>
+        <w:t xml:space="preserve">Remark</w:t>
+      </w:r>
+      <w:r>
+        <w:t xml:space="preserve">. </w:t>
+      </w:r>
+      <w:r>
+        <w:t xml:space="preserve">The inequality carries Markov’s name by convention.</w:t>
+      </w:r>
+      <w:r>
+        <w:t xml:space="preserve"> </w:t>
+      </w:r>
+      <w:r>
+        <w:t xml:space="preserve">Chebyshev’s inequality, which follows from it,</w:t>
+      </w:r>
+      <w:r>
+        <w:t xml:space="preserve"> </w:t>
+      </w:r>
+      <w:r>
+        <w:t xml:space="preserve">is older</w:t>
+      </w:r>
+      <w:r>
+        <w:t xml:space="preserve"> </w:t>
+      </w:r>
+      <w:r>
+        <w:t xml:space="preserve">(Bienaymé 1853; Tchébychef 1867)</w:t>
+      </w:r>
+      <w:r>
+        <w:t xml:space="preserve">;</w:t>
+      </w:r>
+      <w:r>
+        <w:t xml:space="preserve"> </w:t>
+      </w:r>
+      <w:r>
+        <w:t xml:space="preserve">see</w:t>
+      </w:r>
+      <w:r>
+        <w:t xml:space="preserve"> </w:t>
+      </w:r>
+      <w:r>
+        <w:t xml:space="preserve">(Seneta 2013)</w:t>
+      </w:r>
+      <w:r>
+        <w:t xml:space="preserve"> </w:t>
+      </w:r>
+      <w:r>
+        <w:t xml:space="preserve">for the history of the attribution.</w:t>
+      </w:r>
+      <w:r>
+        <w:t xml:space="preserve"> </w:t>
+      </w:r>
+      <w:r>
+        <w:t xml:space="preserve">A modern treatment is in</w:t>
+      </w:r>
+      <w:r>
+        <w:t xml:space="preserve"> </w:t>
+      </w:r>
+      <w:r>
+        <w:t xml:space="preserve">(Blitzstein and Hwang 2019)</w:t>
+      </w:r>
+      <w:r>
+        <w:t xml:space="preserve">.</w:t>
+      </w:r>
+    </w:p>
     <w:bookmarkStart w:id="39" w:name="thm-chebyshev"/>
     <w:p>
       <w:pPr>
@@ -9018,6 +9090,63 @@
         <w:t xml:space="preserve">is 25%.</w:t>
       </w:r>
     </w:p>
+    <w:p>
+      <w:pPr>
+        <w:pStyle w:val="BodyText"/>
+      </w:pPr>
+      <w:r>
+        <w:rPr>
+          <w:i/>
+          <w:iCs/>
+        </w:rPr>
+        <w:t xml:space="preserve">Remark</w:t>
+      </w:r>
+      <w:r>
+        <w:t xml:space="preserve">. </w:t>
+      </w:r>
+      <w:r>
+        <w:t xml:space="preserve">Bienaymé derived this bound in 1853</w:t>
+      </w:r>
+      <w:r>
+        <w:t xml:space="preserve"> </w:t>
+      </w:r>
+      <w:r>
+        <w:t xml:space="preserve">(Bienaymé 1853)</w:t>
+      </w:r>
+      <w:r>
+        <w:t xml:space="preserve">,</w:t>
+      </w:r>
+      <w:r>
+        <w:t xml:space="preserve"> </w:t>
+      </w:r>
+      <w:r>
+        <w:t xml:space="preserve">and Chebyshev proved a more general form in 1867</w:t>
+      </w:r>
+      <w:r>
+        <w:t xml:space="preserve"> </w:t>
+      </w:r>
+      <w:r>
+        <w:t xml:space="preserve">(Tchébychef 1867)</w:t>
+      </w:r>
+      <w:r>
+        <w:t xml:space="preserve">.</w:t>
+      </w:r>
+      <w:r>
+        <w:t xml:space="preserve"> </w:t>
+      </w:r>
+      <w:r>
+        <w:t xml:space="preserve">A modern treatment is in</w:t>
+      </w:r>
+      <w:r>
+        <w:t xml:space="preserve"> </w:t>
+      </w:r>
+      <w:r>
+        <w:t xml:space="preserve">(Blitzstein and Hwang 2019)</w:t>
+      </w:r>
+      <w:r>
+        <w:t xml:space="preserve">.</w:t>
+      </w:r>
+    </w:p>
     <w:bookmarkStart w:id="40" w:name="exm-chebyshev-auto"/>
     <w:p>
       <w:pPr>
@@ -11850,7 +11979,7 @@
     </w:p>
     <w:bookmarkEnd w:id="42"/>
     <w:bookmarkEnd w:id="43"/>
-    <w:bookmarkStart w:id="48" w:name="references"/>
+    <w:bookmarkStart w:id="56" w:name="references"/>
     <w:p>
       <w:pPr>
         <w:pStyle w:val="Heading2"/>
@@ -11859,7 +11988,7 @@
         <w:t xml:space="preserve">References</w:t>
       </w:r>
     </w:p>
-    <w:bookmarkStart w:id="47" w:name="refs"/>
+    <w:bookmarkStart w:id="55" w:name="refs"/>
     <w:bookmarkStart w:id="45" w:name="ref-fiveminuteai_probstat"/>
     <w:p>
       <w:pPr>
@@ -11897,13 +12026,31 @@
       </w:r>
     </w:p>
     <w:bookmarkEnd w:id="45"/>
-    <w:bookmarkStart w:id="46" w:name="ref-billingsley1995probability"/>
+    <w:bookmarkStart w:id="47" w:name="ref-bienayme1853"/>
     <w:p>
       <w:pPr>
         <w:pStyle w:val="Bibliography"/>
       </w:pPr>
       <w:r>
-        <w:t xml:space="preserve">Billingsley, Patrick. 1995.</w:t>
+        <w:t xml:space="preserve">Bienaymé, Irénée-Jules. 1853.</w:t>
+      </w:r>
+      <w:r>
+        <w:t xml:space="preserve"> </w:t>
+      </w:r>
+      <w:r>
+        <w:t xml:space="preserve">“Considérations à l’appui de La Découverte de</w:t>
+      </w:r>
+      <w:r>
+        <w:t xml:space="preserve"> </w:t>
+      </w:r>
+      <w:r>
+        <w:t xml:space="preserve">Laplace</w:t>
+      </w:r>
+      <w:r>
+        <w:t xml:space="preserve"> </w:t>
+      </w:r>
+      <w:r>
+        <w:t xml:space="preserve">Sur La Loi de Probabilité Dans La Méthode Des Moindres Carrés.”</w:t>
       </w:r>
       <w:r>
         <w:t xml:space="preserve"> </w:t>
@@ -11913,15 +12060,181 @@
           <w:i/>
           <w:iCs/>
         </w:rPr>
+        <w:t xml:space="preserve">Comptes Rendus de l’Académie Des Sciences</w:t>
+      </w:r>
+      <w:r>
+        <w:t xml:space="preserve"> </w:t>
+      </w:r>
+      <w:r>
+        <w:t xml:space="preserve">37: 309–24.</w:t>
+      </w:r>
+      <w:r>
+        <w:t xml:space="preserve"> </w:t>
+      </w:r>
+      <w:hyperlink r:id="rId46">
+        <w:r>
+          <w:rPr>
+            <w:rStyle w:val="Hyperlink"/>
+          </w:rPr>
+          <w:t xml:space="preserve">https://www.numdam.org/item/JMPA_1867_2_12__158_0/</w:t>
+        </w:r>
+      </w:hyperlink>
+      <w:r>
+        <w:t xml:space="preserve">.</w:t>
+      </w:r>
+    </w:p>
+    <w:bookmarkEnd w:id="47"/>
+    <w:bookmarkStart w:id="48" w:name="ref-billingsley1995probability"/>
+    <w:p>
+      <w:pPr>
+        <w:pStyle w:val="Bibliography"/>
+      </w:pPr>
+      <w:r>
+        <w:t xml:space="preserve">Billingsley, Patrick. 1995.</w:t>
+      </w:r>
+      <w:r>
+        <w:t xml:space="preserve"> </w:t>
+      </w:r>
+      <w:r>
+        <w:rPr>
+          <w:i/>
+          <w:iCs/>
+        </w:rPr>
         <w:t xml:space="preserve">Probability and Measure</w:t>
       </w:r>
       <w:r>
         <w:t xml:space="preserve">. 3rd ed. Wiley Series in Probability and Mathematical Statistics. Wiley.</w:t>
       </w:r>
     </w:p>
-    <w:bookmarkEnd w:id="46"/>
-    <w:bookmarkEnd w:id="47"/>
     <w:bookmarkEnd w:id="48"/>
+    <w:bookmarkStart w:id="50" w:name="ref-blitzstein2019introduction"/>
+    <w:p>
+      <w:pPr>
+        <w:pStyle w:val="Bibliography"/>
+      </w:pPr>
+      <w:r>
+        <w:t xml:space="preserve">Blitzstein, Joseph K, and Jessica Hwang. 2019.</w:t>
+      </w:r>
+      <w:r>
+        <w:t xml:space="preserve"> </w:t>
+      </w:r>
+      <w:r>
+        <w:rPr>
+          <w:i/>
+          <w:iCs/>
+        </w:rPr>
+        <w:t xml:space="preserve">Introduction to Probability</w:t>
+      </w:r>
+      <w:r>
+        <w:t xml:space="preserve">. 2nd ed. Chapman; Hall/CRC.</w:t>
+      </w:r>
+      <w:r>
+        <w:t xml:space="preserve"> </w:t>
+      </w:r>
+      <w:hyperlink r:id="rId49">
+        <w:r>
+          <w:rPr>
+            <w:rStyle w:val="Hyperlink"/>
+          </w:rPr>
+          <w:t xml:space="preserve">https://doi.org/10.1201/9780429428357</w:t>
+        </w:r>
+      </w:hyperlink>
+      <w:r>
+        <w:t xml:space="preserve">.</w:t>
+      </w:r>
+    </w:p>
+    <w:bookmarkEnd w:id="50"/>
+    <w:bookmarkStart w:id="52" w:name="ref-seneta2013"/>
+    <w:p>
+      <w:pPr>
+        <w:pStyle w:val="Bibliography"/>
+      </w:pPr>
+      <w:r>
+        <w:t xml:space="preserve">Seneta, Eugene. 2013.</w:t>
+      </w:r>
+      <w:r>
+        <w:t xml:space="preserve"> </w:t>
+      </w:r>
+      <w:r>
+        <w:t xml:space="preserve">“A Tricentenary History of the Law of Large Numbers.”</w:t>
+      </w:r>
+      <w:r>
+        <w:t xml:space="preserve"> </w:t>
+      </w:r>
+      <w:r>
+        <w:rPr>
+          <w:i/>
+          <w:iCs/>
+        </w:rPr>
+        <w:t xml:space="preserve">Bernoulli</w:t>
+      </w:r>
+      <w:r>
+        <w:t xml:space="preserve"> </w:t>
+      </w:r>
+      <w:r>
+        <w:t xml:space="preserve">19 (4): 1088–121.</w:t>
+      </w:r>
+      <w:r>
+        <w:t xml:space="preserve"> </w:t>
+      </w:r>
+      <w:hyperlink r:id="rId51">
+        <w:r>
+          <w:rPr>
+            <w:rStyle w:val="Hyperlink"/>
+          </w:rPr>
+          <w:t xml:space="preserve">https://doi.org/10.3150/12-BEJSP12</w:t>
+        </w:r>
+      </w:hyperlink>
+      <w:r>
+        <w:t xml:space="preserve">.</w:t>
+      </w:r>
+    </w:p>
+    <w:bookmarkEnd w:id="52"/>
+    <w:bookmarkStart w:id="54" w:name="ref-tchebichef1867"/>
+    <w:p>
+      <w:pPr>
+        <w:pStyle w:val="Bibliography"/>
+      </w:pPr>
+      <w:r>
+        <w:t xml:space="preserve">Tchébychef, P. L. 1867.</w:t>
+      </w:r>
+      <w:r>
+        <w:t xml:space="preserve"> </w:t>
+      </w:r>
+      <w:r>
+        <w:t xml:space="preserve">“Des Valeurs Moyennes.”</w:t>
+      </w:r>
+      <w:r>
+        <w:t xml:space="preserve"> </w:t>
+      </w:r>
+      <w:r>
+        <w:rPr>
+          <w:i/>
+          <w:iCs/>
+        </w:rPr>
+        <w:t xml:space="preserve">Journal de Mathématiques Pures Et Appliquées</w:t>
+      </w:r>
+      <w:r>
+        <w:t xml:space="preserve">, 2nd series, vol. 12: 177–84.</w:t>
+      </w:r>
+      <w:r>
+        <w:t xml:space="preserve"> </w:t>
+      </w:r>
+      <w:hyperlink r:id="rId53">
+        <w:r>
+          <w:rPr>
+            <w:rStyle w:val="Hyperlink"/>
+          </w:rPr>
+          <w:t xml:space="preserve">https://www.numdam.org/item/JMPA_1867_2_12__177_0/</w:t>
+        </w:r>
+      </w:hyperlink>
+      <w:r>
+        <w:t xml:space="preserve">.</w:t>
+      </w:r>
+    </w:p>
+    <w:bookmarkEnd w:id="54"/>
+    <w:bookmarkEnd w:id="55"/>
+    <w:bookmarkEnd w:id="56"/>
     <w:sectPr>
       <w:footnotePr>
         <w:numRestart w:val="eachSect"/>

</xml_diff>

<commit_message>
Deploying to gh-pages from @ Morrison-Lab/pds@44c0e8c20f665ad793ba749209f96ddf78f257db 🚀
</commit_message>
<xml_diff>
--- a/limit-theorems.docx
+++ b/limit-theorems.docx
@@ -15,7 +15,7 @@
         <w:pStyle w:val="Date"/>
       </w:pPr>
       <w:r>
-        <w:t xml:space="preserve">Last modified: 2026-10-15 01:30:39 (PDT)</w:t>
+        <w:t xml:space="preserve">Last modified: 2026-10-15 01:42:53 (PDT)</w:t>
       </w:r>
     </w:p>
     <w:bookmarkStart w:id="37" w:name="sec-clt"/>
@@ -21397,17 +21397,2328 @@
     </w:p>
     <w:bookmarkEnd w:id="48"/>
     <w:bookmarkEnd w:id="49"/>
-    <w:bookmarkStart w:id="64" w:name="references"/>
+    <w:bookmarkStart w:id="57" w:name="sec-lln"/>
     <w:p>
       <w:pPr>
         <w:pStyle w:val="Heading2"/>
       </w:pPr>
       <w:r>
+        <w:t xml:space="preserve">3 The law of large numbers</w:t>
+      </w:r>
+    </w:p>
+    <w:bookmarkStart w:id="53" w:name="def-convergence-in-probability"/>
+    <w:p>
+      <w:pPr>
+        <w:pStyle w:val="FirstParagraph"/>
+      </w:pPr>
+      <w:r>
+        <w:rPr>
+          <w:b/>
+          <w:bCs/>
+        </w:rPr>
+        <w:t xml:space="preserve">Definition 1 (Convergence in probability)</w:t>
+      </w:r>
+      <w:r>
+        <w:t xml:space="preserve"> </w:t>
+      </w:r>
+      <w:r>
+        <w:t xml:space="preserve">A sequence of random variables</w:t>
+      </w:r>
+      <w:r>
+        <w:t xml:space="preserve"> </w:t>
+      </w:r>
+      <m:oMath>
+        <m:sSub>
+          <m:e>
+            <m:r>
+              <m:t>Y</m:t>
+            </m:r>
+          </m:e>
+          <m:sub>
+            <m:r>
+              <m:t>1</m:t>
+            </m:r>
+          </m:sub>
+        </m:sSub>
+        <m:r>
+          <m:rPr>
+            <m:sty m:val="p"/>
+          </m:rPr>
+          <m:t>,</m:t>
+        </m:r>
+        <m:sSub>
+          <m:e>
+            <m:r>
+              <m:t>Y</m:t>
+            </m:r>
+          </m:e>
+          <m:sub>
+            <m:r>
+              <m:t>2</m:t>
+            </m:r>
+          </m:sub>
+        </m:sSub>
+        <m:r>
+          <m:rPr>
+            <m:sty m:val="p"/>
+          </m:rPr>
+          <m:t>,</m:t>
+        </m:r>
+        <m:r>
+          <m:rPr>
+            <m:sty m:val="p"/>
+          </m:rPr>
+          <m:t>…</m:t>
+        </m:r>
+      </m:oMath>
+      <w:r>
+        <w:t xml:space="preserve"> </w:t>
+      </w:r>
+      <w:r>
+        <w:rPr>
+          <w:b/>
+          <w:bCs/>
+        </w:rPr>
+        <w:t xml:space="preserve">converges in probability</w:t>
+      </w:r>
+      <w:r>
+        <w:t xml:space="preserve"> </w:t>
+      </w:r>
+      <w:r>
+        <w:t xml:space="preserve">to a constant</w:t>
+      </w:r>
+      <w:r>
+        <w:t xml:space="preserve"> </w:t>
+      </w:r>
+      <m:oMath>
+        <m:r>
+          <m:t>c</m:t>
+        </m:r>
+      </m:oMath>
+      <w:r>
+        <w:t xml:space="preserve"> </w:t>
+      </w:r>
+      <w:r>
+        <w:t xml:space="preserve">if, for every distance</w:t>
+      </w:r>
+      <w:r>
+        <w:t xml:space="preserve"> </w:t>
+      </w:r>
+      <m:oMath>
+        <m:r>
+          <m:t>ε</m:t>
+        </m:r>
+        <m:r>
+          <m:rPr>
+            <m:sty m:val="p"/>
+          </m:rPr>
+          <m:t>&gt;</m:t>
+        </m:r>
+        <m:r>
+          <m:t>0</m:t>
+        </m:r>
+      </m:oMath>
+      <w:r>
+        <w:t xml:space="preserve">,</w:t>
+      </w:r>
+      <w:r>
+        <w:t xml:space="preserve"> </w:t>
+      </w:r>
+      <w:r>
+        <w:t xml:space="preserve">the probability that</w:t>
+      </w:r>
+      <w:r>
+        <w:t xml:space="preserve"> </w:t>
+      </w:r>
+      <m:oMath>
+        <m:sSub>
+          <m:e>
+            <m:r>
+              <m:t>Y</m:t>
+            </m:r>
+          </m:e>
+          <m:sub>
+            <m:r>
+              <m:t>n</m:t>
+            </m:r>
+          </m:sub>
+        </m:sSub>
+      </m:oMath>
+      <w:r>
+        <w:t xml:space="preserve"> </w:t>
+      </w:r>
+      <w:r>
+        <w:t xml:space="preserve">lies at least</w:t>
+      </w:r>
+      <w:r>
+        <w:t xml:space="preserve"> </w:t>
+      </w:r>
+      <m:oMath>
+        <m:r>
+          <m:t>ε</m:t>
+        </m:r>
+      </m:oMath>
+      <w:r>
+        <w:t xml:space="preserve"> </w:t>
+      </w:r>
+      <w:r>
+        <w:t xml:space="preserve">away from</w:t>
+      </w:r>
+      <w:r>
+        <w:t xml:space="preserve"> </w:t>
+      </w:r>
+      <m:oMath>
+        <m:r>
+          <m:t>c</m:t>
+        </m:r>
+      </m:oMath>
+      <w:r>
+        <w:t xml:space="preserve"> </w:t>
+      </w:r>
+      <w:r>
+        <w:t xml:space="preserve">goes to zero as</w:t>
+      </w:r>
+      <w:r>
+        <w:t xml:space="preserve"> </w:t>
+      </w:r>
+      <m:oMath>
+        <m:r>
+          <m:t>n</m:t>
+        </m:r>
+      </m:oMath>
+      <w:r>
+        <w:t xml:space="preserve"> </w:t>
+      </w:r>
+      <w:r>
+        <w:t xml:space="preserve">grows:</w:t>
+      </w:r>
+    </w:p>
+    <w:p>
+      <w:pPr>
+        <w:pStyle w:val="BodyText"/>
+      </w:pPr>
+      <m:oMathPara>
+        <m:oMathParaPr>
+          <m:jc m:val="center"/>
+        </m:oMathParaPr>
+        <m:oMath>
+          <m:limLow>
+            <m:e>
+              <m:r>
+                <m:rPr>
+                  <m:sty m:val="p"/>
+                </m:rPr>
+                <m:t>lim</m:t>
+              </m:r>
+            </m:e>
+            <m:lim>
+              <m:r>
+                <m:t>n</m:t>
+              </m:r>
+              <m:r>
+                <m:rPr>
+                  <m:sty m:val="p"/>
+                </m:rPr>
+                <m:t>→</m:t>
+              </m:r>
+              <m:r>
+                <m:rPr>
+                  <m:sty m:val="p"/>
+                </m:rPr>
+                <m:t>∞</m:t>
+              </m:r>
+            </m:lim>
+          </m:limLow>
+          <m:r>
+            <m:rPr>
+              <m:sty m:val="p"/>
+            </m:rPr>
+            <m:t>Pr</m:t>
+          </m:r>
+          <m:r>
+            <m:t>​</m:t>
+          </m:r>
+          <m:d>
+            <m:dPr>
+              <m:begChr m:val="("/>
+              <m:sepChr m:val=""/>
+              <m:endChr m:val=")"/>
+              <m:grow/>
+            </m:dPr>
+            <m:e>
+              <m:r>
+                <m:t>​</m:t>
+              </m:r>
+              <m:d>
+                <m:dPr>
+                  <m:begChr m:val="|"/>
+                  <m:sepChr m:val=""/>
+                  <m:endChr m:val="|"/>
+                  <m:grow/>
+                </m:dPr>
+                <m:e>
+                  <m:sSub>
+                    <m:e>
+                      <m:r>
+                        <m:t>Y</m:t>
+                      </m:r>
+                    </m:e>
+                    <m:sub>
+                      <m:r>
+                        <m:t>n</m:t>
+                      </m:r>
+                    </m:sub>
+                  </m:sSub>
+                  <m:r>
+                    <m:rPr>
+                      <m:sty m:val="p"/>
+                    </m:rPr>
+                    <m:t>−</m:t>
+                  </m:r>
+                  <m:r>
+                    <m:t>c</m:t>
+                  </m:r>
+                </m:e>
+              </m:d>
+              <m:r>
+                <m:t>​</m:t>
+              </m:r>
+              <m:r>
+                <m:rPr>
+                  <m:sty m:val="p"/>
+                </m:rPr>
+                <m:t>≥</m:t>
+              </m:r>
+              <m:r>
+                <m:t>ε</m:t>
+              </m:r>
+            </m:e>
+          </m:d>
+          <m:r>
+            <m:t>​</m:t>
+          </m:r>
+          <m:r>
+            <m:rPr>
+              <m:sty m:val="p"/>
+            </m:rPr>
+            <m:t>=</m:t>
+          </m:r>
+          <m:r>
+            <m:t>0</m:t>
+          </m:r>
+        </m:oMath>
+      </m:oMathPara>
+    </w:p>
+    <w:p>
+      <w:pPr>
+        <w:pStyle w:val="FirstParagraph"/>
+      </w:pPr>
+      <w:r>
+        <w:t xml:space="preserve">We write</w:t>
+      </w:r>
+      <w:r>
+        <w:t xml:space="preserve"> </w:t>
+      </w:r>
+      <m:oMath>
+        <m:sSub>
+          <m:e>
+            <m:r>
+              <m:t>Y</m:t>
+            </m:r>
+          </m:e>
+          <m:sub>
+            <m:r>
+              <m:t>n</m:t>
+            </m:r>
+          </m:sub>
+        </m:sSub>
+        <m:limUpp>
+          <m:e>
+            <m:r>
+              <m:rPr>
+                <m:sty m:val="p"/>
+              </m:rPr>
+              <m:t>→</m:t>
+            </m:r>
+          </m:e>
+          <m:lim>
+            <m:r>
+              <m:t>p</m:t>
+            </m:r>
+          </m:lim>
+        </m:limUpp>
+        <m:r>
+          <m:t>c</m:t>
+        </m:r>
+      </m:oMath>
+      <w:r>
+        <w:t xml:space="preserve">.</w:t>
+      </w:r>
+    </w:p>
+    <w:tbl>
+      <w:tblPr>
+        <w:tblStyle w:val="Table"/>
+        <w:tblLook w:firstRow="0" w:lastRow="0" w:firstColumn="0" w:lastColumn="0" w:noHBand="0" w:noVBand="0" w:val="0000"/>
+        <w:tblBorders>
+          <w:top w:val="single" w:sz="4" w:space="0" w:color="0758E5"/>
+          <w:left w:val="single" w:sz="24" w:space="0" w:color="0758E5"/>
+          <w:bottom w:val="single" w:sz="4" w:space="0" w:color="0758E5"/>
+          <w:right w:val="single" w:sz="4" w:space="0" w:color="0758E5"/>
+        </w:tblBorders>
+        <w:tblCellMar>
+          <w:left w:w="144" w:type="dxa"/>
+          <w:right w:w="144" w:type="dxa"/>
+        </w:tblCellMar>
+        <w:tblLook w:firstRow="0" w:lastRow="0" w:firstColumn="0" w:lastColumn="0" w:noHBand="0" w:noVBand="0" w:val="0000"/>
+      </w:tblPr>
+      <w:tr>
+        <w:trPr>
+          <w:cantSplit/>
+        </w:trPr>
+        <w:tc>
+          <w:tcPr>
+            <w:shd w:color="auto" w:fill="dae6fb" w:val="clear"/>
+            <w:tcMar>
+              <w:top w:w="92" w:type="dxa"/>
+              <w:bottom w:w="92" w:type="dxa"/>
+            </w:tcMar>
+          </w:tcPr>
+          <w:p>
+            <w:pPr>
+              <w:pStyle w:val="BodyText"/>
+            </w:pPr>
+            <w:pPr>
+              <w:spacing w:before="0" w:after="0"/>
+              <w:textAlignment w:val="center"/>
+            </w:pPr>
+            <w:r>
+              <w:drawing>
+                <wp:inline>
+                  <wp:extent cx="152400" cy="152400"/>
+                  <wp:effectExtent b="0" l="0" r="0" t="0"/>
+                  <wp:docPr descr="" title="" id="51" name="Picture"/>
+                  <a:graphic>
+                    <a:graphicData uri="http://schemas.openxmlformats.org/drawingml/2006/picture">
+                      <pic:pic>
+                        <pic:nvPicPr>
+                          <pic:cNvPr descr="/opt/quarto/share/formats/docx/note.png" id="52" name="Picture"/>
+                          <pic:cNvPicPr>
+                            <a:picLocks noChangeArrowheads="1" noChangeAspect="1"/>
+                          </pic:cNvPicPr>
+                        </pic:nvPicPr>
+                        <pic:blipFill>
+                          <a:blip r:embed="rId50"/>
+                          <a:stretch>
+                            <a:fillRect/>
+                          </a:stretch>
+                        </pic:blipFill>
+                        <pic:spPr bwMode="auto">
+                          <a:xfrm>
+                            <a:off x="0" y="0"/>
+                            <a:ext cx="152400" cy="152400"/>
+                          </a:xfrm>
+                          <a:prstGeom prst="rect">
+                            <a:avLst/>
+                          </a:prstGeom>
+                          <a:noFill/>
+                          <a:ln w="9525">
+                            <a:noFill/>
+                            <a:headEnd/>
+                            <a:tailEnd/>
+                          </a:ln>
+                        </pic:spPr>
+                      </pic:pic>
+                    </a:graphicData>
+                  </a:graphic>
+                </wp:inline>
+              </w:drawing>
+            </w:r>
+            <w:r>
+              <w:t xml:space="preserve"> </w:t>
+            </w:r>
+            <w:r>
+              <w:t xml:space="preserve"> </w:t>
+            </w:r>
+            <w:r>
+              <w:t xml:space="preserve">Source</w:t>
+            </w:r>
+          </w:p>
+        </w:tc>
+      </w:tr>
+      <w:tr>
+        <w:trPr>
+          <w:cantSplit/>
+        </w:trPr>
+        <w:tc>
+          <w:tcPr>
+            <w:tcMar>
+              <w:top w:w="108" w:type="dxa"/>
+              <w:bottom w:w="108" w:type="dxa"/>
+            </w:tcMar>
+          </w:tcPr>
+          <w:p>
+            <w:pPr>
+              <w:pStyle w:val="BodyText"/>
+            </w:pPr>
+            <w:pPr>
+              <w:spacing w:before="16" w:after="16"/>
+            </w:pPr>
+            <w:r>
+              <w:t xml:space="preserve">Casella and Berger (2002, Def. 5.5.1)</w:t>
+            </w:r>
+            <w:r>
+              <w:t xml:space="preserve">.</w:t>
+            </w:r>
+          </w:p>
+          <w:p/>
+        </w:tc>
+      </w:tr>
+    </w:tbl>
+    <w:bookmarkEnd w:id="53"/>
+    <w:bookmarkStart w:id="56" w:name="thm-wlln"/>
+    <w:p>
+      <w:pPr>
+        <w:pStyle w:val="BodyText"/>
+      </w:pPr>
+      <w:r>
+        <w:rPr>
+          <w:b/>
+          <w:bCs/>
+        </w:rPr>
+        <w:t xml:space="preserve">Theorem 5 (Weak law of large numbers)</w:t>
+      </w:r>
+      <w:r>
+        <w:t xml:space="preserve"> </w:t>
+      </w:r>
+      <w:r>
+        <w:t xml:space="preserve">Let</w:t>
+      </w:r>
+      <w:r>
+        <w:t xml:space="preserve"> </w:t>
+      </w:r>
+      <m:oMath>
+        <m:sSub>
+          <m:e>
+            <m:r>
+              <m:t>X</m:t>
+            </m:r>
+          </m:e>
+          <m:sub>
+            <m:r>
+              <m:t>1</m:t>
+            </m:r>
+          </m:sub>
+        </m:sSub>
+        <m:r>
+          <m:rPr>
+            <m:sty m:val="p"/>
+          </m:rPr>
+          <m:t>,</m:t>
+        </m:r>
+        <m:sSub>
+          <m:e>
+            <m:r>
+              <m:t>X</m:t>
+            </m:r>
+          </m:e>
+          <m:sub>
+            <m:r>
+              <m:t>2</m:t>
+            </m:r>
+          </m:sub>
+        </m:sSub>
+        <m:r>
+          <m:rPr>
+            <m:sty m:val="p"/>
+          </m:rPr>
+          <m:t>,</m:t>
+        </m:r>
+        <m:r>
+          <m:rPr>
+            <m:sty m:val="p"/>
+          </m:rPr>
+          <m:t>…</m:t>
+        </m:r>
+      </m:oMath>
+      <w:r>
+        <w:t xml:space="preserve"> </w:t>
+      </w:r>
+      <w:r>
+        <w:t xml:space="preserve">be</w:t>
+      </w:r>
+      <w:r>
+        <w:t xml:space="preserve"> </w:t>
+      </w:r>
+      <w:hyperlink r:id="rId9">
+        <w:r>
+          <w:rPr>
+            <w:rStyle w:val="Hyperlink"/>
+          </w:rPr>
+          <w:t xml:space="preserve">IID</w:t>
+        </w:r>
+      </w:hyperlink>
+      <w:r>
+        <w:t xml:space="preserve"> </w:t>
+      </w:r>
+      <w:r>
+        <w:t xml:space="preserve">random variables</w:t>
+      </w:r>
+      <w:r>
+        <w:t xml:space="preserve"> </w:t>
+      </w:r>
+      <w:r>
+        <w:t xml:space="preserve">with mean</w:t>
+      </w:r>
+      <w:r>
+        <w:t xml:space="preserve"> </w:t>
+      </w:r>
+      <m:oMath>
+        <m:r>
+          <m:t>μ</m:t>
+        </m:r>
+      </m:oMath>
+      <w:r>
+        <w:t xml:space="preserve"> </w:t>
+      </w:r>
+      <w:r>
+        <w:t xml:space="preserve">and finite variance</w:t>
+      </w:r>
+      <w:r>
+        <w:t xml:space="preserve"> </w:t>
+      </w:r>
+      <m:oMath>
+        <m:sSup>
+          <m:e>
+            <m:r>
+              <m:t>σ</m:t>
+            </m:r>
+          </m:e>
+          <m:sup>
+            <m:r>
+              <m:t>2</m:t>
+            </m:r>
+          </m:sup>
+        </m:sSup>
+        <m:r>
+          <m:rPr>
+            <m:sty m:val="p"/>
+          </m:rPr>
+          <m:t>&gt;</m:t>
+        </m:r>
+        <m:r>
+          <m:t>0</m:t>
+        </m:r>
+      </m:oMath>
+      <w:r>
+        <w:t xml:space="preserve">,</w:t>
+      </w:r>
+      <w:r>
+        <w:t xml:space="preserve"> </w:t>
+      </w:r>
+      <w:r>
+        <w:t xml:space="preserve">and let</w:t>
+      </w:r>
+      <w:r>
+        <w:t xml:space="preserve"> </w:t>
+      </w:r>
+      <m:oMath>
+        <m:sSub>
+          <m:e>
+            <m:acc>
+              <m:accPr>
+                <m:chr m:val="‾"/>
+              </m:accPr>
+              <m:e>
+                <m:r>
+                  <m:t>X</m:t>
+                </m:r>
+              </m:e>
+            </m:acc>
+          </m:e>
+          <m:sub>
+            <m:r>
+              <m:t>n</m:t>
+            </m:r>
+          </m:sub>
+        </m:sSub>
+        <m:limUpp>
+          <m:e>
+            <m:r>
+              <m:rPr>
+                <m:sty m:val="p"/>
+              </m:rPr>
+              <m:t>=</m:t>
+            </m:r>
+          </m:e>
+          <m:lim>
+            <m:r>
+              <m:rPr>
+                <m:nor/>
+                <m:sty m:val="p"/>
+              </m:rPr>
+              <m:t>def</m:t>
+            </m:r>
+          </m:lim>
+        </m:limUpp>
+        <m:f>
+          <m:fPr>
+            <m:type m:val="bar"/>
+          </m:fPr>
+          <m:num>
+            <m:r>
+              <m:t>1</m:t>
+            </m:r>
+          </m:num>
+          <m:den>
+            <m:r>
+              <m:t>n</m:t>
+            </m:r>
+          </m:den>
+        </m:f>
+        <m:nary>
+          <m:naryPr>
+            <m:chr m:val="∑"/>
+            <m:limLoc m:val="undOvr"/>
+            <m:subHide m:val="off"/>
+            <m:supHide m:val="off"/>
+          </m:naryPr>
+          <m:sub>
+            <m:r>
+              <m:t>i</m:t>
+            </m:r>
+            <m:r>
+              <m:rPr>
+                <m:sty m:val="p"/>
+              </m:rPr>
+              <m:t>=</m:t>
+            </m:r>
+            <m:r>
+              <m:t>1</m:t>
+            </m:r>
+          </m:sub>
+          <m:sup>
+            <m:r>
+              <m:t>n</m:t>
+            </m:r>
+          </m:sup>
+          <m:e>
+            <m:sSub>
+              <m:e>
+                <m:r>
+                  <m:t>X</m:t>
+                </m:r>
+              </m:e>
+              <m:sub>
+                <m:r>
+                  <m:t>i</m:t>
+                </m:r>
+              </m:sub>
+            </m:sSub>
+          </m:e>
+        </m:nary>
+      </m:oMath>
+      <w:r>
+        <w:t xml:space="preserve"> </w:t>
+      </w:r>
+      <w:r>
+        <w:t xml:space="preserve">be the sample mean.</w:t>
+      </w:r>
+      <w:r>
+        <w:t xml:space="preserve"> </w:t>
+      </w:r>
+      <w:r>
+        <w:t xml:space="preserve">Then the sample mean</w:t>
+      </w:r>
+      <w:r>
+        <w:t xml:space="preserve"> </w:t>
+      </w:r>
+      <w:hyperlink w:anchor="def-convergence-in-probability">
+        <w:r>
+          <w:rPr>
+            <w:rStyle w:val="Hyperlink"/>
+          </w:rPr>
+          <w:t xml:space="preserve">converges in probability</w:t>
+        </w:r>
+      </w:hyperlink>
+      <w:r>
+        <w:t xml:space="preserve"> </w:t>
+      </w:r>
+      <w:r>
+        <w:t xml:space="preserve">to</w:t>
+      </w:r>
+      <w:r>
+        <w:t xml:space="preserve"> </w:t>
+      </w:r>
+      <m:oMath>
+        <m:r>
+          <m:t>μ</m:t>
+        </m:r>
+      </m:oMath>
+      <w:r>
+        <w:t xml:space="preserve">:</w:t>
+      </w:r>
+    </w:p>
+    <w:p>
+      <w:pPr>
+        <w:pStyle w:val="BodyText"/>
+      </w:pPr>
+      <m:oMathPara>
+        <m:oMathParaPr>
+          <m:jc m:val="center"/>
+        </m:oMathParaPr>
+        <m:oMath>
+          <m:sSub>
+            <m:e>
+              <m:acc>
+                <m:accPr>
+                  <m:chr m:val="‾"/>
+                </m:accPr>
+                <m:e>
+                  <m:r>
+                    <m:t>X</m:t>
+                  </m:r>
+                </m:e>
+              </m:acc>
+            </m:e>
+            <m:sub>
+              <m:r>
+                <m:t>n</m:t>
+              </m:r>
+            </m:sub>
+          </m:sSub>
+          <m:limUpp>
+            <m:e>
+              <m:r>
+                <m:rPr>
+                  <m:sty m:val="p"/>
+                </m:rPr>
+                <m:t>→</m:t>
+              </m:r>
+            </m:e>
+            <m:lim>
+              <m:r>
+                <m:t>p</m:t>
+              </m:r>
+            </m:lim>
+          </m:limUpp>
+          <m:r>
+            <m:t>μ</m:t>
+          </m:r>
+        </m:oMath>
+      </m:oMathPara>
+    </w:p>
+    <w:tbl>
+      <w:tblPr>
+        <w:tblStyle w:val="Table"/>
+        <w:tblLook w:firstRow="0" w:lastRow="0" w:firstColumn="0" w:lastColumn="0" w:noHBand="0" w:noVBand="0" w:val="0000"/>
+        <w:tblBorders>
+          <w:top w:val="single" w:sz="4" w:space="0" w:color="0758E5"/>
+          <w:left w:val="single" w:sz="24" w:space="0" w:color="0758E5"/>
+          <w:bottom w:val="single" w:sz="4" w:space="0" w:color="0758E5"/>
+          <w:right w:val="single" w:sz="4" w:space="0" w:color="0758E5"/>
+        </w:tblBorders>
+        <w:tblCellMar>
+          <w:left w:w="144" w:type="dxa"/>
+          <w:right w:w="144" w:type="dxa"/>
+        </w:tblCellMar>
+        <w:tblLook w:firstRow="0" w:lastRow="0" w:firstColumn="0" w:lastColumn="0" w:noHBand="0" w:noVBand="0" w:val="0000"/>
+      </w:tblPr>
+      <w:tr>
+        <w:trPr>
+          <w:cantSplit/>
+        </w:trPr>
+        <w:tc>
+          <w:tcPr>
+            <w:shd w:color="auto" w:fill="dae6fb" w:val="clear"/>
+            <w:tcMar>
+              <w:top w:w="92" w:type="dxa"/>
+              <w:bottom w:w="92" w:type="dxa"/>
+            </w:tcMar>
+          </w:tcPr>
+          <w:p>
+            <w:pPr>
+              <w:pStyle w:val="FirstParagraph"/>
+            </w:pPr>
+            <w:pPr>
+              <w:spacing w:before="0" w:after="0"/>
+              <w:textAlignment w:val="center"/>
+            </w:pPr>
+            <w:r>
+              <w:drawing>
+                <wp:inline>
+                  <wp:extent cx="152400" cy="152400"/>
+                  <wp:effectExtent b="0" l="0" r="0" t="0"/>
+                  <wp:docPr descr="" title="" id="54" name="Picture"/>
+                  <a:graphic>
+                    <a:graphicData uri="http://schemas.openxmlformats.org/drawingml/2006/picture">
+                      <pic:pic>
+                        <pic:nvPicPr>
+                          <pic:cNvPr descr="/opt/quarto/share/formats/docx/note.png" id="55" name="Picture"/>
+                          <pic:cNvPicPr>
+                            <a:picLocks noChangeArrowheads="1" noChangeAspect="1"/>
+                          </pic:cNvPicPr>
+                        </pic:nvPicPr>
+                        <pic:blipFill>
+                          <a:blip r:embed="rId50"/>
+                          <a:stretch>
+                            <a:fillRect/>
+                          </a:stretch>
+                        </pic:blipFill>
+                        <pic:spPr bwMode="auto">
+                          <a:xfrm>
+                            <a:off x="0" y="0"/>
+                            <a:ext cx="152400" cy="152400"/>
+                          </a:xfrm>
+                          <a:prstGeom prst="rect">
+                            <a:avLst/>
+                          </a:prstGeom>
+                          <a:noFill/>
+                          <a:ln w="9525">
+                            <a:noFill/>
+                            <a:headEnd/>
+                            <a:tailEnd/>
+                          </a:ln>
+                        </pic:spPr>
+                      </pic:pic>
+                    </a:graphicData>
+                  </a:graphic>
+                </wp:inline>
+              </w:drawing>
+            </w:r>
+            <w:r>
+              <w:t xml:space="preserve"> </w:t>
+            </w:r>
+            <w:r>
+              <w:t xml:space="preserve"> </w:t>
+            </w:r>
+            <w:r>
+              <w:t xml:space="preserve">Source</w:t>
+            </w:r>
+          </w:p>
+        </w:tc>
+      </w:tr>
+      <w:tr>
+        <w:trPr>
+          <w:cantSplit/>
+        </w:trPr>
+        <w:tc>
+          <w:tcPr>
+            <w:tcMar>
+              <w:top w:w="108" w:type="dxa"/>
+              <w:bottom w:w="108" w:type="dxa"/>
+            </w:tcMar>
+          </w:tcPr>
+          <w:p>
+            <w:pPr>
+              <w:pStyle w:val="BodyText"/>
+            </w:pPr>
+            <w:pPr>
+              <w:spacing w:before="16" w:after="16"/>
+            </w:pPr>
+            <w:r>
+              <w:t xml:space="preserve">Casella and Berger (2002, Thm. 5.5.2)</w:t>
+            </w:r>
+            <w:r>
+              <w:t xml:space="preserve">.</w:t>
+            </w:r>
+          </w:p>
+          <w:p/>
+        </w:tc>
+      </w:tr>
+    </w:tbl>
+    <w:bookmarkEnd w:id="56"/>
+    <w:p>
+      <w:pPr>
+        <w:pStyle w:val="BodyText"/>
+      </w:pPr>
+      <w:r>
+        <w:rPr>
+          <w:i/>
+          <w:iCs/>
+        </w:rPr>
+        <w:t xml:space="preserve">Proof</w:t>
+      </w:r>
+      <w:r>
+        <w:t xml:space="preserve">. </w:t>
+      </w:r>
+      <w:r>
+        <w:t xml:space="preserve">By</w:t>
+      </w:r>
+      <w:r>
+        <w:t xml:space="preserve"> </w:t>
+      </w:r>
+      <w:hyperlink w:anchor="cor-sum-iid-moments">
+        <w:r>
+          <w:rPr>
+            <w:rStyle w:val="Hyperlink"/>
+          </w:rPr>
+          <w:t xml:space="preserve">Corollary 1</w:t>
+        </w:r>
+      </w:hyperlink>
+      <w:r>
+        <w:t xml:space="preserve">,</w:t>
+      </w:r>
+      <w:r>
+        <w:t xml:space="preserve"> </w:t>
+      </w:r>
+      <m:oMath>
+        <m:r>
+          <m:rPr>
+            <m:sty m:val="p"/>
+          </m:rPr>
+          <m:t>E</m:t>
+        </m:r>
+        <m:r>
+          <m:t>​</m:t>
+        </m:r>
+        <m:d>
+          <m:dPr>
+            <m:begChr m:val="["/>
+            <m:sepChr m:val=""/>
+            <m:endChr m:val="]"/>
+            <m:grow/>
+          </m:dPr>
+          <m:e>
+            <m:sSub>
+              <m:e>
+                <m:r>
+                  <m:t>S</m:t>
+                </m:r>
+              </m:e>
+              <m:sub>
+                <m:r>
+                  <m:t>n</m:t>
+                </m:r>
+              </m:sub>
+            </m:sSub>
+          </m:e>
+        </m:d>
+        <m:r>
+          <m:t>​</m:t>
+        </m:r>
+        <m:r>
+          <m:rPr>
+            <m:sty m:val="p"/>
+          </m:rPr>
+          <m:t>=</m:t>
+        </m:r>
+        <m:r>
+          <m:t>n</m:t>
+        </m:r>
+        <m:r>
+          <m:t>μ</m:t>
+        </m:r>
+      </m:oMath>
+      <w:r>
+        <w:t xml:space="preserve"> </w:t>
+      </w:r>
+      <w:r>
+        <w:t xml:space="preserve">and</w:t>
+      </w:r>
+      <w:r>
+        <w:t xml:space="preserve"> </w:t>
+      </w:r>
+      <m:oMath>
+        <m:r>
+          <m:rPr>
+            <m:sty m:val="p"/>
+          </m:rPr>
+          <m:t>Var</m:t>
+        </m:r>
+        <m:r>
+          <m:t>​</m:t>
+        </m:r>
+        <m:d>
+          <m:dPr>
+            <m:begChr m:val="("/>
+            <m:sepChr m:val=""/>
+            <m:endChr m:val=")"/>
+            <m:grow/>
+          </m:dPr>
+          <m:e>
+            <m:sSub>
+              <m:e>
+                <m:r>
+                  <m:t>S</m:t>
+                </m:r>
+              </m:e>
+              <m:sub>
+                <m:r>
+                  <m:t>n</m:t>
+                </m:r>
+              </m:sub>
+            </m:sSub>
+          </m:e>
+        </m:d>
+        <m:r>
+          <m:t>​</m:t>
+        </m:r>
+        <m:r>
+          <m:rPr>
+            <m:sty m:val="p"/>
+          </m:rPr>
+          <m:t>=</m:t>
+        </m:r>
+        <m:r>
+          <m:t>n</m:t>
+        </m:r>
+        <m:sSup>
+          <m:e>
+            <m:r>
+              <m:t>σ</m:t>
+            </m:r>
+          </m:e>
+          <m:sup>
+            <m:r>
+              <m:t>2</m:t>
+            </m:r>
+          </m:sup>
+        </m:sSup>
+      </m:oMath>
+      <w:r>
+        <w:t xml:space="preserve">,</w:t>
+      </w:r>
+      <w:r>
+        <w:t xml:space="preserve"> </w:t>
+      </w:r>
+      <w:r>
+        <w:t xml:space="preserve">where</w:t>
+      </w:r>
+      <w:r>
+        <w:t xml:space="preserve"> </w:t>
+      </w:r>
+      <m:oMath>
+        <m:sSub>
+          <m:e>
+            <m:r>
+              <m:t>S</m:t>
+            </m:r>
+          </m:e>
+          <m:sub>
+            <m:r>
+              <m:t>n</m:t>
+            </m:r>
+          </m:sub>
+        </m:sSub>
+        <m:limUpp>
+          <m:e>
+            <m:r>
+              <m:rPr>
+                <m:sty m:val="p"/>
+              </m:rPr>
+              <m:t>=</m:t>
+            </m:r>
+          </m:e>
+          <m:lim>
+            <m:r>
+              <m:rPr>
+                <m:nor/>
+                <m:sty m:val="p"/>
+              </m:rPr>
+              <m:t>def</m:t>
+            </m:r>
+          </m:lim>
+        </m:limUpp>
+        <m:nary>
+          <m:naryPr>
+            <m:chr m:val="∑"/>
+            <m:limLoc m:val="undOvr"/>
+            <m:subHide m:val="off"/>
+            <m:supHide m:val="off"/>
+          </m:naryPr>
+          <m:sub>
+            <m:r>
+              <m:t>i</m:t>
+            </m:r>
+            <m:r>
+              <m:rPr>
+                <m:sty m:val="p"/>
+              </m:rPr>
+              <m:t>=</m:t>
+            </m:r>
+            <m:r>
+              <m:t>1</m:t>
+            </m:r>
+          </m:sub>
+          <m:sup>
+            <m:r>
+              <m:t>n</m:t>
+            </m:r>
+          </m:sup>
+          <m:e>
+            <m:sSub>
+              <m:e>
+                <m:r>
+                  <m:t>X</m:t>
+                </m:r>
+              </m:e>
+              <m:sub>
+                <m:r>
+                  <m:t>i</m:t>
+                </m:r>
+              </m:sub>
+            </m:sSub>
+          </m:e>
+        </m:nary>
+      </m:oMath>
+      <w:r>
+        <w:t xml:space="preserve">, so</w:t>
+      </w:r>
+      <w:r>
+        <w:t xml:space="preserve"> </w:t>
+      </w:r>
+      <m:oMath>
+        <m:sSub>
+          <m:e>
+            <m:acc>
+              <m:accPr>
+                <m:chr m:val="‾"/>
+              </m:accPr>
+              <m:e>
+                <m:r>
+                  <m:t>X</m:t>
+                </m:r>
+              </m:e>
+            </m:acc>
+          </m:e>
+          <m:sub>
+            <m:r>
+              <m:t>n</m:t>
+            </m:r>
+          </m:sub>
+        </m:sSub>
+        <m:r>
+          <m:rPr>
+            <m:sty m:val="p"/>
+          </m:rPr>
+          <m:t>=</m:t>
+        </m:r>
+        <m:sSub>
+          <m:e>
+            <m:r>
+              <m:t>S</m:t>
+            </m:r>
+          </m:e>
+          <m:sub>
+            <m:r>
+              <m:t>n</m:t>
+            </m:r>
+          </m:sub>
+        </m:sSub>
+        <m:r>
+          <m:rPr>
+            <m:sty m:val="p"/>
+          </m:rPr>
+          <m:t>/</m:t>
+        </m:r>
+        <m:r>
+          <m:t>n</m:t>
+        </m:r>
+      </m:oMath>
+      <w:r>
+        <w:t xml:space="preserve"> </w:t>
+      </w:r>
+      <w:r>
+        <w:t xml:space="preserve">has</w:t>
+      </w:r>
+    </w:p>
+    <w:p>
+      <w:pPr>
+        <w:pStyle w:val="BodyText"/>
+      </w:pPr>
+      <m:oMathPara>
+        <m:oMathParaPr>
+          <m:jc m:val="center"/>
+        </m:oMathParaPr>
+        <m:oMath>
+          <m:eqArr>
+            <m:e>
+              <m:r>
+                <m:rPr>
+                  <m:sty m:val="p"/>
+                </m:rPr>
+                <m:t>E</m:t>
+              </m:r>
+              <m:r>
+                <m:t>​</m:t>
+              </m:r>
+              <m:d>
+                <m:dPr>
+                  <m:begChr m:val="["/>
+                  <m:sepChr m:val=""/>
+                  <m:endChr m:val="]"/>
+                  <m:grow/>
+                </m:dPr>
+                <m:e>
+                  <m:sSub>
+                    <m:e>
+                      <m:acc>
+                        <m:accPr>
+                          <m:chr m:val="‾"/>
+                        </m:accPr>
+                        <m:e>
+                          <m:r>
+                            <m:t>X</m:t>
+                          </m:r>
+                        </m:e>
+                      </m:acc>
+                    </m:e>
+                    <m:sub>
+                      <m:r>
+                        <m:t>n</m:t>
+                      </m:r>
+                    </m:sub>
+                  </m:sSub>
+                </m:e>
+              </m:d>
+              <m:r>
+                <m:t>​</m:t>
+              </m:r>
+              <m:r>
+                <m:t>&amp;</m:t>
+              </m:r>
+              <m:r>
+                <m:rPr>
+                  <m:sty m:val="p"/>
+                </m:rPr>
+                <m:t>=</m:t>
+              </m:r>
+              <m:f>
+                <m:fPr>
+                  <m:type m:val="bar"/>
+                </m:fPr>
+                <m:num>
+                  <m:r>
+                    <m:t>1</m:t>
+                  </m:r>
+                </m:num>
+                <m:den>
+                  <m:r>
+                    <m:t>n</m:t>
+                  </m:r>
+                </m:den>
+              </m:f>
+              <m:r>
+                <m:rPr>
+                  <m:sty m:val="p"/>
+                </m:rPr>
+                <m:t>E</m:t>
+              </m:r>
+              <m:r>
+                <m:t>​</m:t>
+              </m:r>
+              <m:d>
+                <m:dPr>
+                  <m:begChr m:val="["/>
+                  <m:sepChr m:val=""/>
+                  <m:endChr m:val="]"/>
+                  <m:grow/>
+                </m:dPr>
+                <m:e>
+                  <m:sSub>
+                    <m:e>
+                      <m:r>
+                        <m:t>S</m:t>
+                      </m:r>
+                    </m:e>
+                    <m:sub>
+                      <m:r>
+                        <m:t>n</m:t>
+                      </m:r>
+                    </m:sub>
+                  </m:sSub>
+                </m:e>
+              </m:d>
+              <m:r>
+                <m:t>​</m:t>
+              </m:r>
+              <m:r>
+                <m:t>&amp;</m:t>
+              </m:r>
+              <m:r>
+                <m:t>&amp;</m:t>
+              </m:r>
+              <m:r>
+                <m:rPr>
+                  <m:nor/>
+                  <m:sty m:val="p"/>
+                </m:rPr>
+                <m:t>(linearity of expectation)</m:t>
+              </m:r>
+            </m:e>
+            <m:e>
+              <m:r>
+                <m:t>&amp;</m:t>
+              </m:r>
+              <m:r>
+                <m:rPr>
+                  <m:sty m:val="p"/>
+                </m:rPr>
+                <m:t>=</m:t>
+              </m:r>
+              <m:f>
+                <m:fPr>
+                  <m:type m:val="bar"/>
+                </m:fPr>
+                <m:num>
+                  <m:r>
+                    <m:t>1</m:t>
+                  </m:r>
+                </m:num>
+                <m:den>
+                  <m:r>
+                    <m:t>n</m:t>
+                  </m:r>
+                </m:den>
+              </m:f>
+              <m:r>
+                <m:rPr>
+                  <m:sty m:val="p"/>
+                </m:rPr>
+                <m:t>⋅</m:t>
+              </m:r>
+              <m:r>
+                <m:t>n</m:t>
+              </m:r>
+              <m:r>
+                <m:t>μ</m:t>
+              </m:r>
+              <m:r>
+                <m:t>&amp;</m:t>
+              </m:r>
+              <m:r>
+                <m:t>&amp;</m:t>
+              </m:r>
+              <m:r>
+                <m:rPr>
+                  <m:nor/>
+                  <m:sty m:val="p"/>
+                </m:rPr>
+                <m:t>(mean of a sum of IID variables)</m:t>
+              </m:r>
+            </m:e>
+            <m:e>
+              <m:r>
+                <m:t>&amp;</m:t>
+              </m:r>
+              <m:r>
+                <m:rPr>
+                  <m:sty m:val="p"/>
+                </m:rPr>
+                <m:t>=</m:t>
+              </m:r>
+              <m:r>
+                <m:t>μ</m:t>
+              </m:r>
+              <m:r>
+                <m:t>&amp;</m:t>
+              </m:r>
+              <m:r>
+                <m:t>&amp;</m:t>
+              </m:r>
+              <m:r>
+                <m:rPr>
+                  <m:nor/>
+                  <m:sty m:val="p"/>
+                </m:rPr>
+                <m:t>(cancel </m:t>
+              </m:r>
+              <m:r>
+                <m:t>n</m:t>
+              </m:r>
+              <m:r>
+                <m:rPr>
+                  <m:nor/>
+                  <m:sty m:val="p"/>
+                </m:rPr>
+                <m:t>)</m:t>
+              </m:r>
+            </m:e>
+            <m:e>
+              <m:r>
+                <m:rPr>
+                  <m:sty m:val="p"/>
+                </m:rPr>
+                <m:t>Var</m:t>
+              </m:r>
+              <m:r>
+                <m:t>​</m:t>
+              </m:r>
+              <m:d>
+                <m:dPr>
+                  <m:begChr m:val="("/>
+                  <m:sepChr m:val=""/>
+                  <m:endChr m:val=")"/>
+                  <m:grow/>
+                </m:dPr>
+                <m:e>
+                  <m:sSub>
+                    <m:e>
+                      <m:acc>
+                        <m:accPr>
+                          <m:chr m:val="‾"/>
+                        </m:accPr>
+                        <m:e>
+                          <m:r>
+                            <m:t>X</m:t>
+                          </m:r>
+                        </m:e>
+                      </m:acc>
+                    </m:e>
+                    <m:sub>
+                      <m:r>
+                        <m:t>n</m:t>
+                      </m:r>
+                    </m:sub>
+                  </m:sSub>
+                </m:e>
+              </m:d>
+              <m:r>
+                <m:t>​</m:t>
+              </m:r>
+              <m:r>
+                <m:t>&amp;</m:t>
+              </m:r>
+              <m:r>
+                <m:rPr>
+                  <m:sty m:val="p"/>
+                </m:rPr>
+                <m:t>=</m:t>
+              </m:r>
+              <m:f>
+                <m:fPr>
+                  <m:type m:val="bar"/>
+                </m:fPr>
+                <m:num>
+                  <m:r>
+                    <m:t>1</m:t>
+                  </m:r>
+                </m:num>
+                <m:den>
+                  <m:sSup>
+                    <m:e>
+                      <m:r>
+                        <m:t>n</m:t>
+                      </m:r>
+                    </m:e>
+                    <m:sup>
+                      <m:r>
+                        <m:t>2</m:t>
+                      </m:r>
+                    </m:sup>
+                  </m:sSup>
+                </m:den>
+              </m:f>
+              <m:r>
+                <m:rPr>
+                  <m:sty m:val="p"/>
+                </m:rPr>
+                <m:t>Var</m:t>
+              </m:r>
+              <m:r>
+                <m:t>​</m:t>
+              </m:r>
+              <m:d>
+                <m:dPr>
+                  <m:begChr m:val="("/>
+                  <m:sepChr m:val=""/>
+                  <m:endChr m:val=")"/>
+                  <m:grow/>
+                </m:dPr>
+                <m:e>
+                  <m:sSub>
+                    <m:e>
+                      <m:r>
+                        <m:t>S</m:t>
+                      </m:r>
+                    </m:e>
+                    <m:sub>
+                      <m:r>
+                        <m:t>n</m:t>
+                      </m:r>
+                    </m:sub>
+                  </m:sSub>
+                </m:e>
+              </m:d>
+              <m:r>
+                <m:t>​</m:t>
+              </m:r>
+              <m:r>
+                <m:t>&amp;</m:t>
+              </m:r>
+              <m:r>
+                <m:t>&amp;</m:t>
+              </m:r>
+              <m:r>
+                <m:rPr>
+                  <m:nor/>
+                  <m:sty m:val="p"/>
+                </m:rPr>
+                <m:t>(variance of a constant multiple)</m:t>
+              </m:r>
+            </m:e>
+            <m:e>
+              <m:r>
+                <m:t>&amp;</m:t>
+              </m:r>
+              <m:r>
+                <m:rPr>
+                  <m:sty m:val="p"/>
+                </m:rPr>
+                <m:t>=</m:t>
+              </m:r>
+              <m:f>
+                <m:fPr>
+                  <m:type m:val="bar"/>
+                </m:fPr>
+                <m:num>
+                  <m:r>
+                    <m:t>1</m:t>
+                  </m:r>
+                </m:num>
+                <m:den>
+                  <m:sSup>
+                    <m:e>
+                      <m:r>
+                        <m:t>n</m:t>
+                      </m:r>
+                    </m:e>
+                    <m:sup>
+                      <m:r>
+                        <m:t>2</m:t>
+                      </m:r>
+                    </m:sup>
+                  </m:sSup>
+                </m:den>
+              </m:f>
+              <m:r>
+                <m:rPr>
+                  <m:sty m:val="p"/>
+                </m:rPr>
+                <m:t>⋅</m:t>
+              </m:r>
+              <m:r>
+                <m:t>n</m:t>
+              </m:r>
+              <m:sSup>
+                <m:e>
+                  <m:r>
+                    <m:t>σ</m:t>
+                  </m:r>
+                </m:e>
+                <m:sup>
+                  <m:r>
+                    <m:t>2</m:t>
+                  </m:r>
+                </m:sup>
+              </m:sSup>
+              <m:r>
+                <m:t>&amp;</m:t>
+              </m:r>
+              <m:r>
+                <m:t>&amp;</m:t>
+              </m:r>
+              <m:r>
+                <m:rPr>
+                  <m:nor/>
+                  <m:sty m:val="p"/>
+                </m:rPr>
+                <m:t>(variance of a sum of IID variables)</m:t>
+              </m:r>
+            </m:e>
+            <m:e>
+              <m:r>
+                <m:t>&amp;</m:t>
+              </m:r>
+              <m:r>
+                <m:rPr>
+                  <m:sty m:val="p"/>
+                </m:rPr>
+                <m:t>=</m:t>
+              </m:r>
+              <m:f>
+                <m:fPr>
+                  <m:type m:val="bar"/>
+                </m:fPr>
+                <m:num>
+                  <m:sSup>
+                    <m:e>
+                      <m:r>
+                        <m:t>σ</m:t>
+                      </m:r>
+                    </m:e>
+                    <m:sup>
+                      <m:r>
+                        <m:t>2</m:t>
+                      </m:r>
+                    </m:sup>
+                  </m:sSup>
+                </m:num>
+                <m:den>
+                  <m:r>
+                    <m:t>n</m:t>
+                  </m:r>
+                </m:den>
+              </m:f>
+              <m:r>
+                <m:t>&amp;</m:t>
+              </m:r>
+              <m:r>
+                <m:t>&amp;</m:t>
+              </m:r>
+              <m:r>
+                <m:rPr>
+                  <m:nor/>
+                  <m:sty m:val="p"/>
+                </m:rPr>
+                <m:t>(cancel one factor of </m:t>
+              </m:r>
+              <m:r>
+                <m:t>n</m:t>
+              </m:r>
+              <m:r>
+                <m:rPr>
+                  <m:nor/>
+                  <m:sty m:val="p"/>
+                </m:rPr>
+                <m:t>)</m:t>
+              </m:r>
+            </m:e>
+          </m:eqArr>
+        </m:oMath>
+      </m:oMathPara>
+    </w:p>
+    <w:p>
+      <w:pPr>
+        <w:pStyle w:val="FirstParagraph"/>
+      </w:pPr>
+      <w:r>
+        <w:t xml:space="preserve">Fix</w:t>
+      </w:r>
+      <w:r>
+        <w:t xml:space="preserve"> </w:t>
+      </w:r>
+      <m:oMath>
+        <m:r>
+          <m:t>ε</m:t>
+        </m:r>
+        <m:r>
+          <m:rPr>
+            <m:sty m:val="p"/>
+          </m:rPr>
+          <m:t>&gt;</m:t>
+        </m:r>
+        <m:r>
+          <m:t>0</m:t>
+        </m:r>
+      </m:oMath>
+      <w:r>
+        <w:t xml:space="preserve"> </w:t>
+      </w:r>
+      <w:r>
+        <w:t xml:space="preserve">and let</w:t>
+      </w:r>
+      <w:r>
+        <w:t xml:space="preserve"> </w:t>
+      </w:r>
+      <m:oMath>
+        <m:r>
+          <m:t>k</m:t>
+        </m:r>
+        <m:limUpp>
+          <m:e>
+            <m:r>
+              <m:rPr>
+                <m:sty m:val="p"/>
+              </m:rPr>
+              <m:t>=</m:t>
+            </m:r>
+          </m:e>
+          <m:lim>
+            <m:r>
+              <m:rPr>
+                <m:nor/>
+                <m:sty m:val="p"/>
+              </m:rPr>
+              <m:t>def</m:t>
+            </m:r>
+          </m:lim>
+        </m:limUpp>
+        <m:r>
+          <m:t>ε</m:t>
+        </m:r>
+        <m:rad>
+          <m:radPr>
+            <m:degHide m:val="on"/>
+          </m:radPr>
+          <m:deg/>
+          <m:e>
+            <m:r>
+              <m:t>n</m:t>
+            </m:r>
+          </m:e>
+        </m:rad>
+        <m:r>
+          <m:rPr>
+            <m:sty m:val="p"/>
+          </m:rPr>
+          <m:t>/</m:t>
+        </m:r>
+        <m:r>
+          <m:t>σ</m:t>
+        </m:r>
+      </m:oMath>
+      <w:r>
+        <w:t xml:space="preserve">,</w:t>
+      </w:r>
+      <w:r>
+        <w:t xml:space="preserve"> </w:t>
+      </w:r>
+      <w:r>
+        <w:t xml:space="preserve">so that</w:t>
+      </w:r>
+      <w:r>
+        <w:t xml:space="preserve"> </w:t>
+      </w:r>
+      <m:oMath>
+        <m:r>
+          <m:t>k</m:t>
+        </m:r>
+        <m:r>
+          <m:t>σ</m:t>
+        </m:r>
+        <m:r>
+          <m:rPr>
+            <m:sty m:val="p"/>
+          </m:rPr>
+          <m:t>/</m:t>
+        </m:r>
+        <m:rad>
+          <m:radPr>
+            <m:degHide m:val="on"/>
+          </m:radPr>
+          <m:deg/>
+          <m:e>
+            <m:r>
+              <m:t>n</m:t>
+            </m:r>
+          </m:e>
+        </m:rad>
+        <m:r>
+          <m:rPr>
+            <m:sty m:val="p"/>
+          </m:rPr>
+          <m:t>=</m:t>
+        </m:r>
+        <m:r>
+          <m:t>ε</m:t>
+        </m:r>
+      </m:oMath>
+      <w:r>
+        <w:t xml:space="preserve">.</w:t>
+      </w:r>
+      <w:r>
+        <w:t xml:space="preserve"> </w:t>
+      </w:r>
+      <w:hyperlink w:anchor="thm-chebyshev">
+        <w:r>
+          <w:rPr>
+            <w:rStyle w:val="Hyperlink"/>
+          </w:rPr>
+          <w:t xml:space="preserve">Chebyshev’s inequality</w:t>
+        </w:r>
+      </w:hyperlink>
+      <w:r>
+        <w:t xml:space="preserve"> </w:t>
+      </w:r>
+      <w:r>
+        <w:t xml:space="preserve">for</w:t>
+      </w:r>
+      <w:r>
+        <w:t xml:space="preserve"> </w:t>
+      </w:r>
+      <m:oMath>
+        <m:sSub>
+          <m:e>
+            <m:acc>
+              <m:accPr>
+                <m:chr m:val="‾"/>
+              </m:accPr>
+              <m:e>
+                <m:r>
+                  <m:t>X</m:t>
+                </m:r>
+              </m:e>
+            </m:acc>
+          </m:e>
+          <m:sub>
+            <m:r>
+              <m:t>n</m:t>
+            </m:r>
+          </m:sub>
+        </m:sSub>
+      </m:oMath>
+      <w:r>
+        <w:t xml:space="preserve">,</w:t>
+      </w:r>
+      <w:r>
+        <w:t xml:space="preserve"> </w:t>
+      </w:r>
+      <w:r>
+        <w:t xml:space="preserve">whose standard deviation is</w:t>
+      </w:r>
+      <w:r>
+        <w:t xml:space="preserve"> </w:t>
+      </w:r>
+      <m:oMath>
+        <m:r>
+          <m:t>σ</m:t>
+        </m:r>
+        <m:r>
+          <m:rPr>
+            <m:sty m:val="p"/>
+          </m:rPr>
+          <m:t>/</m:t>
+        </m:r>
+        <m:rad>
+          <m:radPr>
+            <m:degHide m:val="on"/>
+          </m:radPr>
+          <m:deg/>
+          <m:e>
+            <m:r>
+              <m:t>n</m:t>
+            </m:r>
+          </m:e>
+        </m:rad>
+      </m:oMath>
+      <w:r>
+        <w:t xml:space="preserve">, gives</w:t>
+      </w:r>
+    </w:p>
+    <w:p>
+      <w:pPr>
+        <w:pStyle w:val="BodyText"/>
+      </w:pPr>
+      <m:oMathPara>
+        <m:oMathParaPr>
+          <m:jc m:val="center"/>
+        </m:oMathParaPr>
+        <m:oMath>
+          <m:eqArr>
+            <m:e>
+              <m:r>
+                <m:t>0</m:t>
+              </m:r>
+              <m:r>
+                <m:rPr>
+                  <m:sty m:val="p"/>
+                </m:rPr>
+                <m:t>≤</m:t>
+              </m:r>
+              <m:r>
+                <m:rPr>
+                  <m:sty m:val="p"/>
+                </m:rPr>
+                <m:t>Pr</m:t>
+              </m:r>
+              <m:r>
+                <m:t>​</m:t>
+              </m:r>
+              <m:d>
+                <m:dPr>
+                  <m:begChr m:val="("/>
+                  <m:sepChr m:val=""/>
+                  <m:endChr m:val=")"/>
+                  <m:grow/>
+                </m:dPr>
+                <m:e>
+                  <m:r>
+                    <m:t>​</m:t>
+                  </m:r>
+                  <m:d>
+                    <m:dPr>
+                      <m:begChr m:val="|"/>
+                      <m:sepChr m:val=""/>
+                      <m:endChr m:val="|"/>
+                      <m:grow/>
+                    </m:dPr>
+                    <m:e>
+                      <m:sSub>
+                        <m:e>
+                          <m:acc>
+                            <m:accPr>
+                              <m:chr m:val="‾"/>
+                            </m:accPr>
+                            <m:e>
+                              <m:r>
+                                <m:t>X</m:t>
+                              </m:r>
+                            </m:e>
+                          </m:acc>
+                        </m:e>
+                        <m:sub>
+                          <m:r>
+                            <m:t>n</m:t>
+                          </m:r>
+                        </m:sub>
+                      </m:sSub>
+                      <m:r>
+                        <m:rPr>
+                          <m:sty m:val="p"/>
+                        </m:rPr>
+                        <m:t>−</m:t>
+                      </m:r>
+                      <m:r>
+                        <m:t>μ</m:t>
+                      </m:r>
+                    </m:e>
+                  </m:d>
+                  <m:r>
+                    <m:t>​</m:t>
+                  </m:r>
+                  <m:r>
+                    <m:rPr>
+                      <m:sty m:val="p"/>
+                    </m:rPr>
+                    <m:t>≥</m:t>
+                  </m:r>
+                  <m:r>
+                    <m:t>ε</m:t>
+                  </m:r>
+                </m:e>
+              </m:d>
+              <m:r>
+                <m:t>​</m:t>
+              </m:r>
+              <m:r>
+                <m:t>&amp;</m:t>
+              </m:r>
+              <m:r>
+                <m:rPr>
+                  <m:sty m:val="p"/>
+                </m:rPr>
+                <m:t>=</m:t>
+              </m:r>
+              <m:r>
+                <m:rPr>
+                  <m:sty m:val="p"/>
+                </m:rPr>
+                <m:t>Pr</m:t>
+              </m:r>
+              <m:r>
+                <m:t>​</m:t>
+              </m:r>
+              <m:d>
+                <m:dPr>
+                  <m:begChr m:val="("/>
+                  <m:sepChr m:val=""/>
+                  <m:endChr m:val=")"/>
+                  <m:grow/>
+                </m:dPr>
+                <m:e>
+                  <m:r>
+                    <m:t>​</m:t>
+                  </m:r>
+                  <m:d>
+                    <m:dPr>
+                      <m:begChr m:val="|"/>
+                      <m:sepChr m:val=""/>
+                      <m:endChr m:val="|"/>
+                      <m:grow/>
+                    </m:dPr>
+                    <m:e>
+                      <m:sSub>
+                        <m:e>
+                          <m:acc>
+                            <m:accPr>
+                              <m:chr m:val="‾"/>
+                            </m:accPr>
+                            <m:e>
+                              <m:r>
+                                <m:t>X</m:t>
+                              </m:r>
+                            </m:e>
+                          </m:acc>
+                        </m:e>
+                        <m:sub>
+                          <m:r>
+                            <m:t>n</m:t>
+                          </m:r>
+                        </m:sub>
+                      </m:sSub>
+                      <m:r>
+                        <m:rPr>
+                          <m:sty m:val="p"/>
+                        </m:rPr>
+                        <m:t>−</m:t>
+                      </m:r>
+                      <m:r>
+                        <m:t>μ</m:t>
+                      </m:r>
+                    </m:e>
+                  </m:d>
+                  <m:r>
+                    <m:t>​</m:t>
+                  </m:r>
+                  <m:r>
+                    <m:rPr>
+                      <m:sty m:val="p"/>
+                    </m:rPr>
+                    <m:t>≥</m:t>
+                  </m:r>
+                  <m:r>
+                    <m:t>k</m:t>
+                  </m:r>
+                  <m:f>
+                    <m:fPr>
+                      <m:type m:val="bar"/>
+                    </m:fPr>
+                    <m:num>
+                      <m:r>
+                        <m:t>σ</m:t>
+                      </m:r>
+                    </m:num>
+                    <m:den>
+                      <m:rad>
+                        <m:radPr>
+                          <m:degHide m:val="on"/>
+                        </m:radPr>
+                        <m:deg/>
+                        <m:e>
+                          <m:r>
+                            <m:t>n</m:t>
+                          </m:r>
+                        </m:e>
+                      </m:rad>
+                    </m:den>
+                  </m:f>
+                </m:e>
+              </m:d>
+              <m:r>
+                <m:t>​</m:t>
+              </m:r>
+              <m:r>
+                <m:t>&amp;</m:t>
+              </m:r>
+              <m:r>
+                <m:t>&amp;</m:t>
+              </m:r>
+              <m:r>
+                <m:rPr>
+                  <m:nor/>
+                  <m:sty m:val="p"/>
+                </m:rPr>
+                <m:t>(definition of </m:t>
+              </m:r>
+              <m:r>
+                <m:t>k</m:t>
+              </m:r>
+              <m:r>
+                <m:rPr>
+                  <m:nor/>
+                  <m:sty m:val="p"/>
+                </m:rPr>
+                <m:t>)</m:t>
+              </m:r>
+            </m:e>
+            <m:e>
+              <m:r>
+                <m:t>&amp;</m:t>
+              </m:r>
+              <m:r>
+                <m:rPr>
+                  <m:sty m:val="p"/>
+                </m:rPr>
+                <m:t>≤</m:t>
+              </m:r>
+              <m:f>
+                <m:fPr>
+                  <m:type m:val="bar"/>
+                </m:fPr>
+                <m:num>
+                  <m:r>
+                    <m:t>1</m:t>
+                  </m:r>
+                </m:num>
+                <m:den>
+                  <m:sSup>
+                    <m:e>
+                      <m:r>
+                        <m:t>k</m:t>
+                      </m:r>
+                    </m:e>
+                    <m:sup>
+                      <m:r>
+                        <m:t>2</m:t>
+                      </m:r>
+                    </m:sup>
+                  </m:sSup>
+                </m:den>
+              </m:f>
+              <m:r>
+                <m:t>&amp;</m:t>
+              </m:r>
+              <m:r>
+                <m:t>&amp;</m:t>
+              </m:r>
+              <m:r>
+                <m:rPr>
+                  <m:nor/>
+                  <m:sty m:val="p"/>
+                </m:rPr>
+                <m:t>(Chebyshev’s inequality)</m:t>
+              </m:r>
+            </m:e>
+            <m:e>
+              <m:r>
+                <m:t>&amp;</m:t>
+              </m:r>
+              <m:r>
+                <m:rPr>
+                  <m:sty m:val="p"/>
+                </m:rPr>
+                <m:t>=</m:t>
+              </m:r>
+              <m:f>
+                <m:fPr>
+                  <m:type m:val="bar"/>
+                </m:fPr>
+                <m:num>
+                  <m:sSup>
+                    <m:e>
+                      <m:r>
+                        <m:t>σ</m:t>
+                      </m:r>
+                    </m:e>
+                    <m:sup>
+                      <m:r>
+                        <m:t>2</m:t>
+                      </m:r>
+                    </m:sup>
+                  </m:sSup>
+                </m:num>
+                <m:den>
+                  <m:r>
+                    <m:t>n</m:t>
+                  </m:r>
+                  <m:sSup>
+                    <m:e>
+                      <m:r>
+                        <m:t>ε</m:t>
+                      </m:r>
+                    </m:e>
+                    <m:sup>
+                      <m:r>
+                        <m:t>2</m:t>
+                      </m:r>
+                    </m:sup>
+                  </m:sSup>
+                </m:den>
+              </m:f>
+              <m:r>
+                <m:t>&amp;</m:t>
+              </m:r>
+              <m:r>
+                <m:t>&amp;</m:t>
+              </m:r>
+              <m:r>
+                <m:rPr>
+                  <m:nor/>
+                  <m:sty m:val="p"/>
+                </m:rPr>
+                <m:t>(substitute </m:t>
+              </m:r>
+              <m:r>
+                <m:t>k</m:t>
+              </m:r>
+              <m:r>
+                <m:rPr>
+                  <m:nor/>
+                  <m:sty m:val="p"/>
+                </m:rPr>
+                <m:t>)</m:t>
+              </m:r>
+            </m:e>
+          </m:eqArr>
+        </m:oMath>
+      </m:oMathPara>
+    </w:p>
+    <w:p>
+      <w:pPr>
+        <w:pStyle w:val="FirstParagraph"/>
+      </w:pPr>
+      <w:r>
+        <w:t xml:space="preserve">The bound goes to zero as</w:t>
+      </w:r>
+      <w:r>
+        <w:t xml:space="preserve"> </w:t>
+      </w:r>
+      <m:oMath>
+        <m:r>
+          <m:t>n</m:t>
+        </m:r>
+        <m:r>
+          <m:rPr>
+            <m:sty m:val="p"/>
+          </m:rPr>
+          <m:t>→</m:t>
+        </m:r>
+        <m:r>
+          <m:rPr>
+            <m:sty m:val="p"/>
+          </m:rPr>
+          <m:t>∞</m:t>
+        </m:r>
+      </m:oMath>
+      <w:r>
+        <w:t xml:space="preserve">,</w:t>
+      </w:r>
+      <w:r>
+        <w:t xml:space="preserve"> </w:t>
+      </w:r>
+      <w:r>
+        <w:t xml:space="preserve">so the probability, squeezed between zero and the bound, goes to zero.</w:t>
+      </w:r>
+      <w:r>
+        <w:t xml:space="preserve"> </w:t>
+      </w:r>
+      <w:r>
+        <w:t xml:space="preserve">This holds for every</w:t>
+      </w:r>
+      <w:r>
+        <w:t xml:space="preserve"> </w:t>
+      </w:r>
+      <m:oMath>
+        <m:r>
+          <m:t>ε</m:t>
+        </m:r>
+        <m:r>
+          <m:rPr>
+            <m:sty m:val="p"/>
+          </m:rPr>
+          <m:t>&gt;</m:t>
+        </m:r>
+        <m:r>
+          <m:t>0</m:t>
+        </m:r>
+      </m:oMath>
+      <w:r>
+        <w:t xml:space="preserve">.</w:t>
+      </w:r>
+    </w:p>
+    <w:bookmarkEnd w:id="57"/>
+    <w:bookmarkStart w:id="74" w:name="references"/>
+    <w:p>
+      <w:pPr>
+        <w:pStyle w:val="Heading2"/>
+      </w:pPr>
+      <w:r>
         <w:t xml:space="preserve">References</w:t>
       </w:r>
     </w:p>
-    <w:bookmarkStart w:id="63" w:name="refs"/>
-    <w:bookmarkStart w:id="51" w:name="ref-fiveminuteai_probstat"/>
+    <w:bookmarkStart w:id="73" w:name="refs"/>
+    <w:bookmarkStart w:id="59" w:name="ref-fiveminuteai_probstat"/>
     <w:p>
       <w:pPr>
         <w:pStyle w:val="Bibliography"/>
@@ -21431,7 +23742,7 @@
       <w:r>
         <w:t xml:space="preserve"> </w:t>
       </w:r>
-      <w:hyperlink r:id="rId50">
+      <w:hyperlink r:id="rId58">
         <w:r>
           <w:rPr>
             <w:rStyle w:val="Hyperlink"/>
@@ -21443,8 +23754,8 @@
         <w:t xml:space="preserve">.</w:t>
       </w:r>
     </w:p>
-    <w:bookmarkEnd w:id="51"/>
-    <w:bookmarkStart w:id="53" w:name="ref-bienayme1853"/>
+    <w:bookmarkEnd w:id="59"/>
+    <w:bookmarkStart w:id="61" w:name="ref-bienayme1853"/>
     <w:p>
       <w:pPr>
         <w:pStyle w:val="Bibliography"/>
@@ -21489,7 +23800,7 @@
       <w:r>
         <w:t xml:space="preserve"> </w:t>
       </w:r>
-      <w:hyperlink r:id="rId52">
+      <w:hyperlink r:id="rId60">
         <w:r>
           <w:rPr>
             <w:rStyle w:val="Hyperlink"/>
@@ -21501,8 +23812,8 @@
         <w:t xml:space="preserve">.</w:t>
       </w:r>
     </w:p>
-    <w:bookmarkEnd w:id="53"/>
-    <w:bookmarkStart w:id="54" w:name="ref-billingsley1995probability"/>
+    <w:bookmarkEnd w:id="61"/>
+    <w:bookmarkStart w:id="62" w:name="ref-billingsley1995probability"/>
     <w:p>
       <w:pPr>
         <w:pStyle w:val="Bibliography"/>
@@ -21524,8 +23835,8 @@
         <w:t xml:space="preserve">. 3rd ed. Wiley Series in Probability and Mathematical Statistics. Wiley.</w:t>
       </w:r>
     </w:p>
-    <w:bookmarkEnd w:id="54"/>
-    <w:bookmarkStart w:id="56" w:name="ref-blitzstein2019introduction"/>
+    <w:bookmarkEnd w:id="62"/>
+    <w:bookmarkStart w:id="64" w:name="ref-blitzstein2019introduction"/>
     <w:p>
       <w:pPr>
         <w:pStyle w:val="Bibliography"/>
@@ -21549,7 +23860,7 @@
       <w:r>
         <w:t xml:space="preserve"> </w:t>
       </w:r>
-      <w:hyperlink r:id="rId55">
+      <w:hyperlink r:id="rId63">
         <w:r>
           <w:rPr>
             <w:rStyle w:val="Hyperlink"/>
@@ -21561,20 +23872,14 @@
         <w:t xml:space="preserve">.</w:t>
       </w:r>
     </w:p>
-    <w:bookmarkEnd w:id="56"/>
-    <w:bookmarkStart w:id="58" w:name="ref-hoeffding1963"/>
+    <w:bookmarkEnd w:id="64"/>
+    <w:bookmarkStart w:id="66" w:name="ref-CaseBerg01"/>
     <w:p>
       <w:pPr>
         <w:pStyle w:val="Bibliography"/>
       </w:pPr>
       <w:r>
-        <w:t xml:space="preserve">Hoeffding, Wassily. 1963.</w:t>
-      </w:r>
-      <w:r>
-        <w:t xml:space="preserve"> </w:t>
-      </w:r>
-      <w:r>
-        <w:t xml:space="preserve">“Probability Inequalities for Sums of Bounded Random Variables.”</w:t>
+        <w:t xml:space="preserve">Casella, George, and Roger Berger. 2002.</w:t>
       </w:r>
       <w:r>
         <w:t xml:space="preserve"> </w:t>
@@ -21584,6 +23889,49 @@
           <w:i/>
           <w:iCs/>
         </w:rPr>
+        <w:t xml:space="preserve">Statistical Inference</w:t>
+      </w:r>
+      <w:r>
+        <w:t xml:space="preserve">. 2nd ed. Cengage Learning.</w:t>
+      </w:r>
+      <w:r>
+        <w:t xml:space="preserve"> </w:t>
+      </w:r>
+      <w:hyperlink r:id="rId65">
+        <w:r>
+          <w:rPr>
+            <w:rStyle w:val="Hyperlink"/>
+          </w:rPr>
+          <w:t xml:space="preserve">https://www.cengage.com/c/statistical-inference-2e-casella-berger/9780534243128/</w:t>
+        </w:r>
+      </w:hyperlink>
+      <w:r>
+        <w:t xml:space="preserve">.</w:t>
+      </w:r>
+    </w:p>
+    <w:bookmarkEnd w:id="66"/>
+    <w:bookmarkStart w:id="68" w:name="ref-hoeffding1963"/>
+    <w:p>
+      <w:pPr>
+        <w:pStyle w:val="Bibliography"/>
+      </w:pPr>
+      <w:r>
+        <w:t xml:space="preserve">Hoeffding, Wassily. 1963.</w:t>
+      </w:r>
+      <w:r>
+        <w:t xml:space="preserve"> </w:t>
+      </w:r>
+      <w:r>
+        <w:t xml:space="preserve">“Probability Inequalities for Sums of Bounded Random Variables.”</w:t>
+      </w:r>
+      <w:r>
+        <w:t xml:space="preserve"> </w:t>
+      </w:r>
+      <w:r>
+        <w:rPr>
+          <w:i/>
+          <w:iCs/>
+        </w:rPr>
         <w:t xml:space="preserve">Journal of the American Statistical Association</w:t>
       </w:r>
       <w:r>
@@ -21595,7 +23943,7 @@
       <w:r>
         <w:t xml:space="preserve"> </w:t>
       </w:r>
-      <w:hyperlink r:id="rId57">
+      <w:hyperlink r:id="rId67">
         <w:r>
           <w:rPr>
             <w:rStyle w:val="Hyperlink"/>
@@ -21607,8 +23955,8 @@
         <w:t xml:space="preserve">.</w:t>
       </w:r>
     </w:p>
-    <w:bookmarkEnd w:id="58"/>
-    <w:bookmarkStart w:id="60" w:name="ref-seneta2013"/>
+    <w:bookmarkEnd w:id="68"/>
+    <w:bookmarkStart w:id="70" w:name="ref-seneta2013"/>
     <w:p>
       <w:pPr>
         <w:pStyle w:val="Bibliography"/>
@@ -21641,7 +23989,7 @@
       <w:r>
         <w:t xml:space="preserve"> </w:t>
       </w:r>
-      <w:hyperlink r:id="rId59">
+      <w:hyperlink r:id="rId69">
         <w:r>
           <w:rPr>
             <w:rStyle w:val="Hyperlink"/>
@@ -21653,8 +24001,8 @@
         <w:t xml:space="preserve">.</w:t>
       </w:r>
     </w:p>
-    <w:bookmarkEnd w:id="60"/>
-    <w:bookmarkStart w:id="62" w:name="ref-tchebichef1867"/>
+    <w:bookmarkEnd w:id="70"/>
+    <w:bookmarkStart w:id="72" w:name="ref-tchebichef1867"/>
     <w:p>
       <w:pPr>
         <w:pStyle w:val="Bibliography"/>
@@ -21684,7 +24032,7 @@
       <w:r>
         <w:t xml:space="preserve"> </w:t>
       </w:r>
-      <w:hyperlink r:id="rId61">
+      <w:hyperlink r:id="rId71">
         <w:r>
           <w:rPr>
             <w:rStyle w:val="Hyperlink"/>
@@ -21696,9 +24044,9 @@
         <w:t xml:space="preserve">.</w:t>
       </w:r>
     </w:p>
-    <w:bookmarkEnd w:id="62"/>
-    <w:bookmarkEnd w:id="63"/>
-    <w:bookmarkEnd w:id="64"/>
+    <w:bookmarkEnd w:id="72"/>
+    <w:bookmarkEnd w:id="73"/>
+    <w:bookmarkEnd w:id="74"/>
     <w:sectPr>
       <w:footnotePr>
         <w:numRestart w:val="eachSect"/>

</xml_diff>

<commit_message>
Deploying to gh-pages from @ Morrison-Lab/pds@a7e12af0a60deb06077a1e05937f33d2a3b91be9 🚀
</commit_message>
<xml_diff>
--- a/limit-theorems.docx
+++ b/limit-theorems.docx
@@ -15,7 +15,7 @@
         <w:pStyle w:val="Date"/>
       </w:pPr>
       <w:r>
-        <w:t xml:space="preserve">Last modified: 2026-10-15 05:08:19 (PDT)</w:t>
+        <w:t xml:space="preserve">Last modified: 2026-10-15 05:15:30 (PDT)</w:t>
       </w:r>
     </w:p>
     <w:bookmarkStart w:id="37" w:name="sec-clt"/>
@@ -7617,7 +7617,7 @@
       </w:r>
     </w:p>
     <w:bookmarkEnd w:id="37"/>
-    <w:bookmarkStart w:id="49" w:name="sec-tail-bounds"/>
+    <w:bookmarkStart w:id="50" w:name="sec-tail-bounds"/>
     <w:p>
       <w:pPr>
         <w:pStyle w:val="Heading2"/>
@@ -11978,7 +11978,554 @@
       </w:r>
     </w:p>
     <w:bookmarkEnd w:id="42"/>
-    <w:bookmarkStart w:id="43" w:name="lem-hoeffding"/>
+    <w:bookmarkStart w:id="43" w:name="thm-chebyshev-sample-mean"/>
+    <w:p>
+      <w:pPr>
+        <w:pStyle w:val="BodyText"/>
+      </w:pPr>
+      <w:r>
+        <w:rPr>
+          <w:b/>
+          <w:bCs/>
+        </w:rPr>
+        <w:t xml:space="preserve">Theorem 4 (Chebyshev’s inequality for a sample average)</w:t>
+      </w:r>
+      <w:r>
+        <w:t xml:space="preserve"> </w:t>
+      </w:r>
+      <w:r>
+        <w:t xml:space="preserve">Let</w:t>
+      </w:r>
+      <w:r>
+        <w:t xml:space="preserve"> </w:t>
+      </w:r>
+      <m:oMath>
+        <m:sSub>
+          <m:e>
+            <m:r>
+              <m:t>X</m:t>
+            </m:r>
+          </m:e>
+          <m:sub>
+            <m:r>
+              <m:t>1</m:t>
+            </m:r>
+          </m:sub>
+        </m:sSub>
+        <m:r>
+          <m:rPr>
+            <m:sty m:val="p"/>
+          </m:rPr>
+          <m:t>,</m:t>
+        </m:r>
+        <m:r>
+          <m:rPr>
+            <m:sty m:val="p"/>
+          </m:rPr>
+          <m:t>…</m:t>
+        </m:r>
+        <m:r>
+          <m:rPr>
+            <m:sty m:val="p"/>
+          </m:rPr>
+          <m:t>,</m:t>
+        </m:r>
+        <m:sSub>
+          <m:e>
+            <m:r>
+              <m:t>X</m:t>
+            </m:r>
+          </m:e>
+          <m:sub>
+            <m:r>
+              <m:t>n</m:t>
+            </m:r>
+          </m:sub>
+        </m:sSub>
+      </m:oMath>
+      <w:r>
+        <w:t xml:space="preserve"> </w:t>
+      </w:r>
+      <w:r>
+        <w:t xml:space="preserve">be</w:t>
+      </w:r>
+      <w:r>
+        <w:t xml:space="preserve"> </w:t>
+      </w:r>
+      <w:hyperlink r:id="rId9">
+        <w:r>
+          <w:rPr>
+            <w:rStyle w:val="Hyperlink"/>
+          </w:rPr>
+          <w:t xml:space="preserve">IID</w:t>
+        </w:r>
+      </w:hyperlink>
+      <w:r>
+        <w:t xml:space="preserve"> </w:t>
+      </w:r>
+      <w:r>
+        <w:t xml:space="preserve">random variables</w:t>
+      </w:r>
+      <w:r>
+        <w:t xml:space="preserve"> </w:t>
+      </w:r>
+      <w:r>
+        <w:t xml:space="preserve">with mean</w:t>
+      </w:r>
+      <w:r>
+        <w:t xml:space="preserve"> </w:t>
+      </w:r>
+      <m:oMath>
+        <m:r>
+          <m:t>μ</m:t>
+        </m:r>
+      </m:oMath>
+      <w:r>
+        <w:t xml:space="preserve"> </w:t>
+      </w:r>
+      <w:r>
+        <w:t xml:space="preserve">and finite variance</w:t>
+      </w:r>
+      <w:r>
+        <w:t xml:space="preserve"> </w:t>
+      </w:r>
+      <m:oMath>
+        <m:sSup>
+          <m:e>
+            <m:r>
+              <m:t>σ</m:t>
+            </m:r>
+          </m:e>
+          <m:sup>
+            <m:r>
+              <m:t>2</m:t>
+            </m:r>
+          </m:sup>
+        </m:sSup>
+        <m:r>
+          <m:rPr>
+            <m:sty m:val="p"/>
+          </m:rPr>
+          <m:t>&gt;</m:t>
+        </m:r>
+        <m:r>
+          <m:t>0</m:t>
+        </m:r>
+      </m:oMath>
+      <w:r>
+        <w:t xml:space="preserve">,</w:t>
+      </w:r>
+      <w:r>
+        <w:t xml:space="preserve"> </w:t>
+      </w:r>
+      <w:r>
+        <w:t xml:space="preserve">and let</w:t>
+      </w:r>
+      <w:r>
+        <w:t xml:space="preserve"> </w:t>
+      </w:r>
+      <m:oMath>
+        <m:sSub>
+          <m:e>
+            <m:acc>
+              <m:accPr>
+                <m:chr m:val="‾"/>
+              </m:accPr>
+              <m:e>
+                <m:r>
+                  <m:t>X</m:t>
+                </m:r>
+              </m:e>
+            </m:acc>
+          </m:e>
+          <m:sub>
+            <m:r>
+              <m:t>n</m:t>
+            </m:r>
+          </m:sub>
+        </m:sSub>
+        <m:limUpp>
+          <m:e>
+            <m:r>
+              <m:rPr>
+                <m:sty m:val="p"/>
+              </m:rPr>
+              <m:t>=</m:t>
+            </m:r>
+          </m:e>
+          <m:lim>
+            <m:r>
+              <m:rPr>
+                <m:nor/>
+                <m:sty m:val="p"/>
+              </m:rPr>
+              <m:t>def</m:t>
+            </m:r>
+          </m:lim>
+        </m:limUpp>
+        <m:f>
+          <m:fPr>
+            <m:type m:val="bar"/>
+          </m:fPr>
+          <m:num>
+            <m:r>
+              <m:t>1</m:t>
+            </m:r>
+          </m:num>
+          <m:den>
+            <m:r>
+              <m:t>n</m:t>
+            </m:r>
+          </m:den>
+        </m:f>
+        <m:nary>
+          <m:naryPr>
+            <m:chr m:val="∑"/>
+            <m:limLoc m:val="undOvr"/>
+            <m:subHide m:val="off"/>
+            <m:supHide m:val="off"/>
+          </m:naryPr>
+          <m:sub>
+            <m:r>
+              <m:t>i</m:t>
+            </m:r>
+            <m:r>
+              <m:rPr>
+                <m:sty m:val="p"/>
+              </m:rPr>
+              <m:t>=</m:t>
+            </m:r>
+            <m:r>
+              <m:t>1</m:t>
+            </m:r>
+          </m:sub>
+          <m:sup>
+            <m:r>
+              <m:t>n</m:t>
+            </m:r>
+          </m:sup>
+          <m:e>
+            <m:sSub>
+              <m:e>
+                <m:r>
+                  <m:t>X</m:t>
+                </m:r>
+              </m:e>
+              <m:sub>
+                <m:r>
+                  <m:t>i</m:t>
+                </m:r>
+              </m:sub>
+            </m:sSub>
+          </m:e>
+        </m:nary>
+      </m:oMath>
+      <w:r>
+        <w:t xml:space="preserve">.</w:t>
+      </w:r>
+      <w:r>
+        <w:t xml:space="preserve"> </w:t>
+      </w:r>
+      <w:r>
+        <w:t xml:space="preserve">Then for every</w:t>
+      </w:r>
+      <w:r>
+        <w:t xml:space="preserve"> </w:t>
+      </w:r>
+      <m:oMath>
+        <m:r>
+          <m:t>ϵ</m:t>
+        </m:r>
+        <m:r>
+          <m:rPr>
+            <m:sty m:val="p"/>
+          </m:rPr>
+          <m:t>&gt;</m:t>
+        </m:r>
+        <m:r>
+          <m:t>0</m:t>
+        </m:r>
+      </m:oMath>
+      <w:r>
+        <w:t xml:space="preserve">:</w:t>
+      </w:r>
+    </w:p>
+    <w:p>
+      <w:pPr>
+        <w:pStyle w:val="BodyText"/>
+      </w:pPr>
+      <m:oMathPara>
+        <m:oMathParaPr>
+          <m:jc m:val="center"/>
+        </m:oMathParaPr>
+        <m:oMath>
+          <m:r>
+            <m:rPr>
+              <m:sty m:val="p"/>
+            </m:rPr>
+            <m:t>Pr</m:t>
+          </m:r>
+          <m:r>
+            <m:t>​</m:t>
+          </m:r>
+          <m:d>
+            <m:dPr>
+              <m:begChr m:val="("/>
+              <m:sepChr m:val=""/>
+              <m:endChr m:val=")"/>
+              <m:grow/>
+            </m:dPr>
+            <m:e>
+              <m:r>
+                <m:t>​</m:t>
+              </m:r>
+              <m:d>
+                <m:dPr>
+                  <m:begChr m:val="|"/>
+                  <m:sepChr m:val=""/>
+                  <m:endChr m:val="|"/>
+                  <m:grow/>
+                </m:dPr>
+                <m:e>
+                  <m:sSub>
+                    <m:e>
+                      <m:acc>
+                        <m:accPr>
+                          <m:chr m:val="‾"/>
+                        </m:accPr>
+                        <m:e>
+                          <m:r>
+                            <m:t>X</m:t>
+                          </m:r>
+                        </m:e>
+                      </m:acc>
+                    </m:e>
+                    <m:sub>
+                      <m:r>
+                        <m:t>n</m:t>
+                      </m:r>
+                    </m:sub>
+                  </m:sSub>
+                  <m:r>
+                    <m:rPr>
+                      <m:sty m:val="p"/>
+                    </m:rPr>
+                    <m:t>−</m:t>
+                  </m:r>
+                  <m:r>
+                    <m:t>μ</m:t>
+                  </m:r>
+                </m:e>
+              </m:d>
+              <m:r>
+                <m:t>​</m:t>
+              </m:r>
+              <m:r>
+                <m:rPr>
+                  <m:sty m:val="p"/>
+                </m:rPr>
+                <m:t>≥</m:t>
+              </m:r>
+              <m:r>
+                <m:t>ϵ</m:t>
+              </m:r>
+            </m:e>
+          </m:d>
+          <m:r>
+            <m:t>​</m:t>
+          </m:r>
+          <m:r>
+            <m:rPr>
+              <m:sty m:val="p"/>
+            </m:rPr>
+            <m:t>≤</m:t>
+          </m:r>
+          <m:f>
+            <m:fPr>
+              <m:type m:val="bar"/>
+            </m:fPr>
+            <m:num>
+              <m:sSup>
+                <m:e>
+                  <m:r>
+                    <m:t>σ</m:t>
+                  </m:r>
+                </m:e>
+                <m:sup>
+                  <m:r>
+                    <m:t>2</m:t>
+                  </m:r>
+                </m:sup>
+              </m:sSup>
+            </m:num>
+            <m:den>
+              <m:r>
+                <m:t>n</m:t>
+              </m:r>
+              <m:sSup>
+                <m:e>
+                  <m:r>
+                    <m:t>ϵ</m:t>
+                  </m:r>
+                </m:e>
+                <m:sup>
+                  <m:r>
+                    <m:t>2</m:t>
+                  </m:r>
+                </m:sup>
+              </m:sSup>
+            </m:den>
+          </m:f>
+        </m:oMath>
+      </m:oMathPara>
+    </w:p>
+    <w:bookmarkEnd w:id="43"/>
+    <w:p>
+      <w:pPr>
+        <w:pStyle w:val="FirstParagraph"/>
+      </w:pPr>
+      <w:r>
+        <w:rPr>
+          <w:i/>
+          <w:iCs/>
+        </w:rPr>
+        <w:t xml:space="preserve">Proof</w:t>
+      </w:r>
+      <w:r>
+        <w:t xml:space="preserve">. </w:t>
+      </w:r>
+      <w:r>
+        <w:t xml:space="preserve">This is the solution to</w:t>
+      </w:r>
+      <w:r>
+        <w:t xml:space="preserve"> </w:t>
+      </w:r>
+      <w:hyperlink w:anchor="exr-chebyshev-sample-size">
+        <w:r>
+          <w:rPr>
+            <w:rStyle w:val="Hyperlink"/>
+          </w:rPr>
+          <w:t xml:space="preserve">Exercise 1</w:t>
+        </w:r>
+      </w:hyperlink>
+      <w:r>
+        <w:t xml:space="preserve"> </w:t>
+      </w:r>
+      <w:r>
+        <w:t xml:space="preserve">(a), worked in</w:t>
+      </w:r>
+      <w:r>
+        <w:t xml:space="preserve"> </w:t>
+      </w:r>
+      <w:hyperlink w:anchor="sol-chebyshev-sample-size">
+        <w:r>
+          <w:rPr>
+            <w:rStyle w:val="Hyperlink"/>
+          </w:rPr>
+          <w:t xml:space="preserve">Solution 1</w:t>
+        </w:r>
+      </w:hyperlink>
+      <w:r>
+        <w:t xml:space="preserve">.</w:t>
+      </w:r>
+      <w:r>
+        <w:t xml:space="preserve"> </w:t>
+      </w:r>
+      <w:r>
+        <w:t xml:space="preserve">It applies</w:t>
+      </w:r>
+      <w:r>
+        <w:t xml:space="preserve"> </w:t>
+      </w:r>
+      <w:hyperlink w:anchor="thm-chebyshev">
+        <w:r>
+          <w:rPr>
+            <w:rStyle w:val="Hyperlink"/>
+          </w:rPr>
+          <w:t xml:space="preserve">Theorem 3</w:t>
+        </w:r>
+      </w:hyperlink>
+      <w:r>
+        <w:t xml:space="preserve"> </w:t>
+      </w:r>
+      <w:r>
+        <w:t xml:space="preserve">to</w:t>
+      </w:r>
+      <w:r>
+        <w:t xml:space="preserve"> </w:t>
+      </w:r>
+      <m:oMath>
+        <m:sSub>
+          <m:e>
+            <m:acc>
+              <m:accPr>
+                <m:chr m:val="‾"/>
+              </m:accPr>
+              <m:e>
+                <m:r>
+                  <m:t>X</m:t>
+                </m:r>
+              </m:e>
+            </m:acc>
+          </m:e>
+          <m:sub>
+            <m:r>
+              <m:t>n</m:t>
+            </m:r>
+          </m:sub>
+        </m:sSub>
+      </m:oMath>
+      <w:r>
+        <w:t xml:space="preserve">, whose variance is</w:t>
+      </w:r>
+      <w:r>
+        <w:t xml:space="preserve"> </w:t>
+      </w:r>
+      <m:oMath>
+        <m:sSup>
+          <m:e>
+            <m:r>
+              <m:t>σ</m:t>
+            </m:r>
+          </m:e>
+          <m:sup>
+            <m:r>
+              <m:t>2</m:t>
+            </m:r>
+          </m:sup>
+        </m:sSup>
+        <m:r>
+          <m:rPr>
+            <m:sty m:val="p"/>
+          </m:rPr>
+          <m:t>/</m:t>
+        </m:r>
+        <m:r>
+          <m:t>n</m:t>
+        </m:r>
+      </m:oMath>
+      <w:r>
+        <w:t xml:space="preserve"> </w:t>
+      </w:r>
+      <w:r>
+        <w:t xml:space="preserve">by</w:t>
+      </w:r>
+      <w:r>
+        <w:t xml:space="preserve"> </w:t>
+      </w:r>
+      <w:hyperlink w:anchor="cor-sum-iid-moments">
+        <w:r>
+          <w:rPr>
+            <w:rStyle w:val="Hyperlink"/>
+          </w:rPr>
+          <w:t xml:space="preserve">Corollary 1</w:t>
+        </w:r>
+      </w:hyperlink>
+      <w:r>
+        <w:t xml:space="preserve">.</w:t>
+      </w:r>
+    </w:p>
+    <w:bookmarkStart w:id="44" w:name="lem-hoeffding"/>
     <w:p>
       <w:pPr>
         <w:pStyle w:val="BodyText"/>
@@ -12183,7 +12730,7 @@
         </m:oMath>
       </m:oMathPara>
     </w:p>
-    <w:bookmarkEnd w:id="43"/>
+    <w:bookmarkEnd w:id="44"/>
     <w:p>
       <w:pPr>
         <w:pStyle w:val="FirstParagraph"/>
@@ -15746,7 +16293,7 @@
         <w:t xml:space="preserve">The next result uses it to bound the tails of an average.</w:t>
       </w:r>
     </w:p>
-    <w:bookmarkStart w:id="45" w:name="thm-hoeffding"/>
+    <w:bookmarkStart w:id="46" w:name="thm-hoeffding"/>
     <w:p>
       <w:pPr>
         <w:pStyle w:val="BodyText"/>
@@ -15756,7 +16303,7 @@
           <w:b/>
           <w:bCs/>
         </w:rPr>
-        <w:t xml:space="preserve">Theorem 4 (Hoeffding’s inequality)</w:t>
+        <w:t xml:space="preserve">Theorem 5 (Hoeffding’s inequality)</w:t>
       </w:r>
       <w:r>
         <w:t xml:space="preserve"> </w:t>
@@ -16025,7 +16572,7 @@
       <w:pPr>
         <w:pStyle w:val="BodyText"/>
       </w:pPr>
-      <w:bookmarkStart w:id="44" w:name="eq-hoeffding-one-sided"/>
+      <w:bookmarkStart w:id="45" w:name="eq-hoeffding-one-sided"/>
       <m:oMathPara>
         <m:oMathParaPr>
           <m:jc m:val="center"/>
@@ -16155,9 +16702,9 @@
           </m:r>
         </m:oMath>
       </m:oMathPara>
-      <w:bookmarkEnd w:id="44"/>
+      <w:bookmarkEnd w:id="45"/>
     </w:p>
-    <w:bookmarkEnd w:id="45"/>
+    <w:bookmarkEnd w:id="46"/>
     <w:p>
       <w:pPr>
         <w:pStyle w:val="FirstParagraph"/>
@@ -18254,7 +18801,7 @@
         <w:t xml:space="preserve">which is the claim.</w:t>
       </w:r>
     </w:p>
-    <w:bookmarkStart w:id="47" w:name="cor-hoeffding-two-sided"/>
+    <w:bookmarkStart w:id="48" w:name="cor-hoeffding-two-sided"/>
     <w:p>
       <w:pPr>
         <w:pStyle w:val="BodyText"/>
@@ -18280,7 +18827,7 @@
           <w:rPr>
             <w:rStyle w:val="Hyperlink"/>
           </w:rPr>
-          <w:t xml:space="preserve">Theorem 4</w:t>
+          <w:t xml:space="preserve">Theorem 5</w:t>
         </w:r>
       </w:hyperlink>
       <w:r>
@@ -18311,7 +18858,7 @@
       <w:pPr>
         <w:pStyle w:val="BodyText"/>
       </w:pPr>
-      <w:bookmarkStart w:id="46" w:name="eq-hoeffding"/>
+      <w:bookmarkStart w:id="47" w:name="eq-hoeffding"/>
       <m:oMathPara>
         <m:oMathParaPr>
           <m:jc m:val="center"/>
@@ -18460,9 +19007,9 @@
           </m:r>
         </m:oMath>
       </m:oMathPara>
-      <w:bookmarkEnd w:id="46"/>
+      <w:bookmarkEnd w:id="47"/>
     </w:p>
-    <w:bookmarkEnd w:id="47"/>
+    <w:bookmarkEnd w:id="48"/>
     <w:p>
       <w:pPr>
         <w:pStyle w:val="FirstParagraph"/>
@@ -18659,7 +19206,7 @@
           <w:rPr>
             <w:rStyle w:val="Hyperlink"/>
           </w:rPr>
-          <w:t xml:space="preserve">Theorem 4</w:t>
+          <w:t xml:space="preserve">Theorem 5</w:t>
         </w:r>
       </w:hyperlink>
       <w:r>
@@ -19705,7 +20252,7 @@
         <w:t xml:space="preserve">draws in which it occurs.</w:t>
       </w:r>
     </w:p>
-    <w:bookmarkStart w:id="48" w:name="exm-hoeffding-auto"/>
+    <w:bookmarkStart w:id="49" w:name="exm-hoeffding-auto"/>
     <w:p>
       <w:pPr>
         <w:pStyle w:val="BodyText"/>
@@ -20225,12 +20772,12 @@
       <w:r>
         <w:t xml:space="preserve">(</w:t>
       </w:r>
-      <w:hyperlink w:anchor="exr-chebyshev-sample-size">
+      <w:hyperlink w:anchor="thm-chebyshev-sample-mean">
         <w:r>
           <w:rPr>
             <w:rStyle w:val="Hyperlink"/>
           </w:rPr>
-          <w:t xml:space="preserve">Exercise 1</w:t>
+          <w:t xml:space="preserve">Theorem 4</w:t>
         </w:r>
       </w:hyperlink>
       <w:r>
@@ -21395,9 +21942,9 @@
         <w:t xml:space="preserve">Both bounds are loose because they must hold for every distribution of this kind, not only for this one.</w:t>
       </w:r>
     </w:p>
-    <w:bookmarkEnd w:id="48"/>
     <w:bookmarkEnd w:id="49"/>
-    <w:bookmarkStart w:id="57" w:name="sec-lln"/>
+    <w:bookmarkEnd w:id="50"/>
+    <w:bookmarkStart w:id="58" w:name="sec-lln"/>
     <w:p>
       <w:pPr>
         <w:pStyle w:val="Heading2"/>
@@ -21406,7 +21953,7 @@
         <w:t xml:space="preserve">3 The law of large numbers</w:t>
       </w:r>
     </w:p>
-    <w:bookmarkStart w:id="53" w:name="def-convergence-in-probability"/>
+    <w:bookmarkStart w:id="54" w:name="def-convergence-in-probability"/>
     <w:p>
       <w:pPr>
         <w:pStyle w:val="FirstParagraph"/>
@@ -21796,18 +22343,18 @@
                 <wp:inline>
                   <wp:extent cx="152400" cy="152400"/>
                   <wp:effectExtent b="0" l="0" r="0" t="0"/>
-                  <wp:docPr descr="" title="" id="51" name="Picture"/>
+                  <wp:docPr descr="" title="" id="52" name="Picture"/>
                   <a:graphic>
                     <a:graphicData uri="http://schemas.openxmlformats.org/drawingml/2006/picture">
                       <pic:pic>
                         <pic:nvPicPr>
-                          <pic:cNvPr descr="/opt/quarto/share/formats/docx/note.png" id="52" name="Picture"/>
+                          <pic:cNvPr descr="/opt/quarto/share/formats/docx/note.png" id="53" name="Picture"/>
                           <pic:cNvPicPr>
                             <a:picLocks noChangeArrowheads="1" noChangeAspect="1"/>
                           </pic:cNvPicPr>
                         </pic:nvPicPr>
                         <pic:blipFill>
-                          <a:blip r:embed="rId50"/>
+                          <a:blip r:embed="rId51"/>
                           <a:stretch>
                             <a:fillRect/>
                           </a:stretch>
@@ -21874,8 +22421,8 @@
         </w:tc>
       </w:tr>
     </w:tbl>
-    <w:bookmarkEnd w:id="53"/>
-    <w:bookmarkStart w:id="56" w:name="thm-wlln"/>
+    <w:bookmarkEnd w:id="54"/>
+    <w:bookmarkStart w:id="57" w:name="thm-wlln"/>
     <w:p>
       <w:pPr>
         <w:pStyle w:val="BodyText"/>
@@ -21885,7 +22432,7 @@
           <w:b/>
           <w:bCs/>
         </w:rPr>
-        <w:t xml:space="preserve">Theorem 5 (Weak law of large numbers)</w:t>
+        <w:t xml:space="preserve">Theorem 6 (Weak law of large numbers)</w:t>
       </w:r>
       <w:r>
         <w:t xml:space="preserve"> </w:t>
@@ -22248,18 +22795,18 @@
                 <wp:inline>
                   <wp:extent cx="152400" cy="152400"/>
                   <wp:effectExtent b="0" l="0" r="0" t="0"/>
-                  <wp:docPr descr="" title="" id="54" name="Picture"/>
+                  <wp:docPr descr="" title="" id="55" name="Picture"/>
                   <a:graphic>
                     <a:graphicData uri="http://schemas.openxmlformats.org/drawingml/2006/picture">
                       <pic:pic>
                         <pic:nvPicPr>
-                          <pic:cNvPr descr="/opt/quarto/share/formats/docx/note.png" id="55" name="Picture"/>
+                          <pic:cNvPr descr="/opt/quarto/share/formats/docx/note.png" id="56" name="Picture"/>
                           <pic:cNvPicPr>
                             <a:picLocks noChangeArrowheads="1" noChangeAspect="1"/>
                           </pic:cNvPicPr>
                         </pic:nvPicPr>
                         <pic:blipFill>
-                          <a:blip r:embed="rId50"/>
+                          <a:blip r:embed="rId51"/>
                           <a:stretch>
                             <a:fillRect/>
                           </a:stretch>
@@ -22326,7 +22873,7 @@
         </w:tc>
       </w:tr>
     </w:tbl>
-    <w:bookmarkEnd w:id="56"/>
+    <w:bookmarkEnd w:id="57"/>
     <w:p>
       <w:pPr>
         <w:pStyle w:val="BodyText"/>
@@ -23707,8 +24254,8 @@
         <w:t xml:space="preserve">.</w:t>
       </w:r>
     </w:p>
-    <w:bookmarkEnd w:id="57"/>
-    <w:bookmarkStart w:id="74" w:name="references"/>
+    <w:bookmarkEnd w:id="58"/>
+    <w:bookmarkStart w:id="75" w:name="references"/>
     <w:p>
       <w:pPr>
         <w:pStyle w:val="Heading2"/>
@@ -23717,8 +24264,8 @@
         <w:t xml:space="preserve">References</w:t>
       </w:r>
     </w:p>
-    <w:bookmarkStart w:id="73" w:name="refs"/>
-    <w:bookmarkStart w:id="59" w:name="ref-fiveminuteai_probstat"/>
+    <w:bookmarkStart w:id="74" w:name="refs"/>
+    <w:bookmarkStart w:id="60" w:name="ref-fiveminuteai_probstat"/>
     <w:p>
       <w:pPr>
         <w:pStyle w:val="Bibliography"/>
@@ -23742,7 +24289,7 @@
       <w:r>
         <w:t xml:space="preserve"> </w:t>
       </w:r>
-      <w:hyperlink r:id="rId58">
+      <w:hyperlink r:id="rId59">
         <w:r>
           <w:rPr>
             <w:rStyle w:val="Hyperlink"/>
@@ -23754,8 +24301,8 @@
         <w:t xml:space="preserve">.</w:t>
       </w:r>
     </w:p>
-    <w:bookmarkEnd w:id="59"/>
-    <w:bookmarkStart w:id="61" w:name="ref-bienayme1853"/>
+    <w:bookmarkEnd w:id="60"/>
+    <w:bookmarkStart w:id="62" w:name="ref-bienayme1853"/>
     <w:p>
       <w:pPr>
         <w:pStyle w:val="Bibliography"/>
@@ -23800,7 +24347,7 @@
       <w:r>
         <w:t xml:space="preserve"> </w:t>
       </w:r>
-      <w:hyperlink r:id="rId60">
+      <w:hyperlink r:id="rId61">
         <w:r>
           <w:rPr>
             <w:rStyle w:val="Hyperlink"/>
@@ -23812,8 +24359,8 @@
         <w:t xml:space="preserve">.</w:t>
       </w:r>
     </w:p>
-    <w:bookmarkEnd w:id="61"/>
-    <w:bookmarkStart w:id="62" w:name="ref-billingsley1995probability"/>
+    <w:bookmarkEnd w:id="62"/>
+    <w:bookmarkStart w:id="63" w:name="ref-billingsley1995probability"/>
     <w:p>
       <w:pPr>
         <w:pStyle w:val="Bibliography"/>
@@ -23835,8 +24382,8 @@
         <w:t xml:space="preserve">. 3rd ed. Wiley Series in Probability and Mathematical Statistics. Wiley.</w:t>
       </w:r>
     </w:p>
-    <w:bookmarkEnd w:id="62"/>
-    <w:bookmarkStart w:id="64" w:name="ref-blitzstein2019introduction"/>
+    <w:bookmarkEnd w:id="63"/>
+    <w:bookmarkStart w:id="65" w:name="ref-blitzstein2019introduction"/>
     <w:p>
       <w:pPr>
         <w:pStyle w:val="Bibliography"/>
@@ -23860,7 +24407,7 @@
       <w:r>
         <w:t xml:space="preserve"> </w:t>
       </w:r>
-      <w:hyperlink r:id="rId63">
+      <w:hyperlink r:id="rId64">
         <w:r>
           <w:rPr>
             <w:rStyle w:val="Hyperlink"/>
@@ -23872,8 +24419,8 @@
         <w:t xml:space="preserve">.</w:t>
       </w:r>
     </w:p>
-    <w:bookmarkEnd w:id="64"/>
-    <w:bookmarkStart w:id="66" w:name="ref-CaseBerg01"/>
+    <w:bookmarkEnd w:id="65"/>
+    <w:bookmarkStart w:id="67" w:name="ref-CaseBerg01"/>
     <w:p>
       <w:pPr>
         <w:pStyle w:val="Bibliography"/>
@@ -23897,7 +24444,7 @@
       <w:r>
         <w:t xml:space="preserve"> </w:t>
       </w:r>
-      <w:hyperlink r:id="rId65">
+      <w:hyperlink r:id="rId66">
         <w:r>
           <w:rPr>
             <w:rStyle w:val="Hyperlink"/>
@@ -23909,8 +24456,8 @@
         <w:t xml:space="preserve">.</w:t>
       </w:r>
     </w:p>
-    <w:bookmarkEnd w:id="66"/>
-    <w:bookmarkStart w:id="68" w:name="ref-hoeffding1963"/>
+    <w:bookmarkEnd w:id="67"/>
+    <w:bookmarkStart w:id="69" w:name="ref-hoeffding1963"/>
     <w:p>
       <w:pPr>
         <w:pStyle w:val="Bibliography"/>
@@ -23943,7 +24490,7 @@
       <w:r>
         <w:t xml:space="preserve"> </w:t>
       </w:r>
-      <w:hyperlink r:id="rId67">
+      <w:hyperlink r:id="rId68">
         <w:r>
           <w:rPr>
             <w:rStyle w:val="Hyperlink"/>
@@ -23955,8 +24502,8 @@
         <w:t xml:space="preserve">.</w:t>
       </w:r>
     </w:p>
-    <w:bookmarkEnd w:id="68"/>
-    <w:bookmarkStart w:id="70" w:name="ref-seneta2013"/>
+    <w:bookmarkEnd w:id="69"/>
+    <w:bookmarkStart w:id="71" w:name="ref-seneta2013"/>
     <w:p>
       <w:pPr>
         <w:pStyle w:val="Bibliography"/>
@@ -23989,7 +24536,7 @@
       <w:r>
         <w:t xml:space="preserve"> </w:t>
       </w:r>
-      <w:hyperlink r:id="rId69">
+      <w:hyperlink r:id="rId70">
         <w:r>
           <w:rPr>
             <w:rStyle w:val="Hyperlink"/>
@@ -24001,8 +24548,8 @@
         <w:t xml:space="preserve">.</w:t>
       </w:r>
     </w:p>
-    <w:bookmarkEnd w:id="70"/>
-    <w:bookmarkStart w:id="72" w:name="ref-tchebichef1867"/>
+    <w:bookmarkEnd w:id="71"/>
+    <w:bookmarkStart w:id="73" w:name="ref-tchebichef1867"/>
     <w:p>
       <w:pPr>
         <w:pStyle w:val="Bibliography"/>
@@ -24032,7 +24579,7 @@
       <w:r>
         <w:t xml:space="preserve"> </w:t>
       </w:r>
-      <w:hyperlink r:id="rId71">
+      <w:hyperlink r:id="rId72">
         <w:r>
           <w:rPr>
             <w:rStyle w:val="Hyperlink"/>
@@ -24044,9 +24591,9 @@
         <w:t xml:space="preserve">.</w:t>
       </w:r>
     </w:p>
-    <w:bookmarkEnd w:id="72"/>
     <w:bookmarkEnd w:id="73"/>
     <w:bookmarkEnd w:id="74"/>
+    <w:bookmarkEnd w:id="75"/>
     <w:sectPr>
       <w:footnotePr>
         <w:numRestart w:val="eachSect"/>

</xml_diff>

<commit_message>
Deploying to gh-pages from @ Morrison-Lab/pds@c1e31f59d964444efc9f9d2caf03a90fc39dd989 🚀
</commit_message>
<xml_diff>
--- a/limit-theorems.docx
+++ b/limit-theorems.docx
@@ -15,10 +15,10 @@
         <w:pStyle w:val="Date"/>
       </w:pPr>
       <w:r>
-        <w:t xml:space="preserve">Last modified: 2026-10-15 09:10:11 (PDT)</w:t>
+        <w:t xml:space="preserve">Last modified: 2026-10-15 12:42:26 (PDT)</w:t>
       </w:r>
     </w:p>
-    <w:bookmarkStart w:id="37" w:name="sec-clt"/>
+    <w:bookmarkStart w:id="38" w:name="sec-clt"/>
     <w:p>
       <w:pPr>
         <w:pStyle w:val="Heading2"/>
@@ -42,7 +42,7 @@
         <w:t xml:space="preserve">. </w:t>
       </w:r>
       <w:r>
-        <w:t xml:space="preserve">The sum of many independent random variables,</w:t>
+        <w:t xml:space="preserve">The average of many independent random variables,</w:t>
       </w:r>
       <w:r>
         <w:t xml:space="preserve"> </w:t>
@@ -229,9 +229,16 @@
       <m:oMath>
         <m:sSub>
           <m:e>
-            <m:r>
-              <m:t>S</m:t>
-            </m:r>
+            <m:acc>
+              <m:accPr>
+                <m:chr m:val="‾"/>
+              </m:accPr>
+              <m:e>
+                <m:r>
+                  <m:t>X</m:t>
+                </m:r>
+              </m:e>
+            </m:acc>
           </m:e>
           <m:sub>
             <m:r>
@@ -258,6 +265,21 @@
             </m:r>
           </m:lim>
         </m:limUpp>
+        <m:f>
+          <m:fPr>
+            <m:type m:val="bar"/>
+          </m:fPr>
+          <m:num>
+            <m:r>
+              <m:t>1</m:t>
+            </m:r>
+          </m:num>
+          <m:den>
+            <m:r>
+              <m:t>n</m:t>
+            </m:r>
+          </m:den>
+        </m:f>
         <m:nary>
           <m:naryPr>
             <m:chr m:val="∑"/>
@@ -379,35 +401,6 @@
                   <m:type m:val="bar"/>
                 </m:fPr>
                 <m:num>
-                  <m:sSub>
-                    <m:e>
-                      <m:r>
-                        <m:t>S</m:t>
-                      </m:r>
-                    </m:e>
-                    <m:sub>
-                      <m:r>
-                        <m:t>n</m:t>
-                      </m:r>
-                    </m:sub>
-                  </m:sSub>
-                  <m:r>
-                    <m:rPr>
-                      <m:sty m:val="p"/>
-                    </m:rPr>
-                    <m:t>−</m:t>
-                  </m:r>
-                  <m:r>
-                    <m:t>n</m:t>
-                  </m:r>
-                  <m:r>
-                    <m:t>μ</m:t>
-                  </m:r>
-                </m:num>
-                <m:den>
-                  <m:r>
-                    <m:t>σ</m:t>
-                  </m:r>
                   <m:rad>
                     <m:radPr>
                       <m:degHide m:val="on"/>
@@ -419,6 +412,54 @@
                       </m:r>
                     </m:e>
                   </m:rad>
+                  <m:r>
+                    <m:t> </m:t>
+                  </m:r>
+                  <m:r>
+                    <m:rPr>
+                      <m:sty m:val="p"/>
+                    </m:rPr>
+                    <m:t>(</m:t>
+                  </m:r>
+                  <m:sSub>
+                    <m:e>
+                      <m:acc>
+                        <m:accPr>
+                          <m:chr m:val="‾"/>
+                        </m:accPr>
+                        <m:e>
+                          <m:r>
+                            <m:t>X</m:t>
+                          </m:r>
+                        </m:e>
+                      </m:acc>
+                    </m:e>
+                    <m:sub>
+                      <m:r>
+                        <m:t>n</m:t>
+                      </m:r>
+                    </m:sub>
+                  </m:sSub>
+                  <m:r>
+                    <m:rPr>
+                      <m:sty m:val="p"/>
+                    </m:rPr>
+                    <m:t>−</m:t>
+                  </m:r>
+                  <m:r>
+                    <m:t>μ</m:t>
+                  </m:r>
+                  <m:r>
+                    <m:rPr>
+                      <m:sty m:val="p"/>
+                    </m:rPr>
+                    <m:t>)</m:t>
+                  </m:r>
+                </m:num>
+                <m:den>
+                  <m:r>
+                    <m:t>σ</m:t>
+                  </m:r>
                 </m:den>
               </m:f>
               <m:r>
@@ -727,7 +768,7 @@
         <w:t xml:space="preserve">which is why the informal statement asks only that no summand dominate.</w:t>
       </w:r>
     </w:p>
-    <w:bookmarkStart w:id="12" w:name="cor-sum-iid-moments"/>
+    <w:bookmarkStart w:id="12" w:name="cor-clt-sum"/>
     <w:p>
       <w:pPr>
         <w:pStyle w:val="BodyText"/>
@@ -737,7 +778,690 @@
           <w:b/>
           <w:bCs/>
         </w:rPr>
-        <w:t xml:space="preserve">Corollary 1 (Mean and variance of a sum of IID random variables)</w:t>
+        <w:t xml:space="preserve">Corollary 1 (Central Limit Theorem for a sum)</w:t>
+      </w:r>
+      <w:r>
+        <w:t xml:space="preserve"> </w:t>
+      </w:r>
+      <w:r>
+        <w:t xml:space="preserve">Let</w:t>
+      </w:r>
+      <w:r>
+        <w:t xml:space="preserve"> </w:t>
+      </w:r>
+      <m:oMath>
+        <m:sSub>
+          <m:e>
+            <m:r>
+              <m:t>X</m:t>
+            </m:r>
+          </m:e>
+          <m:sub>
+            <m:r>
+              <m:t>1</m:t>
+            </m:r>
+          </m:sub>
+        </m:sSub>
+        <m:r>
+          <m:rPr>
+            <m:sty m:val="p"/>
+          </m:rPr>
+          <m:t>,</m:t>
+        </m:r>
+        <m:sSub>
+          <m:e>
+            <m:r>
+              <m:t>X</m:t>
+            </m:r>
+          </m:e>
+          <m:sub>
+            <m:r>
+              <m:t>2</m:t>
+            </m:r>
+          </m:sub>
+        </m:sSub>
+        <m:r>
+          <m:rPr>
+            <m:sty m:val="p"/>
+          </m:rPr>
+          <m:t>,</m:t>
+        </m:r>
+        <m:r>
+          <m:rPr>
+            <m:sty m:val="p"/>
+          </m:rPr>
+          <m:t>…</m:t>
+        </m:r>
+      </m:oMath>
+      <w:r>
+        <w:t xml:space="preserve"> </w:t>
+      </w:r>
+      <w:r>
+        <w:t xml:space="preserve">be</w:t>
+      </w:r>
+      <w:r>
+        <w:t xml:space="preserve"> </w:t>
+      </w:r>
+      <w:hyperlink r:id="rId9">
+        <w:r>
+          <w:rPr>
+            <w:rStyle w:val="Hyperlink"/>
+          </w:rPr>
+          <w:t xml:space="preserve">IID</w:t>
+        </w:r>
+      </w:hyperlink>
+      <w:r>
+        <w:t xml:space="preserve"> </w:t>
+      </w:r>
+      <w:r>
+        <w:t xml:space="preserve">random variables</w:t>
+      </w:r>
+      <w:r>
+        <w:t xml:space="preserve"> </w:t>
+      </w:r>
+      <w:r>
+        <w:t xml:space="preserve">with mean</w:t>
+      </w:r>
+      <w:r>
+        <w:t xml:space="preserve"> </w:t>
+      </w:r>
+      <m:oMath>
+        <m:r>
+          <m:t>μ</m:t>
+        </m:r>
+      </m:oMath>
+      <w:r>
+        <w:t xml:space="preserve"> </w:t>
+      </w:r>
+      <w:r>
+        <w:t xml:space="preserve">and finite variance</w:t>
+      </w:r>
+      <w:r>
+        <w:t xml:space="preserve"> </w:t>
+      </w:r>
+      <m:oMath>
+        <m:sSup>
+          <m:e>
+            <m:r>
+              <m:t>σ</m:t>
+            </m:r>
+          </m:e>
+          <m:sup>
+            <m:r>
+              <m:t>2</m:t>
+            </m:r>
+          </m:sup>
+        </m:sSup>
+        <m:r>
+          <m:rPr>
+            <m:sty m:val="p"/>
+          </m:rPr>
+          <m:t>&gt;</m:t>
+        </m:r>
+        <m:r>
+          <m:t>0</m:t>
+        </m:r>
+      </m:oMath>
+      <w:r>
+        <w:t xml:space="preserve">,</w:t>
+      </w:r>
+      <w:r>
+        <w:t xml:space="preserve"> </w:t>
+      </w:r>
+      <w:r>
+        <w:t xml:space="preserve">and let</w:t>
+      </w:r>
+      <w:r>
+        <w:t xml:space="preserve"> </w:t>
+      </w:r>
+      <m:oMath>
+        <m:sSub>
+          <m:e>
+            <m:r>
+              <m:t>S</m:t>
+            </m:r>
+          </m:e>
+          <m:sub>
+            <m:r>
+              <m:t>n</m:t>
+            </m:r>
+          </m:sub>
+        </m:sSub>
+        <m:limUpp>
+          <m:e>
+            <m:r>
+              <m:rPr>
+                <m:sty m:val="p"/>
+              </m:rPr>
+              <m:t>=</m:t>
+            </m:r>
+          </m:e>
+          <m:lim>
+            <m:r>
+              <m:rPr>
+                <m:nor/>
+                <m:sty m:val="p"/>
+              </m:rPr>
+              <m:t>def</m:t>
+            </m:r>
+          </m:lim>
+        </m:limUpp>
+        <m:nary>
+          <m:naryPr>
+            <m:chr m:val="∑"/>
+            <m:limLoc m:val="undOvr"/>
+            <m:subHide m:val="off"/>
+            <m:supHide m:val="off"/>
+          </m:naryPr>
+          <m:sub>
+            <m:r>
+              <m:t>i</m:t>
+            </m:r>
+            <m:r>
+              <m:rPr>
+                <m:sty m:val="p"/>
+              </m:rPr>
+              <m:t>=</m:t>
+            </m:r>
+            <m:r>
+              <m:t>1</m:t>
+            </m:r>
+          </m:sub>
+          <m:sup>
+            <m:r>
+              <m:t>n</m:t>
+            </m:r>
+          </m:sup>
+          <m:e>
+            <m:sSub>
+              <m:e>
+                <m:r>
+                  <m:t>X</m:t>
+                </m:r>
+              </m:e>
+              <m:sub>
+                <m:r>
+                  <m:t>i</m:t>
+                </m:r>
+              </m:sub>
+            </m:sSub>
+          </m:e>
+        </m:nary>
+      </m:oMath>
+      <w:r>
+        <w:t xml:space="preserve">.</w:t>
+      </w:r>
+      <w:r>
+        <w:t xml:space="preserve"> </w:t>
+      </w:r>
+      <w:r>
+        <w:t xml:space="preserve">Then for every real number</w:t>
+      </w:r>
+      <w:r>
+        <w:t xml:space="preserve"> </w:t>
+      </w:r>
+      <m:oMath>
+        <m:r>
+          <m:t>z</m:t>
+        </m:r>
+      </m:oMath>
+      <w:r>
+        <w:t xml:space="preserve">:</w:t>
+      </w:r>
+    </w:p>
+    <w:p>
+      <w:pPr>
+        <w:pStyle w:val="BodyText"/>
+      </w:pPr>
+      <m:oMathPara>
+        <m:oMathParaPr>
+          <m:jc m:val="center"/>
+        </m:oMathParaPr>
+        <m:oMath>
+          <m:limLow>
+            <m:e>
+              <m:r>
+                <m:rPr>
+                  <m:sty m:val="p"/>
+                </m:rPr>
+                <m:t>lim</m:t>
+              </m:r>
+            </m:e>
+            <m:lim>
+              <m:r>
+                <m:t>n</m:t>
+              </m:r>
+              <m:r>
+                <m:rPr>
+                  <m:sty m:val="p"/>
+                </m:rPr>
+                <m:t>→</m:t>
+              </m:r>
+              <m:r>
+                <m:rPr>
+                  <m:sty m:val="p"/>
+                </m:rPr>
+                <m:t>∞</m:t>
+              </m:r>
+            </m:lim>
+          </m:limLow>
+          <m:r>
+            <m:rPr>
+              <m:sty m:val="p"/>
+            </m:rPr>
+            <m:t>Pr</m:t>
+          </m:r>
+          <m:r>
+            <m:t>​</m:t>
+          </m:r>
+          <m:d>
+            <m:dPr>
+              <m:begChr m:val="("/>
+              <m:sepChr m:val=""/>
+              <m:endChr m:val=")"/>
+              <m:grow/>
+            </m:dPr>
+            <m:e>
+              <m:f>
+                <m:fPr>
+                  <m:type m:val="bar"/>
+                </m:fPr>
+                <m:num>
+                  <m:sSub>
+                    <m:e>
+                      <m:r>
+                        <m:t>S</m:t>
+                      </m:r>
+                    </m:e>
+                    <m:sub>
+                      <m:r>
+                        <m:t>n</m:t>
+                      </m:r>
+                    </m:sub>
+                  </m:sSub>
+                  <m:r>
+                    <m:rPr>
+                      <m:sty m:val="p"/>
+                    </m:rPr>
+                    <m:t>−</m:t>
+                  </m:r>
+                  <m:r>
+                    <m:t>n</m:t>
+                  </m:r>
+                  <m:r>
+                    <m:t>μ</m:t>
+                  </m:r>
+                </m:num>
+                <m:den>
+                  <m:r>
+                    <m:t>σ</m:t>
+                  </m:r>
+                  <m:rad>
+                    <m:radPr>
+                      <m:degHide m:val="on"/>
+                    </m:radPr>
+                    <m:deg/>
+                    <m:e>
+                      <m:r>
+                        <m:t>n</m:t>
+                      </m:r>
+                    </m:e>
+                  </m:rad>
+                </m:den>
+              </m:f>
+              <m:r>
+                <m:rPr>
+                  <m:sty m:val="p"/>
+                </m:rPr>
+                <m:t>≤</m:t>
+              </m:r>
+              <m:r>
+                <m:t>z</m:t>
+              </m:r>
+            </m:e>
+          </m:d>
+          <m:r>
+            <m:t>​</m:t>
+          </m:r>
+          <m:r>
+            <m:rPr>
+              <m:sty m:val="p"/>
+            </m:rPr>
+            <m:t>=</m:t>
+          </m:r>
+          <m:r>
+            <m:rPr>
+              <m:sty m:val="p"/>
+            </m:rPr>
+            <m:t>Φ</m:t>
+          </m:r>
+          <m:r>
+            <m:rPr>
+              <m:sty m:val="p"/>
+            </m:rPr>
+            <m:t>(</m:t>
+          </m:r>
+          <m:r>
+            <m:t>z</m:t>
+          </m:r>
+          <m:r>
+            <m:rPr>
+              <m:sty m:val="p"/>
+            </m:rPr>
+            <m:t>)</m:t>
+          </m:r>
+        </m:oMath>
+      </m:oMathPara>
+    </w:p>
+    <w:bookmarkEnd w:id="12"/>
+    <w:p>
+      <w:pPr>
+        <w:pStyle w:val="FirstParagraph"/>
+      </w:pPr>
+      <w:r>
+        <w:rPr>
+          <w:i/>
+          <w:iCs/>
+        </w:rPr>
+        <w:t xml:space="preserve">Proof</w:t>
+      </w:r>
+      <w:r>
+        <w:t xml:space="preserve">. </w:t>
+      </w:r>
+      <w:r>
+        <w:t xml:space="preserve">Since</w:t>
+      </w:r>
+      <w:r>
+        <w:t xml:space="preserve"> </w:t>
+      </w:r>
+      <m:oMath>
+        <m:sSub>
+          <m:e>
+            <m:r>
+              <m:t>S</m:t>
+            </m:r>
+          </m:e>
+          <m:sub>
+            <m:r>
+              <m:t>n</m:t>
+            </m:r>
+          </m:sub>
+        </m:sSub>
+        <m:r>
+          <m:rPr>
+            <m:sty m:val="p"/>
+          </m:rPr>
+          <m:t>=</m:t>
+        </m:r>
+        <m:r>
+          <m:t>n</m:t>
+        </m:r>
+        <m:sSub>
+          <m:e>
+            <m:acc>
+              <m:accPr>
+                <m:chr m:val="‾"/>
+              </m:accPr>
+              <m:e>
+                <m:r>
+                  <m:t>X</m:t>
+                </m:r>
+              </m:e>
+            </m:acc>
+          </m:e>
+          <m:sub>
+            <m:r>
+              <m:t>n</m:t>
+            </m:r>
+          </m:sub>
+        </m:sSub>
+      </m:oMath>
+      <w:r>
+        <w:t xml:space="preserve">,</w:t>
+      </w:r>
+    </w:p>
+    <w:p>
+      <w:pPr>
+        <w:pStyle w:val="BodyText"/>
+      </w:pPr>
+      <m:oMathPara>
+        <m:oMathParaPr>
+          <m:jc m:val="center"/>
+        </m:oMathParaPr>
+        <m:oMath>
+          <m:f>
+            <m:fPr>
+              <m:type m:val="bar"/>
+            </m:fPr>
+            <m:num>
+              <m:sSub>
+                <m:e>
+                  <m:r>
+                    <m:t>S</m:t>
+                  </m:r>
+                </m:e>
+                <m:sub>
+                  <m:r>
+                    <m:t>n</m:t>
+                  </m:r>
+                </m:sub>
+              </m:sSub>
+              <m:r>
+                <m:rPr>
+                  <m:sty m:val="p"/>
+                </m:rPr>
+                <m:t>−</m:t>
+              </m:r>
+              <m:r>
+                <m:t>n</m:t>
+              </m:r>
+              <m:r>
+                <m:t>μ</m:t>
+              </m:r>
+            </m:num>
+            <m:den>
+              <m:r>
+                <m:t>σ</m:t>
+              </m:r>
+              <m:rad>
+                <m:radPr>
+                  <m:degHide m:val="on"/>
+                </m:radPr>
+                <m:deg/>
+                <m:e>
+                  <m:r>
+                    <m:t>n</m:t>
+                  </m:r>
+                </m:e>
+              </m:rad>
+            </m:den>
+          </m:f>
+          <m:r>
+            <m:rPr>
+              <m:sty m:val="p"/>
+            </m:rPr>
+            <m:t>=</m:t>
+          </m:r>
+          <m:f>
+            <m:fPr>
+              <m:type m:val="bar"/>
+            </m:fPr>
+            <m:num>
+              <m:r>
+                <m:t>n</m:t>
+              </m:r>
+              <m:r>
+                <m:rPr>
+                  <m:sty m:val="p"/>
+                </m:rPr>
+                <m:t>(</m:t>
+              </m:r>
+              <m:sSub>
+                <m:e>
+                  <m:acc>
+                    <m:accPr>
+                      <m:chr m:val="‾"/>
+                    </m:accPr>
+                    <m:e>
+                      <m:r>
+                        <m:t>X</m:t>
+                      </m:r>
+                    </m:e>
+                  </m:acc>
+                </m:e>
+                <m:sub>
+                  <m:r>
+                    <m:t>n</m:t>
+                  </m:r>
+                </m:sub>
+              </m:sSub>
+              <m:r>
+                <m:rPr>
+                  <m:sty m:val="p"/>
+                </m:rPr>
+                <m:t>−</m:t>
+              </m:r>
+              <m:r>
+                <m:t>μ</m:t>
+              </m:r>
+              <m:r>
+                <m:rPr>
+                  <m:sty m:val="p"/>
+                </m:rPr>
+                <m:t>)</m:t>
+              </m:r>
+            </m:num>
+            <m:den>
+              <m:r>
+                <m:t>σ</m:t>
+              </m:r>
+              <m:rad>
+                <m:radPr>
+                  <m:degHide m:val="on"/>
+                </m:radPr>
+                <m:deg/>
+                <m:e>
+                  <m:r>
+                    <m:t>n</m:t>
+                  </m:r>
+                </m:e>
+              </m:rad>
+            </m:den>
+          </m:f>
+          <m:r>
+            <m:rPr>
+              <m:sty m:val="p"/>
+            </m:rPr>
+            <m:t>=</m:t>
+          </m:r>
+          <m:f>
+            <m:fPr>
+              <m:type m:val="bar"/>
+            </m:fPr>
+            <m:num>
+              <m:rad>
+                <m:radPr>
+                  <m:degHide m:val="on"/>
+                </m:radPr>
+                <m:deg/>
+                <m:e>
+                  <m:r>
+                    <m:t>n</m:t>
+                  </m:r>
+                </m:e>
+              </m:rad>
+              <m:r>
+                <m:t> </m:t>
+              </m:r>
+              <m:r>
+                <m:rPr>
+                  <m:sty m:val="p"/>
+                </m:rPr>
+                <m:t>(</m:t>
+              </m:r>
+              <m:sSub>
+                <m:e>
+                  <m:acc>
+                    <m:accPr>
+                      <m:chr m:val="‾"/>
+                    </m:accPr>
+                    <m:e>
+                      <m:r>
+                        <m:t>X</m:t>
+                      </m:r>
+                    </m:e>
+                  </m:acc>
+                </m:e>
+                <m:sub>
+                  <m:r>
+                    <m:t>n</m:t>
+                  </m:r>
+                </m:sub>
+              </m:sSub>
+              <m:r>
+                <m:rPr>
+                  <m:sty m:val="p"/>
+                </m:rPr>
+                <m:t>−</m:t>
+              </m:r>
+              <m:r>
+                <m:t>μ</m:t>
+              </m:r>
+              <m:r>
+                <m:rPr>
+                  <m:sty m:val="p"/>
+                </m:rPr>
+                <m:t>)</m:t>
+              </m:r>
+            </m:num>
+            <m:den>
+              <m:r>
+                <m:t>σ</m:t>
+              </m:r>
+            </m:den>
+          </m:f>
+          <m:r>
+            <m:rPr>
+              <m:sty m:val="p"/>
+            </m:rPr>
+            <m:t>,</m:t>
+          </m:r>
+        </m:oMath>
+      </m:oMathPara>
+    </w:p>
+    <w:p>
+      <w:pPr>
+        <w:pStyle w:val="FirstParagraph"/>
+      </w:pPr>
+      <w:r>
+        <w:t xml:space="preserve">so the event in this corollary is the event in</w:t>
+      </w:r>
+      <w:r>
+        <w:t xml:space="preserve"> </w:t>
+      </w:r>
+      <w:hyperlink w:anchor="thm-clt">
+        <w:r>
+          <w:rPr>
+            <w:rStyle w:val="Hyperlink"/>
+          </w:rPr>
+          <w:t xml:space="preserve">Theorem 1</w:t>
+        </w:r>
+      </w:hyperlink>
+      <w:r>
+        <w:t xml:space="preserve">, and the limits agree.</w:t>
+      </w:r>
+    </w:p>
+    <w:bookmarkStart w:id="13" w:name="cor-sum-iid-moments"/>
+    <w:p>
+      <w:pPr>
+        <w:pStyle w:val="BodyText"/>
+      </w:pPr>
+      <w:r>
+        <w:rPr>
+          <w:b/>
+          <w:bCs/>
+        </w:rPr>
+        <w:t xml:space="preserve">Corollary 2 (Mean and variance of a sum of IID random variables)</w:t>
       </w:r>
       <w:r>
         <w:t xml:space="preserve"> </w:t>
@@ -1079,7 +1803,7 @@
         </m:oMath>
       </m:oMathPara>
     </w:p>
-    <w:bookmarkEnd w:id="12"/>
+    <w:bookmarkEnd w:id="13"/>
     <w:p>
       <w:pPr>
         <w:pStyle w:val="FirstParagraph"/>
@@ -1100,7 +1824,7 @@
       <w:r>
         <w:t xml:space="preserve"> </w:t>
       </w:r>
-      <w:hyperlink r:id="rId13">
+      <w:hyperlink r:id="rId14">
         <w:r>
           <w:rPr>
             <w:rStyle w:val="Hyperlink"/>
@@ -1338,7 +2062,7 @@
       <w:r>
         <w:t xml:space="preserve"> </w:t>
       </w:r>
-      <w:hyperlink r:id="rId14">
+      <w:hyperlink r:id="rId15">
         <w:r>
           <w:rPr>
             <w:rStyle w:val="Hyperlink"/>
@@ -1512,7 +2236,7 @@
       <w:r>
         <w:t xml:space="preserve"> </w:t>
       </w:r>
-      <w:hyperlink r:id="rId15">
+      <w:hyperlink r:id="rId16">
         <w:r>
           <w:rPr>
             <w:rStyle w:val="Hyperlink"/>
@@ -1604,7 +2328,7 @@
       <w:r>
         <w:t xml:space="preserve"> </w:t>
       </w:r>
-      <w:hyperlink r:id="rId16">
+      <w:hyperlink r:id="rId17">
         <w:r>
           <w:rPr>
             <w:rStyle w:val="Hyperlink"/>
@@ -1724,7 +2448,7 @@
       <w:r>
         <w:t xml:space="preserve">(</w:t>
       </w:r>
-      <w:hyperlink r:id="rId17">
+      <w:hyperlink r:id="rId18">
         <w:r>
           <w:rPr>
             <w:rStyle w:val="Hyperlink"/>
@@ -2413,9 +3137,16 @@
       <m:oMath>
         <m:sSub>
           <m:e>
-            <m:r>
-              <m:t>S</m:t>
-            </m:r>
+            <m:acc>
+              <m:accPr>
+                <m:chr m:val="‾"/>
+              </m:accPr>
+              <m:e>
+                <m:r>
+                  <m:t>X</m:t>
+                </m:r>
+              </m:e>
+            </m:acc>
           </m:e>
           <m:sub>
             <m:r>
@@ -2435,9 +3166,6 @@
       </w:r>
       <m:oMath>
         <m:r>
-          <m:t>n</m:t>
-        </m:r>
-        <m:r>
           <m:t>μ</m:t>
         </m:r>
       </m:oMath>
@@ -2451,9 +3179,6 @@
         <w:t xml:space="preserve"> </w:t>
       </w:r>
       <m:oMath>
-        <m:r>
-          <m:t>n</m:t>
-        </m:r>
         <m:sSup>
           <m:e>
             <m:r>
@@ -2466,6 +3191,15 @@
             </m:r>
           </m:sup>
         </m:sSup>
+        <m:r>
+          <m:rPr>
+            <m:sty m:val="p"/>
+          </m:rPr>
+          <m:t>/</m:t>
+        </m:r>
+        <m:r>
+          <m:t>n</m:t>
+        </m:r>
       </m:oMath>
       <w:r>
         <w:t xml:space="preserve">,</w:t>
@@ -2474,12 +3208,12 @@
         <w:t xml:space="preserve"> </w:t>
       </w:r>
       <w:r>
-        <w:t xml:space="preserve">which by</w:t>
-      </w:r>
-      <w:r>
-        <w:t xml:space="preserve"> </w:t>
-      </w:r>
-      <w:hyperlink w:anchor="cor-sum-iid-moments">
+        <w:t xml:space="preserve">and</w:t>
+      </w:r>
+      <w:r>
+        <w:t xml:space="preserve"> </w:t>
+      </w:r>
+      <w:hyperlink w:anchor="cor-clt-sum">
         <w:r>
           <w:rPr>
             <w:rStyle w:val="Hyperlink"/>
@@ -2491,7 +3225,7 @@
         <w:t xml:space="preserve"> </w:t>
       </w:r>
       <w:r>
-        <w:t xml:space="preserve">are exactly the mean and variance of</w:t>
+        <w:t xml:space="preserve">justifies approximating</w:t>
       </w:r>
       <w:r>
         <w:t xml:space="preserve"> </w:t>
@@ -2511,10 +3245,156 @@
         </m:sSub>
       </m:oMath>
       <w:r>
+        <w:t xml:space="preserve"> </w:t>
+      </w:r>
+      <w:r>
+        <w:t xml:space="preserve">by a normal distribution with mean</w:t>
+      </w:r>
+      <w:r>
+        <w:t xml:space="preserve"> </w:t>
+      </w:r>
+      <m:oMath>
+        <m:r>
+          <m:t>n</m:t>
+        </m:r>
+        <m:r>
+          <m:t>μ</m:t>
+        </m:r>
+      </m:oMath>
+      <w:r>
+        <w:t xml:space="preserve"> </w:t>
+      </w:r>
+      <w:r>
+        <w:t xml:space="preserve">and variance</w:t>
+      </w:r>
+      <w:r>
+        <w:t xml:space="preserve"> </w:t>
+      </w:r>
+      <m:oMath>
+        <m:r>
+          <m:t>n</m:t>
+        </m:r>
+        <m:sSup>
+          <m:e>
+            <m:r>
+              <m:t>σ</m:t>
+            </m:r>
+          </m:e>
+          <m:sup>
+            <m:r>
+              <m:t>2</m:t>
+            </m:r>
+          </m:sup>
+        </m:sSup>
+      </m:oMath>
+      <w:r>
         <w:t xml:space="preserve">.</w:t>
       </w:r>
+      <w:r>
+        <w:t xml:space="preserve"> </w:t>
+      </w:r>
+      <w:r>
+        <w:t xml:space="preserve">By</w:t>
+      </w:r>
+      <w:r>
+        <w:t xml:space="preserve"> </w:t>
+      </w:r>
+      <w:hyperlink w:anchor="cor-sum-iid-moments">
+        <w:r>
+          <w:rPr>
+            <w:rStyle w:val="Hyperlink"/>
+          </w:rPr>
+          <w:t xml:space="preserve">Corollary 2</w:t>
+        </w:r>
+      </w:hyperlink>
+      <w:r>
+        <w:t xml:space="preserve">, these are exactly the means and variances</w:t>
+      </w:r>
+      <w:r>
+        <w:t xml:space="preserve"> </w:t>
+      </w:r>
+      <w:r>
+        <w:t xml:space="preserve">of</w:t>
+      </w:r>
+      <w:r>
+        <w:t xml:space="preserve"> </w:t>
+      </w:r>
+      <m:oMath>
+        <m:sSub>
+          <m:e>
+            <m:acc>
+              <m:accPr>
+                <m:chr m:val="‾"/>
+              </m:accPr>
+              <m:e>
+                <m:r>
+                  <m:t>X</m:t>
+                </m:r>
+              </m:e>
+            </m:acc>
+          </m:e>
+          <m:sub>
+            <m:r>
+              <m:t>n</m:t>
+            </m:r>
+          </m:sub>
+        </m:sSub>
+        <m:r>
+          <m:rPr>
+            <m:sty m:val="p"/>
+          </m:rPr>
+          <m:t>=</m:t>
+        </m:r>
+        <m:sSub>
+          <m:e>
+            <m:r>
+              <m:t>S</m:t>
+            </m:r>
+          </m:e>
+          <m:sub>
+            <m:r>
+              <m:t>n</m:t>
+            </m:r>
+          </m:sub>
+        </m:sSub>
+        <m:r>
+          <m:rPr>
+            <m:sty m:val="p"/>
+          </m:rPr>
+          <m:t>/</m:t>
+        </m:r>
+        <m:r>
+          <m:t>n</m:t>
+        </m:r>
+      </m:oMath>
+      <w:r>
+        <w:t xml:space="preserve"> </w:t>
+      </w:r>
+      <w:r>
+        <w:t xml:space="preserve">and</w:t>
+      </w:r>
+      <w:r>
+        <w:t xml:space="preserve"> </w:t>
+      </w:r>
+      <m:oMath>
+        <m:sSub>
+          <m:e>
+            <m:r>
+              <m:t>S</m:t>
+            </m:r>
+          </m:e>
+          <m:sub>
+            <m:r>
+              <m:t>n</m:t>
+            </m:r>
+          </m:sub>
+        </m:sSub>
+      </m:oMath>
+      <w:r>
+        <w:t xml:space="preserve">.</w:t>
+      </w:r>
     </w:p>
-    <w:bookmarkStart w:id="26" w:name="exm-clt-5d6"/>
+    <w:bookmarkStart w:id="27" w:name="exm-clt-5d6"/>
     <w:p>
       <w:pPr>
         <w:pStyle w:val="BodyText"/>
@@ -3373,7 +4253,7 @@
       <w:tr>
         <w:tc>
           <w:tcPr/>
-          <w:bookmarkStart w:id="21" w:name="fig-clt-1d6"/>
+          <w:bookmarkStart w:id="22" w:name="fig-clt-1d6"/>
           <w:p>
             <w:pPr>
               <w:pStyle w:val="Compact"/>
@@ -3384,18 +4264,18 @@
                 <wp:inline>
                   <wp:extent cx="4620126" cy="3696101"/>
                   <wp:effectExtent b="0" l="0" r="0" t="0"/>
-                  <wp:docPr descr="" title="" id="19" name="Picture"/>
+                  <wp:docPr descr="" title="" id="20" name="Picture"/>
                   <a:graphic>
                     <a:graphicData uri="http://schemas.openxmlformats.org/drawingml/2006/picture">
                       <pic:pic>
                         <pic:nvPicPr>
-                          <pic:cNvPr descr="limit-theorems_files/figure-docx/fig-clt-1d6-1.png" id="20" name="Picture"/>
+                          <pic:cNvPr descr="limit-theorems_files/figure-docx/fig-clt-1d6-1.png" id="21" name="Picture"/>
                           <pic:cNvPicPr>
                             <a:picLocks noChangeArrowheads="1" noChangeAspect="1"/>
                           </pic:cNvPicPr>
                         </pic:nvPicPr>
                         <pic:blipFill>
-                          <a:blip r:embed="rId18"/>
+                          <a:blip r:embed="rId19"/>
                           <a:stretch>
                             <a:fillRect/>
                           </a:stretch>
@@ -3435,7 +4315,7 @@
               <w:t xml:space="preserve">Figure 1: Distribution of the outcome of one die</w:t>
             </w:r>
           </w:p>
-          <w:bookmarkEnd w:id="21"/>
+          <w:bookmarkEnd w:id="22"/>
         </w:tc>
       </w:tr>
     </w:tbl>
@@ -3595,7 +4475,7 @@
       <w:tr>
         <w:tc>
           <w:tcPr/>
-          <w:bookmarkStart w:id="25" w:name="fig-clt-5d6"/>
+          <w:bookmarkStart w:id="26" w:name="fig-clt-5d6"/>
           <w:p>
             <w:pPr>
               <w:pStyle w:val="Compact"/>
@@ -3606,18 +4486,18 @@
                 <wp:inline>
                   <wp:extent cx="4620126" cy="3696101"/>
                   <wp:effectExtent b="0" l="0" r="0" t="0"/>
-                  <wp:docPr descr="" title="" id="23" name="Picture"/>
+                  <wp:docPr descr="" title="" id="24" name="Picture"/>
                   <a:graphic>
                     <a:graphicData uri="http://schemas.openxmlformats.org/drawingml/2006/picture">
                       <pic:pic>
                         <pic:nvPicPr>
-                          <pic:cNvPr descr="limit-theorems_files/figure-docx/fig-clt-5d6-1.png" id="24" name="Picture"/>
+                          <pic:cNvPr descr="limit-theorems_files/figure-docx/fig-clt-5d6-1.png" id="25" name="Picture"/>
                           <pic:cNvPicPr>
                             <a:picLocks noChangeArrowheads="1" noChangeAspect="1"/>
                           </pic:cNvPicPr>
                         </pic:nvPicPr>
                         <pic:blipFill>
-                          <a:blip r:embed="rId22"/>
+                          <a:blip r:embed="rId23"/>
                           <a:stretch>
                             <a:fillRect/>
                           </a:stretch>
@@ -3657,7 +4537,7 @@
               <w:t xml:space="preserve">Figure 2: Distribution of the sum of five dice</w:t>
             </w:r>
           </w:p>
-          <w:bookmarkEnd w:id="25"/>
+          <w:bookmarkEnd w:id="26"/>
         </w:tc>
       </w:tr>
     </w:tbl>
@@ -3733,12 +4613,12 @@
       <w:r>
         <w:t xml:space="preserve"> </w:t>
       </w:r>
-      <w:hyperlink w:anchor="thm-clt">
+      <w:hyperlink w:anchor="cor-clt-sum">
         <w:r>
           <w:rPr>
             <w:rStyle w:val="Hyperlink"/>
           </w:rPr>
-          <w:t xml:space="preserve">Theorem 1</w:t>
+          <w:t xml:space="preserve">Corollary 1</w:t>
         </w:r>
       </w:hyperlink>
       <w:r>
@@ -3953,8 +4833,8 @@
         <w:t xml:space="preserve">.</w:t>
       </w:r>
     </w:p>
-    <w:bookmarkEnd w:id="26"/>
-    <w:bookmarkStart w:id="34" w:name="exm-clt-auto"/>
+    <w:bookmarkEnd w:id="27"/>
+    <w:bookmarkStart w:id="35" w:name="exm-clt-auto"/>
     <w:p>
       <w:pPr>
         <w:pStyle w:val="BodyText"/>
@@ -4018,7 +4898,7 @@
       <w:r>
         <w:t xml:space="preserve"> </w:t>
       </w:r>
-      <w:hyperlink r:id="rId27">
+      <w:hyperlink r:id="rId28">
         <w:r>
           <w:rPr>
             <w:rStyle w:val="VerbatimChar"/>
@@ -4050,7 +4930,7 @@
       <w:r>
         <w:t xml:space="preserve"> </w:t>
       </w:r>
-      <w:hyperlink r:id="rId28">
+      <w:hyperlink r:id="rId29">
         <w:r>
           <w:rPr>
             <w:rStyle w:val="VerbatimChar"/>
@@ -4082,7 +4962,7 @@
       <w:r>
         <w:t xml:space="preserve"> </w:t>
       </w:r>
-      <w:hyperlink r:id="rId29">
+      <w:hyperlink r:id="rId30">
         <w:r>
           <w:rPr>
             <w:rStyle w:val="VerbatimChar"/>
@@ -4200,7 +5080,7 @@
         <w:t xml:space="preserve"> </w:t>
       </w:r>
       <w:r>
-        <w:t xml:space="preserve">The sum</w:t>
+        <w:t xml:space="preserve">The sample mean</w:t>
       </w:r>
       <w:r>
         <w:t xml:space="preserve"> </w:t>
@@ -4208,9 +5088,16 @@
       <m:oMath>
         <m:sSub>
           <m:e>
-            <m:r>
-              <m:t>S</m:t>
-            </m:r>
+            <m:acc>
+              <m:accPr>
+                <m:chr m:val="‾"/>
+              </m:accPr>
+              <m:e>
+                <m:r>
+                  <m:t>X</m:t>
+                </m:r>
+              </m:e>
+            </m:acc>
           </m:e>
           <m:sub>
             <m:r>
@@ -4218,80 +5105,12 @@
             </m:r>
           </m:sub>
         </m:sSub>
-      </m:oMath>
-      <w:r>
-        <w:t xml:space="preserve"> </w:t>
-      </w:r>
-      <w:r>
-        <w:t xml:space="preserve">has mean</w:t>
-      </w:r>
-      <w:r>
-        <w:t xml:space="preserve"> </w:t>
-      </w:r>
-      <m:oMath>
-        <m:r>
-          <m:t>n</m:t>
-        </m:r>
-        <m:r>
-          <m:t>μ</m:t>
-        </m:r>
-      </m:oMath>
-      <w:r>
-        <w:t xml:space="preserve"> </w:t>
-      </w:r>
-      <w:r>
-        <w:t xml:space="preserve">and variance</w:t>
-      </w:r>
-      <w:r>
-        <w:t xml:space="preserve"> </w:t>
-      </w:r>
-      <m:oMath>
-        <m:r>
-          <m:t>n</m:t>
-        </m:r>
-        <m:sSup>
-          <m:e>
-            <m:r>
-              <m:t>σ</m:t>
-            </m:r>
-          </m:e>
-          <m:sup>
-            <m:r>
-              <m:t>2</m:t>
-            </m:r>
-          </m:sup>
-        </m:sSup>
-      </m:oMath>
-      <w:r>
-        <w:t xml:space="preserve"> </w:t>
-      </w:r>
-      <w:r>
-        <w:t xml:space="preserve">by</w:t>
-      </w:r>
-      <w:r>
-        <w:t xml:space="preserve"> </w:t>
-      </w:r>
-      <w:hyperlink w:anchor="cor-sum-iid-moments">
-        <w:r>
-          <w:rPr>
-            <w:rStyle w:val="Hyperlink"/>
-          </w:rPr>
-          <w:t xml:space="preserve">Corollary 1</w:t>
-        </w:r>
-      </w:hyperlink>
-      <w:r>
-        <w:t xml:space="preserve">,</w:t>
-      </w:r>
-      <w:r>
-        <w:t xml:space="preserve"> </w:t>
-      </w:r>
-      <w:r>
-        <w:t xml:space="preserve">so the sample mean</w:t>
-      </w:r>
-      <w:r>
-        <w:t xml:space="preserve"> </w:t>
-      </w:r>
-      <m:oMath>
+        <m:r>
+          <m:rPr>
+            <m:sty m:val="p"/>
+          </m:rPr>
+          <m:t>=</m:t>
+        </m:r>
         <m:sSub>
           <m:e>
             <m:r>
@@ -4359,6 +5178,92 @@
           </m:e>
         </m:rad>
       </m:oMath>
+      <w:r>
+        <w:t xml:space="preserve">,</w:t>
+      </w:r>
+      <w:r>
+        <w:t xml:space="preserve"> </w:t>
+      </w:r>
+      <w:r>
+        <w:t xml:space="preserve">because</w:t>
+      </w:r>
+      <w:r>
+        <w:t xml:space="preserve"> </w:t>
+      </w:r>
+      <m:oMath>
+        <m:sSub>
+          <m:e>
+            <m:r>
+              <m:t>S</m:t>
+            </m:r>
+          </m:e>
+          <m:sub>
+            <m:r>
+              <m:t>n</m:t>
+            </m:r>
+          </m:sub>
+        </m:sSub>
+      </m:oMath>
+      <w:r>
+        <w:t xml:space="preserve"> </w:t>
+      </w:r>
+      <w:r>
+        <w:t xml:space="preserve">has mean</w:t>
+      </w:r>
+      <w:r>
+        <w:t xml:space="preserve"> </w:t>
+      </w:r>
+      <m:oMath>
+        <m:r>
+          <m:t>n</m:t>
+        </m:r>
+        <m:r>
+          <m:t>μ</m:t>
+        </m:r>
+      </m:oMath>
+      <w:r>
+        <w:t xml:space="preserve"> </w:t>
+      </w:r>
+      <w:r>
+        <w:t xml:space="preserve">and variance</w:t>
+      </w:r>
+      <w:r>
+        <w:t xml:space="preserve"> </w:t>
+      </w:r>
+      <m:oMath>
+        <m:r>
+          <m:t>n</m:t>
+        </m:r>
+        <m:sSup>
+          <m:e>
+            <m:r>
+              <m:t>σ</m:t>
+            </m:r>
+          </m:e>
+          <m:sup>
+            <m:r>
+              <m:t>2</m:t>
+            </m:r>
+          </m:sup>
+        </m:sSup>
+      </m:oMath>
+      <w:r>
+        <w:t xml:space="preserve"> </w:t>
+      </w:r>
+      <w:r>
+        <w:t xml:space="preserve">by</w:t>
+      </w:r>
+      <w:r>
+        <w:t xml:space="preserve"> </w:t>
+      </w:r>
+      <w:hyperlink w:anchor="cor-sum-iid-moments">
+        <w:r>
+          <w:rPr>
+            <w:rStyle w:val="Hyperlink"/>
+          </w:rPr>
+          <w:t xml:space="preserve">Corollary 2</w:t>
+        </w:r>
+      </w:hyperlink>
       <w:r>
         <w:t xml:space="preserve">.</w:t>
       </w:r>
@@ -7268,7 +8173,7 @@
       <w:tr>
         <w:tc>
           <w:tcPr/>
-          <w:bookmarkStart w:id="33" w:name="fig-clt-auto"/>
+          <w:bookmarkStart w:id="34" w:name="fig-clt-auto"/>
           <w:p>
             <w:pPr>
               <w:pStyle w:val="Compact"/>
@@ -7279,18 +8184,18 @@
                 <wp:inline>
                   <wp:extent cx="5334000" cy="2000250"/>
                   <wp:effectExtent b="0" l="0" r="0" t="0"/>
-                  <wp:docPr descr="" title="" id="31" name="Picture"/>
+                  <wp:docPr descr="" title="" id="32" name="Picture"/>
                   <a:graphic>
                     <a:graphicData uri="http://schemas.openxmlformats.org/drawingml/2006/picture">
                       <pic:pic>
                         <pic:nvPicPr>
-                          <pic:cNvPr descr="limit-theorems_files/figure-docx/fig-clt-auto-1.png" id="32" name="Picture"/>
+                          <pic:cNvPr descr="limit-theorems_files/figure-docx/fig-clt-auto-1.png" id="33" name="Picture"/>
                           <pic:cNvPicPr>
                             <a:picLocks noChangeArrowheads="1" noChangeAspect="1"/>
                           </pic:cNvPicPr>
                         </pic:nvPicPr>
                         <pic:blipFill>
-                          <a:blip r:embed="rId30"/>
+                          <a:blip r:embed="rId31"/>
                           <a:stretch>
                             <a:fillRect/>
                           </a:stretch>
@@ -7330,7 +8235,7 @@
               <w:t xml:space="preserve">Figure 3: Histograms of 10,000 sample means of horsepower, for samples of n = 1, 5 and 30 cars drawn with replacement from the Auto data. The curve is the normal density with mean mu and standard deviation sigma over the square root of n.</w:t>
             </w:r>
           </w:p>
-          <w:bookmarkEnd w:id="33"/>
+          <w:bookmarkEnd w:id="34"/>
         </w:tc>
       </w:tr>
     </w:tbl>
@@ -7467,7 +8372,7 @@
           <w:rPr>
             <w:rStyle w:val="Hyperlink"/>
           </w:rPr>
-          <w:t xml:space="preserve">Corollary 1</w:t>
+          <w:t xml:space="preserve">Corollary 2</w:t>
         </w:r>
       </w:hyperlink>
       <w:r>
@@ -7561,7 +8466,7 @@
         <w:t xml:space="preserve">.</w:t>
       </w:r>
     </w:p>
-    <w:bookmarkEnd w:id="34"/>
+    <w:bookmarkEnd w:id="35"/>
     <w:p>
       <w:pPr>
         <w:pStyle w:val="BodyText"/>
@@ -7572,7 +8477,7 @@
       <w:r>
         <w:t xml:space="preserve"> </w:t>
       </w:r>
-      <w:hyperlink r:id="rId35">
+      <w:hyperlink r:id="rId36">
         <w:r>
           <w:rPr>
             <w:rStyle w:val="Hyperlink"/>
@@ -7589,7 +8494,7 @@
       <w:r>
         <w:t xml:space="preserve"> </w:t>
       </w:r>
-      <w:hyperlink r:id="rId36">
+      <w:hyperlink r:id="rId37">
         <w:r>
           <w:rPr>
             <w:rStyle w:val="Hyperlink"/>
@@ -7616,8 +8521,8 @@
         <w:t xml:space="preserve">.</w:t>
       </w:r>
     </w:p>
-    <w:bookmarkEnd w:id="37"/>
-    <w:bookmarkStart w:id="50" w:name="sec-tail-bounds"/>
+    <w:bookmarkEnd w:id="38"/>
+    <w:bookmarkStart w:id="51" w:name="sec-tail-bounds"/>
     <w:p>
       <w:pPr>
         <w:pStyle w:val="Heading2"/>
@@ -7626,7 +8531,7 @@
         <w:t xml:space="preserve">2 Tail bounds</w:t>
       </w:r>
     </w:p>
-    <w:bookmarkStart w:id="38" w:name="thm-markov"/>
+    <w:bookmarkStart w:id="39" w:name="thm-markov"/>
     <w:p>
       <w:pPr>
         <w:pStyle w:val="FirstParagraph"/>
@@ -7842,7 +8747,7 @@
         </m:oMath>
       </m:oMathPara>
     </w:p>
-    <w:bookmarkEnd w:id="38"/>
+    <w:bookmarkEnd w:id="39"/>
     <w:p>
       <w:pPr>
         <w:pStyle w:val="FirstParagraph"/>
@@ -8031,7 +8936,7 @@
       <w:r>
         <w:t xml:space="preserve"> </w:t>
       </w:r>
-      <w:hyperlink r:id="rId13">
+      <w:hyperlink r:id="rId14">
         <w:r>
           <w:rPr>
             <w:rStyle w:val="Hyperlink"/>
@@ -8334,7 +9239,7 @@
         <w:t xml:space="preserve">.</w:t>
       </w:r>
     </w:p>
-    <w:bookmarkStart w:id="39" w:name="thm-chebyshev"/>
+    <w:bookmarkStart w:id="40" w:name="thm-chebyshev"/>
     <w:p>
       <w:pPr>
         <w:pStyle w:val="BodyText"/>
@@ -8540,7 +9445,7 @@
         </m:oMath>
       </m:oMathPara>
     </w:p>
-    <w:bookmarkEnd w:id="39"/>
+    <w:bookmarkEnd w:id="40"/>
     <w:p>
       <w:pPr>
         <w:pStyle w:val="FirstParagraph"/>
@@ -9147,7 +10052,7 @@
         <w:t xml:space="preserve">.</w:t>
       </w:r>
     </w:p>
-    <w:bookmarkStart w:id="40" w:name="exm-chebyshev-auto"/>
+    <w:bookmarkStart w:id="41" w:name="exm-chebyshev-auto"/>
     <w:p>
       <w:pPr>
         <w:pStyle w:val="BodyText"/>
@@ -9893,8 +10798,8 @@
         <w:t xml:space="preserve">The bound is loose because it must hold for every distribution with this mean and variance.</w:t>
       </w:r>
     </w:p>
-    <w:bookmarkEnd w:id="40"/>
-    <w:bookmarkStart w:id="41" w:name="exr-chebyshev-sample-size"/>
+    <w:bookmarkEnd w:id="41"/>
+    <w:bookmarkStart w:id="42" w:name="exr-chebyshev-sample-size"/>
     <w:p>
       <w:pPr>
         <w:pStyle w:val="BodyText"/>
@@ -10164,7 +11069,7 @@
           <w:rPr>
             <w:rStyle w:val="Hyperlink"/>
           </w:rPr>
-          <w:t xml:space="preserve">Corollary 1</w:t>
+          <w:t xml:space="preserve">Corollary 2</w:t>
         </w:r>
       </w:hyperlink>
       <w:r>
@@ -10391,7 +11296,7 @@
       <w:r>
         <w:t xml:space="preserve"> </w:t>
       </w:r>
-      <w:hyperlink r:id="rId29">
+      <w:hyperlink r:id="rId30">
         <w:r>
           <w:rPr>
             <w:rStyle w:val="VerbatimChar"/>
@@ -10558,8 +11463,8 @@
         <w:t xml:space="preserve">Why is the count so far below the 5% the bound allows?</w:t>
       </w:r>
     </w:p>
-    <w:bookmarkEnd w:id="41"/>
-    <w:bookmarkStart w:id="42" w:name="sol-chebyshev-sample-size"/>
+    <w:bookmarkEnd w:id="42"/>
+    <w:bookmarkStart w:id="43" w:name="sol-chebyshev-sample-size"/>
     <w:p>
       <w:pPr>
         <w:pStyle w:val="FirstParagraph"/>
@@ -10593,7 +11498,7 @@
           <w:rPr>
             <w:rStyle w:val="Hyperlink"/>
           </w:rPr>
-          <w:t xml:space="preserve">Corollary 1</w:t>
+          <w:t xml:space="preserve">Corollary 2</w:t>
         </w:r>
       </w:hyperlink>
       <w:r>
@@ -11977,8 +12882,8 @@
         <w:t xml:space="preserve">.</w:t>
       </w:r>
     </w:p>
-    <w:bookmarkEnd w:id="42"/>
-    <w:bookmarkStart w:id="43" w:name="thm-chebyshev-sample-mean"/>
+    <w:bookmarkEnd w:id="43"/>
+    <w:bookmarkStart w:id="44" w:name="thm-chebyshev-sample-mean"/>
     <w:p>
       <w:pPr>
         <w:pStyle w:val="BodyText"/>
@@ -12379,7 +13284,7 @@
         </m:oMath>
       </m:oMathPara>
     </w:p>
-    <w:bookmarkEnd w:id="43"/>
+    <w:bookmarkEnd w:id="44"/>
     <w:p>
       <w:pPr>
         <w:pStyle w:val="FirstParagraph"/>
@@ -12518,14 +13423,14 @@
           <w:rPr>
             <w:rStyle w:val="Hyperlink"/>
           </w:rPr>
-          <w:t xml:space="preserve">Corollary 1</w:t>
+          <w:t xml:space="preserve">Corollary 2</w:t>
         </w:r>
       </w:hyperlink>
       <w:r>
         <w:t xml:space="preserve">.</w:t>
       </w:r>
     </w:p>
-    <w:bookmarkStart w:id="44" w:name="lem-hoeffding"/>
+    <w:bookmarkStart w:id="45" w:name="lem-hoeffding"/>
     <w:p>
       <w:pPr>
         <w:pStyle w:val="BodyText"/>
@@ -12730,7 +13635,7 @@
         </m:oMath>
       </m:oMathPara>
     </w:p>
-    <w:bookmarkEnd w:id="44"/>
+    <w:bookmarkEnd w:id="45"/>
     <w:p>
       <w:pPr>
         <w:pStyle w:val="FirstParagraph"/>
@@ -16293,7 +17198,7 @@
         <w:t xml:space="preserve">The next result uses it to bound the tails of an average.</w:t>
       </w:r>
     </w:p>
-    <w:bookmarkStart w:id="46" w:name="thm-hoeffding"/>
+    <w:bookmarkStart w:id="47" w:name="thm-hoeffding"/>
     <w:p>
       <w:pPr>
         <w:pStyle w:val="BodyText"/>
@@ -16572,7 +17477,7 @@
       <w:pPr>
         <w:pStyle w:val="BodyText"/>
       </w:pPr>
-      <w:bookmarkStart w:id="45" w:name="eq-hoeffding-one-sided"/>
+      <w:bookmarkStart w:id="46" w:name="eq-hoeffding-one-sided"/>
       <m:oMathPara>
         <m:oMathParaPr>
           <m:jc m:val="center"/>
@@ -16702,9 +17607,9 @@
           </m:r>
         </m:oMath>
       </m:oMathPara>
-      <w:bookmarkEnd w:id="45"/>
+      <w:bookmarkEnd w:id="46"/>
     </w:p>
-    <w:bookmarkEnd w:id="46"/>
+    <w:bookmarkEnd w:id="47"/>
     <w:p>
       <w:pPr>
         <w:pStyle w:val="FirstParagraph"/>
@@ -17798,7 +18703,7 @@
       <w:r>
         <w:t xml:space="preserve"> </w:t>
       </w:r>
-      <w:hyperlink r:id="rId16">
+      <w:hyperlink r:id="rId17">
         <w:r>
           <w:rPr>
             <w:rStyle w:val="Hyperlink"/>
@@ -18801,7 +19706,7 @@
         <w:t xml:space="preserve">which is the claim.</w:t>
       </w:r>
     </w:p>
-    <w:bookmarkStart w:id="48" w:name="cor-hoeffding-two-sided"/>
+    <w:bookmarkStart w:id="49" w:name="cor-hoeffding-two-sided"/>
     <w:p>
       <w:pPr>
         <w:pStyle w:val="BodyText"/>
@@ -18811,7 +19716,7 @@
           <w:b/>
           <w:bCs/>
         </w:rPr>
-        <w:t xml:space="preserve">Corollary 2 (Hoeffding’s inequality, two-sided)</w:t>
+        <w:t xml:space="preserve">Corollary 3 (Hoeffding’s inequality, two-sided)</w:t>
       </w:r>
       <w:r>
         <w:t xml:space="preserve"> </w:t>
@@ -18858,7 +19763,7 @@
       <w:pPr>
         <w:pStyle w:val="BodyText"/>
       </w:pPr>
-      <w:bookmarkStart w:id="47" w:name="eq-hoeffding"/>
+      <w:bookmarkStart w:id="48" w:name="eq-hoeffding"/>
       <m:oMathPara>
         <m:oMathParaPr>
           <m:jc m:val="center"/>
@@ -19007,9 +19912,9 @@
           </m:r>
         </m:oMath>
       </m:oMathPara>
-      <w:bookmarkEnd w:id="47"/>
+      <w:bookmarkEnd w:id="48"/>
     </w:p>
-    <w:bookmarkEnd w:id="48"/>
+    <w:bookmarkEnd w:id="49"/>
     <w:p>
       <w:pPr>
         <w:pStyle w:val="FirstParagraph"/>
@@ -20252,7 +21157,7 @@
         <w:t xml:space="preserve">draws in which it occurs.</w:t>
       </w:r>
     </w:p>
-    <w:bookmarkStart w:id="49" w:name="exm-hoeffding-auto"/>
+    <w:bookmarkStart w:id="50" w:name="exm-hoeffding-auto"/>
     <w:p>
       <w:pPr>
         <w:pStyle w:val="BodyText"/>
@@ -20562,7 +21467,7 @@
           <w:rPr>
             <w:rStyle w:val="Hyperlink"/>
           </w:rPr>
-          <w:t xml:space="preserve">Corollary 2</w:t>
+          <w:t xml:space="preserve">Corollary 3</w:t>
         </w:r>
       </w:hyperlink>
       <w:r>
@@ -21942,9 +22847,9 @@
         <w:t xml:space="preserve">Both bounds are loose because they must hold for every distribution of this kind, not only for this one.</w:t>
       </w:r>
     </w:p>
-    <w:bookmarkEnd w:id="49"/>
     <w:bookmarkEnd w:id="50"/>
-    <w:bookmarkStart w:id="58" w:name="sec-lln"/>
+    <w:bookmarkEnd w:id="51"/>
+    <w:bookmarkStart w:id="59" w:name="sec-lln"/>
     <w:p>
       <w:pPr>
         <w:pStyle w:val="Heading2"/>
@@ -21953,7 +22858,7 @@
         <w:t xml:space="preserve">3 The law of large numbers</w:t>
       </w:r>
     </w:p>
-    <w:bookmarkStart w:id="54" w:name="def-convergence-in-probability"/>
+    <w:bookmarkStart w:id="55" w:name="def-convergence-in-probability"/>
     <w:p>
       <w:pPr>
         <w:pStyle w:val="FirstParagraph"/>
@@ -22343,18 +23248,18 @@
                 <wp:inline>
                   <wp:extent cx="152400" cy="152400"/>
                   <wp:effectExtent b="0" l="0" r="0" t="0"/>
-                  <wp:docPr descr="" title="" id="52" name="Picture"/>
+                  <wp:docPr descr="" title="" id="53" name="Picture"/>
                   <a:graphic>
                     <a:graphicData uri="http://schemas.openxmlformats.org/drawingml/2006/picture">
                       <pic:pic>
                         <pic:nvPicPr>
-                          <pic:cNvPr descr="/opt/quarto/share/formats/docx/note.png" id="53" name="Picture"/>
+                          <pic:cNvPr descr="/opt/quarto/share/formats/docx/note.png" id="54" name="Picture"/>
                           <pic:cNvPicPr>
                             <a:picLocks noChangeArrowheads="1" noChangeAspect="1"/>
                           </pic:cNvPicPr>
                         </pic:nvPicPr>
                         <pic:blipFill>
-                          <a:blip r:embed="rId51"/>
+                          <a:blip r:embed="rId52"/>
                           <a:stretch>
                             <a:fillRect/>
                           </a:stretch>
@@ -22421,8 +23326,8 @@
         </w:tc>
       </w:tr>
     </w:tbl>
-    <w:bookmarkEnd w:id="54"/>
-    <w:bookmarkStart w:id="57" w:name="thm-wlln"/>
+    <w:bookmarkEnd w:id="55"/>
+    <w:bookmarkStart w:id="58" w:name="thm-wlln"/>
     <w:p>
       <w:pPr>
         <w:pStyle w:val="BodyText"/>
@@ -22795,18 +23700,18 @@
                 <wp:inline>
                   <wp:extent cx="152400" cy="152400"/>
                   <wp:effectExtent b="0" l="0" r="0" t="0"/>
-                  <wp:docPr descr="" title="" id="55" name="Picture"/>
+                  <wp:docPr descr="" title="" id="56" name="Picture"/>
                   <a:graphic>
                     <a:graphicData uri="http://schemas.openxmlformats.org/drawingml/2006/picture">
                       <pic:pic>
                         <pic:nvPicPr>
-                          <pic:cNvPr descr="/opt/quarto/share/formats/docx/note.png" id="56" name="Picture"/>
+                          <pic:cNvPr descr="/opt/quarto/share/formats/docx/note.png" id="57" name="Picture"/>
                           <pic:cNvPicPr>
                             <a:picLocks noChangeArrowheads="1" noChangeAspect="1"/>
                           </pic:cNvPicPr>
                         </pic:nvPicPr>
                         <pic:blipFill>
-                          <a:blip r:embed="rId51"/>
+                          <a:blip r:embed="rId52"/>
                           <a:stretch>
                             <a:fillRect/>
                           </a:stretch>
@@ -22873,7 +23778,7 @@
         </w:tc>
       </w:tr>
     </w:tbl>
-    <w:bookmarkEnd w:id="57"/>
+    <w:bookmarkEnd w:id="58"/>
     <w:p>
       <w:pPr>
         <w:pStyle w:val="BodyText"/>
@@ -22899,7 +23804,7 @@
           <w:rPr>
             <w:rStyle w:val="Hyperlink"/>
           </w:rPr>
-          <w:t xml:space="preserve">Corollary 1</w:t>
+          <w:t xml:space="preserve">Corollary 2</w:t>
         </w:r>
       </w:hyperlink>
       <w:r>
@@ -24254,8 +25159,8 @@
         <w:t xml:space="preserve">.</w:t>
       </w:r>
     </w:p>
-    <w:bookmarkEnd w:id="58"/>
-    <w:bookmarkStart w:id="75" w:name="references"/>
+    <w:bookmarkEnd w:id="59"/>
+    <w:bookmarkStart w:id="76" w:name="references"/>
     <w:p>
       <w:pPr>
         <w:pStyle w:val="Heading2"/>
@@ -24264,8 +25169,8 @@
         <w:t xml:space="preserve">References</w:t>
       </w:r>
     </w:p>
-    <w:bookmarkStart w:id="74" w:name="refs"/>
-    <w:bookmarkStart w:id="60" w:name="ref-fiveminuteai_probstat"/>
+    <w:bookmarkStart w:id="75" w:name="refs"/>
+    <w:bookmarkStart w:id="61" w:name="ref-fiveminuteai_probstat"/>
     <w:p>
       <w:pPr>
         <w:pStyle w:val="Bibliography"/>
@@ -24289,7 +25194,7 @@
       <w:r>
         <w:t xml:space="preserve"> </w:t>
       </w:r>
-      <w:hyperlink r:id="rId59">
+      <w:hyperlink r:id="rId60">
         <w:r>
           <w:rPr>
             <w:rStyle w:val="Hyperlink"/>
@@ -24301,8 +25206,8 @@
         <w:t xml:space="preserve">.</w:t>
       </w:r>
     </w:p>
-    <w:bookmarkEnd w:id="60"/>
-    <w:bookmarkStart w:id="62" w:name="ref-bienayme1853"/>
+    <w:bookmarkEnd w:id="61"/>
+    <w:bookmarkStart w:id="63" w:name="ref-bienayme1853"/>
     <w:p>
       <w:pPr>
         <w:pStyle w:val="Bibliography"/>
@@ -24347,7 +25252,7 @@
       <w:r>
         <w:t xml:space="preserve"> </w:t>
       </w:r>
-      <w:hyperlink r:id="rId61">
+      <w:hyperlink r:id="rId62">
         <w:r>
           <w:rPr>
             <w:rStyle w:val="Hyperlink"/>
@@ -24359,8 +25264,8 @@
         <w:t xml:space="preserve">.</w:t>
       </w:r>
     </w:p>
-    <w:bookmarkEnd w:id="62"/>
-    <w:bookmarkStart w:id="63" w:name="ref-billingsley1995probability"/>
+    <w:bookmarkEnd w:id="63"/>
+    <w:bookmarkStart w:id="64" w:name="ref-billingsley1995probability"/>
     <w:p>
       <w:pPr>
         <w:pStyle w:val="Bibliography"/>
@@ -24382,8 +25287,8 @@
         <w:t xml:space="preserve">. 3rd ed. Wiley Series in Probability and Mathematical Statistics. Wiley.</w:t>
       </w:r>
     </w:p>
-    <w:bookmarkEnd w:id="63"/>
-    <w:bookmarkStart w:id="65" w:name="ref-blitzstein2019introduction"/>
+    <w:bookmarkEnd w:id="64"/>
+    <w:bookmarkStart w:id="66" w:name="ref-blitzstein2019introduction"/>
     <w:p>
       <w:pPr>
         <w:pStyle w:val="Bibliography"/>
@@ -24407,7 +25312,7 @@
       <w:r>
         <w:t xml:space="preserve"> </w:t>
       </w:r>
-      <w:hyperlink r:id="rId64">
+      <w:hyperlink r:id="rId65">
         <w:r>
           <w:rPr>
             <w:rStyle w:val="Hyperlink"/>
@@ -24419,8 +25324,8 @@
         <w:t xml:space="preserve">.</w:t>
       </w:r>
     </w:p>
-    <w:bookmarkEnd w:id="65"/>
-    <w:bookmarkStart w:id="67" w:name="ref-CaseBerg01"/>
+    <w:bookmarkEnd w:id="66"/>
+    <w:bookmarkStart w:id="68" w:name="ref-CaseBerg01"/>
     <w:p>
       <w:pPr>
         <w:pStyle w:val="Bibliography"/>
@@ -24444,7 +25349,7 @@
       <w:r>
         <w:t xml:space="preserve"> </w:t>
       </w:r>
-      <w:hyperlink r:id="rId66">
+      <w:hyperlink r:id="rId67">
         <w:r>
           <w:rPr>
             <w:rStyle w:val="Hyperlink"/>
@@ -24456,8 +25361,8 @@
         <w:t xml:space="preserve">.</w:t>
       </w:r>
     </w:p>
-    <w:bookmarkEnd w:id="67"/>
-    <w:bookmarkStart w:id="69" w:name="ref-hoeffding1963"/>
+    <w:bookmarkEnd w:id="68"/>
+    <w:bookmarkStart w:id="70" w:name="ref-hoeffding1963"/>
     <w:p>
       <w:pPr>
         <w:pStyle w:val="Bibliography"/>
@@ -24490,7 +25395,7 @@
       <w:r>
         <w:t xml:space="preserve"> </w:t>
       </w:r>
-      <w:hyperlink r:id="rId68">
+      <w:hyperlink r:id="rId69">
         <w:r>
           <w:rPr>
             <w:rStyle w:val="Hyperlink"/>
@@ -24502,8 +25407,8 @@
         <w:t xml:space="preserve">.</w:t>
       </w:r>
     </w:p>
-    <w:bookmarkEnd w:id="69"/>
-    <w:bookmarkStart w:id="71" w:name="ref-seneta2013"/>
+    <w:bookmarkEnd w:id="70"/>
+    <w:bookmarkStart w:id="72" w:name="ref-seneta2013"/>
     <w:p>
       <w:pPr>
         <w:pStyle w:val="Bibliography"/>
@@ -24536,7 +25441,7 @@
       <w:r>
         <w:t xml:space="preserve"> </w:t>
       </w:r>
-      <w:hyperlink r:id="rId70">
+      <w:hyperlink r:id="rId71">
         <w:r>
           <w:rPr>
             <w:rStyle w:val="Hyperlink"/>
@@ -24548,8 +25453,8 @@
         <w:t xml:space="preserve">.</w:t>
       </w:r>
     </w:p>
-    <w:bookmarkEnd w:id="71"/>
-    <w:bookmarkStart w:id="73" w:name="ref-tchebichef1867"/>
+    <w:bookmarkEnd w:id="72"/>
+    <w:bookmarkStart w:id="74" w:name="ref-tchebichef1867"/>
     <w:p>
       <w:pPr>
         <w:pStyle w:val="Bibliography"/>
@@ -24579,7 +25484,7 @@
       <w:r>
         <w:t xml:space="preserve"> </w:t>
       </w:r>
-      <w:hyperlink r:id="rId72">
+      <w:hyperlink r:id="rId73">
         <w:r>
           <w:rPr>
             <w:rStyle w:val="Hyperlink"/>
@@ -24591,9 +25496,9 @@
         <w:t xml:space="preserve">.</w:t>
       </w:r>
     </w:p>
-    <w:bookmarkEnd w:id="73"/>
     <w:bookmarkEnd w:id="74"/>
     <w:bookmarkEnd w:id="75"/>
+    <w:bookmarkEnd w:id="76"/>
     <w:sectPr>
       <w:footnotePr>
         <w:numRestart w:val="eachSect"/>

</xml_diff>

<commit_message>
Deploying to gh-pages from @ Morrison-Lab/pds@02818b75fc1e322407a71a8f0e40aa8d774ad848 🚀
</commit_message>
<xml_diff>
--- a/limit-theorems.docx
+++ b/limit-theorems.docx
@@ -15,7 +15,7 @@
         <w:pStyle w:val="Date"/>
       </w:pPr>
       <w:r>
-        <w:t xml:space="preserve">Last modified: 2026-10-15 12:42:26 (PDT)</w:t>
+        <w:t xml:space="preserve">Last modified: 2026-10-15 13:26:27 (PDT)</w:t>
       </w:r>
     </w:p>
     <w:bookmarkStart w:id="38" w:name="sec-clt"/>
@@ -5134,10 +5134,74 @@
         </m:r>
       </m:oMath>
       <w:r>
-        <w:t xml:space="preserve"> </w:t>
-      </w:r>
-      <w:r>
-        <w:t xml:space="preserve">has mean</w:t>
+        <w:t xml:space="preserve">, where</w:t>
+      </w:r>
+      <w:r>
+        <w:t xml:space="preserve"> </w:t>
+      </w:r>
+      <m:oMath>
+        <m:sSub>
+          <m:e>
+            <m:r>
+              <m:t>S</m:t>
+            </m:r>
+          </m:e>
+          <m:sub>
+            <m:r>
+              <m:t>n</m:t>
+            </m:r>
+          </m:sub>
+        </m:sSub>
+        <m:r>
+          <m:rPr>
+            <m:sty m:val="p"/>
+          </m:rPr>
+          <m:t>=</m:t>
+        </m:r>
+        <m:nary>
+          <m:naryPr>
+            <m:chr m:val="∑"/>
+            <m:limLoc m:val="undOvr"/>
+            <m:subHide m:val="off"/>
+            <m:supHide m:val="off"/>
+          </m:naryPr>
+          <m:sub>
+            <m:r>
+              <m:t>i</m:t>
+            </m:r>
+            <m:r>
+              <m:rPr>
+                <m:sty m:val="p"/>
+              </m:rPr>
+              <m:t>=</m:t>
+            </m:r>
+            <m:r>
+              <m:t>1</m:t>
+            </m:r>
+          </m:sub>
+          <m:sup>
+            <m:r>
+              <m:t>n</m:t>
+            </m:r>
+          </m:sup>
+          <m:e>
+            <m:sSub>
+              <m:e>
+                <m:r>
+                  <m:t>X</m:t>
+                </m:r>
+              </m:e>
+              <m:sub>
+                <m:r>
+                  <m:t>i</m:t>
+                </m:r>
+              </m:sub>
+            </m:sSub>
+          </m:e>
+        </m:nary>
+      </m:oMath>
+      <w:r>
+        <w:t xml:space="preserve">, has mean</w:t>
       </w:r>
       <w:r>
         <w:t xml:space="preserve"> </w:t>

</xml_diff>

<commit_message>
Deploying to gh-pages from @ Morrison-Lab/pds@65e4cf00120573e8ec6c949a38d30d7a7335e41a 🚀
</commit_message>
<xml_diff>
--- a/limit-theorems.docx
+++ b/limit-theorems.docx
@@ -15,7 +15,7 @@
         <w:pStyle w:val="Date"/>
       </w:pPr>
       <w:r>
-        <w:t xml:space="preserve">Last modified: 2026-10-16 03:22:58 (PDT)</w:t>
+        <w:t xml:space="preserve">Last modified: 2026-10-16 05:12:28 (PDT)</w:t>
       </w:r>
     </w:p>
     <w:bookmarkStart w:id="38" w:name="sec-clt"/>
@@ -42,7 +42,7 @@
         <w:t xml:space="preserve">. </w:t>
       </w:r>
       <w:r>
-        <w:t xml:space="preserve">The average of many independent random variables,</w:t>
+        <w:t xml:space="preserve">The sample mean of many independent random variables,</w:t>
       </w:r>
       <w:r>
         <w:t xml:space="preserve"> </w:t>
@@ -172,7 +172,7 @@
         <w:t xml:space="preserve"> </w:t>
       </w:r>
       <w:r>
-        <w:t xml:space="preserve">with mean</w:t>
+        <w:t xml:space="preserve">with population mean</w:t>
       </w:r>
       <w:r>
         <w:t xml:space="preserve"> </w:t>
@@ -860,7 +860,7 @@
         <w:t xml:space="preserve"> </w:t>
       </w:r>
       <w:r>
-        <w:t xml:space="preserve">with mean</w:t>
+        <w:t xml:space="preserve">with population mean</w:t>
       </w:r>
       <w:r>
         <w:t xml:space="preserve"> </w:t>
@@ -1549,7 +1549,7 @@
         <w:t xml:space="preserve"> </w:t>
       </w:r>
       <w:r>
-        <w:t xml:space="preserve">with mean</w:t>
+        <w:t xml:space="preserve">with population mean</w:t>
       </w:r>
       <w:r>
         <w:t xml:space="preserve"> </w:t>
@@ -5074,7 +5074,7 @@
         <w:t xml:space="preserve"> </w:t>
       </w:r>
       <w:r>
-        <w:t xml:space="preserve">are the mean and variance of the 392 horsepower values.</w:t>
+        <w:t xml:space="preserve">are the population mean and variance of the 392 horsepower values.</w:t>
       </w:r>
       <w:r>
         <w:t xml:space="preserve"> </w:t>
@@ -5395,7 +5395,7 @@
         <w:t xml:space="preserve"> </w:t>
       </w:r>
       <w:r>
-        <w:t xml:space="preserve">with replacement, and computes each sample’s mean.</w:t>
+        <w:t xml:space="preserve">with replacement, and computes each sample’s sample mean.</w:t>
       </w:r>
     </w:p>
     <w:p>
@@ -10873,7 +10873,7 @@
           <w:b/>
           <w:bCs/>
         </w:rPr>
-        <w:t xml:space="preserve">Exercise 1 (How many cars to estimate average fuel economy)</w:t>
+        <w:t xml:space="preserve">Exercise 1 (How many cars to estimate mean fuel economy)</w:t>
       </w:r>
       <w:r>
         <w:t xml:space="preserve"> </w:t>
@@ -10970,7 +10970,7 @@
         <w:t xml:space="preserve"> </w:t>
       </w:r>
       <w:r>
-        <w:t xml:space="preserve">with mean</w:t>
+        <w:t xml:space="preserve">with population mean</w:t>
       </w:r>
       <w:r>
         <w:t xml:space="preserve"> </w:t>
@@ -12957,7 +12957,7 @@
           <w:b/>
           <w:bCs/>
         </w:rPr>
-        <w:t xml:space="preserve">Theorem 4 (Chebyshev’s inequality for a sample average)</w:t>
+        <w:t xml:space="preserve">Theorem 4 (Chebyshev’s inequality for a sample mean)</w:t>
       </w:r>
       <w:r>
         <w:t xml:space="preserve"> </w:t>
@@ -13039,7 +13039,7 @@
         <w:t xml:space="preserve"> </w:t>
       </w:r>
       <w:r>
-        <w:t xml:space="preserve">with mean</w:t>
+        <w:t xml:space="preserve">with population mean</w:t>
       </w:r>
       <w:r>
         <w:t xml:space="preserve"> </w:t>
@@ -17259,7 +17259,7 @@
         <w:t xml:space="preserve"> </w:t>
       </w:r>
       <w:r>
-        <w:t xml:space="preserve">The next result uses it to bound the tails of an average.</w:t>
+        <w:t xml:space="preserve">The next result uses it to bound the tails of a sample mean.</w:t>
       </w:r>
     </w:p>
     <w:bookmarkStart w:id="47" w:name="thm-hoeffding"/>
@@ -17389,7 +17389,7 @@
         <w:t xml:space="preserve"> </w:t>
       </w:r>
       <w:r>
-        <w:t xml:space="preserve">and mean</w:t>
+        <w:t xml:space="preserve">and population mean</w:t>
       </w:r>
       <w:r>
         <w:t xml:space="preserve"> </w:t>
@@ -20123,7 +20123,7 @@
         <w:t xml:space="preserve"> </w:t>
       </w:r>
       <w:r>
-        <w:t xml:space="preserve">Their average is</w:t>
+        <w:t xml:space="preserve">Their sample mean is</w:t>
       </w:r>
       <w:r>
         <w:t xml:space="preserve"> </w:t>
@@ -21116,7 +21116,7 @@
         <w:t xml:space="preserve"> </w:t>
       </w:r>
       <w:r>
-        <w:t xml:space="preserve">This page states the case of an average of IID variables in</w:t>
+        <w:t xml:space="preserve">This page states the case of the sample mean of IID variables in</w:t>
       </w:r>
       <w:r>
         <w:t xml:space="preserve"> </w:t>
@@ -23483,7 +23483,7 @@
         <w:t xml:space="preserve"> </w:t>
       </w:r>
       <w:r>
-        <w:t xml:space="preserve">with mean</w:t>
+        <w:t xml:space="preserve">with population mean</w:t>
       </w:r>
       <w:r>
         <w:t xml:space="preserve"> </w:t>

</xml_diff>

<commit_message>
Deploying to gh-pages from @ Morrison-Lab/pds@cc676b06178eaa901f4301ac7d1f10f3d46709a3 🚀
</commit_message>
<xml_diff>
--- a/limit-theorems.docx
+++ b/limit-theorems.docx
@@ -15,10 +15,10 @@
         <w:pStyle w:val="Date"/>
       </w:pPr>
       <w:r>
-        <w:t xml:space="preserve">Last modified: 2026-10-22 00:49:36 (PDT)</w:t>
+        <w:t xml:space="preserve">Last modified: 2026-10-22 01:12:44 (PDT)</w:t>
       </w:r>
     </w:p>
-    <w:bookmarkStart w:id="38" w:name="sec-clt"/>
+    <w:bookmarkStart w:id="44" w:name="sec-clt"/>
     <w:p>
       <w:pPr>
         <w:pStyle w:val="Heading2"/>
@@ -3103,39 +3103,206 @@
         </m:oMath>
       </m:oMathPara>
     </w:p>
+    <w:bookmarkStart w:id="24" w:name="cor-mean-iid-moments"/>
     <w:p>
       <w:pPr>
         <w:pStyle w:val="FirstParagraph"/>
       </w:pPr>
       <w:r>
         <w:rPr>
-          <w:i/>
-          <w:iCs/>
-        </w:rPr>
-        <w:t xml:space="preserve">Remark</w:t>
-      </w:r>
-      <w:r>
-        <w:t xml:space="preserve">. </w:t>
-      </w:r>
-      <w:r>
-        <w:t xml:space="preserve">In practice,</w:t>
-      </w:r>
-      <w:r>
-        <w:t xml:space="preserve"> </w:t>
-      </w:r>
-      <w:hyperlink w:anchor="thm-clt">
+          <w:b/>
+          <w:bCs/>
+        </w:rPr>
+        <w:t xml:space="preserve">Corollary 3 (Mean and variance of a sample mean of IID random variables)</w:t>
+      </w:r>
+      <w:r>
+        <w:t xml:space="preserve"> </w:t>
+      </w:r>
+      <w:r>
+        <w:t xml:space="preserve">Let</w:t>
+      </w:r>
+      <w:r>
+        <w:t xml:space="preserve"> </w:t>
+      </w:r>
+      <m:oMath>
+        <m:sSub>
+          <m:e>
+            <m:r>
+              <m:t>X</m:t>
+            </m:r>
+          </m:e>
+          <m:sub>
+            <m:r>
+              <m:t>1</m:t>
+            </m:r>
+          </m:sub>
+        </m:sSub>
+        <m:r>
+          <m:rPr>
+            <m:sty m:val="p"/>
+          </m:rPr>
+          <m:t>,</m:t>
+        </m:r>
+        <m:r>
+          <m:rPr>
+            <m:sty m:val="p"/>
+          </m:rPr>
+          <m:t>…</m:t>
+        </m:r>
+        <m:r>
+          <m:rPr>
+            <m:sty m:val="p"/>
+          </m:rPr>
+          <m:t>,</m:t>
+        </m:r>
+        <m:sSub>
+          <m:e>
+            <m:r>
+              <m:t>X</m:t>
+            </m:r>
+          </m:e>
+          <m:sub>
+            <m:r>
+              <m:t>n</m:t>
+            </m:r>
+          </m:sub>
+        </m:sSub>
+      </m:oMath>
+      <w:r>
+        <w:t xml:space="preserve"> </w:t>
+      </w:r>
+      <w:r>
+        <w:t xml:space="preserve">be</w:t>
+      </w:r>
+      <w:r>
+        <w:t xml:space="preserve"> </w:t>
+      </w:r>
+      <w:hyperlink r:id="rId9">
         <w:r>
           <w:rPr>
             <w:rStyle w:val="Hyperlink"/>
           </w:rPr>
-          <w:t xml:space="preserve">Theorem 1</w:t>
+          <w:t xml:space="preserve">IID</w:t>
         </w:r>
       </w:hyperlink>
       <w:r>
         <w:t xml:space="preserve"> </w:t>
       </w:r>
-      <w:r>
-        <w:t xml:space="preserve">justifies approximating</w:t>
+      <w:hyperlink r:id="rId19">
+        <w:r>
+          <w:rPr>
+            <w:rStyle w:val="Hyperlink"/>
+          </w:rPr>
+          <w:t xml:space="preserve">random variables</w:t>
+        </w:r>
+      </w:hyperlink>
+      <w:r>
+        <w:t xml:space="preserve">,</w:t>
+      </w:r>
+      <w:r>
+        <w:t xml:space="preserve"> </w:t>
+      </w:r>
+      <w:r>
+        <w:t xml:space="preserve">each</w:t>
+      </w:r>
+      <w:r>
+        <w:t xml:space="preserve"> </w:t>
+      </w:r>
+      <w:hyperlink r:id="rId20">
+        <w:r>
+          <w:rPr>
+            <w:rStyle w:val="Hyperlink"/>
+          </w:rPr>
+          <w:t xml:space="preserve">discrete</w:t>
+        </w:r>
+      </w:hyperlink>
+      <w:r>
+        <w:t xml:space="preserve"> </w:t>
+      </w:r>
+      <w:r>
+        <w:t xml:space="preserve">or</w:t>
+      </w:r>
+      <w:r>
+        <w:t xml:space="preserve"> </w:t>
+      </w:r>
+      <w:hyperlink r:id="rId21">
+        <w:r>
+          <w:rPr>
+            <w:rStyle w:val="Hyperlink"/>
+          </w:rPr>
+          <w:t xml:space="preserve">continuous</w:t>
+        </w:r>
+      </w:hyperlink>
+      <w:r>
+        <w:t xml:space="preserve">,</w:t>
+      </w:r>
+      <w:r>
+        <w:t xml:space="preserve"> </w:t>
+      </w:r>
+      <w:r>
+        <w:t xml:space="preserve">with</w:t>
+      </w:r>
+      <w:r>
+        <w:t xml:space="preserve"> </w:t>
+      </w:r>
+      <w:hyperlink r:id="rId22">
+        <w:r>
+          <w:rPr>
+            <w:rStyle w:val="Hyperlink"/>
+          </w:rPr>
+          <w:t xml:space="preserve">population mean</w:t>
+        </w:r>
+      </w:hyperlink>
+      <w:r>
+        <w:t xml:space="preserve"> </w:t>
+      </w:r>
+      <m:oMath>
+        <m:r>
+          <m:t>μ</m:t>
+        </m:r>
+      </m:oMath>
+      <w:r>
+        <w:t xml:space="preserve"> </w:t>
+      </w:r>
+      <w:r>
+        <w:t xml:space="preserve">and finite</w:t>
+      </w:r>
+      <w:r>
+        <w:t xml:space="preserve"> </w:t>
+      </w:r>
+      <w:hyperlink r:id="rId23">
+        <w:r>
+          <w:rPr>
+            <w:rStyle w:val="Hyperlink"/>
+          </w:rPr>
+          <w:t xml:space="preserve">variance</w:t>
+        </w:r>
+      </w:hyperlink>
+      <w:r>
+        <w:t xml:space="preserve"> </w:t>
+      </w:r>
+      <m:oMath>
+        <m:sSup>
+          <m:e>
+            <m:r>
+              <m:t>σ</m:t>
+            </m:r>
+          </m:e>
+          <m:sup>
+            <m:r>
+              <m:t>2</m:t>
+            </m:r>
+          </m:sup>
+        </m:sSup>
+      </m:oMath>
+      <w:r>
+        <w:t xml:space="preserve">,</w:t>
+      </w:r>
+      <w:r>
+        <w:t xml:space="preserve"> </w:t>
+      </w:r>
+      <w:r>
+        <w:t xml:space="preserve">and let</w:t>
       </w:r>
       <w:r>
         <w:t xml:space="preserve"> </w:t>
@@ -3160,78 +3327,254 @@
             </m:r>
           </m:sub>
         </m:sSub>
+        <m:limUpp>
+          <m:e>
+            <m:r>
+              <m:rPr>
+                <m:sty m:val="p"/>
+              </m:rPr>
+              <m:t>=</m:t>
+            </m:r>
+          </m:e>
+          <m:lim>
+            <m:r>
+              <m:rPr>
+                <m:nor/>
+                <m:sty m:val="p"/>
+              </m:rPr>
+              <m:t>def</m:t>
+            </m:r>
+          </m:lim>
+        </m:limUpp>
+        <m:f>
+          <m:fPr>
+            <m:type m:val="bar"/>
+          </m:fPr>
+          <m:num>
+            <m:r>
+              <m:t>1</m:t>
+            </m:r>
+          </m:num>
+          <m:den>
+            <m:r>
+              <m:t>n</m:t>
+            </m:r>
+          </m:den>
+        </m:f>
+        <m:nary>
+          <m:naryPr>
+            <m:chr m:val="∑"/>
+            <m:limLoc m:val="undOvr"/>
+            <m:subHide m:val="off"/>
+            <m:supHide m:val="off"/>
+          </m:naryPr>
+          <m:sub>
+            <m:r>
+              <m:t>i</m:t>
+            </m:r>
+            <m:r>
+              <m:rPr>
+                <m:sty m:val="p"/>
+              </m:rPr>
+              <m:t>=</m:t>
+            </m:r>
+            <m:r>
+              <m:t>1</m:t>
+            </m:r>
+          </m:sub>
+          <m:sup>
+            <m:r>
+              <m:t>n</m:t>
+            </m:r>
+          </m:sup>
+          <m:e>
+            <m:sSub>
+              <m:e>
+                <m:r>
+                  <m:t>X</m:t>
+                </m:r>
+              </m:e>
+              <m:sub>
+                <m:r>
+                  <m:t>i</m:t>
+                </m:r>
+              </m:sub>
+            </m:sSub>
+          </m:e>
+        </m:nary>
       </m:oMath>
       <w:r>
-        <w:t xml:space="preserve"> </w:t>
-      </w:r>
-      <w:r>
-        <w:t xml:space="preserve">by a normal distribution with mean</w:t>
-      </w:r>
-      <w:r>
-        <w:t xml:space="preserve"> </w:t>
-      </w:r>
-      <m:oMath>
-        <m:r>
-          <m:t>μ</m:t>
-        </m:r>
-      </m:oMath>
-      <w:r>
-        <w:t xml:space="preserve"> </w:t>
-      </w:r>
-      <w:r>
-        <w:t xml:space="preserve">and variance</w:t>
-      </w:r>
-      <w:r>
-        <w:t xml:space="preserve"> </w:t>
-      </w:r>
-      <m:oMath>
-        <m:sSup>
-          <m:e>
-            <m:r>
-              <m:t>σ</m:t>
-            </m:r>
-          </m:e>
-          <m:sup>
-            <m:r>
-              <m:t>2</m:t>
-            </m:r>
-          </m:sup>
-        </m:sSup>
-        <m:r>
-          <m:rPr>
-            <m:sty m:val="p"/>
-          </m:rPr>
-          <m:t>/</m:t>
-        </m:r>
-        <m:r>
-          <m:t>n</m:t>
-        </m:r>
-      </m:oMath>
-      <w:r>
-        <w:t xml:space="preserve">,</w:t>
-      </w:r>
-      <w:r>
-        <w:t xml:space="preserve"> </w:t>
-      </w:r>
-      <w:r>
-        <w:t xml:space="preserve">and</w:t>
-      </w:r>
-      <w:r>
-        <w:t xml:space="preserve"> </w:t>
-      </w:r>
-      <w:hyperlink w:anchor="cor-clt-sum">
-        <w:r>
-          <w:rPr>
-            <w:rStyle w:val="Hyperlink"/>
-          </w:rPr>
-          <w:t xml:space="preserve">Corollary 1</w:t>
-        </w:r>
-      </w:hyperlink>
-      <w:r>
-        <w:t xml:space="preserve"> </w:t>
-      </w:r>
-      <w:r>
-        <w:t xml:space="preserve">justifies approximating</w:t>
+        <w:t xml:space="preserve">.</w:t>
+      </w:r>
+      <w:r>
+        <w:t xml:space="preserve"> </w:t>
+      </w:r>
+      <w:r>
+        <w:t xml:space="preserve">Then:</w:t>
+      </w:r>
+    </w:p>
+    <w:p>
+      <w:pPr>
+        <w:pStyle w:val="BodyText"/>
+      </w:pPr>
+      <m:oMathPara>
+        <m:oMathParaPr>
+          <m:jc m:val="center"/>
+        </m:oMathParaPr>
+        <m:oMath>
+          <m:eqArr>
+            <m:e>
+              <m:r>
+                <m:rPr>
+                  <m:sty m:val="p"/>
+                </m:rPr>
+                <m:t>E</m:t>
+              </m:r>
+              <m:r>
+                <m:t>​</m:t>
+              </m:r>
+              <m:d>
+                <m:dPr>
+                  <m:begChr m:val="["/>
+                  <m:sepChr m:val=""/>
+                  <m:endChr m:val="]"/>
+                  <m:grow/>
+                </m:dPr>
+                <m:e>
+                  <m:sSub>
+                    <m:e>
+                      <m:acc>
+                        <m:accPr>
+                          <m:chr m:val="‾"/>
+                        </m:accPr>
+                        <m:e>
+                          <m:r>
+                            <m:t>X</m:t>
+                          </m:r>
+                        </m:e>
+                      </m:acc>
+                    </m:e>
+                    <m:sub>
+                      <m:r>
+                        <m:t>n</m:t>
+                      </m:r>
+                    </m:sub>
+                  </m:sSub>
+                </m:e>
+              </m:d>
+              <m:r>
+                <m:t>​</m:t>
+              </m:r>
+              <m:r>
+                <m:t>&amp;</m:t>
+              </m:r>
+              <m:r>
+                <m:rPr>
+                  <m:sty m:val="p"/>
+                </m:rPr>
+                <m:t>=</m:t>
+              </m:r>
+              <m:r>
+                <m:t>μ</m:t>
+              </m:r>
+            </m:e>
+            <m:e>
+              <m:r>
+                <m:rPr>
+                  <m:sty m:val="p"/>
+                </m:rPr>
+                <m:t>Var</m:t>
+              </m:r>
+              <m:r>
+                <m:t>​</m:t>
+              </m:r>
+              <m:d>
+                <m:dPr>
+                  <m:begChr m:val="("/>
+                  <m:sepChr m:val=""/>
+                  <m:endChr m:val=")"/>
+                  <m:grow/>
+                </m:dPr>
+                <m:e>
+                  <m:sSub>
+                    <m:e>
+                      <m:acc>
+                        <m:accPr>
+                          <m:chr m:val="‾"/>
+                        </m:accPr>
+                        <m:e>
+                          <m:r>
+                            <m:t>X</m:t>
+                          </m:r>
+                        </m:e>
+                      </m:acc>
+                    </m:e>
+                    <m:sub>
+                      <m:r>
+                        <m:t>n</m:t>
+                      </m:r>
+                    </m:sub>
+                  </m:sSub>
+                </m:e>
+              </m:d>
+              <m:r>
+                <m:t>​</m:t>
+              </m:r>
+              <m:r>
+                <m:t>&amp;</m:t>
+              </m:r>
+              <m:r>
+                <m:rPr>
+                  <m:sty m:val="p"/>
+                </m:rPr>
+                <m:t>=</m:t>
+              </m:r>
+              <m:f>
+                <m:fPr>
+                  <m:type m:val="bar"/>
+                </m:fPr>
+                <m:num>
+                  <m:sSup>
+                    <m:e>
+                      <m:r>
+                        <m:t>σ</m:t>
+                      </m:r>
+                    </m:e>
+                    <m:sup>
+                      <m:r>
+                        <m:t>2</m:t>
+                      </m:r>
+                    </m:sup>
+                  </m:sSup>
+                </m:num>
+                <m:den>
+                  <m:r>
+                    <m:t>n</m:t>
+                  </m:r>
+                </m:den>
+              </m:f>
+            </m:e>
+          </m:eqArr>
+        </m:oMath>
+      </m:oMathPara>
+    </w:p>
+    <w:bookmarkEnd w:id="24"/>
+    <w:p>
+      <w:pPr>
+        <w:pStyle w:val="FirstParagraph"/>
+      </w:pPr>
+      <w:r>
+        <w:rPr>
+          <w:i/>
+          <w:iCs/>
+        </w:rPr>
+        <w:t xml:space="preserve">Proof</w:t>
+      </w:r>
+      <w:r>
+        <w:t xml:space="preserve">. </w:t>
+      </w:r>
+      <w:r>
+        <w:t xml:space="preserve">Let</w:t>
       </w:r>
       <w:r>
         <w:t xml:space="preserve"> </w:t>
@@ -3249,78 +3592,69 @@
             </m:r>
           </m:sub>
         </m:sSub>
+        <m:limUpp>
+          <m:e>
+            <m:r>
+              <m:rPr>
+                <m:sty m:val="p"/>
+              </m:rPr>
+              <m:t>=</m:t>
+            </m:r>
+          </m:e>
+          <m:lim>
+            <m:r>
+              <m:rPr>
+                <m:nor/>
+                <m:sty m:val="p"/>
+              </m:rPr>
+              <m:t>def</m:t>
+            </m:r>
+          </m:lim>
+        </m:limUpp>
+        <m:nary>
+          <m:naryPr>
+            <m:chr m:val="∑"/>
+            <m:limLoc m:val="undOvr"/>
+            <m:subHide m:val="off"/>
+            <m:supHide m:val="off"/>
+          </m:naryPr>
+          <m:sub>
+            <m:r>
+              <m:t>i</m:t>
+            </m:r>
+            <m:r>
+              <m:rPr>
+                <m:sty m:val="p"/>
+              </m:rPr>
+              <m:t>=</m:t>
+            </m:r>
+            <m:r>
+              <m:t>1</m:t>
+            </m:r>
+          </m:sub>
+          <m:sup>
+            <m:r>
+              <m:t>n</m:t>
+            </m:r>
+          </m:sup>
+          <m:e>
+            <m:sSub>
+              <m:e>
+                <m:r>
+                  <m:t>X</m:t>
+                </m:r>
+              </m:e>
+              <m:sub>
+                <m:r>
+                  <m:t>i</m:t>
+                </m:r>
+              </m:sub>
+            </m:sSub>
+          </m:e>
+        </m:nary>
       </m:oMath>
       <w:r>
-        <w:t xml:space="preserve"> </w:t>
-      </w:r>
-      <w:r>
-        <w:t xml:space="preserve">by a normal distribution with mean</w:t>
-      </w:r>
-      <w:r>
-        <w:t xml:space="preserve"> </w:t>
-      </w:r>
-      <m:oMath>
-        <m:r>
-          <m:t>n</m:t>
-        </m:r>
-        <m:r>
-          <m:t>μ</m:t>
-        </m:r>
-      </m:oMath>
-      <w:r>
-        <w:t xml:space="preserve"> </w:t>
-      </w:r>
-      <w:r>
-        <w:t xml:space="preserve">and variance</w:t>
-      </w:r>
-      <w:r>
-        <w:t xml:space="preserve"> </w:t>
-      </w:r>
-      <m:oMath>
-        <m:r>
-          <m:t>n</m:t>
-        </m:r>
-        <m:sSup>
-          <m:e>
-            <m:r>
-              <m:t>σ</m:t>
-            </m:r>
-          </m:e>
-          <m:sup>
-            <m:r>
-              <m:t>2</m:t>
-            </m:r>
-          </m:sup>
-        </m:sSup>
-      </m:oMath>
-      <w:r>
-        <w:t xml:space="preserve">.</w:t>
-      </w:r>
-      <w:r>
-        <w:t xml:space="preserve"> </w:t>
-      </w:r>
-      <w:r>
-        <w:t xml:space="preserve">By</w:t>
-      </w:r>
-      <w:r>
-        <w:t xml:space="preserve"> </w:t>
-      </w:r>
-      <w:hyperlink w:anchor="cor-sum-iid-moments">
-        <w:r>
-          <w:rPr>
-            <w:rStyle w:val="Hyperlink"/>
-          </w:rPr>
-          <w:t xml:space="preserve">Corollary 2</w:t>
-        </w:r>
-      </w:hyperlink>
-      <w:r>
-        <w:t xml:space="preserve">, these are exactly the means and variances</w:t>
-      </w:r>
-      <w:r>
-        <w:t xml:space="preserve"> </w:t>
-      </w:r>
-      <w:r>
-        <w:t xml:space="preserve">of</w:t>
+        <w:t xml:space="preserve">, so</w:t>
       </w:r>
       <w:r>
         <w:t xml:space="preserve"> </w:t>
@@ -3374,10 +3708,788 @@
         </m:r>
       </m:oMath>
       <w:r>
+        <w:t xml:space="preserve">.</w:t>
+      </w:r>
+      <w:r>
+        <w:t xml:space="preserve"> </w:t>
+      </w:r>
+      <w:r>
+        <w:t xml:space="preserve">By</w:t>
+      </w:r>
+      <w:r>
+        <w:t xml:space="preserve"> </w:t>
+      </w:r>
+      <w:hyperlink w:anchor="cor-sum-iid-moments">
+        <w:r>
+          <w:rPr>
+            <w:rStyle w:val="Hyperlink"/>
+          </w:rPr>
+          <w:t xml:space="preserve">Corollary 2</w:t>
+        </w:r>
+      </w:hyperlink>
+      <w:r>
+        <w:t xml:space="preserve">,</w:t>
+      </w:r>
+      <w:r>
+        <w:t xml:space="preserve"> </w:t>
+      </w:r>
+      <m:oMath>
+        <m:r>
+          <m:rPr>
+            <m:sty m:val="p"/>
+          </m:rPr>
+          <m:t>E</m:t>
+        </m:r>
+        <m:r>
+          <m:t>​</m:t>
+        </m:r>
+        <m:d>
+          <m:dPr>
+            <m:begChr m:val="["/>
+            <m:sepChr m:val=""/>
+            <m:endChr m:val="]"/>
+            <m:grow/>
+          </m:dPr>
+          <m:e>
+            <m:sSub>
+              <m:e>
+                <m:r>
+                  <m:t>S</m:t>
+                </m:r>
+              </m:e>
+              <m:sub>
+                <m:r>
+                  <m:t>n</m:t>
+                </m:r>
+              </m:sub>
+            </m:sSub>
+          </m:e>
+        </m:d>
+        <m:r>
+          <m:t>​</m:t>
+        </m:r>
+        <m:r>
+          <m:rPr>
+            <m:sty m:val="p"/>
+          </m:rPr>
+          <m:t>=</m:t>
+        </m:r>
+        <m:r>
+          <m:t>n</m:t>
+        </m:r>
+        <m:r>
+          <m:t>μ</m:t>
+        </m:r>
+      </m:oMath>
+      <w:r>
         <w:t xml:space="preserve"> </w:t>
       </w:r>
       <w:r>
         <w:t xml:space="preserve">and</w:t>
+      </w:r>
+      <w:r>
+        <w:t xml:space="preserve"> </w:t>
+      </w:r>
+      <m:oMath>
+        <m:r>
+          <m:rPr>
+            <m:sty m:val="p"/>
+          </m:rPr>
+          <m:t>Var</m:t>
+        </m:r>
+        <m:r>
+          <m:t>​</m:t>
+        </m:r>
+        <m:d>
+          <m:dPr>
+            <m:begChr m:val="("/>
+            <m:sepChr m:val=""/>
+            <m:endChr m:val=")"/>
+            <m:grow/>
+          </m:dPr>
+          <m:e>
+            <m:sSub>
+              <m:e>
+                <m:r>
+                  <m:t>S</m:t>
+                </m:r>
+              </m:e>
+              <m:sub>
+                <m:r>
+                  <m:t>n</m:t>
+                </m:r>
+              </m:sub>
+            </m:sSub>
+          </m:e>
+        </m:d>
+        <m:r>
+          <m:t>​</m:t>
+        </m:r>
+        <m:r>
+          <m:rPr>
+            <m:sty m:val="p"/>
+          </m:rPr>
+          <m:t>=</m:t>
+        </m:r>
+        <m:r>
+          <m:t>n</m:t>
+        </m:r>
+        <m:sSup>
+          <m:e>
+            <m:r>
+              <m:t>σ</m:t>
+            </m:r>
+          </m:e>
+          <m:sup>
+            <m:r>
+              <m:t>2</m:t>
+            </m:r>
+          </m:sup>
+        </m:sSup>
+      </m:oMath>
+      <w:r>
+        <w:t xml:space="preserve">:</w:t>
+      </w:r>
+    </w:p>
+    <w:p>
+      <w:pPr>
+        <w:pStyle w:val="BodyText"/>
+      </w:pPr>
+      <m:oMathPara>
+        <m:oMathParaPr>
+          <m:jc m:val="center"/>
+        </m:oMathParaPr>
+        <m:oMath>
+          <m:eqArr>
+            <m:e>
+              <m:r>
+                <m:rPr>
+                  <m:sty m:val="p"/>
+                </m:rPr>
+                <m:t>E</m:t>
+              </m:r>
+              <m:r>
+                <m:t>​</m:t>
+              </m:r>
+              <m:d>
+                <m:dPr>
+                  <m:begChr m:val="["/>
+                  <m:sepChr m:val=""/>
+                  <m:endChr m:val="]"/>
+                  <m:grow/>
+                </m:dPr>
+                <m:e>
+                  <m:sSub>
+                    <m:e>
+                      <m:acc>
+                        <m:accPr>
+                          <m:chr m:val="‾"/>
+                        </m:accPr>
+                        <m:e>
+                          <m:r>
+                            <m:t>X</m:t>
+                          </m:r>
+                        </m:e>
+                      </m:acc>
+                    </m:e>
+                    <m:sub>
+                      <m:r>
+                        <m:t>n</m:t>
+                      </m:r>
+                    </m:sub>
+                  </m:sSub>
+                </m:e>
+              </m:d>
+              <m:r>
+                <m:t>​</m:t>
+              </m:r>
+              <m:r>
+                <m:t>&amp;</m:t>
+              </m:r>
+              <m:r>
+                <m:rPr>
+                  <m:sty m:val="p"/>
+                </m:rPr>
+                <m:t>=</m:t>
+              </m:r>
+              <m:r>
+                <m:rPr>
+                  <m:sty m:val="p"/>
+                </m:rPr>
+                <m:t>E</m:t>
+              </m:r>
+              <m:r>
+                <m:t>​</m:t>
+              </m:r>
+              <m:d>
+                <m:dPr>
+                  <m:begChr m:val="["/>
+                  <m:sepChr m:val=""/>
+                  <m:endChr m:val="]"/>
+                  <m:grow/>
+                </m:dPr>
+                <m:e>
+                  <m:f>
+                    <m:fPr>
+                      <m:type m:val="bar"/>
+                    </m:fPr>
+                    <m:num>
+                      <m:sSub>
+                        <m:e>
+                          <m:r>
+                            <m:t>S</m:t>
+                          </m:r>
+                        </m:e>
+                        <m:sub>
+                          <m:r>
+                            <m:t>n</m:t>
+                          </m:r>
+                        </m:sub>
+                      </m:sSub>
+                    </m:num>
+                    <m:den>
+                      <m:r>
+                        <m:t>n</m:t>
+                      </m:r>
+                    </m:den>
+                  </m:f>
+                </m:e>
+              </m:d>
+              <m:r>
+                <m:t>​</m:t>
+              </m:r>
+              <m:r>
+                <m:t>&amp;</m:t>
+              </m:r>
+              <m:r>
+                <m:t>&amp;</m:t>
+              </m:r>
+              <m:r>
+                <m:rPr>
+                  <m:nor/>
+                  <m:sty m:val="p"/>
+                </m:rPr>
+                <m:t>(definition of sample mean)</m:t>
+              </m:r>
+            </m:e>
+            <m:e>
+              <m:r>
+                <m:t>&amp;</m:t>
+              </m:r>
+              <m:r>
+                <m:rPr>
+                  <m:sty m:val="p"/>
+                </m:rPr>
+                <m:t>=</m:t>
+              </m:r>
+              <m:f>
+                <m:fPr>
+                  <m:type m:val="bar"/>
+                </m:fPr>
+                <m:num>
+                  <m:r>
+                    <m:t>1</m:t>
+                  </m:r>
+                </m:num>
+                <m:den>
+                  <m:r>
+                    <m:t>n</m:t>
+                  </m:r>
+                </m:den>
+              </m:f>
+              <m:r>
+                <m:rPr>
+                  <m:sty m:val="p"/>
+                </m:rPr>
+                <m:t>E</m:t>
+              </m:r>
+              <m:r>
+                <m:t>​</m:t>
+              </m:r>
+              <m:d>
+                <m:dPr>
+                  <m:begChr m:val="["/>
+                  <m:sepChr m:val=""/>
+                  <m:endChr m:val="]"/>
+                  <m:grow/>
+                </m:dPr>
+                <m:e>
+                  <m:sSub>
+                    <m:e>
+                      <m:r>
+                        <m:t>S</m:t>
+                      </m:r>
+                    </m:e>
+                    <m:sub>
+                      <m:r>
+                        <m:t>n</m:t>
+                      </m:r>
+                    </m:sub>
+                  </m:sSub>
+                </m:e>
+              </m:d>
+              <m:r>
+                <m:t>​</m:t>
+              </m:r>
+              <m:r>
+                <m:t>&amp;</m:t>
+              </m:r>
+              <m:r>
+                <m:t>&amp;</m:t>
+              </m:r>
+              <m:r>
+                <m:rPr>
+                  <m:nor/>
+                  <m:sty m:val="p"/>
+                </m:rPr>
+                <m:t>(linearity of expectation)</m:t>
+              </m:r>
+            </m:e>
+            <m:e>
+              <m:r>
+                <m:t>&amp;</m:t>
+              </m:r>
+              <m:r>
+                <m:rPr>
+                  <m:sty m:val="p"/>
+                </m:rPr>
+                <m:t>=</m:t>
+              </m:r>
+              <m:f>
+                <m:fPr>
+                  <m:type m:val="bar"/>
+                </m:fPr>
+                <m:num>
+                  <m:r>
+                    <m:t>1</m:t>
+                  </m:r>
+                </m:num>
+                <m:den>
+                  <m:r>
+                    <m:t>n</m:t>
+                  </m:r>
+                </m:den>
+              </m:f>
+              <m:r>
+                <m:rPr>
+                  <m:sty m:val="p"/>
+                </m:rPr>
+                <m:t>⋅</m:t>
+              </m:r>
+              <m:r>
+                <m:t>n</m:t>
+              </m:r>
+              <m:r>
+                <m:t>μ</m:t>
+              </m:r>
+              <m:r>
+                <m:t>&amp;</m:t>
+              </m:r>
+              <m:r>
+                <m:t>&amp;</m:t>
+              </m:r>
+              <m:r>
+                <m:rPr>
+                  <m:nor/>
+                  <m:sty m:val="p"/>
+                </m:rPr>
+                <m:t>(mean of a sum of IID variables)</m:t>
+              </m:r>
+            </m:e>
+            <m:e>
+              <m:r>
+                <m:t>&amp;</m:t>
+              </m:r>
+              <m:r>
+                <m:rPr>
+                  <m:sty m:val="p"/>
+                </m:rPr>
+                <m:t>=</m:t>
+              </m:r>
+              <m:r>
+                <m:t>μ</m:t>
+              </m:r>
+              <m:r>
+                <m:t>&amp;</m:t>
+              </m:r>
+              <m:r>
+                <m:t>&amp;</m:t>
+              </m:r>
+              <m:r>
+                <m:rPr>
+                  <m:nor/>
+                  <m:sty m:val="p"/>
+                </m:rPr>
+                <m:t>(cancel </m:t>
+              </m:r>
+              <m:r>
+                <m:t>n</m:t>
+              </m:r>
+              <m:r>
+                <m:rPr>
+                  <m:nor/>
+                  <m:sty m:val="p"/>
+                </m:rPr>
+                <m:t>)</m:t>
+              </m:r>
+            </m:e>
+            <m:e>
+              <m:r>
+                <m:rPr>
+                  <m:sty m:val="p"/>
+                </m:rPr>
+                <m:t>Var</m:t>
+              </m:r>
+              <m:r>
+                <m:t>​</m:t>
+              </m:r>
+              <m:d>
+                <m:dPr>
+                  <m:begChr m:val="("/>
+                  <m:sepChr m:val=""/>
+                  <m:endChr m:val=")"/>
+                  <m:grow/>
+                </m:dPr>
+                <m:e>
+                  <m:sSub>
+                    <m:e>
+                      <m:acc>
+                        <m:accPr>
+                          <m:chr m:val="‾"/>
+                        </m:accPr>
+                        <m:e>
+                          <m:r>
+                            <m:t>X</m:t>
+                          </m:r>
+                        </m:e>
+                      </m:acc>
+                    </m:e>
+                    <m:sub>
+                      <m:r>
+                        <m:t>n</m:t>
+                      </m:r>
+                    </m:sub>
+                  </m:sSub>
+                </m:e>
+              </m:d>
+              <m:r>
+                <m:t>​</m:t>
+              </m:r>
+              <m:r>
+                <m:t>&amp;</m:t>
+              </m:r>
+              <m:r>
+                <m:rPr>
+                  <m:sty m:val="p"/>
+                </m:rPr>
+                <m:t>=</m:t>
+              </m:r>
+              <m:r>
+                <m:rPr>
+                  <m:sty m:val="p"/>
+                </m:rPr>
+                <m:t>Var</m:t>
+              </m:r>
+              <m:r>
+                <m:t>​</m:t>
+              </m:r>
+              <m:d>
+                <m:dPr>
+                  <m:begChr m:val="("/>
+                  <m:sepChr m:val=""/>
+                  <m:endChr m:val=")"/>
+                  <m:grow/>
+                </m:dPr>
+                <m:e>
+                  <m:f>
+                    <m:fPr>
+                      <m:type m:val="bar"/>
+                    </m:fPr>
+                    <m:num>
+                      <m:sSub>
+                        <m:e>
+                          <m:r>
+                            <m:t>S</m:t>
+                          </m:r>
+                        </m:e>
+                        <m:sub>
+                          <m:r>
+                            <m:t>n</m:t>
+                          </m:r>
+                        </m:sub>
+                      </m:sSub>
+                    </m:num>
+                    <m:den>
+                      <m:r>
+                        <m:t>n</m:t>
+                      </m:r>
+                    </m:den>
+                  </m:f>
+                </m:e>
+              </m:d>
+              <m:r>
+                <m:t>​</m:t>
+              </m:r>
+              <m:r>
+                <m:t>&amp;</m:t>
+              </m:r>
+              <m:r>
+                <m:t>&amp;</m:t>
+              </m:r>
+              <m:r>
+                <m:rPr>
+                  <m:nor/>
+                  <m:sty m:val="p"/>
+                </m:rPr>
+                <m:t>(definition of sample mean)</m:t>
+              </m:r>
+            </m:e>
+            <m:e>
+              <m:r>
+                <m:t>&amp;</m:t>
+              </m:r>
+              <m:r>
+                <m:rPr>
+                  <m:sty m:val="p"/>
+                </m:rPr>
+                <m:t>=</m:t>
+              </m:r>
+              <m:f>
+                <m:fPr>
+                  <m:type m:val="bar"/>
+                </m:fPr>
+                <m:num>
+                  <m:r>
+                    <m:t>1</m:t>
+                  </m:r>
+                </m:num>
+                <m:den>
+                  <m:sSup>
+                    <m:e>
+                      <m:r>
+                        <m:t>n</m:t>
+                      </m:r>
+                    </m:e>
+                    <m:sup>
+                      <m:r>
+                        <m:t>2</m:t>
+                      </m:r>
+                    </m:sup>
+                  </m:sSup>
+                </m:den>
+              </m:f>
+              <m:r>
+                <m:rPr>
+                  <m:sty m:val="p"/>
+                </m:rPr>
+                <m:t>Var</m:t>
+              </m:r>
+              <m:r>
+                <m:t>​</m:t>
+              </m:r>
+              <m:d>
+                <m:dPr>
+                  <m:begChr m:val="("/>
+                  <m:sepChr m:val=""/>
+                  <m:endChr m:val=")"/>
+                  <m:grow/>
+                </m:dPr>
+                <m:e>
+                  <m:sSub>
+                    <m:e>
+                      <m:r>
+                        <m:t>S</m:t>
+                      </m:r>
+                    </m:e>
+                    <m:sub>
+                      <m:r>
+                        <m:t>n</m:t>
+                      </m:r>
+                    </m:sub>
+                  </m:sSub>
+                </m:e>
+              </m:d>
+              <m:r>
+                <m:t>​</m:t>
+              </m:r>
+              <m:r>
+                <m:t>&amp;</m:t>
+              </m:r>
+              <m:r>
+                <m:t>&amp;</m:t>
+              </m:r>
+              <m:r>
+                <m:rPr>
+                  <m:nor/>
+                  <m:sty m:val="p"/>
+                </m:rPr>
+                <m:t>(variance of a constant multiple)</m:t>
+              </m:r>
+            </m:e>
+            <m:e>
+              <m:r>
+                <m:t>&amp;</m:t>
+              </m:r>
+              <m:r>
+                <m:rPr>
+                  <m:sty m:val="p"/>
+                </m:rPr>
+                <m:t>=</m:t>
+              </m:r>
+              <m:f>
+                <m:fPr>
+                  <m:type m:val="bar"/>
+                </m:fPr>
+                <m:num>
+                  <m:r>
+                    <m:t>1</m:t>
+                  </m:r>
+                </m:num>
+                <m:den>
+                  <m:sSup>
+                    <m:e>
+                      <m:r>
+                        <m:t>n</m:t>
+                      </m:r>
+                    </m:e>
+                    <m:sup>
+                      <m:r>
+                        <m:t>2</m:t>
+                      </m:r>
+                    </m:sup>
+                  </m:sSup>
+                </m:den>
+              </m:f>
+              <m:r>
+                <m:rPr>
+                  <m:sty m:val="p"/>
+                </m:rPr>
+                <m:t>⋅</m:t>
+              </m:r>
+              <m:r>
+                <m:t>n</m:t>
+              </m:r>
+              <m:sSup>
+                <m:e>
+                  <m:r>
+                    <m:t>σ</m:t>
+                  </m:r>
+                </m:e>
+                <m:sup>
+                  <m:r>
+                    <m:t>2</m:t>
+                  </m:r>
+                </m:sup>
+              </m:sSup>
+              <m:r>
+                <m:t>&amp;</m:t>
+              </m:r>
+              <m:r>
+                <m:t>&amp;</m:t>
+              </m:r>
+              <m:r>
+                <m:rPr>
+                  <m:nor/>
+                  <m:sty m:val="p"/>
+                </m:rPr>
+                <m:t>(variance of a sum of IID variables)</m:t>
+              </m:r>
+            </m:e>
+            <m:e>
+              <m:r>
+                <m:t>&amp;</m:t>
+              </m:r>
+              <m:r>
+                <m:rPr>
+                  <m:sty m:val="p"/>
+                </m:rPr>
+                <m:t>=</m:t>
+              </m:r>
+              <m:f>
+                <m:fPr>
+                  <m:type m:val="bar"/>
+                </m:fPr>
+                <m:num>
+                  <m:sSup>
+                    <m:e>
+                      <m:r>
+                        <m:t>σ</m:t>
+                      </m:r>
+                    </m:e>
+                    <m:sup>
+                      <m:r>
+                        <m:t>2</m:t>
+                      </m:r>
+                    </m:sup>
+                  </m:sSup>
+                </m:num>
+                <m:den>
+                  <m:r>
+                    <m:t>n</m:t>
+                  </m:r>
+                </m:den>
+              </m:f>
+              <m:r>
+                <m:t>&amp;</m:t>
+              </m:r>
+              <m:r>
+                <m:t>&amp;</m:t>
+              </m:r>
+              <m:r>
+                <m:rPr>
+                  <m:nor/>
+                  <m:sty m:val="p"/>
+                </m:rPr>
+                <m:t>(cancel one factor of </m:t>
+              </m:r>
+              <m:r>
+                <m:t>n</m:t>
+              </m:r>
+              <m:r>
+                <m:rPr>
+                  <m:nor/>
+                  <m:sty m:val="p"/>
+                </m:rPr>
+                <m:t>)</m:t>
+              </m:r>
+            </m:e>
+          </m:eqArr>
+        </m:oMath>
+      </m:oMathPara>
+    </w:p>
+    <w:p>
+      <w:pPr>
+        <w:pStyle w:val="FirstParagraph"/>
+      </w:pPr>
+      <w:r>
+        <w:rPr>
+          <w:i/>
+          <w:iCs/>
+        </w:rPr>
+        <w:t xml:space="preserve">Remark</w:t>
+      </w:r>
+      <w:r>
+        <w:t xml:space="preserve">. </w:t>
+      </w:r>
+      <w:r>
+        <w:t xml:space="preserve">In practice,</w:t>
+      </w:r>
+      <w:r>
+        <w:t xml:space="preserve"> </w:t>
+      </w:r>
+      <w:hyperlink w:anchor="thm-clt">
+        <w:r>
+          <w:rPr>
+            <w:rStyle w:val="Hyperlink"/>
+          </w:rPr>
+          <w:t xml:space="preserve">Theorem 1</w:t>
+        </w:r>
+      </w:hyperlink>
+      <w:r>
+        <w:t xml:space="preserve"> </w:t>
+      </w:r>
+      <w:r>
+        <w:t xml:space="preserve">justifies approximating</w:t>
       </w:r>
       <w:r>
         <w:t xml:space="preserve"> </w:t>
@@ -3385,9 +4497,16 @@
       <m:oMath>
         <m:sSub>
           <m:e>
-            <m:r>
-              <m:t>S</m:t>
-            </m:r>
+            <m:acc>
+              <m:accPr>
+                <m:chr m:val="‾"/>
+              </m:accPr>
+              <m:e>
+                <m:r>
+                  <m:t>X</m:t>
+                </m:r>
+              </m:e>
+            </m:acc>
           </m:e>
           <m:sub>
             <m:r>
@@ -3397,10 +4516,245 @@
         </m:sSub>
       </m:oMath>
       <w:r>
+        <w:t xml:space="preserve"> </w:t>
+      </w:r>
+      <w:r>
+        <w:t xml:space="preserve">by a normal distribution with mean</w:t>
+      </w:r>
+      <w:r>
+        <w:t xml:space="preserve"> </w:t>
+      </w:r>
+      <m:oMath>
+        <m:r>
+          <m:t>μ</m:t>
+        </m:r>
+      </m:oMath>
+      <w:r>
+        <w:t xml:space="preserve"> </w:t>
+      </w:r>
+      <w:r>
+        <w:t xml:space="preserve">and variance</w:t>
+      </w:r>
+      <w:r>
+        <w:t xml:space="preserve"> </w:t>
+      </w:r>
+      <m:oMath>
+        <m:sSup>
+          <m:e>
+            <m:r>
+              <m:t>σ</m:t>
+            </m:r>
+          </m:e>
+          <m:sup>
+            <m:r>
+              <m:t>2</m:t>
+            </m:r>
+          </m:sup>
+        </m:sSup>
+        <m:r>
+          <m:rPr>
+            <m:sty m:val="p"/>
+          </m:rPr>
+          <m:t>/</m:t>
+        </m:r>
+        <m:r>
+          <m:t>n</m:t>
+        </m:r>
+      </m:oMath>
+      <w:r>
+        <w:t xml:space="preserve">,</w:t>
+      </w:r>
+      <w:r>
+        <w:t xml:space="preserve"> </w:t>
+      </w:r>
+      <w:r>
+        <w:t xml:space="preserve">and</w:t>
+      </w:r>
+      <w:r>
+        <w:t xml:space="preserve"> </w:t>
+      </w:r>
+      <w:hyperlink w:anchor="cor-clt-sum">
+        <w:r>
+          <w:rPr>
+            <w:rStyle w:val="Hyperlink"/>
+          </w:rPr>
+          <w:t xml:space="preserve">Corollary 1</w:t>
+        </w:r>
+      </w:hyperlink>
+      <w:r>
+        <w:t xml:space="preserve"> </w:t>
+      </w:r>
+      <w:r>
+        <w:t xml:space="preserve">justifies approximating</w:t>
+      </w:r>
+      <w:r>
+        <w:t xml:space="preserve"> </w:t>
+      </w:r>
+      <m:oMath>
+        <m:sSub>
+          <m:e>
+            <m:r>
+              <m:t>S</m:t>
+            </m:r>
+          </m:e>
+          <m:sub>
+            <m:r>
+              <m:t>n</m:t>
+            </m:r>
+          </m:sub>
+        </m:sSub>
+      </m:oMath>
+      <w:r>
+        <w:t xml:space="preserve"> </w:t>
+      </w:r>
+      <w:r>
+        <w:t xml:space="preserve">by a normal distribution with mean</w:t>
+      </w:r>
+      <w:r>
+        <w:t xml:space="preserve"> </w:t>
+      </w:r>
+      <m:oMath>
+        <m:r>
+          <m:t>n</m:t>
+        </m:r>
+        <m:r>
+          <m:t>μ</m:t>
+        </m:r>
+      </m:oMath>
+      <w:r>
+        <w:t xml:space="preserve"> </w:t>
+      </w:r>
+      <w:r>
+        <w:t xml:space="preserve">and variance</w:t>
+      </w:r>
+      <w:r>
+        <w:t xml:space="preserve"> </w:t>
+      </w:r>
+      <m:oMath>
+        <m:r>
+          <m:t>n</m:t>
+        </m:r>
+        <m:sSup>
+          <m:e>
+            <m:r>
+              <m:t>σ</m:t>
+            </m:r>
+          </m:e>
+          <m:sup>
+            <m:r>
+              <m:t>2</m:t>
+            </m:r>
+          </m:sup>
+        </m:sSup>
+      </m:oMath>
+      <w:r>
         <w:t xml:space="preserve">.</w:t>
       </w:r>
+      <w:r>
+        <w:t xml:space="preserve"> </w:t>
+      </w:r>
+      <w:r>
+        <w:t xml:space="preserve">By</w:t>
+      </w:r>
+      <w:r>
+        <w:t xml:space="preserve"> </w:t>
+      </w:r>
+      <w:hyperlink w:anchor="cor-sum-iid-moments">
+        <w:r>
+          <w:rPr>
+            <w:rStyle w:val="Hyperlink"/>
+          </w:rPr>
+          <w:t xml:space="preserve">Corollary 2</w:t>
+        </w:r>
+      </w:hyperlink>
+      <w:r>
+        <w:t xml:space="preserve">, these are exactly the means and variances</w:t>
+      </w:r>
+      <w:r>
+        <w:t xml:space="preserve"> </w:t>
+      </w:r>
+      <w:r>
+        <w:t xml:space="preserve">of</w:t>
+      </w:r>
+      <w:r>
+        <w:t xml:space="preserve"> </w:t>
+      </w:r>
+      <m:oMath>
+        <m:sSub>
+          <m:e>
+            <m:acc>
+              <m:accPr>
+                <m:chr m:val="‾"/>
+              </m:accPr>
+              <m:e>
+                <m:r>
+                  <m:t>X</m:t>
+                </m:r>
+              </m:e>
+            </m:acc>
+          </m:e>
+          <m:sub>
+            <m:r>
+              <m:t>n</m:t>
+            </m:r>
+          </m:sub>
+        </m:sSub>
+        <m:r>
+          <m:rPr>
+            <m:sty m:val="p"/>
+          </m:rPr>
+          <m:t>=</m:t>
+        </m:r>
+        <m:sSub>
+          <m:e>
+            <m:r>
+              <m:t>S</m:t>
+            </m:r>
+          </m:e>
+          <m:sub>
+            <m:r>
+              <m:t>n</m:t>
+            </m:r>
+          </m:sub>
+        </m:sSub>
+        <m:r>
+          <m:rPr>
+            <m:sty m:val="p"/>
+          </m:rPr>
+          <m:t>/</m:t>
+        </m:r>
+        <m:r>
+          <m:t>n</m:t>
+        </m:r>
+      </m:oMath>
+      <w:r>
+        <w:t xml:space="preserve"> </w:t>
+      </w:r>
+      <w:r>
+        <w:t xml:space="preserve">and</w:t>
+      </w:r>
+      <w:r>
+        <w:t xml:space="preserve"> </w:t>
+      </w:r>
+      <m:oMath>
+        <m:sSub>
+          <m:e>
+            <m:r>
+              <m:t>S</m:t>
+            </m:r>
+          </m:e>
+          <m:sub>
+            <m:r>
+              <m:t>n</m:t>
+            </m:r>
+          </m:sub>
+        </m:sSub>
+      </m:oMath>
+      <w:r>
+        <w:t xml:space="preserve">.</w:t>
+      </w:r>
     </w:p>
-    <w:bookmarkStart w:id="27" w:name="exm-clt-5d6"/>
+    <w:bookmarkStart w:id="33" w:name="exm-clt-5d6"/>
     <w:p>
       <w:pPr>
         <w:pStyle w:val="BodyText"/>
@@ -4259,7 +5613,7 @@
       <w:tr>
         <w:tc>
           <w:tcPr/>
-          <w:bookmarkStart w:id="22" w:name="fig-clt-1d6"/>
+          <w:bookmarkStart w:id="28" w:name="fig-clt-1d6"/>
           <w:p>
             <w:pPr>
               <w:pStyle w:val="Compact"/>
@@ -4270,18 +5624,18 @@
                 <wp:inline>
                   <wp:extent cx="4620126" cy="3696101"/>
                   <wp:effectExtent b="0" l="0" r="0" t="0"/>
-                  <wp:docPr descr="" title="" id="20" name="Picture"/>
+                  <wp:docPr descr="" title="" id="26" name="Picture"/>
                   <a:graphic>
                     <a:graphicData uri="http://schemas.openxmlformats.org/drawingml/2006/picture">
                       <pic:pic>
                         <pic:nvPicPr>
-                          <pic:cNvPr descr="limit-theorems_files/figure-docx/fig-clt-1d6-1.png" id="21" name="Picture"/>
+                          <pic:cNvPr descr="limit-theorems_files/figure-docx/fig-clt-1d6-1.png" id="27" name="Picture"/>
                           <pic:cNvPicPr>
                             <a:picLocks noChangeArrowheads="1" noChangeAspect="1"/>
                           </pic:cNvPicPr>
                         </pic:nvPicPr>
                         <pic:blipFill>
-                          <a:blip r:embed="rId19"/>
+                          <a:blip r:embed="rId25"/>
                           <a:stretch>
                             <a:fillRect/>
                           </a:stretch>
@@ -4321,7 +5675,7 @@
               <w:t xml:space="preserve">Figure 1: Distribution of the outcome of one die</w:t>
             </w:r>
           </w:p>
-          <w:bookmarkEnd w:id="22"/>
+          <w:bookmarkEnd w:id="28"/>
         </w:tc>
       </w:tr>
     </w:tbl>
@@ -4481,7 +5835,7 @@
       <w:tr>
         <w:tc>
           <w:tcPr/>
-          <w:bookmarkStart w:id="26" w:name="fig-clt-5d6"/>
+          <w:bookmarkStart w:id="32" w:name="fig-clt-5d6"/>
           <w:p>
             <w:pPr>
               <w:pStyle w:val="Compact"/>
@@ -4492,18 +5846,18 @@
                 <wp:inline>
                   <wp:extent cx="4620126" cy="3696101"/>
                   <wp:effectExtent b="0" l="0" r="0" t="0"/>
-                  <wp:docPr descr="" title="" id="24" name="Picture"/>
+                  <wp:docPr descr="" title="" id="30" name="Picture"/>
                   <a:graphic>
                     <a:graphicData uri="http://schemas.openxmlformats.org/drawingml/2006/picture">
                       <pic:pic>
                         <pic:nvPicPr>
-                          <pic:cNvPr descr="limit-theorems_files/figure-docx/fig-clt-5d6-1.png" id="25" name="Picture"/>
+                          <pic:cNvPr descr="limit-theorems_files/figure-docx/fig-clt-5d6-1.png" id="31" name="Picture"/>
                           <pic:cNvPicPr>
                             <a:picLocks noChangeArrowheads="1" noChangeAspect="1"/>
                           </pic:cNvPicPr>
                         </pic:nvPicPr>
                         <pic:blipFill>
-                          <a:blip r:embed="rId23"/>
+                          <a:blip r:embed="rId29"/>
                           <a:stretch>
                             <a:fillRect/>
                           </a:stretch>
@@ -4543,7 +5897,7 @@
               <w:t xml:space="preserve">Figure 2: Distribution of the sum of five dice</w:t>
             </w:r>
           </w:p>
-          <w:bookmarkEnd w:id="26"/>
+          <w:bookmarkEnd w:id="32"/>
         </w:tc>
       </w:tr>
     </w:tbl>
@@ -4839,8 +6193,8 @@
         <w:t xml:space="preserve">.</w:t>
       </w:r>
     </w:p>
-    <w:bookmarkEnd w:id="27"/>
-    <w:bookmarkStart w:id="35" w:name="exm-clt-auto"/>
+    <w:bookmarkEnd w:id="33"/>
+    <w:bookmarkStart w:id="41" w:name="exm-clt-auto"/>
     <w:p>
       <w:pPr>
         <w:pStyle w:val="BodyText"/>
@@ -4904,7 +6258,7 @@
       <w:r>
         <w:t xml:space="preserve"> </w:t>
       </w:r>
-      <w:hyperlink r:id="rId28">
+      <w:hyperlink r:id="rId34">
         <w:r>
           <w:rPr>
             <w:rStyle w:val="VerbatimChar"/>
@@ -4936,7 +6290,7 @@
       <w:r>
         <w:t xml:space="preserve"> </w:t>
       </w:r>
-      <w:hyperlink r:id="rId29">
+      <w:hyperlink r:id="rId35">
         <w:r>
           <w:rPr>
             <w:rStyle w:val="VerbatimChar"/>
@@ -4968,7 +6322,7 @@
       <w:r>
         <w:t xml:space="preserve"> </w:t>
       </w:r>
-      <w:hyperlink r:id="rId30">
+      <w:hyperlink r:id="rId36">
         <w:r>
           <w:rPr>
             <w:rStyle w:val="VerbatimChar"/>
@@ -8243,7 +9597,7 @@
       <w:tr>
         <w:tc>
           <w:tcPr/>
-          <w:bookmarkStart w:id="34" w:name="fig-clt-auto"/>
+          <w:bookmarkStart w:id="40" w:name="fig-clt-auto"/>
           <w:p>
             <w:pPr>
               <w:pStyle w:val="Compact"/>
@@ -8254,18 +9608,18 @@
                 <wp:inline>
                   <wp:extent cx="5334000" cy="2000250"/>
                   <wp:effectExtent b="0" l="0" r="0" t="0"/>
-                  <wp:docPr descr="" title="" id="32" name="Picture"/>
+                  <wp:docPr descr="" title="" id="38" name="Picture"/>
                   <a:graphic>
                     <a:graphicData uri="http://schemas.openxmlformats.org/drawingml/2006/picture">
                       <pic:pic>
                         <pic:nvPicPr>
-                          <pic:cNvPr descr="limit-theorems_files/figure-docx/fig-clt-auto-1.png" id="33" name="Picture"/>
+                          <pic:cNvPr descr="limit-theorems_files/figure-docx/fig-clt-auto-1.png" id="39" name="Picture"/>
                           <pic:cNvPicPr>
                             <a:picLocks noChangeArrowheads="1" noChangeAspect="1"/>
                           </pic:cNvPicPr>
                         </pic:nvPicPr>
                         <pic:blipFill>
-                          <a:blip r:embed="rId31"/>
+                          <a:blip r:embed="rId37"/>
                           <a:stretch>
                             <a:fillRect/>
                           </a:stretch>
@@ -8305,7 +9659,7 @@
               <w:t xml:space="preserve">Figure 3: Histograms of 10,000 sample means of horsepower, for samples of n = 1, 5 and 30 cars drawn with replacement from the Auto data. The curve is the normal density with mean mu and standard deviation sigma over the square root of n.</w:t>
             </w:r>
           </w:p>
-          <w:bookmarkEnd w:id="34"/>
+          <w:bookmarkEnd w:id="40"/>
         </w:tc>
       </w:tr>
     </w:tbl>
@@ -8536,7 +9890,7 @@
         <w:t xml:space="preserve">.</w:t>
       </w:r>
     </w:p>
-    <w:bookmarkEnd w:id="35"/>
+    <w:bookmarkEnd w:id="41"/>
     <w:p>
       <w:pPr>
         <w:pStyle w:val="BodyText"/>
@@ -8547,7 +9901,7 @@
       <w:r>
         <w:t xml:space="preserve"> </w:t>
       </w:r>
-      <w:hyperlink r:id="rId36">
+      <w:hyperlink r:id="rId42">
         <w:r>
           <w:rPr>
             <w:rStyle w:val="Hyperlink"/>
@@ -8564,7 +9918,7 @@
       <w:r>
         <w:t xml:space="preserve"> </w:t>
       </w:r>
-      <w:hyperlink r:id="rId37">
+      <w:hyperlink r:id="rId43">
         <w:r>
           <w:rPr>
             <w:rStyle w:val="Hyperlink"/>
@@ -8591,8 +9945,8 @@
         <w:t xml:space="preserve">.</w:t>
       </w:r>
     </w:p>
-    <w:bookmarkEnd w:id="38"/>
-    <w:bookmarkStart w:id="51" w:name="sec-tail-bounds"/>
+    <w:bookmarkEnd w:id="44"/>
+    <w:bookmarkStart w:id="57" w:name="sec-tail-bounds"/>
     <w:p>
       <w:pPr>
         <w:pStyle w:val="Heading2"/>
@@ -8601,7 +9955,7 @@
         <w:t xml:space="preserve">2 Tail bounds</w:t>
       </w:r>
     </w:p>
-    <w:bookmarkStart w:id="39" w:name="thm-markov"/>
+    <w:bookmarkStart w:id="45" w:name="thm-markov"/>
     <w:p>
       <w:pPr>
         <w:pStyle w:val="FirstParagraph"/>
@@ -8823,7 +10177,7 @@
         </m:oMath>
       </m:oMathPara>
     </w:p>
-    <w:bookmarkEnd w:id="39"/>
+    <w:bookmarkEnd w:id="45"/>
     <w:p>
       <w:pPr>
         <w:pStyle w:val="FirstParagraph"/>
@@ -9315,7 +10669,7 @@
         <w:t xml:space="preserve">.</w:t>
       </w:r>
     </w:p>
-    <w:bookmarkStart w:id="40" w:name="thm-chebyshev"/>
+    <w:bookmarkStart w:id="46" w:name="thm-chebyshev"/>
     <w:p>
       <w:pPr>
         <w:pStyle w:val="BodyText"/>
@@ -9527,7 +10881,7 @@
         </m:oMath>
       </m:oMathPara>
     </w:p>
-    <w:bookmarkEnd w:id="40"/>
+    <w:bookmarkEnd w:id="46"/>
     <w:p>
       <w:pPr>
         <w:pStyle w:val="FirstParagraph"/>
@@ -10134,7 +11488,7 @@
         <w:t xml:space="preserve">.</w:t>
       </w:r>
     </w:p>
-    <w:bookmarkStart w:id="41" w:name="exm-chebyshev-auto"/>
+    <w:bookmarkStart w:id="47" w:name="exm-chebyshev-auto"/>
     <w:p>
       <w:pPr>
         <w:pStyle w:val="BodyText"/>
@@ -10880,8 +12234,8 @@
         <w:t xml:space="preserve">The bound is loose because it must hold for every distribution with this mean and variance.</w:t>
       </w:r>
     </w:p>
-    <w:bookmarkEnd w:id="41"/>
-    <w:bookmarkStart w:id="42" w:name="exr-chebyshev-sample-size"/>
+    <w:bookmarkEnd w:id="47"/>
+    <w:bookmarkStart w:id="48" w:name="exr-chebyshev-sample-size"/>
     <w:p>
       <w:pPr>
         <w:pStyle w:val="BodyText"/>
@@ -11378,7 +12732,7 @@
       <w:r>
         <w:t xml:space="preserve"> </w:t>
       </w:r>
-      <w:hyperlink r:id="rId30">
+      <w:hyperlink r:id="rId36">
         <w:r>
           <w:rPr>
             <w:rStyle w:val="VerbatimChar"/>
@@ -11545,8 +12899,8 @@
         <w:t xml:space="preserve">Why is the count so far below the 5% the bound allows?</w:t>
       </w:r>
     </w:p>
-    <w:bookmarkEnd w:id="42"/>
-    <w:bookmarkStart w:id="43" w:name="sol-chebyshev-sample-size"/>
+    <w:bookmarkEnd w:id="48"/>
+    <w:bookmarkStart w:id="49" w:name="sol-chebyshev-sample-size"/>
     <w:p>
       <w:pPr>
         <w:pStyle w:val="FirstParagraph"/>
@@ -12964,8 +14318,8 @@
         <w:t xml:space="preserve">.</w:t>
       </w:r>
     </w:p>
-    <w:bookmarkEnd w:id="43"/>
-    <w:bookmarkStart w:id="44" w:name="thm-chebyshev-sample-mean"/>
+    <w:bookmarkEnd w:id="49"/>
+    <w:bookmarkStart w:id="50" w:name="thm-chebyshev-sample-mean"/>
     <w:p>
       <w:pPr>
         <w:pStyle w:val="BodyText"/>
@@ -13366,7 +14720,7 @@
         </m:oMath>
       </m:oMathPara>
     </w:p>
-    <w:bookmarkEnd w:id="44"/>
+    <w:bookmarkEnd w:id="50"/>
     <w:p>
       <w:pPr>
         <w:pStyle w:val="FirstParagraph"/>
@@ -13463,7 +14817,24 @@
         </m:sSub>
       </m:oMath>
       <w:r>
-        <w:t xml:space="preserve">, whose variance is</w:t>
+        <w:t xml:space="preserve">, whose</w:t>
+      </w:r>
+      <w:r>
+        <w:t xml:space="preserve"> </w:t>
+      </w:r>
+      <w:hyperlink r:id="rId23">
+        <w:r>
+          <w:rPr>
+            <w:rStyle w:val="Hyperlink"/>
+          </w:rPr>
+          <w:t xml:space="preserve">variance</w:t>
+        </w:r>
+      </w:hyperlink>
+      <w:r>
+        <w:t xml:space="preserve"> </w:t>
+      </w:r>
+      <w:r>
+        <w:t xml:space="preserve">is</w:t>
       </w:r>
       <w:r>
         <w:t xml:space="preserve"> </w:t>
@@ -13500,19 +14871,19 @@
       <w:r>
         <w:t xml:space="preserve"> </w:t>
       </w:r>
-      <w:hyperlink w:anchor="cor-sum-iid-moments">
+      <w:hyperlink w:anchor="cor-mean-iid-moments">
         <w:r>
           <w:rPr>
             <w:rStyle w:val="Hyperlink"/>
           </w:rPr>
-          <w:t xml:space="preserve">Corollary 2</w:t>
+          <w:t xml:space="preserve">Corollary 3</w:t>
         </w:r>
       </w:hyperlink>
       <w:r>
         <w:t xml:space="preserve">.</w:t>
       </w:r>
     </w:p>
-    <w:bookmarkStart w:id="45" w:name="lem-hoeffding"/>
+    <w:bookmarkStart w:id="51" w:name="lem-hoeffding"/>
     <w:p>
       <w:pPr>
         <w:pStyle w:val="BodyText"/>
@@ -13717,7 +15088,7 @@
         </m:oMath>
       </m:oMathPara>
     </w:p>
-    <w:bookmarkEnd w:id="45"/>
+    <w:bookmarkEnd w:id="51"/>
     <w:p>
       <w:pPr>
         <w:pStyle w:val="FirstParagraph"/>
@@ -17280,7 +18651,7 @@
         <w:t xml:space="preserve">The next result uses it to bound the tails of a sample mean.</w:t>
       </w:r>
     </w:p>
-    <w:bookmarkStart w:id="47" w:name="thm-hoeffding"/>
+    <w:bookmarkStart w:id="53" w:name="thm-hoeffding"/>
     <w:p>
       <w:pPr>
         <w:pStyle w:val="BodyText"/>
@@ -17565,7 +18936,7 @@
       <w:pPr>
         <w:pStyle w:val="BodyText"/>
       </w:pPr>
-      <w:bookmarkStart w:id="46" w:name="eq-hoeffding-one-sided"/>
+      <w:bookmarkStart w:id="52" w:name="eq-hoeffding-one-sided"/>
       <m:oMathPara>
         <m:oMathParaPr>
           <m:jc m:val="center"/>
@@ -17695,9 +19066,9 @@
           </m:r>
         </m:oMath>
       </m:oMathPara>
-      <w:bookmarkEnd w:id="46"/>
+      <w:bookmarkEnd w:id="52"/>
     </w:p>
-    <w:bookmarkEnd w:id="47"/>
+    <w:bookmarkEnd w:id="53"/>
     <w:p>
       <w:pPr>
         <w:pStyle w:val="FirstParagraph"/>
@@ -19794,7 +21165,7 @@
         <w:t xml:space="preserve">which is the claim.</w:t>
       </w:r>
     </w:p>
-    <w:bookmarkStart w:id="49" w:name="cor-hoeffding-two-sided"/>
+    <w:bookmarkStart w:id="55" w:name="cor-hoeffding-two-sided"/>
     <w:p>
       <w:pPr>
         <w:pStyle w:val="BodyText"/>
@@ -19804,7 +21175,7 @@
           <w:b/>
           <w:bCs/>
         </w:rPr>
-        <w:t xml:space="preserve">Corollary 3 (Hoeffding’s inequality, two-sided)</w:t>
+        <w:t xml:space="preserve">Corollary 4 (Hoeffding’s inequality, two-sided)</w:t>
       </w:r>
       <w:r>
         <w:t xml:space="preserve"> </w:t>
@@ -19851,7 +21222,7 @@
       <w:pPr>
         <w:pStyle w:val="BodyText"/>
       </w:pPr>
-      <w:bookmarkStart w:id="48" w:name="eq-hoeffding"/>
+      <w:bookmarkStart w:id="54" w:name="eq-hoeffding"/>
       <m:oMathPara>
         <m:oMathParaPr>
           <m:jc m:val="center"/>
@@ -20000,9 +21371,9 @@
           </m:r>
         </m:oMath>
       </m:oMathPara>
-      <w:bookmarkEnd w:id="48"/>
+      <w:bookmarkEnd w:id="54"/>
     </w:p>
-    <w:bookmarkEnd w:id="49"/>
+    <w:bookmarkEnd w:id="55"/>
     <w:p>
       <w:pPr>
         <w:pStyle w:val="FirstParagraph"/>
@@ -21245,7 +22616,7 @@
         <w:t xml:space="preserve">draws in which it occurs.</w:t>
       </w:r>
     </w:p>
-    <w:bookmarkStart w:id="50" w:name="exm-hoeffding-auto"/>
+    <w:bookmarkStart w:id="56" w:name="exm-hoeffding-auto"/>
     <w:p>
       <w:pPr>
         <w:pStyle w:val="BodyText"/>
@@ -21555,7 +22926,7 @@
           <w:rPr>
             <w:rStyle w:val="Hyperlink"/>
           </w:rPr>
-          <w:t xml:space="preserve">Corollary 3</w:t>
+          <w:t xml:space="preserve">Corollary 4</w:t>
         </w:r>
       </w:hyperlink>
       <w:r>
@@ -22935,9 +24306,9 @@
         <w:t xml:space="preserve">Both bounds are loose because they must hold for every distribution of this kind, not only for this one.</w:t>
       </w:r>
     </w:p>
-    <w:bookmarkEnd w:id="50"/>
-    <w:bookmarkEnd w:id="51"/>
-    <w:bookmarkStart w:id="59" w:name="sec-lln"/>
+    <w:bookmarkEnd w:id="56"/>
+    <w:bookmarkEnd w:id="57"/>
+    <w:bookmarkStart w:id="65" w:name="sec-lln"/>
     <w:p>
       <w:pPr>
         <w:pStyle w:val="Heading2"/>
@@ -22946,7 +24317,7 @@
         <w:t xml:space="preserve">3 The law of large numbers</w:t>
       </w:r>
     </w:p>
-    <w:bookmarkStart w:id="55" w:name="def-convergence-in-probability"/>
+    <w:bookmarkStart w:id="61" w:name="def-convergence-in-probability"/>
     <w:p>
       <w:pPr>
         <w:pStyle w:val="FirstParagraph"/>
@@ -23342,18 +24713,18 @@
                 <wp:inline>
                   <wp:extent cx="152400" cy="152400"/>
                   <wp:effectExtent b="0" l="0" r="0" t="0"/>
-                  <wp:docPr descr="" title="" id="53" name="Picture"/>
+                  <wp:docPr descr="" title="" id="59" name="Picture"/>
                   <a:graphic>
                     <a:graphicData uri="http://schemas.openxmlformats.org/drawingml/2006/picture">
                       <pic:pic>
                         <pic:nvPicPr>
-                          <pic:cNvPr descr="/opt/quarto/share/formats/docx/note.png" id="54" name="Picture"/>
+                          <pic:cNvPr descr="/opt/quarto/share/formats/docx/note.png" id="60" name="Picture"/>
                           <pic:cNvPicPr>
                             <a:picLocks noChangeArrowheads="1" noChangeAspect="1"/>
                           </pic:cNvPicPr>
                         </pic:nvPicPr>
                         <pic:blipFill>
-                          <a:blip r:embed="rId52"/>
+                          <a:blip r:embed="rId58"/>
                           <a:stretch>
                             <a:fillRect/>
                           </a:stretch>
@@ -23420,8 +24791,8 @@
         </w:tc>
       </w:tr>
     </w:tbl>
-    <w:bookmarkEnd w:id="55"/>
-    <w:bookmarkStart w:id="58" w:name="thm-wlln"/>
+    <w:bookmarkEnd w:id="61"/>
+    <w:bookmarkStart w:id="64" w:name="thm-wlln"/>
     <w:p>
       <w:pPr>
         <w:pStyle w:val="BodyText"/>
@@ -23800,18 +25171,18 @@
                 <wp:inline>
                   <wp:extent cx="152400" cy="152400"/>
                   <wp:effectExtent b="0" l="0" r="0" t="0"/>
-                  <wp:docPr descr="" title="" id="56" name="Picture"/>
+                  <wp:docPr descr="" title="" id="62" name="Picture"/>
                   <a:graphic>
                     <a:graphicData uri="http://schemas.openxmlformats.org/drawingml/2006/picture">
                       <pic:pic>
                         <pic:nvPicPr>
-                          <pic:cNvPr descr="/opt/quarto/share/formats/docx/note.png" id="57" name="Picture"/>
+                          <pic:cNvPr descr="/opt/quarto/share/formats/docx/note.png" id="63" name="Picture"/>
                           <pic:cNvPicPr>
                             <a:picLocks noChangeArrowheads="1" noChangeAspect="1"/>
                           </pic:cNvPicPr>
                         </pic:nvPicPr>
                         <pic:blipFill>
-                          <a:blip r:embed="rId52"/>
+                          <a:blip r:embed="rId58"/>
                           <a:stretch>
                             <a:fillRect/>
                           </a:stretch>
@@ -23878,7 +25249,7 @@
         </w:tc>
       </w:tr>
     </w:tbl>
-    <w:bookmarkEnd w:id="58"/>
+    <w:bookmarkEnd w:id="64"/>
     <w:p>
       <w:pPr>
         <w:pStyle w:val="BodyText"/>
@@ -23899,12 +25270,12 @@
       <w:r>
         <w:t xml:space="preserve"> </w:t>
       </w:r>
-      <w:hyperlink w:anchor="cor-sum-iid-moments">
+      <w:hyperlink w:anchor="cor-mean-iid-moments">
         <w:r>
           <w:rPr>
             <w:rStyle w:val="Hyperlink"/>
           </w:rPr>
-          <w:t xml:space="preserve">Corollary 2</w:t>
+          <w:t xml:space="preserve">Corollary 3</w:t>
         </w:r>
       </w:hyperlink>
       <w:r>
@@ -23933,9 +25304,16 @@
           <m:e>
             <m:sSub>
               <m:e>
-                <m:r>
-                  <m:t>S</m:t>
-                </m:r>
+                <m:acc>
+                  <m:accPr>
+                    <m:chr m:val="‾"/>
+                  </m:accPr>
+                  <m:e>
+                    <m:r>
+                      <m:t>X</m:t>
+                    </m:r>
+                  </m:e>
+                </m:acc>
               </m:e>
               <m:sub>
                 <m:r>
@@ -23953,9 +25331,6 @@
             <m:sty m:val="p"/>
           </m:rPr>
           <m:t>=</m:t>
-        </m:r>
-        <m:r>
-          <m:t>n</m:t>
         </m:r>
         <m:r>
           <m:t>μ</m:t>
@@ -23990,9 +25365,16 @@
           <m:e>
             <m:sSub>
               <m:e>
-                <m:r>
-                  <m:t>S</m:t>
-                </m:r>
+                <m:acc>
+                  <m:accPr>
+                    <m:chr m:val="‾"/>
+                  </m:accPr>
+                  <m:e>
+                    <m:r>
+                      <m:t>X</m:t>
+                    </m:r>
+                  </m:e>
+                </m:acc>
               </m:e>
               <m:sub>
                 <m:r>
@@ -24011,9 +25393,6 @@
           </m:rPr>
           <m:t>=</m:t>
         </m:r>
-        <m:r>
-          <m:t>n</m:t>
-        </m:r>
         <m:sSup>
           <m:e>
             <m:r>
@@ -24026,137 +25405,6 @@
             </m:r>
           </m:sup>
         </m:sSup>
-      </m:oMath>
-      <w:r>
-        <w:t xml:space="preserve">,</w:t>
-      </w:r>
-      <w:r>
-        <w:t xml:space="preserve"> </w:t>
-      </w:r>
-      <w:r>
-        <w:t xml:space="preserve">where</w:t>
-      </w:r>
-      <w:r>
-        <w:t xml:space="preserve"> </w:t>
-      </w:r>
-      <m:oMath>
-        <m:sSub>
-          <m:e>
-            <m:r>
-              <m:t>S</m:t>
-            </m:r>
-          </m:e>
-          <m:sub>
-            <m:r>
-              <m:t>n</m:t>
-            </m:r>
-          </m:sub>
-        </m:sSub>
-        <m:limUpp>
-          <m:e>
-            <m:r>
-              <m:rPr>
-                <m:sty m:val="p"/>
-              </m:rPr>
-              <m:t>=</m:t>
-            </m:r>
-          </m:e>
-          <m:lim>
-            <m:r>
-              <m:rPr>
-                <m:nor/>
-                <m:sty m:val="p"/>
-              </m:rPr>
-              <m:t>def</m:t>
-            </m:r>
-          </m:lim>
-        </m:limUpp>
-        <m:nary>
-          <m:naryPr>
-            <m:chr m:val="∑"/>
-            <m:limLoc m:val="undOvr"/>
-            <m:subHide m:val="off"/>
-            <m:supHide m:val="off"/>
-          </m:naryPr>
-          <m:sub>
-            <m:r>
-              <m:t>i</m:t>
-            </m:r>
-            <m:r>
-              <m:rPr>
-                <m:sty m:val="p"/>
-              </m:rPr>
-              <m:t>=</m:t>
-            </m:r>
-            <m:r>
-              <m:t>1</m:t>
-            </m:r>
-          </m:sub>
-          <m:sup>
-            <m:r>
-              <m:t>n</m:t>
-            </m:r>
-          </m:sup>
-          <m:e>
-            <m:sSub>
-              <m:e>
-                <m:r>
-                  <m:t>X</m:t>
-                </m:r>
-              </m:e>
-              <m:sub>
-                <m:r>
-                  <m:t>i</m:t>
-                </m:r>
-              </m:sub>
-            </m:sSub>
-          </m:e>
-        </m:nary>
-      </m:oMath>
-      <w:r>
-        <w:t xml:space="preserve">, so</w:t>
-      </w:r>
-      <w:r>
-        <w:t xml:space="preserve"> </w:t>
-      </w:r>
-      <m:oMath>
-        <m:sSub>
-          <m:e>
-            <m:acc>
-              <m:accPr>
-                <m:chr m:val="‾"/>
-              </m:accPr>
-              <m:e>
-                <m:r>
-                  <m:t>X</m:t>
-                </m:r>
-              </m:e>
-            </m:acc>
-          </m:e>
-          <m:sub>
-            <m:r>
-              <m:t>n</m:t>
-            </m:r>
-          </m:sub>
-        </m:sSub>
-        <m:r>
-          <m:rPr>
-            <m:sty m:val="p"/>
-          </m:rPr>
-          <m:t>=</m:t>
-        </m:r>
-        <m:sSub>
-          <m:e>
-            <m:r>
-              <m:t>S</m:t>
-            </m:r>
-          </m:e>
-          <m:sub>
-            <m:r>
-              <m:t>n</m:t>
-            </m:r>
-          </m:sub>
-        </m:sSub>
         <m:r>
           <m:rPr>
             <m:sty m:val="p"/>
@@ -24168,481 +25416,12 @@
         </m:r>
       </m:oMath>
       <w:r>
-        <w:t xml:space="preserve"> </w:t>
-      </w:r>
-      <w:r>
-        <w:t xml:space="preserve">has</w:t>
+        <w:t xml:space="preserve">.</w:t>
       </w:r>
     </w:p>
     <w:p>
       <w:pPr>
         <w:pStyle w:val="BodyText"/>
-      </w:pPr>
-      <m:oMathPara>
-        <m:oMathParaPr>
-          <m:jc m:val="center"/>
-        </m:oMathParaPr>
-        <m:oMath>
-          <m:eqArr>
-            <m:e>
-              <m:r>
-                <m:rPr>
-                  <m:sty m:val="p"/>
-                </m:rPr>
-                <m:t>E</m:t>
-              </m:r>
-              <m:r>
-                <m:t>​</m:t>
-              </m:r>
-              <m:d>
-                <m:dPr>
-                  <m:begChr m:val="["/>
-                  <m:sepChr m:val=""/>
-                  <m:endChr m:val="]"/>
-                  <m:grow/>
-                </m:dPr>
-                <m:e>
-                  <m:sSub>
-                    <m:e>
-                      <m:acc>
-                        <m:accPr>
-                          <m:chr m:val="‾"/>
-                        </m:accPr>
-                        <m:e>
-                          <m:r>
-                            <m:t>X</m:t>
-                          </m:r>
-                        </m:e>
-                      </m:acc>
-                    </m:e>
-                    <m:sub>
-                      <m:r>
-                        <m:t>n</m:t>
-                      </m:r>
-                    </m:sub>
-                  </m:sSub>
-                </m:e>
-              </m:d>
-              <m:r>
-                <m:t>​</m:t>
-              </m:r>
-              <m:r>
-                <m:t>&amp;</m:t>
-              </m:r>
-              <m:r>
-                <m:rPr>
-                  <m:sty m:val="p"/>
-                </m:rPr>
-                <m:t>=</m:t>
-              </m:r>
-              <m:f>
-                <m:fPr>
-                  <m:type m:val="bar"/>
-                </m:fPr>
-                <m:num>
-                  <m:r>
-                    <m:t>1</m:t>
-                  </m:r>
-                </m:num>
-                <m:den>
-                  <m:r>
-                    <m:t>n</m:t>
-                  </m:r>
-                </m:den>
-              </m:f>
-              <m:r>
-                <m:rPr>
-                  <m:sty m:val="p"/>
-                </m:rPr>
-                <m:t>E</m:t>
-              </m:r>
-              <m:r>
-                <m:t>​</m:t>
-              </m:r>
-              <m:d>
-                <m:dPr>
-                  <m:begChr m:val="["/>
-                  <m:sepChr m:val=""/>
-                  <m:endChr m:val="]"/>
-                  <m:grow/>
-                </m:dPr>
-                <m:e>
-                  <m:sSub>
-                    <m:e>
-                      <m:r>
-                        <m:t>S</m:t>
-                      </m:r>
-                    </m:e>
-                    <m:sub>
-                      <m:r>
-                        <m:t>n</m:t>
-                      </m:r>
-                    </m:sub>
-                  </m:sSub>
-                </m:e>
-              </m:d>
-              <m:r>
-                <m:t>​</m:t>
-              </m:r>
-              <m:r>
-                <m:t>&amp;</m:t>
-              </m:r>
-              <m:r>
-                <m:t>&amp;</m:t>
-              </m:r>
-              <m:r>
-                <m:rPr>
-                  <m:nor/>
-                  <m:sty m:val="p"/>
-                </m:rPr>
-                <m:t>(linearity of expectation)</m:t>
-              </m:r>
-            </m:e>
-            <m:e>
-              <m:r>
-                <m:t>&amp;</m:t>
-              </m:r>
-              <m:r>
-                <m:rPr>
-                  <m:sty m:val="p"/>
-                </m:rPr>
-                <m:t>=</m:t>
-              </m:r>
-              <m:f>
-                <m:fPr>
-                  <m:type m:val="bar"/>
-                </m:fPr>
-                <m:num>
-                  <m:r>
-                    <m:t>1</m:t>
-                  </m:r>
-                </m:num>
-                <m:den>
-                  <m:r>
-                    <m:t>n</m:t>
-                  </m:r>
-                </m:den>
-              </m:f>
-              <m:r>
-                <m:rPr>
-                  <m:sty m:val="p"/>
-                </m:rPr>
-                <m:t>⋅</m:t>
-              </m:r>
-              <m:r>
-                <m:t>n</m:t>
-              </m:r>
-              <m:r>
-                <m:t>μ</m:t>
-              </m:r>
-              <m:r>
-                <m:t>&amp;</m:t>
-              </m:r>
-              <m:r>
-                <m:t>&amp;</m:t>
-              </m:r>
-              <m:r>
-                <m:rPr>
-                  <m:nor/>
-                  <m:sty m:val="p"/>
-                </m:rPr>
-                <m:t>(mean of a sum of IID variables)</m:t>
-              </m:r>
-            </m:e>
-            <m:e>
-              <m:r>
-                <m:t>&amp;</m:t>
-              </m:r>
-              <m:r>
-                <m:rPr>
-                  <m:sty m:val="p"/>
-                </m:rPr>
-                <m:t>=</m:t>
-              </m:r>
-              <m:r>
-                <m:t>μ</m:t>
-              </m:r>
-              <m:r>
-                <m:t>&amp;</m:t>
-              </m:r>
-              <m:r>
-                <m:t>&amp;</m:t>
-              </m:r>
-              <m:r>
-                <m:rPr>
-                  <m:nor/>
-                  <m:sty m:val="p"/>
-                </m:rPr>
-                <m:t>(cancel </m:t>
-              </m:r>
-              <m:r>
-                <m:t>n</m:t>
-              </m:r>
-              <m:r>
-                <m:rPr>
-                  <m:nor/>
-                  <m:sty m:val="p"/>
-                </m:rPr>
-                <m:t>)</m:t>
-              </m:r>
-            </m:e>
-            <m:e>
-              <m:r>
-                <m:rPr>
-                  <m:sty m:val="p"/>
-                </m:rPr>
-                <m:t>Var</m:t>
-              </m:r>
-              <m:r>
-                <m:t>​</m:t>
-              </m:r>
-              <m:d>
-                <m:dPr>
-                  <m:begChr m:val="("/>
-                  <m:sepChr m:val=""/>
-                  <m:endChr m:val=")"/>
-                  <m:grow/>
-                </m:dPr>
-                <m:e>
-                  <m:sSub>
-                    <m:e>
-                      <m:acc>
-                        <m:accPr>
-                          <m:chr m:val="‾"/>
-                        </m:accPr>
-                        <m:e>
-                          <m:r>
-                            <m:t>X</m:t>
-                          </m:r>
-                        </m:e>
-                      </m:acc>
-                    </m:e>
-                    <m:sub>
-                      <m:r>
-                        <m:t>n</m:t>
-                      </m:r>
-                    </m:sub>
-                  </m:sSub>
-                </m:e>
-              </m:d>
-              <m:r>
-                <m:t>​</m:t>
-              </m:r>
-              <m:r>
-                <m:t>&amp;</m:t>
-              </m:r>
-              <m:r>
-                <m:rPr>
-                  <m:sty m:val="p"/>
-                </m:rPr>
-                <m:t>=</m:t>
-              </m:r>
-              <m:f>
-                <m:fPr>
-                  <m:type m:val="bar"/>
-                </m:fPr>
-                <m:num>
-                  <m:r>
-                    <m:t>1</m:t>
-                  </m:r>
-                </m:num>
-                <m:den>
-                  <m:sSup>
-                    <m:e>
-                      <m:r>
-                        <m:t>n</m:t>
-                      </m:r>
-                    </m:e>
-                    <m:sup>
-                      <m:r>
-                        <m:t>2</m:t>
-                      </m:r>
-                    </m:sup>
-                  </m:sSup>
-                </m:den>
-              </m:f>
-              <m:r>
-                <m:rPr>
-                  <m:sty m:val="p"/>
-                </m:rPr>
-                <m:t>Var</m:t>
-              </m:r>
-              <m:r>
-                <m:t>​</m:t>
-              </m:r>
-              <m:d>
-                <m:dPr>
-                  <m:begChr m:val="("/>
-                  <m:sepChr m:val=""/>
-                  <m:endChr m:val=")"/>
-                  <m:grow/>
-                </m:dPr>
-                <m:e>
-                  <m:sSub>
-                    <m:e>
-                      <m:r>
-                        <m:t>S</m:t>
-                      </m:r>
-                    </m:e>
-                    <m:sub>
-                      <m:r>
-                        <m:t>n</m:t>
-                      </m:r>
-                    </m:sub>
-                  </m:sSub>
-                </m:e>
-              </m:d>
-              <m:r>
-                <m:t>​</m:t>
-              </m:r>
-              <m:r>
-                <m:t>&amp;</m:t>
-              </m:r>
-              <m:r>
-                <m:t>&amp;</m:t>
-              </m:r>
-              <m:r>
-                <m:rPr>
-                  <m:nor/>
-                  <m:sty m:val="p"/>
-                </m:rPr>
-                <m:t>(variance of a constant multiple)</m:t>
-              </m:r>
-            </m:e>
-            <m:e>
-              <m:r>
-                <m:t>&amp;</m:t>
-              </m:r>
-              <m:r>
-                <m:rPr>
-                  <m:sty m:val="p"/>
-                </m:rPr>
-                <m:t>=</m:t>
-              </m:r>
-              <m:f>
-                <m:fPr>
-                  <m:type m:val="bar"/>
-                </m:fPr>
-                <m:num>
-                  <m:r>
-                    <m:t>1</m:t>
-                  </m:r>
-                </m:num>
-                <m:den>
-                  <m:sSup>
-                    <m:e>
-                      <m:r>
-                        <m:t>n</m:t>
-                      </m:r>
-                    </m:e>
-                    <m:sup>
-                      <m:r>
-                        <m:t>2</m:t>
-                      </m:r>
-                    </m:sup>
-                  </m:sSup>
-                </m:den>
-              </m:f>
-              <m:r>
-                <m:rPr>
-                  <m:sty m:val="p"/>
-                </m:rPr>
-                <m:t>⋅</m:t>
-              </m:r>
-              <m:r>
-                <m:t>n</m:t>
-              </m:r>
-              <m:sSup>
-                <m:e>
-                  <m:r>
-                    <m:t>σ</m:t>
-                  </m:r>
-                </m:e>
-                <m:sup>
-                  <m:r>
-                    <m:t>2</m:t>
-                  </m:r>
-                </m:sup>
-              </m:sSup>
-              <m:r>
-                <m:t>&amp;</m:t>
-              </m:r>
-              <m:r>
-                <m:t>&amp;</m:t>
-              </m:r>
-              <m:r>
-                <m:rPr>
-                  <m:nor/>
-                  <m:sty m:val="p"/>
-                </m:rPr>
-                <m:t>(variance of a sum of IID variables)</m:t>
-              </m:r>
-            </m:e>
-            <m:e>
-              <m:r>
-                <m:t>&amp;</m:t>
-              </m:r>
-              <m:r>
-                <m:rPr>
-                  <m:sty m:val="p"/>
-                </m:rPr>
-                <m:t>=</m:t>
-              </m:r>
-              <m:f>
-                <m:fPr>
-                  <m:type m:val="bar"/>
-                </m:fPr>
-                <m:num>
-                  <m:sSup>
-                    <m:e>
-                      <m:r>
-                        <m:t>σ</m:t>
-                      </m:r>
-                    </m:e>
-                    <m:sup>
-                      <m:r>
-                        <m:t>2</m:t>
-                      </m:r>
-                    </m:sup>
-                  </m:sSup>
-                </m:num>
-                <m:den>
-                  <m:r>
-                    <m:t>n</m:t>
-                  </m:r>
-                </m:den>
-              </m:f>
-              <m:r>
-                <m:t>&amp;</m:t>
-              </m:r>
-              <m:r>
-                <m:t>&amp;</m:t>
-              </m:r>
-              <m:r>
-                <m:rPr>
-                  <m:nor/>
-                  <m:sty m:val="p"/>
-                </m:rPr>
-                <m:t>(cancel one factor of </m:t>
-              </m:r>
-              <m:r>
-                <m:t>n</m:t>
-              </m:r>
-              <m:r>
-                <m:rPr>
-                  <m:nor/>
-                  <m:sty m:val="p"/>
-                </m:rPr>
-                <m:t>)</m:t>
-              </m:r>
-            </m:e>
-          </m:eqArr>
-        </m:oMath>
-      </m:oMathPara>
-    </w:p>
-    <w:p>
-      <w:pPr>
-        <w:pStyle w:val="FirstParagraph"/>
       </w:pPr>
       <w:r>
         <w:t xml:space="preserve">Let the tolerance be</w:t>
@@ -25259,8 +26038,8 @@
         <w:t xml:space="preserve">.</w:t>
       </w:r>
     </w:p>
-    <w:bookmarkEnd w:id="59"/>
-    <w:bookmarkStart w:id="88" w:name="references"/>
+    <w:bookmarkEnd w:id="65"/>
+    <w:bookmarkStart w:id="94" w:name="references"/>
     <w:p>
       <w:pPr>
         <w:pStyle w:val="Heading2"/>
@@ -25269,8 +26048,8 @@
         <w:t xml:space="preserve">References</w:t>
       </w:r>
     </w:p>
-    <w:bookmarkStart w:id="87" w:name="refs"/>
-    <w:bookmarkStart w:id="61" w:name="ref-wikipedia_central_limit_theorem"/>
+    <w:bookmarkStart w:id="93" w:name="refs"/>
+    <w:bookmarkStart w:id="67" w:name="ref-wikipedia_central_limit_theorem"/>
     <w:p>
       <w:pPr>
         <w:pStyle w:val="Bibliography"/>
@@ -25317,7 +26096,7 @@
       <w:r>
         <w:t xml:space="preserve"> </w:t>
       </w:r>
-      <w:hyperlink r:id="rId60">
+      <w:hyperlink r:id="rId66">
         <w:r>
           <w:rPr>
             <w:rStyle w:val="Hyperlink"/>
@@ -25326,8 +26105,8 @@
         </w:r>
       </w:hyperlink>
     </w:p>
-    <w:bookmarkEnd w:id="61"/>
-    <w:bookmarkStart w:id="62" w:name="ref-billingsley1995probability"/>
+    <w:bookmarkEnd w:id="67"/>
+    <w:bookmarkStart w:id="68" w:name="ref-billingsley1995probability"/>
     <w:p>
       <w:pPr>
         <w:pStyle w:val="Bibliography"/>
@@ -25358,8 +26137,8 @@
         <w:t xml:space="preserve">, 3rd ed. in Wiley series in probability and mathematical statistics. New York: Wiley, 1995.</w:t>
       </w:r>
     </w:p>
-    <w:bookmarkEnd w:id="62"/>
-    <w:bookmarkStart w:id="64" w:name="ref-fiveminuteai_probstat"/>
+    <w:bookmarkEnd w:id="68"/>
+    <w:bookmarkStart w:id="70" w:name="ref-fiveminuteai_probstat"/>
     <w:p>
       <w:pPr>
         <w:pStyle w:val="Bibliography"/>
@@ -25391,7 +26170,7 @@
       <w:r>
         <w:t xml:space="preserve"> </w:t>
       </w:r>
-      <w:hyperlink r:id="rId63">
+      <w:hyperlink r:id="rId69">
         <w:r>
           <w:rPr>
             <w:rStyle w:val="Hyperlink"/>
@@ -25400,8 +26179,8 @@
         </w:r>
       </w:hyperlink>
     </w:p>
-    <w:bookmarkEnd w:id="64"/>
-    <w:bookmarkStart w:id="66" w:name="ref-wikipedia_markovs_inequality"/>
+    <w:bookmarkEnd w:id="70"/>
+    <w:bookmarkStart w:id="72" w:name="ref-wikipedia_markovs_inequality"/>
     <w:p>
       <w:pPr>
         <w:pStyle w:val="Bibliography"/>
@@ -25448,7 +26227,7 @@
       <w:r>
         <w:t xml:space="preserve"> </w:t>
       </w:r>
-      <w:hyperlink r:id="rId65">
+      <w:hyperlink r:id="rId71">
         <w:r>
           <w:rPr>
             <w:rStyle w:val="Hyperlink"/>
@@ -25457,8 +26236,8 @@
         </w:r>
       </w:hyperlink>
     </w:p>
-    <w:bookmarkEnd w:id="66"/>
-    <w:bookmarkStart w:id="68" w:name="ref-bienayme1853"/>
+    <w:bookmarkEnd w:id="72"/>
+    <w:bookmarkStart w:id="74" w:name="ref-bienayme1853"/>
     <w:p>
       <w:pPr>
         <w:pStyle w:val="Bibliography"/>
@@ -25509,7 +26288,7 @@
       <w:r>
         <w:t xml:space="preserve"> </w:t>
       </w:r>
-      <w:hyperlink r:id="rId67">
+      <w:hyperlink r:id="rId73">
         <w:r>
           <w:rPr>
             <w:rStyle w:val="Hyperlink"/>
@@ -25518,8 +26297,8 @@
         </w:r>
       </w:hyperlink>
     </w:p>
-    <w:bookmarkEnd w:id="68"/>
-    <w:bookmarkStart w:id="70" w:name="ref-tchebichef1867"/>
+    <w:bookmarkEnd w:id="74"/>
+    <w:bookmarkStart w:id="76" w:name="ref-tchebichef1867"/>
     <w:p>
       <w:pPr>
         <w:pStyle w:val="Bibliography"/>
@@ -25558,7 +26337,7 @@
       <w:r>
         <w:t xml:space="preserve"> </w:t>
       </w:r>
-      <w:hyperlink r:id="rId69">
+      <w:hyperlink r:id="rId75">
         <w:r>
           <w:rPr>
             <w:rStyle w:val="Hyperlink"/>
@@ -25567,8 +26346,8 @@
         </w:r>
       </w:hyperlink>
     </w:p>
-    <w:bookmarkEnd w:id="70"/>
-    <w:bookmarkStart w:id="72" w:name="ref-seneta2013"/>
+    <w:bookmarkEnd w:id="76"/>
+    <w:bookmarkStart w:id="78" w:name="ref-seneta2013"/>
     <w:p>
       <w:pPr>
         <w:pStyle w:val="Bibliography"/>
@@ -25607,7 +26386,7 @@
       <w:r>
         <w:t xml:space="preserve"> </w:t>
       </w:r>
-      <w:hyperlink r:id="rId71">
+      <w:hyperlink r:id="rId77">
         <w:r>
           <w:rPr>
             <w:rStyle w:val="Hyperlink"/>
@@ -25619,8 +26398,8 @@
         <w:t xml:space="preserve">.</w:t>
       </w:r>
     </w:p>
-    <w:bookmarkEnd w:id="72"/>
-    <w:bookmarkStart w:id="74" w:name="ref-blitzstein2019introduction"/>
+    <w:bookmarkEnd w:id="78"/>
+    <w:bookmarkStart w:id="80" w:name="ref-blitzstein2019introduction"/>
     <w:p>
       <w:pPr>
         <w:pStyle w:val="Bibliography"/>
@@ -25653,7 +26432,7 @@
       <w:r>
         <w:t xml:space="preserve"> </w:t>
       </w:r>
-      <w:hyperlink r:id="rId73">
+      <w:hyperlink r:id="rId79">
         <w:r>
           <w:rPr>
             <w:rStyle w:val="Hyperlink"/>
@@ -25665,8 +26444,8 @@
         <w:t xml:space="preserve">.</w:t>
       </w:r>
     </w:p>
-    <w:bookmarkEnd w:id="74"/>
-    <w:bookmarkStart w:id="76" w:name="ref-wikipedia_chebyshevs_inequality"/>
+    <w:bookmarkEnd w:id="80"/>
+    <w:bookmarkStart w:id="82" w:name="ref-wikipedia_chebyshevs_inequality"/>
     <w:p>
       <w:pPr>
         <w:pStyle w:val="Bibliography"/>
@@ -25713,7 +26492,7 @@
       <w:r>
         <w:t xml:space="preserve"> </w:t>
       </w:r>
-      <w:hyperlink r:id="rId75">
+      <w:hyperlink r:id="rId81">
         <w:r>
           <w:rPr>
             <w:rStyle w:val="Hyperlink"/>
@@ -25722,8 +26501,8 @@
         </w:r>
       </w:hyperlink>
     </w:p>
-    <w:bookmarkEnd w:id="76"/>
-    <w:bookmarkStart w:id="78" w:name="ref-hoeffding1963"/>
+    <w:bookmarkEnd w:id="82"/>
+    <w:bookmarkStart w:id="84" w:name="ref-hoeffding1963"/>
     <w:p>
       <w:pPr>
         <w:pStyle w:val="Bibliography"/>
@@ -25762,7 +26541,7 @@
       <w:r>
         <w:t xml:space="preserve"> </w:t>
       </w:r>
-      <w:hyperlink r:id="rId77">
+      <w:hyperlink r:id="rId83">
         <w:r>
           <w:rPr>
             <w:rStyle w:val="Hyperlink"/>
@@ -25774,8 +26553,8 @@
         <w:t xml:space="preserve">.</w:t>
       </w:r>
     </w:p>
-    <w:bookmarkEnd w:id="78"/>
-    <w:bookmarkStart w:id="80" w:name="ref-wikipedia_hoeffdings_inequality"/>
+    <w:bookmarkEnd w:id="84"/>
+    <w:bookmarkStart w:id="86" w:name="ref-wikipedia_hoeffdings_inequality"/>
     <w:p>
       <w:pPr>
         <w:pStyle w:val="Bibliography"/>
@@ -25822,7 +26601,7 @@
       <w:r>
         <w:t xml:space="preserve"> </w:t>
       </w:r>
-      <w:hyperlink r:id="rId79">
+      <w:hyperlink r:id="rId85">
         <w:r>
           <w:rPr>
             <w:rStyle w:val="Hyperlink"/>
@@ -25831,8 +26610,8 @@
         </w:r>
       </w:hyperlink>
     </w:p>
-    <w:bookmarkEnd w:id="80"/>
-    <w:bookmarkStart w:id="82" w:name="Xd57efcf36cbfbff962c3240b4f16e14e48748ce"/>
+    <w:bookmarkEnd w:id="86"/>
+    <w:bookmarkStart w:id="88" w:name="Xd57efcf36cbfbff962c3240b4f16e14e48748ce"/>
     <w:p>
       <w:pPr>
         <w:pStyle w:val="Bibliography"/>
@@ -25879,7 +26658,7 @@
       <w:r>
         <w:t xml:space="preserve"> </w:t>
       </w:r>
-      <w:hyperlink r:id="rId81">
+      <w:hyperlink r:id="rId87">
         <w:r>
           <w:rPr>
             <w:rStyle w:val="Hyperlink"/>
@@ -25888,8 +26667,8 @@
         </w:r>
       </w:hyperlink>
     </w:p>
-    <w:bookmarkEnd w:id="82"/>
-    <w:bookmarkStart w:id="84" w:name="ref-CaseBerg01"/>
+    <w:bookmarkEnd w:id="88"/>
+    <w:bookmarkStart w:id="90" w:name="ref-CaseBerg01"/>
     <w:p>
       <w:pPr>
         <w:pStyle w:val="Bibliography"/>
@@ -25922,7 +26701,7 @@
       <w:r>
         <w:t xml:space="preserve"> </w:t>
       </w:r>
-      <w:hyperlink r:id="rId83">
+      <w:hyperlink r:id="rId89">
         <w:r>
           <w:rPr>
             <w:rStyle w:val="Hyperlink"/>
@@ -25931,8 +26710,8 @@
         </w:r>
       </w:hyperlink>
     </w:p>
-    <w:bookmarkEnd w:id="84"/>
-    <w:bookmarkStart w:id="86" w:name="ref-wikipedia_law_of_large_numbers"/>
+    <w:bookmarkEnd w:id="90"/>
+    <w:bookmarkStart w:id="92" w:name="ref-wikipedia_law_of_large_numbers"/>
     <w:p>
       <w:pPr>
         <w:pStyle w:val="Bibliography"/>
@@ -25979,7 +26758,7 @@
       <w:r>
         <w:t xml:space="preserve"> </w:t>
       </w:r>
-      <w:hyperlink r:id="rId85">
+      <w:hyperlink r:id="rId91">
         <w:r>
           <w:rPr>
             <w:rStyle w:val="Hyperlink"/>
@@ -25988,9 +26767,9 @@
         </w:r>
       </w:hyperlink>
     </w:p>
-    <w:bookmarkEnd w:id="86"/>
-    <w:bookmarkEnd w:id="87"/>
-    <w:bookmarkEnd w:id="88"/>
+    <w:bookmarkEnd w:id="92"/>
+    <w:bookmarkEnd w:id="93"/>
+    <w:bookmarkEnd w:id="94"/>
     <w:sectPr>
       <w:footnotePr>
         <w:numRestart w:val="eachSect"/>

</xml_diff>

<commit_message>
Deploying to gh-pages from @ Morrison-Lab/pds@e242995fd921cfd46b1e32530e7f75c9cb69ac66 🚀
</commit_message>
<xml_diff>
--- a/limit-theorems.docx
+++ b/limit-theorems.docx
@@ -15,10 +15,10 @@
         <w:pStyle w:val="Date"/>
       </w:pPr>
       <w:r>
-        <w:t xml:space="preserve">Last modified: 2026-10-22 01:12:44 (PDT)</w:t>
+        <w:t xml:space="preserve">Last modified: 2026-10-22 01:28:36 (PDT)</w:t>
       </w:r>
     </w:p>
-    <w:bookmarkStart w:id="44" w:name="sec-clt"/>
+    <w:bookmarkStart w:id="45" w:name="sec-clt"/>
     <w:p>
       <w:pPr>
         <w:pStyle w:val="Heading2"/>
@@ -1457,7 +1457,7 @@
         <w:t xml:space="preserve">, and the limits agree.</w:t>
       </w:r>
     </w:p>
-    <w:bookmarkStart w:id="13" w:name="cor-sum-iid-moments"/>
+    <w:bookmarkStart w:id="15" w:name="thm-sum-iid-moments"/>
     <w:p>
       <w:pPr>
         <w:pStyle w:val="BodyText"/>
@@ -1467,7 +1467,7 @@
           <w:b/>
           <w:bCs/>
         </w:rPr>
-        <w:t xml:space="preserve">Corollary 2 (Mean and variance of a sum of IID random variables)</w:t>
+        <w:t xml:space="preserve">Theorem 2 (Mean and variance of a sum of IID random variables)</w:t>
       </w:r>
       <w:r>
         <w:t xml:space="preserve"> </w:t>
@@ -1681,7 +1681,38 @@
         <w:t xml:space="preserve"> </w:t>
       </w:r>
       <w:r>
-        <w:t xml:space="preserve">Then:</w:t>
+        <w:t xml:space="preserve">Then, by</w:t>
+      </w:r>
+      <w:r>
+        <w:t xml:space="preserve"> </w:t>
+      </w:r>
+      <w:hyperlink r:id="rId13">
+        <w:r>
+          <w:rPr>
+            <w:rStyle w:val="Hyperlink"/>
+          </w:rPr>
+          <w:t xml:space="preserve">linearity of expectation</w:t>
+        </w:r>
+      </w:hyperlink>
+      <w:r>
+        <w:t xml:space="preserve"> </w:t>
+      </w:r>
+      <w:r>
+        <w:t xml:space="preserve">and the</w:t>
+      </w:r>
+      <w:r>
+        <w:t xml:space="preserve"> </w:t>
+      </w:r>
+      <w:hyperlink r:id="rId14">
+        <w:r>
+          <w:rPr>
+            <w:rStyle w:val="Hyperlink"/>
+          </w:rPr>
+          <w:t xml:space="preserve">variance of a linear combination</w:t>
+        </w:r>
+      </w:hyperlink>
+      <w:r>
+        <w:t xml:space="preserve">:</w:t>
       </w:r>
     </w:p>
     <w:p>
@@ -1809,7 +1840,7 @@
         </m:oMath>
       </m:oMathPara>
     </w:p>
-    <w:bookmarkEnd w:id="13"/>
+    <w:bookmarkEnd w:id="15"/>
     <w:p>
       <w:pPr>
         <w:pStyle w:val="FirstParagraph"/>
@@ -1830,7 +1861,7 @@
       <w:r>
         <w:t xml:space="preserve"> </w:t>
       </w:r>
-      <w:hyperlink r:id="rId14">
+      <w:hyperlink r:id="rId13">
         <w:r>
           <w:rPr>
             <w:rStyle w:val="Hyperlink"/>
@@ -2068,7 +2099,7 @@
       <w:r>
         <w:t xml:space="preserve"> </w:t>
       </w:r>
-      <w:hyperlink r:id="rId15">
+      <w:hyperlink r:id="rId14">
         <w:r>
           <w:rPr>
             <w:rStyle w:val="Hyperlink"/>
@@ -3113,7 +3144,7 @@
           <w:b/>
           <w:bCs/>
         </w:rPr>
-        <w:t xml:space="preserve">Corollary 3 (Mean and variance of a sample mean of IID random variables)</w:t>
+        <w:t xml:space="preserve">Corollary 2 (Mean and variance of a sample mean of IID random variables)</w:t>
       </w:r>
       <w:r>
         <w:t xml:space="preserve"> </w:t>
@@ -3719,12 +3750,12 @@
       <w:r>
         <w:t xml:space="preserve"> </w:t>
       </w:r>
-      <w:hyperlink w:anchor="cor-sum-iid-moments">
+      <w:hyperlink w:anchor="thm-sum-iid-moments">
         <w:r>
           <w:rPr>
             <w:rStyle w:val="Hyperlink"/>
           </w:rPr>
-          <w:t xml:space="preserve">Corollary 2</w:t>
+          <w:t xml:space="preserve">Theorem 2</w:t>
         </w:r>
       </w:hyperlink>
       <w:r>
@@ -4519,8 +4550,36 @@
         <w:t xml:space="preserve"> </w:t>
       </w:r>
       <w:r>
-        <w:t xml:space="preserve">by a normal distribution with mean</w:t>
-      </w:r>
+        <w:t xml:space="preserve">by a</w:t>
+      </w:r>
+      <w:r>
+        <w:t xml:space="preserve"> </w:t>
+      </w:r>
+      <w:hyperlink r:id="rId25">
+        <w:r>
+          <w:rPr>
+            <w:rStyle w:val="Hyperlink"/>
+          </w:rPr>
+          <w:t xml:space="preserve">normal distribution</w:t>
+        </w:r>
+      </w:hyperlink>
+      <w:r>
+        <w:t xml:space="preserve"> </w:t>
+      </w:r>
+      <w:r>
+        <w:t xml:space="preserve">with</w:t>
+      </w:r>
+      <w:r>
+        <w:t xml:space="preserve"> </w:t>
+      </w:r>
+      <w:hyperlink r:id="rId22">
+        <w:r>
+          <w:rPr>
+            <w:rStyle w:val="Hyperlink"/>
+          </w:rPr>
+          <w:t xml:space="preserve">mean</w:t>
+        </w:r>
+      </w:hyperlink>
       <w:r>
         <w:t xml:space="preserve"> </w:t>
       </w:r>
@@ -4533,8 +4592,19 @@
         <w:t xml:space="preserve"> </w:t>
       </w:r>
       <w:r>
-        <w:t xml:space="preserve">and variance</w:t>
-      </w:r>
+        <w:t xml:space="preserve">and</w:t>
+      </w:r>
+      <w:r>
+        <w:t xml:space="preserve"> </w:t>
+      </w:r>
+      <w:hyperlink r:id="rId23">
+        <w:r>
+          <w:rPr>
+            <w:rStyle w:val="Hyperlink"/>
+          </w:rPr>
+          <w:t xml:space="preserve">variance</w:t>
+        </w:r>
+      </w:hyperlink>
       <w:r>
         <w:t xml:space="preserve"> </w:t>
       </w:r>
@@ -4659,17 +4729,28 @@
       <w:r>
         <w:t xml:space="preserve"> </w:t>
       </w:r>
-      <w:hyperlink w:anchor="cor-sum-iid-moments">
+      <w:hyperlink w:anchor="thm-sum-iid-moments">
         <w:r>
           <w:rPr>
             <w:rStyle w:val="Hyperlink"/>
           </w:rPr>
-          <w:t xml:space="preserve">Corollary 2</w:t>
+          <w:t xml:space="preserve">Theorem 2</w:t>
         </w:r>
       </w:hyperlink>
       <w:r>
-        <w:t xml:space="preserve">, these are exactly the means and variances</w:t>
-      </w:r>
+        <w:t xml:space="preserve">, these are exactly the means and</w:t>
+      </w:r>
+      <w:r>
+        <w:t xml:space="preserve"> </w:t>
+      </w:r>
+      <w:hyperlink r:id="rId23">
+        <w:r>
+          <w:rPr>
+            <w:rStyle w:val="Hyperlink"/>
+          </w:rPr>
+          <w:t xml:space="preserve">variances</w:t>
+        </w:r>
+      </w:hyperlink>
       <w:r>
         <w:t xml:space="preserve"> </w:t>
       </w:r>
@@ -4754,7 +4835,7 @@
         <w:t xml:space="preserve">.</w:t>
       </w:r>
     </w:p>
-    <w:bookmarkStart w:id="33" w:name="exm-clt-5d6"/>
+    <w:bookmarkStart w:id="34" w:name="exm-clt-5d6"/>
     <w:p>
       <w:pPr>
         <w:pStyle w:val="BodyText"/>
@@ -5613,7 +5694,7 @@
       <w:tr>
         <w:tc>
           <w:tcPr/>
-          <w:bookmarkStart w:id="28" w:name="fig-clt-1d6"/>
+          <w:bookmarkStart w:id="29" w:name="fig-clt-1d6"/>
           <w:p>
             <w:pPr>
               <w:pStyle w:val="Compact"/>
@@ -5624,18 +5705,18 @@
                 <wp:inline>
                   <wp:extent cx="4620126" cy="3696101"/>
                   <wp:effectExtent b="0" l="0" r="0" t="0"/>
-                  <wp:docPr descr="" title="" id="26" name="Picture"/>
+                  <wp:docPr descr="" title="" id="27" name="Picture"/>
                   <a:graphic>
                     <a:graphicData uri="http://schemas.openxmlformats.org/drawingml/2006/picture">
                       <pic:pic>
                         <pic:nvPicPr>
-                          <pic:cNvPr descr="limit-theorems_files/figure-docx/fig-clt-1d6-1.png" id="27" name="Picture"/>
+                          <pic:cNvPr descr="limit-theorems_files/figure-docx/fig-clt-1d6-1.png" id="28" name="Picture"/>
                           <pic:cNvPicPr>
                             <a:picLocks noChangeArrowheads="1" noChangeAspect="1"/>
                           </pic:cNvPicPr>
                         </pic:nvPicPr>
                         <pic:blipFill>
-                          <a:blip r:embed="rId25"/>
+                          <a:blip r:embed="rId26"/>
                           <a:stretch>
                             <a:fillRect/>
                           </a:stretch>
@@ -5675,7 +5756,7 @@
               <w:t xml:space="preserve">Figure 1: Distribution of the outcome of one die</w:t>
             </w:r>
           </w:p>
-          <w:bookmarkEnd w:id="28"/>
+          <w:bookmarkEnd w:id="29"/>
         </w:tc>
       </w:tr>
     </w:tbl>
@@ -5835,7 +5916,7 @@
       <w:tr>
         <w:tc>
           <w:tcPr/>
-          <w:bookmarkStart w:id="32" w:name="fig-clt-5d6"/>
+          <w:bookmarkStart w:id="33" w:name="fig-clt-5d6"/>
           <w:p>
             <w:pPr>
               <w:pStyle w:val="Compact"/>
@@ -5846,18 +5927,18 @@
                 <wp:inline>
                   <wp:extent cx="4620126" cy="3696101"/>
                   <wp:effectExtent b="0" l="0" r="0" t="0"/>
-                  <wp:docPr descr="" title="" id="30" name="Picture"/>
+                  <wp:docPr descr="" title="" id="31" name="Picture"/>
                   <a:graphic>
                     <a:graphicData uri="http://schemas.openxmlformats.org/drawingml/2006/picture">
                       <pic:pic>
                         <pic:nvPicPr>
-                          <pic:cNvPr descr="limit-theorems_files/figure-docx/fig-clt-5d6-1.png" id="31" name="Picture"/>
+                          <pic:cNvPr descr="limit-theorems_files/figure-docx/fig-clt-5d6-1.png" id="32" name="Picture"/>
                           <pic:cNvPicPr>
                             <a:picLocks noChangeArrowheads="1" noChangeAspect="1"/>
                           </pic:cNvPicPr>
                         </pic:nvPicPr>
                         <pic:blipFill>
-                          <a:blip r:embed="rId29"/>
+                          <a:blip r:embed="rId30"/>
                           <a:stretch>
                             <a:fillRect/>
                           </a:stretch>
@@ -5897,7 +5978,7 @@
               <w:t xml:space="preserve">Figure 2: Distribution of the sum of five dice</w:t>
             </w:r>
           </w:p>
-          <w:bookmarkEnd w:id="32"/>
+          <w:bookmarkEnd w:id="33"/>
         </w:tc>
       </w:tr>
     </w:tbl>
@@ -6193,8 +6274,8 @@
         <w:t xml:space="preserve">.</w:t>
       </w:r>
     </w:p>
-    <w:bookmarkEnd w:id="33"/>
-    <w:bookmarkStart w:id="41" w:name="exm-clt-auto"/>
+    <w:bookmarkEnd w:id="34"/>
+    <w:bookmarkStart w:id="42" w:name="exm-clt-auto"/>
     <w:p>
       <w:pPr>
         <w:pStyle w:val="BodyText"/>
@@ -6258,7 +6339,7 @@
       <w:r>
         <w:t xml:space="preserve"> </w:t>
       </w:r>
-      <w:hyperlink r:id="rId34">
+      <w:hyperlink r:id="rId35">
         <w:r>
           <w:rPr>
             <w:rStyle w:val="VerbatimChar"/>
@@ -6290,7 +6371,7 @@
       <w:r>
         <w:t xml:space="preserve"> </w:t>
       </w:r>
-      <w:hyperlink r:id="rId35">
+      <w:hyperlink r:id="rId36">
         <w:r>
           <w:rPr>
             <w:rStyle w:val="VerbatimChar"/>
@@ -6322,7 +6403,7 @@
       <w:r>
         <w:t xml:space="preserve"> </w:t>
       </w:r>
-      <w:hyperlink r:id="rId36">
+      <w:hyperlink r:id="rId37">
         <w:r>
           <w:rPr>
             <w:rStyle w:val="VerbatimChar"/>
@@ -6680,12 +6761,12 @@
       <w:r>
         <w:t xml:space="preserve"> </w:t>
       </w:r>
-      <w:hyperlink w:anchor="cor-sum-iid-moments">
+      <w:hyperlink w:anchor="thm-sum-iid-moments">
         <w:r>
           <w:rPr>
             <w:rStyle w:val="Hyperlink"/>
           </w:rPr>
-          <w:t xml:space="preserve">Corollary 2</w:t>
+          <w:t xml:space="preserve">Theorem 2</w:t>
         </w:r>
       </w:hyperlink>
       <w:r>
@@ -9597,7 +9678,7 @@
       <w:tr>
         <w:tc>
           <w:tcPr/>
-          <w:bookmarkStart w:id="40" w:name="fig-clt-auto"/>
+          <w:bookmarkStart w:id="41" w:name="fig-clt-auto"/>
           <w:p>
             <w:pPr>
               <w:pStyle w:val="Compact"/>
@@ -9608,18 +9689,18 @@
                 <wp:inline>
                   <wp:extent cx="5334000" cy="2000250"/>
                   <wp:effectExtent b="0" l="0" r="0" t="0"/>
-                  <wp:docPr descr="" title="" id="38" name="Picture"/>
+                  <wp:docPr descr="" title="" id="39" name="Picture"/>
                   <a:graphic>
                     <a:graphicData uri="http://schemas.openxmlformats.org/drawingml/2006/picture">
                       <pic:pic>
                         <pic:nvPicPr>
-                          <pic:cNvPr descr="limit-theorems_files/figure-docx/fig-clt-auto-1.png" id="39" name="Picture"/>
+                          <pic:cNvPr descr="limit-theorems_files/figure-docx/fig-clt-auto-1.png" id="40" name="Picture"/>
                           <pic:cNvPicPr>
                             <a:picLocks noChangeArrowheads="1" noChangeAspect="1"/>
                           </pic:cNvPicPr>
                         </pic:nvPicPr>
                         <pic:blipFill>
-                          <a:blip r:embed="rId37"/>
+                          <a:blip r:embed="rId38"/>
                           <a:stretch>
                             <a:fillRect/>
                           </a:stretch>
@@ -9659,7 +9740,7 @@
               <w:t xml:space="preserve">Figure 3: Histograms of 10,000 sample means of horsepower, for samples of n = 1, 5 and 30 cars drawn with replacement from the Auto data. The curve is the normal density with mean mu and standard deviation sigma over the square root of n.</w:t>
             </w:r>
           </w:p>
-          <w:bookmarkEnd w:id="40"/>
+          <w:bookmarkEnd w:id="41"/>
         </w:tc>
       </w:tr>
     </w:tbl>
@@ -9791,12 +9872,12 @@
       <w:r>
         <w:t xml:space="preserve"> </w:t>
       </w:r>
-      <w:hyperlink w:anchor="cor-sum-iid-moments">
+      <w:hyperlink w:anchor="thm-sum-iid-moments">
         <w:r>
           <w:rPr>
             <w:rStyle w:val="Hyperlink"/>
           </w:rPr>
-          <w:t xml:space="preserve">Corollary 2</w:t>
+          <w:t xml:space="preserve">Theorem 2</w:t>
         </w:r>
       </w:hyperlink>
       <w:r>
@@ -9890,7 +9971,7 @@
         <w:t xml:space="preserve">.</w:t>
       </w:r>
     </w:p>
-    <w:bookmarkEnd w:id="41"/>
+    <w:bookmarkEnd w:id="42"/>
     <w:p>
       <w:pPr>
         <w:pStyle w:val="BodyText"/>
@@ -9901,7 +9982,7 @@
       <w:r>
         <w:t xml:space="preserve"> </w:t>
       </w:r>
-      <w:hyperlink r:id="rId42">
+      <w:hyperlink r:id="rId43">
         <w:r>
           <w:rPr>
             <w:rStyle w:val="Hyperlink"/>
@@ -9918,7 +9999,7 @@
       <w:r>
         <w:t xml:space="preserve"> </w:t>
       </w:r>
-      <w:hyperlink r:id="rId43">
+      <w:hyperlink r:id="rId44">
         <w:r>
           <w:rPr>
             <w:rStyle w:val="Hyperlink"/>
@@ -9945,8 +10026,8 @@
         <w:t xml:space="preserve">.</w:t>
       </w:r>
     </w:p>
-    <w:bookmarkEnd w:id="44"/>
-    <w:bookmarkStart w:id="57" w:name="sec-tail-bounds"/>
+    <w:bookmarkEnd w:id="45"/>
+    <w:bookmarkStart w:id="58" w:name="sec-tail-bounds"/>
     <w:p>
       <w:pPr>
         <w:pStyle w:val="Heading2"/>
@@ -9955,7 +10036,7 @@
         <w:t xml:space="preserve">2 Tail bounds</w:t>
       </w:r>
     </w:p>
-    <w:bookmarkStart w:id="45" w:name="thm-markov"/>
+    <w:bookmarkStart w:id="46" w:name="thm-markov"/>
     <w:p>
       <w:pPr>
         <w:pStyle w:val="FirstParagraph"/>
@@ -9965,7 +10046,7 @@
           <w:b/>
           <w:bCs/>
         </w:rPr>
-        <w:t xml:space="preserve">Theorem 2 (Markov’s inequality)</w:t>
+        <w:t xml:space="preserve">Theorem 3 (Markov’s inequality)</w:t>
       </w:r>
       <w:r>
         <w:t xml:space="preserve"> </w:t>
@@ -10177,7 +10258,7 @@
         </m:oMath>
       </m:oMathPara>
     </w:p>
-    <w:bookmarkEnd w:id="45"/>
+    <w:bookmarkEnd w:id="46"/>
     <w:p>
       <w:pPr>
         <w:pStyle w:val="FirstParagraph"/>
@@ -10366,7 +10447,7 @@
       <w:r>
         <w:t xml:space="preserve"> </w:t>
       </w:r>
-      <w:hyperlink r:id="rId14">
+      <w:hyperlink r:id="rId13">
         <w:r>
           <w:rPr>
             <w:rStyle w:val="Hyperlink"/>
@@ -10669,7 +10750,7 @@
         <w:t xml:space="preserve">.</w:t>
       </w:r>
     </w:p>
-    <w:bookmarkStart w:id="46" w:name="thm-chebyshev"/>
+    <w:bookmarkStart w:id="47" w:name="thm-chebyshev"/>
     <w:p>
       <w:pPr>
         <w:pStyle w:val="BodyText"/>
@@ -10679,7 +10760,7 @@
           <w:b/>
           <w:bCs/>
         </w:rPr>
-        <w:t xml:space="preserve">Theorem 3 (Chebyshev’s inequality)</w:t>
+        <w:t xml:space="preserve">Theorem 4 (Chebyshev’s inequality)</w:t>
       </w:r>
       <w:r>
         <w:t xml:space="preserve"> </w:t>
@@ -10881,7 +10962,7 @@
         </m:oMath>
       </m:oMathPara>
     </w:p>
-    <w:bookmarkEnd w:id="46"/>
+    <w:bookmarkEnd w:id="47"/>
     <w:p>
       <w:pPr>
         <w:pStyle w:val="FirstParagraph"/>
@@ -11105,7 +11186,7 @@
           <w:rPr>
             <w:rStyle w:val="Hyperlink"/>
           </w:rPr>
-          <w:t xml:space="preserve">Theorem 2</w:t>
+          <w:t xml:space="preserve">Theorem 3</w:t>
         </w:r>
       </w:hyperlink>
       <w:r>
@@ -11380,7 +11461,7 @@
           <w:rPr>
             <w:rStyle w:val="Hyperlink"/>
           </w:rPr>
-          <w:t xml:space="preserve">Theorem 3</w:t>
+          <w:t xml:space="preserve">Theorem 4</w:t>
         </w:r>
       </w:hyperlink>
       <w:r>
@@ -11488,7 +11569,7 @@
         <w:t xml:space="preserve">.</w:t>
       </w:r>
     </w:p>
-    <w:bookmarkStart w:id="47" w:name="exm-chebyshev-auto"/>
+    <w:bookmarkStart w:id="48" w:name="exm-chebyshev-auto"/>
     <w:p>
       <w:pPr>
         <w:pStyle w:val="BodyText"/>
@@ -11618,7 +11699,7 @@
           <w:rPr>
             <w:rStyle w:val="Hyperlink"/>
           </w:rPr>
-          <w:t xml:space="preserve">Theorem 3</w:t>
+          <w:t xml:space="preserve">Theorem 4</w:t>
         </w:r>
       </w:hyperlink>
       <w:r>
@@ -12142,7 +12223,7 @@
           <w:rPr>
             <w:rStyle w:val="Hyperlink"/>
           </w:rPr>
-          <w:t xml:space="preserve">Theorem 3</w:t>
+          <w:t xml:space="preserve">Theorem 4</w:t>
         </w:r>
       </w:hyperlink>
       <w:r>
@@ -12234,8 +12315,8 @@
         <w:t xml:space="preserve">The bound is loose because it must hold for every distribution with this mean and variance.</w:t>
       </w:r>
     </w:p>
-    <w:bookmarkEnd w:id="47"/>
-    <w:bookmarkStart w:id="48" w:name="exr-chebyshev-sample-size"/>
+    <w:bookmarkEnd w:id="48"/>
+    <w:bookmarkStart w:id="49" w:name="exr-chebyshev-sample-size"/>
     <w:p>
       <w:pPr>
         <w:pStyle w:val="BodyText"/>
@@ -12500,12 +12581,12 @@
       <w:r>
         <w:t xml:space="preserve"> </w:t>
       </w:r>
-      <w:hyperlink w:anchor="cor-sum-iid-moments">
+      <w:hyperlink w:anchor="thm-sum-iid-moments">
         <w:r>
           <w:rPr>
             <w:rStyle w:val="Hyperlink"/>
           </w:rPr>
-          <w:t xml:space="preserve">Corollary 2</w:t>
+          <w:t xml:space="preserve">Theorem 2</w:t>
         </w:r>
       </w:hyperlink>
       <w:r>
@@ -12522,7 +12603,7 @@
           <w:rPr>
             <w:rStyle w:val="Hyperlink"/>
           </w:rPr>
-          <w:t xml:space="preserve">Theorem 3</w:t>
+          <w:t xml:space="preserve">Theorem 4</w:t>
         </w:r>
       </w:hyperlink>
       <w:r>
@@ -12732,7 +12813,7 @@
       <w:r>
         <w:t xml:space="preserve"> </w:t>
       </w:r>
-      <w:hyperlink r:id="rId36">
+      <w:hyperlink r:id="rId37">
         <w:r>
           <w:rPr>
             <w:rStyle w:val="VerbatimChar"/>
@@ -12899,8 +12980,8 @@
         <w:t xml:space="preserve">Why is the count so far below the 5% the bound allows?</w:t>
       </w:r>
     </w:p>
-    <w:bookmarkEnd w:id="48"/>
-    <w:bookmarkStart w:id="49" w:name="sol-chebyshev-sample-size"/>
+    <w:bookmarkEnd w:id="49"/>
+    <w:bookmarkStart w:id="50" w:name="sol-chebyshev-sample-size"/>
     <w:p>
       <w:pPr>
         <w:pStyle w:val="FirstParagraph"/>
@@ -12929,12 +13010,12 @@
       <w:r>
         <w:t xml:space="preserve"> </w:t>
       </w:r>
-      <w:hyperlink w:anchor="cor-sum-iid-moments">
+      <w:hyperlink w:anchor="thm-sum-iid-moments">
         <w:r>
           <w:rPr>
             <w:rStyle w:val="Hyperlink"/>
           </w:rPr>
-          <w:t xml:space="preserve">Corollary 2</w:t>
+          <w:t xml:space="preserve">Theorem 2</w:t>
         </w:r>
       </w:hyperlink>
       <w:r>
@@ -13243,7 +13324,7 @@
           <w:rPr>
             <w:rStyle w:val="Hyperlink"/>
           </w:rPr>
-          <w:t xml:space="preserve">Theorem 3</w:t>
+          <w:t xml:space="preserve">Theorem 4</w:t>
         </w:r>
       </w:hyperlink>
       <w:r>
@@ -14318,8 +14399,8 @@
         <w:t xml:space="preserve">.</w:t>
       </w:r>
     </w:p>
-    <w:bookmarkEnd w:id="49"/>
-    <w:bookmarkStart w:id="50" w:name="thm-chebyshev-sample-mean"/>
+    <w:bookmarkEnd w:id="50"/>
+    <w:bookmarkStart w:id="51" w:name="thm-chebyshev-sample-mean"/>
     <w:p>
       <w:pPr>
         <w:pStyle w:val="BodyText"/>
@@ -14329,7 +14410,7 @@
           <w:b/>
           <w:bCs/>
         </w:rPr>
-        <w:t xml:space="preserve">Theorem 4 (Chebyshev’s inequality for a sample mean)</w:t>
+        <w:t xml:space="preserve">Theorem 5 (Chebyshev’s inequality for a sample mean)</w:t>
       </w:r>
       <w:r>
         <w:t xml:space="preserve"> </w:t>
@@ -14720,7 +14801,7 @@
         </m:oMath>
       </m:oMathPara>
     </w:p>
-    <w:bookmarkEnd w:id="50"/>
+    <w:bookmarkEnd w:id="51"/>
     <w:p>
       <w:pPr>
         <w:pStyle w:val="FirstParagraph"/>
@@ -14783,7 +14864,7 @@
           <w:rPr>
             <w:rStyle w:val="Hyperlink"/>
           </w:rPr>
-          <w:t xml:space="preserve">Theorem 3</w:t>
+          <w:t xml:space="preserve">Theorem 4</w:t>
         </w:r>
       </w:hyperlink>
       <w:r>
@@ -14876,14 +14957,14 @@
           <w:rPr>
             <w:rStyle w:val="Hyperlink"/>
           </w:rPr>
-          <w:t xml:space="preserve">Corollary 3</w:t>
+          <w:t xml:space="preserve">Corollary 2</w:t>
         </w:r>
       </w:hyperlink>
       <w:r>
         <w:t xml:space="preserve">.</w:t>
       </w:r>
     </w:p>
-    <w:bookmarkStart w:id="51" w:name="lem-hoeffding"/>
+    <w:bookmarkStart w:id="52" w:name="lem-hoeffding"/>
     <w:p>
       <w:pPr>
         <w:pStyle w:val="BodyText"/>
@@ -15088,7 +15169,7 @@
         </m:oMath>
       </m:oMathPara>
     </w:p>
-    <w:bookmarkEnd w:id="51"/>
+    <w:bookmarkEnd w:id="52"/>
     <w:p>
       <w:pPr>
         <w:pStyle w:val="FirstParagraph"/>
@@ -18651,7 +18732,7 @@
         <w:t xml:space="preserve">The next result uses it to bound the tails of a sample mean.</w:t>
       </w:r>
     </w:p>
-    <w:bookmarkStart w:id="53" w:name="thm-hoeffding"/>
+    <w:bookmarkStart w:id="54" w:name="thm-hoeffding"/>
     <w:p>
       <w:pPr>
         <w:pStyle w:val="BodyText"/>
@@ -18661,7 +18742,7 @@
           <w:b/>
           <w:bCs/>
         </w:rPr>
-        <w:t xml:space="preserve">Theorem 5 (Hoeffding’s inequality)</w:t>
+        <w:t xml:space="preserve">Theorem 6 (Hoeffding’s inequality)</w:t>
       </w:r>
       <w:r>
         <w:t xml:space="preserve"> </w:t>
@@ -18936,7 +19017,7 @@
       <w:pPr>
         <w:pStyle w:val="BodyText"/>
       </w:pPr>
-      <w:bookmarkStart w:id="52" w:name="eq-hoeffding-one-sided"/>
+      <w:bookmarkStart w:id="53" w:name="eq-hoeffding-one-sided"/>
       <m:oMathPara>
         <m:oMathParaPr>
           <m:jc m:val="center"/>
@@ -19066,9 +19147,9 @@
           </m:r>
         </m:oMath>
       </m:oMathPara>
-      <w:bookmarkEnd w:id="52"/>
+      <w:bookmarkEnd w:id="53"/>
     </w:p>
-    <w:bookmarkEnd w:id="53"/>
+    <w:bookmarkEnd w:id="54"/>
     <w:p>
       <w:pPr>
         <w:pStyle w:val="FirstParagraph"/>
@@ -21165,7 +21246,7 @@
         <w:t xml:space="preserve">which is the claim.</w:t>
       </w:r>
     </w:p>
-    <w:bookmarkStart w:id="55" w:name="cor-hoeffding-two-sided"/>
+    <w:bookmarkStart w:id="56" w:name="cor-hoeffding-two-sided"/>
     <w:p>
       <w:pPr>
         <w:pStyle w:val="BodyText"/>
@@ -21175,7 +21256,7 @@
           <w:b/>
           <w:bCs/>
         </w:rPr>
-        <w:t xml:space="preserve">Corollary 4 (Hoeffding’s inequality, two-sided)</w:t>
+        <w:t xml:space="preserve">Corollary 3 (Hoeffding’s inequality, two-sided)</w:t>
       </w:r>
       <w:r>
         <w:t xml:space="preserve"> </w:t>
@@ -21191,7 +21272,7 @@
           <w:rPr>
             <w:rStyle w:val="Hyperlink"/>
           </w:rPr>
-          <w:t xml:space="preserve">Theorem 5</w:t>
+          <w:t xml:space="preserve">Theorem 6</w:t>
         </w:r>
       </w:hyperlink>
       <w:r>
@@ -21222,7 +21303,7 @@
       <w:pPr>
         <w:pStyle w:val="BodyText"/>
       </w:pPr>
-      <w:bookmarkStart w:id="54" w:name="eq-hoeffding"/>
+      <w:bookmarkStart w:id="55" w:name="eq-hoeffding"/>
       <m:oMathPara>
         <m:oMathParaPr>
           <m:jc m:val="center"/>
@@ -21371,9 +21452,9 @@
           </m:r>
         </m:oMath>
       </m:oMathPara>
-      <w:bookmarkEnd w:id="54"/>
+      <w:bookmarkEnd w:id="55"/>
     </w:p>
-    <w:bookmarkEnd w:id="55"/>
+    <w:bookmarkEnd w:id="56"/>
     <w:p>
       <w:pPr>
         <w:pStyle w:val="FirstParagraph"/>
@@ -21570,7 +21651,7 @@
           <w:rPr>
             <w:rStyle w:val="Hyperlink"/>
           </w:rPr>
-          <w:t xml:space="preserve">Theorem 5</w:t>
+          <w:t xml:space="preserve">Theorem 6</w:t>
         </w:r>
       </w:hyperlink>
       <w:r>
@@ -22616,7 +22697,7 @@
         <w:t xml:space="preserve">draws in which it occurs.</w:t>
       </w:r>
     </w:p>
-    <w:bookmarkStart w:id="56" w:name="exm-hoeffding-auto"/>
+    <w:bookmarkStart w:id="57" w:name="exm-hoeffding-auto"/>
     <w:p>
       <w:pPr>
         <w:pStyle w:val="BodyText"/>
@@ -22926,7 +23007,7 @@
           <w:rPr>
             <w:rStyle w:val="Hyperlink"/>
           </w:rPr>
-          <w:t xml:space="preserve">Corollary 4</w:t>
+          <w:t xml:space="preserve">Corollary 3</w:t>
         </w:r>
       </w:hyperlink>
       <w:r>
@@ -23141,7 +23222,7 @@
           <w:rPr>
             <w:rStyle w:val="Hyperlink"/>
           </w:rPr>
-          <w:t xml:space="preserve">Theorem 4</w:t>
+          <w:t xml:space="preserve">Theorem 5</w:t>
         </w:r>
       </w:hyperlink>
       <w:r>
@@ -24306,9 +24387,9 @@
         <w:t xml:space="preserve">Both bounds are loose because they must hold for every distribution of this kind, not only for this one.</w:t>
       </w:r>
     </w:p>
-    <w:bookmarkEnd w:id="56"/>
     <w:bookmarkEnd w:id="57"/>
-    <w:bookmarkStart w:id="65" w:name="sec-lln"/>
+    <w:bookmarkEnd w:id="58"/>
+    <w:bookmarkStart w:id="66" w:name="sec-lln"/>
     <w:p>
       <w:pPr>
         <w:pStyle w:val="Heading2"/>
@@ -24317,7 +24398,7 @@
         <w:t xml:space="preserve">3 The law of large numbers</w:t>
       </w:r>
     </w:p>
-    <w:bookmarkStart w:id="61" w:name="def-convergence-in-probability"/>
+    <w:bookmarkStart w:id="62" w:name="def-convergence-in-probability"/>
     <w:p>
       <w:pPr>
         <w:pStyle w:val="FirstParagraph"/>
@@ -24713,18 +24794,18 @@
                 <wp:inline>
                   <wp:extent cx="152400" cy="152400"/>
                   <wp:effectExtent b="0" l="0" r="0" t="0"/>
-                  <wp:docPr descr="" title="" id="59" name="Picture"/>
+                  <wp:docPr descr="" title="" id="60" name="Picture"/>
                   <a:graphic>
                     <a:graphicData uri="http://schemas.openxmlformats.org/drawingml/2006/picture">
                       <pic:pic>
                         <pic:nvPicPr>
-                          <pic:cNvPr descr="/opt/quarto/share/formats/docx/note.png" id="60" name="Picture"/>
+                          <pic:cNvPr descr="/opt/quarto/share/formats/docx/note.png" id="61" name="Picture"/>
                           <pic:cNvPicPr>
                             <a:picLocks noChangeArrowheads="1" noChangeAspect="1"/>
                           </pic:cNvPicPr>
                         </pic:nvPicPr>
                         <pic:blipFill>
-                          <a:blip r:embed="rId58"/>
+                          <a:blip r:embed="rId59"/>
                           <a:stretch>
                             <a:fillRect/>
                           </a:stretch>
@@ -24791,8 +24872,8 @@
         </w:tc>
       </w:tr>
     </w:tbl>
-    <w:bookmarkEnd w:id="61"/>
-    <w:bookmarkStart w:id="64" w:name="thm-wlln"/>
+    <w:bookmarkEnd w:id="62"/>
+    <w:bookmarkStart w:id="65" w:name="thm-wlln"/>
     <w:p>
       <w:pPr>
         <w:pStyle w:val="BodyText"/>
@@ -24802,7 +24883,7 @@
           <w:b/>
           <w:bCs/>
         </w:rPr>
-        <w:t xml:space="preserve">Theorem 6 (Weak law of large numbers)</w:t>
+        <w:t xml:space="preserve">Theorem 7 (Weak law of large numbers)</w:t>
       </w:r>
       <w:r>
         <w:t xml:space="preserve"> </w:t>
@@ -25171,18 +25252,18 @@
                 <wp:inline>
                   <wp:extent cx="152400" cy="152400"/>
                   <wp:effectExtent b="0" l="0" r="0" t="0"/>
-                  <wp:docPr descr="" title="" id="62" name="Picture"/>
+                  <wp:docPr descr="" title="" id="63" name="Picture"/>
                   <a:graphic>
                     <a:graphicData uri="http://schemas.openxmlformats.org/drawingml/2006/picture">
                       <pic:pic>
                         <pic:nvPicPr>
-                          <pic:cNvPr descr="/opt/quarto/share/formats/docx/note.png" id="63" name="Picture"/>
+                          <pic:cNvPr descr="/opt/quarto/share/formats/docx/note.png" id="64" name="Picture"/>
                           <pic:cNvPicPr>
                             <a:picLocks noChangeArrowheads="1" noChangeAspect="1"/>
                           </pic:cNvPicPr>
                         </pic:nvPicPr>
                         <pic:blipFill>
-                          <a:blip r:embed="rId58"/>
+                          <a:blip r:embed="rId59"/>
                           <a:stretch>
                             <a:fillRect/>
                           </a:stretch>
@@ -25249,7 +25330,7 @@
         </w:tc>
       </w:tr>
     </w:tbl>
-    <w:bookmarkEnd w:id="64"/>
+    <w:bookmarkEnd w:id="65"/>
     <w:p>
       <w:pPr>
         <w:pStyle w:val="BodyText"/>
@@ -25275,7 +25356,7 @@
           <w:rPr>
             <w:rStyle w:val="Hyperlink"/>
           </w:rPr>
-          <w:t xml:space="preserve">Corollary 3</w:t>
+          <w:t xml:space="preserve">Corollary 2</w:t>
         </w:r>
       </w:hyperlink>
       <w:r>
@@ -26038,8 +26119,8 @@
         <w:t xml:space="preserve">.</w:t>
       </w:r>
     </w:p>
-    <w:bookmarkEnd w:id="65"/>
-    <w:bookmarkStart w:id="94" w:name="references"/>
+    <w:bookmarkEnd w:id="66"/>
+    <w:bookmarkStart w:id="95" w:name="references"/>
     <w:p>
       <w:pPr>
         <w:pStyle w:val="Heading2"/>
@@ -26048,8 +26129,8 @@
         <w:t xml:space="preserve">References</w:t>
       </w:r>
     </w:p>
-    <w:bookmarkStart w:id="93" w:name="refs"/>
-    <w:bookmarkStart w:id="67" w:name="ref-wikipedia_central_limit_theorem"/>
+    <w:bookmarkStart w:id="94" w:name="refs"/>
+    <w:bookmarkStart w:id="68" w:name="ref-wikipedia_central_limit_theorem"/>
     <w:p>
       <w:pPr>
         <w:pStyle w:val="Bibliography"/>
@@ -26096,7 +26177,7 @@
       <w:r>
         <w:t xml:space="preserve"> </w:t>
       </w:r>
-      <w:hyperlink r:id="rId66">
+      <w:hyperlink r:id="rId67">
         <w:r>
           <w:rPr>
             <w:rStyle w:val="Hyperlink"/>
@@ -26105,8 +26186,8 @@
         </w:r>
       </w:hyperlink>
     </w:p>
-    <w:bookmarkEnd w:id="67"/>
-    <w:bookmarkStart w:id="68" w:name="ref-billingsley1995probability"/>
+    <w:bookmarkEnd w:id="68"/>
+    <w:bookmarkStart w:id="69" w:name="ref-billingsley1995probability"/>
     <w:p>
       <w:pPr>
         <w:pStyle w:val="Bibliography"/>
@@ -26137,8 +26218,8 @@
         <w:t xml:space="preserve">, 3rd ed. in Wiley series in probability and mathematical statistics. New York: Wiley, 1995.</w:t>
       </w:r>
     </w:p>
-    <w:bookmarkEnd w:id="68"/>
-    <w:bookmarkStart w:id="70" w:name="ref-fiveminuteai_probstat"/>
+    <w:bookmarkEnd w:id="69"/>
+    <w:bookmarkStart w:id="71" w:name="ref-fiveminuteai_probstat"/>
     <w:p>
       <w:pPr>
         <w:pStyle w:val="Bibliography"/>
@@ -26170,7 +26251,7 @@
       <w:r>
         <w:t xml:space="preserve"> </w:t>
       </w:r>
-      <w:hyperlink r:id="rId69">
+      <w:hyperlink r:id="rId70">
         <w:r>
           <w:rPr>
             <w:rStyle w:val="Hyperlink"/>
@@ -26179,8 +26260,8 @@
         </w:r>
       </w:hyperlink>
     </w:p>
-    <w:bookmarkEnd w:id="70"/>
-    <w:bookmarkStart w:id="72" w:name="ref-wikipedia_markovs_inequality"/>
+    <w:bookmarkEnd w:id="71"/>
+    <w:bookmarkStart w:id="73" w:name="ref-wikipedia_markovs_inequality"/>
     <w:p>
       <w:pPr>
         <w:pStyle w:val="Bibliography"/>
@@ -26227,7 +26308,7 @@
       <w:r>
         <w:t xml:space="preserve"> </w:t>
       </w:r>
-      <w:hyperlink r:id="rId71">
+      <w:hyperlink r:id="rId72">
         <w:r>
           <w:rPr>
             <w:rStyle w:val="Hyperlink"/>
@@ -26236,8 +26317,8 @@
         </w:r>
       </w:hyperlink>
     </w:p>
-    <w:bookmarkEnd w:id="72"/>
-    <w:bookmarkStart w:id="74" w:name="ref-bienayme1853"/>
+    <w:bookmarkEnd w:id="73"/>
+    <w:bookmarkStart w:id="75" w:name="ref-bienayme1853"/>
     <w:p>
       <w:pPr>
         <w:pStyle w:val="Bibliography"/>
@@ -26288,7 +26369,7 @@
       <w:r>
         <w:t xml:space="preserve"> </w:t>
       </w:r>
-      <w:hyperlink r:id="rId73">
+      <w:hyperlink r:id="rId74">
         <w:r>
           <w:rPr>
             <w:rStyle w:val="Hyperlink"/>
@@ -26297,8 +26378,8 @@
         </w:r>
       </w:hyperlink>
     </w:p>
-    <w:bookmarkEnd w:id="74"/>
-    <w:bookmarkStart w:id="76" w:name="ref-tchebichef1867"/>
+    <w:bookmarkEnd w:id="75"/>
+    <w:bookmarkStart w:id="77" w:name="ref-tchebichef1867"/>
     <w:p>
       <w:pPr>
         <w:pStyle w:val="Bibliography"/>
@@ -26337,7 +26418,7 @@
       <w:r>
         <w:t xml:space="preserve"> </w:t>
       </w:r>
-      <w:hyperlink r:id="rId75">
+      <w:hyperlink r:id="rId76">
         <w:r>
           <w:rPr>
             <w:rStyle w:val="Hyperlink"/>
@@ -26346,8 +26427,8 @@
         </w:r>
       </w:hyperlink>
     </w:p>
-    <w:bookmarkEnd w:id="76"/>
-    <w:bookmarkStart w:id="78" w:name="ref-seneta2013"/>
+    <w:bookmarkEnd w:id="77"/>
+    <w:bookmarkStart w:id="79" w:name="ref-seneta2013"/>
     <w:p>
       <w:pPr>
         <w:pStyle w:val="Bibliography"/>
@@ -26386,7 +26467,7 @@
       <w:r>
         <w:t xml:space="preserve"> </w:t>
       </w:r>
-      <w:hyperlink r:id="rId77">
+      <w:hyperlink r:id="rId78">
         <w:r>
           <w:rPr>
             <w:rStyle w:val="Hyperlink"/>
@@ -26398,8 +26479,8 @@
         <w:t xml:space="preserve">.</w:t>
       </w:r>
     </w:p>
-    <w:bookmarkEnd w:id="78"/>
-    <w:bookmarkStart w:id="80" w:name="ref-blitzstein2019introduction"/>
+    <w:bookmarkEnd w:id="79"/>
+    <w:bookmarkStart w:id="81" w:name="ref-blitzstein2019introduction"/>
     <w:p>
       <w:pPr>
         <w:pStyle w:val="Bibliography"/>
@@ -26432,7 +26513,7 @@
       <w:r>
         <w:t xml:space="preserve"> </w:t>
       </w:r>
-      <w:hyperlink r:id="rId79">
+      <w:hyperlink r:id="rId80">
         <w:r>
           <w:rPr>
             <w:rStyle w:val="Hyperlink"/>
@@ -26444,8 +26525,8 @@
         <w:t xml:space="preserve">.</w:t>
       </w:r>
     </w:p>
-    <w:bookmarkEnd w:id="80"/>
-    <w:bookmarkStart w:id="82" w:name="ref-wikipedia_chebyshevs_inequality"/>
+    <w:bookmarkEnd w:id="81"/>
+    <w:bookmarkStart w:id="83" w:name="ref-wikipedia_chebyshevs_inequality"/>
     <w:p>
       <w:pPr>
         <w:pStyle w:val="Bibliography"/>
@@ -26492,7 +26573,7 @@
       <w:r>
         <w:t xml:space="preserve"> </w:t>
       </w:r>
-      <w:hyperlink r:id="rId81">
+      <w:hyperlink r:id="rId82">
         <w:r>
           <w:rPr>
             <w:rStyle w:val="Hyperlink"/>
@@ -26501,8 +26582,8 @@
         </w:r>
       </w:hyperlink>
     </w:p>
-    <w:bookmarkEnd w:id="82"/>
-    <w:bookmarkStart w:id="84" w:name="ref-hoeffding1963"/>
+    <w:bookmarkEnd w:id="83"/>
+    <w:bookmarkStart w:id="85" w:name="ref-hoeffding1963"/>
     <w:p>
       <w:pPr>
         <w:pStyle w:val="Bibliography"/>
@@ -26541,7 +26622,7 @@
       <w:r>
         <w:t xml:space="preserve"> </w:t>
       </w:r>
-      <w:hyperlink r:id="rId83">
+      <w:hyperlink r:id="rId84">
         <w:r>
           <w:rPr>
             <w:rStyle w:val="Hyperlink"/>
@@ -26553,8 +26634,8 @@
         <w:t xml:space="preserve">.</w:t>
       </w:r>
     </w:p>
-    <w:bookmarkEnd w:id="84"/>
-    <w:bookmarkStart w:id="86" w:name="ref-wikipedia_hoeffdings_inequality"/>
+    <w:bookmarkEnd w:id="85"/>
+    <w:bookmarkStart w:id="87" w:name="ref-wikipedia_hoeffdings_inequality"/>
     <w:p>
       <w:pPr>
         <w:pStyle w:val="Bibliography"/>
@@ -26601,7 +26682,7 @@
       <w:r>
         <w:t xml:space="preserve"> </w:t>
       </w:r>
-      <w:hyperlink r:id="rId85">
+      <w:hyperlink r:id="rId86">
         <w:r>
           <w:rPr>
             <w:rStyle w:val="Hyperlink"/>
@@ -26610,8 +26691,8 @@
         </w:r>
       </w:hyperlink>
     </w:p>
-    <w:bookmarkEnd w:id="86"/>
-    <w:bookmarkStart w:id="88" w:name="Xd57efcf36cbfbff962c3240b4f16e14e48748ce"/>
+    <w:bookmarkEnd w:id="87"/>
+    <w:bookmarkStart w:id="89" w:name="Xd57efcf36cbfbff962c3240b4f16e14e48748ce"/>
     <w:p>
       <w:pPr>
         <w:pStyle w:val="Bibliography"/>
@@ -26658,7 +26739,7 @@
       <w:r>
         <w:t xml:space="preserve"> </w:t>
       </w:r>
-      <w:hyperlink r:id="rId87">
+      <w:hyperlink r:id="rId88">
         <w:r>
           <w:rPr>
             <w:rStyle w:val="Hyperlink"/>
@@ -26667,8 +26748,8 @@
         </w:r>
       </w:hyperlink>
     </w:p>
-    <w:bookmarkEnd w:id="88"/>
-    <w:bookmarkStart w:id="90" w:name="ref-CaseBerg01"/>
+    <w:bookmarkEnd w:id="89"/>
+    <w:bookmarkStart w:id="91" w:name="ref-CaseBerg01"/>
     <w:p>
       <w:pPr>
         <w:pStyle w:val="Bibliography"/>
@@ -26701,7 +26782,7 @@
       <w:r>
         <w:t xml:space="preserve"> </w:t>
       </w:r>
-      <w:hyperlink r:id="rId89">
+      <w:hyperlink r:id="rId90">
         <w:r>
           <w:rPr>
             <w:rStyle w:val="Hyperlink"/>
@@ -26710,8 +26791,8 @@
         </w:r>
       </w:hyperlink>
     </w:p>
-    <w:bookmarkEnd w:id="90"/>
-    <w:bookmarkStart w:id="92" w:name="ref-wikipedia_law_of_large_numbers"/>
+    <w:bookmarkEnd w:id="91"/>
+    <w:bookmarkStart w:id="93" w:name="ref-wikipedia_law_of_large_numbers"/>
     <w:p>
       <w:pPr>
         <w:pStyle w:val="Bibliography"/>
@@ -26758,7 +26839,7 @@
       <w:r>
         <w:t xml:space="preserve"> </w:t>
       </w:r>
-      <w:hyperlink r:id="rId91">
+      <w:hyperlink r:id="rId92">
         <w:r>
           <w:rPr>
             <w:rStyle w:val="Hyperlink"/>
@@ -26767,9 +26848,9 @@
         </w:r>
       </w:hyperlink>
     </w:p>
-    <w:bookmarkEnd w:id="92"/>
     <w:bookmarkEnd w:id="93"/>
     <w:bookmarkEnd w:id="94"/>
+    <w:bookmarkEnd w:id="95"/>
     <w:sectPr>
       <w:footnotePr>
         <w:numRestart w:val="eachSect"/>

</xml_diff>

<commit_message>
Deploying to gh-pages from @ Morrison-Lab/pds@5a9ef41d5c08c15f5b74c77680702ac21da462d3 🚀
</commit_message>
<xml_diff>
--- a/limit-theorems.docx
+++ b/limit-theorems.docx
@@ -15,7 +15,7 @@
         <w:pStyle w:val="Date"/>
       </w:pPr>
       <w:r>
-        <w:t xml:space="preserve">Last modified: 2026-10-22 01:28:36 (PDT)</w:t>
+        <w:t xml:space="preserve">Last modified: 2026-10-22 01:36:00 (PDT)</w:t>
       </w:r>
     </w:p>
     <w:bookmarkStart w:id="45" w:name="sec-clt"/>
@@ -1691,7 +1691,7 @@
           <w:rPr>
             <w:rStyle w:val="Hyperlink"/>
           </w:rPr>
-          <w:t xml:space="preserve">linearity of expectation</w:t>
+          <w:t xml:space="preserve">linearity of expectation for finite sums</w:t>
         </w:r>
       </w:hyperlink>
       <w:r>
@@ -1866,14 +1866,43 @@
           <w:rPr>
             <w:rStyle w:val="Hyperlink"/>
           </w:rPr>
-          <w:t xml:space="preserve">linearity of expectation</w:t>
+          <w:t xml:space="preserve">linearity of expectation for finite sums</w:t>
         </w:r>
       </w:hyperlink>
       <w:r>
         <w:t xml:space="preserve"> </w:t>
       </w:r>
       <w:r>
-        <w:t xml:space="preserve">once per added summand:</w:t>
+        <w:t xml:space="preserve">with every</w:t>
+      </w:r>
+      <w:r>
+        <w:t xml:space="preserve"> </w:t>
+      </w:r>
+      <m:oMath>
+        <m:sSub>
+          <m:e>
+            <m:r>
+              <m:t>a</m:t>
+            </m:r>
+          </m:e>
+          <m:sub>
+            <m:r>
+              <m:t>i</m:t>
+            </m:r>
+          </m:sub>
+        </m:sSub>
+        <m:r>
+          <m:rPr>
+            <m:sty m:val="p"/>
+          </m:rPr>
+          <m:t>=</m:t>
+        </m:r>
+        <m:r>
+          <m:t>1</m:t>
+        </m:r>
+      </m:oMath>
+      <w:r>
+        <w:t xml:space="preserve">:</w:t>
       </w:r>
     </w:p>
     <w:p>
@@ -1930,6 +1959,254 @@
                 </m:rPr>
                 <m:t>=</m:t>
               </m:r>
+              <m:r>
+                <m:rPr>
+                  <m:sty m:val="p"/>
+                </m:rPr>
+                <m:t>E</m:t>
+              </m:r>
+              <m:r>
+                <m:t>​</m:t>
+              </m:r>
+              <m:d>
+                <m:dPr>
+                  <m:begChr m:val="["/>
+                  <m:sepChr m:val=""/>
+                  <m:endChr m:val="]"/>
+                  <m:grow/>
+                </m:dPr>
+                <m:e>
+                  <m:nary>
+                    <m:naryPr>
+                      <m:chr m:val="∑"/>
+                      <m:limLoc m:val="undOvr"/>
+                      <m:subHide m:val="off"/>
+                      <m:supHide m:val="off"/>
+                    </m:naryPr>
+                    <m:sub>
+                      <m:r>
+                        <m:t>i</m:t>
+                      </m:r>
+                      <m:r>
+                        <m:rPr>
+                          <m:sty m:val="p"/>
+                        </m:rPr>
+                        <m:t>=</m:t>
+                      </m:r>
+                      <m:r>
+                        <m:t>1</m:t>
+                      </m:r>
+                    </m:sub>
+                    <m:sup>
+                      <m:r>
+                        <m:t>n</m:t>
+                      </m:r>
+                    </m:sup>
+                    <m:e>
+                      <m:r>
+                        <m:t>1</m:t>
+                      </m:r>
+                    </m:e>
+                  </m:nary>
+                  <m:r>
+                    <m:rPr>
+                      <m:sty m:val="p"/>
+                    </m:rPr>
+                    <m:t>⋅</m:t>
+                  </m:r>
+                  <m:sSub>
+                    <m:e>
+                      <m:r>
+                        <m:t>X</m:t>
+                      </m:r>
+                    </m:e>
+                    <m:sub>
+                      <m:r>
+                        <m:t>i</m:t>
+                      </m:r>
+                    </m:sub>
+                  </m:sSub>
+                </m:e>
+              </m:d>
+              <m:r>
+                <m:t>​</m:t>
+              </m:r>
+              <m:r>
+                <m:t>&amp;</m:t>
+              </m:r>
+              <m:r>
+                <m:t>&amp;</m:t>
+              </m:r>
+              <m:r>
+                <m:rPr>
+                  <m:nor/>
+                  <m:sty m:val="p"/>
+                </m:rPr>
+                <m:t>(</m:t>
+              </m:r>
+              <m:r>
+                <m:t>1</m:t>
+              </m:r>
+              <m:r>
+                <m:rPr>
+                  <m:sty m:val="p"/>
+                </m:rPr>
+                <m:t>⋅</m:t>
+              </m:r>
+              <m:r>
+                <m:t>v</m:t>
+              </m:r>
+              <m:r>
+                <m:rPr>
+                  <m:sty m:val="p"/>
+                </m:rPr>
+                <m:t>=</m:t>
+              </m:r>
+              <m:r>
+                <m:t>v</m:t>
+              </m:r>
+              <m:r>
+                <m:rPr>
+                  <m:nor/>
+                  <m:sty m:val="p"/>
+                </m:rPr>
+                <m:t>)</m:t>
+              </m:r>
+            </m:e>
+            <m:e>
+              <m:r>
+                <m:t>&amp;</m:t>
+              </m:r>
+              <m:r>
+                <m:rPr>
+                  <m:sty m:val="p"/>
+                </m:rPr>
+                <m:t>=</m:t>
+              </m:r>
+              <m:nary>
+                <m:naryPr>
+                  <m:chr m:val="∑"/>
+                  <m:limLoc m:val="undOvr"/>
+                  <m:subHide m:val="off"/>
+                  <m:supHide m:val="off"/>
+                </m:naryPr>
+                <m:sub>
+                  <m:r>
+                    <m:t>i</m:t>
+                  </m:r>
+                  <m:r>
+                    <m:rPr>
+                      <m:sty m:val="p"/>
+                    </m:rPr>
+                    <m:t>=</m:t>
+                  </m:r>
+                  <m:r>
+                    <m:t>1</m:t>
+                  </m:r>
+                </m:sub>
+                <m:sup>
+                  <m:r>
+                    <m:t>n</m:t>
+                  </m:r>
+                </m:sup>
+                <m:e>
+                  <m:r>
+                    <m:t>1</m:t>
+                  </m:r>
+                </m:e>
+              </m:nary>
+              <m:r>
+                <m:rPr>
+                  <m:sty m:val="p"/>
+                </m:rPr>
+                <m:t>⋅</m:t>
+              </m:r>
+              <m:r>
+                <m:rPr>
+                  <m:sty m:val="p"/>
+                </m:rPr>
+                <m:t>E</m:t>
+              </m:r>
+              <m:r>
+                <m:t>​</m:t>
+              </m:r>
+              <m:d>
+                <m:dPr>
+                  <m:begChr m:val="["/>
+                  <m:sepChr m:val=""/>
+                  <m:endChr m:val="]"/>
+                  <m:grow/>
+                </m:dPr>
+                <m:e>
+                  <m:sSub>
+                    <m:e>
+                      <m:r>
+                        <m:t>X</m:t>
+                      </m:r>
+                    </m:e>
+                    <m:sub>
+                      <m:r>
+                        <m:t>i</m:t>
+                      </m:r>
+                    </m:sub>
+                  </m:sSub>
+                </m:e>
+              </m:d>
+              <m:r>
+                <m:t>​</m:t>
+              </m:r>
+              <m:r>
+                <m:t>&amp;</m:t>
+              </m:r>
+              <m:r>
+                <m:t>&amp;</m:t>
+              </m:r>
+              <m:r>
+                <m:rPr>
+                  <m:nor/>
+                  <m:sty m:val="p"/>
+                </m:rPr>
+                <m:t>(linearity of expectation for finite sums, all </m:t>
+              </m:r>
+              <m:sSub>
+                <m:e>
+                  <m:r>
+                    <m:t>a</m:t>
+                  </m:r>
+                </m:e>
+                <m:sub>
+                  <m:r>
+                    <m:t>i</m:t>
+                  </m:r>
+                </m:sub>
+              </m:sSub>
+              <m:r>
+                <m:rPr>
+                  <m:sty m:val="p"/>
+                </m:rPr>
+                <m:t>=</m:t>
+              </m:r>
+              <m:r>
+                <m:t>1</m:t>
+              </m:r>
+              <m:r>
+                <m:rPr>
+                  <m:nor/>
+                  <m:sty m:val="p"/>
+                </m:rPr>
+                <m:t>)</m:t>
+              </m:r>
+            </m:e>
+            <m:e>
+              <m:r>
+                <m:t>&amp;</m:t>
+              </m:r>
+              <m:r>
+                <m:rPr>
+                  <m:sty m:val="p"/>
+                </m:rPr>
+                <m:t>=</m:t>
+              </m:r>
               <m:nary>
                 <m:naryPr>
                   <m:chr m:val="∑"/>
@@ -2004,26 +2281,35 @@
                   <m:nor/>
                   <m:sty m:val="p"/>
                 </m:rPr>
-                <m:t>(linearity of expectation, applied </m:t>
-              </m:r>
-              <m:r>
-                <m:t>n</m:t>
-              </m:r>
-              <m:r>
-                <m:rPr>
-                  <m:sty m:val="p"/>
-                </m:rPr>
-                <m:t>−</m:t>
+                <m:t>(</m:t>
               </m:r>
               <m:r>
                 <m:t>1</m:t>
               </m:r>
               <m:r>
                 <m:rPr>
+                  <m:sty m:val="p"/>
+                </m:rPr>
+                <m:t>⋅</m:t>
+              </m:r>
+              <m:r>
+                <m:t>v</m:t>
+              </m:r>
+              <m:r>
+                <m:rPr>
+                  <m:sty m:val="p"/>
+                </m:rPr>
+                <m:t>=</m:t>
+              </m:r>
+              <m:r>
+                <m:t>v</m:t>
+              </m:r>
+              <m:r>
+                <m:rPr>
                   <m:nor/>
                   <m:sty m:val="p"/>
                 </m:rPr>
-                <m:t> times)</m:t>
+                <m:t>)</m:t>
               </m:r>
             </m:e>
             <m:e>
@@ -10027,7 +10313,7 @@
       </w:r>
     </w:p>
     <w:bookmarkEnd w:id="45"/>
-    <w:bookmarkStart w:id="58" w:name="sec-tail-bounds"/>
+    <w:bookmarkStart w:id="59" w:name="sec-tail-bounds"/>
     <w:p>
       <w:pPr>
         <w:pStyle w:val="Heading2"/>
@@ -10447,7 +10733,7 @@
       <w:r>
         <w:t xml:space="preserve"> </w:t>
       </w:r>
-      <w:hyperlink r:id="rId13">
+      <w:hyperlink r:id="rId47">
         <w:r>
           <w:rPr>
             <w:rStyle w:val="Hyperlink"/>
@@ -10750,7 +11036,7 @@
         <w:t xml:space="preserve">.</w:t>
       </w:r>
     </w:p>
-    <w:bookmarkStart w:id="47" w:name="thm-chebyshev"/>
+    <w:bookmarkStart w:id="48" w:name="thm-chebyshev"/>
     <w:p>
       <w:pPr>
         <w:pStyle w:val="BodyText"/>
@@ -10962,7 +11248,7 @@
         </m:oMath>
       </m:oMathPara>
     </w:p>
-    <w:bookmarkEnd w:id="47"/>
+    <w:bookmarkEnd w:id="48"/>
     <w:p>
       <w:pPr>
         <w:pStyle w:val="FirstParagraph"/>
@@ -11569,7 +11855,7 @@
         <w:t xml:space="preserve">.</w:t>
       </w:r>
     </w:p>
-    <w:bookmarkStart w:id="48" w:name="exm-chebyshev-auto"/>
+    <w:bookmarkStart w:id="49" w:name="exm-chebyshev-auto"/>
     <w:p>
       <w:pPr>
         <w:pStyle w:val="BodyText"/>
@@ -12315,8 +12601,8 @@
         <w:t xml:space="preserve">The bound is loose because it must hold for every distribution with this mean and variance.</w:t>
       </w:r>
     </w:p>
-    <w:bookmarkEnd w:id="48"/>
-    <w:bookmarkStart w:id="49" w:name="exr-chebyshev-sample-size"/>
+    <w:bookmarkEnd w:id="49"/>
+    <w:bookmarkStart w:id="50" w:name="exr-chebyshev-sample-size"/>
     <w:p>
       <w:pPr>
         <w:pStyle w:val="BodyText"/>
@@ -12980,8 +13266,8 @@
         <w:t xml:space="preserve">Why is the count so far below the 5% the bound allows?</w:t>
       </w:r>
     </w:p>
-    <w:bookmarkEnd w:id="49"/>
-    <w:bookmarkStart w:id="50" w:name="sol-chebyshev-sample-size"/>
+    <w:bookmarkEnd w:id="50"/>
+    <w:bookmarkStart w:id="51" w:name="sol-chebyshev-sample-size"/>
     <w:p>
       <w:pPr>
         <w:pStyle w:val="FirstParagraph"/>
@@ -14399,8 +14685,8 @@
         <w:t xml:space="preserve">.</w:t>
       </w:r>
     </w:p>
-    <w:bookmarkEnd w:id="50"/>
-    <w:bookmarkStart w:id="51" w:name="thm-chebyshev-sample-mean"/>
+    <w:bookmarkEnd w:id="51"/>
+    <w:bookmarkStart w:id="52" w:name="thm-chebyshev-sample-mean"/>
     <w:p>
       <w:pPr>
         <w:pStyle w:val="BodyText"/>
@@ -14801,7 +15087,7 @@
         </m:oMath>
       </m:oMathPara>
     </w:p>
-    <w:bookmarkEnd w:id="51"/>
+    <w:bookmarkEnd w:id="52"/>
     <w:p>
       <w:pPr>
         <w:pStyle w:val="FirstParagraph"/>
@@ -14964,7 +15250,7 @@
         <w:t xml:space="preserve">.</w:t>
       </w:r>
     </w:p>
-    <w:bookmarkStart w:id="52" w:name="lem-hoeffding"/>
+    <w:bookmarkStart w:id="53" w:name="lem-hoeffding"/>
     <w:p>
       <w:pPr>
         <w:pStyle w:val="BodyText"/>
@@ -15169,7 +15455,7 @@
         </m:oMath>
       </m:oMathPara>
     </w:p>
-    <w:bookmarkEnd w:id="52"/>
+    <w:bookmarkEnd w:id="53"/>
     <w:p>
       <w:pPr>
         <w:pStyle w:val="FirstParagraph"/>
@@ -18732,7 +19018,7 @@
         <w:t xml:space="preserve">The next result uses it to bound the tails of a sample mean.</w:t>
       </w:r>
     </w:p>
-    <w:bookmarkStart w:id="54" w:name="thm-hoeffding"/>
+    <w:bookmarkStart w:id="55" w:name="thm-hoeffding"/>
     <w:p>
       <w:pPr>
         <w:pStyle w:val="BodyText"/>
@@ -19017,7 +19303,7 @@
       <w:pPr>
         <w:pStyle w:val="BodyText"/>
       </w:pPr>
-      <w:bookmarkStart w:id="53" w:name="eq-hoeffding-one-sided"/>
+      <w:bookmarkStart w:id="54" w:name="eq-hoeffding-one-sided"/>
       <m:oMathPara>
         <m:oMathParaPr>
           <m:jc m:val="center"/>
@@ -19147,9 +19433,9 @@
           </m:r>
         </m:oMath>
       </m:oMathPara>
-      <w:bookmarkEnd w:id="53"/>
+      <w:bookmarkEnd w:id="54"/>
     </w:p>
-    <w:bookmarkEnd w:id="54"/>
+    <w:bookmarkEnd w:id="55"/>
     <w:p>
       <w:pPr>
         <w:pStyle w:val="FirstParagraph"/>
@@ -21246,7 +21532,7 @@
         <w:t xml:space="preserve">which is the claim.</w:t>
       </w:r>
     </w:p>
-    <w:bookmarkStart w:id="56" w:name="cor-hoeffding-two-sided"/>
+    <w:bookmarkStart w:id="57" w:name="cor-hoeffding-two-sided"/>
     <w:p>
       <w:pPr>
         <w:pStyle w:val="BodyText"/>
@@ -21303,7 +21589,7 @@
       <w:pPr>
         <w:pStyle w:val="BodyText"/>
       </w:pPr>
-      <w:bookmarkStart w:id="55" w:name="eq-hoeffding"/>
+      <w:bookmarkStart w:id="56" w:name="eq-hoeffding"/>
       <m:oMathPara>
         <m:oMathParaPr>
           <m:jc m:val="center"/>
@@ -21452,9 +21738,9 @@
           </m:r>
         </m:oMath>
       </m:oMathPara>
-      <w:bookmarkEnd w:id="55"/>
+      <w:bookmarkEnd w:id="56"/>
     </w:p>
-    <w:bookmarkEnd w:id="56"/>
+    <w:bookmarkEnd w:id="57"/>
     <w:p>
       <w:pPr>
         <w:pStyle w:val="FirstParagraph"/>
@@ -22697,7 +22983,7 @@
         <w:t xml:space="preserve">draws in which it occurs.</w:t>
       </w:r>
     </w:p>
-    <w:bookmarkStart w:id="57" w:name="exm-hoeffding-auto"/>
+    <w:bookmarkStart w:id="58" w:name="exm-hoeffding-auto"/>
     <w:p>
       <w:pPr>
         <w:pStyle w:val="BodyText"/>
@@ -24387,9 +24673,9 @@
         <w:t xml:space="preserve">Both bounds are loose because they must hold for every distribution of this kind, not only for this one.</w:t>
       </w:r>
     </w:p>
-    <w:bookmarkEnd w:id="57"/>
     <w:bookmarkEnd w:id="58"/>
-    <w:bookmarkStart w:id="66" w:name="sec-lln"/>
+    <w:bookmarkEnd w:id="59"/>
+    <w:bookmarkStart w:id="67" w:name="sec-lln"/>
     <w:p>
       <w:pPr>
         <w:pStyle w:val="Heading2"/>
@@ -24398,7 +24684,7 @@
         <w:t xml:space="preserve">3 The law of large numbers</w:t>
       </w:r>
     </w:p>
-    <w:bookmarkStart w:id="62" w:name="def-convergence-in-probability"/>
+    <w:bookmarkStart w:id="63" w:name="def-convergence-in-probability"/>
     <w:p>
       <w:pPr>
         <w:pStyle w:val="FirstParagraph"/>
@@ -24794,18 +25080,18 @@
                 <wp:inline>
                   <wp:extent cx="152400" cy="152400"/>
                   <wp:effectExtent b="0" l="0" r="0" t="0"/>
-                  <wp:docPr descr="" title="" id="60" name="Picture"/>
+                  <wp:docPr descr="" title="" id="61" name="Picture"/>
                   <a:graphic>
                     <a:graphicData uri="http://schemas.openxmlformats.org/drawingml/2006/picture">
                       <pic:pic>
                         <pic:nvPicPr>
-                          <pic:cNvPr descr="/opt/quarto/share/formats/docx/note.png" id="61" name="Picture"/>
+                          <pic:cNvPr descr="/opt/quarto/share/formats/docx/note.png" id="62" name="Picture"/>
                           <pic:cNvPicPr>
                             <a:picLocks noChangeArrowheads="1" noChangeAspect="1"/>
                           </pic:cNvPicPr>
                         </pic:nvPicPr>
                         <pic:blipFill>
-                          <a:blip r:embed="rId59"/>
+                          <a:blip r:embed="rId60"/>
                           <a:stretch>
                             <a:fillRect/>
                           </a:stretch>
@@ -24872,8 +25158,8 @@
         </w:tc>
       </w:tr>
     </w:tbl>
-    <w:bookmarkEnd w:id="62"/>
-    <w:bookmarkStart w:id="65" w:name="thm-wlln"/>
+    <w:bookmarkEnd w:id="63"/>
+    <w:bookmarkStart w:id="66" w:name="thm-wlln"/>
     <w:p>
       <w:pPr>
         <w:pStyle w:val="BodyText"/>
@@ -25252,18 +25538,18 @@
                 <wp:inline>
                   <wp:extent cx="152400" cy="152400"/>
                   <wp:effectExtent b="0" l="0" r="0" t="0"/>
-                  <wp:docPr descr="" title="" id="63" name="Picture"/>
+                  <wp:docPr descr="" title="" id="64" name="Picture"/>
                   <a:graphic>
                     <a:graphicData uri="http://schemas.openxmlformats.org/drawingml/2006/picture">
                       <pic:pic>
                         <pic:nvPicPr>
-                          <pic:cNvPr descr="/opt/quarto/share/formats/docx/note.png" id="64" name="Picture"/>
+                          <pic:cNvPr descr="/opt/quarto/share/formats/docx/note.png" id="65" name="Picture"/>
                           <pic:cNvPicPr>
                             <a:picLocks noChangeArrowheads="1" noChangeAspect="1"/>
                           </pic:cNvPicPr>
                         </pic:nvPicPr>
                         <pic:blipFill>
-                          <a:blip r:embed="rId59"/>
+                          <a:blip r:embed="rId60"/>
                           <a:stretch>
                             <a:fillRect/>
                           </a:stretch>
@@ -25330,7 +25616,7 @@
         </w:tc>
       </w:tr>
     </w:tbl>
-    <w:bookmarkEnd w:id="65"/>
+    <w:bookmarkEnd w:id="66"/>
     <w:p>
       <w:pPr>
         <w:pStyle w:val="BodyText"/>
@@ -26119,8 +26405,8 @@
         <w:t xml:space="preserve">.</w:t>
       </w:r>
     </w:p>
-    <w:bookmarkEnd w:id="66"/>
-    <w:bookmarkStart w:id="95" w:name="references"/>
+    <w:bookmarkEnd w:id="67"/>
+    <w:bookmarkStart w:id="96" w:name="references"/>
     <w:p>
       <w:pPr>
         <w:pStyle w:val="Heading2"/>
@@ -26129,8 +26415,8 @@
         <w:t xml:space="preserve">References</w:t>
       </w:r>
     </w:p>
-    <w:bookmarkStart w:id="94" w:name="refs"/>
-    <w:bookmarkStart w:id="68" w:name="ref-wikipedia_central_limit_theorem"/>
+    <w:bookmarkStart w:id="95" w:name="refs"/>
+    <w:bookmarkStart w:id="69" w:name="ref-wikipedia_central_limit_theorem"/>
     <w:p>
       <w:pPr>
         <w:pStyle w:val="Bibliography"/>
@@ -26177,7 +26463,7 @@
       <w:r>
         <w:t xml:space="preserve"> </w:t>
       </w:r>
-      <w:hyperlink r:id="rId67">
+      <w:hyperlink r:id="rId68">
         <w:r>
           <w:rPr>
             <w:rStyle w:val="Hyperlink"/>
@@ -26186,8 +26472,8 @@
         </w:r>
       </w:hyperlink>
     </w:p>
-    <w:bookmarkEnd w:id="68"/>
-    <w:bookmarkStart w:id="69" w:name="ref-billingsley1995probability"/>
+    <w:bookmarkEnd w:id="69"/>
+    <w:bookmarkStart w:id="70" w:name="ref-billingsley1995probability"/>
     <w:p>
       <w:pPr>
         <w:pStyle w:val="Bibliography"/>
@@ -26218,8 +26504,8 @@
         <w:t xml:space="preserve">, 3rd ed. in Wiley series in probability and mathematical statistics. New York: Wiley, 1995.</w:t>
       </w:r>
     </w:p>
-    <w:bookmarkEnd w:id="69"/>
-    <w:bookmarkStart w:id="71" w:name="ref-fiveminuteai_probstat"/>
+    <w:bookmarkEnd w:id="70"/>
+    <w:bookmarkStart w:id="72" w:name="ref-fiveminuteai_probstat"/>
     <w:p>
       <w:pPr>
         <w:pStyle w:val="Bibliography"/>
@@ -26251,7 +26537,7 @@
       <w:r>
         <w:t xml:space="preserve"> </w:t>
       </w:r>
-      <w:hyperlink r:id="rId70">
+      <w:hyperlink r:id="rId71">
         <w:r>
           <w:rPr>
             <w:rStyle w:val="Hyperlink"/>
@@ -26260,8 +26546,8 @@
         </w:r>
       </w:hyperlink>
     </w:p>
-    <w:bookmarkEnd w:id="71"/>
-    <w:bookmarkStart w:id="73" w:name="ref-wikipedia_markovs_inequality"/>
+    <w:bookmarkEnd w:id="72"/>
+    <w:bookmarkStart w:id="74" w:name="ref-wikipedia_markovs_inequality"/>
     <w:p>
       <w:pPr>
         <w:pStyle w:val="Bibliography"/>
@@ -26308,7 +26594,7 @@
       <w:r>
         <w:t xml:space="preserve"> </w:t>
       </w:r>
-      <w:hyperlink r:id="rId72">
+      <w:hyperlink r:id="rId73">
         <w:r>
           <w:rPr>
             <w:rStyle w:val="Hyperlink"/>
@@ -26317,8 +26603,8 @@
         </w:r>
       </w:hyperlink>
     </w:p>
-    <w:bookmarkEnd w:id="73"/>
-    <w:bookmarkStart w:id="75" w:name="ref-bienayme1853"/>
+    <w:bookmarkEnd w:id="74"/>
+    <w:bookmarkStart w:id="76" w:name="ref-bienayme1853"/>
     <w:p>
       <w:pPr>
         <w:pStyle w:val="Bibliography"/>
@@ -26369,7 +26655,7 @@
       <w:r>
         <w:t xml:space="preserve"> </w:t>
       </w:r>
-      <w:hyperlink r:id="rId74">
+      <w:hyperlink r:id="rId75">
         <w:r>
           <w:rPr>
             <w:rStyle w:val="Hyperlink"/>
@@ -26378,8 +26664,8 @@
         </w:r>
       </w:hyperlink>
     </w:p>
-    <w:bookmarkEnd w:id="75"/>
-    <w:bookmarkStart w:id="77" w:name="ref-tchebichef1867"/>
+    <w:bookmarkEnd w:id="76"/>
+    <w:bookmarkStart w:id="78" w:name="ref-tchebichef1867"/>
     <w:p>
       <w:pPr>
         <w:pStyle w:val="Bibliography"/>
@@ -26418,7 +26704,7 @@
       <w:r>
         <w:t xml:space="preserve"> </w:t>
       </w:r>
-      <w:hyperlink r:id="rId76">
+      <w:hyperlink r:id="rId77">
         <w:r>
           <w:rPr>
             <w:rStyle w:val="Hyperlink"/>
@@ -26427,8 +26713,8 @@
         </w:r>
       </w:hyperlink>
     </w:p>
-    <w:bookmarkEnd w:id="77"/>
-    <w:bookmarkStart w:id="79" w:name="ref-seneta2013"/>
+    <w:bookmarkEnd w:id="78"/>
+    <w:bookmarkStart w:id="80" w:name="ref-seneta2013"/>
     <w:p>
       <w:pPr>
         <w:pStyle w:val="Bibliography"/>
@@ -26467,7 +26753,7 @@
       <w:r>
         <w:t xml:space="preserve"> </w:t>
       </w:r>
-      <w:hyperlink r:id="rId78">
+      <w:hyperlink r:id="rId79">
         <w:r>
           <w:rPr>
             <w:rStyle w:val="Hyperlink"/>
@@ -26479,8 +26765,8 @@
         <w:t xml:space="preserve">.</w:t>
       </w:r>
     </w:p>
-    <w:bookmarkEnd w:id="79"/>
-    <w:bookmarkStart w:id="81" w:name="ref-blitzstein2019introduction"/>
+    <w:bookmarkEnd w:id="80"/>
+    <w:bookmarkStart w:id="82" w:name="ref-blitzstein2019introduction"/>
     <w:p>
       <w:pPr>
         <w:pStyle w:val="Bibliography"/>
@@ -26513,7 +26799,7 @@
       <w:r>
         <w:t xml:space="preserve"> </w:t>
       </w:r>
-      <w:hyperlink r:id="rId80">
+      <w:hyperlink r:id="rId81">
         <w:r>
           <w:rPr>
             <w:rStyle w:val="Hyperlink"/>
@@ -26525,8 +26811,8 @@
         <w:t xml:space="preserve">.</w:t>
       </w:r>
     </w:p>
-    <w:bookmarkEnd w:id="81"/>
-    <w:bookmarkStart w:id="83" w:name="ref-wikipedia_chebyshevs_inequality"/>
+    <w:bookmarkEnd w:id="82"/>
+    <w:bookmarkStart w:id="84" w:name="ref-wikipedia_chebyshevs_inequality"/>
     <w:p>
       <w:pPr>
         <w:pStyle w:val="Bibliography"/>
@@ -26573,7 +26859,7 @@
       <w:r>
         <w:t xml:space="preserve"> </w:t>
       </w:r>
-      <w:hyperlink r:id="rId82">
+      <w:hyperlink r:id="rId83">
         <w:r>
           <w:rPr>
             <w:rStyle w:val="Hyperlink"/>
@@ -26582,8 +26868,8 @@
         </w:r>
       </w:hyperlink>
     </w:p>
-    <w:bookmarkEnd w:id="83"/>
-    <w:bookmarkStart w:id="85" w:name="ref-hoeffding1963"/>
+    <w:bookmarkEnd w:id="84"/>
+    <w:bookmarkStart w:id="86" w:name="ref-hoeffding1963"/>
     <w:p>
       <w:pPr>
         <w:pStyle w:val="Bibliography"/>
@@ -26622,7 +26908,7 @@
       <w:r>
         <w:t xml:space="preserve"> </w:t>
       </w:r>
-      <w:hyperlink r:id="rId84">
+      <w:hyperlink r:id="rId85">
         <w:r>
           <w:rPr>
             <w:rStyle w:val="Hyperlink"/>
@@ -26634,8 +26920,8 @@
         <w:t xml:space="preserve">.</w:t>
       </w:r>
     </w:p>
-    <w:bookmarkEnd w:id="85"/>
-    <w:bookmarkStart w:id="87" w:name="ref-wikipedia_hoeffdings_inequality"/>
+    <w:bookmarkEnd w:id="86"/>
+    <w:bookmarkStart w:id="88" w:name="ref-wikipedia_hoeffdings_inequality"/>
     <w:p>
       <w:pPr>
         <w:pStyle w:val="Bibliography"/>
@@ -26682,7 +26968,7 @@
       <w:r>
         <w:t xml:space="preserve"> </w:t>
       </w:r>
-      <w:hyperlink r:id="rId86">
+      <w:hyperlink r:id="rId87">
         <w:r>
           <w:rPr>
             <w:rStyle w:val="Hyperlink"/>
@@ -26691,8 +26977,8 @@
         </w:r>
       </w:hyperlink>
     </w:p>
-    <w:bookmarkEnd w:id="87"/>
-    <w:bookmarkStart w:id="89" w:name="Xd57efcf36cbfbff962c3240b4f16e14e48748ce"/>
+    <w:bookmarkEnd w:id="88"/>
+    <w:bookmarkStart w:id="90" w:name="Xd57efcf36cbfbff962c3240b4f16e14e48748ce"/>
     <w:p>
       <w:pPr>
         <w:pStyle w:val="Bibliography"/>
@@ -26739,7 +27025,7 @@
       <w:r>
         <w:t xml:space="preserve"> </w:t>
       </w:r>
-      <w:hyperlink r:id="rId88">
+      <w:hyperlink r:id="rId89">
         <w:r>
           <w:rPr>
             <w:rStyle w:val="Hyperlink"/>
@@ -26748,8 +27034,8 @@
         </w:r>
       </w:hyperlink>
     </w:p>
-    <w:bookmarkEnd w:id="89"/>
-    <w:bookmarkStart w:id="91" w:name="ref-CaseBerg01"/>
+    <w:bookmarkEnd w:id="90"/>
+    <w:bookmarkStart w:id="92" w:name="ref-CaseBerg01"/>
     <w:p>
       <w:pPr>
         <w:pStyle w:val="Bibliography"/>
@@ -26782,7 +27068,7 @@
       <w:r>
         <w:t xml:space="preserve"> </w:t>
       </w:r>
-      <w:hyperlink r:id="rId90">
+      <w:hyperlink r:id="rId91">
         <w:r>
           <w:rPr>
             <w:rStyle w:val="Hyperlink"/>
@@ -26791,8 +27077,8 @@
         </w:r>
       </w:hyperlink>
     </w:p>
-    <w:bookmarkEnd w:id="91"/>
-    <w:bookmarkStart w:id="93" w:name="ref-wikipedia_law_of_large_numbers"/>
+    <w:bookmarkEnd w:id="92"/>
+    <w:bookmarkStart w:id="94" w:name="ref-wikipedia_law_of_large_numbers"/>
     <w:p>
       <w:pPr>
         <w:pStyle w:val="Bibliography"/>
@@ -26839,7 +27125,7 @@
       <w:r>
         <w:t xml:space="preserve"> </w:t>
       </w:r>
-      <w:hyperlink r:id="rId92">
+      <w:hyperlink r:id="rId93">
         <w:r>
           <w:rPr>
             <w:rStyle w:val="Hyperlink"/>
@@ -26848,9 +27134,9 @@
         </w:r>
       </w:hyperlink>
     </w:p>
-    <w:bookmarkEnd w:id="93"/>
     <w:bookmarkEnd w:id="94"/>
     <w:bookmarkEnd w:id="95"/>
+    <w:bookmarkEnd w:id="96"/>
     <w:sectPr>
       <w:footnotePr>
         <w:numRestart w:val="eachSect"/>

</xml_diff>

<commit_message>
Deploying to gh-pages from @ Morrison-Lab/pds@ae3f62c76d6e07ad621feb81ce28931aac3f5aca 🚀
</commit_message>
<xml_diff>
--- a/limit-theorems.docx
+++ b/limit-theorems.docx
@@ -15,7 +15,7 @@
         <w:pStyle w:val="Date"/>
       </w:pPr>
       <w:r>
-        <w:t xml:space="preserve">Last modified: 2026-10-27 10:44:58 (PDT)</w:t>
+        <w:t xml:space="preserve">Last modified: 2026-10-27 10:52:35 (PDT)</w:t>
       </w:r>
     </w:p>
     <w:bookmarkStart w:id="45" w:name="sec-clt"/>
@@ -10323,7 +10323,7 @@
       </w:r>
     </w:p>
     <w:bookmarkEnd w:id="45"/>
-    <w:bookmarkStart w:id="59" w:name="sec-tail-bounds"/>
+    <w:bookmarkStart w:id="68" w:name="sec-tail-bounds"/>
     <w:p>
       <w:pPr>
         <w:pStyle w:val="Heading2"/>
@@ -12626,7 +12626,7 @@
           <w:b/>
           <w:bCs/>
         </w:rPr>
-        <w:t xml:space="preserve">Exercise 1 (How many cars to estimate mean fuel economy)</w:t>
+        <w:t xml:space="preserve">Exercise 1 (Chebyshev’s bound for the mean fuel economy)</w:t>
       </w:r>
       <w:r>
         <w:t xml:space="preserve"> </w:t>
@@ -12870,10 +12870,7 @@
     </w:p>
     <w:p>
       <w:pPr>
-        <w:numPr>
-          <w:ilvl w:val="0"/>
-          <w:numId w:val="1001"/>
-        </w:numPr>
+        <w:pStyle w:val="BodyText"/>
       </w:pPr>
       <w:r>
         <w:t xml:space="preserve">Use</w:t>
@@ -13062,13 +13059,564 @@
         </m:oMath>
       </m:oMathPara>
     </w:p>
+    <w:bookmarkEnd w:id="50"/>
+    <w:bookmarkStart w:id="51" w:name="sol-chebyshev-sample-size"/>
     <w:p>
       <w:pPr>
-        <w:numPr>
-          <w:ilvl w:val="0"/>
-          <w:numId w:val="1001"/>
-        </w:numPr>
+        <w:pStyle w:val="FirstParagraph"/>
       </w:pPr>
+      <w:r>
+        <w:rPr>
+          <w:i/>
+          <w:iCs/>
+        </w:rPr>
+        <w:t xml:space="preserve">Solution 1</w:t>
+      </w:r>
+      <w:r>
+        <w:t xml:space="preserve">. </w:t>
+      </w:r>
+      <w:r>
+        <w:t xml:space="preserve">By</w:t>
+      </w:r>
+      <w:r>
+        <w:t xml:space="preserve"> </w:t>
+      </w:r>
+      <w:hyperlink w:anchor="thm-sum-iid-moments">
+        <w:r>
+          <w:rPr>
+            <w:rStyle w:val="Hyperlink"/>
+          </w:rPr>
+          <w:t xml:space="preserve">Theorem 2</w:t>
+        </w:r>
+      </w:hyperlink>
+      <w:r>
+        <w:t xml:space="preserve">,</w:t>
+      </w:r>
+      <w:r>
+        <w:t xml:space="preserve"> </w:t>
+      </w:r>
+      <m:oMath>
+        <m:r>
+          <m:rPr>
+            <m:sty m:val="p"/>
+          </m:rPr>
+          <m:t>Var</m:t>
+        </m:r>
+        <m:r>
+          <m:t>​</m:t>
+        </m:r>
+        <m:d>
+          <m:dPr>
+            <m:begChr m:val="("/>
+            <m:sepChr m:val=""/>
+            <m:endChr m:val=")"/>
+            <m:grow/>
+          </m:dPr>
+          <m:e>
+            <m:sSub>
+              <m:e>
+                <m:r>
+                  <m:t>S</m:t>
+                </m:r>
+              </m:e>
+              <m:sub>
+                <m:r>
+                  <m:t>n</m:t>
+                </m:r>
+              </m:sub>
+            </m:sSub>
+          </m:e>
+        </m:d>
+        <m:r>
+          <m:t>​</m:t>
+        </m:r>
+        <m:r>
+          <m:rPr>
+            <m:sty m:val="p"/>
+          </m:rPr>
+          <m:t>=</m:t>
+        </m:r>
+        <m:r>
+          <m:t>n</m:t>
+        </m:r>
+        <m:sSup>
+          <m:e>
+            <m:r>
+              <m:t>σ</m:t>
+            </m:r>
+          </m:e>
+          <m:sup>
+            <m:r>
+              <m:t>2</m:t>
+            </m:r>
+          </m:sup>
+        </m:sSup>
+      </m:oMath>
+      <w:r>
+        <w:t xml:space="preserve"> </w:t>
+      </w:r>
+      <w:r>
+        <w:t xml:space="preserve">for</w:t>
+      </w:r>
+      <w:r>
+        <w:t xml:space="preserve"> </w:t>
+      </w:r>
+      <m:oMath>
+        <m:sSub>
+          <m:e>
+            <m:r>
+              <m:t>S</m:t>
+            </m:r>
+          </m:e>
+          <m:sub>
+            <m:r>
+              <m:t>n</m:t>
+            </m:r>
+          </m:sub>
+        </m:sSub>
+        <m:limUpp>
+          <m:e>
+            <m:r>
+              <m:rPr>
+                <m:sty m:val="p"/>
+              </m:rPr>
+              <m:t>=</m:t>
+            </m:r>
+          </m:e>
+          <m:lim>
+            <m:r>
+              <m:rPr>
+                <m:nor/>
+                <m:sty m:val="p"/>
+              </m:rPr>
+              <m:t>def</m:t>
+            </m:r>
+          </m:lim>
+        </m:limUpp>
+        <m:nary>
+          <m:naryPr>
+            <m:chr m:val="∑"/>
+            <m:limLoc m:val="undOvr"/>
+            <m:subHide m:val="off"/>
+            <m:supHide m:val="off"/>
+          </m:naryPr>
+          <m:sub>
+            <m:r>
+              <m:t>i</m:t>
+            </m:r>
+            <m:r>
+              <m:rPr>
+                <m:sty m:val="p"/>
+              </m:rPr>
+              <m:t>=</m:t>
+            </m:r>
+            <m:r>
+              <m:t>1</m:t>
+            </m:r>
+          </m:sub>
+          <m:sup>
+            <m:r>
+              <m:t>n</m:t>
+            </m:r>
+          </m:sup>
+          <m:e>
+            <m:sSub>
+              <m:e>
+                <m:r>
+                  <m:t>X</m:t>
+                </m:r>
+              </m:e>
+              <m:sub>
+                <m:r>
+                  <m:t>i</m:t>
+                </m:r>
+              </m:sub>
+            </m:sSub>
+          </m:e>
+        </m:nary>
+      </m:oMath>
+      <w:r>
+        <w:t xml:space="preserve">,</w:t>
+      </w:r>
+      <w:r>
+        <w:t xml:space="preserve"> </w:t>
+      </w:r>
+      <w:r>
+        <w:t xml:space="preserve">so</w:t>
+      </w:r>
+      <w:r>
+        <w:t xml:space="preserve"> </w:t>
+      </w:r>
+      <m:oMath>
+        <m:sSub>
+          <m:e>
+            <m:acc>
+              <m:accPr>
+                <m:chr m:val="‾"/>
+              </m:accPr>
+              <m:e>
+                <m:r>
+                  <m:t>X</m:t>
+                </m:r>
+              </m:e>
+            </m:acc>
+          </m:e>
+          <m:sub>
+            <m:r>
+              <m:t>n</m:t>
+            </m:r>
+          </m:sub>
+        </m:sSub>
+        <m:r>
+          <m:rPr>
+            <m:sty m:val="p"/>
+          </m:rPr>
+          <m:t>=</m:t>
+        </m:r>
+        <m:sSub>
+          <m:e>
+            <m:r>
+              <m:t>S</m:t>
+            </m:r>
+          </m:e>
+          <m:sub>
+            <m:r>
+              <m:t>n</m:t>
+            </m:r>
+          </m:sub>
+        </m:sSub>
+        <m:r>
+          <m:rPr>
+            <m:sty m:val="p"/>
+          </m:rPr>
+          <m:t>/</m:t>
+        </m:r>
+        <m:r>
+          <m:t>n</m:t>
+        </m:r>
+      </m:oMath>
+      <w:r>
+        <w:t xml:space="preserve"> </w:t>
+      </w:r>
+      <w:r>
+        <w:t xml:space="preserve">has mean</w:t>
+      </w:r>
+      <w:r>
+        <w:t xml:space="preserve"> </w:t>
+      </w:r>
+      <m:oMath>
+        <m:r>
+          <m:t>μ</m:t>
+        </m:r>
+      </m:oMath>
+      <w:r>
+        <w:t xml:space="preserve"> </w:t>
+      </w:r>
+      <w:r>
+        <w:t xml:space="preserve">and variance</w:t>
+      </w:r>
+      <w:r>
+        <w:t xml:space="preserve"> </w:t>
+      </w:r>
+      <m:oMath>
+        <m:sSup>
+          <m:e>
+            <m:r>
+              <m:t>σ</m:t>
+            </m:r>
+          </m:e>
+          <m:sup>
+            <m:r>
+              <m:t>2</m:t>
+            </m:r>
+          </m:sup>
+        </m:sSup>
+        <m:r>
+          <m:rPr>
+            <m:sty m:val="p"/>
+          </m:rPr>
+          <m:t>/</m:t>
+        </m:r>
+        <m:r>
+          <m:t>n</m:t>
+        </m:r>
+      </m:oMath>
+      <w:r>
+        <w:t xml:space="preserve"> </w:t>
+      </w:r>
+      <w:r>
+        <w:t xml:space="preserve">(a constant factor</w:t>
+      </w:r>
+      <w:r>
+        <w:t xml:space="preserve"> </w:t>
+      </w:r>
+      <m:oMath>
+        <m:r>
+          <m:t>c</m:t>
+        </m:r>
+      </m:oMath>
+      <w:r>
+        <w:t xml:space="preserve"> </w:t>
+      </w:r>
+      <w:r>
+        <w:t xml:space="preserve">scales a variance by</w:t>
+      </w:r>
+      <w:r>
+        <w:t xml:space="preserve"> </w:t>
+      </w:r>
+      <m:oMath>
+        <m:sSup>
+          <m:e>
+            <m:r>
+              <m:t>c</m:t>
+            </m:r>
+          </m:e>
+          <m:sup>
+            <m:r>
+              <m:t>2</m:t>
+            </m:r>
+          </m:sup>
+        </m:sSup>
+      </m:oMath>
+      <w:r>
+        <w:t xml:space="preserve">).</w:t>
+      </w:r>
+      <w:r>
+        <w:t xml:space="preserve"> </w:t>
+      </w:r>
+      <w:r>
+        <w:t xml:space="preserve">Apply</w:t>
+      </w:r>
+      <w:r>
+        <w:t xml:space="preserve"> </w:t>
+      </w:r>
+      <w:hyperlink w:anchor="thm-chebyshev">
+        <w:r>
+          <w:rPr>
+            <w:rStyle w:val="Hyperlink"/>
+          </w:rPr>
+          <w:t xml:space="preserve">Theorem 4</w:t>
+        </w:r>
+      </w:hyperlink>
+      <w:r>
+        <w:t xml:space="preserve"> </w:t>
+      </w:r>
+      <w:r>
+        <w:t xml:space="preserve">to</w:t>
+      </w:r>
+      <w:r>
+        <w:t xml:space="preserve"> </w:t>
+      </w:r>
+      <m:oMath>
+        <m:sSub>
+          <m:e>
+            <m:acc>
+              <m:accPr>
+                <m:chr m:val="‾"/>
+              </m:accPr>
+              <m:e>
+                <m:r>
+                  <m:t>X</m:t>
+                </m:r>
+              </m:e>
+            </m:acc>
+          </m:e>
+          <m:sub>
+            <m:r>
+              <m:t>n</m:t>
+            </m:r>
+          </m:sub>
+        </m:sSub>
+      </m:oMath>
+      <w:r>
+        <w:t xml:space="preserve"> </w:t>
+      </w:r>
+      <w:r>
+        <w:t xml:space="preserve">with</w:t>
+      </w:r>
+      <w:r>
+        <w:t xml:space="preserve"> </w:t>
+      </w:r>
+      <m:oMath>
+        <m:r>
+          <m:t>k</m:t>
+        </m:r>
+        <m:r>
+          <m:t>σ</m:t>
+        </m:r>
+        <m:r>
+          <m:rPr>
+            <m:sty m:val="p"/>
+          </m:rPr>
+          <m:t>/</m:t>
+        </m:r>
+        <m:rad>
+          <m:radPr>
+            <m:degHide m:val="on"/>
+          </m:radPr>
+          <m:deg/>
+          <m:e>
+            <m:r>
+              <m:t>n</m:t>
+            </m:r>
+          </m:e>
+        </m:rad>
+        <m:r>
+          <m:rPr>
+            <m:sty m:val="p"/>
+          </m:rPr>
+          <m:t>=</m:t>
+        </m:r>
+        <m:r>
+          <m:t>ϵ</m:t>
+        </m:r>
+      </m:oMath>
+      <w:r>
+        <w:t xml:space="preserve">,</w:t>
+      </w:r>
+      <w:r>
+        <w:t xml:space="preserve"> </w:t>
+      </w:r>
+      <w:r>
+        <w:t xml:space="preserve">that is,</w:t>
+      </w:r>
+      <w:r>
+        <w:t xml:space="preserve"> </w:t>
+      </w:r>
+      <m:oMath>
+        <m:r>
+          <m:t>k</m:t>
+        </m:r>
+        <m:r>
+          <m:rPr>
+            <m:sty m:val="p"/>
+          </m:rPr>
+          <m:t>=</m:t>
+        </m:r>
+        <m:r>
+          <m:t>ϵ</m:t>
+        </m:r>
+        <m:rad>
+          <m:radPr>
+            <m:degHide m:val="on"/>
+          </m:radPr>
+          <m:deg/>
+          <m:e>
+            <m:r>
+              <m:t>n</m:t>
+            </m:r>
+          </m:e>
+        </m:rad>
+        <m:r>
+          <m:rPr>
+            <m:sty m:val="p"/>
+          </m:rPr>
+          <m:t>/</m:t>
+        </m:r>
+        <m:r>
+          <m:t>σ</m:t>
+        </m:r>
+      </m:oMath>
+      <w:r>
+        <w:t xml:space="preserve">, so</w:t>
+      </w:r>
+      <w:r>
+        <w:t xml:space="preserve"> </w:t>
+      </w:r>
+      <m:oMath>
+        <m:r>
+          <m:t>1</m:t>
+        </m:r>
+        <m:r>
+          <m:rPr>
+            <m:sty m:val="p"/>
+          </m:rPr>
+          <m:t>/</m:t>
+        </m:r>
+        <m:sSup>
+          <m:e>
+            <m:r>
+              <m:t>k</m:t>
+            </m:r>
+          </m:e>
+          <m:sup>
+            <m:r>
+              <m:t>2</m:t>
+            </m:r>
+          </m:sup>
+        </m:sSup>
+        <m:r>
+          <m:rPr>
+            <m:sty m:val="p"/>
+          </m:rPr>
+          <m:t>=</m:t>
+        </m:r>
+        <m:sSup>
+          <m:e>
+            <m:r>
+              <m:t>σ</m:t>
+            </m:r>
+          </m:e>
+          <m:sup>
+            <m:r>
+              <m:t>2</m:t>
+            </m:r>
+          </m:sup>
+        </m:sSup>
+        <m:r>
+          <m:rPr>
+            <m:sty m:val="p"/>
+          </m:rPr>
+          <m:t>/</m:t>
+        </m:r>
+        <m:r>
+          <m:rPr>
+            <m:sty m:val="p"/>
+          </m:rPr>
+          <m:t>(</m:t>
+        </m:r>
+        <m:r>
+          <m:t>n</m:t>
+        </m:r>
+        <m:sSup>
+          <m:e>
+            <m:r>
+              <m:t>ϵ</m:t>
+            </m:r>
+          </m:e>
+          <m:sup>
+            <m:r>
+              <m:t>2</m:t>
+            </m:r>
+          </m:sup>
+        </m:sSup>
+        <m:r>
+          <m:rPr>
+            <m:sty m:val="p"/>
+          </m:rPr>
+          <m:t>)</m:t>
+        </m:r>
+      </m:oMath>
+      <w:r>
+        <w:t xml:space="preserve">.</w:t>
+      </w:r>
+    </w:p>
+    <w:bookmarkEnd w:id="51"/>
+    <w:bookmarkStart w:id="52" w:name="exr-chebyshev-variance"/>
+    <w:p>
+      <w:pPr>
+        <w:pStyle w:val="BodyText"/>
+      </w:pPr>
+      <w:r>
+        <w:rPr>
+          <w:b/>
+          <w:bCs/>
+        </w:rPr>
+        <w:t xml:space="preserve">Exercise 2 (Population variance of the fuel economy)</w:t>
+      </w:r>
+      <w:r>
+        <w:t xml:space="preserve"> </w:t>
+      </w:r>
       <w:r>
         <w:t xml:space="preserve">Compute</w:t>
       </w:r>
@@ -13130,16 +13678,303 @@
       <w:r>
         <w:t xml:space="preserve">treating the 392 cars as the whole population.</w:t>
       </w:r>
-      <w:r>
-        <w:t xml:space="preserve"> </w:t>
-      </w:r>
-      <w:r>
-        <w:t xml:space="preserve">Find the smallest</w:t>
+    </w:p>
+    <w:bookmarkEnd w:id="52"/>
+    <w:bookmarkStart w:id="53" w:name="sol-chebyshev-variance"/>
+    <w:p>
+      <w:pPr>
+        <w:pStyle w:val="BodyText"/>
+      </w:pPr>
+      <w:r>
+        <w:rPr>
+          <w:i/>
+          <w:iCs/>
+        </w:rPr>
+        <w:t xml:space="preserve">Solution 2</w:t>
+      </w:r>
+      <w:r>
+        <w:t xml:space="preserve">. </w:t>
+      </w:r>
+    </w:p>
+    <w:p>
+      <w:pPr>
+        <w:pStyle w:val="SourceCode"/>
+      </w:pPr>
+      <w:r>
+        <w:rPr>
+          <w:rStyle w:val="NormalTok"/>
+        </w:rPr>
+        <w:t xml:space="preserve">mpg </w:t>
+      </w:r>
+      <w:r>
+        <w:rPr>
+          <w:rStyle w:val="OtherTok"/>
+        </w:rPr>
+        <w:t xml:space="preserve">&lt;-</w:t>
+      </w:r>
+      <w:r>
+        <w:rPr>
+          <w:rStyle w:val="NormalTok"/>
+        </w:rPr>
+        <w:t xml:space="preserve"> </w:t>
+      </w:r>
+      <w:r>
+        <w:rPr>
+          <w:rStyle w:val="FunctionTok"/>
+        </w:rPr>
+        <w:t xml:space="preserve">read.csv</w:t>
+      </w:r>
+      <w:r>
+        <w:rPr>
+          <w:rStyle w:val="NormalTok"/>
+        </w:rPr>
+        <w:t xml:space="preserve">(</w:t>
+      </w:r>
+      <w:r>
+        <w:rPr>
+          <w:rStyle w:val="StringTok"/>
+        </w:rPr>
+        <w:t xml:space="preserve">"data/auto.csv"</w:t>
+      </w:r>
+      <w:r>
+        <w:rPr>
+          <w:rStyle w:val="NormalTok"/>
+        </w:rPr>
+        <w:t xml:space="preserve">)</w:t>
+      </w:r>
+      <w:r>
+        <w:rPr>
+          <w:rStyle w:val="SpecialCharTok"/>
+        </w:rPr>
+        <w:t xml:space="preserve">$</w:t>
+      </w:r>
+      <w:r>
+        <w:rPr>
+          <w:rStyle w:val="NormalTok"/>
+        </w:rPr>
+        <w:t xml:space="preserve">mpg</w:t>
+      </w:r>
+      <w:r>
+        <w:br/>
+      </w:r>
+      <w:r>
+        <w:rPr>
+          <w:rStyle w:val="NormalTok"/>
+        </w:rPr>
+        <w:t xml:space="preserve">mu </w:t>
+      </w:r>
+      <w:r>
+        <w:rPr>
+          <w:rStyle w:val="OtherTok"/>
+        </w:rPr>
+        <w:t xml:space="preserve">&lt;-</w:t>
+      </w:r>
+      <w:r>
+        <w:rPr>
+          <w:rStyle w:val="NormalTok"/>
+        </w:rPr>
+        <w:t xml:space="preserve"> </w:t>
+      </w:r>
+      <w:r>
+        <w:rPr>
+          <w:rStyle w:val="FunctionTok"/>
+        </w:rPr>
+        <w:t xml:space="preserve">mean</w:t>
+      </w:r>
+      <w:r>
+        <w:rPr>
+          <w:rStyle w:val="NormalTok"/>
+        </w:rPr>
+        <w:t xml:space="preserve">(mpg)</w:t>
+      </w:r>
+      <w:r>
+        <w:br/>
+      </w:r>
+      <w:r>
+        <w:rPr>
+          <w:rStyle w:val="NormalTok"/>
+        </w:rPr>
+        <w:t xml:space="preserve">sigma2 </w:t>
+      </w:r>
+      <w:r>
+        <w:rPr>
+          <w:rStyle w:val="OtherTok"/>
+        </w:rPr>
+        <w:t xml:space="preserve">&lt;-</w:t>
+      </w:r>
+      <w:r>
+        <w:rPr>
+          <w:rStyle w:val="NormalTok"/>
+        </w:rPr>
+        <w:t xml:space="preserve"> </w:t>
+      </w:r>
+      <w:r>
+        <w:rPr>
+          <w:rStyle w:val="FunctionTok"/>
+        </w:rPr>
+        <w:t xml:space="preserve">mean</w:t>
+      </w:r>
+      <w:r>
+        <w:rPr>
+          <w:rStyle w:val="NormalTok"/>
+        </w:rPr>
+        <w:t xml:space="preserve">((mpg </w:t>
+      </w:r>
+      <w:r>
+        <w:rPr>
+          <w:rStyle w:val="SpecialCharTok"/>
+        </w:rPr>
+        <w:t xml:space="preserve">-</w:t>
+      </w:r>
+      <w:r>
+        <w:rPr>
+          <w:rStyle w:val="NormalTok"/>
+        </w:rPr>
+        <w:t xml:space="preserve"> mu)</w:t>
+      </w:r>
+      <w:r>
+        <w:rPr>
+          <w:rStyle w:val="SpecialCharTok"/>
+        </w:rPr>
+        <w:t xml:space="preserve">^</w:t>
+      </w:r>
+      <w:r>
+        <w:rPr>
+          <w:rStyle w:val="DecValTok"/>
+        </w:rPr>
+        <w:t xml:space="preserve">2</w:t>
+      </w:r>
+      <w:r>
+        <w:rPr>
+          <w:rStyle w:val="NormalTok"/>
+        </w:rPr>
+        <w:t xml:space="preserve">)</w:t>
+      </w:r>
+      <w:r>
+        <w:br/>
+      </w:r>
+      <w:r>
+        <w:rPr>
+          <w:rStyle w:val="NormalTok"/>
+        </w:rPr>
+        <w:t xml:space="preserve">sigma2</w:t>
+      </w:r>
+      <w:r>
+        <w:br/>
+      </w:r>
+      <w:r>
+        <w:rPr>
+          <w:rStyle w:val="CommentTok"/>
+        </w:rPr>
+        <w:t xml:space="preserve">#&gt; [1] 60.76274</w:t>
+      </w:r>
+    </w:p>
+    <w:p>
+      <w:pPr>
+        <w:pStyle w:val="FirstParagraph"/>
+      </w:pPr>
+      <w:r>
+        <w:t xml:space="preserve">The population</w:t>
+      </w:r>
+      <w:r>
+        <w:t xml:space="preserve"> </w:t>
+      </w:r>
+      <w:hyperlink r:id="rId23">
+        <w:r>
+          <w:rPr>
+            <w:rStyle w:val="Hyperlink"/>
+          </w:rPr>
+          <w:t xml:space="preserve">variance</w:t>
+        </w:r>
+      </w:hyperlink>
+      <w:r>
+        <w:t xml:space="preserve"> </w:t>
+      </w:r>
+      <w:r>
+        <w:t xml:space="preserve">of</w:t>
+      </w:r>
+      <w:r>
+        <w:t xml:space="preserve"> </w:t>
+      </w:r>
+      <w:r>
+        <w:rPr>
+          <w:rStyle w:val="VerbatimChar"/>
+        </w:rPr>
+        <w:t xml:space="preserve">mpg</w:t>
+      </w:r>
+      <w:r>
+        <w:t xml:space="preserve"> </w:t>
+      </w:r>
+      <w:r>
+        <w:t xml:space="preserve">is 60.8.</w:t>
+      </w:r>
+    </w:p>
+    <w:bookmarkEnd w:id="53"/>
+    <w:bookmarkStart w:id="54" w:name="exr-chebyshev-min-n"/>
+    <w:p>
+      <w:pPr>
+        <w:pStyle w:val="BodyText"/>
+      </w:pPr>
+      <w:r>
+        <w:rPr>
+          <w:b/>
+          <w:bCs/>
+        </w:rPr>
+        <w:t xml:space="preserve">Exercise 3 (Smallest sample size from Chebyshev’s bound)</w:t>
+      </w:r>
+      <w:r>
+        <w:t xml:space="preserve"> </w:t>
+      </w:r>
+      <w:r>
+        <w:t xml:space="preserve">With</w:t>
       </w:r>
       <w:r>
         <w:t xml:space="preserve"> </w:t>
       </w:r>
       <m:oMath>
+        <m:sSup>
+          <m:e>
+            <m:r>
+              <m:t>σ</m:t>
+            </m:r>
+          </m:e>
+          <m:sup>
+            <m:r>
+              <m:t>2</m:t>
+            </m:r>
+          </m:sup>
+        </m:sSup>
+      </m:oMath>
+      <w:r>
+        <w:t xml:space="preserve"> </w:t>
+      </w:r>
+      <w:r>
+        <w:t xml:space="preserve">from</w:t>
+      </w:r>
+      <w:r>
+        <w:t xml:space="preserve"> </w:t>
+      </w:r>
+      <w:hyperlink w:anchor="exr-chebyshev-variance">
+        <w:r>
+          <w:rPr>
+            <w:rStyle w:val="Hyperlink"/>
+          </w:rPr>
+          <w:t xml:space="preserve">Exercise 2</w:t>
+        </w:r>
+      </w:hyperlink>
+      <w:r>
+        <w:t xml:space="preserve">,</w:t>
+      </w:r>
+      <w:r>
+        <w:t xml:space="preserve"> </w:t>
+      </w:r>
+      <w:r>
+        <w:t xml:space="preserve">find the smallest</w:t>
+      </w:r>
+      <w:r>
+        <w:t xml:space="preserve"> </w:t>
+      </w:r>
+      <m:oMath>
         <m:r>
           <m:t>n</m:t>
         </m:r>
@@ -13148,7 +13983,24 @@
         <w:t xml:space="preserve"> </w:t>
       </w:r>
       <w:r>
-        <w:t xml:space="preserve">for which the bound in (a) guarantees</w:t>
+        <w:t xml:space="preserve">for which the bound in</w:t>
+      </w:r>
+      <w:r>
+        <w:t xml:space="preserve"> </w:t>
+      </w:r>
+      <w:hyperlink w:anchor="exr-chebyshev-sample-size">
+        <w:r>
+          <w:rPr>
+            <w:rStyle w:val="Hyperlink"/>
+          </w:rPr>
+          <w:t xml:space="preserve">Exercise 1</w:t>
+        </w:r>
+      </w:hyperlink>
+      <w:r>
+        <w:t xml:space="preserve"> </w:t>
+      </w:r>
+      <w:r>
+        <w:t xml:space="preserve">guarantees</w:t>
       </w:r>
       <w:r>
         <w:t xml:space="preserve"> </w:t>
@@ -13243,79 +14095,245 @@
         <w:t xml:space="preserve">.</w:t>
       </w:r>
     </w:p>
+    <w:bookmarkEnd w:id="54"/>
+    <w:bookmarkStart w:id="55" w:name="sol-chebyshev-min-n"/>
     <w:p>
       <w:pPr>
-        <w:numPr>
-          <w:ilvl w:val="0"/>
-          <w:numId w:val="1001"/>
-        </w:numPr>
+        <w:pStyle w:val="BodyText"/>
       </w:pPr>
       <w:r>
-        <w:t xml:space="preserve">Simulate 10,000 samples of that size drawn with replacement,</w:t>
-      </w:r>
-      <w:r>
-        <w:t xml:space="preserve"> </w:t>
-      </w:r>
-      <w:r>
-        <w:t xml:space="preserve">and count how many sample means miss</w:t>
+        <w:rPr>
+          <w:i/>
+          <w:iCs/>
+        </w:rPr>
+        <w:t xml:space="preserve">Solution 3</w:t>
+      </w:r>
+      <w:r>
+        <w:t xml:space="preserve">. </w:t>
+      </w:r>
+      <w:r>
+        <w:t xml:space="preserve">Setting</w:t>
       </w:r>
       <w:r>
         <w:t xml:space="preserve"> </w:t>
       </w:r>
       <m:oMath>
-        <m:r>
-          <m:t>μ</m:t>
+        <m:sSup>
+          <m:e>
+            <m:r>
+              <m:t>σ</m:t>
+            </m:r>
+          </m:e>
+          <m:sup>
+            <m:r>
+              <m:t>2</m:t>
+            </m:r>
+          </m:sup>
+        </m:sSup>
+        <m:r>
+          <m:rPr>
+            <m:sty m:val="p"/>
+          </m:rPr>
+          <m:t>/</m:t>
+        </m:r>
+        <m:r>
+          <m:rPr>
+            <m:sty m:val="p"/>
+          </m:rPr>
+          <m:t>(</m:t>
+        </m:r>
+        <m:r>
+          <m:t>n</m:t>
+        </m:r>
+        <m:r>
+          <m:rPr>
+            <m:sty m:val="p"/>
+          </m:rPr>
+          <m:t>⋅</m:t>
+        </m:r>
+        <m:sSup>
+          <m:e>
+            <m:r>
+              <m:t>1</m:t>
+            </m:r>
+          </m:e>
+          <m:sup>
+            <m:r>
+              <m:t>2</m:t>
+            </m:r>
+          </m:sup>
+        </m:sSup>
+        <m:r>
+          <m:rPr>
+            <m:sty m:val="p"/>
+          </m:rPr>
+          <m:t>)</m:t>
+        </m:r>
+        <m:r>
+          <m:rPr>
+            <m:sty m:val="p"/>
+          </m:rPr>
+          <m:t>≤</m:t>
+        </m:r>
+        <m:r>
+          <m:t>0.05</m:t>
         </m:r>
       </m:oMath>
       <w:r>
         <w:t xml:space="preserve"> </w:t>
       </w:r>
       <w:r>
-        <w:t xml:space="preserve">by 1 or more.</w:t>
-      </w:r>
-      <w:r>
-        <w:t xml:space="preserve"> </w:t>
-      </w:r>
-      <w:r>
-        <w:t xml:space="preserve">Why is the count so far below the 5% the bound allows?</w:t>
+        <w:t xml:space="preserve">gives</w:t>
+      </w:r>
+      <w:r>
+        <w:t xml:space="preserve"> </w:t>
+      </w:r>
+      <m:oMath>
+        <m:r>
+          <m:t>n</m:t>
+        </m:r>
+        <m:r>
+          <m:rPr>
+            <m:sty m:val="p"/>
+          </m:rPr>
+          <m:t>≥</m:t>
+        </m:r>
+        <m:r>
+          <m:t>20</m:t>
+        </m:r>
+        <m:sSup>
+          <m:e>
+            <m:r>
+              <m:t>σ</m:t>
+            </m:r>
+          </m:e>
+          <m:sup>
+            <m:r>
+              <m:t>2</m:t>
+            </m:r>
+          </m:sup>
+        </m:sSup>
+      </m:oMath>
+      <w:r>
+        <w:t xml:space="preserve">.</w:t>
       </w:r>
     </w:p>
-    <w:bookmarkEnd w:id="50"/>
-    <w:bookmarkStart w:id="51" w:name="sol-chebyshev-sample-size"/>
+    <w:p>
+      <w:pPr>
+        <w:pStyle w:val="SourceCode"/>
+      </w:pPr>
+      <w:r>
+        <w:rPr>
+          <w:rStyle w:val="NormalTok"/>
+        </w:rPr>
+        <w:t xml:space="preserve">n_min </w:t>
+      </w:r>
+      <w:r>
+        <w:rPr>
+          <w:rStyle w:val="OtherTok"/>
+        </w:rPr>
+        <w:t xml:space="preserve">&lt;-</w:t>
+      </w:r>
+      <w:r>
+        <w:rPr>
+          <w:rStyle w:val="NormalTok"/>
+        </w:rPr>
+        <w:t xml:space="preserve"> </w:t>
+      </w:r>
+      <w:r>
+        <w:rPr>
+          <w:rStyle w:val="FunctionTok"/>
+        </w:rPr>
+        <w:t xml:space="preserve">ceiling</w:t>
+      </w:r>
+      <w:r>
+        <w:rPr>
+          <w:rStyle w:val="NormalTok"/>
+        </w:rPr>
+        <w:t xml:space="preserve">(</w:t>
+      </w:r>
+      <w:r>
+        <w:rPr>
+          <w:rStyle w:val="DecValTok"/>
+        </w:rPr>
+        <w:t xml:space="preserve">20</w:t>
+      </w:r>
+      <w:r>
+        <w:rPr>
+          <w:rStyle w:val="NormalTok"/>
+        </w:rPr>
+        <w:t xml:space="preserve"> </w:t>
+      </w:r>
+      <w:r>
+        <w:rPr>
+          <w:rStyle w:val="SpecialCharTok"/>
+        </w:rPr>
+        <w:t xml:space="preserve">*</w:t>
+      </w:r>
+      <w:r>
+        <w:rPr>
+          <w:rStyle w:val="NormalTok"/>
+        </w:rPr>
+        <w:t xml:space="preserve"> sigma2)</w:t>
+      </w:r>
+      <w:r>
+        <w:br/>
+      </w:r>
+      <w:r>
+        <w:rPr>
+          <w:rStyle w:val="NormalTok"/>
+        </w:rPr>
+        <w:t xml:space="preserve">n_min</w:t>
+      </w:r>
+      <w:r>
+        <w:br/>
+      </w:r>
+      <w:r>
+        <w:rPr>
+          <w:rStyle w:val="CommentTok"/>
+        </w:rPr>
+        <w:t xml:space="preserve">#&gt; [1] 1216</w:t>
+      </w:r>
+    </w:p>
     <w:p>
       <w:pPr>
         <w:pStyle w:val="FirstParagraph"/>
       </w:pPr>
       <w:r>
-        <w:rPr>
-          <w:i/>
-          <w:iCs/>
-        </w:rPr>
-        <w:t xml:space="preserve">Solution 1</w:t>
-      </w:r>
-      <w:r>
-        <w:t xml:space="preserve">. </w:t>
-      </w:r>
-    </w:p>
-    <w:p>
-      <w:pPr>
-        <w:numPr>
-          <w:ilvl w:val="0"/>
-          <w:numId w:val="1002"/>
-        </w:numPr>
-      </w:pPr>
-      <w:r>
-        <w:t xml:space="preserve">By</w:t>
-      </w:r>
-      <w:r>
-        <w:t xml:space="preserve"> </w:t>
-      </w:r>
-      <w:hyperlink w:anchor="thm-sum-iid-moments">
+        <w:t xml:space="preserve">With</w:t>
+      </w:r>
+      <w:r>
+        <w:t xml:space="preserve"> </w:t>
+      </w:r>
+      <m:oMath>
+        <m:sSup>
+          <m:e>
+            <m:r>
+              <m:t>σ</m:t>
+            </m:r>
+          </m:e>
+          <m:sup>
+            <m:r>
+              <m:t>2</m:t>
+            </m:r>
+          </m:sup>
+        </m:sSup>
+      </m:oMath>
+      <w:r>
+        <w:t xml:space="preserve"> </w:t>
+      </w:r>
+      <w:r>
+        <w:t xml:space="preserve">from</w:t>
+      </w:r>
+      <w:r>
+        <w:t xml:space="preserve"> </w:t>
+      </w:r>
+      <w:hyperlink w:anchor="sol-chebyshev-variance">
         <w:r>
           <w:rPr>
             <w:rStyle w:val="Hyperlink"/>
           </w:rPr>
-          <w:t xml:space="preserve">Theorem 2</w:t>
+          <w:t xml:space="preserve">Solution 2</w:t>
         </w:r>
       </w:hyperlink>
       <w:r>
@@ -13326,38 +14344,7 @@
       </w:r>
       <m:oMath>
         <m:r>
-          <m:rPr>
-            <m:sty m:val="p"/>
-          </m:rPr>
-          <m:t>Var</m:t>
-        </m:r>
-        <m:r>
-          <m:t>​</m:t>
-        </m:r>
-        <m:d>
-          <m:dPr>
-            <m:begChr m:val="("/>
-            <m:sepChr m:val=""/>
-            <m:endChr m:val=")"/>
-            <m:grow/>
-          </m:dPr>
-          <m:e>
-            <m:sSub>
-              <m:e>
-                <m:r>
-                  <m:t>S</m:t>
-                </m:r>
-              </m:e>
-              <m:sub>
-                <m:r>
-                  <m:t>n</m:t>
-                </m:r>
-              </m:sub>
-            </m:sSub>
-          </m:e>
-        </m:d>
-        <m:r>
-          <m:t>​</m:t>
+          <m:t>n</m:t>
         </m:r>
         <m:r>
           <m:rPr>
@@ -13366,113 +14353,69 @@
           <m:t>=</m:t>
         </m:r>
         <m:r>
-          <m:t>n</m:t>
-        </m:r>
-        <m:sSup>
-          <m:e>
-            <m:r>
-              <m:t>σ</m:t>
-            </m:r>
-          </m:e>
-          <m:sup>
-            <m:r>
-              <m:t>2</m:t>
-            </m:r>
-          </m:sup>
-        </m:sSup>
+          <m:t>1216</m:t>
+        </m:r>
       </m:oMath>
       <w:r>
         <w:t xml:space="preserve"> </w:t>
       </w:r>
       <w:r>
-        <w:t xml:space="preserve">for</w:t>
-      </w:r>
-      <w:r>
-        <w:t xml:space="preserve"> </w:t>
-      </w:r>
-      <m:oMath>
-        <m:sSub>
-          <m:e>
-            <m:r>
-              <m:t>S</m:t>
-            </m:r>
-          </m:e>
-          <m:sub>
-            <m:r>
-              <m:t>n</m:t>
-            </m:r>
-          </m:sub>
-        </m:sSub>
-        <m:limUpp>
-          <m:e>
-            <m:r>
-              <m:rPr>
-                <m:sty m:val="p"/>
-              </m:rPr>
-              <m:t>=</m:t>
-            </m:r>
-          </m:e>
-          <m:lim>
-            <m:r>
-              <m:rPr>
-                <m:nor/>
-                <m:sty m:val="p"/>
-              </m:rPr>
-              <m:t>def</m:t>
-            </m:r>
-          </m:lim>
-        </m:limUpp>
-        <m:nary>
-          <m:naryPr>
-            <m:chr m:val="∑"/>
-            <m:limLoc m:val="undOvr"/>
-            <m:subHide m:val="off"/>
-            <m:supHide m:val="off"/>
-          </m:naryPr>
-          <m:sub>
-            <m:r>
-              <m:t>i</m:t>
-            </m:r>
-            <m:r>
-              <m:rPr>
-                <m:sty m:val="p"/>
-              </m:rPr>
-              <m:t>=</m:t>
-            </m:r>
-            <m:r>
-              <m:t>1</m:t>
-            </m:r>
-          </m:sub>
-          <m:sup>
-            <m:r>
-              <m:t>n</m:t>
-            </m:r>
-          </m:sup>
-          <m:e>
-            <m:sSub>
-              <m:e>
-                <m:r>
-                  <m:t>X</m:t>
-                </m:r>
-              </m:e>
-              <m:sub>
-                <m:r>
-                  <m:t>i</m:t>
-                </m:r>
-              </m:sub>
-            </m:sSub>
-          </m:e>
-        </m:nary>
-      </m:oMath>
-      <w:r>
-        <w:t xml:space="preserve">,</w:t>
-      </w:r>
-      <w:r>
-        <w:t xml:space="preserve"> </w:t>
-      </w:r>
-      <w:r>
-        <w:t xml:space="preserve">so</w:t>
-      </w:r>
+        <w:t xml:space="preserve">cars suffice.</w:t>
+      </w:r>
+    </w:p>
+    <w:bookmarkEnd w:id="55"/>
+    <w:bookmarkStart w:id="57" w:name="exr-chebyshev-simulation"/>
+    <w:p>
+      <w:pPr>
+        <w:pStyle w:val="BodyText"/>
+      </w:pPr>
+      <w:r>
+        <w:rPr>
+          <w:b/>
+          <w:bCs/>
+        </w:rPr>
+        <w:t xml:space="preserve">Exercise 4 (Simulated misses of the sample mean)</w:t>
+      </w:r>
+      <w:r>
+        <w:t xml:space="preserve"> </w:t>
+      </w:r>
+      <w:r>
+        <w:t xml:space="preserve">Draw 10,000 samples of the size from</w:t>
+      </w:r>
+      <w:r>
+        <w:t xml:space="preserve"> </w:t>
+      </w:r>
+      <w:hyperlink w:anchor="exr-chebyshev-min-n">
+        <w:r>
+          <w:rPr>
+            <w:rStyle w:val="Hyperlink"/>
+          </w:rPr>
+          <w:t xml:space="preserve">Exercise 3</w:t>
+        </w:r>
+      </w:hyperlink>
+      <w:r>
+        <w:t xml:space="preserve"> </w:t>
+      </w:r>
+      <w:r>
+        <w:t xml:space="preserve">with replacement,</w:t>
+      </w:r>
+      <w:r>
+        <w:t xml:space="preserve"> </w:t>
+      </w:r>
+      <w:r>
+        <w:t xml:space="preserve">and report how many of the sample</w:t>
+      </w:r>
+      <w:r>
+        <w:t xml:space="preserve"> </w:t>
+      </w:r>
+      <w:hyperlink r:id="rId56">
+        <w:r>
+          <w:rPr>
+            <w:rStyle w:val="Hyperlink"/>
+          </w:rPr>
+          <w:t xml:space="preserve">means</w:t>
+        </w:r>
+      </w:hyperlink>
       <w:r>
         <w:t xml:space="preserve"> </w:t>
       </w:r>
@@ -13496,39 +14439,12 @@
             </m:r>
           </m:sub>
         </m:sSub>
-        <m:r>
-          <m:rPr>
-            <m:sty m:val="p"/>
-          </m:rPr>
-          <m:t>=</m:t>
-        </m:r>
-        <m:sSub>
-          <m:e>
-            <m:r>
-              <m:t>S</m:t>
-            </m:r>
-          </m:e>
-          <m:sub>
-            <m:r>
-              <m:t>n</m:t>
-            </m:r>
-          </m:sub>
-        </m:sSub>
-        <m:r>
-          <m:rPr>
-            <m:sty m:val="p"/>
-          </m:rPr>
-          <m:t>/</m:t>
-        </m:r>
-        <m:r>
-          <m:t>n</m:t>
-        </m:r>
       </m:oMath>
       <w:r>
         <w:t xml:space="preserve"> </w:t>
       </w:r>
       <w:r>
-        <w:t xml:space="preserve">has mean</w:t>
+        <w:t xml:space="preserve">miss</w:t>
       </w:r>
       <w:r>
         <w:t xml:space="preserve"> </w:t>
@@ -13542,417 +14458,24 @@
         <w:t xml:space="preserve"> </w:t>
       </w:r>
       <w:r>
-        <w:t xml:space="preserve">and variance</w:t>
-      </w:r>
-      <w:r>
-        <w:t xml:space="preserve"> </w:t>
-      </w:r>
-      <m:oMath>
-        <m:sSup>
-          <m:e>
-            <m:r>
-              <m:t>σ</m:t>
-            </m:r>
-          </m:e>
-          <m:sup>
-            <m:r>
-              <m:t>2</m:t>
-            </m:r>
-          </m:sup>
-        </m:sSup>
-        <m:r>
-          <m:rPr>
-            <m:sty m:val="p"/>
-          </m:rPr>
-          <m:t>/</m:t>
-        </m:r>
-        <m:r>
-          <m:t>n</m:t>
-        </m:r>
-      </m:oMath>
-      <w:r>
-        <w:t xml:space="preserve"> </w:t>
-      </w:r>
-      <w:r>
-        <w:t xml:space="preserve">(a constant factor</w:t>
-      </w:r>
-      <w:r>
-        <w:t xml:space="preserve"> </w:t>
-      </w:r>
-      <m:oMath>
-        <m:r>
-          <m:t>c</m:t>
-        </m:r>
-      </m:oMath>
-      <w:r>
-        <w:t xml:space="preserve"> </w:t>
-      </w:r>
-      <w:r>
-        <w:t xml:space="preserve">scales a variance by</w:t>
-      </w:r>
-      <w:r>
-        <w:t xml:space="preserve"> </w:t>
-      </w:r>
-      <m:oMath>
-        <m:sSup>
-          <m:e>
-            <m:r>
-              <m:t>c</m:t>
-            </m:r>
-          </m:e>
-          <m:sup>
-            <m:r>
-              <m:t>2</m:t>
-            </m:r>
-          </m:sup>
-        </m:sSup>
-      </m:oMath>
-      <w:r>
-        <w:t xml:space="preserve">).</w:t>
-      </w:r>
-      <w:r>
-        <w:t xml:space="preserve"> </w:t>
-      </w:r>
-      <w:r>
-        <w:t xml:space="preserve">Apply</w:t>
-      </w:r>
-      <w:r>
-        <w:t xml:space="preserve"> </w:t>
-      </w:r>
-      <w:hyperlink w:anchor="thm-chebyshev">
-        <w:r>
-          <w:rPr>
-            <w:rStyle w:val="Hyperlink"/>
-          </w:rPr>
-          <w:t xml:space="preserve">Theorem 4</w:t>
-        </w:r>
-      </w:hyperlink>
-      <w:r>
-        <w:t xml:space="preserve"> </w:t>
-      </w:r>
-      <w:r>
-        <w:t xml:space="preserve">to</w:t>
-      </w:r>
-      <w:r>
-        <w:t xml:space="preserve"> </w:t>
-      </w:r>
-      <m:oMath>
-        <m:sSub>
-          <m:e>
-            <m:acc>
-              <m:accPr>
-                <m:chr m:val="‾"/>
-              </m:accPr>
-              <m:e>
-                <m:r>
-                  <m:t>X</m:t>
-                </m:r>
-              </m:e>
-            </m:acc>
-          </m:e>
-          <m:sub>
-            <m:r>
-              <m:t>n</m:t>
-            </m:r>
-          </m:sub>
-        </m:sSub>
-      </m:oMath>
-      <w:r>
-        <w:t xml:space="preserve"> </w:t>
-      </w:r>
-      <w:r>
-        <w:t xml:space="preserve">with</w:t>
-      </w:r>
-      <w:r>
-        <w:t xml:space="preserve"> </w:t>
-      </w:r>
-      <m:oMath>
-        <m:r>
-          <m:t>k</m:t>
-        </m:r>
-        <m:r>
-          <m:t>σ</m:t>
-        </m:r>
-        <m:r>
-          <m:rPr>
-            <m:sty m:val="p"/>
-          </m:rPr>
-          <m:t>/</m:t>
-        </m:r>
-        <m:rad>
-          <m:radPr>
-            <m:degHide m:val="on"/>
-          </m:radPr>
-          <m:deg/>
-          <m:e>
-            <m:r>
-              <m:t>n</m:t>
-            </m:r>
-          </m:e>
-        </m:rad>
-        <m:r>
-          <m:rPr>
-            <m:sty m:val="p"/>
-          </m:rPr>
-          <m:t>=</m:t>
-        </m:r>
-        <m:r>
-          <m:t>ϵ</m:t>
-        </m:r>
-      </m:oMath>
-      <w:r>
-        <w:t xml:space="preserve">,</w:t>
-      </w:r>
-      <w:r>
-        <w:t xml:space="preserve"> </w:t>
-      </w:r>
-      <w:r>
-        <w:t xml:space="preserve">that is,</w:t>
-      </w:r>
-      <w:r>
-        <w:t xml:space="preserve"> </w:t>
-      </w:r>
-      <m:oMath>
-        <m:r>
-          <m:t>k</m:t>
-        </m:r>
-        <m:r>
-          <m:rPr>
-            <m:sty m:val="p"/>
-          </m:rPr>
-          <m:t>=</m:t>
-        </m:r>
-        <m:r>
-          <m:t>ϵ</m:t>
-        </m:r>
-        <m:rad>
-          <m:radPr>
-            <m:degHide m:val="on"/>
-          </m:radPr>
-          <m:deg/>
-          <m:e>
-            <m:r>
-              <m:t>n</m:t>
-            </m:r>
-          </m:e>
-        </m:rad>
-        <m:r>
-          <m:rPr>
-            <m:sty m:val="p"/>
-          </m:rPr>
-          <m:t>/</m:t>
-        </m:r>
-        <m:r>
-          <m:t>σ</m:t>
-        </m:r>
-      </m:oMath>
-      <w:r>
-        <w:t xml:space="preserve">, so</w:t>
-      </w:r>
-      <w:r>
-        <w:t xml:space="preserve"> </w:t>
-      </w:r>
-      <m:oMath>
-        <m:r>
-          <m:t>1</m:t>
-        </m:r>
-        <m:r>
-          <m:rPr>
-            <m:sty m:val="p"/>
-          </m:rPr>
-          <m:t>/</m:t>
-        </m:r>
-        <m:sSup>
-          <m:e>
-            <m:r>
-              <m:t>k</m:t>
-            </m:r>
-          </m:e>
-          <m:sup>
-            <m:r>
-              <m:t>2</m:t>
-            </m:r>
-          </m:sup>
-        </m:sSup>
-        <m:r>
-          <m:rPr>
-            <m:sty m:val="p"/>
-          </m:rPr>
-          <m:t>=</m:t>
-        </m:r>
-        <m:sSup>
-          <m:e>
-            <m:r>
-              <m:t>σ</m:t>
-            </m:r>
-          </m:e>
-          <m:sup>
-            <m:r>
-              <m:t>2</m:t>
-            </m:r>
-          </m:sup>
-        </m:sSup>
-        <m:r>
-          <m:rPr>
-            <m:sty m:val="p"/>
-          </m:rPr>
-          <m:t>/</m:t>
-        </m:r>
-        <m:r>
-          <m:rPr>
-            <m:sty m:val="p"/>
-          </m:rPr>
-          <m:t>(</m:t>
-        </m:r>
-        <m:r>
-          <m:t>n</m:t>
-        </m:r>
-        <m:sSup>
-          <m:e>
-            <m:r>
-              <m:t>ϵ</m:t>
-            </m:r>
-          </m:e>
-          <m:sup>
-            <m:r>
-              <m:t>2</m:t>
-            </m:r>
-          </m:sup>
-        </m:sSup>
-        <m:r>
-          <m:rPr>
-            <m:sty m:val="p"/>
-          </m:rPr>
-          <m:t>)</m:t>
-        </m:r>
-      </m:oMath>
-      <w:r>
-        <w:t xml:space="preserve">.</w:t>
+        <w:t xml:space="preserve">by 1 or more.</w:t>
       </w:r>
     </w:p>
+    <w:bookmarkEnd w:id="57"/>
+    <w:bookmarkStart w:id="58" w:name="sol-chebyshev-simulation"/>
     <w:p>
       <w:pPr>
-        <w:numPr>
-          <w:ilvl w:val="0"/>
-          <w:numId w:val="1002"/>
-        </w:numPr>
+        <w:pStyle w:val="BodyText"/>
       </w:pPr>
       <w:r>
-        <w:t xml:space="preserve">Setting</w:t>
-      </w:r>
-      <w:r>
-        <w:t xml:space="preserve"> </w:t>
-      </w:r>
-      <m:oMath>
-        <m:sSup>
-          <m:e>
-            <m:r>
-              <m:t>σ</m:t>
-            </m:r>
-          </m:e>
-          <m:sup>
-            <m:r>
-              <m:t>2</m:t>
-            </m:r>
-          </m:sup>
-        </m:sSup>
-        <m:r>
-          <m:rPr>
-            <m:sty m:val="p"/>
-          </m:rPr>
-          <m:t>/</m:t>
-        </m:r>
-        <m:r>
-          <m:rPr>
-            <m:sty m:val="p"/>
-          </m:rPr>
-          <m:t>(</m:t>
-        </m:r>
-        <m:r>
-          <m:t>n</m:t>
-        </m:r>
-        <m:r>
-          <m:rPr>
-            <m:sty m:val="p"/>
-          </m:rPr>
-          <m:t>⋅</m:t>
-        </m:r>
-        <m:sSup>
-          <m:e>
-            <m:r>
-              <m:t>1</m:t>
-            </m:r>
-          </m:e>
-          <m:sup>
-            <m:r>
-              <m:t>2</m:t>
-            </m:r>
-          </m:sup>
-        </m:sSup>
-        <m:r>
-          <m:rPr>
-            <m:sty m:val="p"/>
-          </m:rPr>
-          <m:t>)</m:t>
-        </m:r>
-        <m:r>
-          <m:rPr>
-            <m:sty m:val="p"/>
-          </m:rPr>
-          <m:t>≤</m:t>
-        </m:r>
-        <m:r>
-          <m:t>0.05</m:t>
-        </m:r>
-      </m:oMath>
-      <w:r>
-        <w:t xml:space="preserve"> </w:t>
-      </w:r>
-      <w:r>
-        <w:t xml:space="preserve">gives</w:t>
-      </w:r>
-      <w:r>
-        <w:t xml:space="preserve"> </w:t>
-      </w:r>
-      <m:oMath>
-        <m:r>
-          <m:t>n</m:t>
-        </m:r>
-        <m:r>
-          <m:rPr>
-            <m:sty m:val="p"/>
-          </m:rPr>
-          <m:t>≥</m:t>
-        </m:r>
-        <m:r>
-          <m:t>20</m:t>
-        </m:r>
-        <m:sSup>
-          <m:e>
-            <m:r>
-              <m:t>σ</m:t>
-            </m:r>
-          </m:e>
-          <m:sup>
-            <m:r>
-              <m:t>2</m:t>
-            </m:r>
-          </m:sup>
-        </m:sSup>
-      </m:oMath>
-      <w:r>
-        <w:t xml:space="preserve">.</w:t>
-      </w:r>
-    </w:p>
-    <w:p>
-      <w:pPr>
-        <w:numPr>
-          <w:ilvl w:val="0"/>
-          <w:numId w:val="1002"/>
-        </w:numPr>
-      </w:pPr>
-      <w:r>
-        <w:t xml:space="preserve">See the code below.</w:t>
+        <w:rPr>
+          <w:i/>
+          <w:iCs/>
+        </w:rPr>
+        <w:t xml:space="preserve">Solution 4</w:t>
+      </w:r>
+      <w:r>
+        <w:t xml:space="preserve">. </w:t>
       </w:r>
     </w:p>
     <w:p>
@@ -13961,9 +14484,54 @@
       </w:pPr>
       <w:r>
         <w:rPr>
-          <w:rStyle w:val="NormalTok"/>
-        </w:rPr>
-        <w:t xml:space="preserve">mpg </w:t>
+          <w:rStyle w:val="CommentTok"/>
+        </w:rPr>
+        <w:t xml:space="preserve"># Uses mpg and mu from sol-chebyshev-variance,</w:t>
+      </w:r>
+      <w:r>
+        <w:br/>
+      </w:r>
+      <w:r>
+        <w:rPr>
+          <w:rStyle w:val="CommentTok"/>
+        </w:rPr>
+        <w:t xml:space="preserve"># and n_min from sol-chebyshev-min-n.</w:t>
+      </w:r>
+      <w:r>
+        <w:br/>
+      </w:r>
+      <w:r>
+        <w:rPr>
+          <w:rStyle w:val="FunctionTok"/>
+        </w:rPr>
+        <w:t xml:space="preserve">set.seed</w:t>
+      </w:r>
+      <w:r>
+        <w:rPr>
+          <w:rStyle w:val="NormalTok"/>
+        </w:rPr>
+        <w:t xml:space="preserve">(</w:t>
+      </w:r>
+      <w:r>
+        <w:rPr>
+          <w:rStyle w:val="DecValTok"/>
+        </w:rPr>
+        <w:t xml:space="preserve">571</w:t>
+      </w:r>
+      <w:r>
+        <w:rPr>
+          <w:rStyle w:val="NormalTok"/>
+        </w:rPr>
+        <w:t xml:space="preserve">)</w:t>
+      </w:r>
+      <w:r>
+        <w:br/>
+      </w:r>
+      <w:r>
+        <w:rPr>
+          <w:rStyle w:val="NormalTok"/>
+        </w:rPr>
+        <w:t xml:space="preserve">xbar </w:t>
       </w:r>
       <w:r>
         <w:rPr>
@@ -13981,7 +14549,7 @@
         <w:rPr>
           <w:rStyle w:val="FunctionTok"/>
         </w:rPr>
-        <w:t xml:space="preserve">read.csv</w:t>
+        <w:t xml:space="preserve">replicate</w:t>
       </w:r>
       <w:r>
         <w:rPr>
@@ -13991,9 +14559,138 @@
       </w:r>
       <w:r>
         <w:rPr>
-          <w:rStyle w:val="StringTok"/>
-        </w:rPr>
-        <w:t xml:space="preserve">"data/auto.csv"</w:t>
+          <w:rStyle w:val="DecValTok"/>
+        </w:rPr>
+        <w:t xml:space="preserve">10000</w:t>
+      </w:r>
+      <w:r>
+        <w:rPr>
+          <w:rStyle w:val="NormalTok"/>
+        </w:rPr>
+        <w:t xml:space="preserve">, </w:t>
+      </w:r>
+      <w:r>
+        <w:rPr>
+          <w:rStyle w:val="FunctionTok"/>
+        </w:rPr>
+        <w:t xml:space="preserve">mean</w:t>
+      </w:r>
+      <w:r>
+        <w:rPr>
+          <w:rStyle w:val="NormalTok"/>
+        </w:rPr>
+        <w:t xml:space="preserve">(</w:t>
+      </w:r>
+      <w:r>
+        <w:rPr>
+          <w:rStyle w:val="FunctionTok"/>
+        </w:rPr>
+        <w:t xml:space="preserve">sample</w:t>
+      </w:r>
+      <w:r>
+        <w:rPr>
+          <w:rStyle w:val="NormalTok"/>
+        </w:rPr>
+        <w:t xml:space="preserve">(mpg, n_min, </w:t>
+      </w:r>
+      <w:r>
+        <w:rPr>
+          <w:rStyle w:val="AttributeTok"/>
+        </w:rPr>
+        <w:t xml:space="preserve">replace =</w:t>
+      </w:r>
+      <w:r>
+        <w:rPr>
+          <w:rStyle w:val="NormalTok"/>
+        </w:rPr>
+        <w:t xml:space="preserve"> </w:t>
+      </w:r>
+      <w:r>
+        <w:rPr>
+          <w:rStyle w:val="ConstantTok"/>
+        </w:rPr>
+        <w:t xml:space="preserve">TRUE</w:t>
+      </w:r>
+      <w:r>
+        <w:rPr>
+          <w:rStyle w:val="NormalTok"/>
+        </w:rPr>
+        <w:t xml:space="preserve">)))</w:t>
+      </w:r>
+      <w:r>
+        <w:br/>
+      </w:r>
+      <w:r>
+        <w:rPr>
+          <w:rStyle w:val="NormalTok"/>
+        </w:rPr>
+        <w:t xml:space="preserve">misses </w:t>
+      </w:r>
+      <w:r>
+        <w:rPr>
+          <w:rStyle w:val="OtherTok"/>
+        </w:rPr>
+        <w:t xml:space="preserve">&lt;-</w:t>
+      </w:r>
+      <w:r>
+        <w:rPr>
+          <w:rStyle w:val="NormalTok"/>
+        </w:rPr>
+        <w:t xml:space="preserve"> </w:t>
+      </w:r>
+      <w:r>
+        <w:rPr>
+          <w:rStyle w:val="FunctionTok"/>
+        </w:rPr>
+        <w:t xml:space="preserve">sum</w:t>
+      </w:r>
+      <w:r>
+        <w:rPr>
+          <w:rStyle w:val="NormalTok"/>
+        </w:rPr>
+        <w:t xml:space="preserve">(</w:t>
+      </w:r>
+      <w:r>
+        <w:rPr>
+          <w:rStyle w:val="FunctionTok"/>
+        </w:rPr>
+        <w:t xml:space="preserve">abs</w:t>
+      </w:r>
+      <w:r>
+        <w:rPr>
+          <w:rStyle w:val="NormalTok"/>
+        </w:rPr>
+        <w:t xml:space="preserve">(xbar </w:t>
+      </w:r>
+      <w:r>
+        <w:rPr>
+          <w:rStyle w:val="SpecialCharTok"/>
+        </w:rPr>
+        <w:t xml:space="preserve">-</w:t>
+      </w:r>
+      <w:r>
+        <w:rPr>
+          <w:rStyle w:val="NormalTok"/>
+        </w:rPr>
+        <w:t xml:space="preserve"> mu) </w:t>
+      </w:r>
+      <w:r>
+        <w:rPr>
+          <w:rStyle w:val="SpecialCharTok"/>
+        </w:rPr>
+        <w:t xml:space="preserve">&gt;=</w:t>
+      </w:r>
+      <w:r>
+        <w:rPr>
+          <w:rStyle w:val="NormalTok"/>
+        </w:rPr>
+        <w:t xml:space="preserve"> </w:t>
+      </w:r>
+      <w:r>
+        <w:rPr>
+          <w:rStyle w:val="DecValTok"/>
+        </w:rPr>
+        <w:t xml:space="preserve">1</w:t>
       </w:r>
       <w:r>
         <w:rPr>
@@ -14002,565 +14699,22 @@
         <w:t xml:space="preserve">)</w:t>
       </w:r>
       <w:r>
-        <w:rPr>
-          <w:rStyle w:val="SpecialCharTok"/>
-        </w:rPr>
-        <w:t xml:space="preserve">$</w:t>
-      </w:r>
-      <w:r>
-        <w:rPr>
-          <w:rStyle w:val="NormalTok"/>
-        </w:rPr>
-        <w:t xml:space="preserve">mpg</w:t>
-      </w:r>
-      <w:r>
         <w:br/>
       </w:r>
       <w:r>
         <w:rPr>
           <w:rStyle w:val="NormalTok"/>
         </w:rPr>
-        <w:t xml:space="preserve">mu </w:t>
-      </w:r>
-      <w:r>
-        <w:rPr>
-          <w:rStyle w:val="OtherTok"/>
-        </w:rPr>
-        <w:t xml:space="preserve">&lt;-</w:t>
-      </w:r>
-      <w:r>
-        <w:rPr>
-          <w:rStyle w:val="NormalTok"/>
-        </w:rPr>
-        <w:t xml:space="preserve"> </w:t>
-      </w:r>
-      <w:r>
-        <w:rPr>
-          <w:rStyle w:val="FunctionTok"/>
-        </w:rPr>
-        <w:t xml:space="preserve">mean</w:t>
-      </w:r>
-      <w:r>
-        <w:rPr>
-          <w:rStyle w:val="NormalTok"/>
-        </w:rPr>
-        <w:t xml:space="preserve">(mpg)</w:t>
+        <w:t xml:space="preserve">misses</w:t>
       </w:r>
       <w:r>
         <w:br/>
       </w:r>
       <w:r>
         <w:rPr>
-          <w:rStyle w:val="NormalTok"/>
-        </w:rPr>
-        <w:t xml:space="preserve">sigma2 </w:t>
-      </w:r>
-      <w:r>
-        <w:rPr>
-          <w:rStyle w:val="OtherTok"/>
-        </w:rPr>
-        <w:t xml:space="preserve">&lt;-</w:t>
-      </w:r>
-      <w:r>
-        <w:rPr>
-          <w:rStyle w:val="NormalTok"/>
-        </w:rPr>
-        <w:t xml:space="preserve"> </w:t>
-      </w:r>
-      <w:r>
-        <w:rPr>
-          <w:rStyle w:val="FunctionTok"/>
-        </w:rPr>
-        <w:t xml:space="preserve">mean</w:t>
-      </w:r>
-      <w:r>
-        <w:rPr>
-          <w:rStyle w:val="NormalTok"/>
-        </w:rPr>
-        <w:t xml:space="preserve">((mpg </w:t>
-      </w:r>
-      <w:r>
-        <w:rPr>
-          <w:rStyle w:val="SpecialCharTok"/>
-        </w:rPr>
-        <w:t xml:space="preserve">-</w:t>
-      </w:r>
-      <w:r>
-        <w:rPr>
-          <w:rStyle w:val="NormalTok"/>
-        </w:rPr>
-        <w:t xml:space="preserve"> mu)</w:t>
-      </w:r>
-      <w:r>
-        <w:rPr>
-          <w:rStyle w:val="SpecialCharTok"/>
-        </w:rPr>
-        <w:t xml:space="preserve">^</w:t>
-      </w:r>
-      <w:r>
-        <w:rPr>
-          <w:rStyle w:val="DecValTok"/>
-        </w:rPr>
-        <w:t xml:space="preserve">2</w:t>
-      </w:r>
-      <w:r>
-        <w:rPr>
-          <w:rStyle w:val="NormalTok"/>
-        </w:rPr>
-        <w:t xml:space="preserve">)</w:t>
-      </w:r>
-      <w:r>
-        <w:br/>
-      </w:r>
-      <w:r>
-        <w:rPr>
-          <w:rStyle w:val="NormalTok"/>
-        </w:rPr>
-        <w:t xml:space="preserve">n_min </w:t>
-      </w:r>
-      <w:r>
-        <w:rPr>
-          <w:rStyle w:val="OtherTok"/>
-        </w:rPr>
-        <w:t xml:space="preserve">&lt;-</w:t>
-      </w:r>
-      <w:r>
-        <w:rPr>
-          <w:rStyle w:val="NormalTok"/>
-        </w:rPr>
-        <w:t xml:space="preserve"> </w:t>
-      </w:r>
-      <w:r>
-        <w:rPr>
-          <w:rStyle w:val="FunctionTok"/>
-        </w:rPr>
-        <w:t xml:space="preserve">ceiling</w:t>
-      </w:r>
-      <w:r>
-        <w:rPr>
-          <w:rStyle w:val="NormalTok"/>
-        </w:rPr>
-        <w:t xml:space="preserve">(</w:t>
-      </w:r>
-      <w:r>
-        <w:rPr>
-          <w:rStyle w:val="DecValTok"/>
-        </w:rPr>
-        <w:t xml:space="preserve">20</w:t>
-      </w:r>
-      <w:r>
-        <w:rPr>
-          <w:rStyle w:val="NormalTok"/>
-        </w:rPr>
-        <w:t xml:space="preserve"> </w:t>
-      </w:r>
-      <w:r>
-        <w:rPr>
-          <w:rStyle w:val="SpecialCharTok"/>
-        </w:rPr>
-        <w:t xml:space="preserve">*</w:t>
-      </w:r>
-      <w:r>
-        <w:rPr>
-          <w:rStyle w:val="NormalTok"/>
-        </w:rPr>
-        <w:t xml:space="preserve"> sigma2)</w:t>
-      </w:r>
-      <w:r>
-        <w:br/>
-      </w:r>
-      <w:r>
-        <w:br/>
-      </w:r>
-      <w:r>
-        <w:rPr>
-          <w:rStyle w:val="FunctionTok"/>
-        </w:rPr>
-        <w:t xml:space="preserve">set.seed</w:t>
-      </w:r>
-      <w:r>
-        <w:rPr>
-          <w:rStyle w:val="NormalTok"/>
-        </w:rPr>
-        <w:t xml:space="preserve">(</w:t>
-      </w:r>
-      <w:r>
-        <w:rPr>
-          <w:rStyle w:val="DecValTok"/>
-        </w:rPr>
-        <w:t xml:space="preserve">571</w:t>
-      </w:r>
-      <w:r>
-        <w:rPr>
-          <w:rStyle w:val="NormalTok"/>
-        </w:rPr>
-        <w:t xml:space="preserve">)</w:t>
-      </w:r>
-      <w:r>
-        <w:br/>
-      </w:r>
-      <w:r>
-        <w:rPr>
-          <w:rStyle w:val="NormalTok"/>
-        </w:rPr>
-        <w:t xml:space="preserve">xbar </w:t>
-      </w:r>
-      <w:r>
-        <w:rPr>
-          <w:rStyle w:val="OtherTok"/>
-        </w:rPr>
-        <w:t xml:space="preserve">&lt;-</w:t>
-      </w:r>
-      <w:r>
-        <w:rPr>
-          <w:rStyle w:val="NormalTok"/>
-        </w:rPr>
-        <w:t xml:space="preserve"> </w:t>
-      </w:r>
-      <w:r>
-        <w:rPr>
-          <w:rStyle w:val="FunctionTok"/>
-        </w:rPr>
-        <w:t xml:space="preserve">replicate</w:t>
-      </w:r>
-      <w:r>
-        <w:rPr>
-          <w:rStyle w:val="NormalTok"/>
-        </w:rPr>
-        <w:t xml:space="preserve">(</w:t>
-      </w:r>
-      <w:r>
-        <w:rPr>
-          <w:rStyle w:val="DecValTok"/>
-        </w:rPr>
-        <w:t xml:space="preserve">10000</w:t>
-      </w:r>
-      <w:r>
-        <w:rPr>
-          <w:rStyle w:val="NormalTok"/>
-        </w:rPr>
-        <w:t xml:space="preserve">, </w:t>
-      </w:r>
-      <w:r>
-        <w:rPr>
-          <w:rStyle w:val="FunctionTok"/>
-        </w:rPr>
-        <w:t xml:space="preserve">mean</w:t>
-      </w:r>
-      <w:r>
-        <w:rPr>
-          <w:rStyle w:val="NormalTok"/>
-        </w:rPr>
-        <w:t xml:space="preserve">(</w:t>
-      </w:r>
-      <w:r>
-        <w:rPr>
-          <w:rStyle w:val="FunctionTok"/>
-        </w:rPr>
-        <w:t xml:space="preserve">sample</w:t>
-      </w:r>
-      <w:r>
-        <w:rPr>
-          <w:rStyle w:val="NormalTok"/>
-        </w:rPr>
-        <w:t xml:space="preserve">(mpg, n_min, </w:t>
-      </w:r>
-      <w:r>
-        <w:rPr>
-          <w:rStyle w:val="AttributeTok"/>
-        </w:rPr>
-        <w:t xml:space="preserve">replace =</w:t>
-      </w:r>
-      <w:r>
-        <w:rPr>
-          <w:rStyle w:val="NormalTok"/>
-        </w:rPr>
-        <w:t xml:space="preserve"> </w:t>
-      </w:r>
-      <w:r>
-        <w:rPr>
-          <w:rStyle w:val="ConstantTok"/>
-        </w:rPr>
-        <w:t xml:space="preserve">TRUE</w:t>
-      </w:r>
-      <w:r>
-        <w:rPr>
-          <w:rStyle w:val="NormalTok"/>
-        </w:rPr>
-        <w:t xml:space="preserve">)))</w:t>
-      </w:r>
-      <w:r>
-        <w:br/>
-      </w:r>
-      <w:r>
-        <w:rPr>
-          <w:rStyle w:val="NormalTok"/>
-        </w:rPr>
-        <w:t xml:space="preserve">misses </w:t>
-      </w:r>
-      <w:r>
-        <w:rPr>
-          <w:rStyle w:val="OtherTok"/>
-        </w:rPr>
-        <w:t xml:space="preserve">&lt;-</w:t>
-      </w:r>
-      <w:r>
-        <w:rPr>
-          <w:rStyle w:val="NormalTok"/>
-        </w:rPr>
-        <w:t xml:space="preserve"> </w:t>
-      </w:r>
-      <w:r>
-        <w:rPr>
-          <w:rStyle w:val="FunctionTok"/>
-        </w:rPr>
-        <w:t xml:space="preserve">sum</w:t>
-      </w:r>
-      <w:r>
-        <w:rPr>
-          <w:rStyle w:val="NormalTok"/>
-        </w:rPr>
-        <w:t xml:space="preserve">(</w:t>
-      </w:r>
-      <w:r>
-        <w:rPr>
-          <w:rStyle w:val="FunctionTok"/>
-        </w:rPr>
-        <w:t xml:space="preserve">abs</w:t>
-      </w:r>
-      <w:r>
-        <w:rPr>
-          <w:rStyle w:val="NormalTok"/>
-        </w:rPr>
-        <w:t xml:space="preserve">(xbar </w:t>
-      </w:r>
-      <w:r>
-        <w:rPr>
-          <w:rStyle w:val="SpecialCharTok"/>
-        </w:rPr>
-        <w:t xml:space="preserve">-</w:t>
-      </w:r>
-      <w:r>
-        <w:rPr>
-          <w:rStyle w:val="NormalTok"/>
-        </w:rPr>
-        <w:t xml:space="preserve"> mu) </w:t>
-      </w:r>
-      <w:r>
-        <w:rPr>
-          <w:rStyle w:val="SpecialCharTok"/>
-        </w:rPr>
-        <w:t xml:space="preserve">&gt;=</w:t>
-      </w:r>
-      <w:r>
-        <w:rPr>
-          <w:rStyle w:val="NormalTok"/>
-        </w:rPr>
-        <w:t xml:space="preserve"> </w:t>
-      </w:r>
-      <w:r>
-        <w:rPr>
-          <w:rStyle w:val="DecValTok"/>
-        </w:rPr>
-        <w:t xml:space="preserve">1</w:t>
-      </w:r>
-      <w:r>
-        <w:rPr>
-          <w:rStyle w:val="NormalTok"/>
-        </w:rPr>
-        <w:t xml:space="preserve">)</w:t>
-      </w:r>
-      <w:r>
-        <w:br/>
-      </w:r>
-      <w:r>
-        <w:rPr>
-          <w:rStyle w:val="NormalTok"/>
-        </w:rPr>
-        <w:t xml:space="preserve">normal_approx </w:t>
-      </w:r>
-      <w:r>
-        <w:rPr>
-          <w:rStyle w:val="OtherTok"/>
-        </w:rPr>
-        <w:t xml:space="preserve">&lt;-</w:t>
-      </w:r>
-      <w:r>
-        <w:rPr>
-          <w:rStyle w:val="NormalTok"/>
-        </w:rPr>
-        <w:t xml:space="preserve"> </w:t>
-      </w:r>
-      <w:r>
-        <w:rPr>
-          <w:rStyle w:val="DecValTok"/>
-        </w:rPr>
-        <w:t xml:space="preserve">2</w:t>
-      </w:r>
-      <w:r>
-        <w:rPr>
-          <w:rStyle w:val="NormalTok"/>
-        </w:rPr>
-        <w:t xml:space="preserve"> </w:t>
-      </w:r>
-      <w:r>
-        <w:rPr>
-          <w:rStyle w:val="SpecialCharTok"/>
-        </w:rPr>
-        <w:t xml:space="preserve">*</w:t>
-      </w:r>
-      <w:r>
-        <w:rPr>
-          <w:rStyle w:val="NormalTok"/>
-        </w:rPr>
-        <w:t xml:space="preserve"> </w:t>
-      </w:r>
-      <w:r>
-        <w:rPr>
-          <w:rStyle w:val="FunctionTok"/>
-        </w:rPr>
-        <w:t xml:space="preserve">pnorm</w:t>
-      </w:r>
-      <w:r>
-        <w:rPr>
-          <w:rStyle w:val="NormalTok"/>
-        </w:rPr>
-        <w:t xml:space="preserve">(</w:t>
-      </w:r>
-      <w:r>
-        <w:rPr>
-          <w:rStyle w:val="SpecialCharTok"/>
-        </w:rPr>
-        <w:t xml:space="preserve">-</w:t>
-      </w:r>
-      <w:r>
-        <w:rPr>
-          <w:rStyle w:val="DecValTok"/>
-        </w:rPr>
-        <w:t xml:space="preserve">1</w:t>
-      </w:r>
-      <w:r>
-        <w:rPr>
-          <w:rStyle w:val="NormalTok"/>
-        </w:rPr>
-        <w:t xml:space="preserve"> </w:t>
-      </w:r>
-      <w:r>
-        <w:rPr>
-          <w:rStyle w:val="SpecialCharTok"/>
-        </w:rPr>
-        <w:t xml:space="preserve">/</w:t>
-      </w:r>
-      <w:r>
-        <w:rPr>
-          <w:rStyle w:val="NormalTok"/>
-        </w:rPr>
-        <w:t xml:space="preserve"> </w:t>
-      </w:r>
-      <w:r>
-        <w:rPr>
-          <w:rStyle w:val="FunctionTok"/>
-        </w:rPr>
-        <w:t xml:space="preserve">sqrt</w:t>
-      </w:r>
-      <w:r>
-        <w:rPr>
-          <w:rStyle w:val="NormalTok"/>
-        </w:rPr>
-        <w:t xml:space="preserve">(sigma2 </w:t>
-      </w:r>
-      <w:r>
-        <w:rPr>
-          <w:rStyle w:val="SpecialCharTok"/>
-        </w:rPr>
-        <w:t xml:space="preserve">/</w:t>
-      </w:r>
-      <w:r>
-        <w:rPr>
-          <w:rStyle w:val="NormalTok"/>
-        </w:rPr>
-        <w:t xml:space="preserve"> n_min))</w:t>
-      </w:r>
-      <w:r>
-        <w:br/>
-      </w:r>
-      <w:r>
-        <w:rPr>
-          <w:rStyle w:val="FunctionTok"/>
-        </w:rPr>
-        <w:t xml:space="preserve">c</w:t>
-      </w:r>
-      <w:r>
-        <w:rPr>
-          <w:rStyle w:val="NormalTok"/>
-        </w:rPr>
-        <w:t xml:space="preserve">(</w:t>
-      </w:r>
-      <w:r>
-        <w:rPr>
-          <w:rStyle w:val="AttributeTok"/>
-        </w:rPr>
-        <w:t xml:space="preserve">variance =</w:t>
-      </w:r>
-      <w:r>
-        <w:rPr>
-          <w:rStyle w:val="NormalTok"/>
-        </w:rPr>
-        <w:t xml:space="preserve"> sigma2, </w:t>
-      </w:r>
-      <w:r>
-        <w:rPr>
-          <w:rStyle w:val="AttributeTok"/>
-        </w:rPr>
-        <w:t xml:space="preserve">n =</w:t>
-      </w:r>
-      <w:r>
-        <w:rPr>
-          <w:rStyle w:val="NormalTok"/>
-        </w:rPr>
-        <w:t xml:space="preserve"> n_min, </w:t>
-      </w:r>
-      <w:r>
-        <w:rPr>
-          <w:rStyle w:val="AttributeTok"/>
-        </w:rPr>
-        <w:t xml:space="preserve">misses =</w:t>
-      </w:r>
-      <w:r>
-        <w:rPr>
-          <w:rStyle w:val="NormalTok"/>
-        </w:rPr>
-        <w:t xml:space="preserve"> misses, </w:t>
-      </w:r>
-      <w:r>
-        <w:rPr>
-          <w:rStyle w:val="AttributeTok"/>
-        </w:rPr>
-        <w:t xml:space="preserve">normal_approx =</w:t>
-      </w:r>
-      <w:r>
-        <w:rPr>
-          <w:rStyle w:val="NormalTok"/>
-        </w:rPr>
-        <w:t xml:space="preserve"> normal_approx)</w:t>
-      </w:r>
-      <w:r>
-        <w:br/>
-      </w:r>
-      <w:r>
-        <w:rPr>
           <w:rStyle w:val="CommentTok"/>
         </w:rPr>
-        <w:t xml:space="preserve">#&gt;      variance             n        misses normal_approx </w:t>
-      </w:r>
-      <w:r>
-        <w:br/>
-      </w:r>
-      <w:r>
-        <w:rPr>
-          <w:rStyle w:val="CommentTok"/>
-        </w:rPr>
-        <w:t xml:space="preserve">#&gt;  6.076274e+01  1.216000e+03  0.000000e+00  7.694705e-06</w:t>
+        <w:t xml:space="preserve">#&gt; [1] 0</w:t>
       </w:r>
     </w:p>
     <w:p>
@@ -14568,70 +14722,20 @@
         <w:pStyle w:val="FirstParagraph"/>
       </w:pPr>
       <w:r>
-        <w:t xml:space="preserve">The population variance of</w:t>
-      </w:r>
-      <w:r>
-        <w:t xml:space="preserve"> </w:t>
-      </w:r>
-      <w:r>
-        <w:rPr>
-          <w:rStyle w:val="VerbatimChar"/>
-        </w:rPr>
-        <w:t xml:space="preserve">mpg</w:t>
-      </w:r>
-      <w:r>
-        <w:t xml:space="preserve"> </w:t>
-      </w:r>
-      <w:r>
-        <w:t xml:space="preserve">is 60.8,</w:t>
-      </w:r>
-      <w:r>
-        <w:t xml:space="preserve"> </w:t>
-      </w:r>
-      <w:r>
-        <w:t xml:space="preserve">so</w:t>
+        <w:t xml:space="preserve">Out of 10,000 samples of that size, 0 sample means missed</w:t>
       </w:r>
       <w:r>
         <w:t xml:space="preserve"> </w:t>
       </w:r>
       <m:oMath>
         <m:r>
-          <m:t>n</m:t>
-        </m:r>
-        <m:r>
-          <m:rPr>
-            <m:sty m:val="p"/>
-          </m:rPr>
-          <m:t>=</m:t>
-        </m:r>
-        <m:r>
-          <m:t>1216</m:t>
+          <m:t>μ</m:t>
         </m:r>
       </m:oMath>
       <w:r>
         <w:t xml:space="preserve"> </w:t>
       </w:r>
       <w:r>
-        <w:t xml:space="preserve">cars suffice.</w:t>
-      </w:r>
-      <w:r>
-        <w:t xml:space="preserve"> </w:t>
-      </w:r>
-      <w:r>
-        <w:t xml:space="preserve">Out of 10,000 samples of that size, 0 sample means missed</w:t>
-      </w:r>
-      <w:r>
-        <w:t xml:space="preserve"> </w:t>
-      </w:r>
-      <m:oMath>
-        <m:r>
-          <m:t>μ</m:t>
-        </m:r>
-      </m:oMath>
-      <w:r>
-        <w:t xml:space="preserve"> </w:t>
-      </w:r>
-      <w:r>
         <w:t xml:space="preserve">by 1 or more,</w:t>
       </w:r>
       <w:r>
@@ -14640,12 +14744,259 @@
       <w:r>
         <w:t xml:space="preserve">against the 5% (500 samples) the bound allows.</w:t>
       </w:r>
-      <w:r>
-        <w:t xml:space="preserve"> </w:t>
-      </w:r>
-      <w:r>
-        <w:t xml:space="preserve">The bound is loose because the sample mean of this many cars is nearly normal</w:t>
-      </w:r>
+    </w:p>
+    <w:bookmarkEnd w:id="58"/>
+    <w:bookmarkStart w:id="59" w:name="exr-chebyshev-loose"/>
+    <w:p>
+      <w:pPr>
+        <w:pStyle w:val="BodyText"/>
+      </w:pPr>
+      <w:r>
+        <w:rPr>
+          <w:b/>
+          <w:bCs/>
+        </w:rPr>
+        <w:t xml:space="preserve">Exercise 5 (Why Chebyshev’s bound is loose here)</w:t>
+      </w:r>
+      <w:r>
+        <w:t xml:space="preserve"> </w:t>
+      </w:r>
+      <w:r>
+        <w:t xml:space="preserve">Explain why the count in</w:t>
+      </w:r>
+      <w:r>
+        <w:t xml:space="preserve"> </w:t>
+      </w:r>
+      <w:hyperlink w:anchor="exr-chebyshev-simulation">
+        <w:r>
+          <w:rPr>
+            <w:rStyle w:val="Hyperlink"/>
+          </w:rPr>
+          <w:t xml:space="preserve">Exercise 4</w:t>
+        </w:r>
+      </w:hyperlink>
+      <w:r>
+        <w:t xml:space="preserve"> </w:t>
+      </w:r>
+      <w:r>
+        <w:t xml:space="preserve">is far below the 5% the bound allows.</w:t>
+      </w:r>
+    </w:p>
+    <w:bookmarkEnd w:id="59"/>
+    <w:bookmarkStart w:id="60" w:name="sol-chebyshev-loose"/>
+    <w:p>
+      <w:pPr>
+        <w:pStyle w:val="BodyText"/>
+      </w:pPr>
+      <w:r>
+        <w:rPr>
+          <w:i/>
+          <w:iCs/>
+        </w:rPr>
+        <w:t xml:space="preserve">Solution 5</w:t>
+      </w:r>
+      <w:r>
+        <w:t xml:space="preserve">. </w:t>
+      </w:r>
+    </w:p>
+    <w:p>
+      <w:pPr>
+        <w:pStyle w:val="SourceCode"/>
+      </w:pPr>
+      <w:r>
+        <w:rPr>
+          <w:rStyle w:val="NormalTok"/>
+        </w:rPr>
+        <w:t xml:space="preserve">normal_approx </w:t>
+      </w:r>
+      <w:r>
+        <w:rPr>
+          <w:rStyle w:val="OtherTok"/>
+        </w:rPr>
+        <w:t xml:space="preserve">&lt;-</w:t>
+      </w:r>
+      <w:r>
+        <w:rPr>
+          <w:rStyle w:val="NormalTok"/>
+        </w:rPr>
+        <w:t xml:space="preserve"> </w:t>
+      </w:r>
+      <w:r>
+        <w:rPr>
+          <w:rStyle w:val="DecValTok"/>
+        </w:rPr>
+        <w:t xml:space="preserve">2</w:t>
+      </w:r>
+      <w:r>
+        <w:rPr>
+          <w:rStyle w:val="NormalTok"/>
+        </w:rPr>
+        <w:t xml:space="preserve"> </w:t>
+      </w:r>
+      <w:r>
+        <w:rPr>
+          <w:rStyle w:val="SpecialCharTok"/>
+        </w:rPr>
+        <w:t xml:space="preserve">*</w:t>
+      </w:r>
+      <w:r>
+        <w:rPr>
+          <w:rStyle w:val="NormalTok"/>
+        </w:rPr>
+        <w:t xml:space="preserve"> </w:t>
+      </w:r>
+      <w:r>
+        <w:rPr>
+          <w:rStyle w:val="FunctionTok"/>
+        </w:rPr>
+        <w:t xml:space="preserve">pnorm</w:t>
+      </w:r>
+      <w:r>
+        <w:rPr>
+          <w:rStyle w:val="NormalTok"/>
+        </w:rPr>
+        <w:t xml:space="preserve">(</w:t>
+      </w:r>
+      <w:r>
+        <w:rPr>
+          <w:rStyle w:val="SpecialCharTok"/>
+        </w:rPr>
+        <w:t xml:space="preserve">-</w:t>
+      </w:r>
+      <w:r>
+        <w:rPr>
+          <w:rStyle w:val="DecValTok"/>
+        </w:rPr>
+        <w:t xml:space="preserve">1</w:t>
+      </w:r>
+      <w:r>
+        <w:rPr>
+          <w:rStyle w:val="NormalTok"/>
+        </w:rPr>
+        <w:t xml:space="preserve"> </w:t>
+      </w:r>
+      <w:r>
+        <w:rPr>
+          <w:rStyle w:val="SpecialCharTok"/>
+        </w:rPr>
+        <w:t xml:space="preserve">/</w:t>
+      </w:r>
+      <w:r>
+        <w:rPr>
+          <w:rStyle w:val="NormalTok"/>
+        </w:rPr>
+        <w:t xml:space="preserve"> </w:t>
+      </w:r>
+      <w:r>
+        <w:rPr>
+          <w:rStyle w:val="FunctionTok"/>
+        </w:rPr>
+        <w:t xml:space="preserve">sqrt</w:t>
+      </w:r>
+      <w:r>
+        <w:rPr>
+          <w:rStyle w:val="NormalTok"/>
+        </w:rPr>
+        <w:t xml:space="preserve">(sigma2 </w:t>
+      </w:r>
+      <w:r>
+        <w:rPr>
+          <w:rStyle w:val="SpecialCharTok"/>
+        </w:rPr>
+        <w:t xml:space="preserve">/</w:t>
+      </w:r>
+      <w:r>
+        <w:rPr>
+          <w:rStyle w:val="NormalTok"/>
+        </w:rPr>
+        <w:t xml:space="preserve"> n_min))</w:t>
+      </w:r>
+      <w:r>
+        <w:br/>
+      </w:r>
+      <w:r>
+        <w:rPr>
+          <w:rStyle w:val="NormalTok"/>
+        </w:rPr>
+        <w:t xml:space="preserve">normal_approx</w:t>
+      </w:r>
+      <w:r>
+        <w:br/>
+      </w:r>
+      <w:r>
+        <w:rPr>
+          <w:rStyle w:val="CommentTok"/>
+        </w:rPr>
+        <w:t xml:space="preserve">#&gt; [1] 7.694705e-06</w:t>
+      </w:r>
+    </w:p>
+    <w:p>
+      <w:pPr>
+        <w:pStyle w:val="FirstParagraph"/>
+      </w:pPr>
+      <w:r>
+        <w:t xml:space="preserve">In</w:t>
+      </w:r>
+      <w:r>
+        <w:t xml:space="preserve"> </w:t>
+      </w:r>
+      <w:hyperlink w:anchor="sol-chebyshev-simulation">
+        <w:r>
+          <w:rPr>
+            <w:rStyle w:val="Hyperlink"/>
+          </w:rPr>
+          <w:t xml:space="preserve">Solution 4</w:t>
+        </w:r>
+      </w:hyperlink>
+      <w:r>
+        <w:t xml:space="preserve">,</w:t>
+      </w:r>
+      <w:r>
+        <w:t xml:space="preserve"> </w:t>
+      </w:r>
+      <w:r>
+        <w:t xml:space="preserve">the count is far below the 5% (500 samples) the bound allows.</w:t>
+      </w:r>
+      <w:r>
+        <w:t xml:space="preserve"> </w:t>
+      </w:r>
+      <w:r>
+        <w:t xml:space="preserve">The bound is loose</w:t>
+      </w:r>
+      <w:r>
+        <w:t xml:space="preserve"> </w:t>
+      </w:r>
+      <w:r>
+        <w:t xml:space="preserve">because the sample</w:t>
+      </w:r>
+      <w:r>
+        <w:t xml:space="preserve"> </w:t>
+      </w:r>
+      <w:hyperlink r:id="rId56">
+        <w:r>
+          <w:rPr>
+            <w:rStyle w:val="Hyperlink"/>
+          </w:rPr>
+          <w:t xml:space="preserve">mean</w:t>
+        </w:r>
+      </w:hyperlink>
+      <w:r>
+        <w:t xml:space="preserve"> </w:t>
+      </w:r>
+      <w:r>
+        <w:t xml:space="preserve">of this many cars is nearly</w:t>
+      </w:r>
+      <w:r>
+        <w:t xml:space="preserve"> </w:t>
+      </w:r>
+      <w:hyperlink r:id="rId25">
+        <w:r>
+          <w:rPr>
+            <w:rStyle w:val="Hyperlink"/>
+          </w:rPr>
+          <w:t xml:space="preserve">normal</w:t>
+        </w:r>
+      </w:hyperlink>
       <w:r>
         <w:t xml:space="preserve"> </w:t>
       </w:r>
@@ -14676,7 +15027,7 @@
         <w:t xml:space="preserve">7.7</w:t>
       </w:r>
       <w:r>
-        <w:t xml:space="preserve">^{-6};</w:t>
+        <w:t xml:space="preserve">^{-6}.</w:t>
       </w:r>
       <w:r>
         <w:t xml:space="preserve"> </w:t>
@@ -14699,8 +15050,8 @@
         <w:t xml:space="preserve">.</w:t>
       </w:r>
     </w:p>
-    <w:bookmarkEnd w:id="51"/>
-    <w:bookmarkStart w:id="52" w:name="thm-chebyshev-sample-mean"/>
+    <w:bookmarkEnd w:id="60"/>
+    <w:bookmarkStart w:id="61" w:name="thm-chebyshev-sample-mean"/>
     <w:p>
       <w:pPr>
         <w:pStyle w:val="BodyText"/>
@@ -15101,7 +15452,7 @@
         </m:oMath>
       </m:oMathPara>
     </w:p>
-    <w:bookmarkEnd w:id="52"/>
+    <w:bookmarkEnd w:id="61"/>
     <w:p>
       <w:pPr>
         <w:pStyle w:val="FirstParagraph"/>
@@ -15131,10 +15482,7 @@
         </w:r>
       </w:hyperlink>
       <w:r>
-        <w:t xml:space="preserve"> </w:t>
-      </w:r>
-      <w:r>
-        <w:t xml:space="preserve">(a), worked in</w:t>
+        <w:t xml:space="preserve">, worked in</w:t>
       </w:r>
       <w:r>
         <w:t xml:space="preserve"> </w:t>
@@ -15264,7 +15612,7 @@
         <w:t xml:space="preserve">.</w:t>
       </w:r>
     </w:p>
-    <w:bookmarkStart w:id="53" w:name="lem-hoeffding"/>
+    <w:bookmarkStart w:id="62" w:name="lem-hoeffding"/>
     <w:p>
       <w:pPr>
         <w:pStyle w:val="BodyText"/>
@@ -15470,7 +15818,7 @@
         </m:oMath>
       </m:oMathPara>
     </w:p>
-    <w:bookmarkEnd w:id="53"/>
+    <w:bookmarkEnd w:id="62"/>
     <w:p>
       <w:pPr>
         <w:pStyle w:val="FirstParagraph"/>
@@ -19040,7 +19388,7 @@
         <w:t xml:space="preserve">The next result uses it to bound the tails of a sample mean.</w:t>
       </w:r>
     </w:p>
-    <w:bookmarkStart w:id="55" w:name="thm-hoeffding"/>
+    <w:bookmarkStart w:id="64" w:name="thm-hoeffding"/>
     <w:p>
       <w:pPr>
         <w:pStyle w:val="BodyText"/>
@@ -19325,7 +19673,7 @@
       <w:pPr>
         <w:pStyle w:val="BodyText"/>
       </w:pPr>
-      <w:bookmarkStart w:id="54" w:name="eq-hoeffding-one-sided"/>
+      <w:bookmarkStart w:id="63" w:name="eq-hoeffding-one-sided"/>
       <m:oMathPara>
         <m:oMathParaPr>
           <m:jc m:val="center"/>
@@ -19455,9 +19803,9 @@
           </m:r>
         </m:oMath>
       </m:oMathPara>
-      <w:bookmarkEnd w:id="54"/>
+      <w:bookmarkEnd w:id="63"/>
     </w:p>
-    <w:bookmarkEnd w:id="55"/>
+    <w:bookmarkEnd w:id="64"/>
     <w:p>
       <w:pPr>
         <w:pStyle w:val="FirstParagraph"/>
@@ -21557,7 +21905,7 @@
         <w:t xml:space="preserve">which is the claim.</w:t>
       </w:r>
     </w:p>
-    <w:bookmarkStart w:id="57" w:name="cor-hoeffding-two-sided"/>
+    <w:bookmarkStart w:id="66" w:name="cor-hoeffding-two-sided"/>
     <w:p>
       <w:pPr>
         <w:pStyle w:val="BodyText"/>
@@ -21614,7 +21962,7 @@
       <w:pPr>
         <w:pStyle w:val="BodyText"/>
       </w:pPr>
-      <w:bookmarkStart w:id="56" w:name="eq-hoeffding"/>
+      <w:bookmarkStart w:id="65" w:name="eq-hoeffding"/>
       <m:oMathPara>
         <m:oMathParaPr>
           <m:jc m:val="center"/>
@@ -21763,9 +22111,9 @@
           </m:r>
         </m:oMath>
       </m:oMathPara>
-      <w:bookmarkEnd w:id="56"/>
+      <w:bookmarkEnd w:id="65"/>
     </w:p>
-    <w:bookmarkEnd w:id="57"/>
+    <w:bookmarkEnd w:id="66"/>
     <w:p>
       <w:pPr>
         <w:pStyle w:val="FirstParagraph"/>
@@ -23008,7 +23356,7 @@
         <w:t xml:space="preserve">draws in which it occurs.</w:t>
       </w:r>
     </w:p>
-    <w:bookmarkStart w:id="58" w:name="exm-hoeffding-auto"/>
+    <w:bookmarkStart w:id="67" w:name="exm-hoeffding-auto"/>
     <w:p>
       <w:pPr>
         <w:pStyle w:val="BodyText"/>
@@ -24698,9 +25046,9 @@
         <w:t xml:space="preserve">Both bounds are loose because they must hold for every distribution of this kind, not only for this one.</w:t>
       </w:r>
     </w:p>
-    <w:bookmarkEnd w:id="58"/>
-    <w:bookmarkEnd w:id="59"/>
-    <w:bookmarkStart w:id="67" w:name="sec-lln"/>
+    <w:bookmarkEnd w:id="67"/>
+    <w:bookmarkEnd w:id="68"/>
+    <w:bookmarkStart w:id="76" w:name="sec-lln"/>
     <w:p>
       <w:pPr>
         <w:pStyle w:val="Heading2"/>
@@ -24709,7 +25057,7 @@
         <w:t xml:space="preserve">3 The law of large numbers</w:t>
       </w:r>
     </w:p>
-    <w:bookmarkStart w:id="63" w:name="def-convergence-in-probability"/>
+    <w:bookmarkStart w:id="72" w:name="def-convergence-in-probability"/>
     <w:p>
       <w:pPr>
         <w:pStyle w:val="FirstParagraph"/>
@@ -25105,18 +25453,18 @@
                 <wp:inline>
                   <wp:extent cx="152400" cy="152400"/>
                   <wp:effectExtent b="0" l="0" r="0" t="0"/>
-                  <wp:docPr descr="" title="" id="61" name="Picture"/>
+                  <wp:docPr descr="" title="" id="70" name="Picture"/>
                   <a:graphic>
                     <a:graphicData uri="http://schemas.openxmlformats.org/drawingml/2006/picture">
                       <pic:pic>
                         <pic:nvPicPr>
-                          <pic:cNvPr descr="/opt/quarto/share/formats/docx/note.png" id="62" name="Picture"/>
+                          <pic:cNvPr descr="/opt/quarto/share/formats/docx/note.png" id="71" name="Picture"/>
                           <pic:cNvPicPr>
                             <a:picLocks noChangeArrowheads="1" noChangeAspect="1"/>
                           </pic:cNvPicPr>
                         </pic:nvPicPr>
                         <pic:blipFill>
-                          <a:blip r:embed="rId60"/>
+                          <a:blip r:embed="rId69"/>
                           <a:stretch>
                             <a:fillRect/>
                           </a:stretch>
@@ -25183,8 +25531,8 @@
         </w:tc>
       </w:tr>
     </w:tbl>
-    <w:bookmarkEnd w:id="63"/>
-    <w:bookmarkStart w:id="66" w:name="thm-wlln"/>
+    <w:bookmarkEnd w:id="72"/>
+    <w:bookmarkStart w:id="75" w:name="thm-wlln"/>
     <w:p>
       <w:pPr>
         <w:pStyle w:val="BodyText"/>
@@ -25563,18 +25911,18 @@
                 <wp:inline>
                   <wp:extent cx="152400" cy="152400"/>
                   <wp:effectExtent b="0" l="0" r="0" t="0"/>
-                  <wp:docPr descr="" title="" id="64" name="Picture"/>
+                  <wp:docPr descr="" title="" id="73" name="Picture"/>
                   <a:graphic>
                     <a:graphicData uri="http://schemas.openxmlformats.org/drawingml/2006/picture">
                       <pic:pic>
                         <pic:nvPicPr>
-                          <pic:cNvPr descr="/opt/quarto/share/formats/docx/note.png" id="65" name="Picture"/>
+                          <pic:cNvPr descr="/opt/quarto/share/formats/docx/note.png" id="74" name="Picture"/>
                           <pic:cNvPicPr>
                             <a:picLocks noChangeArrowheads="1" noChangeAspect="1"/>
                           </pic:cNvPicPr>
                         </pic:nvPicPr>
                         <pic:blipFill>
-                          <a:blip r:embed="rId60"/>
+                          <a:blip r:embed="rId69"/>
                           <a:stretch>
                             <a:fillRect/>
                           </a:stretch>
@@ -25641,7 +25989,7 @@
         </w:tc>
       </w:tr>
     </w:tbl>
-    <w:bookmarkEnd w:id="66"/>
+    <w:bookmarkEnd w:id="75"/>
     <w:p>
       <w:pPr>
         <w:pStyle w:val="BodyText"/>
@@ -26431,8 +26779,8 @@
         <w:t xml:space="preserve">.</w:t>
       </w:r>
     </w:p>
-    <w:bookmarkEnd w:id="67"/>
-    <w:bookmarkStart w:id="96" w:name="references"/>
+    <w:bookmarkEnd w:id="76"/>
+    <w:bookmarkStart w:id="105" w:name="references"/>
     <w:p>
       <w:pPr>
         <w:pStyle w:val="Heading2"/>
@@ -26441,8 +26789,8 @@
         <w:t xml:space="preserve">References</w:t>
       </w:r>
     </w:p>
-    <w:bookmarkStart w:id="95" w:name="refs"/>
-    <w:bookmarkStart w:id="69" w:name="ref-wikipedia_central_limit_theorem"/>
+    <w:bookmarkStart w:id="104" w:name="refs"/>
+    <w:bookmarkStart w:id="78" w:name="ref-wikipedia_central_limit_theorem"/>
     <w:p>
       <w:pPr>
         <w:pStyle w:val="Bibliography"/>
@@ -26489,7 +26837,7 @@
       <w:r>
         <w:t xml:space="preserve"> </w:t>
       </w:r>
-      <w:hyperlink r:id="rId68">
+      <w:hyperlink r:id="rId77">
         <w:r>
           <w:rPr>
             <w:rStyle w:val="Hyperlink"/>
@@ -26498,8 +26846,8 @@
         </w:r>
       </w:hyperlink>
     </w:p>
-    <w:bookmarkEnd w:id="69"/>
-    <w:bookmarkStart w:id="70" w:name="ref-billingsley1995probability"/>
+    <w:bookmarkEnd w:id="78"/>
+    <w:bookmarkStart w:id="79" w:name="ref-billingsley1995probability"/>
     <w:p>
       <w:pPr>
         <w:pStyle w:val="Bibliography"/>
@@ -26530,8 +26878,8 @@
         <w:t xml:space="preserve">, 3rd ed. in Wiley series in probability and mathematical statistics. New York: Wiley, 1995.</w:t>
       </w:r>
     </w:p>
-    <w:bookmarkEnd w:id="70"/>
-    <w:bookmarkStart w:id="72" w:name="ref-fiveminuteai_probstat"/>
+    <w:bookmarkEnd w:id="79"/>
+    <w:bookmarkStart w:id="81" w:name="ref-fiveminuteai_probstat"/>
     <w:p>
       <w:pPr>
         <w:pStyle w:val="Bibliography"/>
@@ -26563,7 +26911,7 @@
       <w:r>
         <w:t xml:space="preserve"> </w:t>
       </w:r>
-      <w:hyperlink r:id="rId71">
+      <w:hyperlink r:id="rId80">
         <w:r>
           <w:rPr>
             <w:rStyle w:val="Hyperlink"/>
@@ -26572,8 +26920,8 @@
         </w:r>
       </w:hyperlink>
     </w:p>
-    <w:bookmarkEnd w:id="72"/>
-    <w:bookmarkStart w:id="74" w:name="ref-wikipedia_markovs_inequality"/>
+    <w:bookmarkEnd w:id="81"/>
+    <w:bookmarkStart w:id="83" w:name="ref-wikipedia_markovs_inequality"/>
     <w:p>
       <w:pPr>
         <w:pStyle w:val="Bibliography"/>
@@ -26620,7 +26968,7 @@
       <w:r>
         <w:t xml:space="preserve"> </w:t>
       </w:r>
-      <w:hyperlink r:id="rId73">
+      <w:hyperlink r:id="rId82">
         <w:r>
           <w:rPr>
             <w:rStyle w:val="Hyperlink"/>
@@ -26629,8 +26977,8 @@
         </w:r>
       </w:hyperlink>
     </w:p>
-    <w:bookmarkEnd w:id="74"/>
-    <w:bookmarkStart w:id="76" w:name="ref-bienayme1853"/>
+    <w:bookmarkEnd w:id="83"/>
+    <w:bookmarkStart w:id="85" w:name="ref-bienayme1853"/>
     <w:p>
       <w:pPr>
         <w:pStyle w:val="Bibliography"/>
@@ -26681,7 +27029,7 @@
       <w:r>
         <w:t xml:space="preserve"> </w:t>
       </w:r>
-      <w:hyperlink r:id="rId75">
+      <w:hyperlink r:id="rId84">
         <w:r>
           <w:rPr>
             <w:rStyle w:val="Hyperlink"/>
@@ -26690,8 +27038,8 @@
         </w:r>
       </w:hyperlink>
     </w:p>
-    <w:bookmarkEnd w:id="76"/>
-    <w:bookmarkStart w:id="78" w:name="ref-tchebichef1867"/>
+    <w:bookmarkEnd w:id="85"/>
+    <w:bookmarkStart w:id="87" w:name="ref-tchebichef1867"/>
     <w:p>
       <w:pPr>
         <w:pStyle w:val="Bibliography"/>
@@ -26730,7 +27078,7 @@
       <w:r>
         <w:t xml:space="preserve"> </w:t>
       </w:r>
-      <w:hyperlink r:id="rId77">
+      <w:hyperlink r:id="rId86">
         <w:r>
           <w:rPr>
             <w:rStyle w:val="Hyperlink"/>
@@ -26739,8 +27087,8 @@
         </w:r>
       </w:hyperlink>
     </w:p>
-    <w:bookmarkEnd w:id="78"/>
-    <w:bookmarkStart w:id="80" w:name="ref-seneta2013"/>
+    <w:bookmarkEnd w:id="87"/>
+    <w:bookmarkStart w:id="89" w:name="ref-seneta2013"/>
     <w:p>
       <w:pPr>
         <w:pStyle w:val="Bibliography"/>
@@ -26779,7 +27127,7 @@
       <w:r>
         <w:t xml:space="preserve"> </w:t>
       </w:r>
-      <w:hyperlink r:id="rId79">
+      <w:hyperlink r:id="rId88">
         <w:r>
           <w:rPr>
             <w:rStyle w:val="Hyperlink"/>
@@ -26791,8 +27139,8 @@
         <w:t xml:space="preserve">.</w:t>
       </w:r>
     </w:p>
-    <w:bookmarkEnd w:id="80"/>
-    <w:bookmarkStart w:id="82" w:name="ref-blitzstein2019introduction"/>
+    <w:bookmarkEnd w:id="89"/>
+    <w:bookmarkStart w:id="91" w:name="ref-blitzstein2019introduction"/>
     <w:p>
       <w:pPr>
         <w:pStyle w:val="Bibliography"/>
@@ -26825,7 +27173,7 @@
       <w:r>
         <w:t xml:space="preserve"> </w:t>
       </w:r>
-      <w:hyperlink r:id="rId81">
+      <w:hyperlink r:id="rId90">
         <w:r>
           <w:rPr>
             <w:rStyle w:val="Hyperlink"/>
@@ -26837,8 +27185,8 @@
         <w:t xml:space="preserve">.</w:t>
       </w:r>
     </w:p>
-    <w:bookmarkEnd w:id="82"/>
-    <w:bookmarkStart w:id="84" w:name="ref-wikipedia_chebyshevs_inequality"/>
+    <w:bookmarkEnd w:id="91"/>
+    <w:bookmarkStart w:id="93" w:name="ref-wikipedia_chebyshevs_inequality"/>
     <w:p>
       <w:pPr>
         <w:pStyle w:val="Bibliography"/>
@@ -26885,7 +27233,7 @@
       <w:r>
         <w:t xml:space="preserve"> </w:t>
       </w:r>
-      <w:hyperlink r:id="rId83">
+      <w:hyperlink r:id="rId92">
         <w:r>
           <w:rPr>
             <w:rStyle w:val="Hyperlink"/>
@@ -26894,8 +27242,8 @@
         </w:r>
       </w:hyperlink>
     </w:p>
-    <w:bookmarkEnd w:id="84"/>
-    <w:bookmarkStart w:id="86" w:name="ref-hoeffding1963"/>
+    <w:bookmarkEnd w:id="93"/>
+    <w:bookmarkStart w:id="95" w:name="ref-hoeffding1963"/>
     <w:p>
       <w:pPr>
         <w:pStyle w:val="Bibliography"/>
@@ -26934,7 +27282,7 @@
       <w:r>
         <w:t xml:space="preserve"> </w:t>
       </w:r>
-      <w:hyperlink r:id="rId85">
+      <w:hyperlink r:id="rId94">
         <w:r>
           <w:rPr>
             <w:rStyle w:val="Hyperlink"/>
@@ -26946,8 +27294,8 @@
         <w:t xml:space="preserve">.</w:t>
       </w:r>
     </w:p>
-    <w:bookmarkEnd w:id="86"/>
-    <w:bookmarkStart w:id="88" w:name="ref-wikipedia_hoeffdings_inequality"/>
+    <w:bookmarkEnd w:id="95"/>
+    <w:bookmarkStart w:id="97" w:name="ref-wikipedia_hoeffdings_inequality"/>
     <w:p>
       <w:pPr>
         <w:pStyle w:val="Bibliography"/>
@@ -26994,7 +27342,7 @@
       <w:r>
         <w:t xml:space="preserve"> </w:t>
       </w:r>
-      <w:hyperlink r:id="rId87">
+      <w:hyperlink r:id="rId96">
         <w:r>
           <w:rPr>
             <w:rStyle w:val="Hyperlink"/>
@@ -27003,8 +27351,8 @@
         </w:r>
       </w:hyperlink>
     </w:p>
-    <w:bookmarkEnd w:id="88"/>
-    <w:bookmarkStart w:id="90" w:name="Xd57efcf36cbfbff962c3240b4f16e14e48748ce"/>
+    <w:bookmarkEnd w:id="97"/>
+    <w:bookmarkStart w:id="99" w:name="Xd57efcf36cbfbff962c3240b4f16e14e48748ce"/>
     <w:p>
       <w:pPr>
         <w:pStyle w:val="Bibliography"/>
@@ -27051,7 +27399,7 @@
       <w:r>
         <w:t xml:space="preserve"> </w:t>
       </w:r>
-      <w:hyperlink r:id="rId89">
+      <w:hyperlink r:id="rId98">
         <w:r>
           <w:rPr>
             <w:rStyle w:val="Hyperlink"/>
@@ -27060,8 +27408,8 @@
         </w:r>
       </w:hyperlink>
     </w:p>
-    <w:bookmarkEnd w:id="90"/>
-    <w:bookmarkStart w:id="92" w:name="ref-CaseBerg01"/>
+    <w:bookmarkEnd w:id="99"/>
+    <w:bookmarkStart w:id="101" w:name="ref-CaseBerg01"/>
     <w:p>
       <w:pPr>
         <w:pStyle w:val="Bibliography"/>
@@ -27094,7 +27442,7 @@
       <w:r>
         <w:t xml:space="preserve"> </w:t>
       </w:r>
-      <w:hyperlink r:id="rId91">
+      <w:hyperlink r:id="rId100">
         <w:r>
           <w:rPr>
             <w:rStyle w:val="Hyperlink"/>
@@ -27103,8 +27451,8 @@
         </w:r>
       </w:hyperlink>
     </w:p>
-    <w:bookmarkEnd w:id="92"/>
-    <w:bookmarkStart w:id="94" w:name="ref-wikipedia_law_of_large_numbers"/>
+    <w:bookmarkEnd w:id="101"/>
+    <w:bookmarkStart w:id="103" w:name="ref-wikipedia_law_of_large_numbers"/>
     <w:p>
       <w:pPr>
         <w:pStyle w:val="Bibliography"/>
@@ -27151,7 +27499,7 @@
       <w:r>
         <w:t xml:space="preserve"> </w:t>
       </w:r>
-      <w:hyperlink r:id="rId93">
+      <w:hyperlink r:id="rId102">
         <w:r>
           <w:rPr>
             <w:rStyle w:val="Hyperlink"/>
@@ -27160,9 +27508,9 @@
         </w:r>
       </w:hyperlink>
     </w:p>
-    <w:bookmarkEnd w:id="94"/>
-    <w:bookmarkEnd w:id="95"/>
-    <w:bookmarkEnd w:id="96"/>
+    <w:bookmarkEnd w:id="103"/>
+    <w:bookmarkEnd w:id="104"/>
+    <w:bookmarkEnd w:id="105"/>
     <w:sectPr>
       <w:footnotePr>
         <w:numRestart w:val="eachSect"/>
@@ -27273,153 +27621,8 @@
       </w:pPr>
     </w:lvl>
   </w:abstractNum>
-  <w:abstractNum w:abstractNumId="99711">
-    <w:nsid w:val="00A99711"/>
-    <w:multiLevelType w:val="multilevel"/>
-    <w:lvl w:ilvl="0">
-      <w:start w:val="1"/>
-      <w:numFmt w:val="lowerLetter"/>
-      <w:lvlText w:val="%1."/>
-      <w:lvlJc w:val="left"/>
-      <w:pPr>
-        <w:ind w:left="720" w:hanging="360"/>
-      </w:pPr>
-    </w:lvl>
-    <w:lvl w:ilvl="1">
-      <w:start w:val="1"/>
-      <w:numFmt w:val="lowerLetter"/>
-      <w:lvlText w:val="%2."/>
-      <w:lvlJc w:val="left"/>
-      <w:pPr>
-        <w:ind w:left="1440" w:hanging="360"/>
-      </w:pPr>
-    </w:lvl>
-    <w:lvl w:ilvl="2">
-      <w:start w:val="1"/>
-      <w:numFmt w:val="lowerLetter"/>
-      <w:lvlText w:val="%3."/>
-      <w:lvlJc w:val="left"/>
-      <w:pPr>
-        <w:ind w:left="2160" w:hanging="360"/>
-      </w:pPr>
-    </w:lvl>
-    <w:lvl w:ilvl="3">
-      <w:start w:val="1"/>
-      <w:numFmt w:val="lowerLetter"/>
-      <w:lvlText w:val="%4."/>
-      <w:lvlJc w:val="left"/>
-      <w:pPr>
-        <w:ind w:left="2880" w:hanging="360"/>
-      </w:pPr>
-    </w:lvl>
-    <w:lvl w:ilvl="4">
-      <w:start w:val="1"/>
-      <w:numFmt w:val="lowerLetter"/>
-      <w:lvlText w:val="%5."/>
-      <w:lvlJc w:val="left"/>
-      <w:pPr>
-        <w:ind w:left="3600" w:hanging="360"/>
-      </w:pPr>
-    </w:lvl>
-    <w:lvl w:ilvl="5">
-      <w:start w:val="1"/>
-      <w:numFmt w:val="lowerLetter"/>
-      <w:lvlText w:val="%6."/>
-      <w:lvlJc w:val="left"/>
-      <w:pPr>
-        <w:ind w:left="4320" w:hanging="360"/>
-      </w:pPr>
-    </w:lvl>
-    <w:lvl w:ilvl="6">
-      <w:start w:val="1"/>
-      <w:numFmt w:val="lowerLetter"/>
-      <w:lvlText w:val="%7."/>
-      <w:lvlJc w:val="left"/>
-      <w:pPr>
-        <w:ind w:left="5040" w:hanging="360"/>
-      </w:pPr>
-    </w:lvl>
-    <w:lvl w:ilvl="7">
-      <w:start w:val="1"/>
-      <w:numFmt w:val="lowerLetter"/>
-      <w:lvlText w:val="%8."/>
-      <w:lvlJc w:val="left"/>
-      <w:pPr>
-        <w:ind w:left="5760" w:hanging="360"/>
-      </w:pPr>
-    </w:lvl>
-    <w:lvl w:ilvl="8">
-      <w:start w:val="1"/>
-      <w:numFmt w:val="lowerLetter"/>
-      <w:lvlText w:val="%9."/>
-      <w:lvlJc w:val="left"/>
-      <w:pPr>
-        <w:ind w:left="6480" w:hanging="360"/>
-      </w:pPr>
-    </w:lvl>
-  </w:abstractNum>
   <w:num w:numId="1000">
     <w:abstractNumId w:val="990"/>
-  </w:num>
-  <w:num w:numId="1001">
-    <w:abstractNumId w:val="99711"/>
-    <w:lvlOverride w:ilvl="0">
-      <w:startOverride w:val="1"/>
-    </w:lvlOverride>
-    <w:lvlOverride w:ilvl="1">
-      <w:startOverride w:val="1"/>
-    </w:lvlOverride>
-    <w:lvlOverride w:ilvl="2">
-      <w:startOverride w:val="1"/>
-    </w:lvlOverride>
-    <w:lvlOverride w:ilvl="3">
-      <w:startOverride w:val="1"/>
-    </w:lvlOverride>
-    <w:lvlOverride w:ilvl="4">
-      <w:startOverride w:val="1"/>
-    </w:lvlOverride>
-    <w:lvlOverride w:ilvl="5">
-      <w:startOverride w:val="1"/>
-    </w:lvlOverride>
-    <w:lvlOverride w:ilvl="6">
-      <w:startOverride w:val="1"/>
-    </w:lvlOverride>
-    <w:lvlOverride w:ilvl="7">
-      <w:startOverride w:val="1"/>
-    </w:lvlOverride>
-    <w:lvlOverride w:ilvl="8">
-      <w:startOverride w:val="1"/>
-    </w:lvlOverride>
-  </w:num>
-  <w:num w:numId="1002">
-    <w:abstractNumId w:val="99711"/>
-    <w:lvlOverride w:ilvl="0">
-      <w:startOverride w:val="1"/>
-    </w:lvlOverride>
-    <w:lvlOverride w:ilvl="1">
-      <w:startOverride w:val="1"/>
-    </w:lvlOverride>
-    <w:lvlOverride w:ilvl="2">
-      <w:startOverride w:val="1"/>
-    </w:lvlOverride>
-    <w:lvlOverride w:ilvl="3">
-      <w:startOverride w:val="1"/>
-    </w:lvlOverride>
-    <w:lvlOverride w:ilvl="4">
-      <w:startOverride w:val="1"/>
-    </w:lvlOverride>
-    <w:lvlOverride w:ilvl="5">
-      <w:startOverride w:val="1"/>
-    </w:lvlOverride>
-    <w:lvlOverride w:ilvl="6">
-      <w:startOverride w:val="1"/>
-    </w:lvlOverride>
-    <w:lvlOverride w:ilvl="7">
-      <w:startOverride w:val="1"/>
-    </w:lvlOverride>
-    <w:lvlOverride w:ilvl="8">
-      <w:startOverride w:val="1"/>
-    </w:lvlOverride>
   </w:num>
 </w:numbering>
 </file>

</xml_diff>